<commit_message>
Updated citations in literature review
</commit_message>
<xml_diff>
--- a/final report/Final Report.docx
+++ b/final report/Final Report.docx
@@ -4711,7 +4711,7 @@
       <w:bookmarkStart w:id="5" w:name="_Toc237985775"/>
       <w:r>
         <w:lastRenderedPageBreak/>
-        <w:t>2.1.0 Automated Essay Scoring (AES) Systems</w:t>
+        <w:t>2.1 Automated Essay Scoring (AES) Systems</w:t>
       </w:r>
       <w:bookmarkEnd w:id="5"/>
     </w:p>
@@ -4720,22 +4720,13 @@
         <w:spacing w:line="360" w:lineRule="auto"/>
       </w:pPr>
       <w:r>
-        <w:rPr>
-          <w:b/>
-          <w:bCs/>
-        </w:rPr>
-        <w:t>Key terms</w:t>
-      </w:r>
-      <w:r>
-        <w:t>: traits, features, handmade features, engineered features, holistic score, neural networks, transformers, prompts, QWK - QWK (Quadratic weighted Kappa) evaluates the degree of agreement among human and AI scorers, it is a metric between 0 and 1, representing no agreement beyond chance and perfect agreement, respectively [1].</w:t>
-      </w:r>
-    </w:p>
-    <w:p>
-      <w:pPr>
-        <w:spacing w:line="360" w:lineRule="auto"/>
-      </w:pPr>
-      <w:r>
-        <w:t xml:space="preserve">This section is designed to give the user a historical perspective on AES system describing their advantages and limitations and, in the process, justify the selection of </w:t>
+        <w:t xml:space="preserve">This section is designed to </w:t>
+      </w:r>
+      <w:r>
+        <w:t>provide the reader with a</w:t>
+      </w:r>
+      <w:r>
+        <w:t xml:space="preserve"> historical perspective on AES system describing their advantages and limitations and, in the process, justify the selection of </w:t>
       </w:r>
       <w:proofErr w:type="spellStart"/>
       <w:r>
@@ -4770,7 +4761,13 @@
       </w:r>
       <w:r>
         <w:br/>
-        <w:t>According to [2], automated essay scoring refers to the process of grading student essays without human interference. An AES system takes as input an essay written for a given prompt (the topic) and then assigns a numeric score to the essay reflecting its quality, based on traits such as content, grammar and organization.</w:t>
+        <w:t xml:space="preserve">According to </w:t>
+      </w:r>
+      <w:r>
+        <w:t xml:space="preserve">Taghipour et al. </w:t>
+      </w:r>
+      <w:r>
+        <w:t>[2], automated essay scoring refers to the process of grading student essays without human interference. An AES system takes as input an essay written for a given prompt (the topic) and then assigns a numeric score to the essay reflecting its quality, based on traits such as content, grammar and organization.</w:t>
       </w:r>
     </w:p>
     <w:p>
@@ -4792,7 +4789,10 @@
         <w:spacing w:line="360" w:lineRule="auto"/>
       </w:pPr>
       <w:r>
-        <w:t xml:space="preserve">According to [3], early AES systems such as Project Essay Grader (PEG), IEA, E-rater, </w:t>
+        <w:t>Early</w:t>
+      </w:r>
+      <w:r>
+        <w:t xml:space="preserve"> AES systems such as Project Essay Grader (PEG), IEA, E-rater, </w:t>
       </w:r>
       <w:proofErr w:type="spellStart"/>
       <w:r>
@@ -4800,7 +4800,13 @@
       </w:r>
       <w:proofErr w:type="spellEnd"/>
       <w:r>
-        <w:t xml:space="preserve"> and BETSY, all used handcrafted feature approaches. Handcrafted features are values that are encoded into feature vectors, for example, the first dimension of a vector may represent word count and the second, sentence length and so on. These are then fed to a neural network for processing. This approach gives features positional significance, resulting in an interpretable output</w:t>
+        <w:t xml:space="preserve"> and BETSY, all used handcrafted feature approaches</w:t>
+      </w:r>
+      <w:r>
+        <w:t xml:space="preserve"> [3]</w:t>
+      </w:r>
+      <w:r>
+        <w:t>. Handcrafted features are values that are encoded into feature vectors, for example, the first dimension of a vector may represent word count and the second, sentence length and so on. These are then fed to a neural network for processing. This approach gives features positional significance, resulting in an interpretable output</w:t>
       </w:r>
       <w:r>
         <w:t>.</w:t>
@@ -4811,28 +4817,1266 @@
         <w:spacing w:line="360" w:lineRule="auto"/>
       </w:pPr>
       <w:r>
-        <w:t>According to [4], these features are meticulously designed by researchers based on linguistic expertise, allowing for adaptability to various scoring criteria. [4], although stating the fact that these systems were exceptionally accurate, noted that despite the reliance on handcrafted features, conventional AES systems demonstrate robust performance even with limited datasets.</w:t>
-      </w:r>
-    </w:p>
-    <w:p>
-      <w:pPr>
-        <w:spacing w:line="360" w:lineRule="auto"/>
-      </w:pPr>
-      <w:r>
-        <w:rPr>
-          <w:b/>
-          <w:bCs/>
-        </w:rPr>
-        <w:t>Limitations:</w:t>
+        <w:t xml:space="preserve">According to </w:t>
+      </w:r>
+      <w:r>
+        <w:t xml:space="preserve">Yang </w:t>
+      </w:r>
+      <w:r>
+        <w:t>[4], these features are meticulously designed by researchers based on linguistic expertise, allowing for adaptability to various scoring criteria. [4], although stating the fact that these systems were exceptionally accurate, noted that despite the reliance on handcrafted features, conventional AES systems demonstrate robust performance even with limited datasets.</w:t>
+      </w:r>
+    </w:p>
+    <w:p>
+      <w:pPr>
+        <w:spacing w:line="360" w:lineRule="auto"/>
+      </w:pPr>
+      <w:r>
+        <w:rPr>
+          <w:b/>
+          <w:bCs/>
+        </w:rPr>
+        <w:t>Limitations</w:t>
+      </w:r>
+      <w:r>
+        <w:rPr>
+          <w:b/>
+          <w:bCs/>
+        </w:rPr>
+        <w:t xml:space="preserve"> of handcrafted systems</w:t>
+      </w:r>
+      <w:r>
+        <w:rPr>
+          <w:b/>
+          <w:bCs/>
+        </w:rPr>
+        <w:t>:</w:t>
       </w:r>
       <w:r>
         <w:br/>
-        <w:t xml:space="preserve">[2] stated that the process of feature engineering is the most difficult part of building an </w:t>
+      </w:r>
+      <w:r>
+        <w:t xml:space="preserve">Taghipour et al. </w:t>
+      </w:r>
+      <w:r>
+        <w:t>[2] stated that the process of feature engineering is the most difficult part of building an AES system, and that it is also challenging for humans to consider all the factors that are involved in assigning a score to an essay. There is also no evidence to suggest that any of these earlier systems graded handwritten essays.</w:t>
+      </w:r>
+    </w:p>
+    <w:p>
+      <w:pPr>
+        <w:spacing w:line="360" w:lineRule="auto"/>
+      </w:pPr>
+      <w:r>
+        <w:rPr>
+          <w:rStyle w:val="Heading4Char"/>
+        </w:rPr>
+        <w:t>Feature engineered systems</w:t>
+      </w:r>
+      <w:r>
+        <w:br/>
+        <w:t xml:space="preserve">Neural approaches engineer features like sentence length and number of paragraphs </w:t>
       </w:r>
       <w:r>
         <w:lastRenderedPageBreak/>
-        <w:t>AES system, and that it is also challenging for humans to consider all the factors that are involved in assigning a score to an essay. There is also no evidence to suggest that any of these earlier systems graded handwritten essays.</w:t>
-      </w:r>
+        <w:t>and encode these in dense numerical feature vectors. A dense vector can contain several numerical values relating to a feature or combination of features. These numbers have no positional significance to humans as compared to handcrafted features as they are assigned based on weight adjustments influenced by gradient descent. This enables the network to iteratively adjust weights to learn a model that can then generalise to score new essays.</w:t>
+      </w:r>
+    </w:p>
+    <w:p>
+      <w:pPr>
+        <w:spacing w:line="360" w:lineRule="auto"/>
+      </w:pPr>
+      <w:r>
+        <w:t xml:space="preserve">Taghipour et al. </w:t>
+      </w:r>
+      <w:r>
+        <w:t>[2] implemented a model for holistic scoring based on recurrent neural networks (LSTM), to learn the relationship between an input essay directly and its assigned score. The system encodes the information required for essay evaluation and learns the complex patterns in the data. Their system outperformed a strong baseline by 5.6% in terms of QWK, without requiring any feature engineering.</w:t>
+      </w:r>
+      <w:r>
+        <w:t xml:space="preserve"> </w:t>
+      </w:r>
+      <w:r>
+        <w:t>QWK (Quadratic weighted Kappa) evaluates the degree of agreement among human and AI scorers, it is a metric between 0 and 1, representing no agreement beyond chance and perfect agreement, respectively [1]</w:t>
+      </w:r>
+      <w:r>
+        <w:t>.</w:t>
+      </w:r>
+    </w:p>
+    <w:p>
+      <w:pPr>
+        <w:spacing w:line="360" w:lineRule="auto"/>
+      </w:pPr>
+      <w:r>
+        <w:rPr>
+          <w:b/>
+          <w:bCs/>
+        </w:rPr>
+        <w:t>Limitations</w:t>
+      </w:r>
+      <w:r>
+        <w:rPr>
+          <w:b/>
+          <w:bCs/>
+        </w:rPr>
+        <w:t xml:space="preserve"> of feature engineered sys</w:t>
+      </w:r>
+      <w:r>
+        <w:rPr>
+          <w:b/>
+          <w:bCs/>
+        </w:rPr>
+        <w:t>t</w:t>
+      </w:r>
+      <w:r>
+        <w:rPr>
+          <w:b/>
+          <w:bCs/>
+        </w:rPr>
+        <w:t>ems</w:t>
+      </w:r>
+      <w:r>
+        <w:t xml:space="preserve">: The system was not tested on a handwritten dataset, especially not one with cursive handwritten essays. </w:t>
+      </w:r>
+      <w:r>
+        <w:t>N</w:t>
+      </w:r>
+      <w:r>
+        <w:t xml:space="preserve">eural approaches provide scores without giving evidence of how they are arrived at. Since one of the goals of </w:t>
+      </w:r>
+      <w:proofErr w:type="spellStart"/>
+      <w:r>
+        <w:t>BrainPower</w:t>
+      </w:r>
+      <w:proofErr w:type="spellEnd"/>
+      <w:r>
+        <w:t xml:space="preserve"> is to produce interpretable results, a neural approach will not be employed</w:t>
+      </w:r>
+      <w:r>
+        <w:t xml:space="preserve"> [5]</w:t>
+      </w:r>
+      <w:r>
+        <w:t>.</w:t>
+      </w:r>
+    </w:p>
+    <w:p>
+      <w:pPr>
+        <w:spacing w:line="360" w:lineRule="auto"/>
+      </w:pPr>
+      <w:r>
+        <w:t xml:space="preserve">Furthermore, more modern approaches such as transformers have been shown to be superior to neural approaches. </w:t>
+      </w:r>
+      <w:r>
+        <w:t xml:space="preserve">Han and Mynt </w:t>
+      </w:r>
+      <w:r>
+        <w:t xml:space="preserve">[6] compared the performance of three neural approaches LSTM, Bi-LSTM and BERT a transformer model and concluded that the transformer model offered </w:t>
+      </w:r>
+      <w:r>
+        <w:t xml:space="preserve">superior performance. </w:t>
+      </w:r>
+      <w:proofErr w:type="spellStart"/>
+      <w:r>
+        <w:t>Elmassry</w:t>
+      </w:r>
+      <w:proofErr w:type="spellEnd"/>
+      <w:r>
+        <w:t xml:space="preserve"> et al. </w:t>
+      </w:r>
+      <w:r>
+        <w:t xml:space="preserve">[5] reviewed several </w:t>
+      </w:r>
+      <w:r>
+        <w:t>pretrained models in AES and discovered that BERT outperformed all of them achieving a QWK of 0.83.</w:t>
+      </w:r>
+    </w:p>
+    <w:p>
+      <w:pPr>
+        <w:spacing w:line="360" w:lineRule="auto"/>
+      </w:pPr>
+      <w:bookmarkStart w:id="6" w:name="_Toc237985776"/>
+      <w:r>
+        <w:rPr>
+          <w:rStyle w:val="Heading3Char"/>
+        </w:rPr>
+        <w:t>2.1.1 Transformers</w:t>
+      </w:r>
+      <w:bookmarkEnd w:id="6"/>
+      <w:r>
+        <w:br/>
+        <w:t>Transformer models work by using an attention mechanism that relates each token in the text to every other token thus enabling them to capture long-range contextual dependencies. According to</w:t>
+      </w:r>
+      <w:r>
+        <w:t xml:space="preserve"> </w:t>
+      </w:r>
+      <w:r>
+        <w:t xml:space="preserve">Lagakis and </w:t>
+      </w:r>
+      <w:proofErr w:type="spellStart"/>
+      <w:r>
+        <w:t>Demetriadis</w:t>
+      </w:r>
+      <w:proofErr w:type="spellEnd"/>
+      <w:r>
+        <w:t xml:space="preserve"> [3], they make use of huge </w:t>
+      </w:r>
+      <w:r>
+        <w:lastRenderedPageBreak/>
+        <w:t>datasets of existing general text data, such as Wikipedia Corpus, to pretrain multilayer neural networks with context-sensitive meaning of and relationships between words.</w:t>
+      </w:r>
+    </w:p>
+    <w:p>
+      <w:pPr>
+        <w:spacing w:line="360" w:lineRule="auto"/>
+      </w:pPr>
+      <w:r>
+        <w:t xml:space="preserve">Yang </w:t>
+      </w:r>
+      <w:r>
+        <w:t>[4] compared the performance of several models on an AES task. The results show transformer models outperforming traditional models, achieving higher QWK scores. The best performer was a NCPR model, which used contrastive learning and utilised BERT for feature extraction achieved a QWK of 0.817, indicating a close similarity to human scoring.</w:t>
+      </w:r>
+    </w:p>
+    <w:p>
+      <w:pPr>
+        <w:spacing w:line="360" w:lineRule="auto"/>
+      </w:pPr>
+      <w:r>
+        <w:t xml:space="preserve">Lagakis and </w:t>
+      </w:r>
+      <w:proofErr w:type="spellStart"/>
+      <w:r>
+        <w:t>Demetriadis</w:t>
+      </w:r>
+      <w:proofErr w:type="spellEnd"/>
+      <w:r>
+        <w:t xml:space="preserve"> </w:t>
+      </w:r>
+      <w:r>
+        <w:t xml:space="preserve">[3] suggests not relying solely on transformer models and like [4], proposed a technique of combining transformers with more traditional approaches like those that employ handcrafted features. </w:t>
+      </w:r>
+      <w:r>
+        <w:t xml:space="preserve">Xu et al. </w:t>
+      </w:r>
+      <w:r>
+        <w:t xml:space="preserve">[1] argued that human evaluation remains important since expert markers can identify subtle linguistic and cognitive qualities that automated systems may overlook. </w:t>
+      </w:r>
+      <w:r>
+        <w:t xml:space="preserve">Yang </w:t>
+      </w:r>
+      <w:r>
+        <w:t xml:space="preserve">[4] indicated that when models work in combination the results are more promising. </w:t>
+      </w:r>
+      <w:r>
+        <w:t xml:space="preserve">Dadi and </w:t>
+      </w:r>
+      <w:proofErr w:type="spellStart"/>
+      <w:r>
+        <w:t>Sanampudi</w:t>
+      </w:r>
+      <w:proofErr w:type="spellEnd"/>
+      <w:r>
+        <w:t xml:space="preserve"> </w:t>
+      </w:r>
+      <w:r>
+        <w:t xml:space="preserve">[7] used a hybrid model – LSTM and Word Embedding and achieved a QWK of 0.94. </w:t>
+      </w:r>
+      <w:r>
+        <w:t xml:space="preserve">Lagakis and </w:t>
+      </w:r>
+      <w:proofErr w:type="spellStart"/>
+      <w:r>
+        <w:t>Demetriadis</w:t>
+      </w:r>
+      <w:proofErr w:type="spellEnd"/>
+      <w:r>
+        <w:t xml:space="preserve"> </w:t>
+      </w:r>
+      <w:r>
+        <w:t xml:space="preserve">[3], </w:t>
+      </w:r>
+      <w:r>
+        <w:t xml:space="preserve">Yang </w:t>
+      </w:r>
+      <w:r>
+        <w:t xml:space="preserve">[4] and </w:t>
+      </w:r>
+      <w:r>
+        <w:t xml:space="preserve">Xu et al. </w:t>
+      </w:r>
+      <w:r>
+        <w:t>[1] all give compelling reasons for a hybrid design for an AES system but do not give explicit indication of the format that the essay must be in for evaluation.</w:t>
+      </w:r>
+    </w:p>
+    <w:p>
+      <w:pPr>
+        <w:spacing w:line="360" w:lineRule="auto"/>
+      </w:pPr>
+      <w:r>
+        <w:rPr>
+          <w:b/>
+          <w:bCs/>
+        </w:rPr>
+        <w:t>Limitations</w:t>
+      </w:r>
+      <w:r>
+        <w:rPr>
+          <w:b/>
+          <w:bCs/>
+        </w:rPr>
+        <w:t xml:space="preserve"> of transformers</w:t>
+      </w:r>
+      <w:r>
+        <w:rPr>
+          <w:b/>
+          <w:bCs/>
+        </w:rPr>
+        <w:t>:</w:t>
+      </w:r>
+      <w:r>
+        <w:t> As effective as stand-alone neural approaches are, they are usually criticized for their lack of readability and interpretability by humans, as was mentioned in [5]. Several studies cited in [4] have shown that to be effective at AES tasks, transformer models require fine tuning.</w:t>
+      </w:r>
+      <w:r>
+        <w:t xml:space="preserve"> </w:t>
+      </w:r>
+    </w:p>
+    <w:p>
+      <w:pPr>
+        <w:spacing w:line="360" w:lineRule="auto"/>
+      </w:pPr>
+      <w:r>
+        <w:t xml:space="preserve">The transformer is essential </w:t>
+      </w:r>
+      <w:r>
+        <w:t xml:space="preserve">to </w:t>
+      </w:r>
+      <w:proofErr w:type="spellStart"/>
+      <w:r>
+        <w:t>BrainPower</w:t>
+      </w:r>
+      <w:proofErr w:type="spellEnd"/>
+      <w:r>
+        <w:t xml:space="preserve"> </w:t>
+      </w:r>
+      <w:r>
+        <w:t>providing interpretable trait and holistic scores</w:t>
+      </w:r>
+      <w:r>
+        <w:t xml:space="preserve">. It however does not contribute to the accessibility of the system. </w:t>
+      </w:r>
+      <w:r>
+        <w:t xml:space="preserve">The section that follows discusses the critical OCR and ASR input components – the components incorporated into the system to make it accessible. </w:t>
+      </w:r>
+    </w:p>
+    <w:p>
+      <w:pPr>
+        <w:pStyle w:val="Heading3"/>
+        <w:spacing w:line="360" w:lineRule="auto"/>
+      </w:pPr>
+      <w:bookmarkStart w:id="7" w:name="_Toc237985777"/>
+      <w:r>
+        <w:t>2.1.2 Optical Character Recognition (OCR)</w:t>
+      </w:r>
+      <w:bookmarkEnd w:id="7"/>
+    </w:p>
+    <w:p>
+      <w:pPr>
+        <w:spacing w:line="360" w:lineRule="auto"/>
+      </w:pPr>
+      <w:r>
+        <w:t xml:space="preserve">Jain et al. </w:t>
+      </w:r>
+      <w:r>
+        <w:t xml:space="preserve">[8] defines OCR as a computational technology that extracts text in an editable format from PDF files, scanned or hand-written documents, images etc. [9] describes traditional OCR systems as comprising two modules: a text detection module </w:t>
+      </w:r>
+      <w:r>
+        <w:lastRenderedPageBreak/>
+        <w:t>and a text recognition module. Text detection localizes all text blocks at word-level or text-line level while text recognition aims to understand the text image content and transcribe the visual signals into natural language tokens [9].</w:t>
+      </w:r>
+    </w:p>
+    <w:p>
+      <w:pPr>
+        <w:spacing w:line="360" w:lineRule="auto"/>
+      </w:pPr>
+      <w:r>
+        <w:t>Mostafa et al. [10] summarized work done using OCR to digitize Bangla scripts - a diverse and complicated language in written form. They concluded that CNN architectures are the most accurate tried and tested method for that task. Although no evidence is given of the performance of transformer models, the researchers do acknowledge their potential. The decision to experiment with Bangla script as compared to English may be due to its perceived difficulty compared to English although the research did not make that claim.</w:t>
+      </w:r>
+    </w:p>
+    <w:p>
+      <w:pPr>
+        <w:spacing w:line="360" w:lineRule="auto"/>
+      </w:pPr>
+      <w:r>
+        <w:rPr>
+          <w:b/>
+          <w:bCs/>
+        </w:rPr>
+        <w:t>Limitations</w:t>
+      </w:r>
+      <w:r>
+        <w:rPr>
+          <w:b/>
+          <w:bCs/>
+        </w:rPr>
+        <w:t xml:space="preserve"> of OCR sy</w:t>
+      </w:r>
+      <w:r>
+        <w:rPr>
+          <w:b/>
+          <w:bCs/>
+        </w:rPr>
+        <w:t>s</w:t>
+      </w:r>
+      <w:r>
+        <w:rPr>
+          <w:b/>
+          <w:bCs/>
+        </w:rPr>
+        <w:t>tems</w:t>
+      </w:r>
+      <w:r>
+        <w:rPr>
+          <w:b/>
+          <w:bCs/>
+        </w:rPr>
+        <w:t>:</w:t>
+      </w:r>
+      <w:r>
+        <w:t> No mention is made of other architectures or listing of benchmarks for a performance comparison. Also, the study does not give evidence of CNNs being trained on English language typed or cursive handwriting datasets.</w:t>
+      </w:r>
+    </w:p>
+    <w:p>
+      <w:pPr>
+        <w:spacing w:line="360" w:lineRule="auto"/>
+        <w:rPr>
+          <w:b/>
+          <w:bCs/>
+        </w:rPr>
+      </w:pPr>
+      <w:r>
+        <w:rPr>
+          <w:b/>
+          <w:bCs/>
+        </w:rPr>
+        <w:t>Tr-OCR</w:t>
+      </w:r>
+    </w:p>
+    <w:p>
+      <w:pPr>
+        <w:spacing w:line="360" w:lineRule="auto"/>
+      </w:pPr>
+      <w:r>
+        <w:t xml:space="preserve">Li et al. </w:t>
+      </w:r>
+      <w:r>
+        <w:t>[9] achieved state-of-the-art results on printed, handwritten and scene text image datasets with Tr-OCR, an end-to-end Transformer-based model. Tr-OCR achieved word-level precision, recall and F1 scores of 96.59, 96.57 and 96.58 respectively on the SROIE (Scanned Receipts OCR and Image Formation Extraction) dataset. It also achieved a state-of-the-art CER (Character Error Rate) of 2.89 on the IAM Handwriting Dataset, a dataset containing, according to [11], natural variety, cursive elements and mixed script samples of handwriting.</w:t>
+      </w:r>
+    </w:p>
+    <w:p>
+      <w:pPr>
+        <w:spacing w:line="360" w:lineRule="auto"/>
+      </w:pPr>
+      <w:r>
+        <w:rPr>
+          <w:b/>
+          <w:bCs/>
+        </w:rPr>
+        <w:t>Limitations</w:t>
+      </w:r>
+      <w:r>
+        <w:rPr>
+          <w:b/>
+          <w:bCs/>
+        </w:rPr>
+        <w:t xml:space="preserve"> of Tr-OCR</w:t>
+      </w:r>
+      <w:r>
+        <w:rPr>
+          <w:b/>
+          <w:bCs/>
+        </w:rPr>
+        <w:t>:</w:t>
+      </w:r>
+      <w:r>
+        <w:t> According to [12], Tr-OCR is designed for single-line text detection and failed to extract text from full-page or paragraph-level images. In one experiment it achieved a low accuracy of around 50-60% in text extraction.</w:t>
+      </w:r>
+    </w:p>
+    <w:p>
+      <w:pPr>
+        <w:spacing w:line="360" w:lineRule="auto"/>
+      </w:pPr>
+      <w:proofErr w:type="spellStart"/>
+      <w:r>
+        <w:t>BrainPower</w:t>
+      </w:r>
+      <w:proofErr w:type="spellEnd"/>
+      <w:r>
+        <w:t xml:space="preserve"> relies on full page text extraction so to utilise Tr-OCR essays must be segmented into a series of sentence-images, fed to the model and then recombined. This </w:t>
+      </w:r>
+      <w:r>
+        <w:t xml:space="preserve">raises the question – can </w:t>
+      </w:r>
+      <w:r>
+        <w:t xml:space="preserve">the OCR function of </w:t>
+      </w:r>
+      <w:proofErr w:type="spellStart"/>
+      <w:r>
+        <w:t>BrainPower</w:t>
+      </w:r>
+      <w:proofErr w:type="spellEnd"/>
+      <w:r>
+        <w:t xml:space="preserve"> utilise Tr-OCR's proven handwriting recognition and </w:t>
+      </w:r>
+      <w:proofErr w:type="spellStart"/>
+      <w:r>
+        <w:t>PaddleOCR's</w:t>
+      </w:r>
+      <w:proofErr w:type="spellEnd"/>
+      <w:r>
+        <w:t xml:space="preserve"> robust text detection capabilities?</w:t>
+      </w:r>
+    </w:p>
+    <w:p>
+      <w:pPr>
+        <w:spacing w:line="360" w:lineRule="auto"/>
+      </w:pPr>
+      <w:r>
+        <w:lastRenderedPageBreak/>
+        <w:t xml:space="preserve">A study carried out by [13], where YOLOv10, an object detector, was integrated with Tr-OCR and </w:t>
+      </w:r>
+      <w:proofErr w:type="spellStart"/>
+      <w:r>
+        <w:t>PaddleOCR</w:t>
+      </w:r>
+      <w:proofErr w:type="spellEnd"/>
+      <w:r>
+        <w:t xml:space="preserve"> for reliable text detection, found that Tr-OCR provided the best overall solution for reliable, high-accuracy container ISO code recognition with a recognition accuracy of 92% outperforming </w:t>
+      </w:r>
+      <w:proofErr w:type="spellStart"/>
+      <w:r>
+        <w:t>PaddleOCR</w:t>
+      </w:r>
+      <w:proofErr w:type="spellEnd"/>
+      <w:r>
+        <w:t>, a hybrid CNN-Transformer model.</w:t>
+      </w:r>
+    </w:p>
+    <w:p>
+      <w:pPr>
+        <w:spacing w:line="360" w:lineRule="auto"/>
+      </w:pPr>
+      <w:r>
+        <w:rPr>
+          <w:b/>
+          <w:bCs/>
+        </w:rPr>
+        <w:t>Limitations</w:t>
+      </w:r>
+      <w:r>
+        <w:rPr>
+          <w:b/>
+          <w:bCs/>
+        </w:rPr>
+        <w:t xml:space="preserve"> Tr-OCR paired with YOLOv10</w:t>
+      </w:r>
+      <w:r>
+        <w:rPr>
+          <w:b/>
+          <w:bCs/>
+        </w:rPr>
+        <w:t>:</w:t>
+      </w:r>
+      <w:r>
+        <w:t xml:space="preserve"> The research was carried out on text printed/painted on containers. Such text is usually printed using a stencil ensuring uniform height and spacing. There is also no evidence from this research to support the usage of YOLO and </w:t>
+      </w:r>
+      <w:proofErr w:type="spellStart"/>
+      <w:r>
+        <w:t>PaddleOCR</w:t>
+      </w:r>
+      <w:proofErr w:type="spellEnd"/>
+      <w:r>
+        <w:t xml:space="preserve"> in combination for detecting handwritten text.</w:t>
+      </w:r>
+    </w:p>
+    <w:p>
+      <w:pPr>
+        <w:spacing w:line="360" w:lineRule="auto"/>
+        <w:rPr>
+          <w:b/>
+          <w:bCs/>
+        </w:rPr>
+      </w:pPr>
+      <w:proofErr w:type="spellStart"/>
+      <w:r>
+        <w:rPr>
+          <w:b/>
+          <w:bCs/>
+        </w:rPr>
+        <w:t>PaddleOCR</w:t>
+      </w:r>
+      <w:proofErr w:type="spellEnd"/>
+    </w:p>
+    <w:p>
+      <w:pPr>
+        <w:spacing w:line="360" w:lineRule="auto"/>
+      </w:pPr>
+      <w:proofErr w:type="spellStart"/>
+      <w:r>
+        <w:t>PaddleOCR</w:t>
+      </w:r>
+      <w:proofErr w:type="spellEnd"/>
+      <w:r>
+        <w:t xml:space="preserve"> is an open-source OCR model launched by Baidu Paddle</w:t>
+      </w:r>
+      <w:r>
+        <w:t xml:space="preserve"> [14]</w:t>
+      </w:r>
+      <w:r>
+        <w:t>. The architecture always maintains the three-stage pipeline design of "text-detection + direction classification + text recognition".</w:t>
+      </w:r>
+      <w:r>
+        <w:t xml:space="preserve"> </w:t>
+      </w:r>
+      <w:r>
+        <w:t>Wang et al.</w:t>
+      </w:r>
+      <w:r>
+        <w:t xml:space="preserve"> </w:t>
+      </w:r>
+      <w:r>
+        <w:t xml:space="preserve"> [14] tested the model on a dataset containing 200 national grids stand slogans and power supply line maps collected on the spot at a power generation environment. The images were captured at different angles under varying lighting conditions. The model achieved high detection accuracy of over 95% for standardized slogans and power supply circuit diagrams. It also achieved 93.3% and 86.6% average recognition for standardized slogans and power supply circuit diagrams respectively [14].</w:t>
+      </w:r>
+    </w:p>
+    <w:p>
+      <w:pPr>
+        <w:spacing w:line="360" w:lineRule="auto"/>
+      </w:pPr>
+      <w:r>
+        <w:rPr>
+          <w:b/>
+          <w:bCs/>
+        </w:rPr>
+        <w:t>Limitation</w:t>
+      </w:r>
+      <w:r>
+        <w:rPr>
+          <w:b/>
+          <w:bCs/>
+        </w:rPr>
+        <w:t xml:space="preserve"> of </w:t>
+      </w:r>
+      <w:proofErr w:type="spellStart"/>
+      <w:r>
+        <w:rPr>
+          <w:b/>
+          <w:bCs/>
+        </w:rPr>
+        <w:t>PaddleOCR</w:t>
+      </w:r>
+      <w:proofErr w:type="spellEnd"/>
+      <w:r>
+        <w:rPr>
+          <w:b/>
+          <w:bCs/>
+        </w:rPr>
+        <w:t>:</w:t>
+      </w:r>
+      <w:r>
+        <w:t xml:space="preserve"> This study focused solely on block printed text, which is generally uniform, evenly spaced and aligned. As such there is no evidence to suggest that </w:t>
+      </w:r>
+      <w:proofErr w:type="spellStart"/>
+      <w:r>
+        <w:t>PaddleOCR</w:t>
+      </w:r>
+      <w:proofErr w:type="spellEnd"/>
+      <w:r>
+        <w:t xml:space="preserve"> can recognize handwritten text. However, it recognizes text from whole page documents, unlike Tr-OCR. These studies focused on OCR, but ASR presents an optional modality for presenting an essay for evaluation.</w:t>
+      </w:r>
+    </w:p>
+    <w:p>
+      <w:pPr>
+        <w:pStyle w:val="Heading3"/>
+        <w:spacing w:line="360" w:lineRule="auto"/>
+      </w:pPr>
+      <w:bookmarkStart w:id="8" w:name="_Toc237985778"/>
+      <w:r>
+        <w:t>2.1.3 Automated Speech Recognition (ASR), Speech-To-Text (STT)</w:t>
+      </w:r>
+      <w:bookmarkEnd w:id="8"/>
+    </w:p>
+    <w:p>
+      <w:pPr>
+        <w:spacing w:line="360" w:lineRule="auto"/>
+      </w:pPr>
+      <w:r>
+        <w:t xml:space="preserve">According to </w:t>
+      </w:r>
+      <w:r>
+        <w:t>Elakkiya</w:t>
+      </w:r>
+      <w:r>
+        <w:t xml:space="preserve"> et al. </w:t>
+      </w:r>
+      <w:r>
+        <w:t>[15] A speech-to-text (STT) system accepts an audio input signal from either a person or a machine and detects and converts individual words and phrases into text. Advances in deep learning technology has profoundly transformed automatic speech recognition (ASR) over the past decade</w:t>
+      </w:r>
+      <w:r>
+        <w:t xml:space="preserve"> </w:t>
+      </w:r>
+      <w:r>
+        <w:t>[16]</w:t>
+      </w:r>
+      <w:r>
+        <w:t xml:space="preserve">. Historically, ASR </w:t>
+      </w:r>
+      <w:r>
+        <w:lastRenderedPageBreak/>
+        <w:t>systems were constructed from a complex pipeline of independently trained components for example, a pronunciation model (lexicon) and a language model (LM). Like early AES systems, features had to be hand engineered, which was tedious and did not scale well.</w:t>
+      </w:r>
+    </w:p>
+    <w:p>
+      <w:pPr>
+        <w:spacing w:line="360" w:lineRule="auto"/>
+      </w:pPr>
+      <w:r>
+        <w:t xml:space="preserve">Hinton et al. </w:t>
+      </w:r>
+      <w:r>
+        <w:t>[17] described how three major research groups - Microsoft Research (MSR), Google and IBM Research, achieved significant improvements in a variety of state-of-the-art ASR systems with Deep Neural Networks. According to [16], the modern era of ASR is defined by firstly, a shift towards end-to-end (E2E) models – systems that learn a direct mapping from acoustic features to text using a single, jointly optimized neural network which simplifies training and improves performance. Secondly, a shift in the data paradigm. Early deep learning systems used supervised learning to train on large datasets of labelled data. Modern systems have moved towards unlabelled data. Self-supervised systems have demonstrated the ability to learn from raw audio data while weakly supervised systems have demonstrated the ability to generalise to data they were never trained on [16].</w:t>
+      </w:r>
+    </w:p>
+    <w:p>
+      <w:pPr>
+        <w:spacing w:line="360" w:lineRule="auto"/>
+        <w:rPr>
+          <w:b/>
+          <w:bCs/>
+        </w:rPr>
+      </w:pPr>
+      <w:r>
+        <w:rPr>
+          <w:b/>
+          <w:bCs/>
+        </w:rPr>
+        <w:t>Whisper</w:t>
+      </w:r>
+    </w:p>
+    <w:p>
+      <w:pPr>
+        <w:spacing w:line="360" w:lineRule="auto"/>
+      </w:pPr>
+      <w:r>
+        <w:t>One model that exemplifies this shift is OpenAI's Whisper, a transform</w:t>
+      </w:r>
+      <w:r>
+        <w:t xml:space="preserve">er </w:t>
+      </w:r>
+      <w:r>
+        <w:t>[18</w:t>
+      </w:r>
+      <w:proofErr w:type="gramStart"/>
+      <w:r>
+        <w:t xml:space="preserve">] </w:t>
+      </w:r>
+      <w:r>
+        <w:t>.</w:t>
+      </w:r>
+      <w:proofErr w:type="gramEnd"/>
+      <w:r>
+        <w:t xml:space="preserve"> For translation tasks, the Transformer can be trained significantly faster than architectures based on recurrent or convolutional layers</w:t>
+      </w:r>
+      <w:r>
+        <w:t xml:space="preserve"> </w:t>
+      </w:r>
+      <w:r>
+        <w:t>[19]</w:t>
+      </w:r>
+      <w:r>
+        <w:t>. The Whisper model was trained on an enormous dataset of 680,000 hours of labelled audio. Whisper transcribed 950 out of 1000 words correctly in research carried out by [20] achieving 95% accuracy. The model's integration into classroom technology effectively supports students with diverse linguistic, cultural, and ability-based needs, achieving high accuracy and frequency responsiveness. Whisper is a valuable tool for educators seeking to foster a more accessible learning environment [20].</w:t>
+      </w:r>
+    </w:p>
+    <w:p>
+      <w:pPr>
+        <w:spacing w:line="360" w:lineRule="auto"/>
+      </w:pPr>
+      <w:r>
+        <w:rPr>
+          <w:b/>
+          <w:bCs/>
+        </w:rPr>
+        <w:t>Limitations</w:t>
+      </w:r>
+      <w:r>
+        <w:rPr>
+          <w:b/>
+          <w:bCs/>
+        </w:rPr>
+        <w:t xml:space="preserve"> of Whisper</w:t>
+      </w:r>
+      <w:r>
+        <w:rPr>
+          <w:b/>
+          <w:bCs/>
+        </w:rPr>
+        <w:t>:</w:t>
+      </w:r>
+      <w:r>
+        <w:t xml:space="preserve"> Occasionally Whisper hallucinates. </w:t>
+      </w:r>
+      <w:r>
+        <w:t>Hlongwane</w:t>
+      </w:r>
+      <w:r>
+        <w:t xml:space="preserve"> et al. </w:t>
+      </w:r>
+      <w:r>
+        <w:t xml:space="preserve">[20] discovered that about 1% of transcriptions contain fabricated phrases that were not present in the original audio, and that a significant portion of these can lead to harmful implications. The study further indicated that systems which lack the necessary </w:t>
+      </w:r>
+      <w:r>
+        <w:lastRenderedPageBreak/>
+        <w:t>processing power will experience transcription latency, as Whisper models occupy gigabytes of storage space and this may be undesirable.</w:t>
+      </w:r>
+    </w:p>
+    <w:p>
+      <w:pPr>
+        <w:pStyle w:val="Heading3"/>
+        <w:spacing w:line="360" w:lineRule="auto"/>
+      </w:pPr>
+      <w:bookmarkStart w:id="9" w:name="_Toc237985779"/>
+      <w:r>
+        <w:t>2.1.4 Multimodal Systems</w:t>
+      </w:r>
+      <w:bookmarkEnd w:id="9"/>
+    </w:p>
+    <w:p>
+      <w:pPr>
+        <w:spacing w:line="360" w:lineRule="auto"/>
+      </w:pPr>
+      <w:r>
+        <w:t xml:space="preserve">This section discusses some multimodal systems that share some similarity with </w:t>
+      </w:r>
+      <w:proofErr w:type="spellStart"/>
+      <w:r>
+        <w:t>BrainPower</w:t>
+      </w:r>
+      <w:proofErr w:type="spellEnd"/>
+      <w:r>
+        <w:t xml:space="preserve"> but however, fail to provide in entirety for all input modalities, catering to students who have writing disabilities. These observations present the following two gaps that this research hopes to fill:</w:t>
+      </w:r>
+      <w:r>
+        <w:br/>
+      </w:r>
+      <w:r>
+        <w:rPr>
+          <w:b/>
+          <w:bCs/>
+        </w:rPr>
+        <w:t>Gap 1</w:t>
+      </w:r>
+      <w:r>
+        <w:t xml:space="preserve"> - most AES systems ignore input equity.</w:t>
+      </w:r>
+      <w:r>
+        <w:br/>
+      </w:r>
+      <w:r>
+        <w:rPr>
+          <w:b/>
+          <w:bCs/>
+        </w:rPr>
+        <w:t>Gap 2</w:t>
+      </w:r>
+      <w:r>
+        <w:t xml:space="preserve"> – the architecture of commercial multimodal products is not accessible for analysis.</w:t>
+      </w:r>
+    </w:p>
+    <w:p>
+      <w:pPr>
+        <w:spacing w:line="360" w:lineRule="auto"/>
+      </w:pPr>
+      <w:r>
+        <w:t>An extensive search of Google Scholar, IEEE Explore, ACM and similar services and querying current AI applications like ChatGPT and Gemini with the search terms "multimodal AES", "accessible multimodal AES" and "hybrid multimodal AES" reveals that such systems are exceptionally rare. The results returned were of systems that orchestrated at most two AI models of disparate modality. This indicates a gap in current AES technology revealing that most AES systems ignore input equity.</w:t>
+      </w:r>
+    </w:p>
+    <w:p>
+      <w:pPr>
+        <w:spacing w:line="360" w:lineRule="auto"/>
+      </w:pPr>
+      <w:r>
+        <w:t xml:space="preserve">The architecture of commercially available multimodal systems such as </w:t>
+      </w:r>
+      <w:proofErr w:type="spellStart"/>
+      <w:r>
+        <w:t>IntelliMetric</w:t>
+      </w:r>
+      <w:proofErr w:type="spellEnd"/>
+      <w:r>
+        <w:t xml:space="preserve">® are not freely available for analysis. </w:t>
+      </w:r>
+      <w:r>
+        <w:t>This</w:t>
+      </w:r>
+      <w:r>
+        <w:t xml:space="preserve"> research project intends to fill the gap by implementing an accessible, interpretable, hybrid, multimodal AES system by orchestrating three pre-trained models – an OCR, ASR and a transformer model that accepts as input, written, typed and spoken essays and transparently scores them.</w:t>
+      </w:r>
+    </w:p>
+    <w:p>
+      <w:pPr>
+        <w:spacing w:line="360" w:lineRule="auto"/>
+        <w:rPr>
+          <w:b/>
+          <w:bCs/>
+        </w:rPr>
+      </w:pPr>
+      <w:r>
+        <w:rPr>
+          <w:b/>
+          <w:bCs/>
+        </w:rPr>
+        <w:t>CAFES</w:t>
+      </w:r>
+    </w:p>
+    <w:p>
+      <w:pPr>
+        <w:spacing w:line="360" w:lineRule="auto"/>
+      </w:pPr>
+      <w:r>
+        <w:t xml:space="preserve">Su et al. </w:t>
+      </w:r>
+      <w:r>
+        <w:t xml:space="preserve">[21] proposed a multimodal AES system called CAFES that uses a MLLM to process graphics e.g. a scenery along with text. The system orchestrates GPT-4o as the MLLM. The dataset used for their experiment is the ESSAYJUDGE dataset which consists of 1,054 multimodal essays written at the university level. This dataset is limited in that it does not cover complex visual inputs such as film frames. </w:t>
+      </w:r>
+    </w:p>
+    <w:p>
+      <w:pPr>
+        <w:spacing w:line="360" w:lineRule="auto"/>
+      </w:pPr>
+      <w:r>
+        <w:rPr>
+          <w:b/>
+          <w:bCs/>
+        </w:rPr>
+        <w:t>Limitation</w:t>
+      </w:r>
+      <w:r>
+        <w:rPr>
+          <w:b/>
+          <w:bCs/>
+        </w:rPr>
+        <w:t xml:space="preserve"> of CAFES</w:t>
+      </w:r>
+      <w:r>
+        <w:rPr>
+          <w:b/>
+          <w:bCs/>
+        </w:rPr>
+        <w:t>:</w:t>
+      </w:r>
+      <w:r>
+        <w:rPr>
+          <w:b/>
+          <w:bCs/>
+        </w:rPr>
+        <w:t xml:space="preserve"> </w:t>
+      </w:r>
+      <w:r>
+        <w:t>This system although multimodal, is still not designed to cater to students with disabilities, as it, like other AES systems ignores input equity.</w:t>
+      </w:r>
+    </w:p>
+    <w:p>
+      <w:pPr>
+        <w:spacing w:line="360" w:lineRule="auto"/>
+        <w:rPr>
+          <w:b/>
+          <w:bCs/>
+        </w:rPr>
+      </w:pPr>
+      <w:proofErr w:type="spellStart"/>
+      <w:r>
+        <w:rPr>
+          <w:b/>
+          <w:bCs/>
+        </w:rPr>
+        <w:lastRenderedPageBreak/>
+        <w:t>ExaGrade</w:t>
+      </w:r>
+      <w:proofErr w:type="spellEnd"/>
+    </w:p>
+    <w:p>
+      <w:pPr>
+        <w:spacing w:line="360" w:lineRule="auto"/>
+      </w:pPr>
+      <w:proofErr w:type="spellStart"/>
+      <w:r>
+        <w:t>Algablan</w:t>
+      </w:r>
+      <w:proofErr w:type="spellEnd"/>
+      <w:r>
+        <w:t xml:space="preserve"> </w:t>
+      </w:r>
+      <w:r>
+        <w:t xml:space="preserve">et al. </w:t>
+      </w:r>
+      <w:r>
+        <w:t xml:space="preserve">[22] developed a multimodal system </w:t>
+      </w:r>
+      <w:proofErr w:type="spellStart"/>
+      <w:r>
+        <w:t>ExaGrade</w:t>
+      </w:r>
+      <w:proofErr w:type="spellEnd"/>
+      <w:r>
+        <w:t xml:space="preserve"> that integrates optical character recognition (OCR) with the generative pre-trained transformer (GPT). The platform integrates two pre-trained models - </w:t>
+      </w:r>
+      <w:proofErr w:type="spellStart"/>
+      <w:r>
+        <w:t>HandwritingOCR</w:t>
+      </w:r>
+      <w:proofErr w:type="spellEnd"/>
+      <w:r>
+        <w:t xml:space="preserve"> to extract text from handwritten exam papers and like [21] employs GPT-4 to evaluate and score student responses. The platform offers features such as exam creation where for MCQs and TFs the teacher supplies the answers, and student exam completion using handwritten or online modalities.</w:t>
+      </w:r>
+    </w:p>
+    <w:p>
+      <w:pPr>
+        <w:spacing w:line="360" w:lineRule="auto"/>
+      </w:pPr>
+      <w:r>
+        <w:rPr>
+          <w:b/>
+          <w:bCs/>
+        </w:rPr>
+        <w:t>Limitation</w:t>
+      </w:r>
+      <w:r>
+        <w:rPr>
+          <w:b/>
+          <w:bCs/>
+        </w:rPr>
+        <w:t xml:space="preserve"> of </w:t>
+      </w:r>
+      <w:proofErr w:type="spellStart"/>
+      <w:r>
+        <w:rPr>
+          <w:b/>
+          <w:bCs/>
+        </w:rPr>
+        <w:t>ExaGrade</w:t>
+      </w:r>
+      <w:proofErr w:type="spellEnd"/>
+      <w:r>
+        <w:rPr>
+          <w:b/>
+          <w:bCs/>
+        </w:rPr>
+        <w:t>:</w:t>
+      </w:r>
+      <w:r>
+        <w:rPr>
+          <w:b/>
+          <w:bCs/>
+        </w:rPr>
+        <w:t xml:space="preserve"> </w:t>
+      </w:r>
+      <w:r>
+        <w:t xml:space="preserve">The platform is described as accessible; however, accessibility only encompasses availability online at GitHub since the platform is released as an open-source project [22]. </w:t>
+      </w:r>
+      <w:proofErr w:type="spellStart"/>
+      <w:r>
+        <w:t>ExaGrade</w:t>
+      </w:r>
+      <w:proofErr w:type="spellEnd"/>
+      <w:r>
+        <w:t xml:space="preserve"> is not accessible to students with writing disabilities. Notably absent from the system is a means to input an essay in audible form.</w:t>
+      </w:r>
+    </w:p>
+    <w:p>
+      <w:pPr>
+        <w:spacing w:line="360" w:lineRule="auto"/>
+      </w:pPr>
+      <w:r>
+        <w:t xml:space="preserve">Gao et al. </w:t>
+      </w:r>
+      <w:r>
+        <w:t xml:space="preserve">[23] proposed </w:t>
+      </w:r>
+      <w:proofErr w:type="spellStart"/>
+      <w:r>
+        <w:t>VisualAES</w:t>
+      </w:r>
+      <w:proofErr w:type="spellEnd"/>
+      <w:r>
+        <w:t xml:space="preserve">, a bi-modal system that utilizes both textual and visual features for handwritten essay scoring. It orchestrates three pretrained transformer-based models to take both textual features and visual features extracted by Faster R-CNN and then uses a stacking ensemble model to robustly map their output to a final score. This system's architecture is more congruent with what is being proposed in this research – </w:t>
+      </w:r>
+      <w:proofErr w:type="spellStart"/>
+      <w:r>
+        <w:t>an</w:t>
+      </w:r>
+      <w:proofErr w:type="spellEnd"/>
+      <w:r>
+        <w:t xml:space="preserve"> OCR model to convert text from scanned essays to digital text for processing, and a transformer model for essay scoring. </w:t>
+      </w:r>
+      <w:proofErr w:type="spellStart"/>
+      <w:r>
+        <w:t>VisualAES</w:t>
+      </w:r>
+      <w:proofErr w:type="spellEnd"/>
+      <w:r>
+        <w:t xml:space="preserve"> was evaluated on the Automated Student Assessment Prize (ASAP) dataset and their own handwritten Chinese Student's handwritten essay dataset (</w:t>
+      </w:r>
+      <w:proofErr w:type="spellStart"/>
+      <w:r>
+        <w:t>ChnStd</w:t>
+      </w:r>
+      <w:proofErr w:type="spellEnd"/>
+      <w:r>
+        <w:t xml:space="preserve">). Their results showed that their system outperformed all state-of-the-art methods on both datasets. </w:t>
+      </w:r>
+    </w:p>
+    <w:p>
+      <w:pPr>
+        <w:spacing w:line="360" w:lineRule="auto"/>
+      </w:pPr>
+      <w:r>
+        <w:rPr>
+          <w:b/>
+          <w:bCs/>
+        </w:rPr>
+        <w:t>Limitation</w:t>
+      </w:r>
+      <w:r>
+        <w:rPr>
+          <w:b/>
+          <w:bCs/>
+        </w:rPr>
+        <w:t xml:space="preserve"> of </w:t>
+      </w:r>
+      <w:proofErr w:type="spellStart"/>
+      <w:r>
+        <w:rPr>
+          <w:b/>
+          <w:bCs/>
+        </w:rPr>
+        <w:t>VisualAES</w:t>
+      </w:r>
+      <w:proofErr w:type="spellEnd"/>
+      <w:r>
+        <w:rPr>
+          <w:b/>
+          <w:bCs/>
+        </w:rPr>
+        <w:t>:</w:t>
+      </w:r>
+      <w:r>
+        <w:rPr>
+          <w:b/>
+          <w:bCs/>
+        </w:rPr>
+        <w:t xml:space="preserve"> </w:t>
+      </w:r>
+      <w:proofErr w:type="spellStart"/>
+      <w:r>
+        <w:t>VisualAES</w:t>
+      </w:r>
+      <w:proofErr w:type="spellEnd"/>
+      <w:r>
+        <w:t xml:space="preserve"> like CAFES does not provide accessibility for students suffering writing disability.</w:t>
+      </w:r>
+    </w:p>
+    <w:p>
+      <w:pPr>
+        <w:spacing w:line="360" w:lineRule="auto"/>
+      </w:pPr>
+      <w:r>
+        <w:t>Hlongwane</w:t>
+      </w:r>
+      <w:r>
+        <w:t xml:space="preserve"> </w:t>
+      </w:r>
+      <w:r>
+        <w:t xml:space="preserve">et al. </w:t>
+      </w:r>
+      <w:r>
+        <w:t xml:space="preserve">[20] developed an inclusive learning classroom using the OpenAI Whisper model. The model was selected to promote diversity and inclusivity in education through real-time transcription and translation for students with diverse linguistic and cultural abilities and backgrounds. The results were encouraging as the model achieved high accuracy especially in an environment where ambient noise did </w:t>
+      </w:r>
+      <w:r>
+        <w:lastRenderedPageBreak/>
+        <w:t>not alter the audio signal input. This system however is limited in input modality as it only focuses on audio transcription with no allocation made for submission of handwritten work.</w:t>
+      </w:r>
+    </w:p>
+    <w:p>
+      <w:pPr>
+        <w:spacing w:line="360" w:lineRule="auto"/>
+      </w:pPr>
+      <w:r>
+        <w:t>Baclayon</w:t>
+      </w:r>
+      <w:r>
+        <w:t xml:space="preserve"> </w:t>
+      </w:r>
+      <w:r>
+        <w:t xml:space="preserve">et al. </w:t>
+      </w:r>
+      <w:r>
+        <w:t>[24] developed a system for investigating the possibility of automatically grading handwritten essays by leveraging OCR together with a fine-tuned and trained Large Language Model (LLM) Mistral 7b. According to the BERT Score analysis, the precision, recall and F1 scores were observed to be consistent over all the essays. The F1 score of 85.78% demonstrates the model's overall stability in replicating human-grading decisions with a high degree of consistency. The system used a Moodle plugin that integrated Mistral 7b into the platform.</w:t>
+      </w:r>
+    </w:p>
+    <w:p>
+      <w:pPr>
+        <w:spacing w:line="360" w:lineRule="auto"/>
+      </w:pPr>
+      <w:r>
+        <w:rPr>
+          <w:b/>
+          <w:bCs/>
+        </w:rPr>
+        <w:t>Limitation</w:t>
+      </w:r>
+      <w:r>
+        <w:rPr>
+          <w:b/>
+          <w:bCs/>
+        </w:rPr>
+        <w:t xml:space="preserve"> of Baclayon et al.’s sy</w:t>
+      </w:r>
+      <w:r>
+        <w:rPr>
+          <w:b/>
+          <w:bCs/>
+        </w:rPr>
+        <w:t>s</w:t>
+      </w:r>
+      <w:r>
+        <w:rPr>
+          <w:b/>
+          <w:bCs/>
+        </w:rPr>
+        <w:t>tems</w:t>
+      </w:r>
+      <w:r>
+        <w:rPr>
+          <w:b/>
+          <w:bCs/>
+        </w:rPr>
+        <w:t>:</w:t>
+      </w:r>
+      <w:r>
+        <w:rPr>
+          <w:b/>
+          <w:bCs/>
+        </w:rPr>
+        <w:t xml:space="preserve"> </w:t>
+      </w:r>
+      <w:r>
+        <w:t xml:space="preserve"> There is no mention of inclusivity in the system developed by [24] showing once again that most modern AES systems focus on the quality of essay scoring and do not prioritize input equity, emphasizing the need for an integrated system.</w:t>
+      </w:r>
+    </w:p>
+    <w:p>
+      <w:pPr>
+        <w:pStyle w:val="Heading3"/>
+        <w:spacing w:line="360" w:lineRule="auto"/>
+      </w:pPr>
+      <w:bookmarkStart w:id="10" w:name="_Toc237985780"/>
+      <w:r>
+        <w:t>2.2 Challenges and consideration for component selection</w:t>
+      </w:r>
+      <w:bookmarkEnd w:id="10"/>
     </w:p>
     <w:p>
       <w:pPr>
@@ -4842,739 +6086,321 @@
         <w:rPr>
           <w:rStyle w:val="Heading4Char"/>
         </w:rPr>
-        <w:t>Feature engineered systems</w:t>
+        <w:t>The datasets</w:t>
       </w:r>
       <w:r>
         <w:br/>
-        <w:t>Neural approaches engineer features like sentence length and number of paragraphs and encode these in dense numerical feature vectors. A dense vector can contain several numerical values relating to a feature or combination of features. These numbers have no positional significance to humans as compared to handcrafted features as they are assigned based on weight adjustments influenced by gradient descent. This enables the network to iteratively adjust weights to learn a model that can then generalise to score new essays.</w:t>
-      </w:r>
-    </w:p>
-    <w:p>
-      <w:pPr>
-        <w:spacing w:line="360" w:lineRule="auto"/>
-      </w:pPr>
-      <w:r>
-        <w:t>[2] implemented a model for holistic scoring based on recurrent neural networks (LSTM), to learn the relationship between an input essay directly and its assigned score. The system encodes the information required for essay evaluation and learns the complex patterns in the data. Their system outperformed a strong baseline by 5.6% in terms of QWK, without requiring any feature engineering.</w:t>
-      </w:r>
-    </w:p>
-    <w:p>
-      <w:pPr>
-        <w:spacing w:line="360" w:lineRule="auto"/>
-      </w:pPr>
-      <w:r>
-        <w:rPr>
-          <w:b/>
-          <w:bCs/>
-        </w:rPr>
-        <w:t>Limitations</w:t>
-      </w:r>
-      <w:r>
-        <w:t xml:space="preserve">: The system was not tested on a handwritten dataset, especially not one with cursive handwritten essays. According to [5], neural approaches provide scores without giving evidence of how they are arrived at. Since one of the goals of </w:t>
+        <w:t xml:space="preserve">According to [3], the most elaborate AES systems currently have trouble accurately evaluating the coherence and persuasiveness of an essay, or an argument's clarity, and that is due to two main reasons: (1) such aspects are very hard to model, and (2) the lack of datasets that provide human-graded dimension-specific data, especially compared to those that provide holistic scoring. </w:t>
       </w:r>
       <w:proofErr w:type="spellStart"/>
       <w:r>
-        <w:t>BrainPower</w:t>
+        <w:t>Elmassry</w:t>
       </w:r>
       <w:proofErr w:type="spellEnd"/>
       <w:r>
-        <w:t xml:space="preserve"> is to produce interpretable results, a neural approach will not be employed.</w:t>
-      </w:r>
-    </w:p>
-    <w:p>
-      <w:pPr>
-        <w:spacing w:line="360" w:lineRule="auto"/>
-      </w:pPr>
-      <w:r>
-        <w:t>Furthermore, more modern approaches such as transformers have been shown to be superior to neural approaches. [6] compared the performance of three neural approaches LSTM, Bi-LSTM and BERT a transformer model and concluded that the transformer model offered superior performance. [5] reviewed several pretrained models in AES and discovered that BERT outperformed all of them achieving a QWK of 0.83.</w:t>
-      </w:r>
-    </w:p>
-    <w:p>
-      <w:pPr>
-        <w:spacing w:line="360" w:lineRule="auto"/>
-      </w:pPr>
-      <w:bookmarkStart w:id="6" w:name="_Toc237985776"/>
-      <w:r>
-        <w:rPr>
-          <w:rStyle w:val="Heading3Char"/>
-        </w:rPr>
-        <w:t>2.1.1 Transformers</w:t>
-      </w:r>
-      <w:bookmarkEnd w:id="6"/>
-      <w:r>
-        <w:br/>
-        <w:t xml:space="preserve">Transformer models work by using an attention mechanism that relates each token in the text to every other token thus enabling them to capture long-range contextual dependencies. According to [3], they make use of huge datasets of existing general text </w:t>
+        <w:t xml:space="preserve"> </w:t>
+      </w:r>
+      <w:r>
+        <w:t xml:space="preserve">et al. </w:t>
+      </w:r>
+      <w:r>
+        <w:t>[5] indicates that the problem originates from AES research relying heavily on the ASAP dataset as the primary benchmark, highlighting the limited options available. Additionally, most publicly available datasets are tailored toward English-language assessment e.g., TOEFL11, CELA, or the Cambridge English assessment datasets.</w:t>
+      </w:r>
+    </w:p>
+    <w:p>
+      <w:pPr>
+        <w:spacing w:line="360" w:lineRule="auto"/>
+      </w:pPr>
+      <w:r>
+        <w:t xml:space="preserve">Su et al. </w:t>
+      </w:r>
+      <w:r>
+        <w:t xml:space="preserve">[21] further emphasizes this limitation, describing the ASAP and its extended version, ASAP++, as both containing few topics. ASAP++ adds trait-level annotations but merges key content traits into a single "CONTENT" label, decreasing granularity and interpretability. The TOEFL11 dataset, similarly, uses only coarse-grained proficiency labels (low / medium / high). Thus, models trained on the TOEFL11 dataset will </w:t>
       </w:r>
       <w:r>
         <w:lastRenderedPageBreak/>
-        <w:t>data, such as Wikipedia Corpus, to pretrain multilayer neural networks with context-sensitive meaning of and relationships between words.</w:t>
-      </w:r>
-    </w:p>
-    <w:p>
-      <w:pPr>
-        <w:spacing w:line="360" w:lineRule="auto"/>
-      </w:pPr>
-      <w:r>
-        <w:t>[4] compared the performance of several models on an AES task. The results show transformer models outperforming traditional models, achieving higher QWK scores. The best performer was a NCPR model, which used contrastive learning and utilised BERT for feature extraction achieved a QWK of 0.817, indicating a close similarity to human scoring.</w:t>
-      </w:r>
-    </w:p>
-    <w:p>
-      <w:pPr>
-        <w:spacing w:line="360" w:lineRule="auto"/>
-      </w:pPr>
-      <w:r>
-        <w:t>[3] suggests not relying solely on transformer models and like [4], proposed a technique of combining transformers with more traditional approaches like those that employ handcrafted features. [1] argued that human evaluation remains important since expert markers can identify subtle linguistic and cognitive qualities that automated systems may overlook. [4] indicated that when models work in combination the results are more promising. [7] used a hybrid model – LSTM and Word Embedding and achieved a QWK of 0.94. [3], [4] and [1] all give compelling reasons for a hybrid design for an AES system but do not give explicit indication of the format that the essay must be in for evaluation.</w:t>
-      </w:r>
-    </w:p>
-    <w:p>
-      <w:pPr>
-        <w:spacing w:line="360" w:lineRule="auto"/>
-      </w:pPr>
-      <w:r>
-        <w:rPr>
-          <w:b/>
-          <w:bCs/>
-        </w:rPr>
-        <w:t>Limitations:</w:t>
-      </w:r>
-      <w:r>
-        <w:t> As effective as stand-alone neural approaches are, they are usually criticized for their lack of readability and interpretability by humans, as was mentioned in [5]. Several studies cited in [4] have shown that to be effective at AES tasks, transformer models require fine tuning.</w:t>
-      </w:r>
-    </w:p>
-    <w:p>
-      <w:pPr>
-        <w:pStyle w:val="Heading3"/>
-        <w:spacing w:line="360" w:lineRule="auto"/>
-      </w:pPr>
-      <w:bookmarkStart w:id="7" w:name="_Toc237985777"/>
-      <w:r>
-        <w:t>2.1.2 Optical Character Recognition (OCR)</w:t>
-      </w:r>
-      <w:bookmarkEnd w:id="7"/>
-    </w:p>
-    <w:p>
-      <w:pPr>
-        <w:spacing w:line="360" w:lineRule="auto"/>
-      </w:pPr>
-      <w:r>
-        <w:t>[8] defines OCR as a computational technology that extracts text in an editable format from PDF files, scanned or hand-written documents, images etc. [9] describes traditional OCR systems as comprising two modules: a text detection module and a text recognition module. Text detection localizes all text blocks at word-level or text-line level while text recognition aims to understand the text image content and transcribe the visual signals into natural language tokens [9].</w:t>
-      </w:r>
-    </w:p>
-    <w:p>
-      <w:pPr>
-        <w:spacing w:line="360" w:lineRule="auto"/>
-      </w:pPr>
-      <w:r>
-        <w:t xml:space="preserve">Mostafa et al. [10] summarized work done using OCR to digitize Bangla scripts - a diverse and complicated language in written form. They concluded that CNN architectures are the most accurate tried and tested method for that task. Although no </w:t>
+        <w:t>inherently produce results that are difficult to interpret due to the granularity of the training data [21].</w:t>
+      </w:r>
+    </w:p>
+    <w:p>
+      <w:pPr>
+        <w:spacing w:line="360" w:lineRule="auto"/>
+      </w:pPr>
+      <w:proofErr w:type="spellStart"/>
+      <w:r>
+        <w:t>Elmassry</w:t>
+      </w:r>
+      <w:proofErr w:type="spellEnd"/>
+      <w:r>
+        <w:t xml:space="preserve"> </w:t>
+      </w:r>
+      <w:r>
+        <w:t xml:space="preserve">et al. </w:t>
+      </w:r>
+      <w:r>
+        <w:t>[5] also points out that the dataset availability and diversity issue is not limited to the field of research, but extends to commercial products, which primarily focus on English-language datasets. The quality, quantity, and availability of the data are fundamental to the model's performance. It is fitting to consider available models, discuss the impact the limited datasets have on them and propose the best option to provide reliable, interpretable trait scoring.</w:t>
+      </w:r>
+    </w:p>
+    <w:p>
+      <w:pPr>
+        <w:pStyle w:val="Heading4"/>
+        <w:spacing w:line="360" w:lineRule="auto"/>
+      </w:pPr>
+      <w:r>
+        <w:t>The models</w:t>
+      </w:r>
+    </w:p>
+    <w:p>
+      <w:pPr>
+        <w:spacing w:line="360" w:lineRule="auto"/>
+      </w:pPr>
+      <w:proofErr w:type="spellStart"/>
+      <w:r>
+        <w:t>Elmassry</w:t>
+      </w:r>
+      <w:proofErr w:type="spellEnd"/>
+      <w:r>
+        <w:t xml:space="preserve"> </w:t>
+      </w:r>
+      <w:r>
+        <w:t xml:space="preserve">et al. </w:t>
+      </w:r>
+      <w:r>
+        <w:t>[5] presents some of the issues with Transformer pretrained models as having a closed-box nature, high computational requirements, longer training times and the need for large datasets. Additionally, issues presented by [5] are data quality, biases in training data, generalization, and overfitting which still pose significant obstacles that need to be addressed.</w:t>
+      </w:r>
+    </w:p>
+    <w:p>
+      <w:pPr>
+        <w:spacing w:line="360" w:lineRule="auto"/>
+      </w:pPr>
+      <w:proofErr w:type="spellStart"/>
+      <w:r>
+        <w:t>Algablan</w:t>
+      </w:r>
+      <w:proofErr w:type="spellEnd"/>
+      <w:r>
+        <w:t xml:space="preserve"> et al. </w:t>
+      </w:r>
+      <w:r>
+        <w:t>[22] cited three studies that showed the limitations of ChatGPT, a transformer model, as an AES tool. The results indicated that ChatGPT often scores lower than human scorers and its evaluation is inconsistent due to variations in its scoring mechanism, training data, model updates, and ingrained randomness. [22] Additionally, the consistency of ChatGPT's scores over multiple evaluations was low, indicating variability and raising concerns about its reliability.</w:t>
+      </w:r>
+    </w:p>
+    <w:p>
+      <w:pPr>
+        <w:spacing w:line="360" w:lineRule="auto"/>
+      </w:pPr>
+      <w:r>
+        <w:t xml:space="preserve">Wang et al. </w:t>
+      </w:r>
+      <w:r>
+        <w:t>[25] explored the potential of using GPT-based models as an alternative solution to the data scarcity issue, comparing their performance to that of fine-tuning BERT models, which remains the state-of-the-art, in quantitative text analysis. They concluded that BERT models remain the overall go-to method for classification although GPT models can serve as alternatives on smaller tasks. GPT models are also easier to tweak; however, they are more expensive. Due to the findings of [22] and [25], GPT will not be included in this system.</w:t>
+      </w:r>
+    </w:p>
+    <w:p>
+      <w:pPr>
+        <w:spacing w:line="360" w:lineRule="auto"/>
+      </w:pPr>
+      <w:r>
+        <w:t xml:space="preserve">He et al. </w:t>
+      </w:r>
+      <w:r>
+        <w:t xml:space="preserve">[26] </w:t>
+      </w:r>
+      <w:r>
+        <w:t xml:space="preserve">introduced </w:t>
+      </w:r>
+      <w:proofErr w:type="spellStart"/>
+      <w:r>
+        <w:t>DeBERTa</w:t>
+      </w:r>
+      <w:proofErr w:type="spellEnd"/>
+      <w:r>
+        <w:t xml:space="preserve"> (Decoding-enhanced BERT with Disentangled Attention) </w:t>
+      </w:r>
+      <w:r>
+        <w:t>as</w:t>
+      </w:r>
+      <w:r>
+        <w:t xml:space="preserve"> an improvement of previous state-of-the-art pre-trained transformer models such as BERT and </w:t>
+      </w:r>
+      <w:proofErr w:type="spellStart"/>
+      <w:r>
+        <w:t>RoBERTa</w:t>
+      </w:r>
+      <w:proofErr w:type="spellEnd"/>
+      <w:r>
+        <w:t xml:space="preserve">, its predecessors. BERT and </w:t>
+      </w:r>
+      <w:proofErr w:type="spellStart"/>
+      <w:r>
+        <w:t>RoBERTa</w:t>
+      </w:r>
+      <w:proofErr w:type="spellEnd"/>
+      <w:r>
+        <w:t xml:space="preserve"> represent </w:t>
       </w:r>
       <w:r>
         <w:lastRenderedPageBreak/>
-        <w:t>evidence is given of the performance of transformer models, the researchers do acknowledge their potential. The decision to experiment with Bangla script as compared to English may be due to its perceived difficulty compared to English although the research did not make that claim.</w:t>
-      </w:r>
-    </w:p>
-    <w:p>
-      <w:pPr>
-        <w:spacing w:line="360" w:lineRule="auto"/>
-      </w:pPr>
-      <w:r>
-        <w:rPr>
-          <w:b/>
-          <w:bCs/>
-        </w:rPr>
-        <w:t>Limitations:</w:t>
-      </w:r>
-      <w:r>
-        <w:t> No mention is made of other architectures or listing of benchmarks for a performance comparison. Also, the study does not give evidence of CNNs being trained on English language typed or cursive handwriting datasets.</w:t>
-      </w:r>
-    </w:p>
-    <w:p>
-      <w:pPr>
-        <w:spacing w:line="360" w:lineRule="auto"/>
-        <w:rPr>
-          <w:b/>
-          <w:bCs/>
-        </w:rPr>
-      </w:pPr>
-      <w:r>
-        <w:rPr>
-          <w:b/>
-          <w:bCs/>
-        </w:rPr>
-        <w:t>Tr-OCR</w:t>
-      </w:r>
-    </w:p>
-    <w:p>
-      <w:pPr>
-        <w:spacing w:line="360" w:lineRule="auto"/>
-      </w:pPr>
-      <w:r>
-        <w:t>[9] achieved state-of-the-art results on printed, handwritten and scene text image datasets with Tr-OCR, an end-to-end Transformer-based model. Tr-OCR achieved word-level precision, recall and F1 scores of 96.59, 96.57 and 96.58 respectively on the SROIE (Scanned Receipts OCR and Image Formation Extraction) dataset. It also achieved a state-of-the-art CER (Character Error Rate) of 2.89 on the IAM Handwriting Dataset, a dataset containing, according to [11], natural variety, cursive elements and mixed script samples of handwriting.</w:t>
-      </w:r>
-    </w:p>
-    <w:p>
-      <w:pPr>
-        <w:spacing w:line="360" w:lineRule="auto"/>
-      </w:pPr>
-      <w:r>
-        <w:rPr>
-          <w:b/>
-          <w:bCs/>
-        </w:rPr>
-        <w:t>Limitations:</w:t>
-      </w:r>
-      <w:r>
-        <w:t> According to [12], Tr-OCR is designed for single-line text detection and failed to extract text from full-page or paragraph-level images. In one experiment it achieved a low accuracy of around 50-60% in text extraction.</w:t>
-      </w:r>
-    </w:p>
-    <w:p>
-      <w:pPr>
-        <w:spacing w:line="360" w:lineRule="auto"/>
-      </w:pPr>
+        <w:t>each word in the input layer by a single vector which is the sum of its word (content) embedding and position embedding</w:t>
+      </w:r>
+      <w:r>
+        <w:t xml:space="preserve"> </w:t>
+      </w:r>
+      <w:r>
+        <w:t>[26]</w:t>
+      </w:r>
+      <w:r>
+        <w:t xml:space="preserve">. Each word in </w:t>
+      </w:r>
       <w:proofErr w:type="spellStart"/>
       <w:r>
-        <w:t>BrainPower</w:t>
+        <w:t>DeBERTa</w:t>
       </w:r>
       <w:proofErr w:type="spellEnd"/>
       <w:r>
-        <w:t xml:space="preserve"> relies on full page text extraction so to utilise Tr-OCR essays must be segmented into a series of sentence-images, fed to the model and then recombined. This begs the question; can the OCR function of </w:t>
+        <w:t>, however, represents a word with two vectors that encode its content and position, respectively, and the attention weights among words are computed using disentangled matrices based on their contents and relative positions [26].</w:t>
+      </w:r>
+    </w:p>
+    <w:p>
+      <w:pPr>
+        <w:spacing w:line="360" w:lineRule="auto"/>
+      </w:pPr>
+      <w:r>
+        <w:t>After</w:t>
+      </w:r>
+      <w:r>
+        <w:t xml:space="preserve"> training on 78GB of data, </w:t>
       </w:r>
       <w:proofErr w:type="spellStart"/>
       <w:r>
-        <w:t>BrainPower</w:t>
+        <w:t>DeBERTa</w:t>
       </w:r>
       <w:proofErr w:type="spellEnd"/>
       <w:r>
-        <w:t xml:space="preserve"> utilise Tr-OCR's proven handwriting recognition and </w:t>
+        <w:t xml:space="preserve"> </w:t>
+      </w:r>
+      <w:r>
+        <w:t xml:space="preserve">outperformed </w:t>
       </w:r>
       <w:proofErr w:type="spellStart"/>
       <w:r>
-        <w:t>PaddleOCR's</w:t>
+        <w:t>RoBERTa</w:t>
       </w:r>
       <w:proofErr w:type="spellEnd"/>
       <w:r>
-        <w:t xml:space="preserve"> robust text detection capabilities?</w:t>
-      </w:r>
-    </w:p>
-    <w:p>
-      <w:pPr>
-        <w:spacing w:line="360" w:lineRule="auto"/>
-      </w:pPr>
-      <w:r>
-        <w:t xml:space="preserve">A study carried out by [13], where YOLOv10, an object detector, was integrated with Tr-OCR and </w:t>
+        <w:t xml:space="preserve">, which was trained on 160GB of data and surpassed human scoring on the </w:t>
       </w:r>
       <w:proofErr w:type="spellStart"/>
       <w:r>
-        <w:t>PaddleOCR</w:t>
+        <w:t>SuperGLUE</w:t>
       </w:r>
       <w:proofErr w:type="spellEnd"/>
       <w:r>
-        <w:t xml:space="preserve"> for reliable text detection, found that Tr-OCR provided the best overall solution for reliable, high-accuracy container ISO code recognition with a recognition accuracy of 92% outperforming </w:t>
+        <w:t xml:space="preserve"> benchmarks for the first time since 2021. This benchmark </w:t>
+      </w:r>
+      <w:r>
+        <w:t xml:space="preserve">according to [26] </w:t>
+      </w:r>
+      <w:r>
+        <w:t>includes a wide range of tasks such as question answering, natural language inference, and word sense disambiguation.</w:t>
+      </w:r>
+    </w:p>
+    <w:p>
+      <w:pPr>
+        <w:pStyle w:val="Heading4"/>
+        <w:spacing w:line="360" w:lineRule="auto"/>
+      </w:pPr>
+      <w:r>
+        <w:t>Limitations of OCR</w:t>
+      </w:r>
+      <w:r>
+        <w:t xml:space="preserve"> in general</w:t>
+      </w:r>
+    </w:p>
+    <w:p>
+      <w:pPr>
+        <w:spacing w:line="360" w:lineRule="auto"/>
+      </w:pPr>
+      <w:r>
+        <w:t>The accuracy of OCR models in recognizing text from images depends on the quality of its input image. High-quality images have clear, uncluttered text, no background noise (such as smudges) and are captured in well-lit environments. Most classroom environments, however, do not provide all these conditions. Furthermore, quality of images is determined by the photographer's ability to hold the camera steady and the quality of the camera used to capture the image. Consequently, selection of an appropriate model is critical to preventing errors from propagating through the pipeline as errors fed into the core (</w:t>
       </w:r>
       <w:proofErr w:type="spellStart"/>
       <w:r>
-        <w:t>PaddleOCR</w:t>
+        <w:t>DeBERTa</w:t>
       </w:r>
       <w:proofErr w:type="spellEnd"/>
       <w:r>
-        <w:t>, a hybrid CNN-Transformer model.</w:t>
-      </w:r>
-    </w:p>
-    <w:p>
-      <w:pPr>
-        <w:spacing w:line="360" w:lineRule="auto"/>
-      </w:pPr>
-      <w:r>
-        <w:rPr>
-          <w:b/>
-          <w:bCs/>
-        </w:rPr>
-        <w:t>Limitations:</w:t>
-      </w:r>
-      <w:r>
-        <w:t xml:space="preserve"> The research was carried out on text printed/painted on containers. Such text is usually printed using a stencil ensuring uniform height and spacing. There is also </w:t>
+        <w:t>) will degrade its scoring accuracy.</w:t>
+      </w:r>
+    </w:p>
+    <w:p>
+      <w:pPr>
+        <w:spacing w:line="360" w:lineRule="auto"/>
+      </w:pPr>
+      <w:r>
+        <w:t>Several popular models struggle to decipher handwritten text or are only capable of extracting text from one language. Others are limited to handling only single lines of text and cannot scan whole documents, making it necessary for a text extraction add-on. One such example is Tr-OCR, according to [12], which is designed for single-line text detection and failed to extract text from full-page or paragraph-level images, in one experiment achieving a low accuracy of around 50-60% in text extraction [12].</w:t>
+      </w:r>
+    </w:p>
+    <w:p>
+      <w:pPr>
+        <w:pStyle w:val="Heading4"/>
+        <w:spacing w:line="360" w:lineRule="auto"/>
+      </w:pPr>
+      <w:r>
+        <w:t>Limitations of ASR (STT)</w:t>
+      </w:r>
+      <w:r>
+        <w:t xml:space="preserve"> in general</w:t>
+      </w:r>
+    </w:p>
+    <w:p>
+      <w:pPr>
+        <w:spacing w:line="360" w:lineRule="auto"/>
+      </w:pPr>
+      <w:r>
+        <w:t>Aravindan</w:t>
+      </w:r>
+      <w:r>
+        <w:t xml:space="preserve"> </w:t>
+      </w:r>
+      <w:r>
+        <w:t xml:space="preserve">et al. </w:t>
+      </w:r>
+      <w:r>
+        <w:t xml:space="preserve">[27] </w:t>
+      </w:r>
+      <w:r>
+        <w:t>s</w:t>
+      </w:r>
+      <w:r>
+        <w:t>t</w:t>
+      </w:r>
+      <w:r>
+        <w:t>ate</w:t>
+      </w:r>
+      <w:r>
+        <w:t>d</w:t>
+      </w:r>
+      <w:r>
+        <w:t xml:space="preserve"> that </w:t>
+      </w:r>
+      <w:r>
+        <w:t xml:space="preserve">noise interference, echoes, accents, dialect variation and overlapping speech have a degrading effect on the performance of speech-to-text (STT) and text-to-speech (TTS) systems, resulting in transcription errors. As with OCR systems, ASR systems are vulnerable to environmental conditions as these determine </w:t>
       </w:r>
       <w:r>
         <w:lastRenderedPageBreak/>
-        <w:t xml:space="preserve">no evidence from this research to support the usage of YOLO and </w:t>
-      </w:r>
-      <w:proofErr w:type="spellStart"/>
-      <w:r>
-        <w:t>PaddleOCR</w:t>
-      </w:r>
-      <w:proofErr w:type="spellEnd"/>
-      <w:r>
-        <w:t xml:space="preserve"> in combination for detecting handwritten text.</w:t>
-      </w:r>
-    </w:p>
-    <w:p>
-      <w:pPr>
-        <w:spacing w:line="360" w:lineRule="auto"/>
-        <w:rPr>
-          <w:b/>
-          <w:bCs/>
-        </w:rPr>
-      </w:pPr>
-      <w:proofErr w:type="spellStart"/>
-      <w:r>
-        <w:rPr>
-          <w:b/>
-          <w:bCs/>
-        </w:rPr>
-        <w:t>PaddleOCR</w:t>
-      </w:r>
-      <w:proofErr w:type="spellEnd"/>
-    </w:p>
-    <w:p>
-      <w:pPr>
-        <w:spacing w:line="360" w:lineRule="auto"/>
-      </w:pPr>
-      <w:r>
-        <w:t xml:space="preserve">[14] </w:t>
-      </w:r>
-      <w:proofErr w:type="spellStart"/>
-      <w:r>
-        <w:t>PaddleOCR</w:t>
-      </w:r>
-      <w:proofErr w:type="spellEnd"/>
-      <w:r>
-        <w:t xml:space="preserve"> is an open-source OCR model launched by Baidu Paddle. The architecture always maintains the three-stage pipeline design of "text-detection + direction classification + text recognition". [14] tested the model on a dataset containing 200 national grids stand slogans and power supply line maps collected on the spot at a power generation environment. The images were captured at different angles under varying lighting conditions. The model achieved high detection accuracy of over 95% for standardized slogans and power supply circuit diagrams. It also achieved 93.3% and 86.6% average recognition for standardized slogans and power supply circuit diagrams respectively [14].</w:t>
-      </w:r>
-    </w:p>
-    <w:p>
-      <w:pPr>
-        <w:spacing w:line="360" w:lineRule="auto"/>
-      </w:pPr>
-      <w:r>
-        <w:rPr>
-          <w:b/>
-          <w:bCs/>
-        </w:rPr>
-        <w:t>Limitation:</w:t>
-      </w:r>
-      <w:r>
-        <w:t xml:space="preserve"> This study focused solely on block printed text, which is generally uniform, evenly spaced and aligned. As such there is no evidence to suggest that </w:t>
-      </w:r>
-      <w:proofErr w:type="spellStart"/>
-      <w:r>
-        <w:t>PaddleOCR</w:t>
-      </w:r>
-      <w:proofErr w:type="spellEnd"/>
-      <w:r>
-        <w:t xml:space="preserve"> can recognize handwritten text. However, it recognizes text from whole page documents, unlike Tr-OCR. These studies focused on OCR, but ASR presents an optional modality for presenting an essay for evaluation.</w:t>
-      </w:r>
-    </w:p>
-    <w:p>
-      <w:pPr>
-        <w:pStyle w:val="Heading3"/>
-        <w:spacing w:line="360" w:lineRule="auto"/>
-      </w:pPr>
-      <w:bookmarkStart w:id="8" w:name="_Toc237985778"/>
-      <w:r>
-        <w:t>2.1.3 Automated Speech Recognition (ASR), Speech-To-Text (STT)</w:t>
-      </w:r>
-      <w:bookmarkEnd w:id="8"/>
-    </w:p>
-    <w:p>
-      <w:pPr>
-        <w:spacing w:line="360" w:lineRule="auto"/>
-      </w:pPr>
-      <w:r>
-        <w:t>[15] A speech-to-text (STT) system accepts an audio input signal from either a person or a machine and detects and converts individual words and phrases into text. [16] Advances in deep learning technology has profoundly transformed automatic speech recognition (ASR) over the past decade. Historically, ASR systems were constructed from a complex pipeline of independently trained components for example, a pronunciation model (lexicon) and a language model (LM). Like early AES systems, features had to be hand engineered, which was tedious and did not scale well.</w:t>
-      </w:r>
-    </w:p>
-    <w:p>
-      <w:pPr>
-        <w:spacing w:line="360" w:lineRule="auto"/>
-      </w:pPr>
-      <w:r>
-        <w:t xml:space="preserve">[17] described how three major research groups - Microsoft Research (MSR), Google and IBM Research, achieved significant improvements in a variety of state-of-the-art ASR systems with Deep Neural Networks. According to [16], the modern era of ASR is defined by firstly, a shift towards end-to-end (E2E) models – systems that learn a direct </w:t>
-      </w:r>
-      <w:r>
-        <w:lastRenderedPageBreak/>
-        <w:t>mapping from acoustic features to text using a single, jointly optimized neural network which simplifies training and improves performance. Secondly, a shift in the data paradigm. Early deep learning systems used supervised learning to train on large datasets of labelled data. Modern systems have moved towards unlabelled data. Self-supervised systems have demonstrated the ability to learn from raw audio data while weakly supervised systems have demonstrated the ability to generalise to data they were never trained on [16].</w:t>
-      </w:r>
-    </w:p>
-    <w:p>
-      <w:pPr>
-        <w:spacing w:line="360" w:lineRule="auto"/>
-        <w:rPr>
-          <w:b/>
-          <w:bCs/>
-        </w:rPr>
-      </w:pPr>
-      <w:r>
-        <w:rPr>
-          <w:b/>
-          <w:bCs/>
-        </w:rPr>
-        <w:t>Whisper</w:t>
-      </w:r>
-    </w:p>
-    <w:p>
-      <w:pPr>
-        <w:spacing w:line="360" w:lineRule="auto"/>
-      </w:pPr>
-      <w:r>
-        <w:t>[18] One model that exemplifies this shift is OpenAI's Whisper, a transformer. [19] For translation tasks, the Transformer can be trained significantly faster than architectures based on recurrent or convolutional layers. The Whisper model was trained on an enormous dataset of 680,000 hours of labelled audio. Whisper transcribed 950 out of 1000 words correctly in research carried out by [20] achieving 95% accuracy. The model's integration into classroom technology effectively supports students with diverse linguistic, cultural, and ability-based needs, achieving high accuracy and frequency responsiveness. Whisper is a valuable tool for educators seeking to foster a more accessible learning environment [20].</w:t>
-      </w:r>
-    </w:p>
-    <w:p>
-      <w:pPr>
-        <w:spacing w:line="360" w:lineRule="auto"/>
-      </w:pPr>
-      <w:r>
-        <w:rPr>
-          <w:b/>
-          <w:bCs/>
-        </w:rPr>
-        <w:t>Limitations:</w:t>
-      </w:r>
-      <w:r>
-        <w:t> Occasionally Whisper hallucinates. [20] discovered that about 1% of transcriptions contain fabricated phrases that were not present in the original audio, and that a significant portion of these can lead to harmful implications. The study further indicated that systems which lack the necessary processing power will experience transcription latency, as Whisper models occupy gigabytes of storage space and this may be undesirable.</w:t>
-      </w:r>
-    </w:p>
-    <w:p>
-      <w:pPr>
-        <w:pStyle w:val="Heading3"/>
-        <w:spacing w:line="360" w:lineRule="auto"/>
-      </w:pPr>
-      <w:bookmarkStart w:id="9" w:name="_Toc237985779"/>
-      <w:r>
-        <w:t>2.1.4 Multimodal Systems</w:t>
-      </w:r>
-      <w:bookmarkEnd w:id="9"/>
-    </w:p>
-    <w:p>
-      <w:pPr>
-        <w:spacing w:line="360" w:lineRule="auto"/>
-      </w:pPr>
-      <w:r>
-        <w:t xml:space="preserve">This section discusses some multimodal systems that share some similarity with </w:t>
-      </w:r>
-      <w:proofErr w:type="spellStart"/>
-      <w:r>
-        <w:t>BrainPower</w:t>
-      </w:r>
-      <w:proofErr w:type="spellEnd"/>
-      <w:r>
-        <w:t xml:space="preserve"> but however, fail to provide in entirety for all input modalities, catering to students who have writing disabilities. These observations present the following two gaps that this research hopes to fill:</w:t>
-      </w:r>
-      <w:r>
-        <w:br/>
-      </w:r>
-      <w:r>
-        <w:rPr>
-          <w:b/>
-          <w:bCs/>
-        </w:rPr>
-        <w:t>Gap 1</w:t>
-      </w:r>
-      <w:r>
-        <w:t xml:space="preserve"> - most AES systems ignore input equity.</w:t>
-      </w:r>
-      <w:r>
-        <w:br/>
-      </w:r>
-      <w:r>
-        <w:rPr>
-          <w:b/>
-          <w:bCs/>
-        </w:rPr>
-        <w:lastRenderedPageBreak/>
-        <w:t>Gap 2</w:t>
-      </w:r>
-      <w:r>
-        <w:t xml:space="preserve"> – the architecture of commercial multimodal products is not accessible for analysis.</w:t>
-      </w:r>
-    </w:p>
-    <w:p>
-      <w:pPr>
-        <w:spacing w:line="360" w:lineRule="auto"/>
-      </w:pPr>
-      <w:r>
-        <w:t>An extensive search of Google Scholar, IEEE Explore, ACM and similar services and querying current AI applications like ChatGPT and Gemini with the search terms "multimodal AES", "accessible multimodal AES" and "hybrid multimodal AES" reveals that such systems are exceptionally rare. The results returned were of systems that orchestrated at most two AI models of disparate modality. This indicates a gap in current AES technology revealing that most AES systems ignore input equity.</w:t>
-      </w:r>
-    </w:p>
-    <w:p>
-      <w:pPr>
-        <w:spacing w:line="360" w:lineRule="auto"/>
-      </w:pPr>
-      <w:r>
-        <w:t xml:space="preserve">The architecture of commercially available multimodal systems such as </w:t>
-      </w:r>
-      <w:proofErr w:type="spellStart"/>
-      <w:r>
-        <w:t>IntelliMetric</w:t>
-      </w:r>
-      <w:proofErr w:type="spellEnd"/>
-      <w:r>
-        <w:t>® are not freely available for analysis. My research project intends to fill the gap by implementing an accessible, interpretable, hybrid, multimodal AES system by orchestrating three pre-trained models – an OCR, ASR and a transformer model that accepts as input, written, typed and spoken essays and transparently scores them.</w:t>
-      </w:r>
-    </w:p>
-    <w:p>
-      <w:pPr>
-        <w:spacing w:line="360" w:lineRule="auto"/>
-        <w:rPr>
-          <w:b/>
-          <w:bCs/>
-        </w:rPr>
-      </w:pPr>
-      <w:r>
-        <w:rPr>
-          <w:b/>
-          <w:bCs/>
-        </w:rPr>
-        <w:t>CAFES</w:t>
-      </w:r>
-    </w:p>
-    <w:p>
-      <w:pPr>
-        <w:spacing w:line="360" w:lineRule="auto"/>
-      </w:pPr>
-      <w:r>
-        <w:t xml:space="preserve">[21] proposed a multimodal AES system called CAFES that uses a MLLM to process graphics e.g. a scenery along with text. The system orchestrates GPT-4o as the MLLM. The dataset used for their experiment is the ESSAYJUDGE dataset which consists of 1,054 multimodal essays written at the university level. This dataset is limited in that it does not cover complex visual inputs such as film frames. </w:t>
-      </w:r>
-    </w:p>
-    <w:p>
-      <w:pPr>
-        <w:spacing w:line="360" w:lineRule="auto"/>
-      </w:pPr>
-      <w:r>
-        <w:rPr>
-          <w:b/>
-          <w:bCs/>
-        </w:rPr>
-        <w:t>Limitation(s):</w:t>
-      </w:r>
-      <w:r>
-        <w:rPr>
-          <w:b/>
-          <w:bCs/>
-        </w:rPr>
-        <w:t xml:space="preserve"> </w:t>
-      </w:r>
-      <w:r>
-        <w:t>This system although multimodal, is still not designed to cater to students with disabilities, as it, like other AES systems ignores input equity.</w:t>
-      </w:r>
-    </w:p>
-    <w:p>
-      <w:pPr>
-        <w:spacing w:line="360" w:lineRule="auto"/>
-        <w:rPr>
-          <w:b/>
-          <w:bCs/>
-        </w:rPr>
-      </w:pPr>
-      <w:proofErr w:type="spellStart"/>
-      <w:r>
-        <w:rPr>
-          <w:b/>
-          <w:bCs/>
-        </w:rPr>
-        <w:t>ExaGrade</w:t>
-      </w:r>
-      <w:proofErr w:type="spellEnd"/>
-    </w:p>
-    <w:p>
-      <w:pPr>
-        <w:spacing w:line="360" w:lineRule="auto"/>
-      </w:pPr>
-      <w:r>
-        <w:t xml:space="preserve">[22] developed a multimodal system </w:t>
-      </w:r>
-      <w:proofErr w:type="spellStart"/>
-      <w:r>
-        <w:t>ExaGrade</w:t>
-      </w:r>
-      <w:proofErr w:type="spellEnd"/>
-      <w:r>
-        <w:t xml:space="preserve"> that integrates optical character recognition (OCR) with the generative pre-trained transformer (GPT). The platform integrates two pre-trained models - </w:t>
-      </w:r>
-      <w:proofErr w:type="spellStart"/>
-      <w:r>
-        <w:t>HandwritingOCR</w:t>
-      </w:r>
-      <w:proofErr w:type="spellEnd"/>
-      <w:r>
-        <w:t xml:space="preserve"> to extract text from handwritten exam papers and like [21] employs GPT-4 to evaluate and score student responses. The platform offers features such as exam creation where for MCQs and TFs the teacher supplies the answers, and student exam completion using handwritten or online modalities.</w:t>
-      </w:r>
-    </w:p>
-    <w:p>
-      <w:pPr>
-        <w:spacing w:line="360" w:lineRule="auto"/>
-      </w:pPr>
-      <w:r>
-        <w:rPr>
-          <w:b/>
-          <w:bCs/>
-        </w:rPr>
-        <w:lastRenderedPageBreak/>
-        <w:t>Limitation(s):</w:t>
-      </w:r>
-      <w:r>
-        <w:rPr>
-          <w:b/>
-          <w:bCs/>
-        </w:rPr>
-        <w:t xml:space="preserve"> </w:t>
-      </w:r>
-      <w:r>
-        <w:t xml:space="preserve">The platform is described as accessible; however, accessibility only encompasses availability online at GitHub since the platform is released as an open-source project [22]. </w:t>
-      </w:r>
-      <w:proofErr w:type="spellStart"/>
-      <w:r>
-        <w:t>ExaGrade</w:t>
-      </w:r>
-      <w:proofErr w:type="spellEnd"/>
-      <w:r>
-        <w:t xml:space="preserve"> is not accessible to students with writing disabilities. Notably absent from the system is a means to input an essay in audible form.</w:t>
-      </w:r>
-    </w:p>
-    <w:p>
-      <w:pPr>
-        <w:spacing w:line="360" w:lineRule="auto"/>
-      </w:pPr>
-      <w:r>
-        <w:t xml:space="preserve">[23] proposed </w:t>
-      </w:r>
-      <w:proofErr w:type="spellStart"/>
-      <w:r>
-        <w:t>VisualAES</w:t>
-      </w:r>
-      <w:proofErr w:type="spellEnd"/>
-      <w:r>
-        <w:t xml:space="preserve">, a bi-modal system that utilizes both textual and visual features for handwritten essay scoring. It orchestrates three pretrained transformer-based models to take both textual features and visual features extracted by Faster R-CNN and then uses a stacking ensemble model to robustly map their output to a final score. This system's architecture is more congruent with what is being proposed in this research – </w:t>
-      </w:r>
-      <w:proofErr w:type="spellStart"/>
-      <w:r>
-        <w:t>an</w:t>
-      </w:r>
-      <w:proofErr w:type="spellEnd"/>
-      <w:r>
-        <w:t xml:space="preserve"> OCR model to convert text from scanned essays to digital text for processing, and a transformer model for essay scoring. </w:t>
-      </w:r>
-      <w:proofErr w:type="spellStart"/>
-      <w:r>
-        <w:t>VisualAES</w:t>
-      </w:r>
-      <w:proofErr w:type="spellEnd"/>
-      <w:r>
-        <w:t xml:space="preserve"> was evaluated on the Automated Student Assessment Prize (ASAP) dataset and their own handwritten Chinese Student's handwritten essay dataset (</w:t>
-      </w:r>
-      <w:proofErr w:type="spellStart"/>
-      <w:r>
-        <w:t>ChnStd</w:t>
-      </w:r>
-      <w:proofErr w:type="spellEnd"/>
-      <w:r>
-        <w:t xml:space="preserve">). Their results showed that their system outperformed all state-of-the-art methods on both datasets. </w:t>
-      </w:r>
-    </w:p>
-    <w:p>
-      <w:pPr>
-        <w:spacing w:line="360" w:lineRule="auto"/>
-      </w:pPr>
-      <w:r>
-        <w:rPr>
-          <w:b/>
-          <w:bCs/>
-        </w:rPr>
-        <w:t>Limitation(s):</w:t>
-      </w:r>
-      <w:r>
-        <w:rPr>
-          <w:b/>
-          <w:bCs/>
-        </w:rPr>
-        <w:t xml:space="preserve"> </w:t>
-      </w:r>
-      <w:proofErr w:type="spellStart"/>
-      <w:r>
-        <w:t>VisualAES</w:t>
-      </w:r>
-      <w:proofErr w:type="spellEnd"/>
-      <w:r>
-        <w:t xml:space="preserve"> like CAFES does not provide accessibility for students suffering writing disability.</w:t>
-      </w:r>
-    </w:p>
-    <w:p>
-      <w:pPr>
-        <w:spacing w:line="360" w:lineRule="auto"/>
-      </w:pPr>
-      <w:r>
-        <w:t>[20] developed an inclusive learning classroom using the OpenAI Whisper model. The model was selected to promote diversity and inclusivity in education through real-time transcription and translation for students with diverse linguistic and cultural abilities and backgrounds. The results were encouraging as the model achieved high accuracy especially in an environment where ambient noise did not alter the audio signal input. This system however is limited in input modality as it only focuses on audio transcription with no allocation made for submission of handwritten work.</w:t>
-      </w:r>
-    </w:p>
-    <w:p>
-      <w:pPr>
-        <w:spacing w:line="360" w:lineRule="auto"/>
-      </w:pPr>
-      <w:r>
-        <w:t>[24] developed a system for investigating the possibility of automatically grading handwritten essays by leveraging OCR together with a fine-tuned and trained Large Language Model (LLM) Mistral 7b. According to the BERT Score analysis, the precision, recall and F1 scores were observed to be consistent over all the essays. The F1 score of 85.78% demonstrates the model's overall stability in replicating human-grading decisions with a high degree of consistency. The system used a Moodle plugin that integrated Mistral 7b into the platform.</w:t>
-      </w:r>
-    </w:p>
-    <w:p>
-      <w:pPr>
-        <w:spacing w:line="360" w:lineRule="auto"/>
-      </w:pPr>
-      <w:r>
-        <w:rPr>
-          <w:b/>
-          <w:bCs/>
-        </w:rPr>
-        <w:lastRenderedPageBreak/>
-        <w:t>Limitation(s):</w:t>
-      </w:r>
-      <w:r>
-        <w:rPr>
-          <w:b/>
-          <w:bCs/>
-        </w:rPr>
-        <w:t xml:space="preserve"> </w:t>
-      </w:r>
-      <w:r>
-        <w:t xml:space="preserve"> There is no mention of inclusivity in the system developed by [24] showing once again that most modern AES systems focus on the quality of essay scoring and do not prioritize input equity, emphasizing the need for an integrated system.</w:t>
-      </w:r>
-    </w:p>
-    <w:p>
-      <w:pPr>
-        <w:pStyle w:val="Heading3"/>
-        <w:spacing w:line="360" w:lineRule="auto"/>
-      </w:pPr>
-      <w:bookmarkStart w:id="10" w:name="_Toc237985780"/>
-      <w:r>
-        <w:t>2.2.0 Challenges and consideration for component selection</w:t>
-      </w:r>
-      <w:bookmarkEnd w:id="10"/>
-    </w:p>
-    <w:p>
-      <w:pPr>
-        <w:spacing w:line="360" w:lineRule="auto"/>
-      </w:pPr>
-      <w:r>
-        <w:rPr>
-          <w:rStyle w:val="Heading4Char"/>
-        </w:rPr>
-        <w:t>The datasets</w:t>
-      </w:r>
-      <w:r>
-        <w:br/>
-        <w:t>According to [3], the most elaborate AES systems currently have trouble accurately evaluating the coherence and persuasiveness of an essay, or an argument's clarity, and that is due to two main reasons: (1) such aspects are very hard to model, and (2) the lack of datasets that provide human-graded dimension-specific data, especially compared to those that provide holistic scoring. [5] indicates that the problem originates from AES research relying heavily on the ASAP dataset as the primary benchmark, highlighting the limited options available. Additionally, most publicly available datasets are tailored toward English-language assessment e.g., TOEFL11, CELA, or the Cambridge English assessment datasets.</w:t>
-      </w:r>
-    </w:p>
-    <w:p>
-      <w:pPr>
-        <w:spacing w:line="360" w:lineRule="auto"/>
-      </w:pPr>
-      <w:r>
-        <w:t>[21] further emphasizes this limitation, describing the ASAP and its extended version, ASAP++, as both containing few topics. ASAP++ adds trait-level annotations but merges key content traits into a single "CONTENT" label, decreasing granularity and interpretability. The TOEFL11 dataset, similarly, uses only coarse-grained proficiency labels (low / medium / high). Thus, models trained on the TOEFL11 dataset will inherently produce results that are difficult to interpret due to the granularity of the training data [21].</w:t>
-      </w:r>
-    </w:p>
-    <w:p>
-      <w:pPr>
-        <w:spacing w:line="360" w:lineRule="auto"/>
-      </w:pPr>
-      <w:r>
-        <w:t>[5] also points out that the dataset availability and diversity issue is not limited to the field of research, but extends to commercial products, which primarily focus on English-language datasets. The quality, quantity, and availability of the data are fundamental to the model's performance. It is fitting to consider available models, discuss the impact the limited datasets have on them and propose the best option to provide reliable, interpretable trait scoring.</w:t>
+        <w:t>the quality of the input, which invariably determines the quality of the output. According to [27], model and dataset scarcity are the reasons why the issues mentioned earlier still pose a challenge to modern ASR systems.</w:t>
+      </w:r>
+    </w:p>
+    <w:p>
+      <w:pPr>
+        <w:spacing w:line="360" w:lineRule="auto"/>
+        <w:rPr>
+          <w:color w:val="EE0000"/>
+        </w:rPr>
+      </w:pPr>
+      <w:r>
+        <w:t xml:space="preserve">This issue of dataset scarcity seems to be a common thread among modern AI models, since they rely heavily on data for training and testing, underscoring the need for greater diversity and availability. </w:t>
       </w:r>
     </w:p>
     <w:p>
@@ -5583,184 +6409,6 @@
         <w:spacing w:line="360" w:lineRule="auto"/>
       </w:pPr>
       <w:r>
-        <w:lastRenderedPageBreak/>
-        <w:t>The models</w:t>
-      </w:r>
-    </w:p>
-    <w:p>
-      <w:pPr>
-        <w:spacing w:line="360" w:lineRule="auto"/>
-      </w:pPr>
-      <w:r>
-        <w:t>[5] presents some of the issues with Transformer pretrained models as having a closed-box nature, high computational requirements, longer training times and the need for large datasets. Additionally, issues presented by [5] are data quality, biases in training data, generalization, and overfitting which still pose significant obstacles that need to be addressed.</w:t>
-      </w:r>
-    </w:p>
-    <w:p>
-      <w:pPr>
-        <w:spacing w:line="360" w:lineRule="auto"/>
-      </w:pPr>
-      <w:r>
-        <w:t>[22] cited three studies that showed the limitations of ChatGPT, a transformer model, as an AES tool. The results indicated that ChatGPT often scores lower than human scorers and its evaluation is inconsistent due to variations in its scoring mechanism, training data, model updates, and ingrained randomness. [22] Additionally, the consistency of ChatGPT's scores over multiple evaluations was low, indicating variability and raising concerns about its reliability.</w:t>
-      </w:r>
-    </w:p>
-    <w:p>
-      <w:pPr>
-        <w:spacing w:line="360" w:lineRule="auto"/>
-      </w:pPr>
-      <w:r>
-        <w:t>[25] explored the potential of using GPT-based models as an alternative solution to the data scarcity issue, comparing their performance to that of fine-tuning BERT models, which remains the state-of-the-art, in quantitative text analysis. They concluded that BERT models remain the overall go-to method for classification although GPT models can serve as alternatives on smaller tasks. GPT models are also easier to tweak; however, they are more expensive. Due to the findings of [22] and [25], GPT will not be included in this system.</w:t>
-      </w:r>
-    </w:p>
-    <w:p>
-      <w:pPr>
-        <w:spacing w:line="360" w:lineRule="auto"/>
-      </w:pPr>
-      <w:r>
-        <w:t xml:space="preserve">[26] </w:t>
-      </w:r>
-      <w:proofErr w:type="spellStart"/>
-      <w:r>
-        <w:t>DeBERTa</w:t>
-      </w:r>
-      <w:proofErr w:type="spellEnd"/>
-      <w:r>
-        <w:t xml:space="preserve"> (Decoding-enhanced BERT with Disentangled Attention) is an improvement of previous state-of-the-art pre-trained transformer models such as BERT and </w:t>
-      </w:r>
-      <w:proofErr w:type="spellStart"/>
-      <w:r>
-        <w:t>RoBERTa</w:t>
-      </w:r>
-      <w:proofErr w:type="spellEnd"/>
-      <w:r>
-        <w:t xml:space="preserve">, its predecessors. [26] BERT and </w:t>
-      </w:r>
-      <w:proofErr w:type="spellStart"/>
-      <w:r>
-        <w:t>RoBERTa</w:t>
-      </w:r>
-      <w:proofErr w:type="spellEnd"/>
-      <w:r>
-        <w:t xml:space="preserve"> represent each word in the input layer by a single vector which is the sum of its word (content) embedding and position embedding. Each word in </w:t>
-      </w:r>
-      <w:proofErr w:type="spellStart"/>
-      <w:r>
-        <w:t>DeBERTa</w:t>
-      </w:r>
-      <w:proofErr w:type="spellEnd"/>
-      <w:r>
-        <w:t>, however, represents a word with two vectors that encode its content and position, respectively, and the attention weights among words are computed using disentangled matrices based on their contents and relative positions [26].</w:t>
-      </w:r>
-    </w:p>
-    <w:p>
-      <w:pPr>
-        <w:spacing w:line="360" w:lineRule="auto"/>
-      </w:pPr>
-      <w:r>
-        <w:t xml:space="preserve">[26] </w:t>
-      </w:r>
-      <w:proofErr w:type="spellStart"/>
-      <w:r>
-        <w:t>DeBERTa</w:t>
-      </w:r>
-      <w:proofErr w:type="spellEnd"/>
-      <w:r>
-        <w:t xml:space="preserve">, after training on 78GB of data, outperformed </w:t>
-      </w:r>
-      <w:proofErr w:type="spellStart"/>
-      <w:r>
-        <w:t>RoBERTa</w:t>
-      </w:r>
-      <w:proofErr w:type="spellEnd"/>
-      <w:r>
-        <w:t xml:space="preserve">, which was trained on 160GB of data and surpassed human scoring on the </w:t>
-      </w:r>
-      <w:proofErr w:type="spellStart"/>
-      <w:r>
-        <w:t>SuperGLUE</w:t>
-      </w:r>
-      <w:proofErr w:type="spellEnd"/>
-      <w:r>
-        <w:t xml:space="preserve"> benchmarks for the </w:t>
-      </w:r>
-      <w:r>
-        <w:lastRenderedPageBreak/>
-        <w:t>first time since 2021. This benchmark includes a wide range of tasks such as question answering, natural language inference, and word sense disambiguation [26].</w:t>
-      </w:r>
-    </w:p>
-    <w:p>
-      <w:pPr>
-        <w:pStyle w:val="Heading4"/>
-        <w:spacing w:line="360" w:lineRule="auto"/>
-      </w:pPr>
-      <w:r>
-        <w:t>Limitations of OCR</w:t>
-      </w:r>
-      <w:r>
-        <w:t xml:space="preserve"> in general</w:t>
-      </w:r>
-    </w:p>
-    <w:p>
-      <w:pPr>
-        <w:spacing w:line="360" w:lineRule="auto"/>
-      </w:pPr>
-      <w:r>
-        <w:t>The accuracy of OCR models in recognizing text from images depends on the quality of its input image. High-quality images have clear, uncluttered text, no background noise (such as smudges) and are captured in well-lit environments. Most classroom environments, however, do not provide all these conditions. Furthermore, quality of images is determined by the photographer's ability to hold the camera steady and the quality of the camera used to capture the image. Consequently, selection of an appropriate model is critical to preventing errors from propagating through the pipeline as errors fed into the core (</w:t>
-      </w:r>
-      <w:proofErr w:type="spellStart"/>
-      <w:r>
-        <w:t>DeBERTa</w:t>
-      </w:r>
-      <w:proofErr w:type="spellEnd"/>
-      <w:r>
-        <w:t>) will degrade its scoring accuracy.</w:t>
-      </w:r>
-    </w:p>
-    <w:p>
-      <w:pPr>
-        <w:spacing w:line="360" w:lineRule="auto"/>
-      </w:pPr>
-      <w:r>
-        <w:t>Several popular models struggle to decipher handwritten text or are only capable of extracting text from one language. Others are limited to handling only single lines of text and cannot scan whole documents, making it necessary for a text extraction add-on. One such example is Tr-OCR, according to [12], which is designed for single-line text detection and failed to extract text from full-page or paragraph-level images, in one experiment achieving a low accuracy of around 50-60% in text extraction [12].</w:t>
-      </w:r>
-    </w:p>
-    <w:p>
-      <w:pPr>
-        <w:pStyle w:val="Heading4"/>
-        <w:spacing w:line="360" w:lineRule="auto"/>
-      </w:pPr>
-      <w:r>
-        <w:t>Limitations of ASR (STT)</w:t>
-      </w:r>
-      <w:r>
-        <w:t xml:space="preserve"> in general</w:t>
-      </w:r>
-    </w:p>
-    <w:p>
-      <w:pPr>
-        <w:spacing w:line="360" w:lineRule="auto"/>
-      </w:pPr>
-      <w:r>
-        <w:t>[27] noise interference, echoes, accents, dialect variation and overlapping speech have a degrading effect on the performance of speech-to-text (STT) and text-to-speech (TTS) systems, resulting in transcription errors. As with OCR systems, ASR systems are vulnerable to environmental conditions as these determine the quality of the input, which invariably determines the quality of the output. According to [27], model and dataset scarcity are the reasons why the issues mentioned earlier still pose a challenge to modern ASR systems.</w:t>
-      </w:r>
-    </w:p>
-    <w:p>
-      <w:pPr>
-        <w:spacing w:line="360" w:lineRule="auto"/>
-        <w:rPr>
-          <w:color w:val="EE0000"/>
-        </w:rPr>
-      </w:pPr>
-      <w:r>
-        <w:t xml:space="preserve">This issue of dataset scarcity seems to be a common thread among modern AI models, since they rely heavily on data for training and testing, underscoring the need for greater diversity and availability. </w:t>
-      </w:r>
-    </w:p>
-    <w:p>
-      <w:pPr>
-        <w:pStyle w:val="Heading4"/>
-        <w:spacing w:line="360" w:lineRule="auto"/>
-      </w:pPr>
-      <w:r>
-        <w:lastRenderedPageBreak/>
         <w:t>Limitations of Multimodal Integrated Systems</w:t>
       </w:r>
     </w:p>
@@ -5830,10 +6478,24 @@
     </w:p>
     <w:p>
       <w:pPr>
+        <w:rPr>
+          <w:rFonts w:eastAsiaTheme="majorEastAsia" w:cstheme="majorBidi"/>
+          <w:color w:val="0F4761" w:themeColor="accent1" w:themeShade="BF"/>
+          <w:sz w:val="28"/>
+          <w:szCs w:val="28"/>
+        </w:rPr>
+      </w:pPr>
+      <w:bookmarkStart w:id="11" w:name="_Toc233586916"/>
+      <w:r>
+        <w:br w:type="page"/>
+      </w:r>
+    </w:p>
+    <w:p>
+      <w:pPr>
         <w:pStyle w:val="Heading3"/>
       </w:pPr>
-      <w:bookmarkStart w:id="11" w:name="_Toc233586916"/>
-      <w:r>
+      <w:r>
+        <w:lastRenderedPageBreak/>
         <w:t>Evaluation Metrics</w:t>
       </w:r>
       <w:bookmarkEnd w:id="11"/>
@@ -6004,14 +6666,11 @@
         <w:spacing w:line="360" w:lineRule="auto"/>
       </w:pPr>
       <w:r>
-        <w:lastRenderedPageBreak/>
         <w:t xml:space="preserve">Accuracy rate is a measure of the number of correct classifications over the entire test set, indicating the strength of the classifier [28]. [29] Precision is the fraction of </w:t>
       </w:r>
-      <w:proofErr w:type="gramStart"/>
-      <w:r>
-        <w:t>correctly predicted,</w:t>
-      </w:r>
-      <w:proofErr w:type="gramEnd"/>
+      <w:r>
+        <w:t>correctly predicted</w:t>
+      </w:r>
       <w:r>
         <w:t xml:space="preserve"> positive results out of the sum of all positive predictions (true positives + false positives). This number is useful in situations where the false-positives outnumber the false-negatives. A high-precision value suggests that the model makes accurate positive predictions. </w:t>
       </w:r>
@@ -6074,40 +6733,14 @@
             </m:r>
           </m:num>
           <m:den>
-            <m:sSub>
-              <m:sSubPr>
-                <m:ctrlPr>
-                  <w:rPr>
-                    <w:rFonts w:ascii="Cambria Math" w:hAnsi="Cambria Math"/>
-                    <w:i/>
-                  </w:rPr>
-                </m:ctrlPr>
-              </m:sSubPr>
-              <m:e>
-                <m:r>
-                  <w:rPr>
-                    <w:rFonts w:ascii="Cambria Math" w:hAnsi="Cambria Math"/>
-                  </w:rPr>
-                  <m:t>N</m:t>
-                </m:r>
-              </m:e>
-              <m:sub>
-                <m:r>
-                  <w:rPr>
-                    <w:rFonts w:ascii="Cambria Math" w:hAnsi="Cambria Math"/>
-                  </w:rPr>
-                  <m:t>W</m:t>
-                </m:r>
-              </m:sub>
-            </m:sSub>
+            <m:r>
+              <w:rPr>
+                <w:rFonts w:ascii="Cambria Math" w:hAnsi="Cambria Math"/>
+              </w:rPr>
+              <m:t>N</m:t>
+            </m:r>
           </m:den>
         </m:f>
-        <m:r>
-          <w:rPr>
-            <w:rFonts w:ascii="Cambria Math" w:hAnsi="Cambria Math"/>
-          </w:rPr>
-          <m:t>*100</m:t>
-        </m:r>
       </m:oMath>
       <w:r>
         <w:rPr>
@@ -6179,6 +6812,7 @@
         <w:spacing w:line="360" w:lineRule="auto"/>
       </w:pPr>
       <w:r>
+        <w:lastRenderedPageBreak/>
         <w:t xml:space="preserve">[32] this metric counts any deletions, insertions or substitutions at the character level, enabling evaluation based on character-wise accuracy. CER works well in spotting symbol, typographical and abbreviation mistakes. </w:t>
       </w:r>
     </w:p>
@@ -6204,44 +6838,24 @@
               <w:rPr>
                 <w:rFonts w:ascii="Cambria Math" w:hAnsi="Cambria Math"/>
               </w:rPr>
+              <m:t xml:space="preserve">N- </m:t>
+            </m:r>
+            <m:r>
+              <w:rPr>
+                <w:rFonts w:ascii="Cambria Math" w:hAnsi="Cambria Math"/>
+              </w:rPr>
               <m:t>CRC</m:t>
             </m:r>
           </m:num>
           <m:den>
-            <m:sSub>
-              <m:sSubPr>
-                <m:ctrlPr>
-                  <w:rPr>
-                    <w:rFonts w:ascii="Cambria Math" w:hAnsi="Cambria Math"/>
-                    <w:i/>
-                  </w:rPr>
-                </m:ctrlPr>
-              </m:sSubPr>
-              <m:e>
-                <m:r>
-                  <w:rPr>
-                    <w:rFonts w:ascii="Cambria Math" w:hAnsi="Cambria Math"/>
-                  </w:rPr>
-                  <m:t>N</m:t>
-                </m:r>
-              </m:e>
-              <m:sub>
-                <m:r>
-                  <w:rPr>
-                    <w:rFonts w:ascii="Cambria Math" w:hAnsi="Cambria Math"/>
-                  </w:rPr>
-                  <m:t>C</m:t>
-                </m:r>
-              </m:sub>
-            </m:sSub>
+            <m:r>
+              <w:rPr>
+                <w:rFonts w:ascii="Cambria Math" w:hAnsi="Cambria Math"/>
+              </w:rPr>
+              <m:t>N</m:t>
+            </m:r>
           </m:den>
         </m:f>
-        <m:r>
-          <w:rPr>
-            <w:rFonts w:ascii="Cambria Math" w:hAnsi="Cambria Math"/>
-          </w:rPr>
-          <m:t>*100</m:t>
-        </m:r>
       </m:oMath>
       <w:r>
         <w:rPr>
@@ -6801,7 +7415,13 @@
         <w:t xml:space="preserve"> </w:t>
       </w:r>
       <w:r>
-        <w:t>The text is then routed to the OCR Evaluator</w:t>
+        <w:t xml:space="preserve">The text is then routed to the OCR </w:t>
+      </w:r>
+      <w:r>
+        <w:t xml:space="preserve">output </w:t>
+      </w:r>
+      <w:r>
+        <w:t>Evaluator</w:t>
       </w:r>
       <w:r>
         <w:t xml:space="preserve">. </w:t>
@@ -6914,783 +7534,14 @@
     </w:p>
     <w:p>
       <w:pPr>
-        <w:rPr>
-          <w:b/>
-          <w:bCs/>
-        </w:rPr>
-      </w:pPr>
-      <w:r>
-        <w:rPr>
-          <w:b/>
-          <w:bCs/>
-        </w:rPr>
-        <w:br w:type="page"/>
-      </w:r>
-    </w:p>
-    <w:p>
-      <w:pPr>
-        <w:spacing w:line="360" w:lineRule="auto"/>
-        <w:rPr>
-          <w:b/>
-          <w:bCs/>
-        </w:rPr>
-      </w:pPr>
-      <w:r>
-        <w:rPr>
-          <w:b/>
-          <w:bCs/>
-        </w:rPr>
-        <w:lastRenderedPageBreak/>
-        <w:t>Use Case</w:t>
-      </w:r>
-      <w:r>
-        <w:rPr>
-          <w:b/>
-          <w:bCs/>
-        </w:rPr>
-        <w:t xml:space="preserve"> 2:</w:t>
-      </w:r>
-      <w:r>
-        <w:rPr>
-          <w:b/>
-          <w:bCs/>
-        </w:rPr>
-        <w:t xml:space="preserve"> Audio-based essay submission</w:t>
-      </w:r>
-    </w:p>
-    <w:p>
-      <w:pPr>
-        <w:spacing w:line="360" w:lineRule="auto"/>
-      </w:pPr>
-      <w:r>
-        <w:t xml:space="preserve">The user submits a </w:t>
-      </w:r>
-      <w:r>
-        <w:t>recorded</w:t>
-      </w:r>
-      <w:r>
-        <w:t xml:space="preserve"> essay to the </w:t>
-      </w:r>
-      <w:r>
-        <w:t>AS</w:t>
-      </w:r>
-      <w:r>
-        <w:t>R</w:t>
-      </w:r>
-      <w:r>
-        <w:t xml:space="preserve">/STT </w:t>
-      </w:r>
-      <w:r>
-        <w:t>component via the user</w:t>
-      </w:r>
-      <w:r>
-        <w:t xml:space="preserve"> </w:t>
-      </w:r>
-      <w:r>
-        <w:t xml:space="preserve">interface. </w:t>
-      </w:r>
-      <w:proofErr w:type="spellStart"/>
-      <w:r>
-        <w:rPr>
-          <w:b/>
-          <w:bCs/>
-        </w:rPr>
-        <w:t>L</w:t>
-      </w:r>
-      <w:r>
-        <w:rPr>
-          <w:b/>
-          <w:bCs/>
-        </w:rPr>
-        <w:t>ibrosa</w:t>
-      </w:r>
-      <w:proofErr w:type="spellEnd"/>
-      <w:r>
-        <w:t xml:space="preserve"> interprets the audio signal </w:t>
-      </w:r>
-      <w:r>
-        <w:t>and represents it as</w:t>
-      </w:r>
-      <w:r>
-        <w:t xml:space="preserve"> a</w:t>
-      </w:r>
-      <w:r>
-        <w:t xml:space="preserve"> vector of numerical values. </w:t>
-      </w:r>
-      <w:r>
-        <w:t xml:space="preserve">Whisper then transcribes the audio signal and represents the signal as machine-readable text. </w:t>
-      </w:r>
-      <w:r>
-        <w:t xml:space="preserve">The </w:t>
-      </w:r>
-      <w:r>
-        <w:t>ASR</w:t>
-      </w:r>
-      <w:r>
-        <w:t xml:space="preserve"> Evaluator calculates the Word Error Rate (WER) and Character Error Rate (CER) against the ground-truth essay. If both the WER and CER are at or </w:t>
-      </w:r>
-      <w:r>
-        <w:t>below</w:t>
-      </w:r>
-      <w:r>
-        <w:t xml:space="preserve"> </w:t>
-      </w:r>
-      <w:r>
-        <w:t>their respective thresholds</w:t>
-      </w:r>
-      <w:r>
-        <w:t>, the essay is routed to the transformer for scoring. Otherwise, the essay is routed to the human scorer.</w:t>
-      </w:r>
-    </w:p>
-    <w:p>
-      <w:pPr>
-        <w:rPr>
-          <w:b/>
-          <w:bCs/>
-        </w:rPr>
-      </w:pPr>
-      <w:r>
-        <w:rPr>
-          <w:b/>
-          <w:bCs/>
-        </w:rPr>
-        <w:br w:type="page"/>
-      </w:r>
-    </w:p>
-    <w:p>
-      <w:pPr>
-        <w:spacing w:line="360" w:lineRule="auto"/>
-        <w:rPr>
-          <w:b/>
-          <w:bCs/>
-        </w:rPr>
-      </w:pPr>
-      <w:r>
-        <w:rPr>
-          <w:b/>
-          <w:bCs/>
-        </w:rPr>
-        <w:lastRenderedPageBreak/>
-        <w:t>Use Case</w:t>
-      </w:r>
-      <w:r>
-        <w:rPr>
-          <w:b/>
-          <w:bCs/>
-        </w:rPr>
-        <w:t xml:space="preserve"> 3:</w:t>
-      </w:r>
-      <w:r>
-        <w:rPr>
-          <w:b/>
-          <w:bCs/>
-        </w:rPr>
-        <w:t xml:space="preserve"> Machine-readable essay submission</w:t>
-      </w:r>
-    </w:p>
-    <w:p>
-      <w:pPr>
-        <w:spacing w:line="360" w:lineRule="auto"/>
-      </w:pPr>
-      <w:r>
-        <w:t>An e</w:t>
-      </w:r>
-      <w:r>
-        <w:t xml:space="preserve">ssay in machine-readable format </w:t>
-      </w:r>
-      <w:r>
-        <w:t xml:space="preserve">is </w:t>
-      </w:r>
-      <w:r>
-        <w:t xml:space="preserve">routed to </w:t>
-      </w:r>
-      <w:proofErr w:type="spellStart"/>
-      <w:r>
-        <w:t>deBERTa</w:t>
-      </w:r>
-      <w:proofErr w:type="spellEnd"/>
-      <w:r>
-        <w:t xml:space="preserve"> </w:t>
-      </w:r>
-      <w:r>
-        <w:t>for</w:t>
-      </w:r>
-      <w:r>
-        <w:t xml:space="preserve"> evaluation</w:t>
-      </w:r>
-      <w:r>
-        <w:t xml:space="preserve"> and scoring. The model processes the text, evaluates and scores the essay. The Transformer Output Evaluator, then calculates the QWK. If the QWK is wit</w:t>
-      </w:r>
-      <w:r>
-        <w:t>h</w:t>
-      </w:r>
-      <w:r>
-        <w:t xml:space="preserve">in the acceptable range, the scores are displayed to the user via the web interface. If not, the essay is routed to the human scorer for evaluation and scoring. </w:t>
-      </w:r>
-    </w:p>
-    <w:p>
-      <w:pPr>
-        <w:pStyle w:val="ListParagraph"/>
-        <w:spacing w:line="360" w:lineRule="auto"/>
-      </w:pPr>
-    </w:p>
-    <w:p>
-      <w:pPr>
-        <w:rPr>
-          <w:rFonts w:eastAsiaTheme="majorEastAsia" w:cstheme="majorBidi"/>
-          <w:color w:val="0F4761" w:themeColor="accent1" w:themeShade="BF"/>
-          <w:sz w:val="28"/>
-          <w:szCs w:val="28"/>
-        </w:rPr>
-      </w:pPr>
-      <w:r>
-        <w:br w:type="page"/>
-      </w:r>
-    </w:p>
-    <w:p>
-      <w:pPr>
-        <w:pStyle w:val="Heading3"/>
-      </w:pPr>
-      <w:r>
-        <w:lastRenderedPageBreak/>
-        <w:t xml:space="preserve">3.4 </w:t>
-      </w:r>
-      <w:r>
-        <w:t>Component Selection</w:t>
-      </w:r>
-    </w:p>
-    <w:p>
-      <w:pPr>
-        <w:ind w:left="405"/>
-      </w:pPr>
-    </w:p>
-    <w:p>
-      <w:pPr>
-        <w:rPr>
-          <w:b/>
-          <w:bCs/>
-        </w:rPr>
-      </w:pPr>
-      <w:r>
-        <w:rPr>
-          <w:b/>
-          <w:bCs/>
-        </w:rPr>
-        <w:t xml:space="preserve">The </w:t>
-      </w:r>
-      <w:r>
-        <w:rPr>
-          <w:b/>
-          <w:bCs/>
-        </w:rPr>
-        <w:t>T</w:t>
-      </w:r>
-      <w:r>
-        <w:rPr>
-          <w:b/>
-          <w:bCs/>
-        </w:rPr>
-        <w:t>ransformer model</w:t>
-      </w:r>
-    </w:p>
-    <w:p>
-      <w:pPr>
-        <w:spacing w:line="360" w:lineRule="auto"/>
-      </w:pPr>
-      <w:proofErr w:type="spellStart"/>
-      <w:r>
-        <w:t>DeBERTa</w:t>
-      </w:r>
-      <w:proofErr w:type="spellEnd"/>
-      <w:r>
-        <w:t xml:space="preserve"> </w:t>
-      </w:r>
-      <w:r>
-        <w:t>was</w:t>
-      </w:r>
-      <w:r>
-        <w:t xml:space="preserve"> selected </w:t>
-      </w:r>
-      <w:r>
-        <w:t>as the essay scoring component of</w:t>
-      </w:r>
-      <w:r>
-        <w:t xml:space="preserve"> </w:t>
-      </w:r>
-      <w:proofErr w:type="spellStart"/>
-      <w:r>
-        <w:t>BrainPower</w:t>
-      </w:r>
-      <w:proofErr w:type="spellEnd"/>
-      <w:r>
-        <w:t>,</w:t>
-      </w:r>
-      <w:r>
-        <w:t xml:space="preserve"> based on </w:t>
-      </w:r>
-      <w:r>
-        <w:t>its performance</w:t>
-      </w:r>
-      <w:r>
-        <w:t xml:space="preserve"> on </w:t>
-      </w:r>
-      <w:proofErr w:type="spellStart"/>
-      <w:r>
-        <w:t>SuperG</w:t>
-      </w:r>
-      <w:r>
-        <w:t>LUE</w:t>
-      </w:r>
-      <w:proofErr w:type="spellEnd"/>
-      <w:r>
-        <w:t xml:space="preserve"> </w:t>
-      </w:r>
-      <w:r>
-        <w:t>benchmarks</w:t>
-      </w:r>
-      <w:r>
-        <w:t xml:space="preserve"> and </w:t>
-      </w:r>
-      <w:r>
-        <w:t>achieve</w:t>
-      </w:r>
-      <w:r>
-        <w:t xml:space="preserve">ment </w:t>
-      </w:r>
-      <w:r>
-        <w:t xml:space="preserve">of high QWK scores </w:t>
-      </w:r>
-      <w:r>
-        <w:t xml:space="preserve">on </w:t>
-      </w:r>
-      <w:r>
-        <w:t>AES</w:t>
-      </w:r>
-      <w:r>
-        <w:t xml:space="preserve"> tasks</w:t>
-      </w:r>
-      <w:r>
-        <w:t>.</w:t>
-      </w:r>
-      <w:r>
-        <w:t xml:space="preserve"> The ASAP++ </w:t>
-      </w:r>
-      <w:r>
-        <w:t>dataset preserves</w:t>
-      </w:r>
-      <w:r>
-        <w:t xml:space="preserve"> the essays and prompts</w:t>
-      </w:r>
-      <w:r>
-        <w:t xml:space="preserve"> of ASAP 1.0</w:t>
-      </w:r>
-      <w:r>
-        <w:t xml:space="preserve"> but adds </w:t>
-      </w:r>
-      <w:r>
-        <w:t>trait</w:t>
-      </w:r>
-      <w:r>
-        <w:t xml:space="preserve">-level annotations. </w:t>
-      </w:r>
-      <w:proofErr w:type="spellStart"/>
-      <w:r>
-        <w:t>D</w:t>
-      </w:r>
-      <w:r>
-        <w:t>eBERTA</w:t>
-      </w:r>
-      <w:proofErr w:type="spellEnd"/>
-      <w:r>
-        <w:t xml:space="preserve"> </w:t>
-      </w:r>
-      <w:r>
-        <w:t xml:space="preserve">was </w:t>
-      </w:r>
-      <w:r>
-        <w:t xml:space="preserve">fine-tuned </w:t>
-      </w:r>
-      <w:r>
-        <w:t>using the essays</w:t>
-      </w:r>
-      <w:r>
-        <w:t xml:space="preserve"> and prompts from ASAP 1.0 and the trait-level annotations from ASAP++</w:t>
-      </w:r>
-      <w:r>
-        <w:t xml:space="preserve">. </w:t>
-      </w:r>
-      <w:r>
-        <w:t xml:space="preserve">This enabled the system to produce trait and holistic scores </w:t>
-      </w:r>
-      <w:r>
-        <w:t>while retaining an interpretable scoring structure.</w:t>
-      </w:r>
-      <w:r>
-        <w:t xml:space="preserve"> </w:t>
-      </w:r>
-    </w:p>
-    <w:p>
-      <w:pPr>
-        <w:spacing w:line="360" w:lineRule="auto"/>
-        <w:rPr>
-          <w:b/>
-          <w:bCs/>
-        </w:rPr>
-      </w:pPr>
-      <w:r>
-        <w:rPr>
-          <w:b/>
-          <w:bCs/>
-        </w:rPr>
-        <w:t>The OCR model</w:t>
-      </w:r>
-    </w:p>
-    <w:p>
-      <w:pPr>
-        <w:spacing w:line="360" w:lineRule="auto"/>
-      </w:pPr>
-      <w:proofErr w:type="spellStart"/>
-      <w:r>
-        <w:t>PaddleOCR</w:t>
-      </w:r>
-      <w:proofErr w:type="spellEnd"/>
-      <w:r>
-        <w:t xml:space="preserve"> </w:t>
-      </w:r>
-      <w:r>
-        <w:t>was</w:t>
-      </w:r>
-      <w:r>
-        <w:t xml:space="preserve"> selected </w:t>
-      </w:r>
-      <w:r>
-        <w:t xml:space="preserve">as the OCR input component </w:t>
-      </w:r>
-      <w:r>
-        <w:t>of</w:t>
-      </w:r>
-      <w:r>
-        <w:t xml:space="preserve"> </w:t>
-      </w:r>
-      <w:proofErr w:type="spellStart"/>
-      <w:r>
-        <w:t>BrainPower</w:t>
-      </w:r>
-      <w:proofErr w:type="spellEnd"/>
-      <w:r>
-        <w:t>.</w:t>
-      </w:r>
-      <w:r>
-        <w:t xml:space="preserve"> Although research has shown Tr-</w:t>
-      </w:r>
-      <w:proofErr w:type="spellStart"/>
-      <w:r>
-        <w:t>OCr</w:t>
-      </w:r>
-      <w:proofErr w:type="spellEnd"/>
-      <w:r>
-        <w:t xml:space="preserve"> outperforming </w:t>
-      </w:r>
-      <w:proofErr w:type="spellStart"/>
-      <w:r>
-        <w:t>PaddleOCR</w:t>
-      </w:r>
-      <w:proofErr w:type="spellEnd"/>
-      <w:r>
-        <w:t xml:space="preserve"> on some </w:t>
-      </w:r>
-      <w:r>
-        <w:t xml:space="preserve">handwriting </w:t>
-      </w:r>
-      <w:r>
-        <w:t xml:space="preserve">benchmarks, </w:t>
-      </w:r>
-      <w:proofErr w:type="spellStart"/>
-      <w:r>
-        <w:t>paddleOCR</w:t>
-      </w:r>
-      <w:proofErr w:type="spellEnd"/>
-      <w:r>
-        <w:t xml:space="preserve"> was chosen</w:t>
-      </w:r>
-      <w:r>
-        <w:t xml:space="preserve"> </w:t>
-      </w:r>
-      <w:r>
-        <w:t xml:space="preserve">because </w:t>
-      </w:r>
-      <w:proofErr w:type="spellStart"/>
-      <w:r>
-        <w:t>BrainPower</w:t>
-      </w:r>
-      <w:proofErr w:type="spellEnd"/>
-      <w:r>
-        <w:t xml:space="preserve"> needs an OCR component that can process a full page of text. </w:t>
-      </w:r>
-      <w:r>
-        <w:t>Tr-OCR</w:t>
-      </w:r>
-      <w:r>
-        <w:t xml:space="preserve"> was designed to detect, recognize and represent a single line of text</w:t>
-      </w:r>
-      <w:r>
-        <w:t xml:space="preserve">. </w:t>
-      </w:r>
-      <w:r>
-        <w:t xml:space="preserve">Furthermore, </w:t>
-      </w:r>
-      <w:proofErr w:type="spellStart"/>
-      <w:r>
-        <w:t>PaddlOCR</w:t>
-      </w:r>
-      <w:proofErr w:type="spellEnd"/>
-      <w:r>
-        <w:t xml:space="preserve"> has robust and proven</w:t>
-      </w:r>
-      <w:r>
-        <w:t xml:space="preserve"> text</w:t>
-      </w:r>
-      <w:r>
-        <w:t xml:space="preserve"> detection and recognition models</w:t>
-      </w:r>
-      <w:r>
-        <w:t xml:space="preserve"> that </w:t>
-      </w:r>
-      <w:r>
-        <w:t>have been pretrained to detect, recognise and represent a full page of handwritten text</w:t>
-      </w:r>
-      <w:r>
-        <w:t xml:space="preserve"> </w:t>
-      </w:r>
-      <w:r>
-        <w:t xml:space="preserve"> </w:t>
-      </w:r>
-    </w:p>
-    <w:p>
-      <w:pPr>
-        <w:spacing w:line="360" w:lineRule="auto"/>
-        <w:rPr>
-          <w:b/>
-          <w:bCs/>
-        </w:rPr>
-      </w:pPr>
-      <w:r>
-        <w:rPr>
-          <w:b/>
-          <w:bCs/>
-        </w:rPr>
-        <w:t>The ASR/STT model</w:t>
-      </w:r>
-    </w:p>
-    <w:p>
-      <w:pPr>
-        <w:spacing w:line="360" w:lineRule="auto"/>
-      </w:pPr>
-      <w:r>
-        <w:t xml:space="preserve">Whisper </w:t>
-      </w:r>
-      <w:r>
-        <w:t>was selected as</w:t>
-      </w:r>
-      <w:r>
-        <w:t xml:space="preserve"> the ASR/STT component of </w:t>
-      </w:r>
-      <w:proofErr w:type="spellStart"/>
-      <w:r>
-        <w:t>BrainPower</w:t>
-      </w:r>
-      <w:proofErr w:type="spellEnd"/>
-      <w:r>
-        <w:t xml:space="preserve">, </w:t>
-      </w:r>
-      <w:r>
-        <w:t xml:space="preserve">to </w:t>
-      </w:r>
-      <w:r>
-        <w:t>transcrib</w:t>
-      </w:r>
-      <w:r>
-        <w:t>e</w:t>
-      </w:r>
-      <w:r>
-        <w:t xml:space="preserve"> spoken essays,</w:t>
-      </w:r>
-      <w:r>
-        <w:t xml:space="preserve"> due to</w:t>
-      </w:r>
-      <w:r>
-        <w:t xml:space="preserve"> is reliab</w:t>
-      </w:r>
-      <w:r>
-        <w:t>ility and</w:t>
-      </w:r>
-      <w:r>
-        <w:t xml:space="preserve"> state-of-the-art performance. </w:t>
-      </w:r>
-      <w:r>
-        <w:t xml:space="preserve">It </w:t>
-      </w:r>
-      <w:r>
-        <w:t xml:space="preserve">also </w:t>
-      </w:r>
-      <w:r>
-        <w:t>satisf</w:t>
-      </w:r>
-      <w:r>
-        <w:t>ies</w:t>
-      </w:r>
-      <w:r>
-        <w:t xml:space="preserve"> </w:t>
-      </w:r>
-      <w:r>
-        <w:t>the requirement for a pretrained model</w:t>
-      </w:r>
-      <w:r>
-        <w:t xml:space="preserve">. </w:t>
-      </w:r>
-      <w:r>
-        <w:t>Whisper</w:t>
-      </w:r>
-      <w:r>
-        <w:t xml:space="preserve"> </w:t>
-      </w:r>
-      <w:r>
-        <w:t>has been</w:t>
-      </w:r>
-      <w:r>
-        <w:t xml:space="preserve"> trained </w:t>
-      </w:r>
-      <w:r>
-        <w:t xml:space="preserve">for extended periods </w:t>
-      </w:r>
-      <w:r>
-        <w:t xml:space="preserve">on </w:t>
-      </w:r>
-      <w:r>
-        <w:t xml:space="preserve">very </w:t>
-      </w:r>
-      <w:r>
-        <w:t>large datasets</w:t>
-      </w:r>
-      <w:r>
-        <w:t xml:space="preserve">, </w:t>
-      </w:r>
-      <w:r>
-        <w:t xml:space="preserve">which contain </w:t>
-      </w:r>
-      <w:r>
-        <w:t xml:space="preserve">samples of audio from </w:t>
-      </w:r>
-      <w:r>
-        <w:t>diverse speakers</w:t>
-      </w:r>
-      <w:r>
-        <w:t xml:space="preserve">. It has </w:t>
-      </w:r>
-      <w:r>
-        <w:t xml:space="preserve">consistently </w:t>
-      </w:r>
-      <w:r>
-        <w:t xml:space="preserve">performed very well, even </w:t>
-      </w:r>
-      <w:r>
-        <w:t xml:space="preserve">in experiments </w:t>
-      </w:r>
-      <w:r>
-        <w:t>with little to no training</w:t>
-      </w:r>
-      <w:r>
-        <w:t xml:space="preserve">, </w:t>
-      </w:r>
-      <w:r>
-        <w:t xml:space="preserve">outperforming </w:t>
-      </w:r>
-      <w:r>
-        <w:t xml:space="preserve">other </w:t>
-      </w:r>
-      <w:r>
-        <w:t>models</w:t>
-      </w:r>
-      <w:r>
-        <w:t xml:space="preserve">. </w:t>
-      </w:r>
-    </w:p>
-    <w:p>
-      <w:pPr>
-        <w:spacing w:line="360" w:lineRule="auto"/>
-      </w:pPr>
-      <w:r>
-        <w:br w:type="page"/>
-      </w:r>
-    </w:p>
-    <w:p/>
-    <w:p>
-      <w:pPr>
-        <w:pStyle w:val="Heading2"/>
-      </w:pPr>
-      <w:r>
-        <w:t xml:space="preserve">3.4 </w:t>
-      </w:r>
-      <w:r>
-        <w:t>User Interface</w:t>
-      </w:r>
-      <w:r>
-        <w:t xml:space="preserve"> Design</w:t>
-      </w:r>
-    </w:p>
-    <w:p>
-      <w:pPr>
-        <w:tabs>
-          <w:tab w:val="left" w:pos="1110"/>
-        </w:tabs>
-      </w:pPr>
-    </w:p>
-    <w:p>
-      <w:pPr>
-        <w:tabs>
-          <w:tab w:val="left" w:pos="1110"/>
-        </w:tabs>
-      </w:pPr>
-      <w:r>
-        <w:t xml:space="preserve">The image below describes the layout of the user interface of </w:t>
-      </w:r>
-      <w:proofErr w:type="spellStart"/>
-      <w:r>
-        <w:t>BrainPower</w:t>
-      </w:r>
-      <w:proofErr w:type="spellEnd"/>
-      <w:r>
-        <w:t xml:space="preserve">. </w:t>
-      </w:r>
-      <w:r>
-        <w:t xml:space="preserve">The user interacts with the system via web browser. </w:t>
-      </w:r>
-    </w:p>
-    <w:p>
-      <w:pPr>
-        <w:tabs>
-          <w:tab w:val="left" w:pos="1110"/>
-        </w:tabs>
-        <w:rPr>
-          <w:color w:val="EE0000"/>
-        </w:rPr>
-      </w:pPr>
-    </w:p>
-    <w:p>
-      <w:pPr>
-        <w:keepNext/>
-        <w:spacing w:line="360" w:lineRule="auto"/>
-        <w:jc w:val="center"/>
-      </w:pPr>
-      <w:r>
-        <w:rPr>
-          <w:noProof/>
-        </w:rPr>
+        <w:spacing w:line="360" w:lineRule="auto"/>
+      </w:pPr>
+      <w:r>
         <w:drawing>
-          <wp:inline distT="0" distB="0" distL="0" distR="0" wp14:anchorId="7956E342" wp14:editId="15596110">
-            <wp:extent cx="5626735" cy="4963795"/>
-            <wp:effectExtent l="0" t="0" r="0" b="8255"/>
-            <wp:docPr id="1751286285" name="Picture 1"/>
+          <wp:inline distT="0" distB="0" distL="0" distR="0" wp14:anchorId="49FF87E0" wp14:editId="1C21CDF6">
+            <wp:extent cx="5731510" cy="3982085"/>
+            <wp:effectExtent l="0" t="0" r="2540" b="0"/>
+            <wp:docPr id="296729627" name="Picture 1"/>
             <wp:cNvGraphicFramePr>
               <a:graphicFrameLocks xmlns:a="http://schemas.openxmlformats.org/drawingml/2006/main" noChangeAspect="1"/>
             </wp:cNvGraphicFramePr>
@@ -7698,32 +7549,23 @@
               <a:graphicData uri="http://schemas.openxmlformats.org/drawingml/2006/picture">
                 <pic:pic xmlns:pic="http://schemas.openxmlformats.org/drawingml/2006/picture">
                   <pic:nvPicPr>
-                    <pic:cNvPr id="1751286285" name=""/>
+                    <pic:cNvPr id="296729627" name=""/>
                     <pic:cNvPicPr/>
                   </pic:nvPicPr>
-                  <pic:blipFill rotWithShape="1">
+                  <pic:blipFill>
                     <a:blip r:embed="rId10"/>
-                    <a:srcRect l="1828" t="1138"/>
                     <a:stretch>
                       <a:fillRect/>
                     </a:stretch>
                   </pic:blipFill>
-                  <pic:spPr bwMode="auto">
+                  <pic:spPr>
                     <a:xfrm>
                       <a:off x="0" y="0"/>
-                      <a:ext cx="5626735" cy="4963795"/>
+                      <a:ext cx="5731510" cy="3982085"/>
                     </a:xfrm>
                     <a:prstGeom prst="rect">
                       <a:avLst/>
                     </a:prstGeom>
-                    <a:ln>
-                      <a:noFill/>
-                    </a:ln>
-                    <a:extLst>
-                      <a:ext uri="{53640926-AAD7-44D8-BBD7-CCE9431645EC}">
-                        <a14:shadowObscured xmlns:a14="http://schemas.microsoft.com/office/drawing/2010/main"/>
-                      </a:ext>
-                    </a:extLst>
                   </pic:spPr>
                 </pic:pic>
               </a:graphicData>
@@ -7734,6 +7576,893 @@
     </w:p>
     <w:p>
       <w:pPr>
+        <w:spacing w:line="360" w:lineRule="auto"/>
+      </w:pPr>
+    </w:p>
+    <w:p>
+      <w:pPr>
+        <w:rPr>
+          <w:b/>
+          <w:bCs/>
+        </w:rPr>
+      </w:pPr>
+      <w:r>
+        <w:rPr>
+          <w:b/>
+          <w:bCs/>
+        </w:rPr>
+        <w:br w:type="page"/>
+      </w:r>
+      <w:r>
+        <w:rPr>
+          <w:b/>
+          <w:bCs/>
+        </w:rPr>
+        <w:lastRenderedPageBreak/>
+        <w:t>Use Case</w:t>
+      </w:r>
+      <w:r>
+        <w:rPr>
+          <w:b/>
+          <w:bCs/>
+        </w:rPr>
+        <w:t xml:space="preserve"> 2:</w:t>
+      </w:r>
+      <w:r>
+        <w:rPr>
+          <w:b/>
+          <w:bCs/>
+        </w:rPr>
+        <w:t xml:space="preserve"> Audio-based essay submission</w:t>
+      </w:r>
+    </w:p>
+    <w:p>
+      <w:pPr>
+        <w:spacing w:line="360" w:lineRule="auto"/>
+      </w:pPr>
+      <w:r>
+        <w:t xml:space="preserve">The user submits a </w:t>
+      </w:r>
+      <w:r>
+        <w:t>recorded</w:t>
+      </w:r>
+      <w:r>
+        <w:t xml:space="preserve"> essay to the </w:t>
+      </w:r>
+      <w:r>
+        <w:t>AS</w:t>
+      </w:r>
+      <w:r>
+        <w:t>R</w:t>
+      </w:r>
+      <w:r>
+        <w:t xml:space="preserve">/STT </w:t>
+      </w:r>
+      <w:r>
+        <w:t>component via the user</w:t>
+      </w:r>
+      <w:r>
+        <w:t xml:space="preserve"> </w:t>
+      </w:r>
+      <w:r>
+        <w:t xml:space="preserve">interface. </w:t>
+      </w:r>
+      <w:proofErr w:type="spellStart"/>
+      <w:r>
+        <w:rPr>
+          <w:b/>
+          <w:bCs/>
+        </w:rPr>
+        <w:t>L</w:t>
+      </w:r>
+      <w:r>
+        <w:rPr>
+          <w:b/>
+          <w:bCs/>
+        </w:rPr>
+        <w:t>ibrosa</w:t>
+      </w:r>
+      <w:proofErr w:type="spellEnd"/>
+      <w:r>
+        <w:t xml:space="preserve"> interprets the audio signal </w:t>
+      </w:r>
+      <w:r>
+        <w:t>and represents it as</w:t>
+      </w:r>
+      <w:r>
+        <w:t xml:space="preserve"> a</w:t>
+      </w:r>
+      <w:r>
+        <w:t xml:space="preserve"> vector of numerical values. </w:t>
+      </w:r>
+      <w:r>
+        <w:t xml:space="preserve">Whisper then transcribes the audio signal and represents the signal as machine-readable text. </w:t>
+      </w:r>
+      <w:r>
+        <w:t xml:space="preserve">The </w:t>
+      </w:r>
+      <w:r>
+        <w:t>ASR</w:t>
+      </w:r>
+      <w:r>
+        <w:t xml:space="preserve"> Evaluator calculates the Word Error Rate (WER) and Character Error Rate (CER) against the ground-truth essay. If both the WER and CER are at or </w:t>
+      </w:r>
+      <w:r>
+        <w:t>below</w:t>
+      </w:r>
+      <w:r>
+        <w:t xml:space="preserve"> </w:t>
+      </w:r>
+      <w:r>
+        <w:t>their respective thresholds</w:t>
+      </w:r>
+      <w:r>
+        <w:t>, the essay is routed to the transformer for scoring. Otherwise, the essay is routed to the human scorer.</w:t>
+      </w:r>
+    </w:p>
+    <w:p>
+      <w:pPr>
+        <w:rPr>
+          <w:b/>
+          <w:bCs/>
+        </w:rPr>
+      </w:pPr>
+      <w:r>
+        <w:rPr>
+          <w:b/>
+          <w:bCs/>
+        </w:rPr>
+        <w:drawing>
+          <wp:inline distT="0" distB="0" distL="0" distR="0" wp14:anchorId="4FB69642" wp14:editId="57C43814">
+            <wp:extent cx="5731510" cy="5041265"/>
+            <wp:effectExtent l="0" t="0" r="2540" b="6985"/>
+            <wp:docPr id="1005222396" name="Picture 1"/>
+            <wp:cNvGraphicFramePr>
+              <a:graphicFrameLocks xmlns:a="http://schemas.openxmlformats.org/drawingml/2006/main" noChangeAspect="1"/>
+            </wp:cNvGraphicFramePr>
+            <a:graphic xmlns:a="http://schemas.openxmlformats.org/drawingml/2006/main">
+              <a:graphicData uri="http://schemas.openxmlformats.org/drawingml/2006/picture">
+                <pic:pic xmlns:pic="http://schemas.openxmlformats.org/drawingml/2006/picture">
+                  <pic:nvPicPr>
+                    <pic:cNvPr id="1005222396" name=""/>
+                    <pic:cNvPicPr/>
+                  </pic:nvPicPr>
+                  <pic:blipFill>
+                    <a:blip r:embed="rId11"/>
+                    <a:stretch>
+                      <a:fillRect/>
+                    </a:stretch>
+                  </pic:blipFill>
+                  <pic:spPr>
+                    <a:xfrm>
+                      <a:off x="0" y="0"/>
+                      <a:ext cx="5731510" cy="5041265"/>
+                    </a:xfrm>
+                    <a:prstGeom prst="rect">
+                      <a:avLst/>
+                    </a:prstGeom>
+                  </pic:spPr>
+                </pic:pic>
+              </a:graphicData>
+            </a:graphic>
+          </wp:inline>
+        </w:drawing>
+      </w:r>
+      <w:r>
+        <w:rPr>
+          <w:b/>
+          <w:bCs/>
+        </w:rPr>
+        <w:br w:type="page"/>
+      </w:r>
+    </w:p>
+    <w:p>
+      <w:pPr>
+        <w:spacing w:line="360" w:lineRule="auto"/>
+        <w:rPr>
+          <w:b/>
+          <w:bCs/>
+        </w:rPr>
+      </w:pPr>
+      <w:r>
+        <w:rPr>
+          <w:b/>
+          <w:bCs/>
+        </w:rPr>
+        <w:lastRenderedPageBreak/>
+        <w:t>Use Case</w:t>
+      </w:r>
+      <w:r>
+        <w:rPr>
+          <w:b/>
+          <w:bCs/>
+        </w:rPr>
+        <w:t xml:space="preserve"> 3:</w:t>
+      </w:r>
+      <w:r>
+        <w:rPr>
+          <w:b/>
+          <w:bCs/>
+        </w:rPr>
+        <w:t xml:space="preserve"> Machine-readable essay submission</w:t>
+      </w:r>
+    </w:p>
+    <w:p>
+      <w:pPr>
+        <w:spacing w:line="360" w:lineRule="auto"/>
+      </w:pPr>
+      <w:r>
+        <w:t>An e</w:t>
+      </w:r>
+      <w:r>
+        <w:t xml:space="preserve">ssay in machine-readable format </w:t>
+      </w:r>
+      <w:r>
+        <w:t xml:space="preserve">is </w:t>
+      </w:r>
+      <w:r>
+        <w:t xml:space="preserve">routed to </w:t>
+      </w:r>
+      <w:proofErr w:type="spellStart"/>
+      <w:r>
+        <w:t>deBERTa</w:t>
+      </w:r>
+      <w:proofErr w:type="spellEnd"/>
+      <w:r>
+        <w:t xml:space="preserve"> </w:t>
+      </w:r>
+      <w:r>
+        <w:t>for</w:t>
+      </w:r>
+      <w:r>
+        <w:t xml:space="preserve"> evaluation</w:t>
+      </w:r>
+      <w:r>
+        <w:t xml:space="preserve"> and scoring. The model processes the text, evaluates and scores the essay. The Transformer Output Evaluator, then calculates the QWK. If the QWK is wit</w:t>
+      </w:r>
+      <w:r>
+        <w:t>h</w:t>
+      </w:r>
+      <w:r>
+        <w:t xml:space="preserve">in the acceptable range, the scores are displayed to the user via the web interface. If not, the essay is routed to the human scorer for evaluation and scoring. </w:t>
+      </w:r>
+    </w:p>
+    <w:p>
+      <w:pPr>
+        <w:spacing w:line="360" w:lineRule="auto"/>
+      </w:pPr>
+      <w:r>
+        <w:drawing>
+          <wp:inline distT="0" distB="0" distL="0" distR="0" wp14:anchorId="6CBDA20C" wp14:editId="2AF85821">
+            <wp:extent cx="5731510" cy="3592830"/>
+            <wp:effectExtent l="0" t="0" r="2540" b="7620"/>
+            <wp:docPr id="914435399" name="Picture 1"/>
+            <wp:cNvGraphicFramePr>
+              <a:graphicFrameLocks xmlns:a="http://schemas.openxmlformats.org/drawingml/2006/main" noChangeAspect="1"/>
+            </wp:cNvGraphicFramePr>
+            <a:graphic xmlns:a="http://schemas.openxmlformats.org/drawingml/2006/main">
+              <a:graphicData uri="http://schemas.openxmlformats.org/drawingml/2006/picture">
+                <pic:pic xmlns:pic="http://schemas.openxmlformats.org/drawingml/2006/picture">
+                  <pic:nvPicPr>
+                    <pic:cNvPr id="914435399" name=""/>
+                    <pic:cNvPicPr/>
+                  </pic:nvPicPr>
+                  <pic:blipFill>
+                    <a:blip r:embed="rId12"/>
+                    <a:stretch>
+                      <a:fillRect/>
+                    </a:stretch>
+                  </pic:blipFill>
+                  <pic:spPr>
+                    <a:xfrm>
+                      <a:off x="0" y="0"/>
+                      <a:ext cx="5731510" cy="3592830"/>
+                    </a:xfrm>
+                    <a:prstGeom prst="rect">
+                      <a:avLst/>
+                    </a:prstGeom>
+                  </pic:spPr>
+                </pic:pic>
+              </a:graphicData>
+            </a:graphic>
+          </wp:inline>
+        </w:drawing>
+      </w:r>
+    </w:p>
+    <w:p>
+      <w:pPr>
+        <w:rPr>
+          <w:rFonts w:eastAsiaTheme="majorEastAsia" w:cstheme="majorBidi"/>
+          <w:color w:val="0F4761" w:themeColor="accent1" w:themeShade="BF"/>
+          <w:sz w:val="28"/>
+          <w:szCs w:val="28"/>
+        </w:rPr>
+      </w:pPr>
+      <w:r>
+        <w:br w:type="page"/>
+      </w:r>
+    </w:p>
+    <w:p>
+      <w:pPr>
+        <w:pStyle w:val="Heading3"/>
+      </w:pPr>
+      <w:r>
+        <w:lastRenderedPageBreak/>
+        <w:t xml:space="preserve">3.4 </w:t>
+      </w:r>
+      <w:r>
+        <w:t>Component Selection</w:t>
+      </w:r>
+    </w:p>
+    <w:p>
+      <w:pPr>
+        <w:ind w:left="405"/>
+      </w:pPr>
+    </w:p>
+    <w:p>
+      <w:pPr>
+        <w:rPr>
+          <w:b/>
+          <w:bCs/>
+        </w:rPr>
+      </w:pPr>
+      <w:r>
+        <w:rPr>
+          <w:b/>
+          <w:bCs/>
+        </w:rPr>
+        <w:t xml:space="preserve">The </w:t>
+      </w:r>
+      <w:r>
+        <w:rPr>
+          <w:b/>
+          <w:bCs/>
+        </w:rPr>
+        <w:t>T</w:t>
+      </w:r>
+      <w:r>
+        <w:rPr>
+          <w:b/>
+          <w:bCs/>
+        </w:rPr>
+        <w:t>ransformer model</w:t>
+      </w:r>
+    </w:p>
+    <w:p>
+      <w:pPr>
+        <w:spacing w:line="360" w:lineRule="auto"/>
+      </w:pPr>
+      <w:proofErr w:type="spellStart"/>
+      <w:r>
+        <w:t>DeBERTa</w:t>
+      </w:r>
+      <w:proofErr w:type="spellEnd"/>
+      <w:r>
+        <w:t xml:space="preserve"> </w:t>
+      </w:r>
+      <w:r>
+        <w:t>was</w:t>
+      </w:r>
+      <w:r>
+        <w:t xml:space="preserve"> selected </w:t>
+      </w:r>
+      <w:r>
+        <w:t>as the essay scoring component of</w:t>
+      </w:r>
+      <w:r>
+        <w:t xml:space="preserve"> </w:t>
+      </w:r>
+      <w:proofErr w:type="spellStart"/>
+      <w:r>
+        <w:t>BrainPower</w:t>
+      </w:r>
+      <w:proofErr w:type="spellEnd"/>
+      <w:r>
+        <w:t>,</w:t>
+      </w:r>
+      <w:r>
+        <w:t xml:space="preserve"> based on </w:t>
+      </w:r>
+      <w:r>
+        <w:t>its performance</w:t>
+      </w:r>
+      <w:r>
+        <w:t xml:space="preserve"> on </w:t>
+      </w:r>
+      <w:proofErr w:type="spellStart"/>
+      <w:r>
+        <w:t>SuperG</w:t>
+      </w:r>
+      <w:r>
+        <w:t>LUE</w:t>
+      </w:r>
+      <w:proofErr w:type="spellEnd"/>
+      <w:r>
+        <w:t xml:space="preserve"> </w:t>
+      </w:r>
+      <w:r>
+        <w:t>benchmarks</w:t>
+      </w:r>
+      <w:r>
+        <w:t xml:space="preserve"> and </w:t>
+      </w:r>
+      <w:r>
+        <w:t>achieve</w:t>
+      </w:r>
+      <w:r>
+        <w:t xml:space="preserve">ment </w:t>
+      </w:r>
+      <w:r>
+        <w:t xml:space="preserve">of high QWK scores </w:t>
+      </w:r>
+      <w:r>
+        <w:t xml:space="preserve">on </w:t>
+      </w:r>
+      <w:r>
+        <w:t>AES</w:t>
+      </w:r>
+      <w:r>
+        <w:t xml:space="preserve"> tasks</w:t>
+      </w:r>
+      <w:r>
+        <w:t>.</w:t>
+      </w:r>
+      <w:r>
+        <w:t xml:space="preserve"> The ASAP++ </w:t>
+      </w:r>
+      <w:r>
+        <w:t>dataset preserves</w:t>
+      </w:r>
+      <w:r>
+        <w:t xml:space="preserve"> the essays and prompts</w:t>
+      </w:r>
+      <w:r>
+        <w:t xml:space="preserve"> of ASAP 1.0</w:t>
+      </w:r>
+      <w:r>
+        <w:t xml:space="preserve"> but adds </w:t>
+      </w:r>
+      <w:r>
+        <w:t>trait</w:t>
+      </w:r>
+      <w:r>
+        <w:t xml:space="preserve">-level annotations. </w:t>
+      </w:r>
+      <w:proofErr w:type="spellStart"/>
+      <w:r>
+        <w:t>D</w:t>
+      </w:r>
+      <w:r>
+        <w:t>eBERTA</w:t>
+      </w:r>
+      <w:proofErr w:type="spellEnd"/>
+      <w:r>
+        <w:t xml:space="preserve"> </w:t>
+      </w:r>
+      <w:r>
+        <w:t xml:space="preserve">was </w:t>
+      </w:r>
+      <w:r>
+        <w:t xml:space="preserve">fine-tuned </w:t>
+      </w:r>
+      <w:r>
+        <w:t>using the essays</w:t>
+      </w:r>
+      <w:r>
+        <w:t xml:space="preserve"> and prompts from ASAP 1.0 and the trait-level annotations from ASAP++</w:t>
+      </w:r>
+      <w:r>
+        <w:t xml:space="preserve">. </w:t>
+      </w:r>
+      <w:r>
+        <w:t xml:space="preserve">This enabled the system to produce trait and holistic scores </w:t>
+      </w:r>
+      <w:r>
+        <w:t>while retaining an interpretable scoring structure.</w:t>
+      </w:r>
+      <w:r>
+        <w:t xml:space="preserve"> </w:t>
+      </w:r>
+    </w:p>
+    <w:p>
+      <w:pPr>
+        <w:spacing w:line="360" w:lineRule="auto"/>
+        <w:rPr>
+          <w:b/>
+          <w:bCs/>
+        </w:rPr>
+      </w:pPr>
+      <w:r>
+        <w:rPr>
+          <w:b/>
+          <w:bCs/>
+        </w:rPr>
+        <w:t>The OCR model</w:t>
+      </w:r>
+    </w:p>
+    <w:p>
+      <w:pPr>
+        <w:spacing w:line="360" w:lineRule="auto"/>
+      </w:pPr>
+      <w:proofErr w:type="spellStart"/>
+      <w:r>
+        <w:t>PaddleOCR</w:t>
+      </w:r>
+      <w:proofErr w:type="spellEnd"/>
+      <w:r>
+        <w:t xml:space="preserve"> </w:t>
+      </w:r>
+      <w:r>
+        <w:t>was</w:t>
+      </w:r>
+      <w:r>
+        <w:t xml:space="preserve"> selected </w:t>
+      </w:r>
+      <w:r>
+        <w:t xml:space="preserve">as the OCR input component </w:t>
+      </w:r>
+      <w:r>
+        <w:t>of</w:t>
+      </w:r>
+      <w:r>
+        <w:t xml:space="preserve"> </w:t>
+      </w:r>
+      <w:proofErr w:type="spellStart"/>
+      <w:r>
+        <w:t>BrainPower</w:t>
+      </w:r>
+      <w:proofErr w:type="spellEnd"/>
+      <w:r>
+        <w:t>.</w:t>
+      </w:r>
+      <w:r>
+        <w:t xml:space="preserve"> Although research has shown Tr-</w:t>
+      </w:r>
+      <w:proofErr w:type="spellStart"/>
+      <w:r>
+        <w:t>OCr</w:t>
+      </w:r>
+      <w:proofErr w:type="spellEnd"/>
+      <w:r>
+        <w:t xml:space="preserve"> outperforming </w:t>
+      </w:r>
+      <w:proofErr w:type="spellStart"/>
+      <w:r>
+        <w:t>PaddleOCR</w:t>
+      </w:r>
+      <w:proofErr w:type="spellEnd"/>
+      <w:r>
+        <w:t xml:space="preserve"> on some </w:t>
+      </w:r>
+      <w:r>
+        <w:t xml:space="preserve">handwriting </w:t>
+      </w:r>
+      <w:r>
+        <w:t xml:space="preserve">benchmarks, </w:t>
+      </w:r>
+      <w:proofErr w:type="spellStart"/>
+      <w:r>
+        <w:t>paddleOCR</w:t>
+      </w:r>
+      <w:proofErr w:type="spellEnd"/>
+      <w:r>
+        <w:t xml:space="preserve"> was chosen</w:t>
+      </w:r>
+      <w:r>
+        <w:t xml:space="preserve"> </w:t>
+      </w:r>
+      <w:r>
+        <w:t xml:space="preserve">because </w:t>
+      </w:r>
+      <w:proofErr w:type="spellStart"/>
+      <w:r>
+        <w:t>BrainPower</w:t>
+      </w:r>
+      <w:proofErr w:type="spellEnd"/>
+      <w:r>
+        <w:t xml:space="preserve"> needs an OCR component that can process a full page of text. </w:t>
+      </w:r>
+      <w:r>
+        <w:t>Tr-OCR</w:t>
+      </w:r>
+      <w:r>
+        <w:t xml:space="preserve"> was designed to detect, recognize and represent a single line of text</w:t>
+      </w:r>
+      <w:r>
+        <w:t xml:space="preserve">. </w:t>
+      </w:r>
+      <w:r>
+        <w:t xml:space="preserve">Furthermore, </w:t>
+      </w:r>
+      <w:proofErr w:type="spellStart"/>
+      <w:r>
+        <w:t>PaddlOCR</w:t>
+      </w:r>
+      <w:proofErr w:type="spellEnd"/>
+      <w:r>
+        <w:t xml:space="preserve"> has robust and proven</w:t>
+      </w:r>
+      <w:r>
+        <w:t xml:space="preserve"> text</w:t>
+      </w:r>
+      <w:r>
+        <w:t xml:space="preserve"> detection and recognition models</w:t>
+      </w:r>
+      <w:r>
+        <w:t xml:space="preserve"> that </w:t>
+      </w:r>
+      <w:r>
+        <w:t>have been pretrained to detect, recognise and represent a full page of handwritten text</w:t>
+      </w:r>
+      <w:r>
+        <w:t xml:space="preserve"> </w:t>
+      </w:r>
+      <w:r>
+        <w:t xml:space="preserve"> </w:t>
+      </w:r>
+    </w:p>
+    <w:p>
+      <w:pPr>
+        <w:spacing w:line="360" w:lineRule="auto"/>
+        <w:rPr>
+          <w:b/>
+          <w:bCs/>
+        </w:rPr>
+      </w:pPr>
+      <w:r>
+        <w:rPr>
+          <w:b/>
+          <w:bCs/>
+        </w:rPr>
+        <w:t>The ASR/STT model</w:t>
+      </w:r>
+    </w:p>
+    <w:p>
+      <w:pPr>
+        <w:spacing w:line="360" w:lineRule="auto"/>
+      </w:pPr>
+      <w:r>
+        <w:t xml:space="preserve">Whisper </w:t>
+      </w:r>
+      <w:r>
+        <w:t>was selected as</w:t>
+      </w:r>
+      <w:r>
+        <w:t xml:space="preserve"> the ASR/STT component of </w:t>
+      </w:r>
+      <w:proofErr w:type="spellStart"/>
+      <w:r>
+        <w:t>BrainPower</w:t>
+      </w:r>
+      <w:proofErr w:type="spellEnd"/>
+      <w:r>
+        <w:t xml:space="preserve">, </w:t>
+      </w:r>
+      <w:r>
+        <w:t xml:space="preserve">to </w:t>
+      </w:r>
+      <w:r>
+        <w:t>transcrib</w:t>
+      </w:r>
+      <w:r>
+        <w:t>e</w:t>
+      </w:r>
+      <w:r>
+        <w:t xml:space="preserve"> spoken essays,</w:t>
+      </w:r>
+      <w:r>
+        <w:t xml:space="preserve"> due to</w:t>
+      </w:r>
+      <w:r>
+        <w:t xml:space="preserve"> is reliab</w:t>
+      </w:r>
+      <w:r>
+        <w:t>ility and</w:t>
+      </w:r>
+      <w:r>
+        <w:t xml:space="preserve"> state-of-the-art performance. </w:t>
+      </w:r>
+      <w:r>
+        <w:t xml:space="preserve">It </w:t>
+      </w:r>
+      <w:r>
+        <w:t xml:space="preserve">also </w:t>
+      </w:r>
+      <w:r>
+        <w:t>satisf</w:t>
+      </w:r>
+      <w:r>
+        <w:t>ies</w:t>
+      </w:r>
+      <w:r>
+        <w:t xml:space="preserve"> </w:t>
+      </w:r>
+      <w:r>
+        <w:t>the requirement for a pretrained model</w:t>
+      </w:r>
+      <w:r>
+        <w:t xml:space="preserve">. </w:t>
+      </w:r>
+      <w:r>
+        <w:t>Whisper</w:t>
+      </w:r>
+      <w:r>
+        <w:t xml:space="preserve"> </w:t>
+      </w:r>
+      <w:r>
+        <w:t>has been</w:t>
+      </w:r>
+      <w:r>
+        <w:t xml:space="preserve"> trained </w:t>
+      </w:r>
+      <w:r>
+        <w:t xml:space="preserve">for extended periods </w:t>
+      </w:r>
+      <w:r>
+        <w:t xml:space="preserve">on </w:t>
+      </w:r>
+      <w:r>
+        <w:t xml:space="preserve">very </w:t>
+      </w:r>
+      <w:r>
+        <w:t>large datasets</w:t>
+      </w:r>
+      <w:r>
+        <w:t xml:space="preserve">, </w:t>
+      </w:r>
+      <w:r>
+        <w:t xml:space="preserve">which contain </w:t>
+      </w:r>
+      <w:r>
+        <w:t xml:space="preserve">samples of audio from </w:t>
+      </w:r>
+      <w:r>
+        <w:t>diverse speakers</w:t>
+      </w:r>
+      <w:r>
+        <w:t xml:space="preserve">. It has </w:t>
+      </w:r>
+      <w:r>
+        <w:t xml:space="preserve">consistently </w:t>
+      </w:r>
+      <w:r>
+        <w:t xml:space="preserve">performed very well, even </w:t>
+      </w:r>
+      <w:r>
+        <w:t xml:space="preserve">in experiments </w:t>
+      </w:r>
+      <w:r>
+        <w:t>with little to no training</w:t>
+      </w:r>
+      <w:r>
+        <w:t xml:space="preserve">, </w:t>
+      </w:r>
+      <w:r>
+        <w:t xml:space="preserve">outperforming </w:t>
+      </w:r>
+      <w:r>
+        <w:t xml:space="preserve">other </w:t>
+      </w:r>
+      <w:r>
+        <w:t>models</w:t>
+      </w:r>
+      <w:r>
+        <w:t xml:space="preserve">. </w:t>
+      </w:r>
+    </w:p>
+    <w:p>
+      <w:pPr>
+        <w:spacing w:line="360" w:lineRule="auto"/>
+      </w:pPr>
+      <w:r>
+        <w:br w:type="page"/>
+      </w:r>
+    </w:p>
+    <w:p>
+      <w:pPr>
+        <w:pStyle w:val="Heading3"/>
+      </w:pPr>
+      <w:r>
+        <w:lastRenderedPageBreak/>
+        <w:t>3.</w:t>
+      </w:r>
+      <w:r>
+        <w:t>5</w:t>
+      </w:r>
+      <w:r>
+        <w:t xml:space="preserve"> </w:t>
+      </w:r>
+      <w:r>
+        <w:t>User Interface</w:t>
+      </w:r>
+      <w:r>
+        <w:t xml:space="preserve"> Design</w:t>
+      </w:r>
+    </w:p>
+    <w:p>
+      <w:pPr>
+        <w:tabs>
+          <w:tab w:val="left" w:pos="1110"/>
+        </w:tabs>
+      </w:pPr>
+    </w:p>
+    <w:p>
+      <w:pPr>
+        <w:tabs>
+          <w:tab w:val="left" w:pos="1110"/>
+        </w:tabs>
+      </w:pPr>
+      <w:r>
+        <w:t xml:space="preserve">The image below describes the layout of the user interface of </w:t>
+      </w:r>
+      <w:proofErr w:type="spellStart"/>
+      <w:r>
+        <w:t>BrainPower</w:t>
+      </w:r>
+      <w:proofErr w:type="spellEnd"/>
+      <w:r>
+        <w:t xml:space="preserve">. </w:t>
+      </w:r>
+      <w:r>
+        <w:t xml:space="preserve">The user interacts with the system via web browser. </w:t>
+      </w:r>
+    </w:p>
+    <w:p>
+      <w:pPr>
+        <w:tabs>
+          <w:tab w:val="left" w:pos="1110"/>
+        </w:tabs>
+        <w:rPr>
+          <w:color w:val="EE0000"/>
+        </w:rPr>
+      </w:pPr>
+    </w:p>
+    <w:p>
+      <w:pPr>
+        <w:keepNext/>
+        <w:spacing w:line="360" w:lineRule="auto"/>
+        <w:jc w:val="center"/>
+      </w:pPr>
+      <w:r>
+        <w:drawing>
+          <wp:inline distT="0" distB="0" distL="0" distR="0" wp14:anchorId="4741951B" wp14:editId="26DF1D46">
+            <wp:extent cx="5731510" cy="5317490"/>
+            <wp:effectExtent l="0" t="0" r="2540" b="0"/>
+            <wp:docPr id="1158281747" name="Picture 1"/>
+            <wp:cNvGraphicFramePr>
+              <a:graphicFrameLocks xmlns:a="http://schemas.openxmlformats.org/drawingml/2006/main" noChangeAspect="1"/>
+            </wp:cNvGraphicFramePr>
+            <a:graphic xmlns:a="http://schemas.openxmlformats.org/drawingml/2006/main">
+              <a:graphicData uri="http://schemas.openxmlformats.org/drawingml/2006/picture">
+                <pic:pic xmlns:pic="http://schemas.openxmlformats.org/drawingml/2006/picture">
+                  <pic:nvPicPr>
+                    <pic:cNvPr id="1158281747" name=""/>
+                    <pic:cNvPicPr/>
+                  </pic:nvPicPr>
+                  <pic:blipFill>
+                    <a:blip r:embed="rId13"/>
+                    <a:stretch>
+                      <a:fillRect/>
+                    </a:stretch>
+                  </pic:blipFill>
+                  <pic:spPr>
+                    <a:xfrm>
+                      <a:off x="0" y="0"/>
+                      <a:ext cx="5731510" cy="5317490"/>
+                    </a:xfrm>
+                    <a:prstGeom prst="rect">
+                      <a:avLst/>
+                    </a:prstGeom>
+                  </pic:spPr>
+                </pic:pic>
+              </a:graphicData>
+            </a:graphic>
+          </wp:inline>
+        </w:drawing>
+      </w:r>
+    </w:p>
+    <w:p>
+      <w:pPr>
         <w:pStyle w:val="Caption"/>
         <w:rPr>
           <w:b/>
@@ -7956,7 +8685,13 @@
       </w:pPr>
       <w:r>
         <w:lastRenderedPageBreak/>
-        <w:t>3.5 Scope</w:t>
+        <w:t>3.</w:t>
+      </w:r>
+      <w:r>
+        <w:t>6</w:t>
+      </w:r>
+      <w:r>
+        <w:t xml:space="preserve"> Scope</w:t>
       </w:r>
     </w:p>
     <w:p>
@@ -8458,7 +9193,7 @@
       <w:pPr>
         <w:spacing w:line="360" w:lineRule="auto"/>
         <w:sectPr>
-          <w:footerReference w:type="default" r:id="rId11"/>
+          <w:footerReference w:type="default" r:id="rId14"/>
           <w:pgSz w:w="11906" w:h="16838"/>
           <w:pgMar w:top="1440" w:right="1440" w:bottom="1440" w:left="1440" w:header="708" w:footer="708" w:gutter="0"/>
           <w:cols w:space="708"/>
@@ -11505,7 +12240,7 @@
                     <pic:cNvPicPr/>
                   </pic:nvPicPr>
                   <pic:blipFill>
-                    <a:blip r:embed="rId12"/>
+                    <a:blip r:embed="rId15"/>
                     <a:stretch>
                       <a:fillRect/>
                     </a:stretch>
@@ -11590,7 +12325,7 @@
                     <pic:cNvPicPr/>
                   </pic:nvPicPr>
                   <pic:blipFill>
-                    <a:blip r:embed="rId13"/>
+                    <a:blip r:embed="rId16"/>
                     <a:stretch>
                       <a:fillRect/>
                     </a:stretch>
@@ -11897,7 +12632,7 @@
                     <pic:cNvPicPr/>
                   </pic:nvPicPr>
                   <pic:blipFill>
-                    <a:blip r:embed="rId14"/>
+                    <a:blip r:embed="rId17"/>
                     <a:stretch>
                       <a:fillRect/>
                     </a:stretch>
@@ -11996,7 +12731,7 @@
                     <pic:cNvPicPr/>
                   </pic:nvPicPr>
                   <pic:blipFill>
-                    <a:blip r:embed="rId15"/>
+                    <a:blip r:embed="rId18"/>
                     <a:stretch>
                       <a:fillRect/>
                     </a:stretch>
@@ -12495,7 +13230,7 @@
                     <pic:cNvPicPr/>
                   </pic:nvPicPr>
                   <pic:blipFill>
-                    <a:blip r:embed="rId16"/>
+                    <a:blip r:embed="rId19"/>
                     <a:stretch>
                       <a:fillRect/>
                     </a:stretch>
@@ -12613,7 +13348,7 @@
                     <pic:cNvPicPr/>
                   </pic:nvPicPr>
                   <pic:blipFill rotWithShape="1">
-                    <a:blip r:embed="rId17"/>
+                    <a:blip r:embed="rId20"/>
                     <a:srcRect r="5389"/>
                     <a:stretch>
                       <a:fillRect/>
@@ -12998,7 +13733,7 @@
                     <pic:cNvPicPr/>
                   </pic:nvPicPr>
                   <pic:blipFill>
-                    <a:blip r:embed="rId18"/>
+                    <a:blip r:embed="rId21"/>
                     <a:stretch>
                       <a:fillRect/>
                     </a:stretch>
@@ -13219,7 +13954,7 @@
                     <pic:cNvPicPr/>
                   </pic:nvPicPr>
                   <pic:blipFill>
-                    <a:blip r:embed="rId19"/>
+                    <a:blip r:embed="rId22"/>
                     <a:stretch>
                       <a:fillRect/>
                     </a:stretch>
@@ -13562,7 +14297,7 @@
                     <pic:cNvPicPr/>
                   </pic:nvPicPr>
                   <pic:blipFill>
-                    <a:blip r:embed="rId20"/>
+                    <a:blip r:embed="rId23"/>
                     <a:stretch>
                       <a:fillRect/>
                     </a:stretch>
@@ -13631,7 +14366,7 @@
                     <pic:cNvPicPr/>
                   </pic:nvPicPr>
                   <pic:blipFill>
-                    <a:blip r:embed="rId21"/>
+                    <a:blip r:embed="rId24"/>
                     <a:stretch>
                       <a:fillRect/>
                     </a:stretch>
@@ -13705,7 +14440,7 @@
                     <pic:cNvPicPr/>
                   </pic:nvPicPr>
                   <pic:blipFill>
-                    <a:blip r:embed="rId22"/>
+                    <a:blip r:embed="rId25"/>
                     <a:stretch>
                       <a:fillRect/>
                     </a:stretch>
@@ -13801,7 +14536,7 @@
                     <pic:cNvPicPr/>
                   </pic:nvPicPr>
                   <pic:blipFill>
-                    <a:blip r:embed="rId23"/>
+                    <a:blip r:embed="rId26"/>
                     <a:stretch>
                       <a:fillRect/>
                     </a:stretch>
@@ -13846,7 +14581,7 @@
                     <pic:cNvPicPr/>
                   </pic:nvPicPr>
                   <pic:blipFill>
-                    <a:blip r:embed="rId24"/>
+                    <a:blip r:embed="rId27"/>
                     <a:stretch>
                       <a:fillRect/>
                     </a:stretch>
@@ -13913,7 +14648,7 @@
                     <pic:cNvPicPr/>
                   </pic:nvPicPr>
                   <pic:blipFill>
-                    <a:blip r:embed="rId25"/>
+                    <a:blip r:embed="rId28"/>
                     <a:stretch>
                       <a:fillRect/>
                     </a:stretch>
@@ -13967,7 +14702,7 @@
         <w:pStyle w:val="Heading2"/>
         <w:spacing w:line="360" w:lineRule="auto"/>
         <w:sectPr>
-          <w:footerReference w:type="default" r:id="rId26"/>
+          <w:footerReference w:type="default" r:id="rId29"/>
           <w:pgSz w:w="11906" w:h="16838"/>
           <w:pgMar w:top="1440" w:right="1440" w:bottom="1440" w:left="1440" w:header="708" w:footer="708" w:gutter="0"/>
           <w:cols w:space="708"/>

</xml_diff>

<commit_message>
Updated Eval Metrics section added literature support
</commit_message>
<xml_diff>
--- a/final report/Final Report.docx
+++ b/final report/Final Report.docx
@@ -1,6 +1,6 @@
 
 <file path=word/document.xml><?xml version="1.0" encoding="utf-8"?>
-<w:document xmlns:wpc="http://schemas.microsoft.com/office/word/2010/wordprocessingCanvas" xmlns:cx="http://schemas.microsoft.com/office/drawing/2014/chartex" xmlns:cx1="http://schemas.microsoft.com/office/drawing/2015/9/8/chartex" xmlns:cx2="http://schemas.microsoft.com/office/drawing/2015/10/21/chartex" xmlns:cx3="http://schemas.microsoft.com/office/drawing/2016/5/9/chartex" xmlns:cx4="http://schemas.microsoft.com/office/drawing/2016/5/10/chartex" xmlns:cx5="http://schemas.microsoft.com/office/drawing/2016/5/11/chartex" xmlns:cx6="http://schemas.microsoft.com/office/drawing/2016/5/12/chartex" xmlns:cx7="http://schemas.microsoft.com/office/drawing/2016/5/13/chartex" xmlns:cx8="http://schemas.microsoft.com/office/drawing/2016/5/14/chartex" xmlns:mc="http://schemas.openxmlformats.org/markup-compatibility/2006" xmlns:aink="http://schemas.microsoft.com/office/drawing/2016/ink" xmlns:am3d="http://schemas.microsoft.com/office/drawing/2017/model3d" xmlns:o="urn:schemas-microsoft-com:office:office" xmlns:oel="http://schemas.microsoft.com/office/2019/extlst" xmlns:r="http://schemas.openxmlformats.org/officeDocument/2006/relationships" xmlns:m="http://schemas.openxmlformats.org/officeDocument/2006/math" xmlns:v="urn:schemas-microsoft-com:vml" xmlns:wp14="http://schemas.microsoft.com/office/word/2010/wordprocessingDrawing" xmlns:wp="http://schemas.openxmlformats.org/drawingml/2006/wordprocessingDrawing" xmlns:w10="urn:schemas-microsoft-com:office:word" xmlns:w="http://schemas.openxmlformats.org/wordprocessingml/2006/main" xmlns:w14="http://schemas.microsoft.com/office/word/2010/wordml" xmlns:w15="http://schemas.microsoft.com/office/word/2012/wordml" xmlns:w16cei="http://schemas.microsoft.com/office/word/2026/wordml/cei" xmlns:w16cex="http://schemas.microsoft.com/office/word/2018/wordml/cex" xmlns:w16cid="http://schemas.microsoft.com/office/word/2016/wordml/cid" xmlns:w16="http://schemas.microsoft.com/office/word/2018/wordml" xmlns:w16du="http://schemas.microsoft.com/office/word/2023/wordml/word16du" xmlns:w16sdtdh="http://schemas.microsoft.com/office/word/2020/wordml/sdtdatahash" xmlns:w16sdtfl="http://schemas.microsoft.com/office/word/2024/wordml/sdtformatlock" xmlns:w16se="http://schemas.microsoft.com/office/word/2015/wordml/symex" xmlns:wpg="http://schemas.microsoft.com/office/word/2010/wordprocessingGroup" xmlns:wpi="http://schemas.microsoft.com/office/word/2010/wordprocessingInk" xmlns:wne="http://schemas.microsoft.com/office/word/2006/wordml" xmlns:wps="http://schemas.microsoft.com/office/word/2010/wordprocessingShape" mc:Ignorable="w14 w15 w16se w16cid w16 w16cex w16sdtdh w16sdtfl w16du wp14">
+<w:document xmlns:wpc="http://schemas.microsoft.com/office/word/2010/wordprocessingCanvas" xmlns:cx="http://schemas.microsoft.com/office/drawing/2014/chartex" xmlns:cx1="http://schemas.microsoft.com/office/drawing/2015/9/8/chartex" xmlns:cx2="http://schemas.microsoft.com/office/drawing/2015/10/21/chartex" xmlns:cx3="http://schemas.microsoft.com/office/drawing/2016/5/9/chartex" xmlns:cx4="http://schemas.microsoft.com/office/drawing/2016/5/10/chartex" xmlns:cx5="http://schemas.microsoft.com/office/drawing/2016/5/11/chartex" xmlns:cx6="http://schemas.microsoft.com/office/drawing/2016/5/12/chartex" xmlns:cx7="http://schemas.microsoft.com/office/drawing/2016/5/13/chartex" xmlns:cx8="http://schemas.microsoft.com/office/drawing/2016/5/14/chartex" xmlns:mc="http://schemas.openxmlformats.org/markup-compatibility/2006" xmlns:aink="http://schemas.microsoft.com/office/drawing/2016/ink" xmlns:am3d="http://schemas.microsoft.com/office/drawing/2017/model3d" xmlns:o="urn:schemas-microsoft-com:office:office" xmlns:oel="http://schemas.microsoft.com/office/2019/extlst" xmlns:r="http://schemas.openxmlformats.org/officeDocument/2006/relationships" xmlns:m="http://schemas.openxmlformats.org/officeDocument/2006/math" xmlns:v="urn:schemas-microsoft-com:vml" xmlns:wp14="http://schemas.microsoft.com/office/word/2010/wordprocessingDrawing" xmlns:wp="http://schemas.openxmlformats.org/drawingml/2006/wordprocessingDrawing" xmlns:w10="urn:schemas-microsoft-com:office:word" xmlns:w="http://schemas.openxmlformats.org/wordprocessingml/2006/main" xmlns:w14="http://schemas.microsoft.com/office/word/2010/wordml" xmlns:w15="http://schemas.microsoft.com/office/word/2012/wordml" xmlns:w16cex="http://schemas.microsoft.com/office/word/2018/wordml/cex" xmlns:w16cid="http://schemas.microsoft.com/office/word/2016/wordml/cid" xmlns:w16="http://schemas.microsoft.com/office/word/2018/wordml" xmlns:w16du="http://schemas.microsoft.com/office/word/2023/wordml/word16du" xmlns:w16sdtdh="http://schemas.microsoft.com/office/word/2020/wordml/sdtdatahash" xmlns:w16sdtfl="http://schemas.microsoft.com/office/word/2024/wordml/sdtformatlock" xmlns:w16se="http://schemas.microsoft.com/office/word/2015/wordml/symex" xmlns:wpg="http://schemas.microsoft.com/office/word/2010/wordprocessingGroup" xmlns:wpi="http://schemas.microsoft.com/office/word/2010/wordprocessingInk" xmlns:wne="http://schemas.microsoft.com/office/word/2006/wordml" xmlns:wps="http://schemas.microsoft.com/office/word/2010/wordprocessingShape" mc:Ignorable="w14 w15 w16se w16cid w16 w16cex w16sdtdh w16sdtfl w16du wp14">
   <w:body>
     <w:p>
       <w:pPr>
@@ -4893,12 +4893,6 @@
       <w:r>
         <w:t xml:space="preserve"> </w:t>
       </w:r>
-      <w:r>
-        <w:t>QWK (Quadratic weighted Kappa) evaluates the degree of agreement among human and AI scorers, it is a metric between 0 and 1, representing no agreement beyond chance and perfect agreement, respectively [1]</w:t>
-      </w:r>
-      <w:r>
-        <w:t>.</w:t>
-      </w:r>
     </w:p>
     <w:p>
       <w:pPr>
@@ -5006,79 +5000,94 @@
       <w:r>
         <w:t xml:space="preserve"> </w:t>
       </w:r>
-      <w:r>
-        <w:t xml:space="preserve">Lagakis and </w:t>
-      </w:r>
       <w:proofErr w:type="spellStart"/>
       <w:r>
+        <w:t>Lagakis</w:t>
+      </w:r>
+      <w:proofErr w:type="spellEnd"/>
+      <w:r>
+        <w:t xml:space="preserve"> and </w:t>
+      </w:r>
+      <w:proofErr w:type="spellStart"/>
+      <w:r>
         <w:t>Demetriadis</w:t>
       </w:r>
       <w:proofErr w:type="spellEnd"/>
       <w:r>
-        <w:t xml:space="preserve"> [3], they make use of huge </w:t>
+        <w:t xml:space="preserve"> [3], they make use of huge datasets of existing general text data, such as Wikipedia Corpus, to pretrain multilayer neural networks with context-sensitive meaning of and relationships between words.</w:t>
+      </w:r>
+    </w:p>
+    <w:p>
+      <w:pPr>
+        <w:spacing w:line="360" w:lineRule="auto"/>
+      </w:pPr>
+      <w:r>
+        <w:t xml:space="preserve">Yang </w:t>
+      </w:r>
+      <w:r>
+        <w:t xml:space="preserve">[4] compared the performance of several models on an AES task. The results show transformer models outperforming traditional models, achieving higher QWK scores. </w:t>
       </w:r>
       <w:r>
         <w:lastRenderedPageBreak/>
-        <w:t>datasets of existing general text data, such as Wikipedia Corpus, to pretrain multilayer neural networks with context-sensitive meaning of and relationships between words.</w:t>
-      </w:r>
-    </w:p>
-    <w:p>
-      <w:pPr>
-        <w:spacing w:line="360" w:lineRule="auto"/>
-      </w:pPr>
+        <w:t>The best performer was a NCPR model, which used contrastive learning and utilised BERT for feature extraction achieved a QWK of 0.817, indicating a close similarity to human scoring.</w:t>
+      </w:r>
+    </w:p>
+    <w:p>
+      <w:pPr>
+        <w:spacing w:line="360" w:lineRule="auto"/>
+      </w:pPr>
+      <w:proofErr w:type="spellStart"/>
+      <w:r>
+        <w:t>Lagakis</w:t>
+      </w:r>
+      <w:proofErr w:type="spellEnd"/>
+      <w:r>
+        <w:t xml:space="preserve"> and </w:t>
+      </w:r>
+      <w:proofErr w:type="spellStart"/>
+      <w:r>
+        <w:t>Demetriadis</w:t>
+      </w:r>
+      <w:proofErr w:type="spellEnd"/>
+      <w:r>
+        <w:t xml:space="preserve"> </w:t>
+      </w:r>
+      <w:r>
+        <w:t xml:space="preserve">[3] suggests not relying solely on transformer models and like [4], proposed a technique of combining transformers with more traditional approaches like those that employ handcrafted features. </w:t>
+      </w:r>
+      <w:r>
+        <w:t xml:space="preserve">Xu et al. </w:t>
+      </w:r>
+      <w:r>
+        <w:t xml:space="preserve">[1] argued that human evaluation remains important since expert markers can identify subtle linguistic and cognitive qualities that automated systems may overlook. </w:t>
+      </w:r>
       <w:r>
         <w:t xml:space="preserve">Yang </w:t>
       </w:r>
       <w:r>
-        <w:t>[4] compared the performance of several models on an AES task. The results show transformer models outperforming traditional models, achieving higher QWK scores. The best performer was a NCPR model, which used contrastive learning and utilised BERT for feature extraction achieved a QWK of 0.817, indicating a close similarity to human scoring.</w:t>
-      </w:r>
-    </w:p>
-    <w:p>
-      <w:pPr>
-        <w:spacing w:line="360" w:lineRule="auto"/>
-      </w:pPr>
-      <w:r>
-        <w:t xml:space="preserve">Lagakis and </w:t>
+        <w:t xml:space="preserve">[4] indicated that when models work in combination the results are more promising. </w:t>
+      </w:r>
+      <w:r>
+        <w:t xml:space="preserve">Dadi and </w:t>
       </w:r>
       <w:proofErr w:type="spellStart"/>
       <w:r>
-        <w:t>Demetriadis</w:t>
+        <w:t>Sanampudi</w:t>
       </w:r>
       <w:proofErr w:type="spellEnd"/>
       <w:r>
         <w:t xml:space="preserve"> </w:t>
       </w:r>
       <w:r>
-        <w:t xml:space="preserve">[3] suggests not relying solely on transformer models and like [4], proposed a technique of combining transformers with more traditional approaches like those that employ handcrafted features. </w:t>
-      </w:r>
-      <w:r>
-        <w:t xml:space="preserve">Xu et al. </w:t>
-      </w:r>
-      <w:r>
-        <w:t xml:space="preserve">[1] argued that human evaluation remains important since expert markers can identify subtle linguistic and cognitive qualities that automated systems may overlook. </w:t>
-      </w:r>
-      <w:r>
-        <w:t xml:space="preserve">Yang </w:t>
-      </w:r>
-      <w:r>
-        <w:t xml:space="preserve">[4] indicated that when models work in combination the results are more promising. </w:t>
-      </w:r>
-      <w:r>
-        <w:t xml:space="preserve">Dadi and </w:t>
+        <w:t xml:space="preserve">[7] used a hybrid model – LSTM and Word Embedding and achieved a QWK of 0.94. </w:t>
       </w:r>
       <w:proofErr w:type="spellStart"/>
       <w:r>
-        <w:t>Sanampudi</w:t>
+        <w:t>Lagakis</w:t>
       </w:r>
       <w:proofErr w:type="spellEnd"/>
       <w:r>
-        <w:t xml:space="preserve"> </w:t>
-      </w:r>
-      <w:r>
-        <w:t xml:space="preserve">[7] used a hybrid model – LSTM and Word Embedding and achieved a QWK of 0.94. </w:t>
-      </w:r>
-      <w:r>
-        <w:t xml:space="preserve">Lagakis and </w:t>
+        <w:t xml:space="preserve"> and </w:t>
       </w:r>
       <w:proofErr w:type="spellStart"/>
       <w:r>
@@ -5183,18 +5192,15 @@
         <w:t xml:space="preserve">Jain et al. </w:t>
       </w:r>
       <w:r>
-        <w:t xml:space="preserve">[8] defines OCR as a computational technology that extracts text in an editable format from PDF files, scanned or hand-written documents, images etc. [9] describes traditional OCR systems as comprising two modules: a text detection module </w:t>
-      </w:r>
+        <w:t>[8] defines OCR as a computational technology that extracts text in an editable format from PDF files, scanned or hand-written documents, images etc. [9] describes traditional OCR systems as comprising two modules: a text detection module and a text recognition module. Text detection localizes all text blocks at word-level or text-line level while text recognition aims to understand the text image content and transcribe the visual signals into natural language tokens [9].</w:t>
+      </w:r>
+    </w:p>
+    <w:p>
+      <w:pPr>
+        <w:spacing w:line="360" w:lineRule="auto"/>
+      </w:pPr>
       <w:r>
         <w:lastRenderedPageBreak/>
-        <w:t>and a text recognition module. Text detection localizes all text blocks at word-level or text-line level while text recognition aims to understand the text image content and transcribe the visual signals into natural language tokens [9].</w:t>
-      </w:r>
-    </w:p>
-    <w:p>
-      <w:pPr>
-        <w:spacing w:line="360" w:lineRule="auto"/>
-      </w:pPr>
-      <w:r>
         <w:t>Mostafa et al. [10] summarized work done using OCR to digitize Bangla scripts - a diverse and complicated language in written form. They concluded that CNN architectures are the most accurate tried and tested method for that task. Although no evidence is given of the performance of transformer models, the researchers do acknowledge their potential. The decision to experiment with Bangla script as compared to English may be due to its perceived difficulty compared to English although the research did not make that claim.</w:t>
       </w:r>
     </w:p>
@@ -5337,16 +5343,19 @@
         <w:spacing w:line="360" w:lineRule="auto"/>
       </w:pPr>
       <w:r>
+        <w:t xml:space="preserve">A study carried out by [13], where YOLOv10, an object detector, was integrated with Tr-OCR and </w:t>
+      </w:r>
+      <w:proofErr w:type="spellStart"/>
+      <w:r>
+        <w:t>PaddleOCR</w:t>
+      </w:r>
+      <w:proofErr w:type="spellEnd"/>
+      <w:r>
+        <w:t xml:space="preserve"> for reliable text detection, found that Tr-OCR provided the best overall solution for reliable, high-accuracy container ISO code recognition with a </w:t>
+      </w:r>
+      <w:r>
         <w:lastRenderedPageBreak/>
-        <w:t xml:space="preserve">A study carried out by [13], where YOLOv10, an object detector, was integrated with Tr-OCR and </w:t>
-      </w:r>
-      <w:proofErr w:type="spellStart"/>
-      <w:r>
-        <w:t>PaddleOCR</w:t>
-      </w:r>
-      <w:proofErr w:type="spellEnd"/>
-      <w:r>
-        <w:t xml:space="preserve"> for reliable text detection, found that Tr-OCR provided the best overall solution for reliable, high-accuracy container ISO code recognition with a recognition accuracy of 92% outperforming </w:t>
+        <w:t xml:space="preserve">recognition accuracy of 92% outperforming </w:t>
       </w:r>
       <w:proofErr w:type="spellStart"/>
       <w:r>
@@ -5431,10 +5440,7 @@
         <w:t>. The architecture always maintains the three-stage pipeline design of "text-detection + direction classification + text recognition".</w:t>
       </w:r>
       <w:r>
-        <w:t xml:space="preserve"> </w:t>
-      </w:r>
-      <w:r>
-        <w:t>Wang et al.</w:t>
+        <w:t xml:space="preserve"> Wang et al.</w:t>
       </w:r>
       <w:r>
         <w:t xml:space="preserve"> </w:t>
@@ -5523,11 +5529,11 @@
         <w:t>[16]</w:t>
       </w:r>
       <w:r>
-        <w:t xml:space="preserve">. Historically, ASR </w:t>
+        <w:t xml:space="preserve">. Historically, ASR systems were constructed from a complex pipeline of independently trained components for example, a pronunciation model (lexicon) and a language model (LM). </w:t>
       </w:r>
       <w:r>
         <w:lastRenderedPageBreak/>
-        <w:t>systems were constructed from a complex pipeline of independently trained components for example, a pronunciation model (lexicon) and a language model (LM). Like early AES systems, features had to be hand engineered, which was tedious and did not scale well.</w:t>
+        <w:t>Like early AES systems, features had to be hand engineered, which was tedious and did not scale well.</w:t>
       </w:r>
     </w:p>
     <w:p>
@@ -5626,20 +5632,17 @@
         <w:t xml:space="preserve"> et al. </w:t>
       </w:r>
       <w:r>
-        <w:t xml:space="preserve">[20] discovered that about 1% of transcriptions contain fabricated phrases that were not present in the original audio, and that a significant portion of these can lead to harmful implications. The study further indicated that systems which lack the necessary </w:t>
-      </w:r>
+        <w:t>[20] discovered that about 1% of transcriptions contain fabricated phrases that were not present in the original audio, and that a significant portion of these can lead to harmful implications. The study further indicated that systems which lack the necessary processing power will experience transcription latency, as Whisper models occupy gigabytes of storage space and this may be undesirable.</w:t>
+      </w:r>
+    </w:p>
+    <w:p>
+      <w:pPr>
+        <w:pStyle w:val="Heading3"/>
+        <w:spacing w:line="360" w:lineRule="auto"/>
+      </w:pPr>
+      <w:bookmarkStart w:id="9" w:name="_Toc237985779"/>
       <w:r>
         <w:lastRenderedPageBreak/>
-        <w:t>processing power will experience transcription latency, as Whisper models occupy gigabytes of storage space and this may be undesirable.</w:t>
-      </w:r>
-    </w:p>
-    <w:p>
-      <w:pPr>
-        <w:pStyle w:val="Heading3"/>
-        <w:spacing w:line="360" w:lineRule="auto"/>
-      </w:pPr>
-      <w:bookmarkStart w:id="9" w:name="_Toc237985779"/>
-      <w:r>
         <w:t>2.1.4 Multimodal Systems</w:t>
       </w:r>
       <w:bookmarkEnd w:id="9"/>
@@ -5793,17 +5796,17 @@
           <w:b/>
           <w:bCs/>
         </w:rPr>
+        <w:t>ExaGrade</w:t>
+      </w:r>
+      <w:proofErr w:type="spellEnd"/>
+    </w:p>
+    <w:p>
+      <w:pPr>
+        <w:spacing w:line="360" w:lineRule="auto"/>
+      </w:pPr>
+      <w:proofErr w:type="spellStart"/>
+      <w:r>
         <w:lastRenderedPageBreak/>
-        <w:t>ExaGrade</w:t>
-      </w:r>
-      <w:proofErr w:type="spellEnd"/>
-    </w:p>
-    <w:p>
-      <w:pPr>
-        <w:spacing w:line="360" w:lineRule="auto"/>
-      </w:pPr>
-      <w:proofErr w:type="spellStart"/>
-      <w:r>
         <w:t>Algablan</w:t>
       </w:r>
       <w:proofErr w:type="spellEnd"/>
@@ -5984,31 +5987,25 @@
         <w:spacing w:line="360" w:lineRule="auto"/>
       </w:pPr>
       <w:r>
-        <w:t>Hlongwane</w:t>
-      </w:r>
-      <w:r>
-        <w:t xml:space="preserve"> </w:t>
+        <w:t xml:space="preserve">Hlongwane </w:t>
       </w:r>
       <w:r>
         <w:t xml:space="preserve">et al. </w:t>
       </w:r>
       <w:r>
-        <w:t xml:space="preserve">[20] developed an inclusive learning classroom using the OpenAI Whisper model. The model was selected to promote diversity and inclusivity in education through real-time transcription and translation for students with diverse linguistic and cultural abilities and backgrounds. The results were encouraging as the model achieved high accuracy especially in an environment where ambient noise did </w:t>
+        <w:t xml:space="preserve">[20] developed an inclusive learning classroom using the OpenAI Whisper model. The model was selected to promote diversity and inclusivity in education through real-time transcription and translation for students with diverse linguistic and cultural abilities and backgrounds. The results were encouraging as the model achieved high accuracy especially in an environment where ambient noise did not alter the audio signal input. This system however is limited in input modality as it </w:t>
       </w:r>
       <w:r>
         <w:lastRenderedPageBreak/>
-        <w:t>not alter the audio signal input. This system however is limited in input modality as it only focuses on audio transcription with no allocation made for submission of handwritten work.</w:t>
-      </w:r>
-    </w:p>
-    <w:p>
-      <w:pPr>
-        <w:spacing w:line="360" w:lineRule="auto"/>
-      </w:pPr>
-      <w:r>
-        <w:t>Baclayon</w:t>
-      </w:r>
-      <w:r>
-        <w:t xml:space="preserve"> </w:t>
+        <w:t>only focuses on audio transcription with no allocation made for submission of handwritten work.</w:t>
+      </w:r>
+    </w:p>
+    <w:p>
+      <w:pPr>
+        <w:spacing w:line="360" w:lineRule="auto"/>
+      </w:pPr>
+      <w:r>
+        <w:t xml:space="preserve">Baclayon </w:t>
       </w:r>
       <w:r>
         <w:t xml:space="preserve">et al. </w:t>
@@ -6358,10 +6355,7 @@
         <w:spacing w:line="360" w:lineRule="auto"/>
       </w:pPr>
       <w:r>
-        <w:t>Aravindan</w:t>
-      </w:r>
-      <w:r>
-        <w:t xml:space="preserve"> </w:t>
+        <w:t xml:space="preserve">Aravindan </w:t>
       </w:r>
       <w:r>
         <w:t xml:space="preserve">et al. </w:t>
@@ -6504,395 +6498,370 @@
     <w:p>
       <w:pPr>
         <w:spacing w:line="360" w:lineRule="auto"/>
+      </w:pPr>
+      <w:proofErr w:type="spellStart"/>
+      <w:r>
+        <w:t>PaddleOCR</w:t>
+      </w:r>
+      <w:proofErr w:type="spellEnd"/>
+      <w:r>
+        <w:t xml:space="preserve"> and Whis</w:t>
+      </w:r>
+      <w:r>
+        <w:t>p</w:t>
+      </w:r>
+      <w:r>
+        <w:t xml:space="preserve">er perform sequence-to-sequence translation and transcription respectively. The output is a variable-length machine-readable string. </w:t>
+      </w:r>
+      <w:r>
+        <w:t>It is standard practice to</w:t>
+      </w:r>
+      <w:r>
+        <w:t xml:space="preserve"> </w:t>
+      </w:r>
+      <w:r>
+        <w:t>measure</w:t>
+      </w:r>
+      <w:r>
+        <w:t xml:space="preserve"> </w:t>
+      </w:r>
+      <w:r>
+        <w:t xml:space="preserve">the accuracy of the output of both processes </w:t>
+      </w:r>
+      <w:r>
+        <w:t xml:space="preserve">using edit-distance metrics such as Word Error Rate (WER) and Character Error Rate (CER). </w:t>
+      </w:r>
+    </w:p>
+    <w:p>
+      <w:pPr>
+        <w:spacing w:line="360" w:lineRule="auto"/>
         <w:rPr>
           <w:b/>
           <w:bCs/>
-          <w:color w:val="EE0000"/>
         </w:rPr>
       </w:pPr>
       <w:r>
         <w:rPr>
           <w:b/>
           <w:bCs/>
-          <w:color w:val="EE0000"/>
-        </w:rPr>
-        <w:t xml:space="preserve">Talk about what other studies used, not just what these mean. Indicate why </w:t>
-      </w:r>
-      <w:proofErr w:type="spellStart"/>
+        </w:rPr>
+        <w:t xml:space="preserve">Word </w:t>
+      </w:r>
       <w:r>
         <w:rPr>
           <w:b/>
           <w:bCs/>
-          <w:color w:val="EE0000"/>
-        </w:rPr>
-        <w:t>wer</w:t>
+        </w:rPr>
+        <w:t>and Character Error Rate (WER and CER)</w:t>
+      </w:r>
+    </w:p>
+    <w:p>
+      <w:pPr>
+        <w:spacing w:line="360" w:lineRule="auto"/>
+      </w:pPr>
+      <w:r>
+        <w:t>The WER metric is used to measure the percentage of words that are incorrectly recognized or translated by the OCR Engine compared to a reference (ground truth) text</w:t>
+      </w:r>
+      <w:r>
+        <w:t xml:space="preserve"> </w:t>
+      </w:r>
+      <w:r>
+        <w:t>[31]</w:t>
+      </w:r>
+      <w:r>
+        <w:t xml:space="preserve">. </w:t>
+      </w:r>
+      <w:r>
+        <w:t xml:space="preserve">According to </w:t>
+      </w:r>
+      <w:proofErr w:type="spellStart"/>
+      <w:r>
+        <w:t>Tabrej</w:t>
       </w:r>
       <w:proofErr w:type="spellEnd"/>
       <w:r>
+        <w:t xml:space="preserve"> </w:t>
+      </w:r>
+      <w:r>
+        <w:t xml:space="preserve">et al. </w:t>
+      </w:r>
+      <w:r>
+        <w:t xml:space="preserve">[16], this is the common metric for ASR accuracy. </w:t>
+      </w:r>
+    </w:p>
+    <w:p>
+      <w:pPr>
+        <w:spacing w:line="360" w:lineRule="auto"/>
+      </w:pPr>
+      <w:r>
+        <w:t>CER</w:t>
+      </w:r>
+      <w:r>
+        <w:t>, however, counts</w:t>
+      </w:r>
+      <w:r>
+        <w:t xml:space="preserve"> any deletions, insertions or substitutions at the character level, enabling evaluation based on character-wise accuracy. CER works well in spotting symbol, typographical and abbreviation mistakes [32].</w:t>
+      </w:r>
+      <w:r>
+        <w:t xml:space="preserve"> </w:t>
+      </w:r>
+      <w:r>
+        <w:t>Li et al. [9] used CER to evaluate the performance of Tr-OCR on the IAM handwriting database.</w:t>
+      </w:r>
+    </w:p>
+    <w:p>
+      <w:pPr>
+        <w:spacing w:line="360" w:lineRule="auto"/>
+      </w:pPr>
+      <w:r>
+        <w:t>Zhang [33] use</w:t>
+      </w:r>
+      <w:r>
+        <w:t>d</w:t>
+      </w:r>
+      <w:r>
+        <w:t xml:space="preserve"> WER to assess the performance of a CNN </w:t>
+      </w:r>
+      <w:r>
+        <w:t xml:space="preserve">in recognizing </w:t>
+      </w:r>
+      <w:r>
+        <w:t>spoken Englis</w:t>
+      </w:r>
+      <w:r>
+        <w:t>h</w:t>
+      </w:r>
+      <w:r>
+        <w:t xml:space="preserve"> </w:t>
+      </w:r>
+      <w:r>
+        <w:t xml:space="preserve">and a Sep2Sep model </w:t>
+      </w:r>
+      <w:r>
+        <w:t>in translating it</w:t>
+      </w:r>
+      <w:r>
+        <w:t xml:space="preserve">. </w:t>
+      </w:r>
+      <w:r>
+        <w:t xml:space="preserve">Schubert et al. [34] calculated WER using the </w:t>
+      </w:r>
+      <w:proofErr w:type="spellStart"/>
+      <w:r>
+        <w:t>jiwer</w:t>
+      </w:r>
+      <w:proofErr w:type="spellEnd"/>
+      <w:r>
+        <w:t xml:space="preserve"> python library to assess the performance of Whisper (Open Ai), </w:t>
+      </w:r>
+      <w:proofErr w:type="spellStart"/>
+      <w:proofErr w:type="gramStart"/>
+      <w:r>
+        <w:t>NeMo</w:t>
+      </w:r>
+      <w:proofErr w:type="spellEnd"/>
+      <w:r>
+        <w:t>(</w:t>
+      </w:r>
+      <w:proofErr w:type="gramEnd"/>
+      <w:r>
+        <w:t xml:space="preserve">NVIDIA) an Wav2Vec2.0(Meta Ai) in transcribing spontaneous as well as read speech form young speakers in Germany. </w:t>
+      </w:r>
+      <w:r>
+        <w:t xml:space="preserve">While widely adopted, </w:t>
+      </w:r>
+      <w:r>
+        <w:t xml:space="preserve">WER and CER </w:t>
+      </w:r>
+      <w:r>
+        <w:t>possess inherent limitations when evaluation real-world system performance</w:t>
+      </w:r>
+      <w:r>
+        <w:t xml:space="preserve">. </w:t>
+      </w:r>
+    </w:p>
+    <w:p>
+      <w:pPr>
         <w:rPr>
           <w:b/>
           <w:bCs/>
-          <w:color w:val="EE0000"/>
-        </w:rPr>
-        <w:t xml:space="preserve"> and </w:t>
-      </w:r>
-      <w:proofErr w:type="spellStart"/>
+        </w:rPr>
+      </w:pPr>
       <w:r>
         <w:rPr>
           <w:b/>
           <w:bCs/>
-          <w:color w:val="EE0000"/>
-        </w:rPr>
-        <w:t>cer</w:t>
-      </w:r>
-      <w:proofErr w:type="spellEnd"/>
-      <w:r>
+        </w:rPr>
+        <w:br w:type="page"/>
+      </w:r>
+    </w:p>
+    <w:p>
+      <w:pPr>
+        <w:spacing w:line="360" w:lineRule="auto"/>
         <w:rPr>
           <w:b/>
           <w:bCs/>
-          <w:color w:val="EE0000"/>
-        </w:rPr>
-        <w:t xml:space="preserve"> are chosen for evaluating the output of </w:t>
-      </w:r>
-      <w:proofErr w:type="spellStart"/>
+        </w:rPr>
+      </w:pPr>
       <w:r>
         <w:rPr>
           <w:b/>
           <w:bCs/>
-          <w:color w:val="EE0000"/>
-        </w:rPr>
-        <w:t>asr</w:t>
+        </w:rPr>
+        <w:lastRenderedPageBreak/>
+        <w:t xml:space="preserve">Limitations of WER and CER </w:t>
+      </w:r>
+    </w:p>
+    <w:p>
+      <w:pPr>
+        <w:spacing w:line="360" w:lineRule="auto"/>
+      </w:pPr>
+      <w:proofErr w:type="spellStart"/>
+      <w:r>
+        <w:t>Tabrej</w:t>
       </w:r>
       <w:proofErr w:type="spellEnd"/>
       <w:r>
-        <w:rPr>
-          <w:b/>
-          <w:bCs/>
-          <w:color w:val="EE0000"/>
-        </w:rPr>
-        <w:t>/</w:t>
+        <w:t xml:space="preserve"> et al. [16] state that, while WER and CER measure accuracy, they do not capture the real-time performance of the system. This limitation is due to these metrics designed specifically for post-process evaluation – applied to the output, rather than during the processing phase. </w:t>
       </w:r>
       <w:proofErr w:type="spellStart"/>
       <w:r>
-        <w:rPr>
-          <w:b/>
-          <w:bCs/>
-          <w:color w:val="EE0000"/>
-        </w:rPr>
-        <w:t>ocr</w:t>
+        <w:t>Tabrej</w:t>
       </w:r>
       <w:proofErr w:type="spellEnd"/>
       <w:r>
-        <w:rPr>
-          <w:b/>
-          <w:bCs/>
-          <w:color w:val="EE0000"/>
-        </w:rPr>
-        <w:t xml:space="preserve">. And the role of precision and recall. </w:t>
+        <w:t xml:space="preserve"> et al. [16] further state that latency and real-time factor (RTF) are key metrics for streaming and that a comprehensive evaluation of an ASR system is required to assess the trade-off between WER and the other two metrics. </w:t>
+      </w:r>
+    </w:p>
+    <w:p>
+      <w:pPr>
+        <w:spacing w:line="360" w:lineRule="auto"/>
+      </w:pPr>
+      <w:r>
+        <w:t xml:space="preserve">To assess the live performance of the system </w:t>
       </w:r>
       <w:proofErr w:type="spellStart"/>
       <w:r>
-        <w:rPr>
-          <w:b/>
-          <w:bCs/>
-          <w:color w:val="EE0000"/>
-        </w:rPr>
-        <w:t>Qwk</w:t>
+        <w:t>paddleOCR’s</w:t>
       </w:r>
       <w:proofErr w:type="spellEnd"/>
       <w:r>
-        <w:rPr>
-          <w:b/>
-          <w:bCs/>
-          <w:color w:val="EE0000"/>
-        </w:rPr>
-        <w:t xml:space="preserve"> for </w:t>
-      </w:r>
+        <w:t xml:space="preserve"> confidence scores will be uses and Whis</w:t>
+      </w:r>
+      <w:r>
+        <w:t>p</w:t>
+      </w:r>
+      <w:r>
+        <w:t xml:space="preserve">er </w:t>
+      </w:r>
+      <w:r>
+        <w:t>average log probability</w:t>
+      </w:r>
+      <w:r>
+        <w:t xml:space="preserve">. </w:t>
+      </w:r>
+    </w:p>
+    <w:p>
+      <w:pPr>
+        <w:spacing w:line="360" w:lineRule="auto"/>
+      </w:pPr>
       <w:proofErr w:type="spellStart"/>
       <w:r>
-        <w:rPr>
-          <w:b/>
-          <w:bCs/>
-          <w:color w:val="EE0000"/>
-        </w:rPr>
-        <w:t>deBERTa</w:t>
+        <w:t>DeBERTA</w:t>
       </w:r>
       <w:proofErr w:type="spellEnd"/>
       <w:r>
-        <w:rPr>
-          <w:b/>
-          <w:bCs/>
-          <w:color w:val="EE0000"/>
-        </w:rPr>
-        <w:t xml:space="preserve"> evaluation. </w:t>
-      </w:r>
-      <w:r>
-        <w:rPr>
-          <w:b/>
-          <w:bCs/>
-          <w:color w:val="EE0000"/>
-        </w:rPr>
-        <w:t xml:space="preserve">Quote paper on limitations of </w:t>
-      </w:r>
-      <w:proofErr w:type="gramStart"/>
-      <w:r>
-        <w:rPr>
-          <w:b/>
-          <w:bCs/>
-          <w:color w:val="EE0000"/>
-        </w:rPr>
-        <w:t>particular metrics</w:t>
-      </w:r>
-      <w:proofErr w:type="gramEnd"/>
-    </w:p>
-    <w:p>
-      <w:pPr>
-        <w:spacing w:line="360" w:lineRule="auto"/>
-        <w:rPr>
-          <w:b/>
-          <w:bCs/>
-        </w:rPr>
-      </w:pPr>
-      <w:r>
-        <w:rPr>
-          <w:b/>
-          <w:bCs/>
-        </w:rPr>
-        <w:t>Accuracy and Precision</w:t>
-      </w:r>
-    </w:p>
-    <w:p>
-      <w:pPr>
-        <w:spacing w:line="360" w:lineRule="auto"/>
-      </w:pPr>
-      <w:r>
-        <w:t xml:space="preserve">Accuracy rate is a measure of the number of correct classifications over the entire test set, indicating the strength of the classifier [28]. [29] Precision is the fraction of </w:t>
-      </w:r>
-      <w:r>
-        <w:t>correctly predicted</w:t>
-      </w:r>
-      <w:r>
-        <w:t xml:space="preserve"> positive results out of the sum of all positive predictions (true positives + false positives). This number is useful in situations where the false-positives outnumber the false-negatives. A high-precision value suggests that the model makes accurate positive predictions. </w:t>
-      </w:r>
-    </w:p>
-    <w:p>
-      <w:pPr>
-        <w:spacing w:line="360" w:lineRule="auto"/>
-      </w:pPr>
-      <w:r>
-        <w:t xml:space="preserve">  Recall on the other hand [30] indicates how well the classifier labels as positive, cases that are positive, showing the ability to correctly identify cases that are positive. This measure is also described as sensitivity.[29] the F1-Score is a measure of the test’s accuracy and is calculated from the precision and recall of the test. </w:t>
-      </w:r>
-    </w:p>
-    <w:p>
-      <w:pPr>
-        <w:spacing w:line="360" w:lineRule="auto"/>
-        <w:rPr>
-          <w:b/>
-          <w:bCs/>
-        </w:rPr>
-      </w:pPr>
-      <w:r>
-        <w:rPr>
-          <w:b/>
-          <w:bCs/>
-        </w:rPr>
-        <w:t>Word Error Rate (WER)</w:t>
-      </w:r>
-    </w:p>
-    <w:p>
-      <w:pPr>
-        <w:spacing w:line="360" w:lineRule="auto"/>
-      </w:pPr>
-      <w:r>
-        <w:t xml:space="preserve">[31] The WER metric is used to measure the percentage of words that are incorrectly recognized or translated by the OCR Engine compared to a reference (ground truth) text. </w:t>
-      </w:r>
-    </w:p>
-    <w:p>
-      <w:pPr>
-        <w:spacing w:line="360" w:lineRule="auto"/>
-      </w:pPr>
-      <w:r>
-        <w:t xml:space="preserve">The WER equation is as follows: WER = </w:t>
-      </w:r>
-      <m:oMath>
-        <m:f>
-          <m:fPr>
-            <m:ctrlPr>
-              <w:rPr>
-                <w:rFonts w:ascii="Cambria Math" w:hAnsi="Cambria Math"/>
-                <w:i/>
-              </w:rPr>
-            </m:ctrlPr>
-          </m:fPr>
-          <m:num>
-            <m:r>
-              <w:rPr>
-                <w:rFonts w:ascii="Cambria Math" w:hAnsi="Cambria Math"/>
-              </w:rPr>
-              <m:t>S+D+I</m:t>
-            </m:r>
-          </m:num>
-          <m:den>
-            <m:r>
-              <w:rPr>
-                <w:rFonts w:ascii="Cambria Math" w:hAnsi="Cambria Math"/>
-              </w:rPr>
-              <m:t>N</m:t>
-            </m:r>
-          </m:den>
-        </m:f>
-      </m:oMath>
-      <w:r>
-        <w:rPr>
-          <w:rFonts w:eastAsiaTheme="minorEastAsia"/>
-        </w:rPr>
-        <w:t>, where:</w:t>
-      </w:r>
-      <w:r>
-        <w:rPr>
-          <w:rFonts w:eastAsiaTheme="minorEastAsia"/>
-          <w:b/>
-          <w:bCs/>
-        </w:rPr>
-        <w:t>S</w:t>
-      </w:r>
-      <w:r>
-        <w:rPr>
-          <w:rFonts w:eastAsiaTheme="minorEastAsia"/>
-        </w:rPr>
-        <w:t xml:space="preserve"> = number of word substitutions (words in the recognized text that are different from the ground truth). </w:t>
-      </w:r>
-      <w:r>
-        <w:rPr>
-          <w:rFonts w:eastAsiaTheme="minorEastAsia"/>
-          <w:b/>
-          <w:bCs/>
-        </w:rPr>
-        <w:t>D</w:t>
-      </w:r>
-      <w:r>
-        <w:rPr>
-          <w:rFonts w:eastAsiaTheme="minorEastAsia"/>
-        </w:rPr>
-        <w:t xml:space="preserve"> = number of word deletions (words missing in the recognized text but present in the ground truth text). </w:t>
-      </w:r>
-      <w:r>
-        <w:rPr>
-          <w:rFonts w:eastAsiaTheme="minorEastAsia"/>
-          <w:b/>
-          <w:bCs/>
-        </w:rPr>
-        <w:t>I</w:t>
-      </w:r>
-      <w:r>
-        <w:rPr>
-          <w:rFonts w:eastAsiaTheme="minorEastAsia"/>
-        </w:rPr>
-        <w:t xml:space="preserve"> = number of word insertions (extra words present in the recognized text but not in the ground truth text)</w:t>
-      </w:r>
-    </w:p>
-    <w:p>
-      <w:pPr>
-        <w:spacing w:line="360" w:lineRule="auto"/>
-        <w:rPr>
-          <w:b/>
-          <w:bCs/>
-        </w:rPr>
-      </w:pPr>
-      <w:r>
-        <w:rPr>
-          <w:b/>
-          <w:bCs/>
-        </w:rPr>
-        <w:t>Character Error Rate (CER)</w:t>
-      </w:r>
-    </w:p>
-    <w:p>
-      <w:pPr>
-        <w:spacing w:line="360" w:lineRule="auto"/>
-      </w:pPr>
-      <w:r>
-        <w:lastRenderedPageBreak/>
-        <w:t xml:space="preserve">[32] this metric counts any deletions, insertions or substitutions at the character level, enabling evaluation based on character-wise accuracy. CER works well in spotting symbol, typographical and abbreviation mistakes. </w:t>
-      </w:r>
-    </w:p>
-    <w:p>
-      <w:pPr>
-        <w:spacing w:line="360" w:lineRule="auto"/>
-      </w:pPr>
-      <w:r>
-        <w:t xml:space="preserve">[31] The formula is as follows: CER = </w:t>
-      </w:r>
-      <m:oMath>
-        <m:f>
-          <m:fPr>
-            <m:ctrlPr>
-              <w:rPr>
-                <w:rFonts w:ascii="Cambria Math" w:hAnsi="Cambria Math"/>
-                <w:i/>
-              </w:rPr>
-            </m:ctrlPr>
-          </m:fPr>
-          <m:num>
-            <m:r>
-              <w:rPr>
-                <w:rFonts w:ascii="Cambria Math" w:hAnsi="Cambria Math"/>
-              </w:rPr>
-              <m:t xml:space="preserve">N- </m:t>
-            </m:r>
-            <m:r>
-              <w:rPr>
-                <w:rFonts w:ascii="Cambria Math" w:hAnsi="Cambria Math"/>
-              </w:rPr>
-              <m:t>CRC</m:t>
-            </m:r>
-          </m:num>
-          <m:den>
-            <m:r>
-              <w:rPr>
-                <w:rFonts w:ascii="Cambria Math" w:hAnsi="Cambria Math"/>
-              </w:rPr>
-              <m:t>N</m:t>
-            </m:r>
-          </m:den>
-        </m:f>
-      </m:oMath>
-      <w:r>
-        <w:rPr>
-          <w:rFonts w:eastAsiaTheme="minorEastAsia"/>
-        </w:rPr>
-        <w:t>, where:</w:t>
+        <w:t xml:space="preserve"> unlike the Whisper and </w:t>
+      </w:r>
+      <w:proofErr w:type="spellStart"/>
+      <w:r>
+        <w:t>PaddleOCR</w:t>
+      </w:r>
+      <w:proofErr w:type="spellEnd"/>
+      <w:r>
+        <w:t xml:space="preserve">, performs ordinal </w:t>
+      </w:r>
+      <w:r>
+        <w:t>regression</w:t>
+      </w:r>
+      <w:r>
+        <w:t>/scoring</w:t>
+      </w:r>
+      <w:r>
+        <w:t>,</w:t>
+      </w:r>
+      <w:r>
+        <w:t xml:space="preserve"> where i</w:t>
+      </w:r>
+      <w:r>
+        <w:t>t</w:t>
+      </w:r>
+      <w:r>
+        <w:t xml:space="preserve"> predicts a numeric </w:t>
+      </w:r>
+      <w:r>
+        <w:t>score</w:t>
+      </w:r>
+      <w:r>
+        <w:t xml:space="preserve"> on</w:t>
       </w:r>
       <w:r>
         <w:t xml:space="preserve"> </w:t>
       </w:r>
       <w:r>
-        <w:rPr>
-          <w:b/>
-          <w:bCs/>
-        </w:rPr>
-        <w:t xml:space="preserve">CRC </w:t>
-      </w:r>
-      <w:r>
-        <w:t xml:space="preserve">= number of correctly recognized characters and </w:t>
-      </w:r>
-      <w:r>
-        <w:rPr>
-          <w:b/>
-          <w:bCs/>
-        </w:rPr>
-        <w:t>N</w:t>
-      </w:r>
-      <w:r>
-        <w:rPr>
-          <w:b/>
-          <w:bCs/>
-          <w:vertAlign w:val="subscript"/>
-        </w:rPr>
-        <w:t>C</w:t>
-      </w:r>
-      <w:r>
-        <w:t xml:space="preserve"> = total number of characters in the ground truth text </w:t>
+        <w:t xml:space="preserve">a rubric scale. </w:t>
+      </w:r>
+      <w:r>
+        <w:t>Therefore,</w:t>
+      </w:r>
+      <w:r>
+        <w:t xml:space="preserve"> a different metric is used to evaluate its performance QWK.</w:t>
+      </w:r>
+    </w:p>
+    <w:p>
+      <w:pPr>
+        <w:spacing w:line="360" w:lineRule="auto"/>
+      </w:pPr>
+      <w:r>
+        <w:t>QWK (Quadratic weighted Kappa) evaluates the degree of agreement among human and AI scorers, it is a metric between 0 and 1, representing no agreement beyond chance and perfect agreement, respectively [1]</w:t>
+      </w:r>
+      <w:r>
+        <w:t>.</w:t>
+      </w:r>
+      <w:r>
+        <w:t xml:space="preserve"> </w:t>
+      </w:r>
+    </w:p>
+    <w:p>
+      <w:pPr>
+        <w:spacing w:line="360" w:lineRule="auto"/>
+      </w:pPr>
+      <w:r>
+        <w:t xml:space="preserve">What studies used </w:t>
+      </w:r>
+      <w:proofErr w:type="spellStart"/>
+      <w:r>
+        <w:t>qwk</w:t>
+      </w:r>
+      <w:proofErr w:type="spellEnd"/>
+      <w:r>
+        <w:t>?</w:t>
+      </w:r>
+    </w:p>
+    <w:p>
+      <w:pPr>
+        <w:spacing w:line="360" w:lineRule="auto"/>
+      </w:pPr>
+      <w:r>
+        <w:t xml:space="preserve">What are the limitations of </w:t>
+      </w:r>
+      <w:proofErr w:type="spellStart"/>
+      <w:r>
+        <w:t>qwk</w:t>
+      </w:r>
+      <w:proofErr w:type="spellEnd"/>
+      <w:r>
+        <w:t xml:space="preserve">? </w:t>
       </w:r>
     </w:p>
     <w:p>
@@ -7157,10 +7126,7 @@
         <w:spacing w:line="360" w:lineRule="auto"/>
       </w:pPr>
       <w:r>
-        <w:t xml:space="preserve">A </w:t>
-      </w:r>
-      <w:r>
-        <w:t xml:space="preserve">pre-trained </w:t>
+        <w:t xml:space="preserve">A pre-trained </w:t>
       </w:r>
       <w:r>
         <w:t>OCR</w:t>
@@ -7197,10 +7163,7 @@
         <w:t xml:space="preserve"> </w:t>
       </w:r>
       <w:r>
-        <w:t>pre-trained</w:t>
-      </w:r>
-      <w:r>
-        <w:t xml:space="preserve"> core – a transformer</w:t>
+        <w:t>pre-trained core – a transformer</w:t>
       </w:r>
       <w:r>
         <w:t xml:space="preserve"> – </w:t>
@@ -7263,35 +7226,11 @@
       </w:r>
       <w:proofErr w:type="spellEnd"/>
       <w:r>
-        <w:t xml:space="preserve"> then </w:t>
-      </w:r>
-      <w:r>
-        <w:t xml:space="preserve">analyses, </w:t>
-      </w:r>
-      <w:r>
-        <w:t xml:space="preserve">scores, </w:t>
-      </w:r>
-      <w:r>
-        <w:t xml:space="preserve">and outputs a holistic </w:t>
-      </w:r>
-      <w:r>
-        <w:t>s</w:t>
-      </w:r>
-      <w:r>
-        <w:t>core and</w:t>
-      </w:r>
-      <w:r>
-        <w:t xml:space="preserve"> four (4)</w:t>
-      </w:r>
-      <w:r>
-        <w:t xml:space="preserve"> trait scores. The routing logic </w:t>
+        <w:t xml:space="preserve"> then analyses, scores, and outputs a holistic score and four (4) trait scores. The routing logic </w:t>
       </w:r>
       <w:r>
         <w:lastRenderedPageBreak/>
-        <w:t>c</w:t>
-      </w:r>
-      <w:r>
-        <w:t xml:space="preserve">omprises the OCR and ASR output evaluators. </w:t>
+        <w:t xml:space="preserve">comprises the OCR and ASR output evaluators. </w:t>
       </w:r>
       <w:r>
         <w:t xml:space="preserve">Essay’s that have text representations classified as “fail” are routed to the human scorer for marking.  </w:t>
@@ -7537,6 +7476,9 @@
         <w:spacing w:line="360" w:lineRule="auto"/>
       </w:pPr>
       <w:r>
+        <w:rPr>
+          <w:noProof/>
+        </w:rPr>
         <w:drawing>
           <wp:inline distT="0" distB="0" distL="0" distR="0" wp14:anchorId="49FF87E0" wp14:editId="1C21CDF6">
             <wp:extent cx="5731510" cy="3982085"/>
@@ -7676,28 +7618,7 @@
         <w:t xml:space="preserve"> vector of numerical values. </w:t>
       </w:r>
       <w:r>
-        <w:t xml:space="preserve">Whisper then transcribes the audio signal and represents the signal as machine-readable text. </w:t>
-      </w:r>
-      <w:r>
-        <w:t xml:space="preserve">The </w:t>
-      </w:r>
-      <w:r>
-        <w:t>ASR</w:t>
-      </w:r>
-      <w:r>
-        <w:t xml:space="preserve"> Evaluator calculates the Word Error Rate (WER) and Character Error Rate (CER) against the ground-truth essay. If both the WER and CER are at or </w:t>
-      </w:r>
-      <w:r>
-        <w:t>below</w:t>
-      </w:r>
-      <w:r>
-        <w:t xml:space="preserve"> </w:t>
-      </w:r>
-      <w:r>
-        <w:t>their respective thresholds</w:t>
-      </w:r>
-      <w:r>
-        <w:t>, the essay is routed to the transformer for scoring. Otherwise, the essay is routed to the human scorer.</w:t>
+        <w:t>Whisper then transcribes the audio signal and represents the signal as machine-readable text. The ASR Evaluator calculates the Word Error Rate (WER) and Character Error Rate (CER) against the ground-truth essay. If both the WER and CER are at or below their respective thresholds, the essay is routed to the transformer for scoring. Otherwise, the essay is routed to the human scorer.</w:t>
       </w:r>
     </w:p>
     <w:p>
@@ -7711,6 +7632,7 @@
         <w:rPr>
           <w:b/>
           <w:bCs/>
+          <w:noProof/>
         </w:rPr>
         <w:drawing>
           <wp:inline distT="0" distB="0" distL="0" distR="0" wp14:anchorId="4FB69642" wp14:editId="57C43814">
@@ -7832,6 +7754,9 @@
         <w:spacing w:line="360" w:lineRule="auto"/>
       </w:pPr>
       <w:r>
+        <w:rPr>
+          <w:noProof/>
+        </w:rPr>
         <w:drawing>
           <wp:inline distT="0" distB="0" distL="0" distR="0" wp14:anchorId="6CBDA20C" wp14:editId="2AF85821">
             <wp:extent cx="5731510" cy="3592830"/>
@@ -8329,13 +8254,7 @@
         <w:t xml:space="preserve">performed very well, even </w:t>
       </w:r>
       <w:r>
-        <w:t xml:space="preserve">in experiments </w:t>
-      </w:r>
-      <w:r>
-        <w:t>with little to no training</w:t>
-      </w:r>
-      <w:r>
-        <w:t xml:space="preserve">, </w:t>
+        <w:t xml:space="preserve">in experiments with little to no training, </w:t>
       </w:r>
       <w:r>
         <w:t xml:space="preserve">outperforming </w:t>
@@ -8424,6 +8343,9 @@
         <w:jc w:val="center"/>
       </w:pPr>
       <w:r>
+        <w:rPr>
+          <w:noProof/>
+        </w:rPr>
         <w:drawing>
           <wp:inline distT="0" distB="0" distL="0" distR="0" wp14:anchorId="4741951B" wp14:editId="26DF1D46">
             <wp:extent cx="5731510" cy="5317490"/>
@@ -12460,7 +12382,13 @@
         <w:t xml:space="preserve">deliberately </w:t>
       </w:r>
       <w:r>
-        <w:t xml:space="preserve">modified by appended the </w:t>
+        <w:t>modified by append</w:t>
+      </w:r>
+      <w:r>
+        <w:t>ing</w:t>
+      </w:r>
+      <w:r>
+        <w:t xml:space="preserve"> the </w:t>
       </w:r>
       <w:r>
         <w:t>digit</w:t>
@@ -12547,7 +12475,13 @@
         <w:t>prior to the implementation of the OCR and ASR components</w:t>
       </w:r>
       <w:r>
-        <w:t xml:space="preserve">. These metrics are essential to the operation of the evaluator functions in determining what output fed to the transformer for further processing or returned to the human scorer for manual scoring. </w:t>
+        <w:t xml:space="preserve">. These metrics are essential to the operation of the evaluator functions in determining what output </w:t>
+      </w:r>
+      <w:r>
+        <w:t xml:space="preserve">is </w:t>
+      </w:r>
+      <w:r>
+        <w:t xml:space="preserve">fed to the transformer for further processing or returned to the human scorer for manual scoring. </w:t>
       </w:r>
       <w:r>
         <w:t xml:space="preserve"> </w:t>
@@ -12585,7 +12519,15 @@
         <w:t>scalability</w:t>
       </w:r>
       <w:r>
-        <w:t xml:space="preserve"> and modularity, a class based approached</w:t>
+        <w:t xml:space="preserve"> and modularity, a </w:t>
+      </w:r>
+      <w:proofErr w:type="gramStart"/>
+      <w:r>
+        <w:t>class based</w:t>
+      </w:r>
+      <w:proofErr w:type="gramEnd"/>
+      <w:r>
+        <w:t xml:space="preserve"> approach</w:t>
       </w:r>
       <w:r>
         <w:t xml:space="preserve"> – the </w:t>
@@ -12765,7 +12707,13 @@
       </w:r>
       <w:proofErr w:type="spellEnd"/>
       <w:r>
-        <w:t xml:space="preserve"> object its text – the reference essay, has been normalised. The object also prints confirmation of all successfully executed operations – when its </w:t>
+        <w:t xml:space="preserve"> object </w:t>
+      </w:r>
+      <w:r>
+        <w:t xml:space="preserve">after </w:t>
+      </w:r>
+      <w:r>
+        <w:t xml:space="preserve">its text – the reference essay, has been normalised. The object also prints confirmation of all successfully executed operations – when its </w:t>
       </w:r>
       <w:proofErr w:type="spellStart"/>
       <w:r>
@@ -16083,10 +16031,78 @@
       </w:r>
     </w:p>
     <w:p>
-      <w:pPr>
-        <w:pStyle w:val="Heading2"/>
-        <w:spacing w:line="360" w:lineRule="auto"/>
-      </w:pPr>
+      <w:r>
+        <w:t>[</w:t>
+      </w:r>
+      <w:r>
+        <w:t>33</w:t>
+      </w:r>
+      <w:r>
+        <w:t xml:space="preserve">] Y. Zhang, “A study on the translation of spoken English from speech to text,” </w:t>
+      </w:r>
+      <w:r>
+        <w:rPr>
+          <w:i/>
+          <w:iCs/>
+        </w:rPr>
+        <w:t>Journal of ICT Standardization</w:t>
+      </w:r>
+      <w:r>
+        <w:t xml:space="preserve">, vol. 12, no. 4, pp. 429–442, 2025, </w:t>
+      </w:r>
+      <w:proofErr w:type="spellStart"/>
+      <w:r>
+        <w:t>doi</w:t>
+      </w:r>
+      <w:proofErr w:type="spellEnd"/>
+      <w:r>
+        <w:t>: 10.13052/jicts2245-800X.1244.</w:t>
+      </w:r>
+    </w:p>
+    <w:p>
+      <w:r>
+        <w:t>[</w:t>
+      </w:r>
+      <w:r>
+        <w:t>34</w:t>
+      </w:r>
+      <w:r>
+        <w:t xml:space="preserve">] M. Schubert, D. Duran, and I. Siegert, “Challenges of German speech recognition: A study on multi-ethnolectal speech among adolescents,” in </w:t>
+      </w:r>
+      <w:r>
+        <w:rPr>
+          <w:i/>
+          <w:iCs/>
+        </w:rPr>
+        <w:t xml:space="preserve">Proc. </w:t>
+      </w:r>
+      <w:proofErr w:type="spellStart"/>
+      <w:r>
+        <w:rPr>
+          <w:i/>
+          <w:iCs/>
+        </w:rPr>
+        <w:t>Interspeech</w:t>
+      </w:r>
+      <w:proofErr w:type="spellEnd"/>
+      <w:r>
+        <w:rPr>
+          <w:i/>
+          <w:iCs/>
+        </w:rPr>
+        <w:t xml:space="preserve"> 2024</w:t>
+      </w:r>
+      <w:r>
+        <w:t xml:space="preserve">, Kos, Greece, Sep. 1–5, 2024, pp. 3045–3049, </w:t>
+      </w:r>
+      <w:proofErr w:type="spellStart"/>
+      <w:r>
+        <w:t>doi</w:t>
+      </w:r>
+      <w:proofErr w:type="spellEnd"/>
+      <w:r>
+        <w:t>: 10.21437/Interspeech.2024-1717.</w:t>
+      </w:r>
     </w:p>
     <w:p>
       <w:pPr>
@@ -20230,7 +20246,7 @@
 </file>
 
 <file path=word/endnotes.xml><?xml version="1.0" encoding="utf-8"?>
-<w:endnotes xmlns:wpc="http://schemas.microsoft.com/office/word/2010/wordprocessingCanvas" xmlns:cx="http://schemas.microsoft.com/office/drawing/2014/chartex" xmlns:cx1="http://schemas.microsoft.com/office/drawing/2015/9/8/chartex" xmlns:cx2="http://schemas.microsoft.com/office/drawing/2015/10/21/chartex" xmlns:cx3="http://schemas.microsoft.com/office/drawing/2016/5/9/chartex" xmlns:cx4="http://schemas.microsoft.com/office/drawing/2016/5/10/chartex" xmlns:cx5="http://schemas.microsoft.com/office/drawing/2016/5/11/chartex" xmlns:cx6="http://schemas.microsoft.com/office/drawing/2016/5/12/chartex" xmlns:cx7="http://schemas.microsoft.com/office/drawing/2016/5/13/chartex" xmlns:cx8="http://schemas.microsoft.com/office/drawing/2016/5/14/chartex" xmlns:mc="http://schemas.openxmlformats.org/markup-compatibility/2006" xmlns:aink="http://schemas.microsoft.com/office/drawing/2016/ink" xmlns:am3d="http://schemas.microsoft.com/office/drawing/2017/model3d" xmlns:o="urn:schemas-microsoft-com:office:office" xmlns:oel="http://schemas.microsoft.com/office/2019/extlst" xmlns:r="http://schemas.openxmlformats.org/officeDocument/2006/relationships" xmlns:m="http://schemas.openxmlformats.org/officeDocument/2006/math" xmlns:v="urn:schemas-microsoft-com:vml" xmlns:wp14="http://schemas.microsoft.com/office/word/2010/wordprocessingDrawing" xmlns:wp="http://schemas.openxmlformats.org/drawingml/2006/wordprocessingDrawing" xmlns:w10="urn:schemas-microsoft-com:office:word" xmlns:w="http://schemas.openxmlformats.org/wordprocessingml/2006/main" xmlns:w14="http://schemas.microsoft.com/office/word/2010/wordml" xmlns:w15="http://schemas.microsoft.com/office/word/2012/wordml" xmlns:w16cei="http://schemas.microsoft.com/office/word/2026/wordml/cei" xmlns:w16cex="http://schemas.microsoft.com/office/word/2018/wordml/cex" xmlns:w16cid="http://schemas.microsoft.com/office/word/2016/wordml/cid" xmlns:w16="http://schemas.microsoft.com/office/word/2018/wordml" xmlns:w16du="http://schemas.microsoft.com/office/word/2023/wordml/word16du" xmlns:w16sdtdh="http://schemas.microsoft.com/office/word/2020/wordml/sdtdatahash" xmlns:w16sdtfl="http://schemas.microsoft.com/office/word/2024/wordml/sdtformatlock" xmlns:w16se="http://schemas.microsoft.com/office/word/2015/wordml/symex" xmlns:wpg="http://schemas.microsoft.com/office/word/2010/wordprocessingGroup" xmlns:wpi="http://schemas.microsoft.com/office/word/2010/wordprocessingInk" xmlns:wne="http://schemas.microsoft.com/office/word/2006/wordml" xmlns:wps="http://schemas.microsoft.com/office/word/2010/wordprocessingShape" mc:Ignorable="w14 w15 w16se w16cid w16 w16cex w16sdtdh w16sdtfl w16du wp14">
+<w:endnotes xmlns:wpc="http://schemas.microsoft.com/office/word/2010/wordprocessingCanvas" xmlns:cx="http://schemas.microsoft.com/office/drawing/2014/chartex" xmlns:cx1="http://schemas.microsoft.com/office/drawing/2015/9/8/chartex" xmlns:cx2="http://schemas.microsoft.com/office/drawing/2015/10/21/chartex" xmlns:cx3="http://schemas.microsoft.com/office/drawing/2016/5/9/chartex" xmlns:cx4="http://schemas.microsoft.com/office/drawing/2016/5/10/chartex" xmlns:cx5="http://schemas.microsoft.com/office/drawing/2016/5/11/chartex" xmlns:cx6="http://schemas.microsoft.com/office/drawing/2016/5/12/chartex" xmlns:cx7="http://schemas.microsoft.com/office/drawing/2016/5/13/chartex" xmlns:cx8="http://schemas.microsoft.com/office/drawing/2016/5/14/chartex" xmlns:mc="http://schemas.openxmlformats.org/markup-compatibility/2006" xmlns:aink="http://schemas.microsoft.com/office/drawing/2016/ink" xmlns:am3d="http://schemas.microsoft.com/office/drawing/2017/model3d" xmlns:o="urn:schemas-microsoft-com:office:office" xmlns:oel="http://schemas.microsoft.com/office/2019/extlst" xmlns:r="http://schemas.openxmlformats.org/officeDocument/2006/relationships" xmlns:m="http://schemas.openxmlformats.org/officeDocument/2006/math" xmlns:v="urn:schemas-microsoft-com:vml" xmlns:wp14="http://schemas.microsoft.com/office/word/2010/wordprocessingDrawing" xmlns:wp="http://schemas.openxmlformats.org/drawingml/2006/wordprocessingDrawing" xmlns:w10="urn:schemas-microsoft-com:office:word" xmlns:w="http://schemas.openxmlformats.org/wordprocessingml/2006/main" xmlns:w14="http://schemas.microsoft.com/office/word/2010/wordml" xmlns:w15="http://schemas.microsoft.com/office/word/2012/wordml" xmlns:w16cex="http://schemas.microsoft.com/office/word/2018/wordml/cex" xmlns:w16cid="http://schemas.microsoft.com/office/word/2016/wordml/cid" xmlns:w16="http://schemas.microsoft.com/office/word/2018/wordml" xmlns:w16du="http://schemas.microsoft.com/office/word/2023/wordml/word16du" xmlns:w16sdtdh="http://schemas.microsoft.com/office/word/2020/wordml/sdtdatahash" xmlns:w16sdtfl="http://schemas.microsoft.com/office/word/2024/wordml/sdtformatlock" xmlns:w16se="http://schemas.microsoft.com/office/word/2015/wordml/symex" xmlns:wpg="http://schemas.microsoft.com/office/word/2010/wordprocessingGroup" xmlns:wpi="http://schemas.microsoft.com/office/word/2010/wordprocessingInk" xmlns:wne="http://schemas.microsoft.com/office/word/2006/wordml" xmlns:wps="http://schemas.microsoft.com/office/word/2010/wordprocessingShape" mc:Ignorable="w14 w15 w16se w16cid w16 w16cex w16sdtdh w16sdtfl w16du wp14">
   <w:endnote w:type="separator" w:id="-1">
     <w:p>
       <w:pPr>
@@ -20255,7 +20271,7 @@
 </file>
 
 <file path=word/footer1.xml><?xml version="1.0" encoding="utf-8"?>
-<w:ftr xmlns:wpc="http://schemas.microsoft.com/office/word/2010/wordprocessingCanvas" xmlns:cx="http://schemas.microsoft.com/office/drawing/2014/chartex" xmlns:cx1="http://schemas.microsoft.com/office/drawing/2015/9/8/chartex" xmlns:cx2="http://schemas.microsoft.com/office/drawing/2015/10/21/chartex" xmlns:cx3="http://schemas.microsoft.com/office/drawing/2016/5/9/chartex" xmlns:cx4="http://schemas.microsoft.com/office/drawing/2016/5/10/chartex" xmlns:cx5="http://schemas.microsoft.com/office/drawing/2016/5/11/chartex" xmlns:cx6="http://schemas.microsoft.com/office/drawing/2016/5/12/chartex" xmlns:cx7="http://schemas.microsoft.com/office/drawing/2016/5/13/chartex" xmlns:cx8="http://schemas.microsoft.com/office/drawing/2016/5/14/chartex" xmlns:mc="http://schemas.openxmlformats.org/markup-compatibility/2006" xmlns:aink="http://schemas.microsoft.com/office/drawing/2016/ink" xmlns:am3d="http://schemas.microsoft.com/office/drawing/2017/model3d" xmlns:o="urn:schemas-microsoft-com:office:office" xmlns:oel="http://schemas.microsoft.com/office/2019/extlst" xmlns:r="http://schemas.openxmlformats.org/officeDocument/2006/relationships" xmlns:m="http://schemas.openxmlformats.org/officeDocument/2006/math" xmlns:v="urn:schemas-microsoft-com:vml" xmlns:wp14="http://schemas.microsoft.com/office/word/2010/wordprocessingDrawing" xmlns:wp="http://schemas.openxmlformats.org/drawingml/2006/wordprocessingDrawing" xmlns:w10="urn:schemas-microsoft-com:office:word" xmlns:w="http://schemas.openxmlformats.org/wordprocessingml/2006/main" xmlns:w14="http://schemas.microsoft.com/office/word/2010/wordml" xmlns:w15="http://schemas.microsoft.com/office/word/2012/wordml" xmlns:w16cei="http://schemas.microsoft.com/office/word/2026/wordml/cei" xmlns:w16cex="http://schemas.microsoft.com/office/word/2018/wordml/cex" xmlns:w16cid="http://schemas.microsoft.com/office/word/2016/wordml/cid" xmlns:w16="http://schemas.microsoft.com/office/word/2018/wordml" xmlns:w16du="http://schemas.microsoft.com/office/word/2023/wordml/word16du" xmlns:w16sdtdh="http://schemas.microsoft.com/office/word/2020/wordml/sdtdatahash" xmlns:w16sdtfl="http://schemas.microsoft.com/office/word/2024/wordml/sdtformatlock" xmlns:w16se="http://schemas.microsoft.com/office/word/2015/wordml/symex" xmlns:wpg="http://schemas.microsoft.com/office/word/2010/wordprocessingGroup" xmlns:wpi="http://schemas.microsoft.com/office/word/2010/wordprocessingInk" xmlns:wne="http://schemas.microsoft.com/office/word/2006/wordml" xmlns:wps="http://schemas.microsoft.com/office/word/2010/wordprocessingShape" mc:Ignorable="w14 w15 w16se w16cid w16 w16cex w16sdtdh w16sdtfl w16du wp14">
+<w:ftr xmlns:wpc="http://schemas.microsoft.com/office/word/2010/wordprocessingCanvas" xmlns:cx="http://schemas.microsoft.com/office/drawing/2014/chartex" xmlns:cx1="http://schemas.microsoft.com/office/drawing/2015/9/8/chartex" xmlns:cx2="http://schemas.microsoft.com/office/drawing/2015/10/21/chartex" xmlns:cx3="http://schemas.microsoft.com/office/drawing/2016/5/9/chartex" xmlns:cx4="http://schemas.microsoft.com/office/drawing/2016/5/10/chartex" xmlns:cx5="http://schemas.microsoft.com/office/drawing/2016/5/11/chartex" xmlns:cx6="http://schemas.microsoft.com/office/drawing/2016/5/12/chartex" xmlns:cx7="http://schemas.microsoft.com/office/drawing/2016/5/13/chartex" xmlns:cx8="http://schemas.microsoft.com/office/drawing/2016/5/14/chartex" xmlns:mc="http://schemas.openxmlformats.org/markup-compatibility/2006" xmlns:aink="http://schemas.microsoft.com/office/drawing/2016/ink" xmlns:am3d="http://schemas.microsoft.com/office/drawing/2017/model3d" xmlns:o="urn:schemas-microsoft-com:office:office" xmlns:oel="http://schemas.microsoft.com/office/2019/extlst" xmlns:r="http://schemas.openxmlformats.org/officeDocument/2006/relationships" xmlns:m="http://schemas.openxmlformats.org/officeDocument/2006/math" xmlns:v="urn:schemas-microsoft-com:vml" xmlns:wp14="http://schemas.microsoft.com/office/word/2010/wordprocessingDrawing" xmlns:wp="http://schemas.openxmlformats.org/drawingml/2006/wordprocessingDrawing" xmlns:w10="urn:schemas-microsoft-com:office:word" xmlns:w="http://schemas.openxmlformats.org/wordprocessingml/2006/main" xmlns:w14="http://schemas.microsoft.com/office/word/2010/wordml" xmlns:w15="http://schemas.microsoft.com/office/word/2012/wordml" xmlns:w16cex="http://schemas.microsoft.com/office/word/2018/wordml/cex" xmlns:w16cid="http://schemas.microsoft.com/office/word/2016/wordml/cid" xmlns:w16="http://schemas.microsoft.com/office/word/2018/wordml" xmlns:w16du="http://schemas.microsoft.com/office/word/2023/wordml/word16du" xmlns:w16sdtdh="http://schemas.microsoft.com/office/word/2020/wordml/sdtdatahash" xmlns:w16sdtfl="http://schemas.microsoft.com/office/word/2024/wordml/sdtformatlock" xmlns:w16se="http://schemas.microsoft.com/office/word/2015/wordml/symex" xmlns:wpg="http://schemas.microsoft.com/office/word/2010/wordprocessingGroup" xmlns:wpi="http://schemas.microsoft.com/office/word/2010/wordprocessingInk" xmlns:wne="http://schemas.microsoft.com/office/word/2006/wordml" xmlns:wps="http://schemas.microsoft.com/office/word/2010/wordprocessingShape" mc:Ignorable="w14 w15 w16se w16cid w16 w16cex w16sdtdh w16sdtfl w16du wp14">
   <w:sdt>
     <w:sdtPr>
       <w:id w:val="1150030750"/>
@@ -20322,7 +20338,7 @@
 </file>
 
 <file path=word/footer2.xml><?xml version="1.0" encoding="utf-8"?>
-<w:ftr xmlns:wpc="http://schemas.microsoft.com/office/word/2010/wordprocessingCanvas" xmlns:cx="http://schemas.microsoft.com/office/drawing/2014/chartex" xmlns:cx1="http://schemas.microsoft.com/office/drawing/2015/9/8/chartex" xmlns:cx2="http://schemas.microsoft.com/office/drawing/2015/10/21/chartex" xmlns:cx3="http://schemas.microsoft.com/office/drawing/2016/5/9/chartex" xmlns:cx4="http://schemas.microsoft.com/office/drawing/2016/5/10/chartex" xmlns:cx5="http://schemas.microsoft.com/office/drawing/2016/5/11/chartex" xmlns:cx6="http://schemas.microsoft.com/office/drawing/2016/5/12/chartex" xmlns:cx7="http://schemas.microsoft.com/office/drawing/2016/5/13/chartex" xmlns:cx8="http://schemas.microsoft.com/office/drawing/2016/5/14/chartex" xmlns:mc="http://schemas.openxmlformats.org/markup-compatibility/2006" xmlns:aink="http://schemas.microsoft.com/office/drawing/2016/ink" xmlns:am3d="http://schemas.microsoft.com/office/drawing/2017/model3d" xmlns:o="urn:schemas-microsoft-com:office:office" xmlns:oel="http://schemas.microsoft.com/office/2019/extlst" xmlns:r="http://schemas.openxmlformats.org/officeDocument/2006/relationships" xmlns:m="http://schemas.openxmlformats.org/officeDocument/2006/math" xmlns:v="urn:schemas-microsoft-com:vml" xmlns:wp14="http://schemas.microsoft.com/office/word/2010/wordprocessingDrawing" xmlns:wp="http://schemas.openxmlformats.org/drawingml/2006/wordprocessingDrawing" xmlns:w10="urn:schemas-microsoft-com:office:word" xmlns:w="http://schemas.openxmlformats.org/wordprocessingml/2006/main" xmlns:w14="http://schemas.microsoft.com/office/word/2010/wordml" xmlns:w15="http://schemas.microsoft.com/office/word/2012/wordml" xmlns:w16cei="http://schemas.microsoft.com/office/word/2026/wordml/cei" xmlns:w16cex="http://schemas.microsoft.com/office/word/2018/wordml/cex" xmlns:w16cid="http://schemas.microsoft.com/office/word/2016/wordml/cid" xmlns:w16="http://schemas.microsoft.com/office/word/2018/wordml" xmlns:w16du="http://schemas.microsoft.com/office/word/2023/wordml/word16du" xmlns:w16sdtdh="http://schemas.microsoft.com/office/word/2020/wordml/sdtdatahash" xmlns:w16sdtfl="http://schemas.microsoft.com/office/word/2024/wordml/sdtformatlock" xmlns:w16se="http://schemas.microsoft.com/office/word/2015/wordml/symex" xmlns:wpg="http://schemas.microsoft.com/office/word/2010/wordprocessingGroup" xmlns:wpi="http://schemas.microsoft.com/office/word/2010/wordprocessingInk" xmlns:wne="http://schemas.microsoft.com/office/word/2006/wordml" xmlns:wps="http://schemas.microsoft.com/office/word/2010/wordprocessingShape" mc:Ignorable="w14 w15 w16se w16cid w16 w16cex w16sdtdh w16sdtfl w16du wp14">
+<w:ftr xmlns:wpc="http://schemas.microsoft.com/office/word/2010/wordprocessingCanvas" xmlns:cx="http://schemas.microsoft.com/office/drawing/2014/chartex" xmlns:cx1="http://schemas.microsoft.com/office/drawing/2015/9/8/chartex" xmlns:cx2="http://schemas.microsoft.com/office/drawing/2015/10/21/chartex" xmlns:cx3="http://schemas.microsoft.com/office/drawing/2016/5/9/chartex" xmlns:cx4="http://schemas.microsoft.com/office/drawing/2016/5/10/chartex" xmlns:cx5="http://schemas.microsoft.com/office/drawing/2016/5/11/chartex" xmlns:cx6="http://schemas.microsoft.com/office/drawing/2016/5/12/chartex" xmlns:cx7="http://schemas.microsoft.com/office/drawing/2016/5/13/chartex" xmlns:cx8="http://schemas.microsoft.com/office/drawing/2016/5/14/chartex" xmlns:mc="http://schemas.openxmlformats.org/markup-compatibility/2006" xmlns:aink="http://schemas.microsoft.com/office/drawing/2016/ink" xmlns:am3d="http://schemas.microsoft.com/office/drawing/2017/model3d" xmlns:o="urn:schemas-microsoft-com:office:office" xmlns:oel="http://schemas.microsoft.com/office/2019/extlst" xmlns:r="http://schemas.openxmlformats.org/officeDocument/2006/relationships" xmlns:m="http://schemas.openxmlformats.org/officeDocument/2006/math" xmlns:v="urn:schemas-microsoft-com:vml" xmlns:wp14="http://schemas.microsoft.com/office/word/2010/wordprocessingDrawing" xmlns:wp="http://schemas.openxmlformats.org/drawingml/2006/wordprocessingDrawing" xmlns:w10="urn:schemas-microsoft-com:office:word" xmlns:w="http://schemas.openxmlformats.org/wordprocessingml/2006/main" xmlns:w14="http://schemas.microsoft.com/office/word/2010/wordml" xmlns:w15="http://schemas.microsoft.com/office/word/2012/wordml" xmlns:w16cex="http://schemas.microsoft.com/office/word/2018/wordml/cex" xmlns:w16cid="http://schemas.microsoft.com/office/word/2016/wordml/cid" xmlns:w16="http://schemas.microsoft.com/office/word/2018/wordml" xmlns:w16du="http://schemas.microsoft.com/office/word/2023/wordml/word16du" xmlns:w16sdtdh="http://schemas.microsoft.com/office/word/2020/wordml/sdtdatahash" xmlns:w16sdtfl="http://schemas.microsoft.com/office/word/2024/wordml/sdtformatlock" xmlns:w16se="http://schemas.microsoft.com/office/word/2015/wordml/symex" xmlns:wpg="http://schemas.microsoft.com/office/word/2010/wordprocessingGroup" xmlns:wpi="http://schemas.microsoft.com/office/word/2010/wordprocessingInk" xmlns:wne="http://schemas.microsoft.com/office/word/2006/wordml" xmlns:wps="http://schemas.microsoft.com/office/word/2010/wordprocessingShape" mc:Ignorable="w14 w15 w16se w16cid w16 w16cex w16sdtdh w16sdtfl w16du wp14">
   <w:sdt>
     <w:sdtPr>
       <w:id w:val="-372226801"/>
@@ -20389,7 +20405,7 @@
 </file>
 
 <file path=word/footer3.xml><?xml version="1.0" encoding="utf-8"?>
-<w:ftr xmlns:wpc="http://schemas.microsoft.com/office/word/2010/wordprocessingCanvas" xmlns:cx="http://schemas.microsoft.com/office/drawing/2014/chartex" xmlns:cx1="http://schemas.microsoft.com/office/drawing/2015/9/8/chartex" xmlns:cx2="http://schemas.microsoft.com/office/drawing/2015/10/21/chartex" xmlns:cx3="http://schemas.microsoft.com/office/drawing/2016/5/9/chartex" xmlns:cx4="http://schemas.microsoft.com/office/drawing/2016/5/10/chartex" xmlns:cx5="http://schemas.microsoft.com/office/drawing/2016/5/11/chartex" xmlns:cx6="http://schemas.microsoft.com/office/drawing/2016/5/12/chartex" xmlns:cx7="http://schemas.microsoft.com/office/drawing/2016/5/13/chartex" xmlns:cx8="http://schemas.microsoft.com/office/drawing/2016/5/14/chartex" xmlns:mc="http://schemas.openxmlformats.org/markup-compatibility/2006" xmlns:aink="http://schemas.microsoft.com/office/drawing/2016/ink" xmlns:am3d="http://schemas.microsoft.com/office/drawing/2017/model3d" xmlns:o="urn:schemas-microsoft-com:office:office" xmlns:oel="http://schemas.microsoft.com/office/2019/extlst" xmlns:r="http://schemas.openxmlformats.org/officeDocument/2006/relationships" xmlns:m="http://schemas.openxmlformats.org/officeDocument/2006/math" xmlns:v="urn:schemas-microsoft-com:vml" xmlns:wp14="http://schemas.microsoft.com/office/word/2010/wordprocessingDrawing" xmlns:wp="http://schemas.openxmlformats.org/drawingml/2006/wordprocessingDrawing" xmlns:w10="urn:schemas-microsoft-com:office:word" xmlns:w="http://schemas.openxmlformats.org/wordprocessingml/2006/main" xmlns:w14="http://schemas.microsoft.com/office/word/2010/wordml" xmlns:w15="http://schemas.microsoft.com/office/word/2012/wordml" xmlns:w16cei="http://schemas.microsoft.com/office/word/2026/wordml/cei" xmlns:w16cex="http://schemas.microsoft.com/office/word/2018/wordml/cex" xmlns:w16cid="http://schemas.microsoft.com/office/word/2016/wordml/cid" xmlns:w16="http://schemas.microsoft.com/office/word/2018/wordml" xmlns:w16du="http://schemas.microsoft.com/office/word/2023/wordml/word16du" xmlns:w16sdtdh="http://schemas.microsoft.com/office/word/2020/wordml/sdtdatahash" xmlns:w16sdtfl="http://schemas.microsoft.com/office/word/2024/wordml/sdtformatlock" xmlns:w16se="http://schemas.microsoft.com/office/word/2015/wordml/symex" xmlns:wpg="http://schemas.microsoft.com/office/word/2010/wordprocessingGroup" xmlns:wpi="http://schemas.microsoft.com/office/word/2010/wordprocessingInk" xmlns:wne="http://schemas.microsoft.com/office/word/2006/wordml" xmlns:wps="http://schemas.microsoft.com/office/word/2010/wordprocessingShape" mc:Ignorable="w14 w15 w16se w16cid w16 w16cex w16sdtdh w16sdtfl w16du wp14">
+<w:ftr xmlns:wpc="http://schemas.microsoft.com/office/word/2010/wordprocessingCanvas" xmlns:cx="http://schemas.microsoft.com/office/drawing/2014/chartex" xmlns:cx1="http://schemas.microsoft.com/office/drawing/2015/9/8/chartex" xmlns:cx2="http://schemas.microsoft.com/office/drawing/2015/10/21/chartex" xmlns:cx3="http://schemas.microsoft.com/office/drawing/2016/5/9/chartex" xmlns:cx4="http://schemas.microsoft.com/office/drawing/2016/5/10/chartex" xmlns:cx5="http://schemas.microsoft.com/office/drawing/2016/5/11/chartex" xmlns:cx6="http://schemas.microsoft.com/office/drawing/2016/5/12/chartex" xmlns:cx7="http://schemas.microsoft.com/office/drawing/2016/5/13/chartex" xmlns:cx8="http://schemas.microsoft.com/office/drawing/2016/5/14/chartex" xmlns:mc="http://schemas.openxmlformats.org/markup-compatibility/2006" xmlns:aink="http://schemas.microsoft.com/office/drawing/2016/ink" xmlns:am3d="http://schemas.microsoft.com/office/drawing/2017/model3d" xmlns:o="urn:schemas-microsoft-com:office:office" xmlns:oel="http://schemas.microsoft.com/office/2019/extlst" xmlns:r="http://schemas.openxmlformats.org/officeDocument/2006/relationships" xmlns:m="http://schemas.openxmlformats.org/officeDocument/2006/math" xmlns:v="urn:schemas-microsoft-com:vml" xmlns:wp14="http://schemas.microsoft.com/office/word/2010/wordprocessingDrawing" xmlns:wp="http://schemas.openxmlformats.org/drawingml/2006/wordprocessingDrawing" xmlns:w10="urn:schemas-microsoft-com:office:word" xmlns:w="http://schemas.openxmlformats.org/wordprocessingml/2006/main" xmlns:w14="http://schemas.microsoft.com/office/word/2010/wordml" xmlns:w15="http://schemas.microsoft.com/office/word/2012/wordml" xmlns:w16cex="http://schemas.microsoft.com/office/word/2018/wordml/cex" xmlns:w16cid="http://schemas.microsoft.com/office/word/2016/wordml/cid" xmlns:w16="http://schemas.microsoft.com/office/word/2018/wordml" xmlns:w16du="http://schemas.microsoft.com/office/word/2023/wordml/word16du" xmlns:w16sdtdh="http://schemas.microsoft.com/office/word/2020/wordml/sdtdatahash" xmlns:w16sdtfl="http://schemas.microsoft.com/office/word/2024/wordml/sdtformatlock" xmlns:w16se="http://schemas.microsoft.com/office/word/2015/wordml/symex" xmlns:wpg="http://schemas.microsoft.com/office/word/2010/wordprocessingGroup" xmlns:wpi="http://schemas.microsoft.com/office/word/2010/wordprocessingInk" xmlns:wne="http://schemas.microsoft.com/office/word/2006/wordml" xmlns:wps="http://schemas.microsoft.com/office/word/2010/wordprocessingShape" mc:Ignorable="w14 w15 w16se w16cid w16 w16cex w16sdtdh w16sdtfl w16du wp14">
   <w:sdt>
     <w:sdtPr>
       <w:id w:val="1977879214"/>
@@ -20456,7 +20472,7 @@
 </file>
 
 <file path=word/footnotes.xml><?xml version="1.0" encoding="utf-8"?>
-<w:footnotes xmlns:wpc="http://schemas.microsoft.com/office/word/2010/wordprocessingCanvas" xmlns:cx="http://schemas.microsoft.com/office/drawing/2014/chartex" xmlns:cx1="http://schemas.microsoft.com/office/drawing/2015/9/8/chartex" xmlns:cx2="http://schemas.microsoft.com/office/drawing/2015/10/21/chartex" xmlns:cx3="http://schemas.microsoft.com/office/drawing/2016/5/9/chartex" xmlns:cx4="http://schemas.microsoft.com/office/drawing/2016/5/10/chartex" xmlns:cx5="http://schemas.microsoft.com/office/drawing/2016/5/11/chartex" xmlns:cx6="http://schemas.microsoft.com/office/drawing/2016/5/12/chartex" xmlns:cx7="http://schemas.microsoft.com/office/drawing/2016/5/13/chartex" xmlns:cx8="http://schemas.microsoft.com/office/drawing/2016/5/14/chartex" xmlns:mc="http://schemas.openxmlformats.org/markup-compatibility/2006" xmlns:aink="http://schemas.microsoft.com/office/drawing/2016/ink" xmlns:am3d="http://schemas.microsoft.com/office/drawing/2017/model3d" xmlns:o="urn:schemas-microsoft-com:office:office" xmlns:oel="http://schemas.microsoft.com/office/2019/extlst" xmlns:r="http://schemas.openxmlformats.org/officeDocument/2006/relationships" xmlns:m="http://schemas.openxmlformats.org/officeDocument/2006/math" xmlns:v="urn:schemas-microsoft-com:vml" xmlns:wp14="http://schemas.microsoft.com/office/word/2010/wordprocessingDrawing" xmlns:wp="http://schemas.openxmlformats.org/drawingml/2006/wordprocessingDrawing" xmlns:w10="urn:schemas-microsoft-com:office:word" xmlns:w="http://schemas.openxmlformats.org/wordprocessingml/2006/main" xmlns:w14="http://schemas.microsoft.com/office/word/2010/wordml" xmlns:w15="http://schemas.microsoft.com/office/word/2012/wordml" xmlns:w16cei="http://schemas.microsoft.com/office/word/2026/wordml/cei" xmlns:w16cex="http://schemas.microsoft.com/office/word/2018/wordml/cex" xmlns:w16cid="http://schemas.microsoft.com/office/word/2016/wordml/cid" xmlns:w16="http://schemas.microsoft.com/office/word/2018/wordml" xmlns:w16du="http://schemas.microsoft.com/office/word/2023/wordml/word16du" xmlns:w16sdtdh="http://schemas.microsoft.com/office/word/2020/wordml/sdtdatahash" xmlns:w16sdtfl="http://schemas.microsoft.com/office/word/2024/wordml/sdtformatlock" xmlns:w16se="http://schemas.microsoft.com/office/word/2015/wordml/symex" xmlns:wpg="http://schemas.microsoft.com/office/word/2010/wordprocessingGroup" xmlns:wpi="http://schemas.microsoft.com/office/word/2010/wordprocessingInk" xmlns:wne="http://schemas.microsoft.com/office/word/2006/wordml" xmlns:wps="http://schemas.microsoft.com/office/word/2010/wordprocessingShape" mc:Ignorable="w14 w15 w16se w16cid w16 w16cex w16sdtdh w16sdtfl w16du wp14">
+<w:footnotes xmlns:wpc="http://schemas.microsoft.com/office/word/2010/wordprocessingCanvas" xmlns:cx="http://schemas.microsoft.com/office/drawing/2014/chartex" xmlns:cx1="http://schemas.microsoft.com/office/drawing/2015/9/8/chartex" xmlns:cx2="http://schemas.microsoft.com/office/drawing/2015/10/21/chartex" xmlns:cx3="http://schemas.microsoft.com/office/drawing/2016/5/9/chartex" xmlns:cx4="http://schemas.microsoft.com/office/drawing/2016/5/10/chartex" xmlns:cx5="http://schemas.microsoft.com/office/drawing/2016/5/11/chartex" xmlns:cx6="http://schemas.microsoft.com/office/drawing/2016/5/12/chartex" xmlns:cx7="http://schemas.microsoft.com/office/drawing/2016/5/13/chartex" xmlns:cx8="http://schemas.microsoft.com/office/drawing/2016/5/14/chartex" xmlns:mc="http://schemas.openxmlformats.org/markup-compatibility/2006" xmlns:aink="http://schemas.microsoft.com/office/drawing/2016/ink" xmlns:am3d="http://schemas.microsoft.com/office/drawing/2017/model3d" xmlns:o="urn:schemas-microsoft-com:office:office" xmlns:oel="http://schemas.microsoft.com/office/2019/extlst" xmlns:r="http://schemas.openxmlformats.org/officeDocument/2006/relationships" xmlns:m="http://schemas.openxmlformats.org/officeDocument/2006/math" xmlns:v="urn:schemas-microsoft-com:vml" xmlns:wp14="http://schemas.microsoft.com/office/word/2010/wordprocessingDrawing" xmlns:wp="http://schemas.openxmlformats.org/drawingml/2006/wordprocessingDrawing" xmlns:w10="urn:schemas-microsoft-com:office:word" xmlns:w="http://schemas.openxmlformats.org/wordprocessingml/2006/main" xmlns:w14="http://schemas.microsoft.com/office/word/2010/wordml" xmlns:w15="http://schemas.microsoft.com/office/word/2012/wordml" xmlns:w16cex="http://schemas.microsoft.com/office/word/2018/wordml/cex" xmlns:w16cid="http://schemas.microsoft.com/office/word/2016/wordml/cid" xmlns:w16="http://schemas.microsoft.com/office/word/2018/wordml" xmlns:w16du="http://schemas.microsoft.com/office/word/2023/wordml/word16du" xmlns:w16sdtdh="http://schemas.microsoft.com/office/word/2020/wordml/sdtdatahash" xmlns:w16sdtfl="http://schemas.microsoft.com/office/word/2024/wordml/sdtformatlock" xmlns:w16se="http://schemas.microsoft.com/office/word/2015/wordml/symex" xmlns:wpg="http://schemas.microsoft.com/office/word/2010/wordprocessingGroup" xmlns:wpi="http://schemas.microsoft.com/office/word/2010/wordprocessingInk" xmlns:wne="http://schemas.microsoft.com/office/word/2006/wordml" xmlns:wps="http://schemas.microsoft.com/office/word/2010/wordprocessingShape" mc:Ignorable="w14 w15 w16se w16cid w16 w16cex w16sdtdh w16sdtfl w16du wp14">
   <w:footnote w:type="separator" w:id="-1">
     <w:p>
       <w:pPr>
@@ -20481,7 +20497,7 @@
 </file>
 
 <file path=word/numbering.xml><?xml version="1.0" encoding="utf-8"?>
-<w:numbering xmlns:wpc="http://schemas.microsoft.com/office/word/2010/wordprocessingCanvas" xmlns:cx="http://schemas.microsoft.com/office/drawing/2014/chartex" xmlns:cx1="http://schemas.microsoft.com/office/drawing/2015/9/8/chartex" xmlns:cx2="http://schemas.microsoft.com/office/drawing/2015/10/21/chartex" xmlns:cx3="http://schemas.microsoft.com/office/drawing/2016/5/9/chartex" xmlns:cx4="http://schemas.microsoft.com/office/drawing/2016/5/10/chartex" xmlns:cx5="http://schemas.microsoft.com/office/drawing/2016/5/11/chartex" xmlns:cx6="http://schemas.microsoft.com/office/drawing/2016/5/12/chartex" xmlns:cx7="http://schemas.microsoft.com/office/drawing/2016/5/13/chartex" xmlns:cx8="http://schemas.microsoft.com/office/drawing/2016/5/14/chartex" xmlns:mc="http://schemas.openxmlformats.org/markup-compatibility/2006" xmlns:aink="http://schemas.microsoft.com/office/drawing/2016/ink" xmlns:am3d="http://schemas.microsoft.com/office/drawing/2017/model3d" xmlns:o="urn:schemas-microsoft-com:office:office" xmlns:oel="http://schemas.microsoft.com/office/2019/extlst" xmlns:r="http://schemas.openxmlformats.org/officeDocument/2006/relationships" xmlns:m="http://schemas.openxmlformats.org/officeDocument/2006/math" xmlns:v="urn:schemas-microsoft-com:vml" xmlns:wp14="http://schemas.microsoft.com/office/word/2010/wordprocessingDrawing" xmlns:wp="http://schemas.openxmlformats.org/drawingml/2006/wordprocessingDrawing" xmlns:w10="urn:schemas-microsoft-com:office:word" xmlns:w="http://schemas.openxmlformats.org/wordprocessingml/2006/main" xmlns:w14="http://schemas.microsoft.com/office/word/2010/wordml" xmlns:w15="http://schemas.microsoft.com/office/word/2012/wordml" xmlns:w16cei="http://schemas.microsoft.com/office/word/2026/wordml/cei" xmlns:w16cex="http://schemas.microsoft.com/office/word/2018/wordml/cex" xmlns:w16cid="http://schemas.microsoft.com/office/word/2016/wordml/cid" xmlns:w16="http://schemas.microsoft.com/office/word/2018/wordml" xmlns:w16du="http://schemas.microsoft.com/office/word/2023/wordml/word16du" xmlns:w16sdtdh="http://schemas.microsoft.com/office/word/2020/wordml/sdtdatahash" xmlns:w16sdtfl="http://schemas.microsoft.com/office/word/2024/wordml/sdtformatlock" xmlns:w16se="http://schemas.microsoft.com/office/word/2015/wordml/symex" xmlns:wpg="http://schemas.microsoft.com/office/word/2010/wordprocessingGroup" xmlns:wpi="http://schemas.microsoft.com/office/word/2010/wordprocessingInk" xmlns:wne="http://schemas.microsoft.com/office/word/2006/wordml" xmlns:wps="http://schemas.microsoft.com/office/word/2010/wordprocessingShape" mc:Ignorable="w14 w15 w16se w16cid w16 w16cex w16sdtdh w16sdtfl w16du wp14">
+<w:numbering xmlns:wpc="http://schemas.microsoft.com/office/word/2010/wordprocessingCanvas" xmlns:cx="http://schemas.microsoft.com/office/drawing/2014/chartex" xmlns:cx1="http://schemas.microsoft.com/office/drawing/2015/9/8/chartex" xmlns:cx2="http://schemas.microsoft.com/office/drawing/2015/10/21/chartex" xmlns:cx3="http://schemas.microsoft.com/office/drawing/2016/5/9/chartex" xmlns:cx4="http://schemas.microsoft.com/office/drawing/2016/5/10/chartex" xmlns:cx5="http://schemas.microsoft.com/office/drawing/2016/5/11/chartex" xmlns:cx6="http://schemas.microsoft.com/office/drawing/2016/5/12/chartex" xmlns:cx7="http://schemas.microsoft.com/office/drawing/2016/5/13/chartex" xmlns:cx8="http://schemas.microsoft.com/office/drawing/2016/5/14/chartex" xmlns:mc="http://schemas.openxmlformats.org/markup-compatibility/2006" xmlns:aink="http://schemas.microsoft.com/office/drawing/2016/ink" xmlns:am3d="http://schemas.microsoft.com/office/drawing/2017/model3d" xmlns:o="urn:schemas-microsoft-com:office:office" xmlns:oel="http://schemas.microsoft.com/office/2019/extlst" xmlns:r="http://schemas.openxmlformats.org/officeDocument/2006/relationships" xmlns:m="http://schemas.openxmlformats.org/officeDocument/2006/math" xmlns:v="urn:schemas-microsoft-com:vml" xmlns:wp14="http://schemas.microsoft.com/office/word/2010/wordprocessingDrawing" xmlns:wp="http://schemas.openxmlformats.org/drawingml/2006/wordprocessingDrawing" xmlns:w10="urn:schemas-microsoft-com:office:word" xmlns:w="http://schemas.openxmlformats.org/wordprocessingml/2006/main" xmlns:w14="http://schemas.microsoft.com/office/word/2010/wordml" xmlns:w15="http://schemas.microsoft.com/office/word/2012/wordml" xmlns:w16cex="http://schemas.microsoft.com/office/word/2018/wordml/cex" xmlns:w16cid="http://schemas.microsoft.com/office/word/2016/wordml/cid" xmlns:w16="http://schemas.microsoft.com/office/word/2018/wordml" xmlns:w16du="http://schemas.microsoft.com/office/word/2023/wordml/word16du" xmlns:w16sdtdh="http://schemas.microsoft.com/office/word/2020/wordml/sdtdatahash" xmlns:w16sdtfl="http://schemas.microsoft.com/office/word/2024/wordml/sdtformatlock" xmlns:w16se="http://schemas.microsoft.com/office/word/2015/wordml/symex" xmlns:wpg="http://schemas.microsoft.com/office/word/2010/wordprocessingGroup" xmlns:wpi="http://schemas.microsoft.com/office/word/2010/wordprocessingInk" xmlns:wne="http://schemas.microsoft.com/office/word/2006/wordml" xmlns:wps="http://schemas.microsoft.com/office/word/2010/wordprocessingShape" mc:Ignorable="w14 w15 w16se w16cid w16 w16cex w16sdtdh w16sdtfl w16du wp14">
   <w:abstractNum w:abstractNumId="0" w15:restartNumberingAfterBreak="0">
     <w:nsid w:val="00223666"/>
     <w:multiLevelType w:val="hybridMultilevel"/>
@@ -25974,7 +25990,6 @@
   <w:style w:type="character" w:default="1" w:styleId="DefaultParagraphFont">
     <w:name w:val="Default Paragraph Font"/>
     <w:uiPriority w:val="1"/>
-    <w:semiHidden/>
     <w:unhideWhenUsed/>
   </w:style>
   <w:style w:type="table" w:default="1" w:styleId="TableNormal">

</xml_diff>

<commit_message>
Completed Eval Metric section, and lit review, completed abstract
</commit_message>
<xml_diff>
--- a/final report/Final Report.docx
+++ b/final report/Final Report.docx
@@ -4282,31 +4282,224 @@
         </w:rPr>
       </w:pPr>
       <w:r>
-        <w:t xml:space="preserve">Automated Essay Scoring is </w:t>
-      </w:r>
-      <w:r>
-        <w:t xml:space="preserve">a rapidly developing </w:t>
-      </w:r>
-      <w:r>
-        <w:t xml:space="preserve">research areas in NLP with respect to education. According to [1] this is due to the rapid progress in Artificial Intelligence which has created new possibilities. Some of the benefits of AES are enhanced fairness, consistency and efficiency in the scoring process [2]. </w:t>
+        <w:t>Artificial intelligence technology is becoming increasingly</w:t>
+      </w:r>
+      <w:r>
+        <w:t xml:space="preserve"> </w:t>
+      </w:r>
+      <w:r>
+        <w:t xml:space="preserve">integral </w:t>
+      </w:r>
+      <w:r>
+        <w:t>to education</w:t>
+      </w:r>
+      <w:r>
+        <w:t xml:space="preserve">, driven by the </w:t>
+      </w:r>
+      <w:r>
+        <w:t>shift to online learning platforms</w:t>
+      </w:r>
+      <w:r>
+        <w:t xml:space="preserve">. </w:t>
+      </w:r>
+      <w:r>
+        <w:t>Most</w:t>
+      </w:r>
+      <w:r>
+        <w:t xml:space="preserve"> AES systems </w:t>
+      </w:r>
+      <w:r>
+        <w:t>ignore input equity</w:t>
+      </w:r>
+      <w:r>
+        <w:t xml:space="preserve">, only </w:t>
+      </w:r>
+      <w:r>
+        <w:t xml:space="preserve">facilitating </w:t>
+      </w:r>
+      <w:r>
+        <w:t>either handwritten</w:t>
+      </w:r>
+      <w:r>
+        <w:t>, typed or in limited cases spoken essays as audio files</w:t>
+      </w:r>
+      <w:r>
+        <w:t>.</w:t>
+      </w:r>
+      <w:r>
+        <w:t xml:space="preserve"> Most systems support at most dual input modality. Furthermore, </w:t>
+      </w:r>
+      <w:r>
+        <w:t xml:space="preserve">these systems </w:t>
+      </w:r>
+      <w:r>
+        <w:t xml:space="preserve">typically output a single </w:t>
+      </w:r>
+      <w:r>
+        <w:t xml:space="preserve">non-interpretable </w:t>
+      </w:r>
+      <w:r>
+        <w:t xml:space="preserve">holistic </w:t>
+      </w:r>
+      <w:r>
+        <w:t>score,</w:t>
+      </w:r>
+      <w:r>
+        <w:t xml:space="preserve"> </w:t>
+      </w:r>
+      <w:r>
+        <w:t>since their scoring</w:t>
+      </w:r>
+      <w:r>
+        <w:t xml:space="preserve"> </w:t>
+      </w:r>
+      <w:r>
+        <w:t>criteria is not annotated</w:t>
+      </w:r>
+      <w:r>
+        <w:t xml:space="preserve"> </w:t>
+      </w:r>
+      <w:r>
+        <w:t>– acting as a “</w:t>
+      </w:r>
+      <w:r>
+        <w:t>close</w:t>
+      </w:r>
+      <w:r>
+        <w:t>d-</w:t>
+      </w:r>
+      <w:r>
+        <w:t xml:space="preserve"> box</w:t>
+      </w:r>
+      <w:r>
+        <w:t>”</w:t>
+      </w:r>
+      <w:r>
+        <w:t xml:space="preserve"> </w:t>
+      </w:r>
+      <w:r>
+        <w:t>for proprietary reasons.</w:t>
+      </w:r>
+      <w:r>
+        <w:t xml:space="preserve"> </w:t>
+      </w:r>
+      <w:proofErr w:type="spellStart"/>
+      <w:r>
+        <w:t>BrainPower</w:t>
+      </w:r>
+      <w:proofErr w:type="spellEnd"/>
+      <w:r>
+        <w:t xml:space="preserve"> AES </w:t>
+      </w:r>
+      <w:r>
+        <w:t>is</w:t>
+      </w:r>
+      <w:r>
+        <w:t xml:space="preserve"> an AES system </w:t>
+      </w:r>
+      <w:r>
+        <w:t>that</w:t>
+      </w:r>
+      <w:r>
+        <w:t xml:space="preserve"> orchestr</w:t>
+      </w:r>
+      <w:r>
+        <w:t>ates</w:t>
+      </w:r>
+      <w:r>
+        <w:t xml:space="preserve"> </w:t>
+      </w:r>
+      <w:proofErr w:type="spellStart"/>
+      <w:r>
+        <w:t>P</w:t>
+      </w:r>
+      <w:r>
+        <w:t>addleOCR</w:t>
+      </w:r>
+      <w:proofErr w:type="spellEnd"/>
+      <w:r>
+        <w:t xml:space="preserve"> and Whisper facilitating the input of handwritten essays, typed essays and spoken essays. </w:t>
+      </w:r>
+      <w:proofErr w:type="spellStart"/>
+      <w:r>
+        <w:t>BrainPower</w:t>
+      </w:r>
+      <w:proofErr w:type="spellEnd"/>
+      <w:r>
+        <w:t xml:space="preserve"> is also interpretable because it outputs both holistic and trait scores providing the human scorer with insight into it</w:t>
+      </w:r>
+      <w:r>
+        <w:t>s</w:t>
+      </w:r>
+      <w:r>
+        <w:t xml:space="preserve"> scoring methodology</w:t>
+      </w:r>
+      <w:r>
+        <w:t xml:space="preserve">. </w:t>
+      </w:r>
+      <w:r>
+        <w:t xml:space="preserve"> </w:t>
+      </w:r>
+      <w:proofErr w:type="spellStart"/>
+      <w:r>
+        <w:t>BrainPower</w:t>
+      </w:r>
+      <w:proofErr w:type="spellEnd"/>
+      <w:r>
+        <w:t xml:space="preserve"> </w:t>
+      </w:r>
+      <w:r>
+        <w:t>achieved a</w:t>
+      </w:r>
+      <w:r>
+        <w:t xml:space="preserve"> QWK score of </w:t>
       </w:r>
       <w:r>
         <w:rPr>
           <w:color w:val="EE0000"/>
         </w:rPr>
-        <w:t xml:space="preserve">This research has shown Optical Character Recognition (OCR) technology </w:t>
+        <w:t>(</w:t>
       </w:r>
       <w:r>
         <w:rPr>
           <w:color w:val="EE0000"/>
         </w:rPr>
-        <w:t>has the potential to provide</w:t>
-      </w:r>
+        <w:t>placeholder value</w:t>
+      </w:r>
+      <w:proofErr w:type="gramStart"/>
       <w:r>
         <w:rPr>
           <w:color w:val="EE0000"/>
         </w:rPr>
-        <w:t xml:space="preserve"> accessibility to an AES system by allowing essays to be submitted in handwritten format as images. </w:t>
+        <w:t>)</w:t>
+      </w:r>
+      <w:r>
+        <w:rPr>
+          <w:color w:val="EE0000"/>
+        </w:rPr>
+        <w:t>,after</w:t>
+      </w:r>
+      <w:proofErr w:type="gramEnd"/>
+      <w:r>
+        <w:rPr>
+          <w:color w:val="EE0000"/>
+        </w:rPr>
+        <w:t xml:space="preserve"> scoring 1732 essays written to prompt 1 </w:t>
+      </w:r>
+      <w:r>
+        <w:t>on the ASAP 1.0 dataset</w:t>
+      </w:r>
+      <w:r>
+        <w:t xml:space="preserve">, </w:t>
+      </w:r>
+      <w:r>
+        <w:t xml:space="preserve">proving that it is accurate and reliable enough to serve as </w:t>
+      </w:r>
+      <w:r>
+        <w:t xml:space="preserve">an </w:t>
+      </w:r>
+      <w:r>
+        <w:t xml:space="preserve">assistive technology to human scorers. </w:t>
       </w:r>
     </w:p>
     <w:p>
@@ -6563,79 +6756,85 @@
         <w:t>The WER metric is used to measure the percentage of words that are incorrectly recognized or translated by the OCR Engine compared to a reference (ground truth) text</w:t>
       </w:r>
       <w:r>
+        <w:t xml:space="preserve"> [31]</w:t>
+      </w:r>
+      <w:r>
+        <w:t xml:space="preserve">. </w:t>
+      </w:r>
+      <w:r>
+        <w:t xml:space="preserve">According to </w:t>
+      </w:r>
+      <w:proofErr w:type="spellStart"/>
+      <w:r>
+        <w:t>Tabrej</w:t>
+      </w:r>
+      <w:proofErr w:type="spellEnd"/>
+      <w:r>
         <w:t xml:space="preserve"> </w:t>
       </w:r>
       <w:r>
-        <w:t>[31]</w:t>
-      </w:r>
-      <w:r>
-        <w:t xml:space="preserve">. </w:t>
-      </w:r>
-      <w:r>
-        <w:t xml:space="preserve">According to </w:t>
-      </w:r>
-      <w:proofErr w:type="spellStart"/>
-      <w:r>
-        <w:t>Tabrej</w:t>
-      </w:r>
-      <w:proofErr w:type="spellEnd"/>
+        <w:t xml:space="preserve">et al. </w:t>
+      </w:r>
+      <w:r>
+        <w:t xml:space="preserve">[16], this is the common metric for ASR accuracy. </w:t>
+      </w:r>
+    </w:p>
+    <w:p>
+      <w:pPr>
+        <w:spacing w:line="360" w:lineRule="auto"/>
+      </w:pPr>
+      <w:r>
+        <w:t>CER</w:t>
+      </w:r>
+      <w:r>
+        <w:t>, however, counts</w:t>
+      </w:r>
+      <w:r>
+        <w:t xml:space="preserve"> any deletions, insertions or substitutions at the character level, enabling evaluation based on character-wise accuracy. CER works well in spotting symbol, typographical and abbreviation mistakes [32].</w:t>
+      </w:r>
       <w:r>
         <w:t xml:space="preserve"> </w:t>
       </w:r>
       <w:r>
-        <w:t xml:space="preserve">et al. </w:t>
-      </w:r>
-      <w:r>
-        <w:t xml:space="preserve">[16], this is the common metric for ASR accuracy. </w:t>
-      </w:r>
-    </w:p>
-    <w:p>
-      <w:pPr>
-        <w:spacing w:line="360" w:lineRule="auto"/>
-      </w:pPr>
-      <w:r>
-        <w:t>CER</w:t>
-      </w:r>
-      <w:r>
-        <w:t>, however, counts</w:t>
-      </w:r>
-      <w:r>
-        <w:t xml:space="preserve"> any deletions, insertions or substitutions at the character level, enabling evaluation based on character-wise accuracy. CER works well in spotting symbol, typographical and abbreviation mistakes [32].</w:t>
+        <w:t>Li et al. [9] used CER to evaluate the performance of Tr-OCR on the IAM handwriting database.</w:t>
+      </w:r>
+    </w:p>
+    <w:p>
+      <w:pPr>
+        <w:spacing w:line="360" w:lineRule="auto"/>
+      </w:pPr>
+      <w:r>
+        <w:t>Zhang [33] use</w:t>
+      </w:r>
+      <w:r>
+        <w:t>d</w:t>
+      </w:r>
+      <w:r>
+        <w:t xml:space="preserve"> WER to assess the performance of a CNN </w:t>
+      </w:r>
+      <w:r>
+        <w:t>in recognizing spoken Englis</w:t>
+      </w:r>
+      <w:r>
+        <w:t>h</w:t>
       </w:r>
       <w:r>
         <w:t xml:space="preserve"> </w:t>
       </w:r>
       <w:r>
-        <w:t>Li et al. [9] used CER to evaluate the performance of Tr-OCR on the IAM handwriting database.</w:t>
-      </w:r>
-    </w:p>
-    <w:p>
-      <w:pPr>
-        <w:spacing w:line="360" w:lineRule="auto"/>
-      </w:pPr>
-      <w:r>
-        <w:t>Zhang [33] use</w:t>
-      </w:r>
-      <w:r>
-        <w:t>d</w:t>
-      </w:r>
-      <w:r>
-        <w:t xml:space="preserve"> WER to assess the performance of a CNN </w:t>
-      </w:r>
-      <w:r>
-        <w:t xml:space="preserve">in recognizing </w:t>
-      </w:r>
-      <w:r>
-        <w:t>spoken Englis</w:t>
-      </w:r>
-      <w:r>
-        <w:t>h</w:t>
-      </w:r>
-      <w:r>
-        <w:t xml:space="preserve"> </w:t>
-      </w:r>
-      <w:r>
-        <w:t xml:space="preserve">and a Sep2Sep model </w:t>
+        <w:t>and a Se</w:t>
+      </w:r>
+      <w:r>
+        <w:t>q</w:t>
+      </w:r>
+      <w:r>
+        <w:t>2Se</w:t>
+      </w:r>
+      <w:r>
+        <w:t>q</w:t>
+      </w:r>
+      <w:r>
+        <w:t xml:space="preserve"> model </w:t>
       </w:r>
       <w:r>
         <w:t>in translating it</w:t>
@@ -6665,7 +6864,13 @@
       </w:r>
       <w:proofErr w:type="gramEnd"/>
       <w:r>
-        <w:t xml:space="preserve">NVIDIA) an Wav2Vec2.0(Meta Ai) in transcribing spontaneous as well as read speech form young speakers in Germany. </w:t>
+        <w:t>NVIDIA) an Wav2Vec2.0(Meta Ai) in transcribing spontaneous as well as read speech fr</w:t>
+      </w:r>
+      <w:r>
+        <w:t>o</w:t>
+      </w:r>
+      <w:r>
+        <w:t xml:space="preserve">m young speakers in Germany. </w:t>
       </w:r>
       <w:r>
         <w:t xml:space="preserve">While widely adopted, </w:t>
@@ -6674,7 +6879,13 @@
         <w:t xml:space="preserve">WER and CER </w:t>
       </w:r>
       <w:r>
-        <w:t>possess inherent limitations when evaluation real-world system performance</w:t>
+        <w:t>possess inherent limitations when evaluati</w:t>
+      </w:r>
+      <w:r>
+        <w:t>ng</w:t>
+      </w:r>
+      <w:r>
+        <w:t xml:space="preserve"> real-world system performance</w:t>
       </w:r>
       <w:r>
         <w:t xml:space="preserve">. </w:t>
@@ -6722,7 +6933,13 @@
       </w:r>
       <w:proofErr w:type="spellEnd"/>
       <w:r>
-        <w:t xml:space="preserve"> et al. [16] state that, while WER and CER measure accuracy, they do not capture the real-time performance of the system. This limitation is due to these metrics designed specifically for post-process evaluation – applied to the output, rather than during the processing phase. </w:t>
+        <w:t xml:space="preserve"> et al. [16] state that, while WER and CER measure accuracy, they do not capture the real-time performance of the system. This limitation is due to these metrics </w:t>
+      </w:r>
+      <w:r>
+        <w:t xml:space="preserve">being </w:t>
+      </w:r>
+      <w:r>
+        <w:t xml:space="preserve">designed specifically for post-process evaluation – applied to the output, rather than during the processing phase. </w:t>
       </w:r>
       <w:proofErr w:type="spellStart"/>
       <w:r>
@@ -6764,6 +6981,22 @@
     <w:p>
       <w:pPr>
         <w:spacing w:line="360" w:lineRule="auto"/>
+        <w:rPr>
+          <w:b/>
+          <w:bCs/>
+        </w:rPr>
+      </w:pPr>
+      <w:r>
+        <w:rPr>
+          <w:b/>
+          <w:bCs/>
+        </w:rPr>
+        <w:t>Quadratic Weighted Kappa</w:t>
+      </w:r>
+    </w:p>
+    <w:p>
+      <w:pPr>
+        <w:spacing w:line="360" w:lineRule="auto"/>
       </w:pPr>
       <w:proofErr w:type="spellStart"/>
       <w:r>
@@ -6771,7 +7004,10 @@
       </w:r>
       <w:proofErr w:type="spellEnd"/>
       <w:r>
-        <w:t xml:space="preserve"> unlike the Whisper and </w:t>
+        <w:t>,</w:t>
+      </w:r>
+      <w:r>
+        <w:t xml:space="preserve"> unlike Whisper and </w:t>
       </w:r>
       <w:proofErr w:type="spellStart"/>
       <w:r>
@@ -6785,7 +7021,10 @@
         <w:t>regression</w:t>
       </w:r>
       <w:r>
-        <w:t>/scoring</w:t>
+        <w:t xml:space="preserve"> </w:t>
+      </w:r>
+      <w:r>
+        <w:t>scoring</w:t>
       </w:r>
       <w:r>
         <w:t>,</w:t>
@@ -6815,7 +7054,19 @@
         <w:t>Therefore,</w:t>
       </w:r>
       <w:r>
-        <w:t xml:space="preserve"> a different metric is used to evaluate its performance QWK.</w:t>
+        <w:t xml:space="preserve"> a different metric is </w:t>
+      </w:r>
+      <w:r>
+        <w:t>required</w:t>
+      </w:r>
+      <w:r>
+        <w:t xml:space="preserve"> to evaluate its performance</w:t>
+      </w:r>
+      <w:r>
+        <w:t xml:space="preserve"> -</w:t>
+      </w:r>
+      <w:r>
+        <w:t xml:space="preserve"> QWK.</w:t>
       </w:r>
     </w:p>
     <w:p>
@@ -6836,32 +7087,96 @@
       <w:pPr>
         <w:spacing w:line="360" w:lineRule="auto"/>
       </w:pPr>
-      <w:r>
-        <w:t xml:space="preserve">What studies used </w:t>
-      </w:r>
       <w:proofErr w:type="spellStart"/>
       <w:r>
-        <w:t>qwk</w:t>
+        <w:t>Lagakis</w:t>
       </w:r>
       <w:proofErr w:type="spellEnd"/>
       <w:r>
-        <w:t>?</w:t>
-      </w:r>
-    </w:p>
-    <w:p>
-      <w:pPr>
-        <w:spacing w:line="360" w:lineRule="auto"/>
-      </w:pPr>
-      <w:r>
-        <w:t xml:space="preserve">What are the limitations of </w:t>
+        <w:t xml:space="preserve"> and </w:t>
       </w:r>
       <w:proofErr w:type="spellStart"/>
       <w:r>
-        <w:t>qwk</w:t>
+        <w:t>Demitriadis</w:t>
       </w:r>
       <w:proofErr w:type="spellEnd"/>
       <w:r>
-        <w:t xml:space="preserve">? </w:t>
+        <w:t xml:space="preserve"> [3] use QWK as their go-to metric to compare the performance of current state-of-the-art AES systems. </w:t>
+      </w:r>
+      <w:r>
+        <w:t xml:space="preserve"> </w:t>
+      </w:r>
+      <w:proofErr w:type="gramStart"/>
+      <w:r>
+        <w:t>Yang  [</w:t>
+      </w:r>
+      <w:proofErr w:type="gramEnd"/>
+      <w:r>
+        <w:t xml:space="preserve">4], used QWK in analysing the results of cross prompt AES models. </w:t>
+      </w:r>
+      <w:proofErr w:type="spellStart"/>
+      <w:r>
+        <w:t>Elmassry</w:t>
+      </w:r>
+      <w:proofErr w:type="spellEnd"/>
+      <w:r>
+        <w:t xml:space="preserve"> et al. [5] in their review of pretrained models in AES identified QWK as the official evaluation metric in the ASAP competition. Dadi and </w:t>
+      </w:r>
+      <w:proofErr w:type="spellStart"/>
+      <w:r>
+        <w:t>Sanampudi</w:t>
+      </w:r>
+      <w:proofErr w:type="spellEnd"/>
+      <w:r>
+        <w:t xml:space="preserve"> [7] used QWK to find the agreement between predicted and actual scores in the output from implementing feature extraction techniques with a sentence encoder and a pre-trained transformer model.  </w:t>
+      </w:r>
+      <w:r>
+        <w:t xml:space="preserve">QWK like the other metrics is not without its flaws. </w:t>
+      </w:r>
+    </w:p>
+    <w:p>
+      <w:pPr>
+        <w:spacing w:line="360" w:lineRule="auto"/>
+        <w:rPr>
+          <w:b/>
+          <w:bCs/>
+        </w:rPr>
+      </w:pPr>
+      <w:r>
+        <w:rPr>
+          <w:b/>
+          <w:bCs/>
+        </w:rPr>
+        <w:t>Limitation of QWK</w:t>
+      </w:r>
+    </w:p>
+    <w:p>
+      <w:pPr>
+        <w:spacing w:line="360" w:lineRule="auto"/>
+      </w:pPr>
+      <w:r>
+        <w:t>According to Xu et al</w:t>
+      </w:r>
+      <w:r>
+        <w:t>.</w:t>
+      </w:r>
+      <w:r>
+        <w:t xml:space="preserve"> [1], a low consensus, compared to what would be anticipated by chance, could render QWK potentially misleading or even detrimental. </w:t>
+      </w:r>
+      <w:r>
+        <w:t xml:space="preserve">Despite its limitations, this study uses QWK to evaluate the performance of </w:t>
+      </w:r>
+      <w:proofErr w:type="spellStart"/>
+      <w:r>
+        <w:t>deBERTa</w:t>
+      </w:r>
+      <w:proofErr w:type="spellEnd"/>
+      <w:r>
+        <w:t xml:space="preserve"> in comparison to a human scorer. This is in line with Taghipour and Ng [2], who used QWK </w:t>
+      </w:r>
+      <w:r>
+        <w:lastRenderedPageBreak/>
+        <w:t xml:space="preserve">for their research in AES using a neural approach. Like this research, they used the ASAP dataset and acknowledged that their adoption of QWK was due to the ASAP competition adopting QWK as its official evaluation metric.  </w:t>
       </w:r>
     </w:p>
     <w:p>
@@ -7028,27 +7343,14 @@
       <w:r>
         <w:t xml:space="preserve">Figure </w:t>
       </w:r>
-      <w:r>
-        <w:fldChar w:fldCharType="begin"/>
-      </w:r>
-      <w:r>
-        <w:instrText xml:space="preserve"> SEQ Figure \* ARABIC </w:instrText>
-      </w:r>
-      <w:r>
-        <w:fldChar w:fldCharType="separate"/>
-      </w:r>
-      <w:r>
-        <w:rPr>
-          <w:noProof/>
-        </w:rPr>
-        <w:t>1</w:t>
-      </w:r>
-      <w:r>
-        <w:rPr>
-          <w:noProof/>
-        </w:rPr>
-        <w:fldChar w:fldCharType="end"/>
-      </w:r>
+      <w:fldSimple w:instr=" SEQ Figure \* ARABIC ">
+        <w:r>
+          <w:rPr>
+            <w:noProof/>
+          </w:rPr>
+          <w:t>1</w:t>
+        </w:r>
+      </w:fldSimple>
       <w:r>
         <w:t xml:space="preserve"> Architecture of </w:t>
       </w:r>
@@ -8394,27 +8696,14 @@
       <w:r>
         <w:t xml:space="preserve">Figure </w:t>
       </w:r>
-      <w:r>
-        <w:fldChar w:fldCharType="begin"/>
-      </w:r>
-      <w:r>
-        <w:instrText xml:space="preserve"> SEQ Figure \* ARABIC </w:instrText>
-      </w:r>
-      <w:r>
-        <w:fldChar w:fldCharType="separate"/>
-      </w:r>
-      <w:r>
-        <w:rPr>
-          <w:noProof/>
-        </w:rPr>
-        <w:t>2</w:t>
-      </w:r>
-      <w:r>
-        <w:rPr>
-          <w:noProof/>
-        </w:rPr>
-        <w:fldChar w:fldCharType="end"/>
-      </w:r>
+      <w:fldSimple w:instr=" SEQ Figure \* ARABIC ">
+        <w:r>
+          <w:rPr>
+            <w:noProof/>
+          </w:rPr>
+          <w:t>2</w:t>
+        </w:r>
+      </w:fldSimple>
       <w:r>
         <w:t xml:space="preserve"> User interface for </w:t>
       </w:r>
@@ -25990,6 +26279,7 @@
   <w:style w:type="character" w:default="1" w:styleId="DefaultParagraphFont">
     <w:name w:val="Default Paragraph Font"/>
     <w:uiPriority w:val="1"/>
+    <w:semiHidden/>
     <w:unhideWhenUsed/>
   </w:style>
   <w:style w:type="table" w:default="1" w:styleId="TableNormal">

</xml_diff>

<commit_message>
Completed sections 3.1 - 3.5
</commit_message>
<xml_diff>
--- a/final report/Final Report.docx
+++ b/final report/Final Report.docx
@@ -4449,42 +4449,31 @@
         <w:t xml:space="preserve"> </w:t>
       </w:r>
       <w:r>
-        <w:t>achieved a</w:t>
-      </w:r>
-      <w:r>
-        <w:t xml:space="preserve"> QWK score of </w:t>
+        <w:t xml:space="preserve">achieved a QWK score of </w:t>
       </w:r>
       <w:r>
         <w:rPr>
           <w:color w:val="EE0000"/>
         </w:rPr>
-        <w:t>(</w:t>
+        <w:t>(placeholder value)</w:t>
       </w:r>
       <w:r>
         <w:rPr>
           <w:color w:val="EE0000"/>
         </w:rPr>
-        <w:t>placeholder value</w:t>
-      </w:r>
-      <w:proofErr w:type="gramStart"/>
+        <w:t>,</w:t>
+      </w:r>
       <w:r>
         <w:rPr>
           <w:color w:val="EE0000"/>
         </w:rPr>
-        <w:t>)</w:t>
+        <w:t xml:space="preserve"> </w:t>
       </w:r>
       <w:r>
         <w:rPr>
           <w:color w:val="EE0000"/>
         </w:rPr>
-        <w:t>,after</w:t>
-      </w:r>
-      <w:proofErr w:type="gramEnd"/>
-      <w:r>
-        <w:rPr>
-          <w:color w:val="EE0000"/>
-        </w:rPr>
-        <w:t xml:space="preserve"> scoring 1732 essays written to prompt 1 </w:t>
+        <w:t xml:space="preserve">after scoring 1732 essays written to prompt 1 </w:t>
       </w:r>
       <w:r>
         <w:t>on the ASAP 1.0 dataset</w:t>
@@ -4517,6 +4506,7 @@
         <w:br w:type="page"/>
       </w:r>
     </w:p>
+    <w:p/>
     <w:p>
       <w:pPr>
         <w:pStyle w:val="Heading2"/>
@@ -6893,6 +6883,7 @@
     </w:p>
     <w:p>
       <w:pPr>
+        <w:spacing w:line="360" w:lineRule="auto"/>
         <w:rPr>
           <w:b/>
           <w:bCs/>
@@ -6903,7 +6894,62 @@
           <w:b/>
           <w:bCs/>
         </w:rPr>
-        <w:br w:type="page"/>
+        <w:t xml:space="preserve">Limitations of WER and CER </w:t>
+      </w:r>
+    </w:p>
+    <w:p>
+      <w:pPr>
+        <w:spacing w:line="360" w:lineRule="auto"/>
+      </w:pPr>
+      <w:proofErr w:type="spellStart"/>
+      <w:r>
+        <w:t>Tabrej</w:t>
+      </w:r>
+      <w:proofErr w:type="spellEnd"/>
+      <w:r>
+        <w:t xml:space="preserve"> et al. [16] state that, while WER and CER measure accuracy, they do not capture the real-time performance of the system. This limitation is due to these metrics </w:t>
+      </w:r>
+      <w:r>
+        <w:t xml:space="preserve">being </w:t>
+      </w:r>
+      <w:r>
+        <w:t xml:space="preserve">designed specifically for post-process evaluation – applied to the output, rather than during the processing phase. </w:t>
+      </w:r>
+      <w:proofErr w:type="spellStart"/>
+      <w:r>
+        <w:t>Tabrej</w:t>
+      </w:r>
+      <w:proofErr w:type="spellEnd"/>
+      <w:r>
+        <w:t xml:space="preserve"> et al. [16] further state that latency and real-time factor (RTF) are key metrics for streaming and that a comprehensive evaluation of an ASR system is required to assess the trade-off between WER and the other two metrics. </w:t>
+      </w:r>
+    </w:p>
+    <w:p>
+      <w:pPr>
+        <w:spacing w:line="360" w:lineRule="auto"/>
+      </w:pPr>
+      <w:r>
+        <w:t xml:space="preserve">To assess the live performance of the system </w:t>
+      </w:r>
+      <w:proofErr w:type="spellStart"/>
+      <w:r>
+        <w:t>paddleOCR’s</w:t>
+      </w:r>
+      <w:proofErr w:type="spellEnd"/>
+      <w:r>
+        <w:t xml:space="preserve"> confidence scores will be uses and Whis</w:t>
+      </w:r>
+      <w:r>
+        <w:t>p</w:t>
+      </w:r>
+      <w:r>
+        <w:t xml:space="preserve">er </w:t>
+      </w:r>
+      <w:r>
+        <w:t>average log probability</w:t>
+      </w:r>
+      <w:r>
+        <w:t xml:space="preserve">. </w:t>
       </w:r>
     </w:p>
     <w:p>
@@ -6920,7 +6966,7 @@
           <w:bCs/>
         </w:rPr>
         <w:lastRenderedPageBreak/>
-        <w:t xml:space="preserve">Limitations of WER and CER </w:t>
+        <w:t>Quadratic Weighted Kappa</w:t>
       </w:r>
     </w:p>
     <w:p>
@@ -6929,53 +6975,138 @@
       </w:pPr>
       <w:proofErr w:type="spellStart"/>
       <w:r>
-        <w:t>Tabrej</w:t>
+        <w:t>DeBERTA</w:t>
       </w:r>
       <w:proofErr w:type="spellEnd"/>
       <w:r>
-        <w:t xml:space="preserve"> et al. [16] state that, while WER and CER measure accuracy, they do not capture the real-time performance of the system. This limitation is due to these metrics </w:t>
-      </w:r>
-      <w:r>
-        <w:t xml:space="preserve">being </w:t>
-      </w:r>
-      <w:r>
-        <w:t xml:space="preserve">designed specifically for post-process evaluation – applied to the output, rather than during the processing phase. </w:t>
+        <w:t>,</w:t>
+      </w:r>
+      <w:r>
+        <w:t xml:space="preserve"> unlike Whisper and </w:t>
       </w:r>
       <w:proofErr w:type="spellStart"/>
       <w:r>
-        <w:t>Tabrej</w:t>
+        <w:t>PaddleOCR</w:t>
       </w:r>
       <w:proofErr w:type="spellEnd"/>
       <w:r>
-        <w:t xml:space="preserve"> et al. [16] further state that latency and real-time factor (RTF) are key metrics for streaming and that a comprehensive evaluation of an ASR system is required to assess the trade-off between WER and the other two metrics. </w:t>
-      </w:r>
-    </w:p>
-    <w:p>
-      <w:pPr>
-        <w:spacing w:line="360" w:lineRule="auto"/>
-      </w:pPr>
-      <w:r>
-        <w:t xml:space="preserve">To assess the live performance of the system </w:t>
-      </w:r>
+        <w:t xml:space="preserve">, performs ordinal </w:t>
+      </w:r>
+      <w:r>
+        <w:t>regression</w:t>
+      </w:r>
+      <w:r>
+        <w:t xml:space="preserve"> </w:t>
+      </w:r>
+      <w:r>
+        <w:t>scoring</w:t>
+      </w:r>
+      <w:r>
+        <w:t>,</w:t>
+      </w:r>
+      <w:r>
+        <w:t xml:space="preserve"> where i</w:t>
+      </w:r>
+      <w:r>
+        <w:t>t</w:t>
+      </w:r>
+      <w:r>
+        <w:t xml:space="preserve"> predicts a numeric </w:t>
+      </w:r>
+      <w:r>
+        <w:t>score</w:t>
+      </w:r>
+      <w:r>
+        <w:t xml:space="preserve"> on</w:t>
+      </w:r>
+      <w:r>
+        <w:t xml:space="preserve"> </w:t>
+      </w:r>
+      <w:r>
+        <w:t xml:space="preserve">a rubric scale. </w:t>
+      </w:r>
+      <w:r>
+        <w:t>Therefore,</w:t>
+      </w:r>
+      <w:r>
+        <w:t xml:space="preserve"> a different metric is </w:t>
+      </w:r>
+      <w:r>
+        <w:t>required</w:t>
+      </w:r>
+      <w:r>
+        <w:t xml:space="preserve"> to evaluate its performance</w:t>
+      </w:r>
+      <w:r>
+        <w:t xml:space="preserve"> -</w:t>
+      </w:r>
+      <w:r>
+        <w:t xml:space="preserve"> QWK.</w:t>
+      </w:r>
+    </w:p>
+    <w:p>
+      <w:pPr>
+        <w:spacing w:line="360" w:lineRule="auto"/>
+      </w:pPr>
+      <w:r>
+        <w:t>QWK (Quadratic weighted Kappa) evaluates the degree of agreement among human and AI scorers, it is a metric between 0 and 1, representing no agreement beyond chance and perfect agreement, respectively [1]</w:t>
+      </w:r>
+      <w:r>
+        <w:t>.</w:t>
+      </w:r>
+      <w:r>
+        <w:t xml:space="preserve"> </w:t>
+      </w:r>
+    </w:p>
+    <w:p>
+      <w:pPr>
+        <w:spacing w:line="360" w:lineRule="auto"/>
+      </w:pPr>
       <w:proofErr w:type="spellStart"/>
       <w:r>
-        <w:t>paddleOCR’s</w:t>
+        <w:t>Lagakis</w:t>
       </w:r>
       <w:proofErr w:type="spellEnd"/>
       <w:r>
-        <w:t xml:space="preserve"> confidence scores will be uses and Whis</w:t>
-      </w:r>
-      <w:r>
-        <w:t>p</w:t>
-      </w:r>
-      <w:r>
-        <w:t xml:space="preserve">er </w:t>
-      </w:r>
-      <w:r>
-        <w:t>average log probability</w:t>
-      </w:r>
-      <w:r>
-        <w:t xml:space="preserve">. </w:t>
+        <w:t xml:space="preserve"> and </w:t>
+      </w:r>
+      <w:proofErr w:type="spellStart"/>
+      <w:r>
+        <w:t>Demitriadis</w:t>
+      </w:r>
+      <w:proofErr w:type="spellEnd"/>
+      <w:r>
+        <w:t xml:space="preserve"> [3] use QWK as their go-to metric to compare the performance of current state-of-the-art AES systems. </w:t>
+      </w:r>
+      <w:r>
+        <w:t xml:space="preserve"> </w:t>
+      </w:r>
+      <w:proofErr w:type="gramStart"/>
+      <w:r>
+        <w:t>Yang  [</w:t>
+      </w:r>
+      <w:proofErr w:type="gramEnd"/>
+      <w:r>
+        <w:t xml:space="preserve">4], used QWK in analysing the results of cross prompt AES models. </w:t>
+      </w:r>
+      <w:proofErr w:type="spellStart"/>
+      <w:r>
+        <w:t>Elmassry</w:t>
+      </w:r>
+      <w:proofErr w:type="spellEnd"/>
+      <w:r>
+        <w:t xml:space="preserve"> et al. [5] in their review of pretrained models in AES identified QWK as the official evaluation metric in the ASAP competition. Dadi and </w:t>
+      </w:r>
+      <w:proofErr w:type="spellStart"/>
+      <w:r>
+        <w:t>Sanampudi</w:t>
+      </w:r>
+      <w:proofErr w:type="spellEnd"/>
+      <w:r>
+        <w:t xml:space="preserve"> [7] used QWK to find the agreement between predicted and actual scores in the output from implementing feature extraction techniques with a sentence encoder and a pre-trained transformer model.  </w:t>
+      </w:r>
+      <w:r>
+        <w:t xml:space="preserve">QWK like the other metrics is not without its flaws. </w:t>
       </w:r>
     </w:p>
     <w:p>
@@ -6991,192 +7122,32 @@
           <w:b/>
           <w:bCs/>
         </w:rPr>
-        <w:t>Quadratic Weighted Kappa</w:t>
-      </w:r>
-    </w:p>
-    <w:p>
-      <w:pPr>
-        <w:spacing w:line="360" w:lineRule="auto"/>
-      </w:pPr>
+        <w:t>Limitation of QWK</w:t>
+      </w:r>
+    </w:p>
+    <w:p>
+      <w:pPr>
+        <w:spacing w:line="360" w:lineRule="auto"/>
+      </w:pPr>
+      <w:r>
+        <w:t>According to Xu et al</w:t>
+      </w:r>
+      <w:r>
+        <w:t>.</w:t>
+      </w:r>
+      <w:r>
+        <w:t xml:space="preserve"> [1], a low consensus, compared to what would be anticipated by chance, could render QWK potentially misleading or even detrimental. </w:t>
+      </w:r>
+      <w:r>
+        <w:t xml:space="preserve">Despite its limitations, this study uses QWK to evaluate the performance of </w:t>
+      </w:r>
       <w:proofErr w:type="spellStart"/>
       <w:r>
-        <w:t>DeBERTA</w:t>
+        <w:t>deBERTa</w:t>
       </w:r>
       <w:proofErr w:type="spellEnd"/>
       <w:r>
-        <w:t>,</w:t>
-      </w:r>
-      <w:r>
-        <w:t xml:space="preserve"> unlike Whisper and </w:t>
-      </w:r>
-      <w:proofErr w:type="spellStart"/>
-      <w:r>
-        <w:t>PaddleOCR</w:t>
-      </w:r>
-      <w:proofErr w:type="spellEnd"/>
-      <w:r>
-        <w:t xml:space="preserve">, performs ordinal </w:t>
-      </w:r>
-      <w:r>
-        <w:t>regression</w:t>
-      </w:r>
-      <w:r>
-        <w:t xml:space="preserve"> </w:t>
-      </w:r>
-      <w:r>
-        <w:t>scoring</w:t>
-      </w:r>
-      <w:r>
-        <w:t>,</w:t>
-      </w:r>
-      <w:r>
-        <w:t xml:space="preserve"> where i</w:t>
-      </w:r>
-      <w:r>
-        <w:t>t</w:t>
-      </w:r>
-      <w:r>
-        <w:t xml:space="preserve"> predicts a numeric </w:t>
-      </w:r>
-      <w:r>
-        <w:t>score</w:t>
-      </w:r>
-      <w:r>
-        <w:t xml:space="preserve"> on</w:t>
-      </w:r>
-      <w:r>
-        <w:t xml:space="preserve"> </w:t>
-      </w:r>
-      <w:r>
-        <w:t xml:space="preserve">a rubric scale. </w:t>
-      </w:r>
-      <w:r>
-        <w:t>Therefore,</w:t>
-      </w:r>
-      <w:r>
-        <w:t xml:space="preserve"> a different metric is </w:t>
-      </w:r>
-      <w:r>
-        <w:t>required</w:t>
-      </w:r>
-      <w:r>
-        <w:t xml:space="preserve"> to evaluate its performance</w:t>
-      </w:r>
-      <w:r>
-        <w:t xml:space="preserve"> -</w:t>
-      </w:r>
-      <w:r>
-        <w:t xml:space="preserve"> QWK.</w:t>
-      </w:r>
-    </w:p>
-    <w:p>
-      <w:pPr>
-        <w:spacing w:line="360" w:lineRule="auto"/>
-      </w:pPr>
-      <w:r>
-        <w:t>QWK (Quadratic weighted Kappa) evaluates the degree of agreement among human and AI scorers, it is a metric between 0 and 1, representing no agreement beyond chance and perfect agreement, respectively [1]</w:t>
-      </w:r>
-      <w:r>
-        <w:t>.</w:t>
-      </w:r>
-      <w:r>
-        <w:t xml:space="preserve"> </w:t>
-      </w:r>
-    </w:p>
-    <w:p>
-      <w:pPr>
-        <w:spacing w:line="360" w:lineRule="auto"/>
-      </w:pPr>
-      <w:proofErr w:type="spellStart"/>
-      <w:r>
-        <w:t>Lagakis</w:t>
-      </w:r>
-      <w:proofErr w:type="spellEnd"/>
-      <w:r>
-        <w:t xml:space="preserve"> and </w:t>
-      </w:r>
-      <w:proofErr w:type="spellStart"/>
-      <w:r>
-        <w:t>Demitriadis</w:t>
-      </w:r>
-      <w:proofErr w:type="spellEnd"/>
-      <w:r>
-        <w:t xml:space="preserve"> [3] use QWK as their go-to metric to compare the performance of current state-of-the-art AES systems. </w:t>
-      </w:r>
-      <w:r>
-        <w:t xml:space="preserve"> </w:t>
-      </w:r>
-      <w:proofErr w:type="gramStart"/>
-      <w:r>
-        <w:t>Yang  [</w:t>
-      </w:r>
-      <w:proofErr w:type="gramEnd"/>
-      <w:r>
-        <w:t xml:space="preserve">4], used QWK in analysing the results of cross prompt AES models. </w:t>
-      </w:r>
-      <w:proofErr w:type="spellStart"/>
-      <w:r>
-        <w:t>Elmassry</w:t>
-      </w:r>
-      <w:proofErr w:type="spellEnd"/>
-      <w:r>
-        <w:t xml:space="preserve"> et al. [5] in their review of pretrained models in AES identified QWK as the official evaluation metric in the ASAP competition. Dadi and </w:t>
-      </w:r>
-      <w:proofErr w:type="spellStart"/>
-      <w:r>
-        <w:t>Sanampudi</w:t>
-      </w:r>
-      <w:proofErr w:type="spellEnd"/>
-      <w:r>
-        <w:t xml:space="preserve"> [7] used QWK to find the agreement between predicted and actual scores in the output from implementing feature extraction techniques with a sentence encoder and a pre-trained transformer model.  </w:t>
-      </w:r>
-      <w:r>
-        <w:t xml:space="preserve">QWK like the other metrics is not without its flaws. </w:t>
-      </w:r>
-    </w:p>
-    <w:p>
-      <w:pPr>
-        <w:spacing w:line="360" w:lineRule="auto"/>
-        <w:rPr>
-          <w:b/>
-          <w:bCs/>
-        </w:rPr>
-      </w:pPr>
-      <w:r>
-        <w:rPr>
-          <w:b/>
-          <w:bCs/>
-        </w:rPr>
-        <w:t>Limitation of QWK</w:t>
-      </w:r>
-    </w:p>
-    <w:p>
-      <w:pPr>
-        <w:spacing w:line="360" w:lineRule="auto"/>
-      </w:pPr>
-      <w:r>
-        <w:t>According to Xu et al</w:t>
-      </w:r>
-      <w:r>
-        <w:t>.</w:t>
-      </w:r>
-      <w:r>
-        <w:t xml:space="preserve"> [1], a low consensus, compared to what would be anticipated by chance, could render QWK potentially misleading or even detrimental. </w:t>
-      </w:r>
-      <w:r>
-        <w:t xml:space="preserve">Despite its limitations, this study uses QWK to evaluate the performance of </w:t>
-      </w:r>
-      <w:proofErr w:type="spellStart"/>
-      <w:r>
-        <w:t>deBERTa</w:t>
-      </w:r>
-      <w:proofErr w:type="spellEnd"/>
-      <w:r>
-        <w:t xml:space="preserve"> in comparison to a human scorer. This is in line with Taghipour and Ng [2], who used QWK </w:t>
-      </w:r>
-      <w:r>
-        <w:lastRenderedPageBreak/>
-        <w:t xml:space="preserve">for their research in AES using a neural approach. Like this research, they used the ASAP dataset and acknowledged that their adoption of QWK was due to the ASAP competition adopting QWK as its official evaluation metric.  </w:t>
+        <w:t xml:space="preserve"> in comparison to a human scorer. This is in line with Taghipour and Ng [2], who used QWK for their research in AES using a neural approach. Like this research, they used the ASAP dataset and acknowledged that their adoption of QWK was due to the ASAP competition adopting QWK as its official evaluation metric.  </w:t>
       </w:r>
     </w:p>
     <w:p>
@@ -7380,7 +7351,13 @@
       </w:r>
       <w:proofErr w:type="spellEnd"/>
       <w:r>
-        <w:t xml:space="preserve"> system. The system c</w:t>
+        <w:t xml:space="preserve"> system</w:t>
+      </w:r>
+      <w:r>
+        <w:t xml:space="preserve"> for development and testing</w:t>
+      </w:r>
+      <w:r>
+        <w:t>. The system c</w:t>
       </w:r>
       <w:r>
         <w:t xml:space="preserve">omprises </w:t>
@@ -7406,13 +7383,11 @@
         <w:t>A pre-trained ASR model</w:t>
       </w:r>
       <w:r>
-        <w:t xml:space="preserve"> – </w:t>
-      </w:r>
-      <w:proofErr w:type="spellStart"/>
-      <w:r>
-        <w:t>OpenAi</w:t>
-      </w:r>
-      <w:proofErr w:type="spellEnd"/>
+        <w:t xml:space="preserve"> – OpenA</w:t>
+      </w:r>
+      <w:r>
+        <w:t>I</w:t>
+      </w:r>
       <w:r>
         <w:t xml:space="preserve"> Whisper – faster-whisper-medium</w:t>
       </w:r>
@@ -7474,22 +7449,22 @@
       <w:r>
         <w:t>DeBERTA</w:t>
       </w:r>
+      <w:r>
+        <w:t>a</w:t>
+      </w:r>
       <w:proofErr w:type="spellEnd"/>
+    </w:p>
+    <w:p>
+      <w:pPr>
+        <w:keepNext/>
+        <w:spacing w:line="360" w:lineRule="auto"/>
+      </w:pPr>
+      <w:r>
+        <w:t>The ASR model</w:t>
+      </w:r>
       <w:r>
         <w:t xml:space="preserve"> </w:t>
       </w:r>
-    </w:p>
-    <w:p>
-      <w:pPr>
-        <w:keepNext/>
-        <w:spacing w:line="360" w:lineRule="auto"/>
-      </w:pPr>
-      <w:r>
-        <w:t>The ASR model</w:t>
-      </w:r>
-      <w:r>
-        <w:t xml:space="preserve"> </w:t>
-      </w:r>
       <w:r>
         <w:t>transcribes</w:t>
       </w:r>
@@ -7520,7 +7495,13 @@
         <w:t xml:space="preserve">detects, recognises and represents text from images, as machine-readable text. </w:t>
       </w:r>
       <w:r>
-        <w:t xml:space="preserve">The output from the components is evaluated against the set thresholds for WER and CER and are classified as “pass” or “fail” accordingly. </w:t>
+        <w:t xml:space="preserve">The output from the components is evaluated against the set thresholds for </w:t>
+      </w:r>
+      <w:r>
+        <w:t>average log probability, compression ratio and confidence scores</w:t>
+      </w:r>
+      <w:r>
+        <w:t xml:space="preserve"> and are classified as “pass” or “fail” accordingly. </w:t>
       </w:r>
       <w:proofErr w:type="spellStart"/>
       <w:r>
@@ -7528,14 +7509,17 @@
       </w:r>
       <w:proofErr w:type="spellEnd"/>
       <w:r>
-        <w:t xml:space="preserve"> then analyses, scores, and outputs a holistic score and four (4) trait scores. The routing logic </w:t>
+        <w:t xml:space="preserve"> analyses</w:t>
+      </w:r>
+      <w:r>
+        <w:t xml:space="preserve">, scores, and outputs a holistic score and four (4) trait scores. The routing logic comprises the OCR and ASR output </w:t>
       </w:r>
       <w:r>
         <w:lastRenderedPageBreak/>
-        <w:t xml:space="preserve">comprises the OCR and ASR output evaluators. </w:t>
-      </w:r>
-      <w:r>
-        <w:t xml:space="preserve">Essay’s that have text representations classified as “fail” are routed to the human scorer for marking.  </w:t>
+        <w:t xml:space="preserve">evaluators. </w:t>
+      </w:r>
+      <w:r>
+        <w:t xml:space="preserve">Essays that have text representations classified as “fail” are routed to the human scorer for marking.  </w:t>
       </w:r>
     </w:p>
     <w:p>
@@ -7674,91 +7658,58 @@
         <w:t xml:space="preserve">OCR Evaluator </w:t>
       </w:r>
       <w:r>
-        <w:t>calculates the</w:t>
-      </w:r>
-      <w:r>
-        <w:t xml:space="preserve"> Word Error Rate (</w:t>
-      </w:r>
-      <w:r>
-        <w:t>WER</w:t>
-      </w:r>
-      <w:r>
-        <w:t>)</w:t>
-      </w:r>
-      <w:r>
-        <w:t xml:space="preserve"> and</w:t>
+        <w:t xml:space="preserve">calculates </w:t>
+      </w:r>
+      <w:r>
+        <w:t>the average confidence score for the whole essay</w:t>
+      </w:r>
+      <w:r>
+        <w:t>.</w:t>
       </w:r>
       <w:r>
         <w:t xml:space="preserve"> </w:t>
       </w:r>
       <w:r>
-        <w:t>Character Error Rate (</w:t>
-      </w:r>
-      <w:r>
-        <w:t>CER</w:t>
-      </w:r>
-      <w:r>
-        <w:t>)</w:t>
+        <w:t xml:space="preserve">If </w:t>
+      </w:r>
+      <w:r>
+        <w:t>this score is</w:t>
       </w:r>
       <w:r>
         <w:t xml:space="preserve"> </w:t>
       </w:r>
       <w:r>
-        <w:t>against</w:t>
+        <w:t xml:space="preserve">above </w:t>
+      </w:r>
+      <w:r>
+        <w:t>the</w:t>
+      </w:r>
+      <w:r>
+        <w:t xml:space="preserve"> confidence</w:t>
+      </w:r>
+      <w:r>
+        <w:t xml:space="preserve"> threshold</w:t>
+      </w:r>
+      <w:r>
+        <w:t>, t</w:t>
+      </w:r>
+      <w:r>
+        <w:t>he</w:t>
+      </w:r>
+      <w:r>
+        <w:t>n</w:t>
       </w:r>
       <w:r>
         <w:t xml:space="preserve"> </w:t>
       </w:r>
       <w:r>
-        <w:t xml:space="preserve">the </w:t>
-      </w:r>
-      <w:r>
-        <w:t>ground</w:t>
-      </w:r>
-      <w:r>
-        <w:t>-</w:t>
-      </w:r>
-      <w:r>
-        <w:t>truth</w:t>
-      </w:r>
-      <w:r>
-        <w:t xml:space="preserve"> essay</w:t>
-      </w:r>
-      <w:r>
-        <w:t>.</w:t>
-      </w:r>
-      <w:r>
-        <w:t xml:space="preserve"> </w:t>
-      </w:r>
-      <w:r>
-        <w:t xml:space="preserve">If both the WER and CER </w:t>
-      </w:r>
-      <w:r>
-        <w:t xml:space="preserve">are at or </w:t>
-      </w:r>
-      <w:r>
-        <w:t>below</w:t>
-      </w:r>
-      <w:r>
-        <w:t xml:space="preserve"> </w:t>
-      </w:r>
-      <w:r>
-        <w:t>their respective</w:t>
-      </w:r>
-      <w:r>
-        <w:t xml:space="preserve"> threshold</w:t>
-      </w:r>
-      <w:r>
-        <w:t>s</w:t>
-      </w:r>
-      <w:r>
-        <w:t>, t</w:t>
-      </w:r>
-      <w:r>
-        <w:t xml:space="preserve">he </w:t>
-      </w:r>
-      <w:r>
-        <w:t>essay is routed to</w:t>
+        <w:t xml:space="preserve">essay is </w:t>
+      </w:r>
+      <w:r>
+        <w:t xml:space="preserve">classified as “pass” and </w:t>
+      </w:r>
+      <w:r>
+        <w:t>routed to</w:t>
       </w:r>
       <w:r>
         <w:t xml:space="preserve"> the transformer</w:t>
@@ -7770,22 +7721,25 @@
         <w:t xml:space="preserve">Otherwise, </w:t>
       </w:r>
       <w:r>
-        <w:t xml:space="preserve">the essay is routed to the human scorer. </w:t>
-      </w:r>
-    </w:p>
-    <w:p>
-      <w:pPr>
-        <w:spacing w:line="360" w:lineRule="auto"/>
-      </w:pPr>
-      <w:r>
-        <w:rPr>
-          <w:noProof/>
-        </w:rPr>
+        <w:t xml:space="preserve">the essay is </w:t>
+      </w:r>
+      <w:r>
+        <w:t xml:space="preserve">classified as “fail” and </w:t>
+      </w:r>
+      <w:r>
+        <w:t xml:space="preserve">routed to the human scorer. </w:t>
+      </w:r>
+    </w:p>
+    <w:p>
+      <w:pPr>
+        <w:spacing w:line="360" w:lineRule="auto"/>
+      </w:pPr>
+      <w:r>
         <w:drawing>
-          <wp:inline distT="0" distB="0" distL="0" distR="0" wp14:anchorId="49FF87E0" wp14:editId="1C21CDF6">
-            <wp:extent cx="5731510" cy="3982085"/>
+          <wp:inline distT="0" distB="0" distL="0" distR="0" wp14:anchorId="2ED3E982" wp14:editId="0B429262">
+            <wp:extent cx="5731510" cy="3907790"/>
             <wp:effectExtent l="0" t="0" r="2540" b="0"/>
-            <wp:docPr id="296729627" name="Picture 1"/>
+            <wp:docPr id="1166837266" name="Picture 1"/>
             <wp:cNvGraphicFramePr>
               <a:graphicFrameLocks xmlns:a="http://schemas.openxmlformats.org/drawingml/2006/main" noChangeAspect="1"/>
             </wp:cNvGraphicFramePr>
@@ -7793,7 +7747,7 @@
               <a:graphicData uri="http://schemas.openxmlformats.org/drawingml/2006/picture">
                 <pic:pic xmlns:pic="http://schemas.openxmlformats.org/drawingml/2006/picture">
                   <pic:nvPicPr>
-                    <pic:cNvPr id="296729627" name=""/>
+                    <pic:cNvPr id="1166837266" name=""/>
                     <pic:cNvPicPr/>
                   </pic:nvPicPr>
                   <pic:blipFill>
@@ -7805,7 +7759,7 @@
                   <pic:spPr>
                     <a:xfrm>
                       <a:off x="0" y="0"/>
-                      <a:ext cx="5731510" cy="3982085"/>
+                      <a:ext cx="5731510" cy="3907790"/>
                     </a:xfrm>
                     <a:prstGeom prst="rect">
                       <a:avLst/>
@@ -7891,56 +7845,91 @@
       <w:r>
         <w:t xml:space="preserve">interface. </w:t>
       </w:r>
+      <w:r>
+        <w:t xml:space="preserve">Whisper then transcribes the audio </w:t>
+      </w:r>
+      <w:r>
+        <w:t xml:space="preserve">outputting </w:t>
+      </w:r>
+      <w:r>
+        <w:t xml:space="preserve">machine-readable text. The ASR Evaluator calculates </w:t>
+      </w:r>
+      <w:r>
+        <w:t>average log probability (</w:t>
+      </w:r>
       <w:proofErr w:type="spellStart"/>
       <w:r>
+        <w:t>avg_logprob</w:t>
+      </w:r>
+      <w:proofErr w:type="spellEnd"/>
+      <w:r>
+        <w:t>) and the compression ratio</w:t>
+      </w:r>
+      <w:r>
+        <w:t>.</w:t>
+      </w:r>
+      <w:r>
+        <w:t xml:space="preserve"> </w:t>
+      </w:r>
+      <w:r>
+        <w:t xml:space="preserve">If </w:t>
+      </w:r>
+      <w:r>
+        <w:t>either the log probability drops too low (indicating low confidence) or the compression ratio is too high (indicating the model is hallucinating)</w:t>
+      </w:r>
+      <w:r>
+        <w:t xml:space="preserve">, then essay is </w:t>
+      </w:r>
+      <w:r>
+        <w:t xml:space="preserve">classified as “fail” and </w:t>
+      </w:r>
+      <w:r>
+        <w:t xml:space="preserve">routed to the </w:t>
+      </w:r>
+      <w:r>
+        <w:t>human scorer</w:t>
+      </w:r>
+      <w:r>
+        <w:t xml:space="preserve">. Otherwise, the essay is </w:t>
+      </w:r>
+      <w:r>
+        <w:t xml:space="preserve">classified as “pass” and </w:t>
+      </w:r>
+      <w:r>
+        <w:t xml:space="preserve">routed to the </w:t>
+      </w:r>
+      <w:r>
+        <w:t>transformer for scoring</w:t>
+      </w:r>
+      <w:r>
+        <w:t xml:space="preserve">. </w:t>
+      </w:r>
+    </w:p>
+    <w:p>
+      <w:pPr>
+        <w:spacing w:line="360" w:lineRule="auto"/>
+      </w:pPr>
+      <w:r>
+        <w:t>.</w:t>
+      </w:r>
+    </w:p>
+    <w:p>
+      <w:pPr>
         <w:rPr>
           <w:b/>
           <w:bCs/>
         </w:rPr>
-        <w:t>L</w:t>
-      </w:r>
+      </w:pPr>
       <w:r>
         <w:rPr>
           <w:b/>
           <w:bCs/>
         </w:rPr>
-        <w:t>ibrosa</w:t>
-      </w:r>
-      <w:proofErr w:type="spellEnd"/>
-      <w:r>
-        <w:t xml:space="preserve"> interprets the audio signal </w:t>
-      </w:r>
-      <w:r>
-        <w:t>and represents it as</w:t>
-      </w:r>
-      <w:r>
-        <w:t xml:space="preserve"> a</w:t>
-      </w:r>
-      <w:r>
-        <w:t xml:space="preserve"> vector of numerical values. </w:t>
-      </w:r>
-      <w:r>
-        <w:t>Whisper then transcribes the audio signal and represents the signal as machine-readable text. The ASR Evaluator calculates the Word Error Rate (WER) and Character Error Rate (CER) against the ground-truth essay. If both the WER and CER are at or below their respective thresholds, the essay is routed to the transformer for scoring. Otherwise, the essay is routed to the human scorer.</w:t>
-      </w:r>
-    </w:p>
-    <w:p>
-      <w:pPr>
-        <w:rPr>
-          <w:b/>
-          <w:bCs/>
-        </w:rPr>
-      </w:pPr>
-      <w:r>
-        <w:rPr>
-          <w:b/>
-          <w:bCs/>
-          <w:noProof/>
-        </w:rPr>
         <w:drawing>
-          <wp:inline distT="0" distB="0" distL="0" distR="0" wp14:anchorId="4FB69642" wp14:editId="57C43814">
-            <wp:extent cx="5731510" cy="5041265"/>
-            <wp:effectExtent l="0" t="0" r="2540" b="6985"/>
-            <wp:docPr id="1005222396" name="Picture 1"/>
+          <wp:inline distT="0" distB="0" distL="0" distR="0" wp14:anchorId="1C11B0C2" wp14:editId="083C60CA">
+            <wp:extent cx="5731510" cy="5133975"/>
+            <wp:effectExtent l="0" t="0" r="2540" b="9525"/>
+            <wp:docPr id="247710868" name="Picture 1"/>
             <wp:cNvGraphicFramePr>
               <a:graphicFrameLocks xmlns:a="http://schemas.openxmlformats.org/drawingml/2006/main" noChangeAspect="1"/>
             </wp:cNvGraphicFramePr>
@@ -7948,7 +7937,7 @@
               <a:graphicData uri="http://schemas.openxmlformats.org/drawingml/2006/picture">
                 <pic:pic xmlns:pic="http://schemas.openxmlformats.org/drawingml/2006/picture">
                   <pic:nvPicPr>
-                    <pic:cNvPr id="1005222396" name=""/>
+                    <pic:cNvPr id="247710868" name=""/>
                     <pic:cNvPicPr/>
                   </pic:nvPicPr>
                   <pic:blipFill>
@@ -7960,7 +7949,7 @@
                   <pic:spPr>
                     <a:xfrm>
                       <a:off x="0" y="0"/>
-                      <a:ext cx="5731510" cy="5041265"/>
+                      <a:ext cx="5731510" cy="5133975"/>
                     </a:xfrm>
                     <a:prstGeom prst="rect">
                       <a:avLst/>
@@ -8042,28 +8031,28 @@
         <w:t xml:space="preserve"> evaluation</w:t>
       </w:r>
       <w:r>
-        <w:t xml:space="preserve"> and scoring. The model processes the text, evaluates and scores the essay. The Transformer Output Evaluator, then calculates the QWK. If the QWK is wit</w:t>
-      </w:r>
-      <w:r>
-        <w:t>h</w:t>
-      </w:r>
-      <w:r>
-        <w:t xml:space="preserve">in the acceptable range, the scores are displayed to the user via the web interface. If not, the essay is routed to the human scorer for evaluation and scoring. </w:t>
-      </w:r>
-    </w:p>
-    <w:p>
-      <w:pPr>
-        <w:spacing w:line="360" w:lineRule="auto"/>
-      </w:pPr>
-      <w:r>
-        <w:rPr>
-          <w:noProof/>
-        </w:rPr>
+        <w:t xml:space="preserve"> and scoring. The model processes the text, evaluates and scores the essay. The Transformer </w:t>
+      </w:r>
+      <w:r>
+        <w:t xml:space="preserve">scores the essay, the scores and other relevant data </w:t>
+      </w:r>
+      <w:r>
+        <w:t>are</w:t>
+      </w:r>
+      <w:r>
+        <w:t xml:space="preserve"> saved to the database and finally, the trait and holistic scores are displayed to user via the web interface.</w:t>
+      </w:r>
+    </w:p>
+    <w:p>
+      <w:pPr>
+        <w:spacing w:line="360" w:lineRule="auto"/>
+      </w:pPr>
+      <w:r>
         <w:drawing>
-          <wp:inline distT="0" distB="0" distL="0" distR="0" wp14:anchorId="6CBDA20C" wp14:editId="2AF85821">
-            <wp:extent cx="5731510" cy="3592830"/>
-            <wp:effectExtent l="0" t="0" r="2540" b="7620"/>
-            <wp:docPr id="914435399" name="Picture 1"/>
+          <wp:inline distT="0" distB="0" distL="0" distR="0" wp14:anchorId="1E00A21A" wp14:editId="19578C40">
+            <wp:extent cx="5382376" cy="5715798"/>
+            <wp:effectExtent l="0" t="0" r="8890" b="0"/>
+            <wp:docPr id="1749053419" name="Picture 1"/>
             <wp:cNvGraphicFramePr>
               <a:graphicFrameLocks xmlns:a="http://schemas.openxmlformats.org/drawingml/2006/main" noChangeAspect="1"/>
             </wp:cNvGraphicFramePr>
@@ -8071,7 +8060,7 @@
               <a:graphicData uri="http://schemas.openxmlformats.org/drawingml/2006/picture">
                 <pic:pic xmlns:pic="http://schemas.openxmlformats.org/drawingml/2006/picture">
                   <pic:nvPicPr>
-                    <pic:cNvPr id="914435399" name=""/>
+                    <pic:cNvPr id="1749053419" name=""/>
                     <pic:cNvPicPr/>
                   </pic:nvPicPr>
                   <pic:blipFill>
@@ -8083,7 +8072,7 @@
                   <pic:spPr>
                     <a:xfrm>
                       <a:off x="0" y="0"/>
-                      <a:ext cx="5731510" cy="3592830"/>
+                      <a:ext cx="5382376" cy="5715798"/>
                     </a:xfrm>
                     <a:prstGeom prst="rect">
                       <a:avLst/>
@@ -8115,7 +8104,13 @@
       </w:pPr>
       <w:r>
         <w:lastRenderedPageBreak/>
-        <w:t xml:space="preserve">3.4 </w:t>
+        <w:t>3.</w:t>
+      </w:r>
+      <w:r>
+        <w:t>3</w:t>
+      </w:r>
+      <w:r>
+        <w:t xml:space="preserve"> </w:t>
       </w:r>
       <w:r>
         <w:t>Component Selection</w:t>
@@ -8260,7 +8255,10 @@
         <w:t>D</w:t>
       </w:r>
       <w:r>
-        <w:t>eBERTA</w:t>
+        <w:t>eBERT</w:t>
+      </w:r>
+      <w:r>
+        <w:t>a</w:t>
       </w:r>
       <w:proofErr w:type="spellEnd"/>
       <w:r>
@@ -8369,7 +8367,10 @@
       </w:r>
       <w:proofErr w:type="spellStart"/>
       <w:r>
-        <w:t>paddleOCR</w:t>
+        <w:t>P</w:t>
+      </w:r>
+      <w:r>
+        <w:t>addleOCR</w:t>
       </w:r>
       <w:proofErr w:type="spellEnd"/>
       <w:r>
@@ -8403,7 +8404,13 @@
       </w:r>
       <w:proofErr w:type="spellStart"/>
       <w:r>
-        <w:t>PaddlOCR</w:t>
+        <w:t>Padd</w:t>
+      </w:r>
+      <w:r>
+        <w:t>e</w:t>
+      </w:r>
+      <w:r>
+        <w:t>lOCR</w:t>
       </w:r>
       <w:proofErr w:type="spellEnd"/>
       <w:r>
@@ -8588,7 +8595,7 @@
         <w:t>3.</w:t>
       </w:r>
       <w:r>
-        <w:t>5</w:t>
+        <w:t>4</w:t>
       </w:r>
       <w:r>
         <w:t xml:space="preserve"> </w:t>
@@ -8625,7 +8632,13 @@
         <w:t xml:space="preserve">. </w:t>
       </w:r>
       <w:r>
-        <w:t xml:space="preserve">The user interacts with the system via web browser. </w:t>
+        <w:t xml:space="preserve">The user interacts with the system via </w:t>
+      </w:r>
+      <w:r>
+        <w:t xml:space="preserve">a </w:t>
+      </w:r>
+      <w:r>
+        <w:t xml:space="preserve">web browser. </w:t>
       </w:r>
     </w:p>
     <w:p>
@@ -8718,14 +8731,30 @@
     </w:p>
     <w:p>
       <w:pPr>
-        <w:spacing w:line="360" w:lineRule="auto"/>
-      </w:pPr>
-      <w:r>
         <w:rPr>
           <w:b/>
           <w:bCs/>
         </w:rPr>
-        <w:t>Sections</w:t>
+      </w:pPr>
+      <w:r>
+        <w:rPr>
+          <w:b/>
+          <w:bCs/>
+        </w:rPr>
+        <w:br w:type="page"/>
+      </w:r>
+    </w:p>
+    <w:p>
+      <w:pPr>
+        <w:spacing w:line="360" w:lineRule="auto"/>
+      </w:pPr>
+      <w:r>
+        <w:rPr>
+          <w:b/>
+          <w:bCs/>
+        </w:rPr>
+        <w:lastRenderedPageBreak/>
+        <w:t>Components of the User Interface</w:t>
       </w:r>
       <w:r>
         <w:t>:</w:t>
@@ -8802,11 +8831,7 @@
         <w:t xml:space="preserve">. </w:t>
       </w:r>
       <w:r>
-        <w:t xml:space="preserve">The user is required to click </w:t>
-      </w:r>
-      <w:r>
-        <w:lastRenderedPageBreak/>
-        <w:t>the upload button to submit an essay and initiate the evaluation and scoring process.</w:t>
+        <w:t>The user is required to click the upload button to submit an essay and initiate the evaluation and scoring process.</w:t>
       </w:r>
     </w:p>
     <w:p>
@@ -8899,7 +8924,7 @@
         <w:t>3.</w:t>
       </w:r>
       <w:r>
-        <w:t>6</w:t>
+        <w:t>5</w:t>
       </w:r>
       <w:r>
         <w:t xml:space="preserve"> Scope</w:t>
@@ -9122,7 +9147,13 @@
         <w:t>Database</w:t>
       </w:r>
       <w:r>
-        <w:t xml:space="preserve"> – Sqlite3</w:t>
+        <w:t xml:space="preserve"> – S</w:t>
+      </w:r>
+      <w:r>
+        <w:t>QL</w:t>
+      </w:r>
+      <w:r>
+        <w:t>ite3</w:t>
       </w:r>
     </w:p>
     <w:p>
@@ -9203,7 +9234,13 @@
         <w:spacing w:line="360" w:lineRule="auto"/>
       </w:pPr>
       <w:r>
-        <w:t xml:space="preserve">(scene text) Essays with visual prompts/visual content such a scene along with a prompt requiring students to write about the scene. </w:t>
+        <w:t>(scene text) Essays with visual prompts/visual content such a</w:t>
+      </w:r>
+      <w:r>
+        <w:t>s a</w:t>
+      </w:r>
+      <w:r>
+        <w:t xml:space="preserve"> scene along with a prompt requiring students to write about the scene. </w:t>
       </w:r>
     </w:p>
     <w:p>

</xml_diff>

<commit_message>
Completed 4.6 Evaluation/Routing Logic
</commit_message>
<xml_diff>
--- a/final report/Final Report.docx
+++ b/final report/Final Report.docx
@@ -6608,7 +6608,14 @@
         <w:spacing w:line="360" w:lineRule="auto"/>
       </w:pPr>
       <w:r>
-        <w:t>Computational complexity: orchestrating three pretrained models requires a lot of processing power and storage space.</w:t>
+        <w:rPr>
+          <w:b/>
+          <w:bCs/>
+        </w:rPr>
+        <w:t>Computational complexity</w:t>
+      </w:r>
+      <w:r>
+        <w:t>: orchestrating three pretrained models requires a lot of processing power and storage space.</w:t>
       </w:r>
     </w:p>
     <w:p>
@@ -6620,7 +6627,14 @@
         <w:spacing w:line="360" w:lineRule="auto"/>
       </w:pPr>
       <w:r>
-        <w:t>Error propagation: It is likely that mistakes from either the audio transcription done by the ASR or from recognition and digitization by the OCR will flow as input to the AES system core. If errors in the input data are not detected and handled correctly, they will propagate and reduce the core component's accuracy and reliability, resulting in inaccurate essay scores.</w:t>
+        <w:rPr>
+          <w:b/>
+          <w:bCs/>
+        </w:rPr>
+        <w:t>Error propagation</w:t>
+      </w:r>
+      <w:r>
+        <w:t>: It is likely that mistakes from either the audio transcription done by the ASR or from recognition and digitization by the OCR will flow as input to the AES system core. If errors in the input data are not detected and handled correctly, they will propagate and reduce the core component's accuracy and reliability, resulting in inaccurate essay scores.</w:t>
       </w:r>
     </w:p>
     <w:p>
@@ -6632,7 +6646,14 @@
         <w:spacing w:line="360" w:lineRule="auto"/>
       </w:pPr>
       <w:r>
-        <w:t>Modality imbalance: Typed essays may score higher than handwritten or audio-transcribed essays due to noise introduced by OCR or the accent or dialect of the speaker for example.</w:t>
+        <w:rPr>
+          <w:b/>
+          <w:bCs/>
+        </w:rPr>
+        <w:t>Modality imbalance</w:t>
+      </w:r>
+      <w:r>
+        <w:t>: Typed essays may score higher than handwritten or audio-transcribed essays due to noise introduced by OCR or the accent or dialect of the speaker for example.</w:t>
       </w:r>
     </w:p>
     <w:p>
@@ -6644,7 +6665,14 @@
         <w:spacing w:line="360" w:lineRule="auto"/>
       </w:pPr>
       <w:r>
-        <w:t>Data Bias: The pre-trained models are inherently biased towards the data they were trained on.</w:t>
+        <w:rPr>
+          <w:b/>
+          <w:bCs/>
+        </w:rPr>
+        <w:t>Data Bias</w:t>
+      </w:r>
+      <w:r>
+        <w:t>: The pre-trained models are inherently biased towards the data they were trained on.</w:t>
       </w:r>
     </w:p>
     <w:p>
@@ -7147,7 +7175,10 @@
       </w:r>
       <w:proofErr w:type="spellStart"/>
       <w:r>
-        <w:t>deBERTa</w:t>
+        <w:t>D</w:t>
+      </w:r>
+      <w:r>
+        <w:t>eBERTa</w:t>
       </w:r>
       <w:proofErr w:type="spellEnd"/>
       <w:r>
@@ -7259,7 +7290,19 @@
       </w:r>
       <w:bookmarkEnd w:id="15"/>
     </w:p>
-    <w:p/>
+    <w:p>
+      <w:pPr>
+        <w:rPr>
+          <w:color w:val="EE0000"/>
+        </w:rPr>
+      </w:pPr>
+      <w:r>
+        <w:rPr>
+          <w:color w:val="EE0000"/>
+        </w:rPr>
+        <w:t>Fix this use for production architecture, not accurate for live system</w:t>
+      </w:r>
+    </w:p>
     <w:p>
       <w:pPr>
         <w:pStyle w:val="Caption"/>
@@ -8025,7 +8068,10 @@
       </w:r>
       <w:proofErr w:type="spellStart"/>
       <w:r>
-        <w:t>deBERTa</w:t>
+        <w:t>D</w:t>
+      </w:r>
+      <w:r>
+        <w:t>eBERTa</w:t>
       </w:r>
       <w:proofErr w:type="spellEnd"/>
       <w:r>
@@ -8889,7 +8935,10 @@
       </w:r>
       <w:proofErr w:type="spellStart"/>
       <w:r>
-        <w:t>deBERTa’s</w:t>
+        <w:t>D</w:t>
+      </w:r>
+      <w:r>
+        <w:t>eBERTa’s</w:t>
       </w:r>
       <w:proofErr w:type="spellEnd"/>
       <w:r>
@@ -9574,14 +9623,6 @@
     <w:p>
       <w:pPr>
         <w:spacing w:line="360" w:lineRule="auto"/>
-        <w:sectPr>
-          <w:footerReference w:type="default" r:id="rId14"/>
-          <w:pgSz w:w="11906" w:h="16838"/>
-          <w:pgMar w:top="1440" w:right="1440" w:bottom="1440" w:left="1440" w:header="708" w:footer="708" w:gutter="0"/>
-          <w:cols w:space="708"/>
-          <w:titlePg/>
-          <w:docGrid w:linePitch="360"/>
-        </w:sectPr>
       </w:pPr>
       <w:r>
         <w:t xml:space="preserve">This class encapsulates </w:t>
@@ -9696,27 +9737,57 @@
         <w:t xml:space="preserve"> </w:t>
       </w:r>
       <w:r>
-        <w:t xml:space="preserve">object allowing for the calculation on the batch. </w:t>
-      </w:r>
-    </w:p>
-    <w:p>
-      <w:pPr>
-        <w:spacing w:line="360" w:lineRule="auto"/>
-        <w:sectPr>
-          <w:pgSz w:w="11906" w:h="16838"/>
-          <w:pgMar w:top="1440" w:right="1440" w:bottom="1440" w:left="1440" w:header="708" w:footer="708" w:gutter="0"/>
-          <w:cols w:space="708"/>
-          <w:titlePg/>
-          <w:docGrid w:linePitch="360"/>
-        </w:sectPr>
-      </w:pPr>
+        <w:t>object allowing for the calculation on the batch</w:t>
+      </w:r>
+      <w:r>
+        <w:t>.</w:t>
+      </w:r>
+      <w:bookmarkStart w:id="21" w:name="_Toc238719418"/>
+    </w:p>
+    <w:p>
+      <w:pPr>
+        <w:spacing w:line="360" w:lineRule="auto"/>
+      </w:pPr>
+      <w:r>
+        <w:rPr>
+          <w:color w:val="EE0000"/>
+        </w:rPr>
+        <w:t xml:space="preserve">Requires some talk of </w:t>
+      </w:r>
+      <w:proofErr w:type="spellStart"/>
+      <w:r>
+        <w:rPr>
+          <w:color w:val="EE0000"/>
+        </w:rPr>
+        <w:t>DeBERTa</w:t>
+      </w:r>
+      <w:proofErr w:type="spellEnd"/>
+      <w:r>
+        <w:rPr>
+          <w:color w:val="EE0000"/>
+        </w:rPr>
+        <w:t xml:space="preserve"> after it has been implemented</w:t>
+      </w:r>
+      <w:r>
+        <w:t xml:space="preserve">. </w:t>
+      </w:r>
+    </w:p>
+    <w:p>
+      <w:r>
+        <w:br w:type="page"/>
+      </w:r>
     </w:p>
     <w:p>
       <w:pPr>
         <w:pStyle w:val="Heading1"/>
         <w:jc w:val="center"/>
       </w:pPr>
-      <w:bookmarkStart w:id="21" w:name="_Toc238719418"/>
+    </w:p>
+    <w:p>
+      <w:pPr>
+        <w:pStyle w:val="Heading1"/>
+        <w:jc w:val="center"/>
+      </w:pPr>
     </w:p>
     <w:p>
       <w:pPr>
@@ -10050,7 +10121,7 @@
       </w:r>
       <w:proofErr w:type="spellStart"/>
       <w:r>
-        <w:t>deBERTa</w:t>
+        <w:t>DeBERTa</w:t>
       </w:r>
       <w:proofErr w:type="spellEnd"/>
     </w:p>
@@ -11577,52 +11648,291 @@
     </w:p>
     <w:p/>
     <w:p>
-      <w:r>
-        <w:t>This is probably worth its own subsection.</w:t>
-      </w:r>
-    </w:p>
-    <w:p>
-      <w:r>
-        <w:t>Explain the mechanism:</w:t>
-      </w:r>
-    </w:p>
-    <w:p>
-      <w:r>
-        <w:t>OCR/ASR → WER/CER → threshold → automated scoring OR human scoring</w:t>
-      </w:r>
-    </w:p>
-    <w:p>
-      <w:r>
-        <w:t>This is one of the more interesting aspects of your system technically.</w:t>
-      </w:r>
-    </w:p>
-    <w:p>
-      <w:r>
-        <w:t>You can explain the actual code here.</w:t>
-      </w:r>
-    </w:p>
-    <w:p>
-      <w:r>
-        <w:t xml:space="preserve">Then </w:t>
-      </w:r>
-      <w:r>
-        <w:rPr>
-          <w:b/>
-          <w:bCs/>
-        </w:rPr>
-        <w:t xml:space="preserve">Chapter 5 evaluates whether that mechanism </w:t>
-      </w:r>
-      <w:proofErr w:type="gramStart"/>
-      <w:r>
-        <w:rPr>
-          <w:b/>
-          <w:bCs/>
-        </w:rPr>
-        <w:t>actually worked</w:t>
-      </w:r>
-      <w:proofErr w:type="gramEnd"/>
+      <w:pPr>
+        <w:spacing w:line="360" w:lineRule="auto"/>
+      </w:pPr>
+      <w:r>
+        <w:t xml:space="preserve">Evaluation of ASR and OCR </w:t>
+      </w:r>
+      <w:r>
+        <w:t xml:space="preserve">component </w:t>
+      </w:r>
+      <w:r>
+        <w:t xml:space="preserve">output was a two-step process. First, the global </w:t>
+      </w:r>
+      <w:proofErr w:type="spellStart"/>
+      <w:r>
+        <w:rPr>
+          <w:b/>
+          <w:bCs/>
+        </w:rPr>
+        <w:t>calculate_error_rates</w:t>
+      </w:r>
+      <w:proofErr w:type="spellEnd"/>
+      <w:r>
+        <w:t xml:space="preserve"> function was invoked</w:t>
+      </w:r>
+      <w:r>
+        <w:t xml:space="preserve">, passing </w:t>
+      </w:r>
+      <w:r>
+        <w:t xml:space="preserve">the reference </w:t>
+      </w:r>
+      <w:r>
+        <w:t>and normalised</w:t>
+      </w:r>
+      <w:r>
+        <w:t xml:space="preserve"> essay</w:t>
+      </w:r>
+      <w:r>
+        <w:t>s</w:t>
+      </w:r>
+      <w:r>
+        <w:t xml:space="preserve"> (ASR/OCR output) as arguments. Th</w:t>
+      </w:r>
+      <w:r>
+        <w:t xml:space="preserve">is function then called </w:t>
+      </w:r>
+      <w:r>
+        <w:t xml:space="preserve">both the </w:t>
+      </w:r>
+      <w:proofErr w:type="spellStart"/>
+      <w:r>
+        <w:rPr>
+          <w:b/>
+          <w:bCs/>
+        </w:rPr>
+        <w:t>wer</w:t>
+      </w:r>
+      <w:proofErr w:type="spellEnd"/>
+      <w:r>
+        <w:t xml:space="preserve"> and </w:t>
+      </w:r>
+      <w:proofErr w:type="spellStart"/>
+      <w:r>
+        <w:rPr>
+          <w:b/>
+          <w:bCs/>
+        </w:rPr>
+        <w:t>cer</w:t>
+      </w:r>
+      <w:proofErr w:type="spellEnd"/>
+      <w:r>
+        <w:rPr>
+          <w:b/>
+          <w:bCs/>
+        </w:rPr>
+        <w:t xml:space="preserve"> </w:t>
+      </w:r>
+      <w:r>
+        <w:t xml:space="preserve">functions </w:t>
+      </w:r>
+      <w:r>
+        <w:t>from</w:t>
+      </w:r>
+      <w:r>
+        <w:t xml:space="preserve"> the </w:t>
+      </w:r>
+      <w:proofErr w:type="spellStart"/>
+      <w:r>
+        <w:rPr>
+          <w:b/>
+          <w:bCs/>
+        </w:rPr>
+        <w:t>jiwer</w:t>
+      </w:r>
+      <w:proofErr w:type="spellEnd"/>
+      <w:r>
+        <w:t xml:space="preserve"> </w:t>
+      </w:r>
+      <w:r>
+        <w:t>module</w:t>
+      </w:r>
+      <w:r>
+        <w:t xml:space="preserve">, </w:t>
+      </w:r>
+      <w:r>
+        <w:t xml:space="preserve">to calculate the word error rate and character error rate, respectively. </w:t>
+      </w:r>
+      <w:r>
+        <w:t xml:space="preserve">The </w:t>
+      </w:r>
+      <w:proofErr w:type="spellStart"/>
+      <w:r>
+        <w:rPr>
+          <w:b/>
+          <w:bCs/>
+        </w:rPr>
+        <w:t>calculate_error_rates</w:t>
+      </w:r>
+      <w:proofErr w:type="spellEnd"/>
+      <w:r>
+        <w:t xml:space="preserve"> </w:t>
+      </w:r>
+      <w:r>
+        <w:t>function then</w:t>
+      </w:r>
+      <w:r>
+        <w:t xml:space="preserve"> returns a dictionary with two key-value pairs – “</w:t>
+      </w:r>
+      <w:proofErr w:type="spellStart"/>
+      <w:r>
+        <w:t>wer</w:t>
+      </w:r>
+      <w:proofErr w:type="spellEnd"/>
+      <w:r>
+        <w:t xml:space="preserve">” </w:t>
+      </w:r>
+      <w:r>
+        <w:t>mapped to the calculated word error rate, and “</w:t>
+      </w:r>
+      <w:proofErr w:type="spellStart"/>
+      <w:r>
+        <w:t>cer</w:t>
+      </w:r>
+      <w:proofErr w:type="spellEnd"/>
+      <w:r>
+        <w:t>” mapped to the calculated character error rate.</w:t>
+      </w:r>
+      <w:r>
+        <w:t xml:space="preserve"> </w:t>
+      </w:r>
+    </w:p>
+    <w:p>
+      <w:pPr>
+        <w:spacing w:line="360" w:lineRule="auto"/>
+      </w:pPr>
+      <w:r>
+        <w:t xml:space="preserve">Secondly, </w:t>
+      </w:r>
+      <w:r>
+        <w:t>a logical test</w:t>
+      </w:r>
+      <w:r>
+        <w:t xml:space="preserve"> was</w:t>
+      </w:r>
+      <w:r>
+        <w:t xml:space="preserve"> </w:t>
+      </w:r>
+      <w:r>
+        <w:t>performed</w:t>
+      </w:r>
+      <w:r>
+        <w:t xml:space="preserve"> to </w:t>
+      </w:r>
+      <w:r>
+        <w:t xml:space="preserve">evaluate these metrics against the predefined system thresholds. The </w:t>
+      </w:r>
+      <w:proofErr w:type="spellStart"/>
+      <w:r>
+        <w:rPr>
+          <w:b/>
+          <w:bCs/>
+        </w:rPr>
+        <w:t>evaluation_status</w:t>
+      </w:r>
+      <w:proofErr w:type="spellEnd"/>
+      <w:r>
+        <w:t xml:space="preserve"> variable was assigned the classification of “pass” if both the WER and CER values were equal to or </w:t>
+      </w:r>
+      <w:r>
+        <w:t xml:space="preserve">less than their respective thresholds, and “fail” otherwise. The classification </w:t>
+      </w:r>
+      <w:r>
+        <w:t>was</w:t>
+      </w:r>
+      <w:r>
+        <w:t xml:space="preserve"> stored </w:t>
+      </w:r>
+      <w:r>
+        <w:t xml:space="preserve">under </w:t>
+      </w:r>
+      <w:r>
+        <w:t>the key</w:t>
+      </w:r>
+      <w:r>
+        <w:t xml:space="preserve"> </w:t>
+      </w:r>
+      <w:r>
+        <w:t xml:space="preserve">“Evaluation </w:t>
+      </w:r>
+      <w:r>
+        <w:t>Status” in</w:t>
+      </w:r>
+      <w:r>
+        <w:t xml:space="preserve"> the </w:t>
+      </w:r>
+      <w:r>
+        <w:rPr>
+          <w:b/>
+          <w:bCs/>
+        </w:rPr>
+        <w:t>details</w:t>
+      </w:r>
+      <w:r>
+        <w:t xml:space="preserve"> dictionary for every </w:t>
+      </w:r>
+      <w:r>
+        <w:t>processed file</w:t>
+      </w:r>
+      <w:r>
+        <w:t xml:space="preserve">, </w:t>
+      </w:r>
+      <w:r>
+        <w:t>which was</w:t>
+      </w:r>
+      <w:r>
+        <w:t xml:space="preserve"> subsequently appended to the batch object</w:t>
+      </w:r>
+      <w:r>
+        <w:t>’s</w:t>
+      </w:r>
+      <w:r>
+        <w:t xml:space="preserve"> </w:t>
+      </w:r>
+      <w:proofErr w:type="spellStart"/>
+      <w:r>
+        <w:rPr>
+          <w:b/>
+          <w:bCs/>
+        </w:rPr>
+        <w:t>detail_list</w:t>
+      </w:r>
+      <w:proofErr w:type="spellEnd"/>
       <w:r>
         <w:t>.</w:t>
+      </w:r>
+      <w:r>
+        <w:t xml:space="preserve"> </w:t>
+      </w:r>
+      <w:r>
+        <w:t>Ultimately, this</w:t>
+      </w:r>
+      <w:r>
+        <w:t xml:space="preserve"> evaluation</w:t>
+      </w:r>
+      <w:r>
+        <w:t xml:space="preserve"> </w:t>
+      </w:r>
+      <w:r>
+        <w:t xml:space="preserve">status </w:t>
+      </w:r>
+      <w:r>
+        <w:t>dictated the routing of the</w:t>
+      </w:r>
+      <w:r>
+        <w:t xml:space="preserve"> essay</w:t>
+      </w:r>
+      <w:r>
+        <w:t xml:space="preserve">: outputs classified as “fail” were routed to human scorer for manual grading, while those classified as “pass” were forwarded to </w:t>
+      </w:r>
+      <w:proofErr w:type="spellStart"/>
+      <w:r>
+        <w:t>DeBERTa</w:t>
+      </w:r>
+      <w:proofErr w:type="spellEnd"/>
+      <w:r>
+        <w:t xml:space="preserve"> for automated evaluation. </w:t>
       </w:r>
     </w:p>
     <w:p/>
@@ -20258,7 +20568,7 @@
                     <pic:cNvPicPr/>
                   </pic:nvPicPr>
                   <pic:blipFill>
-                    <a:blip r:embed="rId15"/>
+                    <a:blip r:embed="rId14"/>
                     <a:stretch>
                       <a:fillRect/>
                     </a:stretch>
@@ -20336,7 +20646,7 @@
                     <pic:cNvPicPr/>
                   </pic:nvPicPr>
                   <pic:blipFill>
-                    <a:blip r:embed="rId16"/>
+                    <a:blip r:embed="rId15"/>
                     <a:stretch>
                       <a:fillRect/>
                     </a:stretch>
@@ -20573,7 +20883,7 @@
                     <pic:cNvPicPr/>
                   </pic:nvPicPr>
                   <pic:blipFill>
-                    <a:blip r:embed="rId17"/>
+                    <a:blip r:embed="rId16"/>
                     <a:stretch>
                       <a:fillRect/>
                     </a:stretch>
@@ -20651,7 +20961,7 @@
                     <pic:cNvPicPr/>
                   </pic:nvPicPr>
                   <pic:blipFill>
-                    <a:blip r:embed="rId18"/>
+                    <a:blip r:embed="rId17"/>
                     <a:stretch>
                       <a:fillRect/>
                     </a:stretch>
@@ -21026,7 +21336,7 @@
                     <pic:cNvPicPr/>
                   </pic:nvPicPr>
                   <pic:blipFill>
-                    <a:blip r:embed="rId19"/>
+                    <a:blip r:embed="rId18"/>
                     <a:stretch>
                       <a:fillRect/>
                     </a:stretch>
@@ -21111,7 +21421,7 @@
                     <pic:cNvPicPr/>
                   </pic:nvPicPr>
                   <pic:blipFill rotWithShape="1">
-                    <a:blip r:embed="rId20"/>
+                    <a:blip r:embed="rId19"/>
                     <a:srcRect r="5389"/>
                     <a:stretch>
                       <a:fillRect/>
@@ -21424,7 +21734,7 @@
                     <pic:cNvPicPr/>
                   </pic:nvPicPr>
                   <pic:blipFill>
-                    <a:blip r:embed="rId21"/>
+                    <a:blip r:embed="rId20"/>
                     <a:stretch>
                       <a:fillRect/>
                     </a:stretch>
@@ -21615,7 +21925,7 @@
                     <pic:cNvPicPr/>
                   </pic:nvPicPr>
                   <pic:blipFill>
-                    <a:blip r:embed="rId22"/>
+                    <a:blip r:embed="rId21"/>
                     <a:stretch>
                       <a:fillRect/>
                     </a:stretch>
@@ -21701,7 +22011,7 @@
                     <pic:cNvPicPr/>
                   </pic:nvPicPr>
                   <pic:blipFill>
-                    <a:blip r:embed="rId23"/>
+                    <a:blip r:embed="rId22"/>
                     <a:stretch>
                       <a:fillRect/>
                     </a:stretch>
@@ -21752,7 +22062,7 @@
                     <pic:cNvPicPr/>
                   </pic:nvPicPr>
                   <pic:blipFill>
-                    <a:blip r:embed="rId24"/>
+                    <a:blip r:embed="rId23"/>
                     <a:stretch>
                       <a:fillRect/>
                     </a:stretch>
@@ -21805,7 +22115,7 @@
                     <pic:cNvPicPr/>
                   </pic:nvPicPr>
                   <pic:blipFill>
-                    <a:blip r:embed="rId25"/>
+                    <a:blip r:embed="rId24"/>
                     <a:stretch>
                       <a:fillRect/>
                     </a:stretch>
@@ -21862,7 +22172,7 @@
                     <pic:cNvPicPr/>
                   </pic:nvPicPr>
                   <pic:blipFill>
-                    <a:blip r:embed="rId26"/>
+                    <a:blip r:embed="rId25"/>
                     <a:stretch>
                       <a:fillRect/>
                     </a:stretch>
@@ -21907,7 +22217,7 @@
                     <pic:cNvPicPr/>
                   </pic:nvPicPr>
                   <pic:blipFill>
-                    <a:blip r:embed="rId27"/>
+                    <a:blip r:embed="rId26"/>
                     <a:stretch>
                       <a:fillRect/>
                     </a:stretch>
@@ -21968,7 +22278,7 @@
                     <pic:cNvPicPr/>
                   </pic:nvPicPr>
                   <pic:blipFill>
-                    <a:blip r:embed="rId28"/>
+                    <a:blip r:embed="rId27"/>
                     <a:stretch>
                       <a:fillRect/>
                     </a:stretch>
@@ -22016,7 +22326,7 @@
       </w:r>
     </w:p>
     <w:sectPr>
-      <w:footerReference w:type="default" r:id="rId29"/>
+      <w:footerReference w:type="default" r:id="rId28"/>
       <w:pgSz w:w="11906" w:h="16838"/>
       <w:pgMar w:top="1440" w:right="1440" w:bottom="1440" w:left="1440" w:header="708" w:footer="708" w:gutter="0"/>
       <w:cols w:space="708"/>
@@ -22120,73 +22430,6 @@
 </file>
 
 <file path=word/footer2.xml><?xml version="1.0" encoding="utf-8"?>
-<w:ftr xmlns:wpc="http://schemas.microsoft.com/office/word/2010/wordprocessingCanvas" xmlns:cx="http://schemas.microsoft.com/office/drawing/2014/chartex" xmlns:cx1="http://schemas.microsoft.com/office/drawing/2015/9/8/chartex" xmlns:cx2="http://schemas.microsoft.com/office/drawing/2015/10/21/chartex" xmlns:cx3="http://schemas.microsoft.com/office/drawing/2016/5/9/chartex" xmlns:cx4="http://schemas.microsoft.com/office/drawing/2016/5/10/chartex" xmlns:cx5="http://schemas.microsoft.com/office/drawing/2016/5/11/chartex" xmlns:cx6="http://schemas.microsoft.com/office/drawing/2016/5/12/chartex" xmlns:cx7="http://schemas.microsoft.com/office/drawing/2016/5/13/chartex" xmlns:cx8="http://schemas.microsoft.com/office/drawing/2016/5/14/chartex" xmlns:mc="http://schemas.openxmlformats.org/markup-compatibility/2006" xmlns:aink="http://schemas.microsoft.com/office/drawing/2016/ink" xmlns:am3d="http://schemas.microsoft.com/office/drawing/2017/model3d" xmlns:o="urn:schemas-microsoft-com:office:office" xmlns:oel="http://schemas.microsoft.com/office/2019/extlst" xmlns:r="http://schemas.openxmlformats.org/officeDocument/2006/relationships" xmlns:m="http://schemas.openxmlformats.org/officeDocument/2006/math" xmlns:v="urn:schemas-microsoft-com:vml" xmlns:wp14="http://schemas.microsoft.com/office/word/2010/wordprocessingDrawing" xmlns:wp="http://schemas.openxmlformats.org/drawingml/2006/wordprocessingDrawing" xmlns:w10="urn:schemas-microsoft-com:office:word" xmlns:w="http://schemas.openxmlformats.org/wordprocessingml/2006/main" xmlns:w14="http://schemas.microsoft.com/office/word/2010/wordml" xmlns:w15="http://schemas.microsoft.com/office/word/2012/wordml" xmlns:w16cex="http://schemas.microsoft.com/office/word/2018/wordml/cex" xmlns:w16cid="http://schemas.microsoft.com/office/word/2016/wordml/cid" xmlns:w16="http://schemas.microsoft.com/office/word/2018/wordml" xmlns:w16du="http://schemas.microsoft.com/office/word/2023/wordml/word16du" xmlns:w16sdtdh="http://schemas.microsoft.com/office/word/2020/wordml/sdtdatahash" xmlns:w16sdtfl="http://schemas.microsoft.com/office/word/2024/wordml/sdtformatlock" xmlns:w16se="http://schemas.microsoft.com/office/word/2015/wordml/symex" xmlns:wpg="http://schemas.microsoft.com/office/word/2010/wordprocessingGroup" xmlns:wpi="http://schemas.microsoft.com/office/word/2010/wordprocessingInk" xmlns:wne="http://schemas.microsoft.com/office/word/2006/wordml" xmlns:wps="http://schemas.microsoft.com/office/word/2010/wordprocessingShape" mc:Ignorable="w14 w15 w16se w16cid w16 w16cex w16sdtdh w16sdtfl w16du wp14">
-  <w:sdt>
-    <w:sdtPr>
-      <w:id w:val="-372226801"/>
-      <w:docPartObj>
-        <w:docPartGallery w:val="Page Numbers (Bottom of Page)"/>
-        <w:docPartUnique/>
-      </w:docPartObj>
-    </w:sdtPr>
-    <w:sdtEndPr>
-      <w:rPr>
-        <w:color w:val="7F7F7F" w:themeColor="background1" w:themeShade="7F"/>
-        <w:spacing w:val="60"/>
-      </w:rPr>
-    </w:sdtEndPr>
-    <w:sdtContent>
-      <w:p>
-        <w:pPr>
-          <w:pStyle w:val="Footer"/>
-          <w:pBdr>
-            <w:top w:val="single" w:sz="4" w:space="1" w:color="D9D9D9" w:themeColor="background1" w:themeShade="D9"/>
-          </w:pBdr>
-          <w:jc w:val="right"/>
-        </w:pPr>
-        <w:r>
-          <w:fldChar w:fldCharType="begin"/>
-        </w:r>
-        <w:r>
-          <w:instrText xml:space="preserve"> PAGE   \* MERGEFORMAT </w:instrText>
-        </w:r>
-        <w:r>
-          <w:fldChar w:fldCharType="separate"/>
-        </w:r>
-        <w:r>
-          <w:rPr>
-            <w:noProof/>
-          </w:rPr>
-          <w:t>2</w:t>
-        </w:r>
-        <w:r>
-          <w:rPr>
-            <w:noProof/>
-          </w:rPr>
-          <w:fldChar w:fldCharType="end"/>
-        </w:r>
-        <w:r>
-          <w:t xml:space="preserve"> | </w:t>
-        </w:r>
-        <w:r>
-          <w:rPr>
-            <w:color w:val="7F7F7F" w:themeColor="background1" w:themeShade="7F"/>
-            <w:spacing w:val="60"/>
-          </w:rPr>
-          <w:t>Page</w:t>
-        </w:r>
-      </w:p>
-    </w:sdtContent>
-  </w:sdt>
-  <w:p>
-    <w:pPr>
-      <w:pStyle w:val="Footer"/>
-    </w:pPr>
-  </w:p>
-</w:ftr>
-</file>
-
-<file path=word/footer3.xml><?xml version="1.0" encoding="utf-8"?>
 <w:ftr xmlns:wpc="http://schemas.microsoft.com/office/word/2010/wordprocessingCanvas" xmlns:cx="http://schemas.microsoft.com/office/drawing/2014/chartex" xmlns:cx1="http://schemas.microsoft.com/office/drawing/2015/9/8/chartex" xmlns:cx2="http://schemas.microsoft.com/office/drawing/2015/10/21/chartex" xmlns:cx3="http://schemas.microsoft.com/office/drawing/2016/5/9/chartex" xmlns:cx4="http://schemas.microsoft.com/office/drawing/2016/5/10/chartex" xmlns:cx5="http://schemas.microsoft.com/office/drawing/2016/5/11/chartex" xmlns:cx6="http://schemas.microsoft.com/office/drawing/2016/5/12/chartex" xmlns:cx7="http://schemas.microsoft.com/office/drawing/2016/5/13/chartex" xmlns:cx8="http://schemas.microsoft.com/office/drawing/2016/5/14/chartex" xmlns:mc="http://schemas.openxmlformats.org/markup-compatibility/2006" xmlns:aink="http://schemas.microsoft.com/office/drawing/2016/ink" xmlns:am3d="http://schemas.microsoft.com/office/drawing/2017/model3d" xmlns:o="urn:schemas-microsoft-com:office:office" xmlns:oel="http://schemas.microsoft.com/office/2019/extlst" xmlns:r="http://schemas.openxmlformats.org/officeDocument/2006/relationships" xmlns:m="http://schemas.openxmlformats.org/officeDocument/2006/math" xmlns:v="urn:schemas-microsoft-com:vml" xmlns:wp14="http://schemas.microsoft.com/office/word/2010/wordprocessingDrawing" xmlns:wp="http://schemas.openxmlformats.org/drawingml/2006/wordprocessingDrawing" xmlns:w10="urn:schemas-microsoft-com:office:word" xmlns:w="http://schemas.openxmlformats.org/wordprocessingml/2006/main" xmlns:w14="http://schemas.microsoft.com/office/word/2010/wordml" xmlns:w15="http://schemas.microsoft.com/office/word/2012/wordml" xmlns:w16cex="http://schemas.microsoft.com/office/word/2018/wordml/cex" xmlns:w16cid="http://schemas.microsoft.com/office/word/2016/wordml/cid" xmlns:w16="http://schemas.microsoft.com/office/word/2018/wordml" xmlns:w16du="http://schemas.microsoft.com/office/word/2023/wordml/word16du" xmlns:w16sdtdh="http://schemas.microsoft.com/office/word/2020/wordml/sdtdatahash" xmlns:w16sdtfl="http://schemas.microsoft.com/office/word/2024/wordml/sdtformatlock" xmlns:w16se="http://schemas.microsoft.com/office/word/2015/wordml/symex" xmlns:wpg="http://schemas.microsoft.com/office/word/2010/wordprocessingGroup" xmlns:wpi="http://schemas.microsoft.com/office/word/2010/wordprocessingInk" xmlns:wne="http://schemas.microsoft.com/office/word/2006/wordml" xmlns:wps="http://schemas.microsoft.com/office/word/2010/wordprocessingShape" mc:Ignorable="w14 w15 w16se w16cid w16 w16cex w16sdtdh w16sdtfl w16du wp14">
   <w:sdt>
     <w:sdtPr>

</xml_diff>

<commit_message>
Completed PaddleOCR experimentation, evauation incomplete
</commit_message>
<xml_diff>
--- a/final report/Final Report.docx
+++ b/final report/Final Report.docx
@@ -5759,18 +5759,10 @@
         <w:t xml:space="preserve">er </w:t>
       </w:r>
       <w:r>
-        <w:t>[18</w:t>
-      </w:r>
-      <w:proofErr w:type="gramStart"/>
-      <w:r>
-        <w:t xml:space="preserve">] </w:t>
-      </w:r>
-      <w:r>
-        <w:t>.</w:t>
-      </w:r>
-      <w:proofErr w:type="gramEnd"/>
-      <w:r>
-        <w:t xml:space="preserve"> For translation tasks, the Transformer can be trained significantly faster than architectures based on recurrent or convolutional layers</w:t>
+        <w:t xml:space="preserve">[18] </w:t>
+      </w:r>
+      <w:r>
+        <w:t>. For translation tasks, the Transformer can be trained significantly faster than architectures based on recurrent or convolutional layers</w:t>
       </w:r>
       <w:r>
         <w:t xml:space="preserve"> </w:t>
@@ -6876,17 +6868,12 @@
         <w:t xml:space="preserve"> python library to assess the performance of Whisper (Open Ai), </w:t>
       </w:r>
       <w:proofErr w:type="spellStart"/>
-      <w:proofErr w:type="gramStart"/>
       <w:r>
         <w:t>NeMo</w:t>
       </w:r>
       <w:proofErr w:type="spellEnd"/>
       <w:r>
-        <w:t>(</w:t>
-      </w:r>
-      <w:proofErr w:type="gramEnd"/>
-      <w:r>
-        <w:t>NVIDIA) an Wav2Vec2.0(Meta Ai) in transcribing spontaneous as well as read speech fr</w:t>
+        <w:t>(NVIDIA) an Wav2Vec2.0(Meta Ai) in transcribing spontaneous as well as read speech fr</w:t>
       </w:r>
       <w:r>
         <w:t>o</w:t>
@@ -7113,13 +7100,8 @@
       <w:r>
         <w:t xml:space="preserve"> </w:t>
       </w:r>
-      <w:proofErr w:type="gramStart"/>
-      <w:r>
-        <w:t>Yang  [</w:t>
-      </w:r>
-      <w:proofErr w:type="gramEnd"/>
-      <w:r>
-        <w:t xml:space="preserve">4], used QWK in analysing the results of cross prompt AES models. </w:t>
+      <w:r>
+        <w:t xml:space="preserve">Yang  [4], used QWK in analysing the results of cross prompt AES models. </w:t>
       </w:r>
       <w:proofErr w:type="spellStart"/>
       <w:r>
@@ -9714,16 +9696,6 @@
       <w:pPr>
         <w:spacing w:line="360" w:lineRule="auto"/>
       </w:pPr>
-      <w:proofErr w:type="spellStart"/>
-      <w:r>
-        <w:t>Calculate_wer_and_cer</w:t>
-      </w:r>
-      <w:proofErr w:type="spellEnd"/>
-    </w:p>
-    <w:p>
-      <w:pPr>
-        <w:spacing w:line="360" w:lineRule="auto"/>
-      </w:pPr>
       <w:r>
         <w:rPr>
           <w:color w:val="EE0000"/>
@@ -10666,13 +10638,29 @@
     </w:p>
     <w:p/>
     <w:p>
-      <w:r>
+      <w:pPr>
+        <w:rPr>
+          <w:b/>
+          <w:bCs/>
+        </w:rPr>
+      </w:pPr>
+      <w:r>
+        <w:rPr>
+          <w:b/>
+          <w:bCs/>
+        </w:rPr>
         <w:t xml:space="preserve">Model loading </w:t>
       </w:r>
     </w:p>
     <w:p>
       <w:r>
-        <w:t xml:space="preserve">The model was loaded by initialising a </w:t>
+        <w:t xml:space="preserve">The model was loaded by </w:t>
+      </w:r>
+      <w:r>
+        <w:t xml:space="preserve">firstly, </w:t>
+      </w:r>
+      <w:r>
+        <w:t xml:space="preserve">initialising a </w:t>
       </w:r>
       <w:proofErr w:type="spellStart"/>
       <w:r>
@@ -10683,7 +10671,10 @@
         <w:t xml:space="preserve"> object. </w:t>
       </w:r>
       <w:r>
-        <w:t xml:space="preserve">The parameters, PP_OCRv6_medium_det and </w:t>
+        <w:t>The parameters</w:t>
+      </w:r>
+      <w:r>
+        <w:t xml:space="preserve">, PP_OCRv6_medium_det and </w:t>
       </w:r>
       <w:r>
         <w:t>PP_OCRv6_medium_</w:t>
@@ -10695,7 +10686,13 @@
         <w:t xml:space="preserve">detection and recognition </w:t>
       </w:r>
       <w:r>
-        <w:t xml:space="preserve">models. The </w:t>
+        <w:t>models</w:t>
+      </w:r>
+      <w:r>
+        <w:t>, respectively</w:t>
+      </w:r>
+      <w:r>
+        <w:t xml:space="preserve">. The </w:t>
       </w:r>
       <w:r>
         <w:rPr>
@@ -10705,6 +10702,54 @@
         <w:t>engine</w:t>
       </w:r>
       <w:r>
+        <w:rPr>
+          <w:b/>
+          <w:bCs/>
+        </w:rPr>
+        <w:t xml:space="preserve"> </w:t>
+      </w:r>
+      <w:r>
+        <w:t>parameter was set to “transformer</w:t>
+      </w:r>
+      <w:r>
+        <w:t>s</w:t>
+      </w:r>
+      <w:r>
+        <w:t>”</w:t>
+      </w:r>
+      <w:r>
+        <w:t>,</w:t>
+      </w:r>
+      <w:r>
+        <w:t xml:space="preserve"> while </w:t>
+      </w:r>
+      <w:r>
+        <w:t xml:space="preserve">the </w:t>
+      </w:r>
+      <w:proofErr w:type="spellStart"/>
+      <w:r>
+        <w:rPr>
+          <w:b/>
+          <w:bCs/>
+        </w:rPr>
+        <w:t>use</w:t>
+      </w:r>
+      <w:r>
+        <w:rPr>
+          <w:b/>
+          <w:bCs/>
+        </w:rPr>
+        <w:t>_</w:t>
+      </w:r>
+      <w:r>
+        <w:rPr>
+          <w:b/>
+          <w:bCs/>
+        </w:rPr>
+        <w:t>doc_orientation_classify</w:t>
+      </w:r>
+      <w:proofErr w:type="spellEnd"/>
+      <w:r>
         <w:t xml:space="preserve">, </w:t>
       </w:r>
       <w:proofErr w:type="spellStart"/>
@@ -10713,10 +10758,69 @@
           <w:b/>
           <w:bCs/>
         </w:rPr>
-        <w:t>use_doc_orientation_classify</w:t>
+        <w:t>use_doc_unwarping</w:t>
       </w:r>
       <w:proofErr w:type="spellEnd"/>
       <w:r>
+        <w:t xml:space="preserve"> and </w:t>
+      </w:r>
+      <w:proofErr w:type="spellStart"/>
+      <w:r>
+        <w:rPr>
+          <w:b/>
+          <w:bCs/>
+        </w:rPr>
+        <w:t>use_textline_orientation</w:t>
+      </w:r>
+      <w:proofErr w:type="spellEnd"/>
+      <w:r>
+        <w:t xml:space="preserve"> parameters were all set to True, </w:t>
+      </w:r>
+      <w:r>
+        <w:t xml:space="preserve">to dynamically handle curvature and distortion </w:t>
+      </w:r>
+      <w:r>
+        <w:t xml:space="preserve">present in images captured with handheld devices. </w:t>
+      </w:r>
+    </w:p>
+    <w:p>
+      <w:r>
+        <w:t>F</w:t>
+      </w:r>
+      <w:r>
+        <w:t xml:space="preserve">ollowing </w:t>
+      </w:r>
+      <w:r>
+        <w:t xml:space="preserve">the </w:t>
+      </w:r>
+      <w:r>
+        <w:t>parameter</w:t>
+      </w:r>
+      <w:r>
+        <w:t>-</w:t>
+      </w:r>
+      <w:r>
+        <w:t>configuration</w:t>
+      </w:r>
+      <w:r>
+        <w:t>-selection experiments, t</w:t>
+      </w:r>
+      <w:r>
+        <w:t>he</w:t>
+      </w:r>
+      <w:r>
+        <w:t xml:space="preserve"> </w:t>
+      </w:r>
+      <w:proofErr w:type="spellStart"/>
+      <w:r>
+        <w:rPr>
+          <w:b/>
+          <w:bCs/>
+        </w:rPr>
+        <w:t>text_det_unclip_ratio</w:t>
+      </w:r>
+      <w:proofErr w:type="spellEnd"/>
+      <w:r>
         <w:t xml:space="preserve">, </w:t>
       </w:r>
       <w:proofErr w:type="spellStart"/>
@@ -10725,7 +10829,7 @@
           <w:b/>
           <w:bCs/>
         </w:rPr>
-        <w:t>use_doc_unwarping</w:t>
+        <w:t>text_det_limit_side_len</w:t>
       </w:r>
       <w:proofErr w:type="spellEnd"/>
       <w:r>
@@ -10737,11 +10841,17 @@
           <w:b/>
           <w:bCs/>
         </w:rPr>
-        <w:t>use_textline_orientation</w:t>
+        <w:t>text_det_box_thresh</w:t>
       </w:r>
       <w:proofErr w:type="spellEnd"/>
       <w:r>
-        <w:t xml:space="preserve"> parameters were all set to True, following parameter configuration of the best performing model, obtained from the parameter configuration selection experiments. The </w:t>
+        <w:t xml:space="preserve"> parameters were set to 1.5, 960 and 0.4 respectively. </w:t>
+      </w:r>
+      <w:r>
+        <w:t>The</w:t>
+      </w:r>
+      <w:r>
+        <w:t xml:space="preserve"> </w:t>
       </w:r>
       <w:proofErr w:type="spellStart"/>
       <w:r>
@@ -10753,231 +10863,288 @@
       </w:r>
       <w:proofErr w:type="spellEnd"/>
       <w:r>
+        <w:t xml:space="preserve"> controls the bounding-box dilation and was adjusted to prevent clipping of long cursive ascenders or descenders such as ‘g” or “l”. </w:t>
+      </w:r>
+      <w:r>
+        <w:t xml:space="preserve">The </w:t>
+      </w:r>
+      <w:proofErr w:type="spellStart"/>
+      <w:r>
+        <w:rPr>
+          <w:b/>
+          <w:bCs/>
+        </w:rPr>
+        <w:t>text_det_limit_side_</w:t>
+      </w:r>
+      <w:r>
+        <w:rPr>
+          <w:b/>
+          <w:bCs/>
+        </w:rPr>
+        <w:t>len</w:t>
+      </w:r>
+      <w:proofErr w:type="spellEnd"/>
+      <w:r>
+        <w:t xml:space="preserve"> was set to </w:t>
+      </w:r>
+      <w:r>
+        <w:t xml:space="preserve">960 to </w:t>
+      </w:r>
+      <w:r>
+        <w:t xml:space="preserve">prevent the image from being downscaled too aggressively or upscaled into overlapping lines, preserving the topological integrity of the handwriting. </w:t>
+      </w:r>
+      <w:r>
+        <w:t xml:space="preserve">Finally, the </w:t>
+      </w:r>
+      <w:proofErr w:type="spellStart"/>
+      <w:r>
+        <w:t>text</w:t>
+      </w:r>
+      <w:r>
+        <w:rPr>
+          <w:b/>
+          <w:bCs/>
+        </w:rPr>
+        <w:t>_det_box_</w:t>
+      </w:r>
+      <w:r>
+        <w:rPr>
+          <w:b/>
+          <w:bCs/>
+        </w:rPr>
+        <w:t>thresh</w:t>
+      </w:r>
+      <w:proofErr w:type="spellEnd"/>
+      <w:r>
+        <w:t xml:space="preserve"> set to </w:t>
+      </w:r>
+      <w:r>
+        <w:t>a low value of 0.4</w:t>
+      </w:r>
+      <w:r>
         <w:t xml:space="preserve">, </w:t>
       </w:r>
+      <w:r>
+        <w:t xml:space="preserve">to </w:t>
+      </w:r>
+      <w:r>
+        <w:t>allow the model to successfully detect light handwriting</w:t>
+      </w:r>
+      <w:r>
+        <w:t xml:space="preserve">, such as light </w:t>
+      </w:r>
+      <w:r>
+        <w:t xml:space="preserve">pencil strokes. </w:t>
+      </w:r>
+      <w:r>
+        <w:t>All other parameters retained their default values</w:t>
+      </w:r>
+      <w:r>
+        <w:t>.</w:t>
+      </w:r>
+      <w:r>
+        <w:t xml:space="preserve"> </w:t>
+      </w:r>
+    </w:p>
+    <w:p>
+      <w:pPr>
+        <w:rPr>
+          <w:b/>
+          <w:bCs/>
+        </w:rPr>
+      </w:pPr>
+      <w:r>
+        <w:rPr>
+          <w:b/>
+          <w:bCs/>
+        </w:rPr>
+        <w:t xml:space="preserve">Detection </w:t>
+      </w:r>
+    </w:p>
+    <w:p>
+      <w:r>
+        <w:t xml:space="preserve">The </w:t>
+      </w:r>
+      <w:r>
+        <w:t>models</w:t>
+      </w:r>
+      <w:r>
+        <w:t xml:space="preserve"> predict () function was called to detect text regions</w:t>
+      </w:r>
+      <w:r>
+        <w:t xml:space="preserve">. Effectively segmenting the image into several text regions in bounded polygons. </w:t>
+      </w:r>
+    </w:p>
+    <w:p>
+      <w:pPr>
+        <w:rPr>
+          <w:b/>
+          <w:bCs/>
+        </w:rPr>
+      </w:pPr>
+      <w:r>
+        <w:rPr>
+          <w:b/>
+          <w:bCs/>
+        </w:rPr>
+        <w:t xml:space="preserve">Recognition </w:t>
+      </w:r>
+    </w:p>
+    <w:p>
+      <w:r>
+        <w:t>The model represent</w:t>
+      </w:r>
+      <w:r>
+        <w:t>ed</w:t>
+      </w:r>
+      <w:r>
+        <w:t xml:space="preserve"> detected text based on </w:t>
+      </w:r>
+      <w:r>
+        <w:t xml:space="preserve">recognition confidence. </w:t>
+      </w:r>
+    </w:p>
+    <w:p>
+      <w:pPr>
+        <w:rPr>
+          <w:b/>
+          <w:bCs/>
+        </w:rPr>
+      </w:pPr>
+      <w:r>
+        <w:rPr>
+          <w:b/>
+          <w:bCs/>
+        </w:rPr>
+        <w:t xml:space="preserve">Processing output </w:t>
+      </w:r>
+    </w:p>
+    <w:p>
+      <w:r>
+        <w:t xml:space="preserve">The output was passed to the </w:t>
+      </w:r>
       <w:proofErr w:type="spellStart"/>
       <w:r>
-        <w:rPr>
-          <w:b/>
-          <w:bCs/>
-        </w:rPr>
-        <w:t>text_det_limit_side_len</w:t>
+        <w:t>EssayEditor’s</w:t>
       </w:r>
       <w:proofErr w:type="spellEnd"/>
       <w:r>
-        <w:t xml:space="preserve"> and </w:t>
+        <w:t xml:space="preserve"> constructor to initialise an </w:t>
       </w:r>
       <w:proofErr w:type="spellStart"/>
       <w:r>
-        <w:rPr>
-          <w:b/>
-          <w:bCs/>
-        </w:rPr>
-        <w:t>text_det_box_thresh</w:t>
+        <w:t>EssayEditor</w:t>
       </w:r>
       <w:proofErr w:type="spellEnd"/>
       <w:r>
-        <w:t xml:space="preserve"> parameters were set to 1.5, 960 and 0.4 respectively. All other parameters retained their default values. </w:t>
-      </w:r>
-    </w:p>
-    <w:p>
-      <w:r>
-        <w:t xml:space="preserve">Detection </w:t>
+        <w:t xml:space="preserve"> object which allowed the output text to be normalised.  This object, along with all other metadata for a processed file, was stored in the</w:t>
+      </w:r>
+      <w:r>
+        <w:rPr>
+          <w:b/>
+          <w:bCs/>
+        </w:rPr>
+        <w:t xml:space="preserve"> details</w:t>
+      </w:r>
+      <w:r>
+        <w:t xml:space="preserve"> list of </w:t>
+      </w:r>
+      <w:proofErr w:type="spellStart"/>
+      <w:r>
+        <w:t>ocr_batch</w:t>
+      </w:r>
+      <w:proofErr w:type="spellEnd"/>
+      <w:r>
+        <w:t xml:space="preserve"> object, an instance of the </w:t>
+      </w:r>
+      <w:proofErr w:type="spellStart"/>
+      <w:r>
+        <w:t>BatchDataOperator</w:t>
+      </w:r>
+      <w:proofErr w:type="spellEnd"/>
+      <w:r>
+        <w:t xml:space="preserve"> class.  The WER and CER percentage scores were </w:t>
+      </w:r>
+      <w:r>
+        <w:t xml:space="preserve">also </w:t>
+      </w:r>
+      <w:r>
+        <w:t xml:space="preserve">calculated and stored for each processed file </w:t>
+      </w:r>
+      <w:r>
+        <w:t xml:space="preserve">separately </w:t>
+      </w:r>
+      <w:r>
+        <w:t xml:space="preserve">and for the </w:t>
+      </w:r>
+      <w:r>
+        <w:t xml:space="preserve">whole </w:t>
+      </w:r>
+      <w:r>
+        <w:t xml:space="preserve">batch. </w:t>
+      </w:r>
+    </w:p>
+    <w:p>
+      <w:pPr>
+        <w:rPr>
+          <w:b/>
+          <w:bCs/>
+        </w:rPr>
+      </w:pPr>
+      <w:r>
+        <w:rPr>
+          <w:b/>
+          <w:bCs/>
+        </w:rPr>
+        <w:t xml:space="preserve">Error-rate calculation </w:t>
       </w:r>
     </w:p>
     <w:p>
       <w:r>
         <w:t xml:space="preserve">The </w:t>
       </w:r>
-      <w:r>
-        <w:t>models</w:t>
-      </w:r>
-      <w:r>
-        <w:t xml:space="preserve"> predict () function was called to detect text regions</w:t>
-      </w:r>
-      <w:r>
-        <w:t xml:space="preserve">. Effectively segmenting the image into several text regions in bounded polygons. </w:t>
-      </w:r>
-    </w:p>
-    <w:p>
-      <w:r>
-        <w:t xml:space="preserve">Recognition </w:t>
-      </w:r>
-    </w:p>
-    <w:p>
-      <w:r>
-        <w:t>The model represent</w:t>
-      </w:r>
-      <w:r>
-        <w:t>ed</w:t>
-      </w:r>
-      <w:r>
-        <w:t xml:space="preserve"> detected text based on </w:t>
-      </w:r>
-      <w:r>
-        <w:t xml:space="preserve">recognition confidence. </w:t>
-      </w:r>
-    </w:p>
-    <w:p>
-      <w:r>
-        <w:t xml:space="preserve">Processing output </w:t>
-      </w:r>
-    </w:p>
-    <w:p>
-      <w:r>
-        <w:t xml:space="preserve">The output was passed to the </w:t>
-      </w:r>
       <w:proofErr w:type="spellStart"/>
       <w:r>
-        <w:t>EssayEditor’s</w:t>
+        <w:t>calculate_wer_and_cer_rates</w:t>
       </w:r>
       <w:proofErr w:type="spellEnd"/>
       <w:r>
-        <w:t xml:space="preserve"> constructor to initialise an </w:t>
+        <w:t xml:space="preserve">() function was invoked </w:t>
+      </w:r>
+      <w:r>
+        <w:t xml:space="preserve">and passed the reference essay and the normalised output from </w:t>
       </w:r>
       <w:proofErr w:type="spellStart"/>
       <w:r>
-        <w:t>EssayEditor</w:t>
+        <w:t>PaddleOCR</w:t>
       </w:r>
       <w:proofErr w:type="spellEnd"/>
       <w:r>
-        <w:t xml:space="preserve"> object which allowed the output text to be normalised.  This object, along with all other metadata for a processed file, was stored in the</w:t>
-      </w:r>
-      <w:r>
-        <w:rPr>
-          <w:b/>
-          <w:bCs/>
-        </w:rPr>
-        <w:t xml:space="preserve"> details</w:t>
-      </w:r>
-      <w:r>
-        <w:t xml:space="preserve"> list of </w:t>
+        <w:t xml:space="preserve">. This function used the </w:t>
       </w:r>
       <w:proofErr w:type="spellStart"/>
       <w:r>
-        <w:t>ocr_batch</w:t>
+        <w:t>jiwer</w:t>
       </w:r>
       <w:proofErr w:type="spellEnd"/>
       <w:r>
-        <w:t xml:space="preserve"> object, an instance of the </w:t>
-      </w:r>
-      <w:proofErr w:type="spellStart"/>
-      <w:r>
-        <w:t>BatchDataOperator</w:t>
-      </w:r>
-      <w:proofErr w:type="spellEnd"/>
-      <w:r>
-        <w:t xml:space="preserve"> class.  The WER and CER percentage scores were </w:t>
-      </w:r>
-      <w:r>
-        <w:t xml:space="preserve">also </w:t>
-      </w:r>
-      <w:r>
-        <w:t xml:space="preserve">calculated and stored for each processed file </w:t>
-      </w:r>
-      <w:r>
-        <w:t xml:space="preserve">separately </w:t>
-      </w:r>
-      <w:r>
-        <w:t xml:space="preserve">and for the </w:t>
-      </w:r>
-      <w:r>
-        <w:t xml:space="preserve">whole </w:t>
-      </w:r>
-      <w:r>
-        <w:t xml:space="preserve">batch. </w:t>
-      </w:r>
-    </w:p>
-    <w:p>
-      <w:r>
-        <w:t xml:space="preserve">Error-rate calculation </w:t>
-      </w:r>
-    </w:p>
-    <w:p>
-      <w:r>
-        <w:t xml:space="preserve">The </w:t>
-      </w:r>
-      <w:proofErr w:type="spellStart"/>
-      <w:r>
-        <w:t>calculate_wer_and_cer_</w:t>
-      </w:r>
-      <w:proofErr w:type="gramStart"/>
-      <w:r>
-        <w:t>rates</w:t>
-      </w:r>
-      <w:proofErr w:type="spellEnd"/>
-      <w:r>
-        <w:t>(</w:t>
-      </w:r>
-      <w:proofErr w:type="gramEnd"/>
-      <w:r>
-        <w:t>) function was invoked passing t</w:t>
-      </w:r>
-    </w:p>
-    <w:p>
-      <w:pPr>
-        <w:numPr>
-          <w:ilvl w:val="0"/>
-          <w:numId w:val="19"/>
-        </w:numPr>
-      </w:pPr>
-      <w:r>
-        <w:t xml:space="preserve">How the OCR output is represented </w:t>
-      </w:r>
-    </w:p>
-    <w:p>
-      <w:pPr>
-        <w:numPr>
-          <w:ilvl w:val="0"/>
-          <w:numId w:val="19"/>
-        </w:numPr>
-      </w:pPr>
-      <w:r>
-        <w:t xml:space="preserve">Important code snippets </w:t>
-      </w:r>
-    </w:p>
-    <w:p>
-      <w:pPr>
-        <w:numPr>
-          <w:ilvl w:val="0"/>
-          <w:numId w:val="19"/>
-        </w:numPr>
-      </w:pPr>
-      <w:r>
-        <w:t xml:space="preserve">Relevant screenshots </w:t>
-      </w:r>
-    </w:p>
-    <w:p>
-      <w:r>
-        <w:t xml:space="preserve">Don't evaluate whether </w:t>
-      </w:r>
-      <w:proofErr w:type="spellStart"/>
-      <w:r>
-        <w:t>PaddleOCR</w:t>
-      </w:r>
-      <w:proofErr w:type="spellEnd"/>
-      <w:r>
-        <w:t xml:space="preserve"> is </w:t>
-      </w:r>
-      <w:r>
-        <w:rPr>
-          <w:i/>
-          <w:iCs/>
-        </w:rPr>
-        <w:t>good</w:t>
-      </w:r>
-      <w:r>
-        <w:t xml:space="preserve"> here. Explain </w:t>
-      </w:r>
-      <w:r>
-        <w:rPr>
-          <w:b/>
-          <w:bCs/>
-        </w:rPr>
-        <w:t>how you implemented it</w:t>
-      </w:r>
-      <w:r>
-        <w:t>.</w:t>
+        <w:t xml:space="preserve"> module to calculate the error rates and returned a list with the results.  </w:t>
+      </w:r>
+    </w:p>
+    <w:p>
+      <w:pPr>
+        <w:rPr>
+          <w:b/>
+          <w:bCs/>
+        </w:rPr>
+      </w:pPr>
+      <w:bookmarkStart w:id="26" w:name="_Toc238719423"/>
+      <w:r>
+        <w:rPr>
+          <w:b/>
+          <w:bCs/>
+        </w:rPr>
+        <w:t>Evaluation Logic</w:t>
       </w:r>
     </w:p>
     <w:p>
@@ -10989,7 +11156,18 @@
           <w:szCs w:val="28"/>
         </w:rPr>
       </w:pPr>
-      <w:bookmarkStart w:id="26" w:name="_Toc238719423"/>
+      <w:r>
+        <w:lastRenderedPageBreak/>
+        <w:t xml:space="preserve">The logic correctly classified output that had either WER or CER percentage scores below their respective thresholds and “pass” and “fail” otherwise. This resulted in the essays classified as “fail” being assigned for manual scoring and the other for </w:t>
+      </w:r>
+      <w:proofErr w:type="spellStart"/>
+      <w:r>
+        <w:t>DeBERTa</w:t>
+      </w:r>
+      <w:proofErr w:type="spellEnd"/>
+      <w:r>
+        <w:t xml:space="preserve"> to score. </w:t>
+      </w:r>
       <w:r>
         <w:br w:type="page"/>
       </w:r>
@@ -11312,16 +11490,18 @@
     <w:p>
       <w:pPr>
         <w:spacing w:line="360" w:lineRule="auto"/>
-      </w:pPr>
-    </w:p>
-    <w:p>
-      <w:pPr>
-        <w:spacing w:line="360" w:lineRule="auto"/>
-        <w:rPr>
-          <w:b/>
-          <w:bCs/>
-        </w:rPr>
-      </w:pPr>
+        <w:rPr>
+          <w:b/>
+          <w:bCs/>
+        </w:rPr>
+      </w:pPr>
+      <w:r>
+        <w:rPr>
+          <w:b/>
+          <w:bCs/>
+        </w:rPr>
+        <w:t xml:space="preserve">  </w:t>
+      </w:r>
       <w:r>
         <w:rPr>
           <w:b/>
@@ -11473,37 +11653,37 @@
         <w:t>,</w:t>
       </w:r>
       <w:r>
-        <w:t xml:space="preserve"> the segments </w:t>
+        <w:t xml:space="preserve"> the segments were </w:t>
+      </w:r>
+      <w:r>
+        <w:t>combined</w:t>
+      </w:r>
+      <w:r>
+        <w:t xml:space="preserve"> into a single text string </w:t>
+      </w:r>
+      <w:r>
+        <w:t xml:space="preserve">by invoking Python’s </w:t>
+      </w:r>
+      <w:r>
+        <w:rPr>
+          <w:b/>
+          <w:bCs/>
+        </w:rPr>
+        <w:t>join (</w:t>
+      </w:r>
+      <w:r>
+        <w:rPr>
+          <w:b/>
+          <w:bCs/>
+        </w:rPr>
+        <w:t>)</w:t>
+      </w:r>
+      <w:r>
+        <w:t xml:space="preserve"> function on the output of a list comprehension, which extracted individual text segments from </w:t>
       </w:r>
       <w:r>
         <w:lastRenderedPageBreak/>
-        <w:t xml:space="preserve">were </w:t>
-      </w:r>
-      <w:r>
-        <w:t>combined</w:t>
-      </w:r>
-      <w:r>
-        <w:t xml:space="preserve"> into a single text string </w:t>
-      </w:r>
-      <w:r>
-        <w:t xml:space="preserve">by invoking Python’s </w:t>
-      </w:r>
-      <w:r>
-        <w:rPr>
-          <w:b/>
-          <w:bCs/>
-        </w:rPr>
-        <w:t>join (</w:t>
-      </w:r>
-      <w:r>
-        <w:rPr>
-          <w:b/>
-          <w:bCs/>
-        </w:rPr>
-        <w:t>)</w:t>
-      </w:r>
-      <w:r>
-        <w:t xml:space="preserve"> function on the output of a list comprehension, which extracted individual text segments from Whisper’s segment generator. The combined string was then passed as an </w:t>
+        <w:t xml:space="preserve">Whisper’s segment generator. The combined string was then passed as an </w:t>
       </w:r>
       <w:r>
         <w:t xml:space="preserve">argument to </w:t>
@@ -12081,6 +12261,82 @@
         <w:t xml:space="preserve"> for automated evaluation. </w:t>
       </w:r>
     </w:p>
+    <w:p>
+      <w:pPr>
+        <w:spacing w:line="360" w:lineRule="auto"/>
+        <w:rPr>
+          <w:color w:val="EE0000"/>
+        </w:rPr>
+      </w:pPr>
+      <w:r>
+        <w:rPr>
+          <w:color w:val="EE0000"/>
+        </w:rPr>
+        <w:t xml:space="preserve">Double check, since </w:t>
+      </w:r>
+      <w:proofErr w:type="spellStart"/>
+      <w:r>
+        <w:rPr>
+          <w:color w:val="EE0000"/>
+        </w:rPr>
+        <w:t>update_eval_stats</w:t>
+      </w:r>
+      <w:proofErr w:type="spellEnd"/>
+      <w:r>
+        <w:rPr>
+          <w:color w:val="EE0000"/>
+        </w:rPr>
+        <w:t xml:space="preserve"> is for development, </w:t>
+      </w:r>
+      <w:r>
+        <w:rPr>
+          <w:color w:val="EE0000"/>
+        </w:rPr>
+        <w:t xml:space="preserve">Explain </w:t>
+      </w:r>
+      <w:proofErr w:type="spellStart"/>
+      <w:r>
+        <w:rPr>
+          <w:color w:val="EE0000"/>
+        </w:rPr>
+        <w:t>update_eval_stats</w:t>
+      </w:r>
+      <w:proofErr w:type="spellEnd"/>
+      <w:r>
+        <w:rPr>
+          <w:color w:val="EE0000"/>
+        </w:rPr>
+        <w:t xml:space="preserve">() and how robust it is, thresholds can change it merely used the pass fail against </w:t>
+      </w:r>
+      <w:proofErr w:type="spellStart"/>
+      <w:r>
+        <w:rPr>
+          <w:color w:val="EE0000"/>
+        </w:rPr>
+        <w:t>wer</w:t>
+      </w:r>
+      <w:proofErr w:type="spellEnd"/>
+      <w:r>
+        <w:rPr>
+          <w:color w:val="EE0000"/>
+        </w:rPr>
+        <w:t xml:space="preserve"> and </w:t>
+      </w:r>
+      <w:proofErr w:type="spellStart"/>
+      <w:r>
+        <w:rPr>
+          <w:color w:val="EE0000"/>
+        </w:rPr>
+        <w:t>cer</w:t>
+      </w:r>
+      <w:proofErr w:type="spellEnd"/>
+      <w:r>
+        <w:rPr>
+          <w:color w:val="EE0000"/>
+        </w:rPr>
+        <w:t xml:space="preserve"> to update the count</w:t>
+      </w:r>
+    </w:p>
     <w:p/>
     <w:p>
       <w:pPr>
@@ -13194,17 +13450,12 @@
       <w:r>
         <w:t xml:space="preserve">Keep </w:t>
       </w:r>
-      <w:proofErr w:type="gramStart"/>
       <w:r>
         <w:t xml:space="preserve">this, </w:t>
       </w:r>
       <w:r>
-        <w:t xml:space="preserve"> </w:t>
-      </w:r>
-      <w:r>
         <w:t>but</w:t>
       </w:r>
-      <w:proofErr w:type="gramEnd"/>
       <w:r>
         <w:t xml:space="preserve"> </w:t>
       </w:r>
@@ -13316,160 +13567,424 @@
           <w:b/>
           <w:bCs/>
         </w:rPr>
-        <w:t>5.3.1 OCR Test Procedure</w:t>
-      </w:r>
-    </w:p>
-    <w:p>
-      <w:pPr>
-        <w:spacing w:line="360" w:lineRule="auto"/>
-        <w:rPr>
-          <w:b/>
-          <w:bCs/>
-        </w:rPr>
-      </w:pPr>
-    </w:p>
-    <w:p>
-      <w:pPr>
-        <w:spacing w:line="360" w:lineRule="auto"/>
-        <w:rPr>
-          <w:b/>
-          <w:bCs/>
-        </w:rPr>
-      </w:pPr>
-      <w:r>
-        <w:rPr>
-          <w:b/>
-          <w:bCs/>
-        </w:rPr>
-        <w:t>5.3.2 OCR Results</w:t>
-      </w:r>
-    </w:p>
-    <w:p>
-      <w:pPr>
-        <w:spacing w:line="360" w:lineRule="auto"/>
-        <w:rPr>
-          <w:b/>
-          <w:bCs/>
-        </w:rPr>
-      </w:pPr>
-      <w:r>
-        <w:rPr>
-          <w:b/>
-          <w:bCs/>
-        </w:rPr>
-        <w:t>5.3.3 OCR Error Analysis</w:t>
-      </w:r>
-    </w:p>
-    <w:p>
-      <w:pPr>
-        <w:spacing w:line="360" w:lineRule="auto"/>
-      </w:pPr>
-      <w:r>
-        <w:t>Then:</w:t>
-      </w:r>
-    </w:p>
-    <w:p>
-      <w:pPr>
-        <w:numPr>
-          <w:ilvl w:val="0"/>
-          <w:numId w:val="23"/>
-        </w:numPr>
-        <w:spacing w:line="360" w:lineRule="auto"/>
-      </w:pPr>
-      <w:r>
-        <w:t xml:space="preserve">Mean CER </w:t>
-      </w:r>
-    </w:p>
-    <w:p>
-      <w:pPr>
-        <w:numPr>
-          <w:ilvl w:val="0"/>
-          <w:numId w:val="23"/>
-        </w:numPr>
-        <w:spacing w:line="360" w:lineRule="auto"/>
-      </w:pPr>
-      <w:r>
-        <w:t xml:space="preserve">Mean WER </w:t>
-      </w:r>
-    </w:p>
-    <w:p>
-      <w:pPr>
-        <w:numPr>
-          <w:ilvl w:val="0"/>
-          <w:numId w:val="23"/>
-        </w:numPr>
-        <w:spacing w:line="360" w:lineRule="auto"/>
-      </w:pPr>
-      <w:r>
-        <w:t xml:space="preserve">Min/max/median </w:t>
-      </w:r>
-    </w:p>
-    <w:p>
-      <w:pPr>
-        <w:numPr>
-          <w:ilvl w:val="0"/>
-          <w:numId w:val="23"/>
-        </w:numPr>
-        <w:spacing w:line="360" w:lineRule="auto"/>
-      </w:pPr>
-      <w:r>
-        <w:t xml:space="preserve">Pass/fail </w:t>
-      </w:r>
-    </w:p>
-    <w:p>
-      <w:pPr>
-        <w:numPr>
-          <w:ilvl w:val="0"/>
-          <w:numId w:val="23"/>
-        </w:numPr>
-        <w:spacing w:line="360" w:lineRule="auto"/>
-      </w:pPr>
-      <w:r>
-        <w:t xml:space="preserve">Representative examples </w:t>
-      </w:r>
-    </w:p>
-    <w:p>
-      <w:pPr>
-        <w:numPr>
-          <w:ilvl w:val="0"/>
-          <w:numId w:val="23"/>
-        </w:numPr>
-        <w:spacing w:line="360" w:lineRule="auto"/>
-      </w:pPr>
-      <w:r>
-        <w:t xml:space="preserve">Confidence scores </w:t>
-      </w:r>
-    </w:p>
-    <w:p>
-      <w:pPr>
-        <w:numPr>
-          <w:ilvl w:val="0"/>
-          <w:numId w:val="23"/>
-        </w:numPr>
-        <w:spacing w:line="360" w:lineRule="auto"/>
-      </w:pPr>
-      <w:r>
-        <w:t xml:space="preserve">Visual examples </w:t>
-      </w:r>
-    </w:p>
-    <w:p>
-      <w:pPr>
-        <w:numPr>
-          <w:ilvl w:val="0"/>
-          <w:numId w:val="23"/>
-        </w:numPr>
-        <w:spacing w:line="360" w:lineRule="auto"/>
-      </w:pPr>
-      <w:r>
-        <w:t xml:space="preserve">Interpretation </w:t>
-      </w:r>
-    </w:p>
-    <w:p>
-      <w:pPr>
-        <w:spacing w:line="360" w:lineRule="auto"/>
-      </w:pPr>
-      <w:r>
-        <w:t>This is where your OCR results should live.</w:t>
+        <w:t>5.</w:t>
+      </w:r>
+      <w:r>
+        <w:rPr>
+          <w:b/>
+          <w:bCs/>
+        </w:rPr>
+        <w:t>4</w:t>
+      </w:r>
+      <w:r>
+        <w:rPr>
+          <w:b/>
+          <w:bCs/>
+        </w:rPr>
+        <w:t>.1 OCR Test Procedure</w:t>
+      </w:r>
+    </w:p>
+    <w:p>
+      <w:pPr>
+        <w:spacing w:line="360" w:lineRule="auto"/>
+        <w:rPr>
+          <w:b/>
+          <w:bCs/>
+        </w:rPr>
+      </w:pPr>
+      <w:r>
+        <w:rPr>
+          <w:b/>
+          <w:bCs/>
+        </w:rPr>
+        <w:drawing>
+          <wp:inline distT="0" distB="0" distL="0" distR="0" wp14:anchorId="4C974334" wp14:editId="61FA0DB6">
+            <wp:extent cx="2124371" cy="523948"/>
+            <wp:effectExtent l="0" t="0" r="9525" b="9525"/>
+            <wp:docPr id="210515010" name="Picture 1"/>
+            <wp:cNvGraphicFramePr>
+              <a:graphicFrameLocks xmlns:a="http://schemas.openxmlformats.org/drawingml/2006/main" noChangeAspect="1"/>
+            </wp:cNvGraphicFramePr>
+            <a:graphic xmlns:a="http://schemas.openxmlformats.org/drawingml/2006/main">
+              <a:graphicData uri="http://schemas.openxmlformats.org/drawingml/2006/picture">
+                <pic:pic xmlns:pic="http://schemas.openxmlformats.org/drawingml/2006/picture">
+                  <pic:nvPicPr>
+                    <pic:cNvPr id="210515010" name=""/>
+                    <pic:cNvPicPr/>
+                  </pic:nvPicPr>
+                  <pic:blipFill>
+                    <a:blip r:embed="rId14"/>
+                    <a:stretch>
+                      <a:fillRect/>
+                    </a:stretch>
+                  </pic:blipFill>
+                  <pic:spPr>
+                    <a:xfrm>
+                      <a:off x="0" y="0"/>
+                      <a:ext cx="2124371" cy="523948"/>
+                    </a:xfrm>
+                    <a:prstGeom prst="rect">
+                      <a:avLst/>
+                    </a:prstGeom>
+                  </pic:spPr>
+                </pic:pic>
+              </a:graphicData>
+            </a:graphic>
+          </wp:inline>
+        </w:drawing>
+      </w:r>
+    </w:p>
+    <w:p>
+      <w:pPr>
+        <w:spacing w:line="360" w:lineRule="auto"/>
+      </w:pPr>
+      <w:r>
+        <w:t xml:space="preserve">Three </w:t>
+      </w:r>
+      <w:r>
+        <w:t>parameter configurations</w:t>
+      </w:r>
+      <w:r>
+        <w:t xml:space="preserve">, for </w:t>
+      </w:r>
+      <w:proofErr w:type="spellStart"/>
+      <w:r>
+        <w:rPr>
+          <w:b/>
+          <w:bCs/>
+        </w:rPr>
+        <w:t>text_det_unclip_ratio</w:t>
+      </w:r>
+      <w:proofErr w:type="spellEnd"/>
+      <w:r>
+        <w:t xml:space="preserve">, </w:t>
+      </w:r>
+      <w:proofErr w:type="spellStart"/>
+      <w:r>
+        <w:rPr>
+          <w:b/>
+          <w:bCs/>
+        </w:rPr>
+        <w:t>text_det_limit_side_len</w:t>
+      </w:r>
+      <w:proofErr w:type="spellEnd"/>
+      <w:r>
+        <w:t xml:space="preserve">, and </w:t>
+      </w:r>
+      <w:proofErr w:type="spellStart"/>
+      <w:r>
+        <w:rPr>
+          <w:b/>
+          <w:bCs/>
+        </w:rPr>
+        <w:t>text_det_box_thresh</w:t>
+      </w:r>
+      <w:proofErr w:type="spellEnd"/>
+      <w:r>
+        <w:t>, respectively</w:t>
+      </w:r>
+      <w:r>
+        <w:t xml:space="preserve">, </w:t>
+      </w:r>
+      <w:r>
+        <w:t xml:space="preserve">as shown in </w:t>
+      </w:r>
+      <w:r>
+        <w:rPr>
+          <w:color w:val="EE0000"/>
+        </w:rPr>
+        <w:t xml:space="preserve">figure 5 </w:t>
+      </w:r>
+      <w:r>
+        <w:rPr>
+          <w:color w:val="EE0000"/>
+        </w:rPr>
+        <w:t>above</w:t>
+      </w:r>
+      <w:r>
+        <w:t xml:space="preserve">, were tested on a sample image of a handwritten essay. The results were then </w:t>
+      </w:r>
+      <w:r>
+        <w:t>compared,</w:t>
+      </w:r>
+      <w:r>
+        <w:t xml:space="preserve"> and </w:t>
+      </w:r>
+      <w:r>
+        <w:t xml:space="preserve">the best configuration (configuration 1) was </w:t>
+      </w:r>
+      <w:r>
+        <w:t xml:space="preserve">implemented </w:t>
+      </w:r>
+      <w:r>
+        <w:t xml:space="preserve">to </w:t>
+      </w:r>
+      <w:r>
+        <w:t xml:space="preserve">process the batch of essays. </w:t>
+      </w:r>
+    </w:p>
+    <w:p>
+      <w:pPr>
+        <w:spacing w:line="360" w:lineRule="auto"/>
+        <w:rPr>
+          <w:b/>
+          <w:bCs/>
+        </w:rPr>
+      </w:pPr>
+      <w:r>
+        <w:rPr>
+          <w:b/>
+          <w:bCs/>
+        </w:rPr>
+        <w:t>5.</w:t>
+      </w:r>
+      <w:r>
+        <w:rPr>
+          <w:b/>
+          <w:bCs/>
+        </w:rPr>
+        <w:t>4</w:t>
+      </w:r>
+      <w:r>
+        <w:rPr>
+          <w:b/>
+          <w:bCs/>
+        </w:rPr>
+        <w:t>.2 OCR Results</w:t>
+      </w:r>
+    </w:p>
+    <w:p>
+      <w:pPr>
+        <w:spacing w:line="360" w:lineRule="auto"/>
+      </w:pPr>
+      <w:r>
+        <w:t xml:space="preserve">Initially, every output was classified as “fail” when evaluated. The main reason being, </w:t>
+      </w:r>
+      <w:r>
+        <w:t>the low CER and WER thresholds and the requirement that the output’s WER and CER both be below their respective threshold</w:t>
+      </w:r>
+      <w:r>
+        <w:t xml:space="preserve">.  </w:t>
+      </w:r>
+    </w:p>
+    <w:p>
+      <w:pPr>
+        <w:spacing w:line="360" w:lineRule="auto"/>
+      </w:pPr>
+      <w:r>
+        <w:t>The mean CER was high, 33.77% while the mean CER</w:t>
+      </w:r>
+      <w:r>
+        <w:t xml:space="preserve">, 17.04% was relatively low. The mean WER was 11.11%, which was 1.11 percentage points above the WER threshold. The min CER, 4.0%, is below the CER threshold, 5.0%. This however only represents a unique case, as there is only one, recorded CER pass in the batch. The WER and CER fail percentages were very high, 100% and 94.43%, respectively. </w:t>
+      </w:r>
+    </w:p>
+    <w:p>
+      <w:pPr>
+        <w:spacing w:line="360" w:lineRule="auto"/>
+        <w:rPr>
+          <w:b/>
+          <w:bCs/>
+        </w:rPr>
+      </w:pPr>
+      <w:r>
+        <w:rPr>
+          <w:b/>
+          <w:bCs/>
+        </w:rPr>
+        <w:t>5.</w:t>
+      </w:r>
+      <w:r>
+        <w:rPr>
+          <w:b/>
+          <w:bCs/>
+        </w:rPr>
+        <w:t>4</w:t>
+      </w:r>
+      <w:r>
+        <w:rPr>
+          <w:b/>
+          <w:bCs/>
+        </w:rPr>
+        <w:t>.3 OCR Error Analysis</w:t>
+      </w:r>
+    </w:p>
+    <w:p>
+      <w:pPr>
+        <w:spacing w:line="360" w:lineRule="auto"/>
+      </w:pPr>
+      <w:r>
+        <w:t xml:space="preserve">The output with the </w:t>
+      </w:r>
+      <w:r>
+        <w:t>lowest WER and CER had percentage scores of 11.11% and 4.0% respectively.</w:t>
+      </w:r>
+      <w:r>
+        <w:t xml:space="preserve"> </w:t>
+      </w:r>
+      <w:r>
+        <w:t xml:space="preserve"> </w:t>
+      </w:r>
+      <w:r>
+        <w:t>A visual inspection of this essay</w:t>
+      </w:r>
+      <w:r>
+        <w:t xml:space="preserve"> </w:t>
+      </w:r>
+      <w:r>
+        <w:t xml:space="preserve">revealed that it was </w:t>
+      </w:r>
+      <w:r>
+        <w:t>readable and decipherable</w:t>
+      </w:r>
+      <w:r>
+        <w:t xml:space="preserve">, which </w:t>
+      </w:r>
+      <w:r>
+        <w:t xml:space="preserve">indicated </w:t>
+      </w:r>
+      <w:r>
+        <w:t xml:space="preserve">that </w:t>
+      </w:r>
+      <w:r>
+        <w:t>the evaluation logic was too strict</w:t>
+      </w:r>
+      <w:r>
+        <w:t xml:space="preserve">. </w:t>
+      </w:r>
+      <w:r>
+        <w:t xml:space="preserve"> </w:t>
+      </w:r>
+      <w:proofErr w:type="spellStart"/>
+      <w:r>
+        <w:t>PaddleOCR’s</w:t>
+      </w:r>
+      <w:proofErr w:type="spellEnd"/>
+      <w:r>
+        <w:t xml:space="preserve"> recognition model performed accurately as is shown by the text representations and corresponding confidence scores, </w:t>
+      </w:r>
+      <w:r>
+        <w:rPr>
+          <w:color w:val="EE0000"/>
+        </w:rPr>
+        <w:t>in figure 5</w:t>
+      </w:r>
+      <w:r>
+        <w:t xml:space="preserve">. </w:t>
+      </w:r>
+      <w:r>
+        <w:t xml:space="preserve">This essay would be accurately scored by the transformer, because it consistently maintained its semantic meaning although there were some obvious word and character errors. </w:t>
+      </w:r>
+      <w:r>
+        <w:rPr>
+          <w:color w:val="EE0000"/>
+        </w:rPr>
+        <w:t xml:space="preserve">(where is quote from, use in lit review to show why </w:t>
+      </w:r>
+      <w:proofErr w:type="spellStart"/>
+      <w:r>
+        <w:rPr>
+          <w:color w:val="EE0000"/>
+        </w:rPr>
+        <w:t>deberta</w:t>
+      </w:r>
+      <w:proofErr w:type="spellEnd"/>
+      <w:r>
+        <w:rPr>
+          <w:color w:val="EE0000"/>
+        </w:rPr>
+        <w:t xml:space="preserve"> is a good choice, expand on </w:t>
+      </w:r>
+      <w:proofErr w:type="spellStart"/>
+      <w:r>
+        <w:rPr>
+          <w:color w:val="EE0000"/>
+        </w:rPr>
+        <w:t>subword</w:t>
+      </w:r>
+      <w:proofErr w:type="spellEnd"/>
+      <w:r>
+        <w:rPr>
+          <w:color w:val="EE0000"/>
+        </w:rPr>
+        <w:t xml:space="preserve"> tokenisation, there) </w:t>
+      </w:r>
+      <w:r>
+        <w:t xml:space="preserve">Transformer models like </w:t>
+      </w:r>
+      <w:proofErr w:type="spellStart"/>
+      <w:r>
+        <w:t>DeBERTa</w:t>
+      </w:r>
+      <w:proofErr w:type="spellEnd"/>
+      <w:r>
+        <w:t xml:space="preserve"> are incredibly robust to minor spelling errors and due </w:t>
+      </w:r>
+      <w:r>
+        <w:lastRenderedPageBreak/>
+        <w:t xml:space="preserve">to sub-word tokenisation, and would still accurately score the essay even with a few minor spelling errors present. </w:t>
+      </w:r>
+    </w:p>
+    <w:p>
+      <w:pPr>
+        <w:spacing w:line="360" w:lineRule="auto"/>
+      </w:pPr>
+      <w:r>
+        <w:t xml:space="preserve">Further inspection revealed that essays with a WER around 20% and a CER around 7% were readable and decipherable and could easily be scored by the transformer. Thus, the decision was made to adjust the thresholds to reflect this revelation. The batch test was </w:t>
+      </w:r>
+      <w:r>
+        <w:t>rerun,</w:t>
+      </w:r>
+      <w:r>
+        <w:t xml:space="preserve"> and the </w:t>
+      </w:r>
+      <w:r>
+        <w:t xml:space="preserve">pass percentage jumped from 0 to 17.85%. This increase, however, was not sufficient to support </w:t>
+      </w:r>
+      <w:proofErr w:type="spellStart"/>
+      <w:r>
+        <w:t>PaddleOCR</w:t>
+      </w:r>
+      <w:proofErr w:type="spellEnd"/>
+      <w:r>
+        <w:t xml:space="preserve"> being included in the </w:t>
+      </w:r>
+      <w:r>
+        <w:t xml:space="preserve">AES pipeline </w:t>
+      </w:r>
+      <w:r>
+        <w:t xml:space="preserve">as assistive technology since more than 80% of the batch had to be scored manually. </w:t>
+      </w:r>
+    </w:p>
+    <w:p>
+      <w:pPr>
+        <w:spacing w:line="360" w:lineRule="auto"/>
+      </w:pPr>
+      <w:r>
+        <w:t xml:space="preserve">Furthermore, Tamera’s essay was classified as “pass” having a WER of 19.72% and CER of 9.50%, yet it contains too many spelling errors to be considered decipherable. This suggests that the evaluation logic should only classify output with a CER at or below 8% as “pass”. This threshold adjustment increased the number of essays assigned to manual marking, further weaking support for </w:t>
+      </w:r>
+      <w:proofErr w:type="spellStart"/>
+      <w:r>
+        <w:t>PaddleOCR</w:t>
+      </w:r>
+      <w:proofErr w:type="spellEnd"/>
+      <w:r>
+        <w:t xml:space="preserve"> inclusion. </w:t>
+      </w:r>
+    </w:p>
+    <w:p>
+      <w:pPr>
+        <w:spacing w:line="360" w:lineRule="auto"/>
+      </w:pPr>
+      <w:r>
+        <w:t xml:space="preserve">This revelation led to experimentation with a hybrid approach – Tr-OCR for text recognition and </w:t>
+      </w:r>
+      <w:proofErr w:type="spellStart"/>
+      <w:r>
+        <w:t>PaddleOCR’s</w:t>
+      </w:r>
+      <w:proofErr w:type="spellEnd"/>
+      <w:r>
+        <w:t xml:space="preserve"> detection model for text detection. </w:t>
       </w:r>
     </w:p>
     <w:p>
@@ -13628,7 +14143,7 @@
                     <pic:cNvPicPr/>
                   </pic:nvPicPr>
                   <pic:blipFill>
-                    <a:blip r:embed="rId14"/>
+                    <a:blip r:embed="rId15"/>
                     <a:stretch>
                       <a:fillRect/>
                     </a:stretch>
@@ -13757,7 +14272,7 @@
                     <pic:cNvPicPr/>
                   </pic:nvPicPr>
                   <pic:blipFill>
-                    <a:blip r:embed="rId15"/>
+                    <a:blip r:embed="rId16"/>
                     <a:stretch>
                       <a:fillRect/>
                     </a:stretch>
@@ -13980,7 +14495,7 @@
                     <pic:cNvPicPr/>
                   </pic:nvPicPr>
                   <pic:blipFill>
-                    <a:blip r:embed="rId16"/>
+                    <a:blip r:embed="rId17"/>
                     <a:stretch>
                       <a:fillRect/>
                     </a:stretch>
@@ -14080,7 +14595,7 @@
                     <pic:cNvPicPr/>
                   </pic:nvPicPr>
                   <pic:blipFill>
-                    <a:blip r:embed="rId17"/>
+                    <a:blip r:embed="rId18"/>
                     <a:stretch>
                       <a:fillRect/>
                     </a:stretch>
@@ -14208,7 +14723,7 @@
                     <pic:cNvPicPr/>
                   </pic:nvPicPr>
                   <pic:blipFill>
-                    <a:blip r:embed="rId18"/>
+                    <a:blip r:embed="rId19"/>
                     <a:stretch>
                       <a:fillRect/>
                     </a:stretch>
@@ -14273,7 +14788,7 @@
                     <pic:cNvPicPr/>
                   </pic:nvPicPr>
                   <pic:blipFill>
-                    <a:blip r:embed="rId19"/>
+                    <a:blip r:embed="rId20"/>
                     <a:stretch>
                       <a:fillRect/>
                     </a:stretch>
@@ -14507,7 +15022,7 @@
                     <pic:cNvPicPr/>
                   </pic:nvPicPr>
                   <pic:blipFill>
-                    <a:blip r:embed="rId20"/>
+                    <a:blip r:embed="rId21"/>
                     <a:stretch>
                       <a:fillRect/>
                     </a:stretch>
@@ -14567,7 +15082,7 @@
                     <pic:cNvPicPr/>
                   </pic:nvPicPr>
                   <pic:blipFill>
-                    <a:blip r:embed="rId21"/>
+                    <a:blip r:embed="rId22"/>
                     <a:stretch>
                       <a:fillRect/>
                     </a:stretch>
@@ -14650,7 +15165,7 @@
                     <pic:cNvPicPr/>
                   </pic:nvPicPr>
                   <pic:blipFill>
-                    <a:blip r:embed="rId22"/>
+                    <a:blip r:embed="rId23"/>
                     <a:stretch>
                       <a:fillRect/>
                     </a:stretch>
@@ -14754,7 +15269,33 @@
         <w:t xml:space="preserve"> the inclusion of Whisper in the AES pipeline as an assistive technology.</w:t>
       </w:r>
       <w:r>
-        <w:t xml:space="preserve"> They also prove that the evaluation logic works as intended, correctly</w:t>
+        <w:t xml:space="preserve"> </w:t>
+      </w:r>
+      <w:r>
+        <w:t xml:space="preserve">Forty percent (40%) of the spoken essays were accurately transcribed and forwarded to </w:t>
+      </w:r>
+      <w:proofErr w:type="spellStart"/>
+      <w:r>
+        <w:t>DeBERTa</w:t>
+      </w:r>
+      <w:proofErr w:type="spellEnd"/>
+      <w:r>
+        <w:t xml:space="preserve"> for scoring. This significantly reduced the human scorer’s workload down to sixty percent (60%). </w:t>
+      </w:r>
+      <w:r>
+        <w:t>The</w:t>
+      </w:r>
+      <w:r>
+        <w:t xml:space="preserve"> results also</w:t>
+      </w:r>
+      <w:r>
+        <w:t xml:space="preserve"> prove that the evaluation logic work</w:t>
+      </w:r>
+      <w:r>
+        <w:t>ed</w:t>
+      </w:r>
+      <w:r>
+        <w:t xml:space="preserve"> as intended, correctly</w:t>
       </w:r>
       <w:r>
         <w:t xml:space="preserve"> rout</w:t>
@@ -14766,28 +15307,49 @@
         <w:t xml:space="preserve"> transcriptions to the appropriate scorer based on their </w:t>
       </w:r>
       <w:r>
-        <w:t>evaluation status which is assigned based on their WER and CER percentage scores</w:t>
-      </w:r>
-      <w:r>
-        <w:t xml:space="preserve">. </w:t>
-      </w:r>
-      <w:r>
-        <w:t>Thus, the</w:t>
+        <w:t>evaluation status</w:t>
+      </w:r>
+      <w:r>
+        <w:t xml:space="preserve">, </w:t>
+      </w:r>
+      <w:r>
+        <w:t xml:space="preserve">assigned </w:t>
+      </w:r>
+      <w:r>
+        <w:t>after calculating the</w:t>
+      </w:r>
+      <w:r>
+        <w:t xml:space="preserve"> WER and CER</w:t>
+      </w:r>
+      <w:r>
+        <w:t>. The evaluation logic also prevented</w:t>
+      </w:r>
+      <w:r>
+        <w:t xml:space="preserve"> the</w:t>
       </w:r>
       <w:r>
         <w:t xml:space="preserve"> transformer</w:t>
       </w:r>
       <w:r>
-        <w:t xml:space="preserve"> was prevented </w:t>
+        <w:t xml:space="preserve"> </w:t>
       </w:r>
       <w:r>
         <w:t xml:space="preserve">from using up system resources to </w:t>
       </w:r>
       <w:r>
-        <w:t>inevitably, inaccurately score essays that should have been forwarded to the human scorer.</w:t>
-      </w:r>
-      <w:r>
-        <w:t xml:space="preserve"> </w:t>
+        <w:t xml:space="preserve">score essays that would </w:t>
+      </w:r>
+      <w:r>
+        <w:t>inevitably</w:t>
+      </w:r>
+      <w:r>
+        <w:t xml:space="preserve"> be</w:t>
+      </w:r>
+      <w:r>
+        <w:t xml:space="preserve"> inaccurately score</w:t>
+      </w:r>
+      <w:r>
+        <w:t xml:space="preserve">d due to the quality of the transcription. </w:t>
       </w:r>
     </w:p>
     <w:p>
@@ -14975,15 +15537,7 @@
     </w:p>
     <w:p>
       <w:r>
-        <w:t xml:space="preserve">Does the complete pipeline </w:t>
-      </w:r>
-      <w:proofErr w:type="gramStart"/>
-      <w:r>
-        <w:t>actually work</w:t>
-      </w:r>
-      <w:proofErr w:type="gramEnd"/>
-      <w:r>
-        <w:t>?</w:t>
+        <w:t>Does the complete pipeline actually work?</w:t>
       </w:r>
     </w:p>
     <w:p>
@@ -15117,15 +15671,7 @@
     </w:p>
     <w:p>
       <w:r>
-        <w:t xml:space="preserve">If you </w:t>
-      </w:r>
-      <w:proofErr w:type="gramStart"/>
-      <w:r>
-        <w:t>actually collect</w:t>
-      </w:r>
-      <w:proofErr w:type="gramEnd"/>
-      <w:r>
-        <w:t xml:space="preserve"> usability data, present the results graphically.</w:t>
+        <w:t>If you actually collect usability data, present the results graphically.</w:t>
       </w:r>
     </w:p>
     <w:p>
@@ -15453,17 +15999,8 @@
           <w:b/>
           <w:bCs/>
         </w:rPr>
-        <w:t xml:space="preserve">critical evaluation of the </w:t>
-      </w:r>
-      <w:proofErr w:type="gramStart"/>
-      <w:r>
-        <w:rPr>
-          <w:b/>
-          <w:bCs/>
-        </w:rPr>
-        <w:t>project as a whole</w:t>
-      </w:r>
-      <w:proofErr w:type="gramEnd"/>
+        <w:t>critical evaluation of the project as a whole</w:t>
+      </w:r>
       <w:r>
         <w:t>.</w:t>
       </w:r>
@@ -15863,15 +16400,7 @@
         <w:t xml:space="preserve"> images of essays submitted as separate files</w:t>
       </w:r>
       <w:r>
-        <w:t xml:space="preserve"> </w:t>
-      </w:r>
-      <w:proofErr w:type="gramStart"/>
-      <w:r>
-        <w:t>in to</w:t>
-      </w:r>
-      <w:proofErr w:type="gramEnd"/>
-      <w:r>
-        <w:t xml:space="preserve"> a single file and routes to the OCR component for processing. </w:t>
+        <w:t xml:space="preserve"> in to a single file and routes to the OCR component for processing. </w:t>
       </w:r>
     </w:p>
     <w:p>
@@ -21825,7 +22354,7 @@
                     <pic:cNvPicPr/>
                   </pic:nvPicPr>
                   <pic:blipFill>
-                    <a:blip r:embed="rId23"/>
+                    <a:blip r:embed="rId24"/>
                     <a:stretch>
                       <a:fillRect/>
                     </a:stretch>
@@ -21903,7 +22432,7 @@
                     <pic:cNvPicPr/>
                   </pic:nvPicPr>
                   <pic:blipFill>
-                    <a:blip r:embed="rId24"/>
+                    <a:blip r:embed="rId25"/>
                     <a:stretch>
                       <a:fillRect/>
                     </a:stretch>
@@ -22056,19 +22585,11 @@
       </w:r>
       <w:proofErr w:type="spellStart"/>
       <w:r>
-        <w:t>calculate_error_</w:t>
-      </w:r>
-      <w:proofErr w:type="gramStart"/>
-      <w:r>
-        <w:t>rates</w:t>
+        <w:t>calculate_error_rates</w:t>
       </w:r>
       <w:proofErr w:type="spellEnd"/>
       <w:r>
-        <w:t>(</w:t>
-      </w:r>
-      <w:proofErr w:type="gramEnd"/>
-      <w:r>
-        <w:t xml:space="preserve">) function, prior to the implementation of the OCR and ASR components. These metrics are essential to the operation of the evaluator functions in determining what output is fed to the transformer for further processing or returned to the human scorer for manual scoring.  </w:t>
+        <w:t xml:space="preserve">() function, prior to the implementation of the OCR and ASR components. These metrics are essential to the operation of the evaluator functions in determining what output is fed to the transformer for further processing or returned to the human scorer for manual scoring.  </w:t>
       </w:r>
     </w:p>
     <w:p>
@@ -22097,15 +22618,7 @@
         <w:spacing w:line="360" w:lineRule="auto"/>
       </w:pPr>
       <w:r>
-        <w:t xml:space="preserve">For efficiency, scalability and modularity, a </w:t>
-      </w:r>
-      <w:proofErr w:type="gramStart"/>
-      <w:r>
-        <w:t>class based</w:t>
-      </w:r>
-      <w:proofErr w:type="gramEnd"/>
-      <w:r>
-        <w:t xml:space="preserve"> approach – the </w:t>
+        <w:t xml:space="preserve">For efficiency, scalability and modularity, a class based approach – the </w:t>
       </w:r>
       <w:proofErr w:type="spellStart"/>
       <w:r>
@@ -22140,7 +22653,7 @@
                     <pic:cNvPicPr/>
                   </pic:nvPicPr>
                   <pic:blipFill>
-                    <a:blip r:embed="rId25"/>
+                    <a:blip r:embed="rId26"/>
                     <a:stretch>
                       <a:fillRect/>
                     </a:stretch>
@@ -22174,15 +22687,7 @@
         <w:spacing w:line="360" w:lineRule="auto"/>
       </w:pPr>
       <w:r>
-        <w:t xml:space="preserve">Some members of the sample use the spoken form slash to represent ‘/’, while others use ‘or’. The </w:t>
-      </w:r>
-      <w:proofErr w:type="gramStart"/>
-      <w:r>
-        <w:t>normalise(</w:t>
-      </w:r>
-      <w:proofErr w:type="gramEnd"/>
-      <w:r>
-        <w:t xml:space="preserve">) method of the </w:t>
+        <w:t xml:space="preserve">Some members of the sample use the spoken form slash to represent ‘/’, while others use ‘or’. The normalise() method of the </w:t>
       </w:r>
       <w:proofErr w:type="spellStart"/>
       <w:r>
@@ -22218,7 +22723,7 @@
                     <pic:cNvPicPr/>
                   </pic:nvPicPr>
                   <pic:blipFill>
-                    <a:blip r:embed="rId26"/>
+                    <a:blip r:embed="rId27"/>
                     <a:stretch>
                       <a:fillRect/>
                     </a:stretch>
@@ -22256,19 +22761,11 @@
       </w:r>
       <w:proofErr w:type="spellStart"/>
       <w:r>
-        <w:t>show_edit_</w:t>
-      </w:r>
-      <w:proofErr w:type="gramStart"/>
-      <w:r>
-        <w:t>log</w:t>
+        <w:t>show_edit_log</w:t>
       </w:r>
       <w:proofErr w:type="spellEnd"/>
       <w:r>
-        <w:t>(</w:t>
-      </w:r>
-      <w:proofErr w:type="gramEnd"/>
-      <w:r>
-        <w:t xml:space="preserve">) method is invoked. </w:t>
+        <w:t xml:space="preserve">() method is invoked. </w:t>
       </w:r>
     </w:p>
     <w:p>
@@ -22504,15 +23001,7 @@
         <w:spacing w:line="360" w:lineRule="auto"/>
       </w:pPr>
       <w:r>
-        <w:t xml:space="preserve">Obtain the best performing model with respect to inference time, and storage footprint </w:t>
-      </w:r>
-      <w:proofErr w:type="gramStart"/>
-      <w:r>
-        <w:t>and  transcription</w:t>
-      </w:r>
-      <w:proofErr w:type="gramEnd"/>
-      <w:r>
-        <w:t xml:space="preserve"> accuracy</w:t>
+        <w:t>Obtain the best performing model with respect to inference time, and storage footprint and  transcription accuracy</w:t>
       </w:r>
     </w:p>
     <w:p>
@@ -22593,7 +23082,7 @@
                     <pic:cNvPicPr/>
                   </pic:nvPicPr>
                   <pic:blipFill>
-                    <a:blip r:embed="rId14"/>
+                    <a:blip r:embed="rId15"/>
                     <a:stretch>
                       <a:fillRect/>
                     </a:stretch>
@@ -22678,7 +23167,7 @@
                     <pic:cNvPicPr/>
                   </pic:nvPicPr>
                   <pic:blipFill rotWithShape="1">
-                    <a:blip r:embed="rId27"/>
+                    <a:blip r:embed="rId28"/>
                     <a:srcRect r="5389"/>
                     <a:stretch>
                       <a:fillRect/>
@@ -22991,7 +23480,7 @@
                     <pic:cNvPicPr/>
                   </pic:nvPicPr>
                   <pic:blipFill>
-                    <a:blip r:embed="rId28"/>
+                    <a:blip r:embed="rId29"/>
                     <a:stretch>
                       <a:fillRect/>
                     </a:stretch>
@@ -23182,7 +23671,7 @@
                     <pic:cNvPicPr/>
                   </pic:nvPicPr>
                   <pic:blipFill>
-                    <a:blip r:embed="rId29"/>
+                    <a:blip r:embed="rId30"/>
                     <a:stretch>
                       <a:fillRect/>
                     </a:stretch>
@@ -23268,7 +23757,7 @@
                     <pic:cNvPicPr/>
                   </pic:nvPicPr>
                   <pic:blipFill>
-                    <a:blip r:embed="rId18"/>
+                    <a:blip r:embed="rId19"/>
                     <a:stretch>
                       <a:fillRect/>
                     </a:stretch>
@@ -23319,7 +23808,7 @@
                     <pic:cNvPicPr/>
                   </pic:nvPicPr>
                   <pic:blipFill>
-                    <a:blip r:embed="rId19"/>
+                    <a:blip r:embed="rId20"/>
                     <a:stretch>
                       <a:fillRect/>
                     </a:stretch>
@@ -23372,7 +23861,7 @@
                     <pic:cNvPicPr/>
                   </pic:nvPicPr>
                   <pic:blipFill>
-                    <a:blip r:embed="rId30"/>
+                    <a:blip r:embed="rId31"/>
                     <a:stretch>
                       <a:fillRect/>
                     </a:stretch>
@@ -23429,7 +23918,7 @@
                     <pic:cNvPicPr/>
                   </pic:nvPicPr>
                   <pic:blipFill>
-                    <a:blip r:embed="rId20"/>
+                    <a:blip r:embed="rId21"/>
                     <a:stretch>
                       <a:fillRect/>
                     </a:stretch>
@@ -23474,7 +23963,7 @@
                     <pic:cNvPicPr/>
                   </pic:nvPicPr>
                   <pic:blipFill>
-                    <a:blip r:embed="rId21"/>
+                    <a:blip r:embed="rId22"/>
                     <a:stretch>
                       <a:fillRect/>
                     </a:stretch>
@@ -23535,7 +24024,7 @@
                     <pic:cNvPicPr/>
                   </pic:nvPicPr>
                   <pic:blipFill>
-                    <a:blip r:embed="rId22"/>
+                    <a:blip r:embed="rId23"/>
                     <a:stretch>
                       <a:fillRect/>
                     </a:stretch>
@@ -23583,7 +24072,7 @@
       </w:r>
     </w:p>
     <w:sectPr>
-      <w:footerReference w:type="default" r:id="rId31"/>
+      <w:footerReference w:type="default" r:id="rId32"/>
       <w:pgSz w:w="11906" w:h="16838"/>
       <w:pgMar w:top="1440" w:right="1440" w:bottom="1440" w:left="1440" w:header="708" w:footer="708" w:gutter="0"/>
       <w:cols w:space="708"/>

</xml_diff>

<commit_message>
Updated Chapter 5 Evaluation, completed input component development
</commit_message>
<xml_diff>
--- a/final report/Final Report.docx
+++ b/final report/Final Report.docx
@@ -5759,10 +5759,18 @@
         <w:t xml:space="preserve">er </w:t>
       </w:r>
       <w:r>
-        <w:t xml:space="preserve">[18] </w:t>
-      </w:r>
-      <w:r>
-        <w:t>. For translation tasks, the Transformer can be trained significantly faster than architectures based on recurrent or convolutional layers</w:t>
+        <w:t>[18</w:t>
+      </w:r>
+      <w:proofErr w:type="gramStart"/>
+      <w:r>
+        <w:t xml:space="preserve">] </w:t>
+      </w:r>
+      <w:r>
+        <w:t>.</w:t>
+      </w:r>
+      <w:proofErr w:type="gramEnd"/>
+      <w:r>
+        <w:t xml:space="preserve"> For translation tasks, the Transformer can be trained significantly faster than architectures based on recurrent or convolutional layers</w:t>
       </w:r>
       <w:r>
         <w:t xml:space="preserve"> </w:t>
@@ -6868,12 +6876,17 @@
         <w:t xml:space="preserve"> python library to assess the performance of Whisper (Open Ai), </w:t>
       </w:r>
       <w:proofErr w:type="spellStart"/>
+      <w:proofErr w:type="gramStart"/>
       <w:r>
         <w:t>NeMo</w:t>
       </w:r>
       <w:proofErr w:type="spellEnd"/>
       <w:r>
-        <w:t>(NVIDIA) an Wav2Vec2.0(Meta Ai) in transcribing spontaneous as well as read speech fr</w:t>
+        <w:t>(</w:t>
+      </w:r>
+      <w:proofErr w:type="gramEnd"/>
+      <w:r>
+        <w:t>NVIDIA) an Wav2Vec2.0(Meta Ai) in transcribing spontaneous as well as read speech fr</w:t>
       </w:r>
       <w:r>
         <w:t>o</w:t>
@@ -7100,8 +7113,13 @@
       <w:r>
         <w:t xml:space="preserve"> </w:t>
       </w:r>
-      <w:r>
-        <w:t xml:space="preserve">Yang  [4], used QWK in analysing the results of cross prompt AES models. </w:t>
+      <w:proofErr w:type="gramStart"/>
+      <w:r>
+        <w:t>Yang  [</w:t>
+      </w:r>
+      <w:proofErr w:type="gramEnd"/>
+      <w:r>
+        <w:t xml:space="preserve">4], used QWK in analysing the results of cross prompt AES models. </w:t>
       </w:r>
       <w:proofErr w:type="spellStart"/>
       <w:r>
@@ -9637,7 +9655,13 @@
         <w:t xml:space="preserve">This design precludes having two separate classes – one for development and the other for the live system. </w:t>
       </w:r>
       <w:r>
-        <w:t xml:space="preserve">These metrics are the average log probability and compression ratio obtain from Whisper and the confidence scores obtained </w:t>
+        <w:t>These metrics are the average log probability and compression ratio obtain</w:t>
+      </w:r>
+      <w:r>
+        <w:t>ed</w:t>
+      </w:r>
+      <w:r>
+        <w:t xml:space="preserve"> from Whisper and the confidence scores obtained </w:t>
       </w:r>
       <w:r>
         <w:t>from</w:t>
@@ -10162,13 +10186,10 @@
         <w:t xml:space="preserve">The </w:t>
       </w:r>
       <w:r>
-        <w:t xml:space="preserve">path to the dataset </w:t>
-      </w:r>
-      <w:r>
-        <w:t>was</w:t>
-      </w:r>
-      <w:r>
-        <w:t xml:space="preserve"> passed to pandas </w:t>
+        <w:t>system utilized the pandas</w:t>
+      </w:r>
+      <w:r>
+        <w:t xml:space="preserve"> </w:t>
       </w:r>
       <w:proofErr w:type="spellStart"/>
       <w:r>
@@ -10302,16 +10323,13 @@
         <w:spacing w:line="360" w:lineRule="auto"/>
       </w:pPr>
       <w:r>
-        <w:t xml:space="preserve"> </w:t>
-      </w:r>
-      <w:r>
-        <w:t xml:space="preserve">All output text </w:t>
-      </w:r>
-      <w:r>
-        <w:t>was</w:t>
-      </w:r>
-      <w:r>
-        <w:t xml:space="preserve"> passed as an argument to the </w:t>
+        <w:t>The pipeline</w:t>
+      </w:r>
+      <w:r>
+        <w:t xml:space="preserve"> passed a</w:t>
+      </w:r>
+      <w:r>
+        <w:t xml:space="preserve">ll output text to the </w:t>
       </w:r>
       <w:proofErr w:type="spellStart"/>
       <w:r>
@@ -10654,10 +10672,10 @@
     </w:p>
     <w:p>
       <w:r>
-        <w:t xml:space="preserve">The model was loaded by </w:t>
-      </w:r>
-      <w:r>
-        <w:t xml:space="preserve">firstly, </w:t>
+        <w:t>Implementation began by</w:t>
+      </w:r>
+      <w:r>
+        <w:t xml:space="preserve"> </w:t>
       </w:r>
       <w:r>
         <w:t xml:space="preserve">initialising a </w:t>
@@ -10674,13 +10692,7 @@
         <w:t>The parameters</w:t>
       </w:r>
       <w:r>
-        <w:t xml:space="preserve">, PP_OCRv6_medium_det and </w:t>
-      </w:r>
-      <w:r>
-        <w:t>PP_OCRv6_medium_</w:t>
-      </w:r>
-      <w:r>
-        <w:t xml:space="preserve">rec, were selected as the </w:t>
+        <w:t xml:space="preserve">, PP_OCRv6_medium_det and PP_OCRv6_medium_rec, were selected as the </w:t>
       </w:r>
       <w:r>
         <w:t xml:space="preserve">detection and recognition </w:t>
@@ -10874,14 +10886,7 @@
           <w:b/>
           <w:bCs/>
         </w:rPr>
-        <w:t>text_det_limit_side_</w:t>
-      </w:r>
-      <w:r>
-        <w:rPr>
-          <w:b/>
-          <w:bCs/>
-        </w:rPr>
-        <w:t>len</w:t>
+        <w:t>text_det_limit_side_len</w:t>
       </w:r>
       <w:proofErr w:type="spellEnd"/>
       <w:r>
@@ -10905,14 +10910,7 @@
           <w:b/>
           <w:bCs/>
         </w:rPr>
-        <w:t>_det_box_</w:t>
-      </w:r>
-      <w:r>
-        <w:rPr>
-          <w:b/>
-          <w:bCs/>
-        </w:rPr>
-        <w:t>thresh</w:t>
+        <w:t>_det_box_thresh</w:t>
       </w:r>
       <w:proofErr w:type="spellEnd"/>
       <w:r>
@@ -11033,11 +11031,22 @@
       </w:r>
       <w:proofErr w:type="spellStart"/>
       <w:r>
+        <w:rPr>
+          <w:b/>
+          <w:bCs/>
+        </w:rPr>
         <w:t>EssayEditor</w:t>
       </w:r>
       <w:proofErr w:type="spellEnd"/>
       <w:r>
-        <w:t xml:space="preserve"> object which allowed the output text to be normalised.  This object, along with all other metadata for a processed file, was stored in the</w:t>
+        <w:rPr>
+          <w:b/>
+          <w:bCs/>
+        </w:rPr>
+        <w:t xml:space="preserve"> </w:t>
+      </w:r>
+      <w:r>
+        <w:t>object which allowed the output text to be normalised.  This object, along with all other metadata for a processed file, was stored in the</w:t>
       </w:r>
       <w:r>
         <w:rPr>
@@ -11059,6 +11068,10 @@
       </w:r>
       <w:proofErr w:type="spellStart"/>
       <w:r>
+        <w:rPr>
+          <w:b/>
+          <w:bCs/>
+        </w:rPr>
         <w:t>BatchDataOperator</w:t>
       </w:r>
       <w:proofErr w:type="spellEnd"/>
@@ -11101,15 +11114,33 @@
     </w:p>
     <w:p>
       <w:r>
-        <w:t xml:space="preserve">The </w:t>
+        <w:t>The</w:t>
+      </w:r>
+      <w:r>
+        <w:rPr>
+          <w:b/>
+          <w:bCs/>
+        </w:rPr>
+        <w:t xml:space="preserve"> </w:t>
       </w:r>
       <w:proofErr w:type="spellStart"/>
       <w:r>
+        <w:rPr>
+          <w:b/>
+          <w:bCs/>
+        </w:rPr>
         <w:t>calculate_wer_and_cer_rates</w:t>
       </w:r>
       <w:proofErr w:type="spellEnd"/>
       <w:r>
-        <w:t xml:space="preserve">() function was invoked </w:t>
+        <w:rPr>
+          <w:b/>
+          <w:bCs/>
+        </w:rPr>
+        <w:t xml:space="preserve"> </w:t>
+      </w:r>
+      <w:r>
+        <w:t xml:space="preserve">function was invoked </w:t>
       </w:r>
       <w:r>
         <w:t xml:space="preserve">and passed the reference essay and the normalised output from </w:t>
@@ -11124,6 +11155,10 @@
       </w:r>
       <w:proofErr w:type="spellStart"/>
       <w:r>
+        <w:rPr>
+          <w:b/>
+          <w:bCs/>
+        </w:rPr>
         <w:t>jiwer</w:t>
       </w:r>
       <w:proofErr w:type="spellEnd"/>
@@ -11158,7 +11193,37 @@
       </w:pPr>
       <w:r>
         <w:lastRenderedPageBreak/>
-        <w:t xml:space="preserve">The logic correctly classified output that had either WER or CER percentage scores below their respective thresholds and “pass” and “fail” otherwise. This resulted in the essays classified as “fail” being assigned for manual scoring and the other for </w:t>
+        <w:t xml:space="preserve">The logic correctly classified output that had either WER or CER percentage scores below their respective thresholds </w:t>
+      </w:r>
+      <w:r>
+        <w:t>as</w:t>
+      </w:r>
+      <w:r>
+        <w:t xml:space="preserve"> “pass”</w:t>
+      </w:r>
+      <w:r>
+        <w:t>,</w:t>
+      </w:r>
+      <w:r>
+        <w:t xml:space="preserve"> and “fail” otherwise. </w:t>
+      </w:r>
+      <w:r>
+        <w:t>The</w:t>
+      </w:r>
+      <w:r>
+        <w:t xml:space="preserve"> essays classified as “fail”</w:t>
+      </w:r>
+      <w:r>
+        <w:t xml:space="preserve">, were correctly </w:t>
+      </w:r>
+      <w:r>
+        <w:t xml:space="preserve">assigned for manual scoring and </w:t>
+      </w:r>
+      <w:r>
+        <w:t>those classified as “pass” were forwarded to</w:t>
+      </w:r>
+      <w:r>
+        <w:t xml:space="preserve"> </w:t>
       </w:r>
       <w:proofErr w:type="spellStart"/>
       <w:r>
@@ -11166,7 +11231,19 @@
       </w:r>
       <w:proofErr w:type="spellEnd"/>
       <w:r>
-        <w:t xml:space="preserve"> to score. </w:t>
+        <w:t xml:space="preserve"> </w:t>
+      </w:r>
+      <w:r>
+        <w:t>for</w:t>
+      </w:r>
+      <w:r>
+        <w:t xml:space="preserve"> scor</w:t>
+      </w:r>
+      <w:r>
+        <w:t>ing</w:t>
+      </w:r>
+      <w:r>
+        <w:t xml:space="preserve">. </w:t>
       </w:r>
       <w:r>
         <w:br w:type="page"/>
@@ -11566,7 +11643,10 @@
         <w:t>of</w:t>
       </w:r>
       <w:r>
-        <w:t xml:space="preserve"> 5</w:t>
+        <w:t xml:space="preserve"> </w:t>
+      </w:r>
+      <w:r>
+        <w:t>2</w:t>
       </w:r>
       <w:r>
         <w:t>,</w:t>
@@ -11602,15 +11682,29 @@
         <w:t>did not have to spend compute cycles detecting</w:t>
       </w:r>
       <w:r>
-        <w:t xml:space="preserve"> the language. Setting the beam size to 5</w:t>
-      </w:r>
-      <w:r>
-        <w:t xml:space="preserve"> improved transcription accuracy by allowing the model to explore a wider range of candidate word sequences during decoding.</w:t>
+        <w:t xml:space="preserve"> the language. Setting the beam size to </w:t>
+      </w:r>
+      <w:r>
+        <w:t>5</w:t>
       </w:r>
       <w:r>
         <w:t xml:space="preserve"> </w:t>
       </w:r>
       <w:r>
+        <w:t>provided the best balance between accuracy and computational efficiency</w:t>
+      </w:r>
+      <w:r>
+        <w:t>.</w:t>
+      </w:r>
+    </w:p>
+    <w:p>
+      <w:pPr>
+        <w:spacing w:line="360" w:lineRule="auto"/>
+      </w:pPr>
+      <w:r>
+        <w:t xml:space="preserve"> </w:t>
+      </w:r>
+      <w:r>
         <w:t>Finally s</w:t>
       </w:r>
       <w:r>
@@ -11679,11 +11773,11 @@
         <w:t>)</w:t>
       </w:r>
       <w:r>
-        <w:t xml:space="preserve"> function on the output of a list comprehension, which extracted individual text segments from </w:t>
+        <w:t xml:space="preserve"> </w:t>
       </w:r>
       <w:r>
         <w:lastRenderedPageBreak/>
-        <w:t xml:space="preserve">Whisper’s segment generator. The combined string was then passed as an </w:t>
+        <w:t xml:space="preserve">function on the output of a list comprehension, which extracted individual text segments from Whisper’s segment generator. The combined string was then passed as an </w:t>
       </w:r>
       <w:r>
         <w:t xml:space="preserve">argument to </w:t>
@@ -12288,25 +12382,47 @@
         </w:rPr>
         <w:t xml:space="preserve"> is for development, </w:t>
       </w:r>
+      <w:proofErr w:type="gramStart"/>
       <w:r>
         <w:rPr>
           <w:color w:val="EE0000"/>
         </w:rPr>
-        <w:t xml:space="preserve">Explain </w:t>
+        <w:t>Explain</w:t>
+      </w:r>
+      <w:proofErr w:type="gramEnd"/>
+      <w:r>
+        <w:rPr>
+          <w:color w:val="EE0000"/>
+        </w:rPr>
+        <w:t xml:space="preserve"> </w:t>
       </w:r>
       <w:proofErr w:type="spellStart"/>
       <w:r>
         <w:rPr>
           <w:color w:val="EE0000"/>
         </w:rPr>
-        <w:t>update_eval_stats</w:t>
+        <w:t>update_eval_</w:t>
+      </w:r>
+      <w:proofErr w:type="gramStart"/>
+      <w:r>
+        <w:rPr>
+          <w:color w:val="EE0000"/>
+        </w:rPr>
+        <w:t>stats</w:t>
       </w:r>
       <w:proofErr w:type="spellEnd"/>
       <w:r>
         <w:rPr>
           <w:color w:val="EE0000"/>
         </w:rPr>
-        <w:t xml:space="preserve">() and how robust it is, thresholds can change it merely used the pass fail against </w:t>
+        <w:t>(</w:t>
+      </w:r>
+      <w:proofErr w:type="gramEnd"/>
+      <w:r>
+        <w:rPr>
+          <w:color w:val="EE0000"/>
+        </w:rPr>
+        <w:t xml:space="preserve">) and how robust it is, thresholds can change it merely used the pass fail against </w:t>
       </w:r>
       <w:proofErr w:type="spellStart"/>
       <w:r>
@@ -13076,7 +13192,10 @@
         <w:t xml:space="preserve">population of </w:t>
       </w:r>
       <w:r>
-        <w:t>30 studen</w:t>
+        <w:t>28</w:t>
+      </w:r>
+      <w:r>
+        <w:t xml:space="preserve"> studen</w:t>
       </w:r>
       <w:r>
         <w:t xml:space="preserve">ts </w:t>
@@ -13159,13 +13278,16 @@
         <w:t>This produced</w:t>
       </w:r>
       <w:r>
-        <w:t xml:space="preserve"> a total of sixty (60) samples - thirty (</w:t>
-      </w:r>
-      <w:r>
-        <w:t>30</w:t>
-      </w:r>
-      <w:r>
-        <w:t>)</w:t>
+        <w:t xml:space="preserve"> a total of </w:t>
+      </w:r>
+      <w:r>
+        <w:t xml:space="preserve">fifty-six </w:t>
+      </w:r>
+      <w:r>
+        <w:t>samples</w:t>
+      </w:r>
+      <w:r>
+        <w:t>, twenty-eight</w:t>
       </w:r>
       <w:r>
         <w:t xml:space="preserve"> </w:t>
@@ -13174,16 +13296,13 @@
         <w:t xml:space="preserve">handwritten and </w:t>
       </w:r>
       <w:r>
-        <w:t>thirty (</w:t>
-      </w:r>
-      <w:r>
-        <w:t>30</w:t>
-      </w:r>
-      <w:r>
-        <w:t>)</w:t>
-      </w:r>
-      <w:r>
-        <w:t xml:space="preserve"> spoken</w:t>
+        <w:t>twenty-eight</w:t>
+      </w:r>
+      <w:r>
+        <w:t xml:space="preserve"> </w:t>
+      </w:r>
+      <w:r>
+        <w:t>spoken</w:t>
       </w:r>
       <w:r>
         <w:t>,</w:t>
@@ -13236,31 +13355,40 @@
         <w:t xml:space="preserve">omparing </w:t>
       </w:r>
       <w:r>
-        <w:t>thirty (</w:t>
-      </w:r>
-      <w:r>
-        <w:t>30</w:t>
-      </w:r>
-      <w:r>
-        <w:t>)</w:t>
-      </w:r>
-      <w:r>
-        <w:t xml:space="preserve"> audio transcriptions to </w:t>
-      </w:r>
-      <w:r>
-        <w:t>thirty (</w:t>
-      </w:r>
-      <w:r>
-        <w:t>30</w:t>
-      </w:r>
-      <w:r>
-        <w:t>)</w:t>
-      </w:r>
-      <w:r>
-        <w:t xml:space="preserve"> representations</w:t>
-      </w:r>
-      <w:r>
-        <w:t xml:space="preserve"> of the same essay from the same individuals </w:t>
+        <w:t>twenty-eight</w:t>
+      </w:r>
+      <w:r>
+        <w:t xml:space="preserve"> audio transcriptions </w:t>
+      </w:r>
+      <w:r>
+        <w:t>and</w:t>
+      </w:r>
+      <w:r>
+        <w:t xml:space="preserve"> </w:t>
+      </w:r>
+      <w:r>
+        <w:t>twenty-eight</w:t>
+      </w:r>
+      <w:r>
+        <w:t xml:space="preserve"> </w:t>
+      </w:r>
+      <w:r>
+        <w:t xml:space="preserve">sample of recognised text, </w:t>
+      </w:r>
+      <w:r>
+        <w:t>of the same essay</w:t>
+      </w:r>
+      <w:r>
+        <w:t xml:space="preserve">, </w:t>
+      </w:r>
+      <w:r>
+        <w:t xml:space="preserve">all </w:t>
+      </w:r>
+      <w:r>
+        <w:t>from</w:t>
+      </w:r>
+      <w:r>
+        <w:t xml:space="preserve"> the same individuals </w:t>
       </w:r>
       <w:r>
         <w:t>produced</w:t>
@@ -13422,6 +13550,7 @@
         </w:rPr>
       </w:pPr>
       <w:r>
+        <w:lastRenderedPageBreak/>
         <w:br w:type="page"/>
       </w:r>
     </w:p>
@@ -13451,10 +13580,7 @@
         <w:t xml:space="preserve">Keep </w:t>
       </w:r>
       <w:r>
-        <w:t xml:space="preserve">this, </w:t>
-      </w:r>
-      <w:r>
-        <w:t>but</w:t>
+        <w:t>this but</w:t>
       </w:r>
       <w:r>
         <w:t xml:space="preserve"> </w:t>
@@ -13586,21 +13712,19 @@
     </w:p>
     <w:p>
       <w:pPr>
-        <w:spacing w:line="360" w:lineRule="auto"/>
-        <w:rPr>
-          <w:b/>
-          <w:bCs/>
-        </w:rPr>
-      </w:pPr>
-      <w:r>
-        <w:rPr>
-          <w:b/>
-          <w:bCs/>
+        <w:keepNext/>
+        <w:spacing w:line="360" w:lineRule="auto"/>
+      </w:pPr>
+      <w:r>
+        <w:rPr>
+          <w:b/>
+          <w:bCs/>
+          <w:noProof/>
         </w:rPr>
         <w:drawing>
-          <wp:inline distT="0" distB="0" distL="0" distR="0" wp14:anchorId="4C974334" wp14:editId="61FA0DB6">
-            <wp:extent cx="2124371" cy="523948"/>
-            <wp:effectExtent l="0" t="0" r="9525" b="9525"/>
+          <wp:inline distT="0" distB="0" distL="0" distR="0" wp14:anchorId="4C974334" wp14:editId="4ACB14FD">
+            <wp:extent cx="2096219" cy="517004"/>
+            <wp:effectExtent l="0" t="0" r="0" b="0"/>
             <wp:docPr id="210515010" name="Picture 1"/>
             <wp:cNvGraphicFramePr>
               <a:graphicFrameLocks xmlns:a="http://schemas.openxmlformats.org/drawingml/2006/main" noChangeAspect="1"/>
@@ -13621,7 +13745,7 @@
                   <pic:spPr>
                     <a:xfrm>
                       <a:off x="0" y="0"/>
-                      <a:ext cx="2124371" cy="523948"/>
+                      <a:ext cx="2108345" cy="519995"/>
                     </a:xfrm>
                     <a:prstGeom prst="rect">
                       <a:avLst/>
@@ -13636,16 +13760,34 @@
     </w:p>
     <w:p>
       <w:pPr>
+        <w:pStyle w:val="Caption"/>
+        <w:rPr>
+          <w:b/>
+          <w:bCs/>
+        </w:rPr>
+      </w:pPr>
+      <w:r>
+        <w:t>Figure 5.</w:t>
+      </w:r>
+      <w:r>
+        <w:t>4.</w:t>
+      </w:r>
+      <w:r>
+        <w:t>1</w:t>
+      </w:r>
+      <w:r>
+        <w:t xml:space="preserve"> List of parameter configurations for parameter selection</w:t>
+      </w:r>
+    </w:p>
+    <w:p>
+      <w:pPr>
         <w:spacing w:line="360" w:lineRule="auto"/>
       </w:pPr>
       <w:r>
         <w:t xml:space="preserve">Three </w:t>
       </w:r>
       <w:r>
-        <w:t>parameter configurations</w:t>
-      </w:r>
-      <w:r>
-        <w:t xml:space="preserve">, for </w:t>
+        <w:t xml:space="preserve">parameter configurations, for </w:t>
       </w:r>
       <w:proofErr w:type="spellStart"/>
       <w:r>
@@ -13681,310 +13823,620 @@
       </w:r>
       <w:proofErr w:type="spellEnd"/>
       <w:r>
-        <w:t>, respectively</w:t>
+        <w:t xml:space="preserve">, respectively, </w:t>
+      </w:r>
+      <w:r>
+        <w:t xml:space="preserve">as shown in </w:t>
+      </w:r>
+      <w:r>
+        <w:t>figure 5</w:t>
+      </w:r>
+      <w:r>
+        <w:t>.</w:t>
+      </w:r>
+      <w:r>
+        <w:t>1</w:t>
+      </w:r>
+      <w:r>
+        <w:t xml:space="preserve"> above</w:t>
+      </w:r>
+      <w:r>
+        <w:t xml:space="preserve">, were tested on </w:t>
+      </w:r>
+      <w:r>
+        <w:t>five</w:t>
+      </w:r>
+      <w:r>
+        <w:t xml:space="preserve"> sample handwritten essay</w:t>
+      </w:r>
+      <w:r>
+        <w:t>s</w:t>
+      </w:r>
+      <w:r>
+        <w:t xml:space="preserve">. The </w:t>
+      </w:r>
+      <w:r>
+        <w:t>configuration that achieved the lowest average WER and CER</w:t>
+      </w:r>
+      <w:r>
+        <w:t>,</w:t>
+      </w:r>
+      <w:r>
+        <w:t xml:space="preserve"> </w:t>
+      </w:r>
+      <w:r>
+        <w:t>was</w:t>
+      </w:r>
+      <w:r>
+        <w:t xml:space="preserve"> </w:t>
+      </w:r>
+      <w:r>
+        <w:t xml:space="preserve">implemented </w:t>
+      </w:r>
+      <w:r>
+        <w:t xml:space="preserve">to </w:t>
+      </w:r>
+      <w:r>
+        <w:t xml:space="preserve">process the batch of essays. </w:t>
+      </w:r>
+    </w:p>
+    <w:p>
+      <w:pPr>
+        <w:spacing w:line="360" w:lineRule="auto"/>
+      </w:pPr>
+      <w:r>
+        <w:t xml:space="preserve">A visual inspection of the detected regions was done to determine if the detection model, accurately identified areas in the image where there was text. </w:t>
+      </w:r>
+      <w:r>
+        <w:t>Figure</w:t>
+      </w:r>
+      <w:r>
+        <w:t xml:space="preserve"> 5.4.2 confirms that the best performing configuration also accurately selected text regions. </w:t>
+      </w:r>
+    </w:p>
+    <w:p>
+      <w:pPr>
+        <w:spacing w:line="360" w:lineRule="auto"/>
+      </w:pPr>
+      <w:r>
+        <w:drawing>
+          <wp:inline distT="0" distB="0" distL="0" distR="0" wp14:anchorId="4D2FA287" wp14:editId="695E629D">
+            <wp:extent cx="5731510" cy="2190115"/>
+            <wp:effectExtent l="0" t="0" r="2540" b="635"/>
+            <wp:docPr id="2075511345" name="Picture 1"/>
+            <wp:cNvGraphicFramePr>
+              <a:graphicFrameLocks xmlns:a="http://schemas.openxmlformats.org/drawingml/2006/main" noChangeAspect="1"/>
+            </wp:cNvGraphicFramePr>
+            <a:graphic xmlns:a="http://schemas.openxmlformats.org/drawingml/2006/main">
+              <a:graphicData uri="http://schemas.openxmlformats.org/drawingml/2006/picture">
+                <pic:pic xmlns:pic="http://schemas.openxmlformats.org/drawingml/2006/picture">
+                  <pic:nvPicPr>
+                    <pic:cNvPr id="2075511345" name=""/>
+                    <pic:cNvPicPr/>
+                  </pic:nvPicPr>
+                  <pic:blipFill>
+                    <a:blip r:embed="rId15"/>
+                    <a:stretch>
+                      <a:fillRect/>
+                    </a:stretch>
+                  </pic:blipFill>
+                  <pic:spPr>
+                    <a:xfrm>
+                      <a:off x="0" y="0"/>
+                      <a:ext cx="5731510" cy="2190115"/>
+                    </a:xfrm>
+                    <a:prstGeom prst="rect">
+                      <a:avLst/>
+                    </a:prstGeom>
+                  </pic:spPr>
+                </pic:pic>
+              </a:graphicData>
+            </a:graphic>
+          </wp:inline>
+        </w:drawing>
+      </w:r>
+    </w:p>
+    <w:p>
+      <w:pPr>
+        <w:spacing w:line="360" w:lineRule="auto"/>
+      </w:pPr>
+    </w:p>
+    <w:p>
+      <w:pPr>
+        <w:spacing w:line="360" w:lineRule="auto"/>
+        <w:rPr>
+          <w:b/>
+          <w:bCs/>
+        </w:rPr>
+      </w:pPr>
+      <w:r>
+        <w:rPr>
+          <w:b/>
+          <w:bCs/>
+        </w:rPr>
+        <w:t>5.</w:t>
+      </w:r>
+      <w:r>
+        <w:rPr>
+          <w:b/>
+          <w:bCs/>
+        </w:rPr>
+        <w:t>4</w:t>
+      </w:r>
+      <w:r>
+        <w:rPr>
+          <w:b/>
+          <w:bCs/>
+        </w:rPr>
+        <w:t>.2 OCR Results</w:t>
+      </w:r>
+    </w:p>
+    <w:p>
+      <w:pPr>
+        <w:spacing w:line="360" w:lineRule="auto"/>
+      </w:pPr>
+      <w:r>
+        <w:t xml:space="preserve">Initially, every output was classified as “fail” when evaluated. The main reason being, </w:t>
+      </w:r>
+      <w:r>
+        <w:t xml:space="preserve">the CER and WER thresholds </w:t>
+      </w:r>
+      <w:r>
+        <w:t xml:space="preserve">were too low </w:t>
+      </w:r>
+      <w:r>
+        <w:t>and the requirement</w:t>
+      </w:r>
+      <w:r>
+        <w:t xml:space="preserve"> for</w:t>
+      </w:r>
+      <w:r>
+        <w:t xml:space="preserve"> the output’s WER and CER </w:t>
+      </w:r>
+      <w:r>
+        <w:t xml:space="preserve">to </w:t>
+      </w:r>
+      <w:r>
+        <w:t>both be below their respective threshold</w:t>
+      </w:r>
+      <w:r>
+        <w:t xml:space="preserve">.  </w:t>
+      </w:r>
+    </w:p>
+    <w:p>
+      <w:pPr>
+        <w:spacing w:line="360" w:lineRule="auto"/>
+      </w:pPr>
+      <w:r>
+        <w:t xml:space="preserve">The mean </w:t>
+      </w:r>
+      <w:r>
+        <w:t>W</w:t>
+      </w:r>
+      <w:r>
+        <w:t>ER was high, 33.77% while the mean CER</w:t>
+      </w:r>
+      <w:r>
+        <w:t xml:space="preserve">, 17.04% was relatively low. The mean WER was 11.11%, which was 1.11 percentage points above the WER threshold. </w:t>
+      </w:r>
+      <w:r>
+        <w:lastRenderedPageBreak/>
+        <w:t xml:space="preserve">The min CER, 4.0%, is below the CER threshold, 5.0%. This however only represents a unique case, as there is only one, recorded CER pass in the batch. The WER and CER fail percentages were very high, 100% and 94.43%, respectively. </w:t>
+      </w:r>
+    </w:p>
+    <w:p>
+      <w:pPr>
+        <w:spacing w:line="360" w:lineRule="auto"/>
+        <w:rPr>
+          <w:b/>
+          <w:bCs/>
+        </w:rPr>
+      </w:pPr>
+      <w:r>
+        <w:rPr>
+          <w:b/>
+          <w:bCs/>
+        </w:rPr>
+        <w:t>5.</w:t>
+      </w:r>
+      <w:r>
+        <w:rPr>
+          <w:b/>
+          <w:bCs/>
+        </w:rPr>
+        <w:t>4</w:t>
+      </w:r>
+      <w:r>
+        <w:rPr>
+          <w:b/>
+          <w:bCs/>
+        </w:rPr>
+        <w:t>.3 OCR Error Analysis</w:t>
+      </w:r>
+    </w:p>
+    <w:p>
+      <w:pPr>
+        <w:spacing w:line="360" w:lineRule="auto"/>
+      </w:pPr>
+      <w:r>
+        <w:t>The output with the lowest WER and CER had percentage scores of 11.11% and 4.0% respectively.</w:t>
+      </w:r>
+      <w:r>
+        <w:t xml:space="preserve"> </w:t>
+      </w:r>
+      <w:r>
+        <w:t xml:space="preserve"> </w:t>
+      </w:r>
+      <w:r>
+        <w:t>Although this essay’s WER was about two percentage points</w:t>
+      </w:r>
+      <w:r>
+        <w:t xml:space="preserve"> </w:t>
+      </w:r>
+      <w:r>
+        <w:t>above the WER threshold, a</w:t>
+      </w:r>
+      <w:r>
+        <w:t xml:space="preserve"> visual inspection revealed that it was readable and decipherable, which </w:t>
+      </w:r>
+      <w:r>
+        <w:t>indicated that the evaluation logic was too strict</w:t>
+      </w:r>
+      <w:r>
+        <w:t xml:space="preserve">. </w:t>
+      </w:r>
+      <w:r>
+        <w:t xml:space="preserve"> </w:t>
+      </w:r>
+      <w:proofErr w:type="spellStart"/>
+      <w:r>
+        <w:t>PaddleOCR’s</w:t>
+      </w:r>
+      <w:proofErr w:type="spellEnd"/>
+      <w:r>
+        <w:t xml:space="preserve"> recognition model performed accurately</w:t>
+      </w:r>
+      <w:r>
+        <w:t xml:space="preserve">, recognising </w:t>
+      </w:r>
+      <w:r>
+        <w:t xml:space="preserve">most </w:t>
+      </w:r>
+      <w:r>
+        <w:t xml:space="preserve">strings with confidence scores above 90% on </w:t>
+      </w:r>
+      <w:r>
+        <w:t>average, as</w:t>
+      </w:r>
+      <w:r>
+        <w:t xml:space="preserve"> is shown </w:t>
+      </w:r>
+      <w:r>
+        <w:t xml:space="preserve">in figure </w:t>
+      </w:r>
+      <w:r>
+        <w:t>5</w:t>
+      </w:r>
+      <w:r>
+        <w:t>.</w:t>
+      </w:r>
+      <w:r>
+        <w:t>4.3</w:t>
+      </w:r>
+      <w:r>
+        <w:t xml:space="preserve"> </w:t>
+      </w:r>
+      <w:r>
+        <w:t>below</w:t>
+      </w:r>
+      <w:r>
+        <w:t xml:space="preserve">. </w:t>
+      </w:r>
+    </w:p>
+    <w:p>
+      <w:pPr>
+        <w:keepNext/>
+        <w:spacing w:line="360" w:lineRule="auto"/>
+      </w:pPr>
+      <w:r>
+        <w:rPr>
+          <w:noProof/>
+        </w:rPr>
+        <w:drawing>
+          <wp:inline distT="0" distB="0" distL="0" distR="0" wp14:anchorId="06F5CE6E" wp14:editId="1EFD030B">
+            <wp:extent cx="5087060" cy="1324160"/>
+            <wp:effectExtent l="0" t="0" r="0" b="9525"/>
+            <wp:docPr id="525322166" name="Picture 1"/>
+            <wp:cNvGraphicFramePr>
+              <a:graphicFrameLocks xmlns:a="http://schemas.openxmlformats.org/drawingml/2006/main" noChangeAspect="1"/>
+            </wp:cNvGraphicFramePr>
+            <a:graphic xmlns:a="http://schemas.openxmlformats.org/drawingml/2006/main">
+              <a:graphicData uri="http://schemas.openxmlformats.org/drawingml/2006/picture">
+                <pic:pic xmlns:pic="http://schemas.openxmlformats.org/drawingml/2006/picture">
+                  <pic:nvPicPr>
+                    <pic:cNvPr id="525322166" name=""/>
+                    <pic:cNvPicPr/>
+                  </pic:nvPicPr>
+                  <pic:blipFill>
+                    <a:blip r:embed="rId16"/>
+                    <a:stretch>
+                      <a:fillRect/>
+                    </a:stretch>
+                  </pic:blipFill>
+                  <pic:spPr>
+                    <a:xfrm>
+                      <a:off x="0" y="0"/>
+                      <a:ext cx="5087060" cy="1324160"/>
+                    </a:xfrm>
+                    <a:prstGeom prst="rect">
+                      <a:avLst/>
+                    </a:prstGeom>
+                  </pic:spPr>
+                </pic:pic>
+              </a:graphicData>
+            </a:graphic>
+          </wp:inline>
+        </w:drawing>
+      </w:r>
+    </w:p>
+    <w:p>
+      <w:pPr>
+        <w:pStyle w:val="Caption"/>
+      </w:pPr>
+      <w:r>
+        <w:t>Figure 5.</w:t>
+      </w:r>
+      <w:r>
+        <w:t>4.3</w:t>
+      </w:r>
+      <w:r>
+        <w:t>2</w:t>
+      </w:r>
+      <w:r>
+        <w:t xml:space="preserve"> Confidence score for OCR output, recognised text</w:t>
+      </w:r>
+    </w:p>
+    <w:p>
+      <w:pPr>
+        <w:spacing w:line="360" w:lineRule="auto"/>
+      </w:pPr>
+      <w:r>
+        <w:t xml:space="preserve">This essay would be accurately scored by the transformer, because it consistently maintained its semantic meaning although there were some obvious word and character errors. </w:t>
+      </w:r>
+      <w:r>
+        <w:t>There are a few misrepresentations for example “(astronomy)” is represented as “</w:t>
+      </w:r>
+      <w:proofErr w:type="spellStart"/>
+      <w:r>
+        <w:t>Castronomy</w:t>
+      </w:r>
+      <w:proofErr w:type="spellEnd"/>
+      <w:r>
+        <w:t xml:space="preserve">)”, likewise “trouble” for “trouble”. </w:t>
+      </w:r>
+      <w:r>
+        <w:rPr>
+          <w:color w:val="EE0000"/>
+        </w:rPr>
+        <w:t xml:space="preserve">(where is quote from, use in lit review to show why </w:t>
+      </w:r>
+      <w:proofErr w:type="spellStart"/>
+      <w:r>
+        <w:rPr>
+          <w:color w:val="EE0000"/>
+        </w:rPr>
+        <w:t>deberta</w:t>
+      </w:r>
+      <w:proofErr w:type="spellEnd"/>
+      <w:r>
+        <w:rPr>
+          <w:color w:val="EE0000"/>
+        </w:rPr>
+        <w:t xml:space="preserve"> is a good choice, expand on </w:t>
+      </w:r>
+      <w:proofErr w:type="spellStart"/>
+      <w:r>
+        <w:rPr>
+          <w:color w:val="EE0000"/>
+        </w:rPr>
+        <w:t>subword</w:t>
+      </w:r>
+      <w:proofErr w:type="spellEnd"/>
+      <w:r>
+        <w:rPr>
+          <w:color w:val="EE0000"/>
+        </w:rPr>
+        <w:t xml:space="preserve"> tokenisation, there) </w:t>
+      </w:r>
+      <w:r>
+        <w:rPr>
+          <w:color w:val="EE0000"/>
+        </w:rPr>
+        <w:t xml:space="preserve">However, as was discussed in the literature review, </w:t>
+      </w:r>
+      <w:r>
+        <w:t>t</w:t>
+      </w:r>
+      <w:r>
+        <w:t xml:space="preserve">ransformer models like </w:t>
+      </w:r>
+      <w:proofErr w:type="spellStart"/>
+      <w:r>
+        <w:t>DeBERTa</w:t>
+      </w:r>
+      <w:proofErr w:type="spellEnd"/>
+      <w:r>
+        <w:t xml:space="preserve"> are incredibly robust to minor spelling errors and due to sub-word tokenisation, and would still accurately score the essay even with a few minor spelling errors present. </w:t>
+      </w:r>
+    </w:p>
+    <w:p>
+      <w:pPr>
+        <w:spacing w:line="360" w:lineRule="auto"/>
+      </w:pPr>
+      <w:r>
+        <w:t xml:space="preserve">Further inspection revealed that essays with a WER around 20% and a CER around 7% were readable and decipherable and could easily be scored by the transformer. Thus, the decision was made to adjust the </w:t>
+      </w:r>
+      <w:r>
+        <w:t>WER and CER threshold to 20% and 8% respectively</w:t>
+      </w:r>
+      <w:r>
+        <w:t xml:space="preserve">. The batch </w:t>
+      </w:r>
+      <w:r>
+        <w:t>was processed using the new thresholds</w:t>
+      </w:r>
+      <w:r>
+        <w:t>,</w:t>
+      </w:r>
+      <w:r>
+        <w:t xml:space="preserve"> and the </w:t>
+      </w:r>
+      <w:r>
+        <w:t xml:space="preserve">pass percentage jumped from 0 to 17.85%. This increase, however, was not sufficient to </w:t>
+      </w:r>
+      <w:r>
+        <w:lastRenderedPageBreak/>
+        <w:t xml:space="preserve">support </w:t>
+      </w:r>
+      <w:proofErr w:type="spellStart"/>
+      <w:r>
+        <w:t>PaddleOCR</w:t>
+      </w:r>
+      <w:proofErr w:type="spellEnd"/>
+      <w:r>
+        <w:t xml:space="preserve"> being included in the AES pipeline as assistive technology since more than 80% of the batch had to be scored manually. </w:t>
+      </w:r>
+    </w:p>
+    <w:p>
+      <w:pPr>
+        <w:keepNext/>
+        <w:spacing w:line="360" w:lineRule="auto"/>
+      </w:pPr>
+      <w:r>
+        <w:drawing>
+          <wp:inline distT="0" distB="0" distL="0" distR="0" wp14:anchorId="7EA5A95E" wp14:editId="715A3040">
+            <wp:extent cx="4157932" cy="1424172"/>
+            <wp:effectExtent l="0" t="0" r="0" b="5080"/>
+            <wp:docPr id="827154535" name="Picture 1"/>
+            <wp:cNvGraphicFramePr>
+              <a:graphicFrameLocks xmlns:a="http://schemas.openxmlformats.org/drawingml/2006/main" noChangeAspect="1"/>
+            </wp:cNvGraphicFramePr>
+            <a:graphic xmlns:a="http://schemas.openxmlformats.org/drawingml/2006/main">
+              <a:graphicData uri="http://schemas.openxmlformats.org/drawingml/2006/picture">
+                <pic:pic xmlns:pic="http://schemas.openxmlformats.org/drawingml/2006/picture">
+                  <pic:nvPicPr>
+                    <pic:cNvPr id="827154535" name=""/>
+                    <pic:cNvPicPr/>
+                  </pic:nvPicPr>
+                  <pic:blipFill>
+                    <a:blip r:embed="rId17"/>
+                    <a:stretch>
+                      <a:fillRect/>
+                    </a:stretch>
+                  </pic:blipFill>
+                  <pic:spPr>
+                    <a:xfrm>
+                      <a:off x="0" y="0"/>
+                      <a:ext cx="4201504" cy="1439096"/>
+                    </a:xfrm>
+                    <a:prstGeom prst="rect">
+                      <a:avLst/>
+                    </a:prstGeom>
+                  </pic:spPr>
+                </pic:pic>
+              </a:graphicData>
+            </a:graphic>
+          </wp:inline>
+        </w:drawing>
+      </w:r>
+    </w:p>
+    <w:p>
+      <w:pPr>
+        <w:pStyle w:val="Caption"/>
+      </w:pPr>
+      <w:r>
+        <w:t>Figure 5.</w:t>
+      </w:r>
+      <w:r>
+        <w:t>4.4</w:t>
+      </w:r>
+      <w:r>
+        <w:t xml:space="preserve"> Indecipherable essay "passed" by evaluation logic</w:t>
+      </w:r>
+    </w:p>
+    <w:p>
+      <w:pPr>
+        <w:spacing w:line="360" w:lineRule="auto"/>
+      </w:pPr>
+    </w:p>
+    <w:p>
+      <w:pPr>
+        <w:spacing w:line="360" w:lineRule="auto"/>
+      </w:pPr>
+      <w:r>
+        <w:t>Furthermore, Tamera’s essay</w:t>
+      </w:r>
+      <w:r>
+        <w:t>, shown in Figure 5.</w:t>
+      </w:r>
+      <w:r>
+        <w:t>4.4</w:t>
       </w:r>
       <w:r>
         <w:t xml:space="preserve">, </w:t>
       </w:r>
       <w:r>
-        <w:t xml:space="preserve">as shown in </w:t>
-      </w:r>
-      <w:r>
-        <w:rPr>
-          <w:color w:val="EE0000"/>
-        </w:rPr>
-        <w:t xml:space="preserve">figure 5 </w:t>
-      </w:r>
-      <w:r>
-        <w:rPr>
-          <w:color w:val="EE0000"/>
-        </w:rPr>
-        <w:t>above</w:t>
-      </w:r>
-      <w:r>
-        <w:t xml:space="preserve">, were tested on a sample image of a handwritten essay. The results were then </w:t>
-      </w:r>
-      <w:r>
-        <w:t>compared,</w:t>
-      </w:r>
-      <w:r>
-        <w:t xml:space="preserve"> and </w:t>
-      </w:r>
-      <w:r>
-        <w:t xml:space="preserve">the best configuration (configuration 1) was </w:t>
-      </w:r>
-      <w:r>
-        <w:t xml:space="preserve">implemented </w:t>
-      </w:r>
-      <w:r>
-        <w:t xml:space="preserve">to </w:t>
-      </w:r>
-      <w:r>
-        <w:t xml:space="preserve">process the batch of essays. </w:t>
-      </w:r>
-    </w:p>
-    <w:p>
-      <w:pPr>
-        <w:spacing w:line="360" w:lineRule="auto"/>
-        <w:rPr>
-          <w:b/>
-          <w:bCs/>
-        </w:rPr>
-      </w:pPr>
-      <w:r>
-        <w:rPr>
-          <w:b/>
-          <w:bCs/>
-        </w:rPr>
-        <w:t>5.</w:t>
-      </w:r>
-      <w:r>
-        <w:rPr>
-          <w:b/>
-          <w:bCs/>
-        </w:rPr>
-        <w:t>4</w:t>
-      </w:r>
-      <w:r>
-        <w:rPr>
-          <w:b/>
-          <w:bCs/>
-        </w:rPr>
-        <w:t>.2 OCR Results</w:t>
-      </w:r>
-    </w:p>
-    <w:p>
-      <w:pPr>
-        <w:spacing w:line="360" w:lineRule="auto"/>
-      </w:pPr>
-      <w:r>
-        <w:t xml:space="preserve">Initially, every output was classified as “fail” when evaluated. The main reason being, </w:t>
-      </w:r>
-      <w:r>
-        <w:t>the low CER and WER thresholds and the requirement that the output’s WER and CER both be below their respective threshold</w:t>
-      </w:r>
-      <w:r>
-        <w:t xml:space="preserve">.  </w:t>
-      </w:r>
-    </w:p>
-    <w:p>
-      <w:pPr>
-        <w:spacing w:line="360" w:lineRule="auto"/>
-      </w:pPr>
-      <w:r>
-        <w:t>The mean CER was high, 33.77% while the mean CER</w:t>
-      </w:r>
-      <w:r>
-        <w:t xml:space="preserve">, 17.04% was relatively low. The mean WER was 11.11%, which was 1.11 percentage points above the WER threshold. The min CER, 4.0%, is below the CER threshold, 5.0%. This however only represents a unique case, as there is only one, recorded CER pass in the batch. The WER and CER fail percentages were very high, 100% and 94.43%, respectively. </w:t>
-      </w:r>
-    </w:p>
-    <w:p>
-      <w:pPr>
-        <w:spacing w:line="360" w:lineRule="auto"/>
-        <w:rPr>
-          <w:b/>
-          <w:bCs/>
-        </w:rPr>
-      </w:pPr>
-      <w:r>
-        <w:rPr>
-          <w:b/>
-          <w:bCs/>
-        </w:rPr>
-        <w:t>5.</w:t>
-      </w:r>
-      <w:r>
-        <w:rPr>
-          <w:b/>
-          <w:bCs/>
-        </w:rPr>
-        <w:t>4</w:t>
-      </w:r>
-      <w:r>
-        <w:rPr>
-          <w:b/>
-          <w:bCs/>
-        </w:rPr>
-        <w:t>.3 OCR Error Analysis</w:t>
-      </w:r>
-    </w:p>
-    <w:p>
-      <w:pPr>
-        <w:spacing w:line="360" w:lineRule="auto"/>
-      </w:pPr>
-      <w:r>
-        <w:t xml:space="preserve">The output with the </w:t>
-      </w:r>
-      <w:r>
-        <w:t>lowest WER and CER had percentage scores of 11.11% and 4.0% respectively.</w:t>
+        <w:t xml:space="preserve">was </w:t>
+      </w:r>
+      <w:r>
+        <w:t xml:space="preserve">initially </w:t>
+      </w:r>
+      <w:r>
+        <w:t>classified as “pass” having a WER of 19.72% and CER of 9.50%,</w:t>
+      </w:r>
+      <w:r>
+        <w:t xml:space="preserve"> both below the corresponding thresholds. However, visual inspection of the output revealed </w:t>
+      </w:r>
+      <w:r>
+        <w:t xml:space="preserve">several </w:t>
+      </w:r>
+      <w:r>
+        <w:t>spelling errors</w:t>
+      </w:r>
+      <w:r>
+        <w:t>,</w:t>
       </w:r>
       <w:r>
         <w:t xml:space="preserve"> </w:t>
       </w:r>
       <w:r>
+        <w:t xml:space="preserve">and </w:t>
+      </w:r>
+      <w:r>
+        <w:t>the essay was difficult</w:t>
+      </w:r>
+      <w:r>
+        <w:t xml:space="preserve"> to</w:t>
+      </w:r>
+      <w:r>
         <w:t xml:space="preserve"> </w:t>
       </w:r>
       <w:r>
-        <w:t>A visual inspection of this essay</w:t>
-      </w:r>
-      <w:r>
-        <w:t xml:space="preserve"> </w:t>
-      </w:r>
-      <w:r>
-        <w:t xml:space="preserve">revealed that it was </w:t>
-      </w:r>
-      <w:r>
-        <w:t>readable and decipherable</w:t>
-      </w:r>
-      <w:r>
-        <w:t xml:space="preserve">, which </w:t>
-      </w:r>
-      <w:r>
-        <w:t xml:space="preserve">indicated </w:t>
-      </w:r>
-      <w:r>
-        <w:t xml:space="preserve">that </w:t>
-      </w:r>
-      <w:r>
-        <w:t>the evaluation logic was too strict</w:t>
+        <w:t>decipher</w:t>
       </w:r>
       <w:r>
         <w:t xml:space="preserve">. </w:t>
       </w:r>
       <w:r>
-        <w:t xml:space="preserve"> </w:t>
+        <w:t xml:space="preserve">Further inspection found that essays with a CER above 8% were generally not sufficiently decipherable to be reliably scored by the transformer. Consequently, the evaluation logic was further refined to classify only OCR output with a CER at or below 8% as “pass”. This stricter criterion reduced the number of essays classified as “pass” and increased the number assigned to manual marking, providing empirical evidence that </w:t>
       </w:r>
       <w:proofErr w:type="spellStart"/>
       <w:r>
-        <w:t>PaddleOCR’s</w:t>
+        <w:t>PaddleOCR</w:t>
       </w:r>
       <w:proofErr w:type="spellEnd"/>
       <w:r>
-        <w:t xml:space="preserve"> recognition model performed accurately as is shown by the text representations and corresponding confidence scores, </w:t>
-      </w:r>
-      <w:r>
-        <w:rPr>
-          <w:color w:val="EE0000"/>
-        </w:rPr>
-        <w:t>in figure 5</w:t>
-      </w:r>
-      <w:r>
-        <w:t xml:space="preserve">. </w:t>
-      </w:r>
-      <w:r>
-        <w:t xml:space="preserve">This essay would be accurately scored by the transformer, because it consistently maintained its semantic meaning although there were some obvious word and character errors. </w:t>
-      </w:r>
-      <w:r>
-        <w:rPr>
-          <w:color w:val="EE0000"/>
-        </w:rPr>
-        <w:t xml:space="preserve">(where is quote from, use in lit review to show why </w:t>
-      </w:r>
-      <w:proofErr w:type="spellStart"/>
-      <w:r>
-        <w:rPr>
-          <w:color w:val="EE0000"/>
-        </w:rPr>
-        <w:t>deberta</w:t>
-      </w:r>
-      <w:proofErr w:type="spellEnd"/>
-      <w:r>
-        <w:rPr>
-          <w:color w:val="EE0000"/>
-        </w:rPr>
-        <w:t xml:space="preserve"> is a good choice, expand on </w:t>
-      </w:r>
-      <w:proofErr w:type="spellStart"/>
-      <w:r>
-        <w:rPr>
-          <w:color w:val="EE0000"/>
-        </w:rPr>
-        <w:t>subword</w:t>
-      </w:r>
-      <w:proofErr w:type="spellEnd"/>
-      <w:r>
-        <w:rPr>
-          <w:color w:val="EE0000"/>
-        </w:rPr>
-        <w:t xml:space="preserve"> tokenisation, there) </w:t>
-      </w:r>
-      <w:r>
-        <w:t xml:space="preserve">Transformer models like </w:t>
-      </w:r>
-      <w:proofErr w:type="spellStart"/>
-      <w:r>
-        <w:t>DeBERTa</w:t>
-      </w:r>
-      <w:proofErr w:type="spellEnd"/>
-      <w:r>
-        <w:t xml:space="preserve"> are incredibly robust to minor spelling errors and due </w:t>
-      </w:r>
-      <w:r>
-        <w:lastRenderedPageBreak/>
-        <w:t xml:space="preserve">to sub-word tokenisation, and would still accurately score the essay even with a few minor spelling errors present. </w:t>
-      </w:r>
-    </w:p>
-    <w:p>
-      <w:pPr>
-        <w:spacing w:line="360" w:lineRule="auto"/>
-      </w:pPr>
-      <w:r>
-        <w:t xml:space="preserve">Further inspection revealed that essays with a WER around 20% and a CER around 7% were readable and decipherable and could easily be scored by the transformer. Thus, the decision was made to adjust the thresholds to reflect this revelation. The batch test was </w:t>
-      </w:r>
-      <w:r>
-        <w:t>rerun,</w:t>
-      </w:r>
-      <w:r>
-        <w:t xml:space="preserve"> and the </w:t>
-      </w:r>
-      <w:r>
-        <w:t xml:space="preserve">pass percentage jumped from 0 to 17.85%. This increase, however, was not sufficient to support </w:t>
-      </w:r>
-      <w:proofErr w:type="spellStart"/>
-      <w:r>
-        <w:t>PaddleOCR</w:t>
-      </w:r>
-      <w:proofErr w:type="spellEnd"/>
-      <w:r>
-        <w:t xml:space="preserve"> being included in the </w:t>
-      </w:r>
-      <w:r>
-        <w:t xml:space="preserve">AES pipeline </w:t>
-      </w:r>
-      <w:r>
-        <w:t xml:space="preserve">as assistive technology since more than 80% of the batch had to be scored manually. </w:t>
-      </w:r>
-    </w:p>
-    <w:p>
-      <w:pPr>
-        <w:spacing w:line="360" w:lineRule="auto"/>
-      </w:pPr>
-      <w:r>
-        <w:t xml:space="preserve">Furthermore, Tamera’s essay was classified as “pass” having a WER of 19.72% and CER of 9.50%, yet it contains too many spelling errors to be considered decipherable. This suggests that the evaluation logic should only classify output with a CER at or below 8% as “pass”. This threshold adjustment increased the number of essays assigned to manual marking, further weaking support for </w:t>
-      </w:r>
-      <w:proofErr w:type="spellStart"/>
-      <w:r>
-        <w:t>PaddleOCR</w:t>
-      </w:r>
-      <w:proofErr w:type="spellEnd"/>
-      <w:r>
-        <w:t xml:space="preserve"> inclusion. </w:t>
-      </w:r>
-    </w:p>
-    <w:p>
-      <w:pPr>
-        <w:spacing w:line="360" w:lineRule="auto"/>
-      </w:pPr>
-      <w:r>
-        <w:t xml:space="preserve">This revelation led to experimentation with a hybrid approach – Tr-OCR for text recognition and </w:t>
-      </w:r>
-      <w:proofErr w:type="spellStart"/>
-      <w:r>
-        <w:t>PaddleOCR’s</w:t>
-      </w:r>
-      <w:proofErr w:type="spellEnd"/>
-      <w:r>
-        <w:t xml:space="preserve"> detection model for text detection. </w:t>
+        <w:t xml:space="preserve"> did not provide sufficient reliability for inclusion as an assistive technology within the proposed system.</w:t>
       </w:r>
     </w:p>
     <w:p>
@@ -14084,7 +14536,13 @@
         <w:t xml:space="preserve">To select the optimum ASR configuration, a </w:t>
       </w:r>
       <w:r>
-        <w:t>list of six, 2-tuples – (</w:t>
+        <w:t xml:space="preserve">list of </w:t>
+      </w:r>
+      <w:r>
+        <w:t>6</w:t>
+      </w:r>
+      <w:r>
+        <w:t>, 2-tuple – (</w:t>
       </w:r>
       <w:r>
         <w:rPr>
@@ -14109,7 +14567,7 @@
         <w:t>as shown in screenshot 5.</w:t>
       </w:r>
       <w:r>
-        <w:t xml:space="preserve"> </w:t>
+        <w:t>5.</w:t>
       </w:r>
       <w:r>
         <w:t>1 below.</w:t>
@@ -14143,7 +14601,7 @@
                     <pic:cNvPicPr/>
                   </pic:nvPicPr>
                   <pic:blipFill>
-                    <a:blip r:embed="rId15"/>
+                    <a:blip r:embed="rId18"/>
                     <a:stretch>
                       <a:fillRect/>
                     </a:stretch>
@@ -14167,11 +14625,17 @@
     <w:p>
       <w:pPr>
         <w:pStyle w:val="Caption"/>
+        <w:rPr>
+          <w:noProof/>
+        </w:rPr>
       </w:pPr>
       <w:r>
         <w:t>Figure 5.</w:t>
       </w:r>
       <w:r>
+        <w:t>5.</w:t>
+      </w:r>
+      <w:r>
         <w:t>1</w:t>
       </w:r>
       <w:r>
@@ -14179,6 +14643,17 @@
           <w:noProof/>
         </w:rPr>
         <w:t>. Model configuration list</w:t>
+      </w:r>
+    </w:p>
+    <w:p>
+      <w:r>
+        <w:t xml:space="preserve">Five samples were selected based on clarity, lack of background noise and </w:t>
+      </w:r>
+      <w:r>
+        <w:t>audibility, after</w:t>
+      </w:r>
+      <w:r>
+        <w:t xml:space="preserve"> each was listened to by the researcher. </w:t>
       </w:r>
     </w:p>
     <w:p>
@@ -14195,7 +14670,13 @@
         <w:t>he experiment produced a</w:t>
       </w:r>
       <w:r>
-        <w:t xml:space="preserve"> total of 30 </w:t>
+        <w:t xml:space="preserve"> total of </w:t>
+      </w:r>
+      <w:r>
+        <w:t>30</w:t>
+      </w:r>
+      <w:r>
+        <w:t xml:space="preserve"> </w:t>
       </w:r>
       <w:r>
         <w:t>configurations</w:t>
@@ -14223,28 +14704,51 @@
       </w:r>
       <w:proofErr w:type="spellEnd"/>
       <w:r>
-        <w:t xml:space="preserve"> pair. For each pair, transcription </w:t>
-      </w:r>
-      <w:r>
-        <w:t>was performed</w:t>
-      </w:r>
-      <w:r>
-        <w:t xml:space="preserve"> </w:t>
-      </w:r>
-      <w:r>
-        <w:t>with</w:t>
-      </w:r>
-      <w:r>
-        <w:t xml:space="preserve"> </w:t>
-      </w:r>
-      <w:r>
-        <w:t xml:space="preserve">steadily increasing </w:t>
-      </w:r>
-      <w:r>
-        <w:t xml:space="preserve">beam sizes from 1 to 5 respectively.  The results are shown in the figure </w:t>
-      </w:r>
-      <w:r>
-        <w:t xml:space="preserve">5.2 </w:t>
+        <w:t xml:space="preserve">, </w:t>
+      </w:r>
+      <w:r>
+        <w:rPr>
+          <w:b/>
+          <w:bCs/>
+        </w:rPr>
+        <w:t>beam size</w:t>
+      </w:r>
+      <w:r>
+        <w:t xml:space="preserve"> combination</w:t>
+      </w:r>
+      <w:r>
+        <w:t xml:space="preserve">. </w:t>
+      </w:r>
+      <w:r>
+        <w:t xml:space="preserve">The beam size was gradually increased </w:t>
+      </w:r>
+      <w:r>
+        <w:t xml:space="preserve">from 1 to 5 </w:t>
+      </w:r>
+      <w:r>
+        <w:t xml:space="preserve">for each </w:t>
+      </w:r>
+      <w:r>
+        <w:rPr>
+          <w:b/>
+          <w:bCs/>
+        </w:rPr>
+        <w:t>model size – compute-type</w:t>
+      </w:r>
+      <w:r>
+        <w:t xml:space="preserve"> pairing</w:t>
+      </w:r>
+      <w:r>
+        <w:t xml:space="preserve">.  The results are shown in the figure </w:t>
+      </w:r>
+      <w:r>
+        <w:t>5.</w:t>
+      </w:r>
+      <w:r>
+        <w:t>5.</w:t>
+      </w:r>
+      <w:r>
+        <w:t xml:space="preserve">2 </w:t>
       </w:r>
       <w:r>
         <w:t>below.</w:t>
@@ -14257,10 +14761,10 @@
       </w:pPr>
       <w:r>
         <w:drawing>
-          <wp:inline distT="0" distB="0" distL="0" distR="0" wp14:anchorId="4A614F97" wp14:editId="3D6D4B9E">
-            <wp:extent cx="5731510" cy="664845"/>
-            <wp:effectExtent l="0" t="0" r="2540" b="1905"/>
-            <wp:docPr id="259387149" name="Picture 1"/>
+          <wp:inline distT="0" distB="0" distL="0" distR="0" wp14:anchorId="1490D2F7" wp14:editId="12F9FD50">
+            <wp:extent cx="4582164" cy="1952898"/>
+            <wp:effectExtent l="0" t="0" r="0" b="9525"/>
+            <wp:docPr id="1444983639" name="Picture 1"/>
             <wp:cNvGraphicFramePr>
               <a:graphicFrameLocks xmlns:a="http://schemas.openxmlformats.org/drawingml/2006/main" noChangeAspect="1"/>
             </wp:cNvGraphicFramePr>
@@ -14268,458 +14772,7 @@
               <a:graphicData uri="http://schemas.openxmlformats.org/drawingml/2006/picture">
                 <pic:pic xmlns:pic="http://schemas.openxmlformats.org/drawingml/2006/picture">
                   <pic:nvPicPr>
-                    <pic:cNvPr id="259387149" name=""/>
-                    <pic:cNvPicPr/>
-                  </pic:nvPicPr>
-                  <pic:blipFill>
-                    <a:blip r:embed="rId16"/>
-                    <a:stretch>
-                      <a:fillRect/>
-                    </a:stretch>
-                  </pic:blipFill>
-                  <pic:spPr>
-                    <a:xfrm>
-                      <a:off x="0" y="0"/>
-                      <a:ext cx="5731510" cy="664845"/>
-                    </a:xfrm>
-                    <a:prstGeom prst="rect">
-                      <a:avLst/>
-                    </a:prstGeom>
-                  </pic:spPr>
-                </pic:pic>
-              </a:graphicData>
-            </a:graphic>
-          </wp:inline>
-        </w:drawing>
-      </w:r>
-    </w:p>
-    <w:p>
-      <w:pPr>
-        <w:pStyle w:val="Caption"/>
-        <w:rPr>
-          <w:b/>
-          <w:bCs/>
-        </w:rPr>
-      </w:pPr>
-      <w:r>
-        <w:t xml:space="preserve">Figure 5.2 </w:t>
-      </w:r>
-      <w:r>
-        <w:t>AS</w:t>
-      </w:r>
-      <w:r>
-        <w:t>R model parameter configuration results</w:t>
-      </w:r>
-    </w:p>
-    <w:p>
-      <w:pPr>
-        <w:spacing w:line="360" w:lineRule="auto"/>
-      </w:pPr>
-      <w:r>
-        <w:t>Configurations</w:t>
-      </w:r>
-      <w:r>
-        <w:t xml:space="preserve"> 24 and 28 achieved the same transcription accuracy</w:t>
-      </w:r>
-      <w:r>
-        <w:t>, h</w:t>
-      </w:r>
-      <w:r>
-        <w:t xml:space="preserve">owever, </w:t>
-      </w:r>
-      <w:r>
-        <w:t>configuration 28 took three times longer to complete the transcription</w:t>
-      </w:r>
-      <w:r>
-        <w:t>. T</w:t>
-      </w:r>
-      <w:r>
-        <w:t>h</w:t>
-      </w:r>
-      <w:r>
-        <w:t>erefore,</w:t>
-      </w:r>
-      <w:r>
-        <w:t xml:space="preserve"> </w:t>
-      </w:r>
-      <w:r>
-        <w:t>configuration</w:t>
-      </w:r>
-      <w:r>
-        <w:t xml:space="preserve"> 24</w:t>
-      </w:r>
-      <w:r>
-        <w:t>,</w:t>
-      </w:r>
-      <w:r>
-        <w:t xml:space="preserve"> </w:t>
-      </w:r>
-      <w:r>
-        <w:t>which</w:t>
-      </w:r>
-      <w:r>
-        <w:t xml:space="preserve"> used </w:t>
-      </w:r>
-      <w:r>
-        <w:t xml:space="preserve">mixed-precision quantization </w:t>
-      </w:r>
-      <w:r>
-        <w:t>(</w:t>
-      </w:r>
-      <w:r>
-        <w:t>int8_float16</w:t>
-      </w:r>
-      <w:r>
-        <w:t>)</w:t>
-      </w:r>
-      <w:r>
-        <w:t xml:space="preserve"> was </w:t>
-      </w:r>
-      <w:r>
-        <w:t>the bes</w:t>
-      </w:r>
-      <w:r>
-        <w:t>t-performing</w:t>
-      </w:r>
-      <w:r>
-        <w:t xml:space="preserve"> configuration. The VAD filter </w:t>
-      </w:r>
-      <w:r>
-        <w:t xml:space="preserve">remained set to True for all experiments to maintain </w:t>
-      </w:r>
-      <w:r>
-        <w:t xml:space="preserve">efficiency. Section 4.2 ASR Implementation gives a comprehensive explanation of the VAD filter’s operation. </w:t>
-      </w:r>
-      <w:r>
-        <w:t xml:space="preserve"> </w:t>
-      </w:r>
-    </w:p>
-    <w:p>
-      <w:pPr>
-        <w:spacing w:line="360" w:lineRule="auto"/>
-      </w:pPr>
-    </w:p>
-    <w:p>
-      <w:pPr>
-        <w:spacing w:line="360" w:lineRule="auto"/>
-      </w:pPr>
-    </w:p>
-    <w:p>
-      <w:pPr>
-        <w:tabs>
-          <w:tab w:val="left" w:pos="1965"/>
-        </w:tabs>
-        <w:spacing w:line="360" w:lineRule="auto"/>
-        <w:rPr>
-          <w:b/>
-          <w:bCs/>
-        </w:rPr>
-      </w:pPr>
-      <w:r>
-        <w:rPr>
-          <w:b/>
-          <w:bCs/>
-        </w:rPr>
-        <w:br w:type="page"/>
-      </w:r>
-    </w:p>
-    <w:p>
-      <w:pPr>
-        <w:rPr>
-          <w:b/>
-          <w:bCs/>
-        </w:rPr>
-      </w:pPr>
-      <w:r>
-        <w:rPr>
-          <w:b/>
-          <w:bCs/>
-        </w:rPr>
-        <w:lastRenderedPageBreak/>
-        <w:t>5.</w:t>
-      </w:r>
-      <w:r>
-        <w:rPr>
-          <w:b/>
-          <w:bCs/>
-        </w:rPr>
-        <w:t>5</w:t>
-      </w:r>
-      <w:r>
-        <w:rPr>
-          <w:b/>
-          <w:bCs/>
-        </w:rPr>
-        <w:t>.</w:t>
-      </w:r>
-      <w:r>
-        <w:rPr>
-          <w:b/>
-          <w:bCs/>
-        </w:rPr>
-        <w:t>2</w:t>
-      </w:r>
-      <w:r>
-        <w:rPr>
-          <w:b/>
-          <w:bCs/>
-        </w:rPr>
-        <w:t xml:space="preserve"> WER/CER Results</w:t>
-      </w:r>
-    </w:p>
-    <w:p>
-      <w:pPr>
-        <w:rPr>
-          <w:b/>
-          <w:bCs/>
-        </w:rPr>
-      </w:pPr>
-      <w:r>
-        <w:rPr>
-          <w:b/>
-          <w:bCs/>
-        </w:rPr>
-        <w:drawing>
-          <wp:inline distT="0" distB="0" distL="0" distR="0" wp14:anchorId="4D8CC5B1" wp14:editId="2C8904EC">
-            <wp:extent cx="1600423" cy="1714739"/>
-            <wp:effectExtent l="0" t="0" r="0" b="0"/>
-            <wp:docPr id="1521619839" name="Picture 1"/>
-            <wp:cNvGraphicFramePr>
-              <a:graphicFrameLocks xmlns:a="http://schemas.openxmlformats.org/drawingml/2006/main" noChangeAspect="1"/>
-            </wp:cNvGraphicFramePr>
-            <a:graphic xmlns:a="http://schemas.openxmlformats.org/drawingml/2006/main">
-              <a:graphicData uri="http://schemas.openxmlformats.org/drawingml/2006/picture">
-                <pic:pic xmlns:pic="http://schemas.openxmlformats.org/drawingml/2006/picture">
-                  <pic:nvPicPr>
-                    <pic:cNvPr id="1521619839" name=""/>
-                    <pic:cNvPicPr/>
-                  </pic:nvPicPr>
-                  <pic:blipFill>
-                    <a:blip r:embed="rId17"/>
-                    <a:stretch>
-                      <a:fillRect/>
-                    </a:stretch>
-                  </pic:blipFill>
-                  <pic:spPr>
-                    <a:xfrm>
-                      <a:off x="0" y="0"/>
-                      <a:ext cx="1600423" cy="1714739"/>
-                    </a:xfrm>
-                    <a:prstGeom prst="rect">
-                      <a:avLst/>
-                    </a:prstGeom>
-                  </pic:spPr>
-                </pic:pic>
-              </a:graphicData>
-            </a:graphic>
-          </wp:inline>
-        </w:drawing>
-      </w:r>
-    </w:p>
-    <w:p>
-      <w:pPr>
-        <w:pStyle w:val="Caption"/>
-      </w:pPr>
-      <w:r>
-        <w:t>Figure 5.3</w:t>
-      </w:r>
-      <w:r>
-        <w:rPr>
-          <w:noProof/>
-        </w:rPr>
-        <w:t xml:space="preserve">. WER and CER </w:t>
-      </w:r>
-      <w:r>
-        <w:rPr>
-          <w:noProof/>
-        </w:rPr>
-        <w:t>r</w:t>
-      </w:r>
-      <w:r>
-        <w:rPr>
-          <w:noProof/>
-        </w:rPr>
-        <w:t>esults</w:t>
-      </w:r>
-    </w:p>
-    <w:p>
-      <w:pPr>
-        <w:spacing w:line="360" w:lineRule="auto"/>
-      </w:pPr>
-      <w:r>
-        <w:t>Figure 5.3 shows the mean WER, 11.5</w:t>
-      </w:r>
-      <w:r>
-        <w:t>7</w:t>
-      </w:r>
-      <w:r>
-        <w:t xml:space="preserve">%, is slightly higher than the acceptable threshold of 9.0%. The max WER however, differs from the min by </w:t>
-      </w:r>
-      <w:r>
-        <w:t>more than</w:t>
-      </w:r>
-      <w:r>
-        <w:t>15 percentage points – indicating variation in transcription accuracy across the samples. The median WER, 10.</w:t>
-      </w:r>
-      <w:r>
-        <w:t>83</w:t>
-      </w:r>
-      <w:r>
-        <w:t>% is slightly above the threshold while the CER, 4.7</w:t>
-      </w:r>
-      <w:r>
-        <w:t>8</w:t>
-      </w:r>
-      <w:r>
-        <w:t xml:space="preserve">%, is slightly below the threshold. </w:t>
-      </w:r>
-    </w:p>
-    <w:p>
-      <w:pPr>
-        <w:spacing w:line="360" w:lineRule="auto"/>
-      </w:pPr>
-      <w:r>
-        <w:drawing>
-          <wp:inline distT="0" distB="0" distL="0" distR="0" wp14:anchorId="28BCEF6D" wp14:editId="7339E549">
-            <wp:extent cx="2229161" cy="2276793"/>
-            <wp:effectExtent l="0" t="0" r="0" b="9525"/>
-            <wp:docPr id="1658193562" name="Picture 1"/>
-            <wp:cNvGraphicFramePr>
-              <a:graphicFrameLocks xmlns:a="http://schemas.openxmlformats.org/drawingml/2006/main" noChangeAspect="1"/>
-            </wp:cNvGraphicFramePr>
-            <a:graphic xmlns:a="http://schemas.openxmlformats.org/drawingml/2006/main">
-              <a:graphicData uri="http://schemas.openxmlformats.org/drawingml/2006/picture">
-                <pic:pic xmlns:pic="http://schemas.openxmlformats.org/drawingml/2006/picture">
-                  <pic:nvPicPr>
-                    <pic:cNvPr id="1658193562" name=""/>
-                    <pic:cNvPicPr/>
-                  </pic:nvPicPr>
-                  <pic:blipFill>
-                    <a:blip r:embed="rId18"/>
-                    <a:stretch>
-                      <a:fillRect/>
-                    </a:stretch>
-                  </pic:blipFill>
-                  <pic:spPr>
-                    <a:xfrm>
-                      <a:off x="0" y="0"/>
-                      <a:ext cx="2229161" cy="2276793"/>
-                    </a:xfrm>
-                    <a:prstGeom prst="rect">
-                      <a:avLst/>
-                    </a:prstGeom>
-                  </pic:spPr>
-                </pic:pic>
-              </a:graphicData>
-            </a:graphic>
-          </wp:inline>
-        </w:drawing>
-      </w:r>
-    </w:p>
-    <w:p>
-      <w:pPr>
-        <w:pStyle w:val="Caption"/>
-      </w:pPr>
-      <w:r>
-        <w:t>Figure 5.</w:t>
-      </w:r>
-      <w:r>
-        <w:t>4</w:t>
-      </w:r>
-      <w:r>
-        <w:rPr>
-          <w:noProof/>
-        </w:rPr>
-        <w:t>. WER and CER Results</w:t>
-      </w:r>
-    </w:p>
-    <w:p>
-      <w:pPr>
-        <w:spacing w:line="360" w:lineRule="auto"/>
-      </w:pPr>
-    </w:p>
-    <w:p>
-      <w:pPr>
-        <w:spacing w:line="360" w:lineRule="auto"/>
-      </w:pPr>
-      <w:r>
-        <w:rPr>
-          <w:color w:val="EE0000"/>
-        </w:rPr>
-        <w:t xml:space="preserve">Figure 5.4, shows that roughly double the number of CER passes then </w:t>
-      </w:r>
-      <w:proofErr w:type="spellStart"/>
-      <w:r>
-        <w:rPr>
-          <w:color w:val="EE0000"/>
-        </w:rPr>
-        <w:t>wer</w:t>
-      </w:r>
-      <w:proofErr w:type="spellEnd"/>
-      <w:r>
-        <w:rPr>
-          <w:color w:val="EE0000"/>
-        </w:rPr>
-        <w:t xml:space="preserve"> </w:t>
-      </w:r>
-      <w:proofErr w:type="spellStart"/>
-      <w:r>
-        <w:rPr>
-          <w:color w:val="EE0000"/>
-        </w:rPr>
-        <w:t>passesthe</w:t>
-      </w:r>
-      <w:proofErr w:type="spellEnd"/>
-      <w:r>
-        <w:rPr>
-          <w:color w:val="EE0000"/>
-        </w:rPr>
-        <w:t xml:space="preserve"> </w:t>
-      </w:r>
-      <w:r>
-        <w:t xml:space="preserve">number of transcriptions that </w:t>
-      </w:r>
-      <w:r>
-        <w:t>were</w:t>
-      </w:r>
-      <w:r>
-        <w:t xml:space="preserve"> classified as “pass” is roughly 10% more than those classified as “fail”. The model seems to more consistently inaccurately transcribe whole words rather than individual letters or characters. </w:t>
-      </w:r>
-    </w:p>
-    <w:p>
-      <w:pPr>
-        <w:spacing w:line="360" w:lineRule="auto"/>
-      </w:pPr>
-      <w:r>
-        <w:t xml:space="preserve">The most accurately transcribed essay has a WER of 6.67%, and a CER of 2.4%.  Perusal of this essay shown in figure 5.4, confirmed the results since it was transcribed very </w:t>
-      </w:r>
-      <w:r>
-        <w:lastRenderedPageBreak/>
-        <w:t xml:space="preserve">accurately and the errors from transcription did not detract from the semantic of the essay. </w:t>
-      </w:r>
-    </w:p>
-    <w:p>
-      <w:pPr>
-        <w:keepNext/>
-        <w:spacing w:line="360" w:lineRule="auto"/>
-      </w:pPr>
-      <w:r>
-        <w:rPr>
-          <w:noProof/>
-        </w:rPr>
-        <w:drawing>
-          <wp:inline distT="0" distB="0" distL="0" distR="0" wp14:anchorId="269C2684" wp14:editId="4F7E5A96">
-            <wp:extent cx="3848637" cy="1781424"/>
-            <wp:effectExtent l="0" t="0" r="0" b="9525"/>
-            <wp:docPr id="1597561988" name="Picture 1"/>
-            <wp:cNvGraphicFramePr>
-              <a:graphicFrameLocks xmlns:a="http://schemas.openxmlformats.org/drawingml/2006/main" noChangeAspect="1"/>
-            </wp:cNvGraphicFramePr>
-            <a:graphic xmlns:a="http://schemas.openxmlformats.org/drawingml/2006/main">
-              <a:graphicData uri="http://schemas.openxmlformats.org/drawingml/2006/picture">
-                <pic:pic xmlns:pic="http://schemas.openxmlformats.org/drawingml/2006/picture">
-                  <pic:nvPicPr>
-                    <pic:cNvPr id="1364885674" name=""/>
+                    <pic:cNvPr id="1444983639" name=""/>
                     <pic:cNvPicPr/>
                   </pic:nvPicPr>
                   <pic:blipFill>
@@ -14731,7 +14784,7 @@
                   <pic:spPr>
                     <a:xfrm>
                       <a:off x="0" y="0"/>
-                      <a:ext cx="3848637" cy="1781424"/>
+                      <a:ext cx="4582164" cy="1952898"/>
                     </a:xfrm>
                     <a:prstGeom prst="rect">
                       <a:avLst/>
@@ -14747,36 +14800,288 @@
     <w:p>
       <w:pPr>
         <w:pStyle w:val="Caption"/>
-      </w:pPr>
-      <w:r>
-        <w:t>Figure 5.4 Screenshot of accurately transcribed essay</w:t>
-      </w:r>
-    </w:p>
-    <w:p>
-      <w:pPr>
-        <w:spacing w:line="360" w:lineRule="auto"/>
-      </w:pPr>
-      <w:r>
-        <w:t>The essay shown in figure 5.5, with the median WER percentage has a WER slightly above the acceptable WER threshold, and a CER slightly below the acceptable threshold.</w:t>
-      </w:r>
-      <w:r>
+        <w:rPr>
+          <w:b/>
+          <w:bCs/>
+        </w:rPr>
+      </w:pPr>
+      <w:r>
+        <w:t>Figure 5.</w:t>
+      </w:r>
+      <w:r>
+        <w:t>5.</w:t>
+      </w:r>
+      <w:r>
+        <w:t xml:space="preserve">2 </w:t>
+      </w:r>
+      <w:r>
+        <w:t>AS</w:t>
+      </w:r>
+      <w:r>
+        <w:t>R model parameter configuration results</w:t>
+      </w:r>
+    </w:p>
+    <w:p>
+      <w:pPr>
+        <w:spacing w:line="360" w:lineRule="auto"/>
+      </w:pPr>
+      <w:r>
+        <w:t>The configuration (medium=model, int8_float16='</w:t>
+      </w:r>
+      <w:proofErr w:type="spellStart"/>
+      <w:r>
+        <w:t>compute_type</w:t>
+      </w:r>
+      <w:proofErr w:type="spellEnd"/>
+      <w:r>
+        <w:t xml:space="preserve">', </w:t>
+      </w:r>
+      <w:proofErr w:type="spellStart"/>
+      <w:r>
+        <w:t>beam_size</w:t>
+      </w:r>
+      <w:proofErr w:type="spellEnd"/>
+      <w:r>
+        <w:t xml:space="preserve">=2) </w:t>
+      </w:r>
+      <w:r>
+        <w:t xml:space="preserve">demonstrated </w:t>
+      </w:r>
+      <w:r>
+        <w:t xml:space="preserve">a good balance between computationally efficiency and accuracy, </w:t>
+      </w:r>
+      <w:r>
+        <w:lastRenderedPageBreak/>
+        <w:t xml:space="preserve">achieving a mean WER of 11.72% and a CER of 5.85%, one of the lowest </w:t>
+      </w:r>
+      <w:proofErr w:type="gramStart"/>
+      <w:r>
+        <w:t>CER</w:t>
+      </w:r>
+      <w:proofErr w:type="gramEnd"/>
+      <w:r>
+        <w:t xml:space="preserve"> of all configurations. It also transcribed the 5 samples in under 12 seconds. The medium model, with </w:t>
+      </w:r>
+      <w:proofErr w:type="spellStart"/>
+      <w:r>
+        <w:rPr>
+          <w:b/>
+          <w:bCs/>
+        </w:rPr>
+        <w:t>compute_type</w:t>
+      </w:r>
+      <w:proofErr w:type="spellEnd"/>
+      <w:r>
+        <w:rPr>
+          <w:b/>
+          <w:bCs/>
+        </w:rPr>
+        <w:t>=</w:t>
+      </w:r>
+      <w:r>
+        <w:rPr>
+          <w:b/>
+          <w:bCs/>
+        </w:rPr>
         <w:t xml:space="preserve"> </w:t>
       </w:r>
-    </w:p>
-    <w:p>
-      <w:pPr>
-        <w:keepNext/>
-        <w:spacing w:line="360" w:lineRule="auto"/>
-      </w:pPr>
-      <w:r>
-        <w:rPr>
-          <w:noProof/>
+      <w:r>
+        <w:rPr>
+          <w:b/>
+          <w:bCs/>
+        </w:rPr>
+        <w:t>float_</w:t>
+      </w:r>
+      <w:r>
+        <w:rPr>
+          <w:b/>
+          <w:bCs/>
+        </w:rPr>
+        <w:t>16</w:t>
+      </w:r>
+      <w:r>
+        <w:t xml:space="preserve"> and </w:t>
+      </w:r>
+      <w:proofErr w:type="spellStart"/>
+      <w:r>
+        <w:rPr>
+          <w:b/>
+          <w:bCs/>
+        </w:rPr>
+        <w:t>beam</w:t>
+      </w:r>
+      <w:r>
+        <w:rPr>
+          <w:b/>
+          <w:bCs/>
+        </w:rPr>
+        <w:t>_</w:t>
+      </w:r>
+      <w:r>
+        <w:rPr>
+          <w:b/>
+          <w:bCs/>
+        </w:rPr>
+        <w:t>size</w:t>
+      </w:r>
+      <w:proofErr w:type="spellEnd"/>
+      <w:r>
+        <w:rPr>
+          <w:b/>
+          <w:bCs/>
+        </w:rPr>
+        <w:t>=</w:t>
+      </w:r>
+      <w:r>
+        <w:rPr>
+          <w:b/>
+          <w:bCs/>
+        </w:rPr>
+        <w:t>3</w:t>
+      </w:r>
+      <w:r>
+        <w:t xml:space="preserve">, achieved the lowest WER and CER of all configurations, however, its transcription time is more than 3 times greater than the model described previously. </w:t>
+      </w:r>
+      <w:r>
+        <w:t>Therefore,</w:t>
+      </w:r>
+      <w:r>
+        <w:t xml:space="preserve"> the </w:t>
+      </w:r>
+      <w:r>
+        <w:t>configuration</w:t>
+      </w:r>
+      <w:r>
+        <w:t xml:space="preserve"> that </w:t>
+      </w:r>
+      <w:r>
+        <w:t>was</w:t>
+      </w:r>
+      <w:r>
+        <w:t xml:space="preserve"> used to transcribe the batch </w:t>
+      </w:r>
+      <w:r>
+        <w:t>was the</w:t>
+      </w:r>
+      <w:r>
+        <w:t xml:space="preserve"> medium mode</w:t>
+      </w:r>
+      <w:r>
+        <w:t>l</w:t>
+      </w:r>
+      <w:r>
+        <w:t>, with quantization int8_float16 and a beam size of 2</w:t>
+      </w:r>
+      <w:r>
+        <w:t xml:space="preserve">. The VAD filter </w:t>
+      </w:r>
+      <w:r>
+        <w:t xml:space="preserve">remained set to True for all experiments to maintain </w:t>
+      </w:r>
+      <w:r>
+        <w:t xml:space="preserve">efficiency. Section 4.2 ASR Implementation gives a comprehensive explanation of the VAD filter’s operation. </w:t>
+      </w:r>
+      <w:r>
+        <w:t xml:space="preserve"> </w:t>
+      </w:r>
+    </w:p>
+    <w:p>
+      <w:pPr>
+        <w:spacing w:line="360" w:lineRule="auto"/>
+      </w:pPr>
+    </w:p>
+    <w:p>
+      <w:pPr>
+        <w:spacing w:line="360" w:lineRule="auto"/>
+      </w:pPr>
+    </w:p>
+    <w:p>
+      <w:pPr>
+        <w:tabs>
+          <w:tab w:val="left" w:pos="1965"/>
+        </w:tabs>
+        <w:spacing w:line="360" w:lineRule="auto"/>
+        <w:rPr>
+          <w:b/>
+          <w:bCs/>
+        </w:rPr>
+      </w:pPr>
+      <w:r>
+        <w:rPr>
+          <w:b/>
+          <w:bCs/>
+        </w:rPr>
+        <w:br w:type="page"/>
+      </w:r>
+    </w:p>
+    <w:p>
+      <w:pPr>
+        <w:rPr>
+          <w:b/>
+          <w:bCs/>
+        </w:rPr>
+      </w:pPr>
+      <w:r>
+        <w:rPr>
+          <w:b/>
+          <w:bCs/>
+        </w:rPr>
+        <w:lastRenderedPageBreak/>
+        <w:t>5.</w:t>
+      </w:r>
+      <w:r>
+        <w:rPr>
+          <w:b/>
+          <w:bCs/>
+        </w:rPr>
+        <w:t>5</w:t>
+      </w:r>
+      <w:r>
+        <w:rPr>
+          <w:b/>
+          <w:bCs/>
+        </w:rPr>
+        <w:t>.</w:t>
+      </w:r>
+      <w:r>
+        <w:rPr>
+          <w:b/>
+          <w:bCs/>
+        </w:rPr>
+        <w:t>2</w:t>
+      </w:r>
+      <w:r>
+        <w:rPr>
+          <w:b/>
+          <w:bCs/>
+        </w:rPr>
+        <w:t xml:space="preserve"> WER/CER Results</w:t>
+      </w:r>
+      <w:r>
+        <w:rPr>
+          <w:b/>
+          <w:bCs/>
+        </w:rPr>
+        <w:t xml:space="preserve"> from Batch Transcription</w:t>
+      </w:r>
+    </w:p>
+    <w:p>
+      <w:pPr>
+        <w:rPr>
+          <w:b/>
+          <w:bCs/>
+        </w:rPr>
+      </w:pPr>
+      <w:r>
+        <w:rPr>
+          <w:b/>
+          <w:bCs/>
         </w:rPr>
         <w:drawing>
-          <wp:inline distT="0" distB="0" distL="0" distR="0" wp14:anchorId="3D661505" wp14:editId="10412335">
-            <wp:extent cx="4667901" cy="1781424"/>
-            <wp:effectExtent l="0" t="0" r="0" b="9525"/>
-            <wp:docPr id="1153520420" name="Picture 1"/>
+          <wp:inline distT="0" distB="0" distL="0" distR="0" wp14:anchorId="27AACEE0" wp14:editId="5ECF2C4F">
+            <wp:extent cx="1724266" cy="1686160"/>
+            <wp:effectExtent l="0" t="0" r="9525" b="0"/>
+            <wp:docPr id="1825204401" name="Picture 1"/>
             <wp:cNvGraphicFramePr>
               <a:graphicFrameLocks xmlns:a="http://schemas.openxmlformats.org/drawingml/2006/main" noChangeAspect="1"/>
             </wp:cNvGraphicFramePr>
@@ -14784,7 +15089,7 @@
               <a:graphicData uri="http://schemas.openxmlformats.org/drawingml/2006/picture">
                 <pic:pic xmlns:pic="http://schemas.openxmlformats.org/drawingml/2006/picture">
                   <pic:nvPicPr>
-                    <pic:cNvPr id="1460716706" name=""/>
+                    <pic:cNvPr id="1825204401" name=""/>
                     <pic:cNvPicPr/>
                   </pic:nvPicPr>
                   <pic:blipFill>
@@ -14796,7 +15101,7 @@
                   <pic:spPr>
                     <a:xfrm>
                       <a:off x="0" y="0"/>
-                      <a:ext cx="4667901" cy="1781424"/>
+                      <a:ext cx="1724266" cy="1686160"/>
                     </a:xfrm>
                     <a:prstGeom prst="rect">
                       <a:avLst/>
@@ -14814,203 +15119,87 @@
         <w:pStyle w:val="Caption"/>
       </w:pPr>
       <w:r>
-        <w:t>Figure 5.5. Transcription with high WER and low CER</w:t>
-      </w:r>
-    </w:p>
-    <w:p>
-      <w:pPr>
-        <w:spacing w:line="360" w:lineRule="auto"/>
-      </w:pPr>
-      <w:r>
-        <w:t xml:space="preserve"> From a visual inspection of this essay, it is apparent that most of the wrongly transcribed words are still decipherable by a human scorer. For example, Whisper transcribed “sea floor spreading” as </w:t>
+        <w:t>Figure 5.</w:t>
+      </w:r>
+      <w:r>
+        <w:t>5.</w:t>
+      </w:r>
+      <w:r>
+        <w:t>3</w:t>
       </w:r>
       <w:r>
         <w:rPr>
           <w:noProof/>
         </w:rPr>
-        <w:t>“the economy sea flow spreading”</w:t>
-      </w:r>
-      <w:r>
-        <w:t xml:space="preserve">. This discovery, however, does not motivate an adjustment to the current thresholds as this substitution, though recognisable to a human scorer, is likely to affect the transformer’s interpretation, resulting in an inaccurate score. </w:t>
-      </w:r>
-    </w:p>
-    <w:p>
-      <w:pPr>
-        <w:rPr>
-          <w:b/>
-          <w:bCs/>
-        </w:rPr>
-      </w:pPr>
-      <w:r>
-        <w:rPr>
-          <w:b/>
-          <w:bCs/>
-        </w:rPr>
+        <w:t xml:space="preserve">. WER and CER </w:t>
+      </w:r>
+      <w:r>
+        <w:rPr>
+          <w:noProof/>
+        </w:rPr>
+        <w:t>r</w:t>
+      </w:r>
+      <w:r>
+        <w:rPr>
+          <w:noProof/>
+        </w:rPr>
+        <w:t>esults</w:t>
+      </w:r>
+    </w:p>
+    <w:p>
+      <w:pPr>
+        <w:spacing w:line="360" w:lineRule="auto"/>
+      </w:pPr>
+      <w:r>
+        <w:t>Figure 5.</w:t>
+      </w:r>
+      <w:r>
         <w:t>5.</w:t>
       </w:r>
       <w:r>
-        <w:rPr>
-          <w:b/>
-          <w:bCs/>
-        </w:rPr>
-        <w:t>5</w:t>
-      </w:r>
-      <w:r>
-        <w:rPr>
-          <w:b/>
-          <w:bCs/>
-        </w:rPr>
-        <w:t>.</w:t>
-      </w:r>
-      <w:r>
-        <w:rPr>
-          <w:b/>
-          <w:bCs/>
-        </w:rPr>
+        <w:t xml:space="preserve">3 shows the mean WER, </w:t>
+      </w:r>
+      <w:r>
+        <w:t>10.94</w:t>
+      </w:r>
+      <w:r>
+        <w:t xml:space="preserve">%, is slightly higher than the acceptable threshold of 9.0%. The max WER however, differs from the min by </w:t>
+      </w:r>
+      <w:r>
+        <w:t>more than</w:t>
+      </w:r>
+      <w:r>
+        <w:t>1</w:t>
+      </w:r>
+      <w:r>
         <w:t>3</w:t>
       </w:r>
       <w:r>
-        <w:rPr>
-          <w:b/>
-          <w:bCs/>
-        </w:rPr>
-        <w:t xml:space="preserve"> Pass/Fail Classification</w:t>
-      </w:r>
-    </w:p>
-    <w:p>
-      <w:pPr>
-        <w:spacing w:line="360" w:lineRule="auto"/>
-      </w:pPr>
-      <w:r>
-        <w:t xml:space="preserve">Whisper transcribed 28 essays. </w:t>
-      </w:r>
-      <w:r>
-        <w:t>Eight (8) of the 28 essays, 28.57</w:t>
-      </w:r>
-      <w:r>
-        <w:t>%</w:t>
-      </w:r>
-      <w:r>
-        <w:t>,</w:t>
-      </w:r>
-      <w:r>
-        <w:t xml:space="preserve"> were </w:t>
-      </w:r>
-      <w:r>
-        <w:t>at or lower than the WER threshold,</w:t>
-      </w:r>
-      <w:r>
-        <w:t xml:space="preserve"> and were classified as “pass”, </w:t>
-      </w:r>
-      <w:r>
-        <w:t xml:space="preserve">While 20 essays, 71.43%, had WER </w:t>
-      </w:r>
-      <w:r>
-        <w:lastRenderedPageBreak/>
-        <w:t>percentage scores above the threshold and were classified as “fail”</w:t>
-      </w:r>
-      <w:r>
-        <w:t xml:space="preserve">. </w:t>
-      </w:r>
-      <w:r>
-        <w:t xml:space="preserve">This indicates that most essays were assigned for manual scoring. </w:t>
-      </w:r>
-    </w:p>
-    <w:p>
-      <w:pPr>
-        <w:rPr>
-          <w:b/>
-          <w:bCs/>
-        </w:rPr>
-      </w:pPr>
-      <w:r>
-        <w:rPr>
-          <w:b/>
-          <w:bCs/>
-        </w:rPr>
-        <w:t>5.</w:t>
-      </w:r>
-      <w:r>
-        <w:rPr>
-          <w:b/>
-          <w:bCs/>
-        </w:rPr>
-        <w:t>5</w:t>
-      </w:r>
-      <w:r>
-        <w:rPr>
-          <w:b/>
-          <w:bCs/>
-        </w:rPr>
-        <w:t>.</w:t>
-      </w:r>
-      <w:r>
-        <w:rPr>
-          <w:b/>
-          <w:bCs/>
-        </w:rPr>
-        <w:t>4</w:t>
-      </w:r>
-      <w:r>
-        <w:rPr>
-          <w:b/>
-          <w:bCs/>
-        </w:rPr>
-        <w:t xml:space="preserve"> Representative Transcriptions</w:t>
-      </w:r>
-    </w:p>
-    <w:p>
-      <w:pPr>
-        <w:spacing w:line="360" w:lineRule="auto"/>
-      </w:pPr>
-      <w:r>
-        <w:t>Figures</w:t>
-      </w:r>
-      <w:r>
-        <w:t xml:space="preserve"> 5.</w:t>
-      </w:r>
-      <w:r>
-        <w:t>6</w:t>
-      </w:r>
-      <w:r>
-        <w:t xml:space="preserve"> and 5.</w:t>
-      </w:r>
-      <w:r>
-        <w:t>7</w:t>
-      </w:r>
-      <w:r>
-        <w:t xml:space="preserve"> </w:t>
-      </w:r>
-      <w:r>
-        <w:t xml:space="preserve">are </w:t>
-      </w:r>
-      <w:r>
-        <w:t>of transcriptions</w:t>
-      </w:r>
-      <w:r>
-        <w:t xml:space="preserve"> with WER and CER percentage</w:t>
-      </w:r>
-      <w:r>
-        <w:t xml:space="preserve"> scores</w:t>
-      </w:r>
-      <w:r>
-        <w:t xml:space="preserve"> between the min and median and the median and max, respectively.</w:t>
-      </w:r>
-    </w:p>
-    <w:p>
-      <w:pPr>
-        <w:keepNext/>
-        <w:spacing w:line="360" w:lineRule="auto"/>
-      </w:pPr>
-      <w:r>
-        <w:rPr>
-          <w:noProof/>
-        </w:rPr>
+        <w:t xml:space="preserve"> percentage points – indicating variation in transcription accuracy across the samples. The median WER, 10.</w:t>
+      </w:r>
+      <w:r>
+        <w:t>42</w:t>
+      </w:r>
+      <w:r>
+        <w:t>% is slightly above the threshold while the CER, 4.</w:t>
+      </w:r>
+      <w:r>
+        <w:t>91</w:t>
+      </w:r>
+      <w:r>
+        <w:t xml:space="preserve">%, is slightly below the threshold. </w:t>
+      </w:r>
+    </w:p>
+    <w:p>
+      <w:pPr>
+        <w:spacing w:line="360" w:lineRule="auto"/>
+      </w:pPr>
+      <w:r>
         <w:drawing>
-          <wp:inline distT="0" distB="0" distL="0" distR="0" wp14:anchorId="3894E1D3" wp14:editId="42A82A1B">
-            <wp:extent cx="4896533" cy="1648055"/>
-            <wp:effectExtent l="0" t="0" r="0" b="9525"/>
-            <wp:docPr id="279969825" name="Picture 1"/>
+          <wp:inline distT="0" distB="0" distL="0" distR="0" wp14:anchorId="3F494FCE" wp14:editId="2E1BA288">
+            <wp:extent cx="1880558" cy="2708998"/>
+            <wp:effectExtent l="0" t="0" r="5715" b="0"/>
+            <wp:docPr id="926703738" name="Picture 1"/>
             <wp:cNvGraphicFramePr>
               <a:graphicFrameLocks xmlns:a="http://schemas.openxmlformats.org/drawingml/2006/main" noChangeAspect="1"/>
             </wp:cNvGraphicFramePr>
@@ -15018,7 +15207,7 @@
               <a:graphicData uri="http://schemas.openxmlformats.org/drawingml/2006/picture">
                 <pic:pic xmlns:pic="http://schemas.openxmlformats.org/drawingml/2006/picture">
                   <pic:nvPicPr>
-                    <pic:cNvPr id="1081167865" name=""/>
+                    <pic:cNvPr id="926703738" name=""/>
                     <pic:cNvPicPr/>
                   </pic:nvPicPr>
                   <pic:blipFill>
@@ -15030,7 +15219,7 @@
                   <pic:spPr>
                     <a:xfrm>
                       <a:off x="0" y="0"/>
-                      <a:ext cx="4896533" cy="1648055"/>
+                      <a:ext cx="1887239" cy="2718622"/>
                     </a:xfrm>
                     <a:prstGeom prst="rect">
                       <a:avLst/>
@@ -15051,10 +15240,89 @@
         <w:t>Figure 5.</w:t>
       </w:r>
       <w:r>
-        <w:t>6</w:t>
-      </w:r>
-      <w:r>
-        <w:t xml:space="preserve"> Transcription with WER between min and median</w:t>
+        <w:t>5.</w:t>
+      </w:r>
+      <w:r>
+        <w:t>4</w:t>
+      </w:r>
+      <w:r>
+        <w:rPr>
+          <w:noProof/>
+        </w:rPr>
+        <w:t>. WER and CER Results</w:t>
+      </w:r>
+    </w:p>
+    <w:p>
+      <w:pPr>
+        <w:spacing w:line="360" w:lineRule="auto"/>
+      </w:pPr>
+    </w:p>
+    <w:p>
+      <w:pPr>
+        <w:spacing w:line="360" w:lineRule="auto"/>
+      </w:pPr>
+      <w:r>
+        <w:t>Figure 5.5.4</w:t>
+      </w:r>
+      <w:r>
+        <w:t xml:space="preserve"> shows that CER passes </w:t>
+      </w:r>
+      <w:r>
+        <w:t xml:space="preserve">were </w:t>
+      </w:r>
+      <w:r>
+        <w:t>roughly</w:t>
+      </w:r>
+      <w:r>
+        <w:t xml:space="preserve"> 10% more than those classified as </w:t>
+      </w:r>
+      <w:r>
+        <w:t>fails.</w:t>
+      </w:r>
+      <w:r>
+        <w:t xml:space="preserve"> The model seems to more consistently</w:t>
+      </w:r>
+      <w:r>
+        <w:t>,</w:t>
+      </w:r>
+      <w:r>
+        <w:t xml:space="preserve"> inaccurately transcribe</w:t>
+      </w:r>
+      <w:r>
+        <w:t>,</w:t>
+      </w:r>
+      <w:r>
+        <w:t xml:space="preserve"> whole words rather than individual letters or characters. </w:t>
+      </w:r>
+    </w:p>
+    <w:p>
+      <w:pPr>
+        <w:spacing w:line="360" w:lineRule="auto"/>
+      </w:pPr>
+      <w:r>
+        <w:t xml:space="preserve">The most accurately transcribed essay has a WER of </w:t>
+      </w:r>
+      <w:r>
+        <w:t>5.83</w:t>
+      </w:r>
+      <w:r>
+        <w:t>%, and a CER of 2.</w:t>
+      </w:r>
+      <w:r>
+        <w:t>18</w:t>
+      </w:r>
+      <w:r>
+        <w:t>%.  Perusal of this essay shown in figure 5.</w:t>
+      </w:r>
+      <w:r>
+        <w:t>5.5</w:t>
+      </w:r>
+      <w:r>
+        <w:t xml:space="preserve">, confirmed the results since it was </w:t>
+      </w:r>
+      <w:r>
+        <w:lastRenderedPageBreak/>
+        <w:t xml:space="preserve">transcribed very accurately and the errors from transcription did not detract from the semantic of the essay. </w:t>
       </w:r>
     </w:p>
     <w:p>
@@ -15063,14 +15331,11 @@
         <w:spacing w:line="360" w:lineRule="auto"/>
       </w:pPr>
       <w:r>
-        <w:rPr>
-          <w:noProof/>
-        </w:rPr>
         <w:drawing>
-          <wp:inline distT="0" distB="0" distL="0" distR="0" wp14:anchorId="48641F1B" wp14:editId="440A2BB8">
-            <wp:extent cx="5172797" cy="1810003"/>
+          <wp:inline distT="0" distB="0" distL="0" distR="0" wp14:anchorId="3956B703" wp14:editId="4EB7C2C2">
+            <wp:extent cx="4515480" cy="1733792"/>
             <wp:effectExtent l="0" t="0" r="0" b="0"/>
-            <wp:docPr id="1299341362" name="Picture 1"/>
+            <wp:docPr id="411516797" name="Picture 1"/>
             <wp:cNvGraphicFramePr>
               <a:graphicFrameLocks xmlns:a="http://schemas.openxmlformats.org/drawingml/2006/main" noChangeAspect="1"/>
             </wp:cNvGraphicFramePr>
@@ -15078,7 +15343,7 @@
               <a:graphicData uri="http://schemas.openxmlformats.org/drawingml/2006/picture">
                 <pic:pic xmlns:pic="http://schemas.openxmlformats.org/drawingml/2006/picture">
                   <pic:nvPicPr>
-                    <pic:cNvPr id="1322649141" name=""/>
+                    <pic:cNvPr id="411516797" name=""/>
                     <pic:cNvPicPr/>
                   </pic:nvPicPr>
                   <pic:blipFill>
@@ -15090,7 +15355,7 @@
                   <pic:spPr>
                     <a:xfrm>
                       <a:off x="0" y="0"/>
-                      <a:ext cx="5172797" cy="1810003"/>
+                      <a:ext cx="4515480" cy="1733792"/>
                     </a:xfrm>
                     <a:prstGeom prst="rect">
                       <a:avLst/>
@@ -15111,32 +15376,27 @@
         <w:t>Figure 5.</w:t>
       </w:r>
       <w:r>
-        <w:t>7</w:t>
-      </w:r>
-      <w:r>
-        <w:t xml:space="preserve"> Transcription with WER between median and max</w:t>
-      </w:r>
-    </w:p>
-    <w:p>
-      <w:pPr>
-        <w:spacing w:line="360" w:lineRule="auto"/>
-      </w:pPr>
-      <w:r>
-        <w:t xml:space="preserve">The transcription of Daniella voice is highly accurate with a WER of 8.89% and a CER of 3.79%. The transcription of Hannah although classified as “fail” is still readable and interpretable by a human scorer. </w:t>
-      </w:r>
-    </w:p>
-    <w:p>
-      <w:pPr>
-        <w:spacing w:line="360" w:lineRule="auto"/>
-      </w:pPr>
-      <w:r>
-        <w:t xml:space="preserve">The most inaccurate transcription is still decipherable by a human scorer, as seen in the screenshot </w:t>
-      </w:r>
-      <w:r>
-        <w:t>5.8 below</w:t>
-      </w:r>
-      <w:r>
-        <w:t xml:space="preserve">. </w:t>
+        <w:t>5.5</w:t>
+      </w:r>
+      <w:r>
+        <w:t xml:space="preserve"> Screenshot of accurately transcribed essay</w:t>
+      </w:r>
+    </w:p>
+    <w:p>
+      <w:pPr>
+        <w:spacing w:line="360" w:lineRule="auto"/>
+      </w:pPr>
+      <w:r>
+        <w:t>The essay shown in figure 5.5</w:t>
+      </w:r>
+      <w:r>
+        <w:t>.6</w:t>
+      </w:r>
+      <w:r>
+        <w:t>, with the median WER percentage has a WER slightly above the acceptable WER threshold, and a CER slightly below the acceptable threshold.</w:t>
+      </w:r>
+      <w:r>
+        <w:t xml:space="preserve"> </w:t>
       </w:r>
     </w:p>
     <w:p>
@@ -15145,15 +15405,11 @@
         <w:spacing w:line="360" w:lineRule="auto"/>
       </w:pPr>
       <w:r>
-        <w:rPr>
-          <w:noProof/>
-        </w:rPr>
-        <w:lastRenderedPageBreak/>
         <w:drawing>
-          <wp:inline distT="0" distB="0" distL="0" distR="0" wp14:anchorId="553C14AC" wp14:editId="7CF1FAB9">
-            <wp:extent cx="4248743" cy="1619476"/>
-            <wp:effectExtent l="0" t="0" r="0" b="0"/>
-            <wp:docPr id="450936967" name="Picture 1"/>
+          <wp:inline distT="0" distB="0" distL="0" distR="0" wp14:anchorId="7E47B227" wp14:editId="1F8A83B9">
+            <wp:extent cx="5068007" cy="2048161"/>
+            <wp:effectExtent l="0" t="0" r="0" b="9525"/>
+            <wp:docPr id="1552621597" name="Picture 1"/>
             <wp:cNvGraphicFramePr>
               <a:graphicFrameLocks xmlns:a="http://schemas.openxmlformats.org/drawingml/2006/main" noChangeAspect="1"/>
             </wp:cNvGraphicFramePr>
@@ -15161,7 +15417,7 @@
               <a:graphicData uri="http://schemas.openxmlformats.org/drawingml/2006/picture">
                 <pic:pic xmlns:pic="http://schemas.openxmlformats.org/drawingml/2006/picture">
                   <pic:nvPicPr>
-                    <pic:cNvPr id="1179730839" name=""/>
+                    <pic:cNvPr id="1552621597" name=""/>
                     <pic:cNvPicPr/>
                   </pic:nvPicPr>
                   <pic:blipFill>
@@ -15173,7 +15429,7 @@
                   <pic:spPr>
                     <a:xfrm>
                       <a:off x="0" y="0"/>
-                      <a:ext cx="4248743" cy="1619476"/>
+                      <a:ext cx="5068007" cy="2048161"/>
                     </a:xfrm>
                     <a:prstGeom prst="rect">
                       <a:avLst/>
@@ -15191,10 +15447,507 @@
         <w:pStyle w:val="Caption"/>
       </w:pPr>
       <w:r>
+        <w:t>Figure 5</w:t>
+      </w:r>
+      <w:r>
+        <w:t>.5.6</w:t>
+      </w:r>
+      <w:r>
+        <w:t>. Transcription with high WER and low CER</w:t>
+      </w:r>
+    </w:p>
+    <w:p>
+      <w:pPr>
+        <w:spacing w:line="360" w:lineRule="auto"/>
+      </w:pPr>
+      <w:r>
+        <w:t xml:space="preserve"> From a visual inspection of this essay, it is apparent that most of the wrongly transcribed words are still decipherable by a human scorer. For example, Whisper transcribed “</w:t>
+      </w:r>
+      <w:r>
+        <w:t>or young people</w:t>
+      </w:r>
+      <w:r>
+        <w:t xml:space="preserve">” as </w:t>
+      </w:r>
+      <w:r>
+        <w:rPr>
+          <w:noProof/>
+        </w:rPr>
+        <w:t>“</w:t>
+      </w:r>
+      <w:r>
+        <w:rPr>
+          <w:noProof/>
+        </w:rPr>
+        <w:t>on your people</w:t>
+      </w:r>
+      <w:r>
+        <w:rPr>
+          <w:noProof/>
+        </w:rPr>
+        <w:t>”</w:t>
+      </w:r>
+      <w:r>
+        <w:t xml:space="preserve">. This discovery, however, does not motivate an adjustment to the current thresholds as this substitution, though recognisable to a human scorer, is likely to affect the transformer’s interpretation, resulting in an inaccurate score. </w:t>
+      </w:r>
+    </w:p>
+    <w:p>
+      <w:pPr>
+        <w:rPr>
+          <w:b/>
+          <w:bCs/>
+        </w:rPr>
+      </w:pPr>
+      <w:r>
+        <w:rPr>
+          <w:b/>
+          <w:bCs/>
+        </w:rPr>
+        <w:br w:type="page"/>
+      </w:r>
+    </w:p>
+    <w:p>
+      <w:pPr>
+        <w:rPr>
+          <w:b/>
+          <w:bCs/>
+        </w:rPr>
+      </w:pPr>
+      <w:r>
+        <w:rPr>
+          <w:b/>
+          <w:bCs/>
+        </w:rPr>
+        <w:lastRenderedPageBreak/>
+        <w:t>5.</w:t>
+      </w:r>
+      <w:r>
+        <w:rPr>
+          <w:b/>
+          <w:bCs/>
+        </w:rPr>
+        <w:t>5</w:t>
+      </w:r>
+      <w:r>
+        <w:rPr>
+          <w:b/>
+          <w:bCs/>
+        </w:rPr>
+        <w:t>.</w:t>
+      </w:r>
+      <w:r>
+        <w:rPr>
+          <w:b/>
+          <w:bCs/>
+        </w:rPr>
+        <w:t>3</w:t>
+      </w:r>
+      <w:r>
+        <w:rPr>
+          <w:b/>
+          <w:bCs/>
+        </w:rPr>
+        <w:t xml:space="preserve"> Pass/Fail Classification</w:t>
+      </w:r>
+    </w:p>
+    <w:p>
+      <w:pPr>
+        <w:spacing w:line="360" w:lineRule="auto"/>
+      </w:pPr>
+      <w:r>
+        <w:t xml:space="preserve">Whisper transcribed 28 essays. </w:t>
+      </w:r>
+      <w:r>
+        <w:t>Twelve (12)</w:t>
+      </w:r>
+      <w:r>
+        <w:t xml:space="preserve"> of the 28 essays, </w:t>
+      </w:r>
+      <w:r>
+        <w:t>42.86</w:t>
+      </w:r>
+      <w:r>
+        <w:t>%</w:t>
+      </w:r>
+      <w:r>
+        <w:t>,</w:t>
+      </w:r>
+      <w:r>
+        <w:t xml:space="preserve"> were </w:t>
+      </w:r>
+      <w:r>
+        <w:t xml:space="preserve">at or </w:t>
+      </w:r>
+      <w:r>
+        <w:t xml:space="preserve">below </w:t>
+      </w:r>
+      <w:r>
+        <w:t>than WER threshold,</w:t>
+      </w:r>
+      <w:r>
+        <w:t xml:space="preserve"> and were classified as “pass”, </w:t>
+      </w:r>
+      <w:r>
+        <w:t>w</w:t>
+      </w:r>
+      <w:r>
+        <w:t>hile</w:t>
+      </w:r>
+      <w:r>
+        <w:t xml:space="preserve"> 16 transcriptions</w:t>
+      </w:r>
+      <w:r>
+        <w:t xml:space="preserve">, </w:t>
+      </w:r>
+      <w:r>
+        <w:t>57.14</w:t>
+      </w:r>
+      <w:r>
+        <w:t>%, had WER percentage scores above the threshold and were classified as “fail”</w:t>
+      </w:r>
+      <w:r>
+        <w:t xml:space="preserve">. </w:t>
+      </w:r>
+      <w:r>
+        <w:t xml:space="preserve">This indicates that </w:t>
+      </w:r>
+      <w:r>
+        <w:t xml:space="preserve">although </w:t>
+      </w:r>
+      <w:r>
+        <w:t>most essays were assigned for manual scoring</w:t>
+      </w:r>
+      <w:r>
+        <w:t>, a significant minority were assigned for scoring by the transformer</w:t>
+      </w:r>
+      <w:r>
+        <w:t xml:space="preserve">. </w:t>
+      </w:r>
+    </w:p>
+    <w:p>
+      <w:pPr>
+        <w:rPr>
+          <w:b/>
+          <w:bCs/>
+        </w:rPr>
+      </w:pPr>
+      <w:r>
+        <w:rPr>
+          <w:b/>
+          <w:bCs/>
+        </w:rPr>
+        <w:t>5.</w:t>
+      </w:r>
+      <w:r>
+        <w:rPr>
+          <w:b/>
+          <w:bCs/>
+        </w:rPr>
+        <w:t>5</w:t>
+      </w:r>
+      <w:r>
+        <w:rPr>
+          <w:b/>
+          <w:bCs/>
+        </w:rPr>
+        <w:t>.</w:t>
+      </w:r>
+      <w:r>
+        <w:rPr>
+          <w:b/>
+          <w:bCs/>
+        </w:rPr>
+        <w:t>4</w:t>
+      </w:r>
+      <w:r>
+        <w:rPr>
+          <w:b/>
+          <w:bCs/>
+        </w:rPr>
+        <w:t xml:space="preserve"> Representative Transcriptions</w:t>
+      </w:r>
+    </w:p>
+    <w:p>
+      <w:pPr>
+        <w:spacing w:line="360" w:lineRule="auto"/>
+      </w:pPr>
+      <w:r>
+        <w:t>Figures</w:t>
+      </w:r>
+      <w:r>
+        <w:t xml:space="preserve"> 5.</w:t>
+      </w:r>
+      <w:r>
+        <w:t>5.7</w:t>
+      </w:r>
+      <w:r>
+        <w:t xml:space="preserve"> and 5.</w:t>
+      </w:r>
+      <w:r>
+        <w:t>5.8</w:t>
+      </w:r>
+      <w:r>
+        <w:t xml:space="preserve"> </w:t>
+      </w:r>
+      <w:r>
+        <w:t xml:space="preserve">are </w:t>
+      </w:r>
+      <w:r>
+        <w:t>of transcriptions</w:t>
+      </w:r>
+      <w:r>
+        <w:t xml:space="preserve"> with WER and CER percentage</w:t>
+      </w:r>
+      <w:r>
+        <w:t xml:space="preserve"> scores</w:t>
+      </w:r>
+      <w:r>
+        <w:t xml:space="preserve"> between the min and median</w:t>
+      </w:r>
+      <w:r>
+        <w:t>,</w:t>
+      </w:r>
+      <w:r>
+        <w:t xml:space="preserve"> and the median and max, respectively.</w:t>
+      </w:r>
+    </w:p>
+    <w:p>
+      <w:pPr>
+        <w:keepNext/>
+        <w:spacing w:line="360" w:lineRule="auto"/>
+      </w:pPr>
+      <w:r>
+        <w:drawing>
+          <wp:inline distT="0" distB="0" distL="0" distR="0" wp14:anchorId="6993889B" wp14:editId="5BEC9BB1">
+            <wp:extent cx="5163271" cy="1467055"/>
+            <wp:effectExtent l="0" t="0" r="0" b="0"/>
+            <wp:docPr id="1173179047" name="Picture 1"/>
+            <wp:cNvGraphicFramePr>
+              <a:graphicFrameLocks xmlns:a="http://schemas.openxmlformats.org/drawingml/2006/main" noChangeAspect="1"/>
+            </wp:cNvGraphicFramePr>
+            <a:graphic xmlns:a="http://schemas.openxmlformats.org/drawingml/2006/main">
+              <a:graphicData uri="http://schemas.openxmlformats.org/drawingml/2006/picture">
+                <pic:pic xmlns:pic="http://schemas.openxmlformats.org/drawingml/2006/picture">
+                  <pic:nvPicPr>
+                    <pic:cNvPr id="1173179047" name=""/>
+                    <pic:cNvPicPr/>
+                  </pic:nvPicPr>
+                  <pic:blipFill>
+                    <a:blip r:embed="rId24"/>
+                    <a:stretch>
+                      <a:fillRect/>
+                    </a:stretch>
+                  </pic:blipFill>
+                  <pic:spPr>
+                    <a:xfrm>
+                      <a:off x="0" y="0"/>
+                      <a:ext cx="5163271" cy="1467055"/>
+                    </a:xfrm>
+                    <a:prstGeom prst="rect">
+                      <a:avLst/>
+                    </a:prstGeom>
+                  </pic:spPr>
+                </pic:pic>
+              </a:graphicData>
+            </a:graphic>
+          </wp:inline>
+        </w:drawing>
+      </w:r>
+    </w:p>
+    <w:p>
+      <w:pPr>
+        <w:pStyle w:val="Caption"/>
+      </w:pPr>
+      <w:r>
+        <w:t>Figure 5.</w:t>
+      </w:r>
+      <w:r>
+        <w:t>5.7</w:t>
+      </w:r>
+      <w:r>
+        <w:t xml:space="preserve"> Transcription with WER between min and median</w:t>
+      </w:r>
+    </w:p>
+    <w:p>
+      <w:pPr>
+        <w:keepNext/>
+        <w:spacing w:line="360" w:lineRule="auto"/>
+      </w:pPr>
+      <w:r>
+        <w:drawing>
+          <wp:inline distT="0" distB="0" distL="0" distR="0" wp14:anchorId="50C4F1C5" wp14:editId="2E7BEB82">
+            <wp:extent cx="4972744" cy="1952898"/>
+            <wp:effectExtent l="0" t="0" r="0" b="9525"/>
+            <wp:docPr id="69573196" name="Picture 1"/>
+            <wp:cNvGraphicFramePr>
+              <a:graphicFrameLocks xmlns:a="http://schemas.openxmlformats.org/drawingml/2006/main" noChangeAspect="1"/>
+            </wp:cNvGraphicFramePr>
+            <a:graphic xmlns:a="http://schemas.openxmlformats.org/drawingml/2006/main">
+              <a:graphicData uri="http://schemas.openxmlformats.org/drawingml/2006/picture">
+                <pic:pic xmlns:pic="http://schemas.openxmlformats.org/drawingml/2006/picture">
+                  <pic:nvPicPr>
+                    <pic:cNvPr id="69573196" name=""/>
+                    <pic:cNvPicPr/>
+                  </pic:nvPicPr>
+                  <pic:blipFill>
+                    <a:blip r:embed="rId25"/>
+                    <a:stretch>
+                      <a:fillRect/>
+                    </a:stretch>
+                  </pic:blipFill>
+                  <pic:spPr>
+                    <a:xfrm>
+                      <a:off x="0" y="0"/>
+                      <a:ext cx="4972744" cy="1952898"/>
+                    </a:xfrm>
+                    <a:prstGeom prst="rect">
+                      <a:avLst/>
+                    </a:prstGeom>
+                  </pic:spPr>
+                </pic:pic>
+              </a:graphicData>
+            </a:graphic>
+          </wp:inline>
+        </w:drawing>
+      </w:r>
+    </w:p>
+    <w:p>
+      <w:pPr>
+        <w:pStyle w:val="Caption"/>
+      </w:pPr>
+      <w:r>
+        <w:t>Figure 5.</w:t>
+      </w:r>
+      <w:r>
+        <w:t>5.8</w:t>
+      </w:r>
+      <w:r>
+        <w:t xml:space="preserve"> Transcription with WER between median and max</w:t>
+      </w:r>
+    </w:p>
+    <w:p>
+      <w:pPr>
+        <w:spacing w:line="360" w:lineRule="auto"/>
+      </w:pPr>
+      <w:r>
+        <w:t xml:space="preserve">The transcription of </w:t>
+      </w:r>
+      <w:r>
+        <w:t>Aaliah’s</w:t>
+      </w:r>
+      <w:r>
+        <w:t xml:space="preserve"> voice is </w:t>
+      </w:r>
+      <w:r>
+        <w:t xml:space="preserve">reasonably </w:t>
+      </w:r>
+      <w:r>
+        <w:t xml:space="preserve">accurate with a WER of </w:t>
+      </w:r>
+      <w:r>
+        <w:t>9.44</w:t>
+      </w:r>
+      <w:r>
+        <w:t>% and a CER of 3.</w:t>
+      </w:r>
+      <w:r>
+        <w:t>90</w:t>
+      </w:r>
+      <w:r>
+        <w:t xml:space="preserve">%. The transcription of </w:t>
+      </w:r>
+      <w:r>
+        <w:t>Amanda’ voice</w:t>
+      </w:r>
+      <w:r>
+        <w:t xml:space="preserve"> although classified as “fail” is still readable and interpretable by a human scorer. </w:t>
+      </w:r>
+    </w:p>
+    <w:p>
+      <w:pPr>
+        <w:spacing w:line="360" w:lineRule="auto"/>
+      </w:pPr>
+      <w:r>
+        <w:t xml:space="preserve">The most inaccurate transcription is still decipherable by a human scorer, as seen in </w:t>
+      </w:r>
+      <w:r>
+        <w:t>figure</w:t>
+      </w:r>
+      <w:r>
+        <w:t xml:space="preserve"> </w:t>
+      </w:r>
+      <w:r>
+        <w:t>5.</w:t>
+      </w:r>
+      <w:r>
+        <w:t>5.9</w:t>
+      </w:r>
+      <w:r>
+        <w:t xml:space="preserve"> below</w:t>
+      </w:r>
+      <w:r>
+        <w:t xml:space="preserve">. </w:t>
+      </w:r>
+    </w:p>
+    <w:p>
+      <w:pPr>
+        <w:keepNext/>
+        <w:spacing w:line="360" w:lineRule="auto"/>
+      </w:pPr>
+      <w:r>
+        <w:lastRenderedPageBreak/>
+        <w:drawing>
+          <wp:inline distT="0" distB="0" distL="0" distR="0" wp14:anchorId="0D58FD30" wp14:editId="29F5D076">
+            <wp:extent cx="3829584" cy="2038635"/>
+            <wp:effectExtent l="0" t="0" r="0" b="0"/>
+            <wp:docPr id="2096836296" name="Picture 1"/>
+            <wp:cNvGraphicFramePr>
+              <a:graphicFrameLocks xmlns:a="http://schemas.openxmlformats.org/drawingml/2006/main" noChangeAspect="1"/>
+            </wp:cNvGraphicFramePr>
+            <a:graphic xmlns:a="http://schemas.openxmlformats.org/drawingml/2006/main">
+              <a:graphicData uri="http://schemas.openxmlformats.org/drawingml/2006/picture">
+                <pic:pic xmlns:pic="http://schemas.openxmlformats.org/drawingml/2006/picture">
+                  <pic:nvPicPr>
+                    <pic:cNvPr id="2096836296" name=""/>
+                    <pic:cNvPicPr/>
+                  </pic:nvPicPr>
+                  <pic:blipFill>
+                    <a:blip r:embed="rId26"/>
+                    <a:stretch>
+                      <a:fillRect/>
+                    </a:stretch>
+                  </pic:blipFill>
+                  <pic:spPr>
+                    <a:xfrm>
+                      <a:off x="0" y="0"/>
+                      <a:ext cx="3829584" cy="2038635"/>
+                    </a:xfrm>
+                    <a:prstGeom prst="rect">
+                      <a:avLst/>
+                    </a:prstGeom>
+                  </pic:spPr>
+                </pic:pic>
+              </a:graphicData>
+            </a:graphic>
+          </wp:inline>
+        </w:drawing>
+      </w:r>
+    </w:p>
+    <w:p>
+      <w:pPr>
+        <w:pStyle w:val="Caption"/>
+      </w:pPr>
+      <w:r>
         <w:t xml:space="preserve">Figure </w:t>
       </w:r>
       <w:r>
-        <w:t>5.8 Most</w:t>
+        <w:t>5.</w:t>
+      </w:r>
+      <w:r>
+        <w:t>5.9</w:t>
+      </w:r>
+      <w:r>
+        <w:t xml:space="preserve"> Most</w:t>
       </w:r>
       <w:r>
         <w:t xml:space="preserve"> inaccurate transcription</w:t>
@@ -15272,7 +16025,10 @@
         <w:t xml:space="preserve"> </w:t>
       </w:r>
       <w:r>
-        <w:t xml:space="preserve">Forty percent (40%) of the spoken essays were accurately transcribed and forwarded to </w:t>
+        <w:t>More than f</w:t>
+      </w:r>
+      <w:r>
+        <w:t xml:space="preserve">orty percent (40%) of the spoken essays were accurately transcribed and forwarded to </w:t>
       </w:r>
       <w:proofErr w:type="spellStart"/>
       <w:r>
@@ -15280,7 +16036,13 @@
       </w:r>
       <w:proofErr w:type="spellEnd"/>
       <w:r>
-        <w:t xml:space="preserve"> for scoring. This significantly reduced the human scorer’s workload down to sixty percent (60%). </w:t>
+        <w:t xml:space="preserve"> for scoring. This significantly reduced the human scorer’s workload down to </w:t>
+      </w:r>
+      <w:r>
+        <w:t xml:space="preserve">around </w:t>
+      </w:r>
+      <w:r>
+        <w:t xml:space="preserve">sixty percent (60%). </w:t>
       </w:r>
       <w:r>
         <w:t>The</w:t>
@@ -15289,13 +16051,19 @@
         <w:t xml:space="preserve"> results also</w:t>
       </w:r>
       <w:r>
-        <w:t xml:space="preserve"> prove that the evaluation logic work</w:t>
-      </w:r>
-      <w:r>
-        <w:t>ed</w:t>
-      </w:r>
-      <w:r>
-        <w:t xml:space="preserve"> as intended, correctly</w:t>
+        <w:t xml:space="preserve"> prove</w:t>
+      </w:r>
+      <w:r>
+        <w:t>d</w:t>
+      </w:r>
+      <w:r>
+        <w:t xml:space="preserve"> t</w:t>
+      </w:r>
+      <w:r>
+        <w:t xml:space="preserve">he accuracy and reliability or </w:t>
+      </w:r>
+      <w:r>
+        <w:t>the evaluation logic, correctly</w:t>
       </w:r>
       <w:r>
         <w:t xml:space="preserve"> rout</w:t>
@@ -15349,7 +16117,13 @@
         <w:t xml:space="preserve"> inaccurately score</w:t>
       </w:r>
       <w:r>
-        <w:t xml:space="preserve">d due to the quality of the transcription. </w:t>
+        <w:t xml:space="preserve">d due to the </w:t>
+      </w:r>
+      <w:r>
+        <w:t xml:space="preserve">poor </w:t>
+      </w:r>
+      <w:r>
+        <w:t xml:space="preserve">quality of the transcription. </w:t>
       </w:r>
     </w:p>
     <w:p>
@@ -15537,7 +16311,15 @@
     </w:p>
     <w:p>
       <w:r>
-        <w:t>Does the complete pipeline actually work?</w:t>
+        <w:t xml:space="preserve">Does the complete pipeline </w:t>
+      </w:r>
+      <w:proofErr w:type="gramStart"/>
+      <w:r>
+        <w:t>actually work</w:t>
+      </w:r>
+      <w:proofErr w:type="gramEnd"/>
+      <w:r>
+        <w:t>?</w:t>
       </w:r>
     </w:p>
     <w:p>
@@ -15671,7 +16453,15 @@
     </w:p>
     <w:p>
       <w:r>
-        <w:t>If you actually collect usability data, present the results graphically.</w:t>
+        <w:t xml:space="preserve">If you </w:t>
+      </w:r>
+      <w:proofErr w:type="gramStart"/>
+      <w:r>
+        <w:t>actually collect</w:t>
+      </w:r>
+      <w:proofErr w:type="gramEnd"/>
+      <w:r>
+        <w:t xml:space="preserve"> usability data, present the results graphically.</w:t>
       </w:r>
     </w:p>
     <w:p>
@@ -15999,8 +16789,17 @@
           <w:b/>
           <w:bCs/>
         </w:rPr>
-        <w:t>critical evaluation of the project as a whole</w:t>
-      </w:r>
+        <w:t xml:space="preserve">critical evaluation of the </w:t>
+      </w:r>
+      <w:proofErr w:type="gramStart"/>
+      <w:r>
+        <w:rPr>
+          <w:b/>
+          <w:bCs/>
+        </w:rPr>
+        <w:t>project as a whole</w:t>
+      </w:r>
+      <w:proofErr w:type="gramEnd"/>
       <w:r>
         <w:t>.</w:t>
       </w:r>
@@ -16400,7 +17199,15 @@
         <w:t xml:space="preserve"> images of essays submitted as separate files</w:t>
       </w:r>
       <w:r>
-        <w:t xml:space="preserve"> in to a single file and routes to the OCR component for processing. </w:t>
+        <w:t xml:space="preserve"> </w:t>
+      </w:r>
+      <w:proofErr w:type="gramStart"/>
+      <w:r>
+        <w:t>in to</w:t>
+      </w:r>
+      <w:proofErr w:type="gramEnd"/>
+      <w:r>
+        <w:t xml:space="preserve"> a single file and routes to the OCR component for processing. </w:t>
       </w:r>
     </w:p>
     <w:p>
@@ -22354,7 +23161,7 @@
                     <pic:cNvPicPr/>
                   </pic:nvPicPr>
                   <pic:blipFill>
-                    <a:blip r:embed="rId24"/>
+                    <a:blip r:embed="rId27"/>
                     <a:stretch>
                       <a:fillRect/>
                     </a:stretch>
@@ -22432,7 +23239,7 @@
                     <pic:cNvPicPr/>
                   </pic:nvPicPr>
                   <pic:blipFill>
-                    <a:blip r:embed="rId25"/>
+                    <a:blip r:embed="rId28"/>
                     <a:stretch>
                       <a:fillRect/>
                     </a:stretch>
@@ -22585,11 +23392,19 @@
       </w:r>
       <w:proofErr w:type="spellStart"/>
       <w:r>
-        <w:t>calculate_error_rates</w:t>
+        <w:t>calculate_error_</w:t>
+      </w:r>
+      <w:proofErr w:type="gramStart"/>
+      <w:r>
+        <w:t>rates</w:t>
       </w:r>
       <w:proofErr w:type="spellEnd"/>
       <w:r>
-        <w:t xml:space="preserve">() function, prior to the implementation of the OCR and ASR components. These metrics are essential to the operation of the evaluator functions in determining what output is fed to the transformer for further processing or returned to the human scorer for manual scoring.  </w:t>
+        <w:t>(</w:t>
+      </w:r>
+      <w:proofErr w:type="gramEnd"/>
+      <w:r>
+        <w:t xml:space="preserve">) function, prior to the implementation of the OCR and ASR components. These metrics are essential to the operation of the evaluator functions in determining what output is fed to the transformer for further processing or returned to the human scorer for manual scoring.  </w:t>
       </w:r>
     </w:p>
     <w:p>
@@ -22618,7 +23433,15 @@
         <w:spacing w:line="360" w:lineRule="auto"/>
       </w:pPr>
       <w:r>
-        <w:t xml:space="preserve">For efficiency, scalability and modularity, a class based approach – the </w:t>
+        <w:t xml:space="preserve">For efficiency, scalability and modularity, a </w:t>
+      </w:r>
+      <w:proofErr w:type="gramStart"/>
+      <w:r>
+        <w:t>class based</w:t>
+      </w:r>
+      <w:proofErr w:type="gramEnd"/>
+      <w:r>
+        <w:t xml:space="preserve"> approach – the </w:t>
       </w:r>
       <w:proofErr w:type="spellStart"/>
       <w:r>
@@ -22653,7 +23476,7 @@
                     <pic:cNvPicPr/>
                   </pic:nvPicPr>
                   <pic:blipFill>
-                    <a:blip r:embed="rId26"/>
+                    <a:blip r:embed="rId29"/>
                     <a:stretch>
                       <a:fillRect/>
                     </a:stretch>
@@ -22687,7 +23510,15 @@
         <w:spacing w:line="360" w:lineRule="auto"/>
       </w:pPr>
       <w:r>
-        <w:t xml:space="preserve">Some members of the sample use the spoken form slash to represent ‘/’, while others use ‘or’. The normalise() method of the </w:t>
+        <w:t xml:space="preserve">Some members of the sample use the spoken form slash to represent ‘/’, while others use ‘or’. The </w:t>
+      </w:r>
+      <w:proofErr w:type="gramStart"/>
+      <w:r>
+        <w:t>normalise(</w:t>
+      </w:r>
+      <w:proofErr w:type="gramEnd"/>
+      <w:r>
+        <w:t xml:space="preserve">) method of the </w:t>
       </w:r>
       <w:proofErr w:type="spellStart"/>
       <w:r>
@@ -22723,7 +23554,7 @@
                     <pic:cNvPicPr/>
                   </pic:nvPicPr>
                   <pic:blipFill>
-                    <a:blip r:embed="rId27"/>
+                    <a:blip r:embed="rId30"/>
                     <a:stretch>
                       <a:fillRect/>
                     </a:stretch>
@@ -22761,11 +23592,19 @@
       </w:r>
       <w:proofErr w:type="spellStart"/>
       <w:r>
-        <w:t>show_edit_log</w:t>
+        <w:t>show_edit_</w:t>
+      </w:r>
+      <w:proofErr w:type="gramStart"/>
+      <w:r>
+        <w:t>log</w:t>
       </w:r>
       <w:proofErr w:type="spellEnd"/>
       <w:r>
-        <w:t xml:space="preserve">() method is invoked. </w:t>
+        <w:t>(</w:t>
+      </w:r>
+      <w:proofErr w:type="gramEnd"/>
+      <w:r>
+        <w:t xml:space="preserve">) method is invoked. </w:t>
       </w:r>
     </w:p>
     <w:p>
@@ -23001,7 +23840,15 @@
         <w:spacing w:line="360" w:lineRule="auto"/>
       </w:pPr>
       <w:r>
-        <w:t>Obtain the best performing model with respect to inference time, and storage footprint and  transcription accuracy</w:t>
+        <w:t xml:space="preserve">Obtain the best performing model with respect to inference time, and storage footprint </w:t>
+      </w:r>
+      <w:proofErr w:type="gramStart"/>
+      <w:r>
+        <w:t>and  transcription</w:t>
+      </w:r>
+      <w:proofErr w:type="gramEnd"/>
+      <w:r>
+        <w:t xml:space="preserve"> accuracy</w:t>
       </w:r>
     </w:p>
     <w:p>
@@ -23082,7 +23929,7 @@
                     <pic:cNvPicPr/>
                   </pic:nvPicPr>
                   <pic:blipFill>
-                    <a:blip r:embed="rId15"/>
+                    <a:blip r:embed="rId18"/>
                     <a:stretch>
                       <a:fillRect/>
                     </a:stretch>
@@ -23167,7 +24014,7 @@
                     <pic:cNvPicPr/>
                   </pic:nvPicPr>
                   <pic:blipFill rotWithShape="1">
-                    <a:blip r:embed="rId28"/>
+                    <a:blip r:embed="rId31"/>
                     <a:srcRect r="5389"/>
                     <a:stretch>
                       <a:fillRect/>
@@ -23480,7 +24327,7 @@
                     <pic:cNvPicPr/>
                   </pic:nvPicPr>
                   <pic:blipFill>
-                    <a:blip r:embed="rId29"/>
+                    <a:blip r:embed="rId32"/>
                     <a:stretch>
                       <a:fillRect/>
                     </a:stretch>
@@ -23671,7 +24518,7 @@
                     <pic:cNvPicPr/>
                   </pic:nvPicPr>
                   <pic:blipFill>
-                    <a:blip r:embed="rId30"/>
+                    <a:blip r:embed="rId33"/>
                     <a:stretch>
                       <a:fillRect/>
                     </a:stretch>
@@ -23757,7 +24604,7 @@
                     <pic:cNvPicPr/>
                   </pic:nvPicPr>
                   <pic:blipFill>
-                    <a:blip r:embed="rId19"/>
+                    <a:blip r:embed="rId34"/>
                     <a:stretch>
                       <a:fillRect/>
                     </a:stretch>
@@ -23808,7 +24655,7 @@
                     <pic:cNvPicPr/>
                   </pic:nvPicPr>
                   <pic:blipFill>
-                    <a:blip r:embed="rId20"/>
+                    <a:blip r:embed="rId35"/>
                     <a:stretch>
                       <a:fillRect/>
                     </a:stretch>
@@ -23861,7 +24708,7 @@
                     <pic:cNvPicPr/>
                   </pic:nvPicPr>
                   <pic:blipFill>
-                    <a:blip r:embed="rId31"/>
+                    <a:blip r:embed="rId36"/>
                     <a:stretch>
                       <a:fillRect/>
                     </a:stretch>
@@ -23918,7 +24765,7 @@
                     <pic:cNvPicPr/>
                   </pic:nvPicPr>
                   <pic:blipFill>
-                    <a:blip r:embed="rId21"/>
+                    <a:blip r:embed="rId37"/>
                     <a:stretch>
                       <a:fillRect/>
                     </a:stretch>
@@ -23963,7 +24810,7 @@
                     <pic:cNvPicPr/>
                   </pic:nvPicPr>
                   <pic:blipFill>
-                    <a:blip r:embed="rId22"/>
+                    <a:blip r:embed="rId38"/>
                     <a:stretch>
                       <a:fillRect/>
                     </a:stretch>
@@ -24024,7 +24871,7 @@
                     <pic:cNvPicPr/>
                   </pic:nvPicPr>
                   <pic:blipFill>
-                    <a:blip r:embed="rId23"/>
+                    <a:blip r:embed="rId39"/>
                     <a:stretch>
                       <a:fillRect/>
                     </a:stretch>
@@ -24056,12 +24903,6 @@
     <w:p>
       <w:pPr>
         <w:spacing w:line="360" w:lineRule="auto"/>
-        <w:rPr>
-          <w:rFonts w:asciiTheme="majorHAnsi" w:eastAsiaTheme="majorEastAsia" w:hAnsiTheme="majorHAnsi" w:cstheme="majorBidi"/>
-          <w:color w:val="0F4761" w:themeColor="accent1" w:themeShade="BF"/>
-          <w:sz w:val="32"/>
-          <w:szCs w:val="32"/>
-        </w:rPr>
       </w:pPr>
       <w:r>
         <w:t xml:space="preserve">This analysis supports the inclusion of Whisper in the AES pipeline as an assistive technology. However, the high proportion of failed transcriptions justifies the use of </w:t>
@@ -24071,8 +24912,80 @@
         <w:t>evaluation logic to route transcriptions to the appropriate scorer based on their WER and CER</w:t>
       </w:r>
     </w:p>
+    <w:p>
+      <w:r>
+        <w:br w:type="page"/>
+      </w:r>
+    </w:p>
+    <w:p>
+      <w:r>
+        <w:lastRenderedPageBreak/>
+        <w:t xml:space="preserve">Selection of Essay samples based on variation in writing styles and image composition </w:t>
+      </w:r>
+    </w:p>
+    <w:p>
+      <w:r>
+        <w:t xml:space="preserve">Aaliah – warpage, curvature, vignetting, blurry top right edge, </w:t>
+      </w:r>
+    </w:p>
+    <w:p>
+      <w:r>
+        <w:t>Gordon- use paper without lines, some text overlaps, some characters were cropped, mixed cursive and block style writing</w:t>
+      </w:r>
+    </w:p>
+    <w:p>
+      <w:r>
+        <w:t xml:space="preserve">Kaelum – no signs of warpage, however, text is light didn’t seem to press much on pen, last sentence is a bit faint. </w:t>
+      </w:r>
+    </w:p>
+    <w:p>
+      <w:r>
+        <w:t xml:space="preserve">Nubia- </w:t>
+      </w:r>
+      <w:proofErr w:type="spellStart"/>
+      <w:proofErr w:type="gramStart"/>
+      <w:r>
+        <w:t>clear,clean</w:t>
+      </w:r>
+      <w:proofErr w:type="spellEnd"/>
+      <w:proofErr w:type="gramEnd"/>
+      <w:r>
+        <w:t>, consistent, text size decreased slightly after the first paragraph so mixed text size</w:t>
+      </w:r>
+    </w:p>
+    <w:p>
+      <w:r>
+        <w:t xml:space="preserve">Shemar, very small text, several crossings, writing uniform however some text is illegible. Overall image is underexposed. </w:t>
+      </w:r>
+    </w:p>
+    <w:p/>
+    <w:p>
+      <w:r>
+        <w:t>Selection of Audio samples-based quality</w:t>
+      </w:r>
+    </w:p>
+    <w:p>
+      <w:r>
+        <w:t>researcher-assessed recording quality</w:t>
+      </w:r>
+    </w:p>
+    <w:p>
+      <w:r>
+        <w:t>Daniella- clear, not background noise, words can be easily deciphered, speaker speaks at a reasonable pace</w:t>
+      </w:r>
+    </w:p>
+    <w:p>
+      <w:r>
+        <w:t>Gordon speaks fast, some words are not easily deciphered the first time they are heard, the audio has some background noise that muffles the speaker’s voice</w:t>
+      </w:r>
+    </w:p>
+    <w:p>
+      <w:r>
+        <w:t>Katelyn – very difficult to hear as the audio volume is quite low, no evidence of background noise</w:t>
+      </w:r>
+    </w:p>
     <w:sectPr>
-      <w:footerReference w:type="default" r:id="rId32"/>
+      <w:footerReference w:type="default" r:id="rId40"/>
       <w:pgSz w:w="11906" w:h="16838"/>
       <w:pgMar w:top="1440" w:right="1440" w:bottom="1440" w:left="1440" w:header="708" w:footer="708" w:gutter="0"/>
       <w:cols w:space="708"/>
@@ -29761,7 +30674,6 @@
   <w:style w:type="character" w:default="1" w:styleId="DefaultParagraphFont">
     <w:name w:val="Default Paragraph Font"/>
     <w:uiPriority w:val="1"/>
-    <w:semiHidden/>
     <w:unhideWhenUsed/>
   </w:style>
   <w:style w:type="table" w:default="1" w:styleId="TableNormal">

</xml_diff>

<commit_message>
Prepared dataset for deBERTa fine-tuning
</commit_message>
<xml_diff>
--- a/final report/Final Report.docx
+++ b/final report/Final Report.docx
@@ -177,7 +177,7 @@
           <w:r>
             <w:fldChar w:fldCharType="separate"/>
           </w:r>
-          <w:hyperlink w:anchor="_Toc238719398" w:history="1">
+          <w:hyperlink w:anchor="_Toc239628339" w:history="1">
             <w:r>
               <w:rPr>
                 <w:rStyle w:val="Hyperlink"/>
@@ -204,7 +204,7 @@
                 <w:noProof/>
                 <w:webHidden/>
               </w:rPr>
-              <w:instrText xml:space="preserve"> PAGEREF _Toc238719398 \h </w:instrText>
+              <w:instrText xml:space="preserve"> PAGEREF _Toc239628339 \h </w:instrText>
             </w:r>
             <w:r>
               <w:rPr>
@@ -247,7 +247,7 @@
               <w:lang w:eastAsia="en-GB"/>
             </w:rPr>
           </w:pPr>
-          <w:hyperlink w:anchor="_Toc238719399" w:history="1">
+          <w:hyperlink w:anchor="_Toc239628340" w:history="1">
             <w:r>
               <w:rPr>
                 <w:rStyle w:val="Hyperlink"/>
@@ -274,7 +274,7 @@
                 <w:noProof/>
                 <w:webHidden/>
               </w:rPr>
-              <w:instrText xml:space="preserve"> PAGEREF _Toc238719399 \h </w:instrText>
+              <w:instrText xml:space="preserve"> PAGEREF _Toc239628340 \h </w:instrText>
             </w:r>
             <w:r>
               <w:rPr>
@@ -317,7 +317,7 @@
               <w:lang w:eastAsia="en-GB"/>
             </w:rPr>
           </w:pPr>
-          <w:hyperlink w:anchor="_Toc238719400" w:history="1">
+          <w:hyperlink w:anchor="_Toc239628341" w:history="1">
             <w:r>
               <w:rPr>
                 <w:rStyle w:val="Hyperlink"/>
@@ -344,7 +344,7 @@
                 <w:noProof/>
                 <w:webHidden/>
               </w:rPr>
-              <w:instrText xml:space="preserve"> PAGEREF _Toc238719400 \h </w:instrText>
+              <w:instrText xml:space="preserve"> PAGEREF _Toc239628341 \h </w:instrText>
             </w:r>
             <w:r>
               <w:rPr>
@@ -387,7 +387,7 @@
               <w:lang w:eastAsia="en-GB"/>
             </w:rPr>
           </w:pPr>
-          <w:hyperlink w:anchor="_Toc238719401" w:history="1">
+          <w:hyperlink w:anchor="_Toc239628342" w:history="1">
             <w:r>
               <w:rPr>
                 <w:rStyle w:val="Hyperlink"/>
@@ -414,7 +414,7 @@
                 <w:noProof/>
                 <w:webHidden/>
               </w:rPr>
-              <w:instrText xml:space="preserve"> PAGEREF _Toc238719401 \h </w:instrText>
+              <w:instrText xml:space="preserve"> PAGEREF _Toc239628342 \h </w:instrText>
             </w:r>
             <w:r>
               <w:rPr>
@@ -457,7 +457,7 @@
               <w:lang w:eastAsia="en-GB"/>
             </w:rPr>
           </w:pPr>
-          <w:hyperlink w:anchor="_Toc238719402" w:history="1">
+          <w:hyperlink w:anchor="_Toc239628343" w:history="1">
             <w:r>
               <w:rPr>
                 <w:rStyle w:val="Hyperlink"/>
@@ -484,7 +484,7 @@
                 <w:noProof/>
                 <w:webHidden/>
               </w:rPr>
-              <w:instrText xml:space="preserve"> PAGEREF _Toc238719402 \h </w:instrText>
+              <w:instrText xml:space="preserve"> PAGEREF _Toc239628343 \h </w:instrText>
             </w:r>
             <w:r>
               <w:rPr>
@@ -527,7 +527,7 @@
               <w:lang w:eastAsia="en-GB"/>
             </w:rPr>
           </w:pPr>
-          <w:hyperlink w:anchor="_Toc238719403" w:history="1">
+          <w:hyperlink w:anchor="_Toc239628344" w:history="1">
             <w:r>
               <w:rPr>
                 <w:rStyle w:val="Hyperlink"/>
@@ -554,7 +554,7 @@
                 <w:noProof/>
                 <w:webHidden/>
               </w:rPr>
-              <w:instrText xml:space="preserve"> PAGEREF _Toc238719403 \h </w:instrText>
+              <w:instrText xml:space="preserve"> PAGEREF _Toc239628344 \h </w:instrText>
             </w:r>
             <w:r>
               <w:rPr>
@@ -597,7 +597,7 @@
               <w:lang w:eastAsia="en-GB"/>
             </w:rPr>
           </w:pPr>
-          <w:hyperlink w:anchor="_Toc238719404" w:history="1">
+          <w:hyperlink w:anchor="_Toc239628345" w:history="1">
             <w:r>
               <w:rPr>
                 <w:rStyle w:val="Hyperlink"/>
@@ -624,7 +624,7 @@
                 <w:noProof/>
                 <w:webHidden/>
               </w:rPr>
-              <w:instrText xml:space="preserve"> PAGEREF _Toc238719404 \h </w:instrText>
+              <w:instrText xml:space="preserve"> PAGEREF _Toc239628345 \h </w:instrText>
             </w:r>
             <w:r>
               <w:rPr>
@@ -667,7 +667,7 @@
               <w:lang w:eastAsia="en-GB"/>
             </w:rPr>
           </w:pPr>
-          <w:hyperlink w:anchor="_Toc238719405" w:history="1">
+          <w:hyperlink w:anchor="_Toc239628346" w:history="1">
             <w:r>
               <w:rPr>
                 <w:rStyle w:val="Hyperlink"/>
@@ -694,7 +694,7 @@
                 <w:noProof/>
                 <w:webHidden/>
               </w:rPr>
-              <w:instrText xml:space="preserve"> PAGEREF _Toc238719405 \h </w:instrText>
+              <w:instrText xml:space="preserve"> PAGEREF _Toc239628346 \h </w:instrText>
             </w:r>
             <w:r>
               <w:rPr>
@@ -737,7 +737,7 @@
               <w:lang w:eastAsia="en-GB"/>
             </w:rPr>
           </w:pPr>
-          <w:hyperlink w:anchor="_Toc238719406" w:history="1">
+          <w:hyperlink w:anchor="_Toc239628347" w:history="1">
             <w:r>
               <w:rPr>
                 <w:rStyle w:val="Hyperlink"/>
@@ -764,7 +764,7 @@
                 <w:noProof/>
                 <w:webHidden/>
               </w:rPr>
-              <w:instrText xml:space="preserve"> PAGEREF _Toc238719406 \h </w:instrText>
+              <w:instrText xml:space="preserve"> PAGEREF _Toc239628347 \h </w:instrText>
             </w:r>
             <w:r>
               <w:rPr>
@@ -807,7 +807,7 @@
               <w:lang w:eastAsia="en-GB"/>
             </w:rPr>
           </w:pPr>
-          <w:hyperlink w:anchor="_Toc238719407" w:history="1">
+          <w:hyperlink w:anchor="_Toc239628348" w:history="1">
             <w:r>
               <w:rPr>
                 <w:rStyle w:val="Hyperlink"/>
@@ -834,7 +834,7 @@
                 <w:noProof/>
                 <w:webHidden/>
               </w:rPr>
-              <w:instrText xml:space="preserve"> PAGEREF _Toc238719407 \h </w:instrText>
+              <w:instrText xml:space="preserve"> PAGEREF _Toc239628348 \h </w:instrText>
             </w:r>
             <w:r>
               <w:rPr>
@@ -877,7 +877,7 @@
               <w:lang w:eastAsia="en-GB"/>
             </w:rPr>
           </w:pPr>
-          <w:hyperlink w:anchor="_Toc238719408" w:history="1">
+          <w:hyperlink w:anchor="_Toc239628349" w:history="1">
             <w:r>
               <w:rPr>
                 <w:rStyle w:val="Hyperlink"/>
@@ -904,7 +904,7 @@
                 <w:noProof/>
                 <w:webHidden/>
               </w:rPr>
-              <w:instrText xml:space="preserve"> PAGEREF _Toc238719408 \h </w:instrText>
+              <w:instrText xml:space="preserve"> PAGEREF _Toc239628349 \h </w:instrText>
             </w:r>
             <w:r>
               <w:rPr>
@@ -947,7 +947,7 @@
               <w:lang w:eastAsia="en-GB"/>
             </w:rPr>
           </w:pPr>
-          <w:hyperlink w:anchor="_Toc238719409" w:history="1">
+          <w:hyperlink w:anchor="_Toc239628350" w:history="1">
             <w:r>
               <w:rPr>
                 <w:rStyle w:val="Hyperlink"/>
@@ -974,7 +974,7 @@
                 <w:noProof/>
                 <w:webHidden/>
               </w:rPr>
-              <w:instrText xml:space="preserve"> PAGEREF _Toc238719409 \h </w:instrText>
+              <w:instrText xml:space="preserve"> PAGEREF _Toc239628350 \h </w:instrText>
             </w:r>
             <w:r>
               <w:rPr>
@@ -1017,7 +1017,7 @@
               <w:lang w:eastAsia="en-GB"/>
             </w:rPr>
           </w:pPr>
-          <w:hyperlink w:anchor="_Toc238719410" w:history="1">
+          <w:hyperlink w:anchor="_Toc239628351" w:history="1">
             <w:r>
               <w:rPr>
                 <w:rStyle w:val="Hyperlink"/>
@@ -1044,7 +1044,7 @@
                 <w:noProof/>
                 <w:webHidden/>
               </w:rPr>
-              <w:instrText xml:space="preserve"> PAGEREF _Toc238719410 \h </w:instrText>
+              <w:instrText xml:space="preserve"> PAGEREF _Toc239628351 \h </w:instrText>
             </w:r>
             <w:r>
               <w:rPr>
@@ -1087,7 +1087,7 @@
               <w:lang w:eastAsia="en-GB"/>
             </w:rPr>
           </w:pPr>
-          <w:hyperlink w:anchor="_Toc238719411" w:history="1">
+          <w:hyperlink w:anchor="_Toc239628352" w:history="1">
             <w:r>
               <w:rPr>
                 <w:rStyle w:val="Hyperlink"/>
@@ -1114,7 +1114,7 @@
                 <w:noProof/>
                 <w:webHidden/>
               </w:rPr>
-              <w:instrText xml:space="preserve"> PAGEREF _Toc238719411 \h </w:instrText>
+              <w:instrText xml:space="preserve"> PAGEREF _Toc239628352 \h </w:instrText>
             </w:r>
             <w:r>
               <w:rPr>
@@ -1157,7 +1157,7 @@
               <w:lang w:eastAsia="en-GB"/>
             </w:rPr>
           </w:pPr>
-          <w:hyperlink w:anchor="_Toc238719412" w:history="1">
+          <w:hyperlink w:anchor="_Toc239628353" w:history="1">
             <w:r>
               <w:rPr>
                 <w:rStyle w:val="Hyperlink"/>
@@ -1184,7 +1184,7 @@
                 <w:noProof/>
                 <w:webHidden/>
               </w:rPr>
-              <w:instrText xml:space="preserve"> PAGEREF _Toc238719412 \h </w:instrText>
+              <w:instrText xml:space="preserve"> PAGEREF _Toc239628353 \h </w:instrText>
             </w:r>
             <w:r>
               <w:rPr>
@@ -1227,7 +1227,7 @@
               <w:lang w:eastAsia="en-GB"/>
             </w:rPr>
           </w:pPr>
-          <w:hyperlink w:anchor="_Toc238719413" w:history="1">
+          <w:hyperlink w:anchor="_Toc239628354" w:history="1">
             <w:r>
               <w:rPr>
                 <w:rStyle w:val="Hyperlink"/>
@@ -1254,7 +1254,7 @@
                 <w:noProof/>
                 <w:webHidden/>
               </w:rPr>
-              <w:instrText xml:space="preserve"> PAGEREF _Toc238719413 \h </w:instrText>
+              <w:instrText xml:space="preserve"> PAGEREF _Toc239628354 \h </w:instrText>
             </w:r>
             <w:r>
               <w:rPr>
@@ -1297,7 +1297,7 @@
               <w:lang w:eastAsia="en-GB"/>
             </w:rPr>
           </w:pPr>
-          <w:hyperlink w:anchor="_Toc238719414" w:history="1">
+          <w:hyperlink w:anchor="_Toc239628355" w:history="1">
             <w:r>
               <w:rPr>
                 <w:rStyle w:val="Hyperlink"/>
@@ -1324,7 +1324,7 @@
                 <w:noProof/>
                 <w:webHidden/>
               </w:rPr>
-              <w:instrText xml:space="preserve"> PAGEREF _Toc238719414 \h </w:instrText>
+              <w:instrText xml:space="preserve"> PAGEREF _Toc239628355 \h </w:instrText>
             </w:r>
             <w:r>
               <w:rPr>
@@ -1367,7 +1367,7 @@
               <w:lang w:eastAsia="en-GB"/>
             </w:rPr>
           </w:pPr>
-          <w:hyperlink w:anchor="_Toc238719415" w:history="1">
+          <w:hyperlink w:anchor="_Toc239628356" w:history="1">
             <w:r>
               <w:rPr>
                 <w:rStyle w:val="Hyperlink"/>
@@ -1394,7 +1394,7 @@
                 <w:noProof/>
                 <w:webHidden/>
               </w:rPr>
-              <w:instrText xml:space="preserve"> PAGEREF _Toc238719415 \h </w:instrText>
+              <w:instrText xml:space="preserve"> PAGEREF _Toc239628356 \h </w:instrText>
             </w:r>
             <w:r>
               <w:rPr>
@@ -1437,7 +1437,7 @@
               <w:lang w:eastAsia="en-GB"/>
             </w:rPr>
           </w:pPr>
-          <w:hyperlink w:anchor="_Toc238719416" w:history="1">
+          <w:hyperlink w:anchor="_Toc239628357" w:history="1">
             <w:r>
               <w:rPr>
                 <w:rStyle w:val="Hyperlink"/>
@@ -1464,7 +1464,7 @@
                 <w:noProof/>
                 <w:webHidden/>
               </w:rPr>
-              <w:instrText xml:space="preserve"> PAGEREF _Toc238719416 \h </w:instrText>
+              <w:instrText xml:space="preserve"> PAGEREF _Toc239628357 \h </w:instrText>
             </w:r>
             <w:r>
               <w:rPr>
@@ -1507,7 +1507,7 @@
               <w:lang w:eastAsia="en-GB"/>
             </w:rPr>
           </w:pPr>
-          <w:hyperlink w:anchor="_Toc238719417" w:history="1">
+          <w:hyperlink w:anchor="_Toc239628358" w:history="1">
             <w:r>
               <w:rPr>
                 <w:rStyle w:val="Hyperlink"/>
@@ -1534,7 +1534,7 @@
                 <w:noProof/>
                 <w:webHidden/>
               </w:rPr>
-              <w:instrText xml:space="preserve"> PAGEREF _Toc238719417 \h </w:instrText>
+              <w:instrText xml:space="preserve"> PAGEREF _Toc239628358 \h </w:instrText>
             </w:r>
             <w:r>
               <w:rPr>
@@ -1577,7 +1577,7 @@
               <w:lang w:eastAsia="en-GB"/>
             </w:rPr>
           </w:pPr>
-          <w:hyperlink w:anchor="_Toc238719418" w:history="1">
+          <w:hyperlink w:anchor="_Toc239628359" w:history="1">
             <w:r>
               <w:rPr>
                 <w:rStyle w:val="Hyperlink"/>
@@ -1604,7 +1604,7 @@
                 <w:noProof/>
                 <w:webHidden/>
               </w:rPr>
-              <w:instrText xml:space="preserve"> PAGEREF _Toc238719418 \h </w:instrText>
+              <w:instrText xml:space="preserve"> PAGEREF _Toc239628359 \h </w:instrText>
             </w:r>
             <w:r>
               <w:rPr>
@@ -1647,7 +1647,7 @@
               <w:lang w:eastAsia="en-GB"/>
             </w:rPr>
           </w:pPr>
-          <w:hyperlink w:anchor="_Toc238719419" w:history="1">
+          <w:hyperlink w:anchor="_Toc239628360" w:history="1">
             <w:r>
               <w:rPr>
                 <w:rStyle w:val="Hyperlink"/>
@@ -1674,7 +1674,7 @@
                 <w:noProof/>
                 <w:webHidden/>
               </w:rPr>
-              <w:instrText xml:space="preserve"> PAGEREF _Toc238719419 \h </w:instrText>
+              <w:instrText xml:space="preserve"> PAGEREF _Toc239628360 \h </w:instrText>
             </w:r>
             <w:r>
               <w:rPr>
@@ -1717,7 +1717,7 @@
               <w:lang w:eastAsia="en-GB"/>
             </w:rPr>
           </w:pPr>
-          <w:hyperlink w:anchor="_Toc238719420" w:history="1">
+          <w:hyperlink w:anchor="_Toc239628361" w:history="1">
             <w:r>
               <w:rPr>
                 <w:rStyle w:val="Hyperlink"/>
@@ -1744,7 +1744,7 @@
                 <w:noProof/>
                 <w:webHidden/>
               </w:rPr>
-              <w:instrText xml:space="preserve"> PAGEREF _Toc238719420 \h </w:instrText>
+              <w:instrText xml:space="preserve"> PAGEREF _Toc239628361 \h </w:instrText>
             </w:r>
             <w:r>
               <w:rPr>
@@ -1787,7 +1787,7 @@
               <w:lang w:eastAsia="en-GB"/>
             </w:rPr>
           </w:pPr>
-          <w:hyperlink w:anchor="_Toc238719421" w:history="1">
+          <w:hyperlink w:anchor="_Toc239628362" w:history="1">
             <w:r>
               <w:rPr>
                 <w:rStyle w:val="Hyperlink"/>
@@ -1814,7 +1814,7 @@
                 <w:noProof/>
                 <w:webHidden/>
               </w:rPr>
-              <w:instrText xml:space="preserve"> PAGEREF _Toc238719421 \h </w:instrText>
+              <w:instrText xml:space="preserve"> PAGEREF _Toc239628362 \h </w:instrText>
             </w:r>
             <w:r>
               <w:rPr>
@@ -1857,7 +1857,7 @@
               <w:lang w:eastAsia="en-GB"/>
             </w:rPr>
           </w:pPr>
-          <w:hyperlink w:anchor="_Toc238719422" w:history="1">
+          <w:hyperlink w:anchor="_Toc239628363" w:history="1">
             <w:r>
               <w:rPr>
                 <w:rStyle w:val="Hyperlink"/>
@@ -1884,7 +1884,7 @@
                 <w:noProof/>
                 <w:webHidden/>
               </w:rPr>
-              <w:instrText xml:space="preserve"> PAGEREF _Toc238719422 \h </w:instrText>
+              <w:instrText xml:space="preserve"> PAGEREF _Toc239628363 \h </w:instrText>
             </w:r>
             <w:r>
               <w:rPr>
@@ -1927,13 +1927,13 @@
               <w:lang w:eastAsia="en-GB"/>
             </w:rPr>
           </w:pPr>
-          <w:hyperlink w:anchor="_Toc238719423" w:history="1">
+          <w:hyperlink w:anchor="_Toc239628364" w:history="1">
             <w:r>
               <w:rPr>
                 <w:rStyle w:val="Hyperlink"/>
                 <w:noProof/>
               </w:rPr>
-              <w:t>4.5 ASR Implementation</w:t>
+              <w:t>4.4 ASR Implementation</w:t>
             </w:r>
             <w:r>
               <w:rPr>
@@ -1954,7 +1954,7 @@
                 <w:noProof/>
                 <w:webHidden/>
               </w:rPr>
-              <w:instrText xml:space="preserve"> PAGEREF _Toc238719423 \h </w:instrText>
+              <w:instrText xml:space="preserve"> PAGEREF _Toc239628364 \h </w:instrText>
             </w:r>
             <w:r>
               <w:rPr>
@@ -1974,7 +1974,7 @@
                 <w:noProof/>
                 <w:webHidden/>
               </w:rPr>
-              <w:t>38</w:t>
+              <w:t>40</w:t>
             </w:r>
             <w:r>
               <w:rPr>
@@ -1997,13 +1997,13 @@
               <w:lang w:eastAsia="en-GB"/>
             </w:rPr>
           </w:pPr>
-          <w:hyperlink w:anchor="_Toc238719424" w:history="1">
+          <w:hyperlink w:anchor="_Toc239628365" w:history="1">
             <w:r>
               <w:rPr>
                 <w:rStyle w:val="Hyperlink"/>
                 <w:noProof/>
               </w:rPr>
-              <w:t>4.6 AES/Transformer Implementation</w:t>
+              <w:t>4.5 AES/Transformer Implementation</w:t>
             </w:r>
             <w:r>
               <w:rPr>
@@ -2024,7 +2024,7 @@
                 <w:noProof/>
                 <w:webHidden/>
               </w:rPr>
-              <w:instrText xml:space="preserve"> PAGEREF _Toc238719424 \h </w:instrText>
+              <w:instrText xml:space="preserve"> PAGEREF _Toc239628365 \h </w:instrText>
             </w:r>
             <w:r>
               <w:rPr>
@@ -2044,7 +2044,7 @@
                 <w:noProof/>
                 <w:webHidden/>
               </w:rPr>
-              <w:t>39</w:t>
+              <w:t>42</w:t>
             </w:r>
             <w:r>
               <w:rPr>
@@ -2067,7 +2067,7 @@
               <w:lang w:eastAsia="en-GB"/>
             </w:rPr>
           </w:pPr>
-          <w:hyperlink w:anchor="_Toc238719425" w:history="1">
+          <w:hyperlink w:anchor="_Toc239628366" w:history="1">
             <w:r>
               <w:rPr>
                 <w:rStyle w:val="Hyperlink"/>
@@ -2094,7 +2094,7 @@
                 <w:noProof/>
                 <w:webHidden/>
               </w:rPr>
-              <w:instrText xml:space="preserve"> PAGEREF _Toc238719425 \h </w:instrText>
+              <w:instrText xml:space="preserve"> PAGEREF _Toc239628366 \h </w:instrText>
             </w:r>
             <w:r>
               <w:rPr>
@@ -2114,7 +2114,7 @@
                 <w:noProof/>
                 <w:webHidden/>
               </w:rPr>
-              <w:t>40</w:t>
+              <w:t>43</w:t>
             </w:r>
             <w:r>
               <w:rPr>
@@ -2137,7 +2137,7 @@
               <w:lang w:eastAsia="en-GB"/>
             </w:rPr>
           </w:pPr>
-          <w:hyperlink w:anchor="_Toc238719426" w:history="1">
+          <w:hyperlink w:anchor="_Toc239628367" w:history="1">
             <w:r>
               <w:rPr>
                 <w:rStyle w:val="Hyperlink"/>
@@ -2164,7 +2164,7 @@
                 <w:noProof/>
                 <w:webHidden/>
               </w:rPr>
-              <w:instrText xml:space="preserve"> PAGEREF _Toc238719426 \h </w:instrText>
+              <w:instrText xml:space="preserve"> PAGEREF _Toc239628367 \h </w:instrText>
             </w:r>
             <w:r>
               <w:rPr>
@@ -2184,7 +2184,7 @@
                 <w:noProof/>
                 <w:webHidden/>
               </w:rPr>
-              <w:t>41</w:t>
+              <w:t>44</w:t>
             </w:r>
             <w:r>
               <w:rPr>
@@ -2207,13 +2207,13 @@
               <w:lang w:eastAsia="en-GB"/>
             </w:rPr>
           </w:pPr>
-          <w:hyperlink w:anchor="_Toc238719427" w:history="1">
+          <w:hyperlink w:anchor="_Toc239628368" w:history="1">
             <w:r>
               <w:rPr>
                 <w:rStyle w:val="Hyperlink"/>
                 <w:noProof/>
               </w:rPr>
-              <w:t>Code Design</w:t>
+              <w:t>4.8 System Deployment/Implementation Details</w:t>
             </w:r>
             <w:r>
               <w:rPr>
@@ -2234,7 +2234,7 @@
                 <w:noProof/>
                 <w:webHidden/>
               </w:rPr>
-              <w:instrText xml:space="preserve"> PAGEREF _Toc238719427 \h </w:instrText>
+              <w:instrText xml:space="preserve"> PAGEREF _Toc239628368 \h </w:instrText>
             </w:r>
             <w:r>
               <w:rPr>
@@ -2254,7 +2254,147 @@
                 <w:noProof/>
                 <w:webHidden/>
               </w:rPr>
-              <w:t>41</w:t>
+              <w:t>45</w:t>
+            </w:r>
+            <w:r>
+              <w:rPr>
+                <w:noProof/>
+                <w:webHidden/>
+              </w:rPr>
+              <w:fldChar w:fldCharType="end"/>
+            </w:r>
+          </w:hyperlink>
+        </w:p>
+        <w:p>
+          <w:pPr>
+            <w:pStyle w:val="TOC1"/>
+            <w:tabs>
+              <w:tab w:val="right" w:leader="dot" w:pos="9016"/>
+            </w:tabs>
+            <w:rPr>
+              <w:rFonts w:eastAsiaTheme="minorEastAsia"/>
+              <w:noProof/>
+              <w:lang w:eastAsia="en-GB"/>
+            </w:rPr>
+          </w:pPr>
+          <w:hyperlink w:anchor="_Toc239628369" w:history="1">
+            <w:r>
+              <w:rPr>
+                <w:rStyle w:val="Hyperlink"/>
+                <w:noProof/>
+              </w:rPr>
+              <w:t>CHAPTER  5</w:t>
+            </w:r>
+            <w:r>
+              <w:rPr>
+                <w:noProof/>
+                <w:webHidden/>
+              </w:rPr>
+              <w:tab/>
+            </w:r>
+            <w:r>
+              <w:rPr>
+                <w:noProof/>
+                <w:webHidden/>
+              </w:rPr>
+              <w:fldChar w:fldCharType="begin"/>
+            </w:r>
+            <w:r>
+              <w:rPr>
+                <w:noProof/>
+                <w:webHidden/>
+              </w:rPr>
+              <w:instrText xml:space="preserve"> PAGEREF _Toc239628369 \h </w:instrText>
+            </w:r>
+            <w:r>
+              <w:rPr>
+                <w:noProof/>
+                <w:webHidden/>
+              </w:rPr>
+            </w:r>
+            <w:r>
+              <w:rPr>
+                <w:noProof/>
+                <w:webHidden/>
+              </w:rPr>
+              <w:fldChar w:fldCharType="separate"/>
+            </w:r>
+            <w:r>
+              <w:rPr>
+                <w:noProof/>
+                <w:webHidden/>
+              </w:rPr>
+              <w:t>46</w:t>
+            </w:r>
+            <w:r>
+              <w:rPr>
+                <w:noProof/>
+                <w:webHidden/>
+              </w:rPr>
+              <w:fldChar w:fldCharType="end"/>
+            </w:r>
+          </w:hyperlink>
+        </w:p>
+        <w:p>
+          <w:pPr>
+            <w:pStyle w:val="TOC1"/>
+            <w:tabs>
+              <w:tab w:val="right" w:leader="dot" w:pos="9016"/>
+            </w:tabs>
+            <w:rPr>
+              <w:rFonts w:eastAsiaTheme="minorEastAsia"/>
+              <w:noProof/>
+              <w:lang w:eastAsia="en-GB"/>
+            </w:rPr>
+          </w:pPr>
+          <w:hyperlink w:anchor="_Toc239628370" w:history="1">
+            <w:r>
+              <w:rPr>
+                <w:rStyle w:val="Hyperlink"/>
+                <w:noProof/>
+              </w:rPr>
+              <w:t>Evaluation</w:t>
+            </w:r>
+            <w:r>
+              <w:rPr>
+                <w:noProof/>
+                <w:webHidden/>
+              </w:rPr>
+              <w:tab/>
+            </w:r>
+            <w:r>
+              <w:rPr>
+                <w:noProof/>
+                <w:webHidden/>
+              </w:rPr>
+              <w:fldChar w:fldCharType="begin"/>
+            </w:r>
+            <w:r>
+              <w:rPr>
+                <w:noProof/>
+                <w:webHidden/>
+              </w:rPr>
+              <w:instrText xml:space="preserve"> PAGEREF _Toc239628370 \h </w:instrText>
+            </w:r>
+            <w:r>
+              <w:rPr>
+                <w:noProof/>
+                <w:webHidden/>
+              </w:rPr>
+            </w:r>
+            <w:r>
+              <w:rPr>
+                <w:noProof/>
+                <w:webHidden/>
+              </w:rPr>
+              <w:fldChar w:fldCharType="separate"/>
+            </w:r>
+            <w:r>
+              <w:rPr>
+                <w:noProof/>
+                <w:webHidden/>
+              </w:rPr>
+              <w:t>46</w:t>
             </w:r>
             <w:r>
               <w:rPr>
@@ -2277,12 +2417,82 @@
               <w:lang w:eastAsia="en-GB"/>
             </w:rPr>
           </w:pPr>
-          <w:hyperlink w:anchor="_Toc238719428" w:history="1">
+          <w:hyperlink w:anchor="_Toc239628371" w:history="1">
             <w:r>
               <w:rPr>
                 <w:rStyle w:val="Hyperlink"/>
                 <w:noProof/>
               </w:rPr>
+              <w:t>5.1 Evaluation Methodology</w:t>
+            </w:r>
+            <w:r>
+              <w:rPr>
+                <w:noProof/>
+                <w:webHidden/>
+              </w:rPr>
+              <w:tab/>
+            </w:r>
+            <w:r>
+              <w:rPr>
+                <w:noProof/>
+                <w:webHidden/>
+              </w:rPr>
+              <w:fldChar w:fldCharType="begin"/>
+            </w:r>
+            <w:r>
+              <w:rPr>
+                <w:noProof/>
+                <w:webHidden/>
+              </w:rPr>
+              <w:instrText xml:space="preserve"> PAGEREF _Toc239628371 \h </w:instrText>
+            </w:r>
+            <w:r>
+              <w:rPr>
+                <w:noProof/>
+                <w:webHidden/>
+              </w:rPr>
+            </w:r>
+            <w:r>
+              <w:rPr>
+                <w:noProof/>
+                <w:webHidden/>
+              </w:rPr>
+              <w:fldChar w:fldCharType="separate"/>
+            </w:r>
+            <w:r>
+              <w:rPr>
+                <w:noProof/>
+                <w:webHidden/>
+              </w:rPr>
+              <w:t>47</w:t>
+            </w:r>
+            <w:r>
+              <w:rPr>
+                <w:noProof/>
+                <w:webHidden/>
+              </w:rPr>
+              <w:fldChar w:fldCharType="end"/>
+            </w:r>
+          </w:hyperlink>
+        </w:p>
+        <w:p>
+          <w:pPr>
+            <w:pStyle w:val="TOC3"/>
+            <w:tabs>
+              <w:tab w:val="right" w:leader="dot" w:pos="9016"/>
+            </w:tabs>
+            <w:rPr>
+              <w:rFonts w:eastAsiaTheme="minorEastAsia"/>
+              <w:noProof/>
+              <w:lang w:eastAsia="en-GB"/>
+            </w:rPr>
+          </w:pPr>
+          <w:hyperlink w:anchor="_Toc239628372" w:history="1">
+            <w:r>
+              <w:rPr>
+                <w:rStyle w:val="Hyperlink"/>
+                <w:noProof/>
+              </w:rPr>
               <w:t>Procedure</w:t>
             </w:r>
             <w:r>
@@ -2304,7 +2514,7 @@
                 <w:noProof/>
                 <w:webHidden/>
               </w:rPr>
-              <w:instrText xml:space="preserve"> PAGEREF _Toc238719428 \h </w:instrText>
+              <w:instrText xml:space="preserve"> PAGEREF _Toc239628372 \h </w:instrText>
             </w:r>
             <w:r>
               <w:rPr>
@@ -2324,7 +2534,847 @@
                 <w:noProof/>
                 <w:webHidden/>
               </w:rPr>
-              <w:t>41</w:t>
+              <w:t>48</w:t>
+            </w:r>
+            <w:r>
+              <w:rPr>
+                <w:noProof/>
+                <w:webHidden/>
+              </w:rPr>
+              <w:fldChar w:fldCharType="end"/>
+            </w:r>
+          </w:hyperlink>
+        </w:p>
+        <w:p>
+          <w:pPr>
+            <w:pStyle w:val="TOC3"/>
+            <w:tabs>
+              <w:tab w:val="right" w:leader="dot" w:pos="9016"/>
+            </w:tabs>
+            <w:rPr>
+              <w:rFonts w:eastAsiaTheme="minorEastAsia"/>
+              <w:noProof/>
+              <w:lang w:eastAsia="en-GB"/>
+            </w:rPr>
+          </w:pPr>
+          <w:hyperlink w:anchor="_Toc239628373" w:history="1">
+            <w:r>
+              <w:rPr>
+                <w:rStyle w:val="Hyperlink"/>
+                <w:noProof/>
+              </w:rPr>
+              <w:t>5.2 Testing Plan</w:t>
+            </w:r>
+            <w:r>
+              <w:rPr>
+                <w:noProof/>
+                <w:webHidden/>
+              </w:rPr>
+              <w:tab/>
+            </w:r>
+            <w:r>
+              <w:rPr>
+                <w:noProof/>
+                <w:webHidden/>
+              </w:rPr>
+              <w:fldChar w:fldCharType="begin"/>
+            </w:r>
+            <w:r>
+              <w:rPr>
+                <w:noProof/>
+                <w:webHidden/>
+              </w:rPr>
+              <w:instrText xml:space="preserve"> PAGEREF _Toc239628373 \h </w:instrText>
+            </w:r>
+            <w:r>
+              <w:rPr>
+                <w:noProof/>
+                <w:webHidden/>
+              </w:rPr>
+            </w:r>
+            <w:r>
+              <w:rPr>
+                <w:noProof/>
+                <w:webHidden/>
+              </w:rPr>
+              <w:fldChar w:fldCharType="separate"/>
+            </w:r>
+            <w:r>
+              <w:rPr>
+                <w:noProof/>
+                <w:webHidden/>
+              </w:rPr>
+              <w:t>49</w:t>
+            </w:r>
+            <w:r>
+              <w:rPr>
+                <w:noProof/>
+                <w:webHidden/>
+              </w:rPr>
+              <w:fldChar w:fldCharType="end"/>
+            </w:r>
+          </w:hyperlink>
+        </w:p>
+        <w:p>
+          <w:pPr>
+            <w:pStyle w:val="TOC3"/>
+            <w:tabs>
+              <w:tab w:val="right" w:leader="dot" w:pos="9016"/>
+            </w:tabs>
+            <w:rPr>
+              <w:rFonts w:eastAsiaTheme="minorEastAsia"/>
+              <w:noProof/>
+              <w:lang w:eastAsia="en-GB"/>
+            </w:rPr>
+          </w:pPr>
+          <w:hyperlink w:anchor="_Toc239628374" w:history="1">
+            <w:r>
+              <w:rPr>
+                <w:rStyle w:val="Hyperlink"/>
+                <w:noProof/>
+              </w:rPr>
+              <w:t>5.3 Unit Testing</w:t>
+            </w:r>
+            <w:r>
+              <w:rPr>
+                <w:noProof/>
+                <w:webHidden/>
+              </w:rPr>
+              <w:tab/>
+            </w:r>
+            <w:r>
+              <w:rPr>
+                <w:noProof/>
+                <w:webHidden/>
+              </w:rPr>
+              <w:fldChar w:fldCharType="begin"/>
+            </w:r>
+            <w:r>
+              <w:rPr>
+                <w:noProof/>
+                <w:webHidden/>
+              </w:rPr>
+              <w:instrText xml:space="preserve"> PAGEREF _Toc239628374 \h </w:instrText>
+            </w:r>
+            <w:r>
+              <w:rPr>
+                <w:noProof/>
+                <w:webHidden/>
+              </w:rPr>
+            </w:r>
+            <w:r>
+              <w:rPr>
+                <w:noProof/>
+                <w:webHidden/>
+              </w:rPr>
+              <w:fldChar w:fldCharType="separate"/>
+            </w:r>
+            <w:r>
+              <w:rPr>
+                <w:noProof/>
+                <w:webHidden/>
+              </w:rPr>
+              <w:t>51</w:t>
+            </w:r>
+            <w:r>
+              <w:rPr>
+                <w:noProof/>
+                <w:webHidden/>
+              </w:rPr>
+              <w:fldChar w:fldCharType="end"/>
+            </w:r>
+          </w:hyperlink>
+        </w:p>
+        <w:p>
+          <w:pPr>
+            <w:pStyle w:val="TOC3"/>
+            <w:tabs>
+              <w:tab w:val="right" w:leader="dot" w:pos="9016"/>
+            </w:tabs>
+            <w:rPr>
+              <w:rFonts w:eastAsiaTheme="minorEastAsia"/>
+              <w:noProof/>
+              <w:lang w:eastAsia="en-GB"/>
+            </w:rPr>
+          </w:pPr>
+          <w:hyperlink w:anchor="_Toc239628375" w:history="1">
+            <w:r>
+              <w:rPr>
+                <w:rStyle w:val="Hyperlink"/>
+                <w:noProof/>
+              </w:rPr>
+              <w:t>5.4 OCR Evaluation</w:t>
+            </w:r>
+            <w:r>
+              <w:rPr>
+                <w:noProof/>
+                <w:webHidden/>
+              </w:rPr>
+              <w:tab/>
+            </w:r>
+            <w:r>
+              <w:rPr>
+                <w:noProof/>
+                <w:webHidden/>
+              </w:rPr>
+              <w:fldChar w:fldCharType="begin"/>
+            </w:r>
+            <w:r>
+              <w:rPr>
+                <w:noProof/>
+                <w:webHidden/>
+              </w:rPr>
+              <w:instrText xml:space="preserve"> PAGEREF _Toc239628375 \h </w:instrText>
+            </w:r>
+            <w:r>
+              <w:rPr>
+                <w:noProof/>
+                <w:webHidden/>
+              </w:rPr>
+            </w:r>
+            <w:r>
+              <w:rPr>
+                <w:noProof/>
+                <w:webHidden/>
+              </w:rPr>
+              <w:fldChar w:fldCharType="separate"/>
+            </w:r>
+            <w:r>
+              <w:rPr>
+                <w:noProof/>
+                <w:webHidden/>
+              </w:rPr>
+              <w:t>52</w:t>
+            </w:r>
+            <w:r>
+              <w:rPr>
+                <w:noProof/>
+                <w:webHidden/>
+              </w:rPr>
+              <w:fldChar w:fldCharType="end"/>
+            </w:r>
+          </w:hyperlink>
+        </w:p>
+        <w:p>
+          <w:pPr>
+            <w:pStyle w:val="TOC3"/>
+            <w:tabs>
+              <w:tab w:val="right" w:leader="dot" w:pos="9016"/>
+            </w:tabs>
+            <w:rPr>
+              <w:rFonts w:eastAsiaTheme="minorEastAsia"/>
+              <w:noProof/>
+              <w:lang w:eastAsia="en-GB"/>
+            </w:rPr>
+          </w:pPr>
+          <w:hyperlink w:anchor="_Toc239628376" w:history="1">
+            <w:r>
+              <w:rPr>
+                <w:rStyle w:val="Hyperlink"/>
+                <w:noProof/>
+              </w:rPr>
+              <w:t>5.5 ASR Evaluation</w:t>
+            </w:r>
+            <w:r>
+              <w:rPr>
+                <w:noProof/>
+                <w:webHidden/>
+              </w:rPr>
+              <w:tab/>
+            </w:r>
+            <w:r>
+              <w:rPr>
+                <w:noProof/>
+                <w:webHidden/>
+              </w:rPr>
+              <w:fldChar w:fldCharType="begin"/>
+            </w:r>
+            <w:r>
+              <w:rPr>
+                <w:noProof/>
+                <w:webHidden/>
+              </w:rPr>
+              <w:instrText xml:space="preserve"> PAGEREF _Toc239628376 \h </w:instrText>
+            </w:r>
+            <w:r>
+              <w:rPr>
+                <w:noProof/>
+                <w:webHidden/>
+              </w:rPr>
+            </w:r>
+            <w:r>
+              <w:rPr>
+                <w:noProof/>
+                <w:webHidden/>
+              </w:rPr>
+              <w:fldChar w:fldCharType="separate"/>
+            </w:r>
+            <w:r>
+              <w:rPr>
+                <w:noProof/>
+                <w:webHidden/>
+              </w:rPr>
+              <w:t>55</w:t>
+            </w:r>
+            <w:r>
+              <w:rPr>
+                <w:noProof/>
+                <w:webHidden/>
+              </w:rPr>
+              <w:fldChar w:fldCharType="end"/>
+            </w:r>
+          </w:hyperlink>
+        </w:p>
+        <w:p>
+          <w:pPr>
+            <w:pStyle w:val="TOC3"/>
+            <w:tabs>
+              <w:tab w:val="right" w:leader="dot" w:pos="9016"/>
+            </w:tabs>
+            <w:rPr>
+              <w:rFonts w:eastAsiaTheme="minorEastAsia"/>
+              <w:noProof/>
+              <w:lang w:eastAsia="en-GB"/>
+            </w:rPr>
+          </w:pPr>
+          <w:hyperlink w:anchor="_Toc239628377" w:history="1">
+            <w:r>
+              <w:rPr>
+                <w:rStyle w:val="Hyperlink"/>
+                <w:noProof/>
+              </w:rPr>
+              <w:t>5.6 Transformer/AES Evaluation</w:t>
+            </w:r>
+            <w:r>
+              <w:rPr>
+                <w:noProof/>
+                <w:webHidden/>
+              </w:rPr>
+              <w:tab/>
+            </w:r>
+            <w:r>
+              <w:rPr>
+                <w:noProof/>
+                <w:webHidden/>
+              </w:rPr>
+              <w:fldChar w:fldCharType="begin"/>
+            </w:r>
+            <w:r>
+              <w:rPr>
+                <w:noProof/>
+                <w:webHidden/>
+              </w:rPr>
+              <w:instrText xml:space="preserve"> PAGEREF _Toc239628377 \h </w:instrText>
+            </w:r>
+            <w:r>
+              <w:rPr>
+                <w:noProof/>
+                <w:webHidden/>
+              </w:rPr>
+            </w:r>
+            <w:r>
+              <w:rPr>
+                <w:noProof/>
+                <w:webHidden/>
+              </w:rPr>
+              <w:fldChar w:fldCharType="separate"/>
+            </w:r>
+            <w:r>
+              <w:rPr>
+                <w:noProof/>
+                <w:webHidden/>
+              </w:rPr>
+              <w:t>61</w:t>
+            </w:r>
+            <w:r>
+              <w:rPr>
+                <w:noProof/>
+                <w:webHidden/>
+              </w:rPr>
+              <w:fldChar w:fldCharType="end"/>
+            </w:r>
+          </w:hyperlink>
+        </w:p>
+        <w:p>
+          <w:pPr>
+            <w:pStyle w:val="TOC3"/>
+            <w:tabs>
+              <w:tab w:val="right" w:leader="dot" w:pos="9016"/>
+            </w:tabs>
+            <w:rPr>
+              <w:rFonts w:eastAsiaTheme="minorEastAsia"/>
+              <w:noProof/>
+              <w:lang w:eastAsia="en-GB"/>
+            </w:rPr>
+          </w:pPr>
+          <w:hyperlink w:anchor="_Toc239628378" w:history="1">
+            <w:r>
+              <w:rPr>
+                <w:rStyle w:val="Hyperlink"/>
+                <w:noProof/>
+              </w:rPr>
+              <w:t>5.7 Integration/System Evaluation</w:t>
+            </w:r>
+            <w:r>
+              <w:rPr>
+                <w:noProof/>
+                <w:webHidden/>
+              </w:rPr>
+              <w:tab/>
+            </w:r>
+            <w:r>
+              <w:rPr>
+                <w:noProof/>
+                <w:webHidden/>
+              </w:rPr>
+              <w:fldChar w:fldCharType="begin"/>
+            </w:r>
+            <w:r>
+              <w:rPr>
+                <w:noProof/>
+                <w:webHidden/>
+              </w:rPr>
+              <w:instrText xml:space="preserve"> PAGEREF _Toc239628378 \h </w:instrText>
+            </w:r>
+            <w:r>
+              <w:rPr>
+                <w:noProof/>
+                <w:webHidden/>
+              </w:rPr>
+            </w:r>
+            <w:r>
+              <w:rPr>
+                <w:noProof/>
+                <w:webHidden/>
+              </w:rPr>
+              <w:fldChar w:fldCharType="separate"/>
+            </w:r>
+            <w:r>
+              <w:rPr>
+                <w:noProof/>
+                <w:webHidden/>
+              </w:rPr>
+              <w:t>62</w:t>
+            </w:r>
+            <w:r>
+              <w:rPr>
+                <w:noProof/>
+                <w:webHidden/>
+              </w:rPr>
+              <w:fldChar w:fldCharType="end"/>
+            </w:r>
+          </w:hyperlink>
+        </w:p>
+        <w:p>
+          <w:pPr>
+            <w:pStyle w:val="TOC3"/>
+            <w:tabs>
+              <w:tab w:val="right" w:leader="dot" w:pos="9016"/>
+            </w:tabs>
+            <w:rPr>
+              <w:rFonts w:eastAsiaTheme="minorEastAsia"/>
+              <w:noProof/>
+              <w:lang w:eastAsia="en-GB"/>
+            </w:rPr>
+          </w:pPr>
+          <w:hyperlink w:anchor="_Toc239628379" w:history="1">
+            <w:r>
+              <w:rPr>
+                <w:rStyle w:val="Hyperlink"/>
+                <w:noProof/>
+              </w:rPr>
+              <w:t>5.8 End-User/Usability Evaluation</w:t>
+            </w:r>
+            <w:r>
+              <w:rPr>
+                <w:noProof/>
+                <w:webHidden/>
+              </w:rPr>
+              <w:tab/>
+            </w:r>
+            <w:r>
+              <w:rPr>
+                <w:noProof/>
+                <w:webHidden/>
+              </w:rPr>
+              <w:fldChar w:fldCharType="begin"/>
+            </w:r>
+            <w:r>
+              <w:rPr>
+                <w:noProof/>
+                <w:webHidden/>
+              </w:rPr>
+              <w:instrText xml:space="preserve"> PAGEREF _Toc239628379 \h </w:instrText>
+            </w:r>
+            <w:r>
+              <w:rPr>
+                <w:noProof/>
+                <w:webHidden/>
+              </w:rPr>
+            </w:r>
+            <w:r>
+              <w:rPr>
+                <w:noProof/>
+                <w:webHidden/>
+              </w:rPr>
+              <w:fldChar w:fldCharType="separate"/>
+            </w:r>
+            <w:r>
+              <w:rPr>
+                <w:noProof/>
+                <w:webHidden/>
+              </w:rPr>
+              <w:t>63</w:t>
+            </w:r>
+            <w:r>
+              <w:rPr>
+                <w:noProof/>
+                <w:webHidden/>
+              </w:rPr>
+              <w:fldChar w:fldCharType="end"/>
+            </w:r>
+          </w:hyperlink>
+        </w:p>
+        <w:p>
+          <w:pPr>
+            <w:pStyle w:val="TOC3"/>
+            <w:tabs>
+              <w:tab w:val="right" w:leader="dot" w:pos="9016"/>
+            </w:tabs>
+            <w:rPr>
+              <w:rFonts w:eastAsiaTheme="minorEastAsia"/>
+              <w:noProof/>
+              <w:lang w:eastAsia="en-GB"/>
+            </w:rPr>
+          </w:pPr>
+          <w:hyperlink w:anchor="_Toc239628380" w:history="1">
+            <w:r>
+              <w:rPr>
+                <w:rStyle w:val="Hyperlink"/>
+                <w:noProof/>
+              </w:rPr>
+              <w:t>5.9 Overall Evaluation</w:t>
+            </w:r>
+            <w:r>
+              <w:rPr>
+                <w:noProof/>
+                <w:webHidden/>
+              </w:rPr>
+              <w:tab/>
+            </w:r>
+            <w:r>
+              <w:rPr>
+                <w:noProof/>
+                <w:webHidden/>
+              </w:rPr>
+              <w:fldChar w:fldCharType="begin"/>
+            </w:r>
+            <w:r>
+              <w:rPr>
+                <w:noProof/>
+                <w:webHidden/>
+              </w:rPr>
+              <w:instrText xml:space="preserve"> PAGEREF _Toc239628380 \h </w:instrText>
+            </w:r>
+            <w:r>
+              <w:rPr>
+                <w:noProof/>
+                <w:webHidden/>
+              </w:rPr>
+            </w:r>
+            <w:r>
+              <w:rPr>
+                <w:noProof/>
+                <w:webHidden/>
+              </w:rPr>
+              <w:fldChar w:fldCharType="separate"/>
+            </w:r>
+            <w:r>
+              <w:rPr>
+                <w:noProof/>
+                <w:webHidden/>
+              </w:rPr>
+              <w:t>64</w:t>
+            </w:r>
+            <w:r>
+              <w:rPr>
+                <w:noProof/>
+                <w:webHidden/>
+              </w:rPr>
+              <w:fldChar w:fldCharType="end"/>
+            </w:r>
+          </w:hyperlink>
+        </w:p>
+        <w:p>
+          <w:pPr>
+            <w:pStyle w:val="TOC1"/>
+            <w:tabs>
+              <w:tab w:val="right" w:leader="dot" w:pos="9016"/>
+            </w:tabs>
+            <w:rPr>
+              <w:rFonts w:eastAsiaTheme="minorEastAsia"/>
+              <w:noProof/>
+              <w:lang w:eastAsia="en-GB"/>
+            </w:rPr>
+          </w:pPr>
+          <w:hyperlink w:anchor="_Toc239628381" w:history="1">
+            <w:r>
+              <w:rPr>
+                <w:rStyle w:val="Hyperlink"/>
+                <w:noProof/>
+              </w:rPr>
+              <w:t>Chapter 6</w:t>
+            </w:r>
+            <w:r>
+              <w:rPr>
+                <w:noProof/>
+                <w:webHidden/>
+              </w:rPr>
+              <w:tab/>
+            </w:r>
+            <w:r>
+              <w:rPr>
+                <w:noProof/>
+                <w:webHidden/>
+              </w:rPr>
+              <w:fldChar w:fldCharType="begin"/>
+            </w:r>
+            <w:r>
+              <w:rPr>
+                <w:noProof/>
+                <w:webHidden/>
+              </w:rPr>
+              <w:instrText xml:space="preserve"> PAGEREF _Toc239628381 \h </w:instrText>
+            </w:r>
+            <w:r>
+              <w:rPr>
+                <w:noProof/>
+                <w:webHidden/>
+              </w:rPr>
+            </w:r>
+            <w:r>
+              <w:rPr>
+                <w:noProof/>
+                <w:webHidden/>
+              </w:rPr>
+              <w:fldChar w:fldCharType="separate"/>
+            </w:r>
+            <w:r>
+              <w:rPr>
+                <w:noProof/>
+                <w:webHidden/>
+              </w:rPr>
+              <w:t>66</w:t>
+            </w:r>
+            <w:r>
+              <w:rPr>
+                <w:noProof/>
+                <w:webHidden/>
+              </w:rPr>
+              <w:fldChar w:fldCharType="end"/>
+            </w:r>
+          </w:hyperlink>
+        </w:p>
+        <w:p>
+          <w:pPr>
+            <w:pStyle w:val="TOC1"/>
+            <w:tabs>
+              <w:tab w:val="right" w:leader="dot" w:pos="9016"/>
+            </w:tabs>
+            <w:rPr>
+              <w:rFonts w:eastAsiaTheme="minorEastAsia"/>
+              <w:noProof/>
+              <w:lang w:eastAsia="en-GB"/>
+            </w:rPr>
+          </w:pPr>
+          <w:hyperlink w:anchor="_Toc239628382" w:history="1">
+            <w:r>
+              <w:rPr>
+                <w:rStyle w:val="Hyperlink"/>
+                <w:noProof/>
+              </w:rPr>
+              <w:t>Conclusion</w:t>
+            </w:r>
+            <w:r>
+              <w:rPr>
+                <w:noProof/>
+                <w:webHidden/>
+              </w:rPr>
+              <w:tab/>
+            </w:r>
+            <w:r>
+              <w:rPr>
+                <w:noProof/>
+                <w:webHidden/>
+              </w:rPr>
+              <w:fldChar w:fldCharType="begin"/>
+            </w:r>
+            <w:r>
+              <w:rPr>
+                <w:noProof/>
+                <w:webHidden/>
+              </w:rPr>
+              <w:instrText xml:space="preserve"> PAGEREF _Toc239628382 \h </w:instrText>
+            </w:r>
+            <w:r>
+              <w:rPr>
+                <w:noProof/>
+                <w:webHidden/>
+              </w:rPr>
+            </w:r>
+            <w:r>
+              <w:rPr>
+                <w:noProof/>
+                <w:webHidden/>
+              </w:rPr>
+              <w:fldChar w:fldCharType="separate"/>
+            </w:r>
+            <w:r>
+              <w:rPr>
+                <w:noProof/>
+                <w:webHidden/>
+              </w:rPr>
+              <w:t>66</w:t>
+            </w:r>
+            <w:r>
+              <w:rPr>
+                <w:noProof/>
+                <w:webHidden/>
+              </w:rPr>
+              <w:fldChar w:fldCharType="end"/>
+            </w:r>
+          </w:hyperlink>
+        </w:p>
+        <w:p>
+          <w:pPr>
+            <w:pStyle w:val="TOC3"/>
+            <w:tabs>
+              <w:tab w:val="right" w:leader="dot" w:pos="9016"/>
+            </w:tabs>
+            <w:rPr>
+              <w:rFonts w:eastAsiaTheme="minorEastAsia"/>
+              <w:noProof/>
+              <w:lang w:eastAsia="en-GB"/>
+            </w:rPr>
+          </w:pPr>
+          <w:hyperlink w:anchor="_Toc239628383" w:history="1">
+            <w:r>
+              <w:rPr>
+                <w:rStyle w:val="Hyperlink"/>
+                <w:noProof/>
+              </w:rPr>
+              <w:t>6.1 Conclusion</w:t>
+            </w:r>
+            <w:r>
+              <w:rPr>
+                <w:noProof/>
+                <w:webHidden/>
+              </w:rPr>
+              <w:tab/>
+            </w:r>
+            <w:r>
+              <w:rPr>
+                <w:noProof/>
+                <w:webHidden/>
+              </w:rPr>
+              <w:fldChar w:fldCharType="begin"/>
+            </w:r>
+            <w:r>
+              <w:rPr>
+                <w:noProof/>
+                <w:webHidden/>
+              </w:rPr>
+              <w:instrText xml:space="preserve"> PAGEREF _Toc239628383 \h </w:instrText>
+            </w:r>
+            <w:r>
+              <w:rPr>
+                <w:noProof/>
+                <w:webHidden/>
+              </w:rPr>
+            </w:r>
+            <w:r>
+              <w:rPr>
+                <w:noProof/>
+                <w:webHidden/>
+              </w:rPr>
+              <w:fldChar w:fldCharType="separate"/>
+            </w:r>
+            <w:r>
+              <w:rPr>
+                <w:noProof/>
+                <w:webHidden/>
+              </w:rPr>
+              <w:t>67</w:t>
+            </w:r>
+            <w:r>
+              <w:rPr>
+                <w:noProof/>
+                <w:webHidden/>
+              </w:rPr>
+              <w:fldChar w:fldCharType="end"/>
+            </w:r>
+          </w:hyperlink>
+        </w:p>
+        <w:p>
+          <w:pPr>
+            <w:pStyle w:val="TOC3"/>
+            <w:tabs>
+              <w:tab w:val="right" w:leader="dot" w:pos="9016"/>
+            </w:tabs>
+            <w:rPr>
+              <w:rFonts w:eastAsiaTheme="minorEastAsia"/>
+              <w:noProof/>
+              <w:lang w:eastAsia="en-GB"/>
+            </w:rPr>
+          </w:pPr>
+          <w:hyperlink w:anchor="_Toc239628384" w:history="1">
+            <w:r>
+              <w:rPr>
+                <w:rStyle w:val="Hyperlink"/>
+                <w:noProof/>
+              </w:rPr>
+              <w:t>6.2 Future improvements:</w:t>
+            </w:r>
+            <w:r>
+              <w:rPr>
+                <w:noProof/>
+                <w:webHidden/>
+              </w:rPr>
+              <w:tab/>
+            </w:r>
+            <w:r>
+              <w:rPr>
+                <w:noProof/>
+                <w:webHidden/>
+              </w:rPr>
+              <w:fldChar w:fldCharType="begin"/>
+            </w:r>
+            <w:r>
+              <w:rPr>
+                <w:noProof/>
+                <w:webHidden/>
+              </w:rPr>
+              <w:instrText xml:space="preserve"> PAGEREF _Toc239628384 \h </w:instrText>
+            </w:r>
+            <w:r>
+              <w:rPr>
+                <w:noProof/>
+                <w:webHidden/>
+              </w:rPr>
+            </w:r>
+            <w:r>
+              <w:rPr>
+                <w:noProof/>
+                <w:webHidden/>
+              </w:rPr>
+              <w:fldChar w:fldCharType="separate"/>
+            </w:r>
+            <w:r>
+              <w:rPr>
+                <w:noProof/>
+                <w:webHidden/>
+              </w:rPr>
+              <w:t>68</w:t>
             </w:r>
             <w:r>
               <w:rPr>
@@ -2347,13 +3397,13 @@
               <w:lang w:eastAsia="en-GB"/>
             </w:rPr>
           </w:pPr>
-          <w:hyperlink w:anchor="_Toc238719429" w:history="1">
+          <w:hyperlink w:anchor="_Toc239628385" w:history="1">
             <w:r>
               <w:rPr>
                 <w:rStyle w:val="Hyperlink"/>
                 <w:noProof/>
               </w:rPr>
-              <w:t>System Deployment/Implementation Details</w:t>
+              <w:t>Reference List</w:t>
             </w:r>
             <w:r>
               <w:rPr>
@@ -2374,7 +3424,7 @@
                 <w:noProof/>
                 <w:webHidden/>
               </w:rPr>
-              <w:instrText xml:space="preserve"> PAGEREF _Toc238719429 \h </w:instrText>
+              <w:instrText xml:space="preserve"> PAGEREF _Toc239628385 \h </w:instrText>
             </w:r>
             <w:r>
               <w:rPr>
@@ -2394,7 +3444,7 @@
                 <w:noProof/>
                 <w:webHidden/>
               </w:rPr>
-              <w:t>43</w:t>
+              <w:t>69</w:t>
             </w:r>
             <w:r>
               <w:rPr>
@@ -2417,13 +3467,13 @@
               <w:lang w:eastAsia="en-GB"/>
             </w:rPr>
           </w:pPr>
-          <w:hyperlink w:anchor="_Toc238719430" w:history="1">
+          <w:hyperlink w:anchor="_Toc239628386" w:history="1">
             <w:r>
               <w:rPr>
                 <w:rStyle w:val="Hyperlink"/>
                 <w:noProof/>
               </w:rPr>
-              <w:t>CHAPTER  5</w:t>
+              <w:t>Appendix A – Testing Documentation</w:t>
             </w:r>
             <w:r>
               <w:rPr>
@@ -2444,7 +3494,7 @@
                 <w:noProof/>
                 <w:webHidden/>
               </w:rPr>
-              <w:instrText xml:space="preserve"> PAGEREF _Toc238719430 \h </w:instrText>
+              <w:instrText xml:space="preserve"> PAGEREF _Toc239628386 \h </w:instrText>
             </w:r>
             <w:r>
               <w:rPr>
@@ -2464,7 +3514,567 @@
                 <w:noProof/>
                 <w:webHidden/>
               </w:rPr>
-              <w:t>44</w:t>
+              <w:t>73</w:t>
+            </w:r>
+            <w:r>
+              <w:rPr>
+                <w:noProof/>
+                <w:webHidden/>
+              </w:rPr>
+              <w:fldChar w:fldCharType="end"/>
+            </w:r>
+          </w:hyperlink>
+        </w:p>
+        <w:p>
+          <w:pPr>
+            <w:pStyle w:val="TOC3"/>
+            <w:tabs>
+              <w:tab w:val="right" w:leader="dot" w:pos="9016"/>
+            </w:tabs>
+            <w:rPr>
+              <w:rFonts w:eastAsiaTheme="minorEastAsia"/>
+              <w:noProof/>
+              <w:lang w:eastAsia="en-GB"/>
+            </w:rPr>
+          </w:pPr>
+          <w:hyperlink w:anchor="_Toc239628387" w:history="1">
+            <w:r>
+              <w:rPr>
+                <w:rStyle w:val="Hyperlink"/>
+                <w:noProof/>
+              </w:rPr>
+              <w:t>A.1 Unit Tests</w:t>
+            </w:r>
+            <w:r>
+              <w:rPr>
+                <w:noProof/>
+                <w:webHidden/>
+              </w:rPr>
+              <w:tab/>
+            </w:r>
+            <w:r>
+              <w:rPr>
+                <w:noProof/>
+                <w:webHidden/>
+              </w:rPr>
+              <w:fldChar w:fldCharType="begin"/>
+            </w:r>
+            <w:r>
+              <w:rPr>
+                <w:noProof/>
+                <w:webHidden/>
+              </w:rPr>
+              <w:instrText xml:space="preserve"> PAGEREF _Toc239628387 \h </w:instrText>
+            </w:r>
+            <w:r>
+              <w:rPr>
+                <w:noProof/>
+                <w:webHidden/>
+              </w:rPr>
+            </w:r>
+            <w:r>
+              <w:rPr>
+                <w:noProof/>
+                <w:webHidden/>
+              </w:rPr>
+              <w:fldChar w:fldCharType="separate"/>
+            </w:r>
+            <w:r>
+              <w:rPr>
+                <w:noProof/>
+                <w:webHidden/>
+              </w:rPr>
+              <w:t>74</w:t>
+            </w:r>
+            <w:r>
+              <w:rPr>
+                <w:noProof/>
+                <w:webHidden/>
+              </w:rPr>
+              <w:fldChar w:fldCharType="end"/>
+            </w:r>
+          </w:hyperlink>
+        </w:p>
+        <w:p>
+          <w:pPr>
+            <w:pStyle w:val="TOC3"/>
+            <w:tabs>
+              <w:tab w:val="right" w:leader="dot" w:pos="9016"/>
+            </w:tabs>
+            <w:rPr>
+              <w:rFonts w:eastAsiaTheme="minorEastAsia"/>
+              <w:noProof/>
+              <w:lang w:eastAsia="en-GB"/>
+            </w:rPr>
+          </w:pPr>
+          <w:hyperlink w:anchor="_Toc239628388" w:history="1">
+            <w:r>
+              <w:rPr>
+                <w:rStyle w:val="Hyperlink"/>
+                <w:noProof/>
+              </w:rPr>
+              <w:t>A.2 OCR Component Tests</w:t>
+            </w:r>
+            <w:r>
+              <w:rPr>
+                <w:noProof/>
+                <w:webHidden/>
+              </w:rPr>
+              <w:tab/>
+            </w:r>
+            <w:r>
+              <w:rPr>
+                <w:noProof/>
+                <w:webHidden/>
+              </w:rPr>
+              <w:fldChar w:fldCharType="begin"/>
+            </w:r>
+            <w:r>
+              <w:rPr>
+                <w:noProof/>
+                <w:webHidden/>
+              </w:rPr>
+              <w:instrText xml:space="preserve"> PAGEREF _Toc239628388 \h </w:instrText>
+            </w:r>
+            <w:r>
+              <w:rPr>
+                <w:noProof/>
+                <w:webHidden/>
+              </w:rPr>
+            </w:r>
+            <w:r>
+              <w:rPr>
+                <w:noProof/>
+                <w:webHidden/>
+              </w:rPr>
+              <w:fldChar w:fldCharType="separate"/>
+            </w:r>
+            <w:r>
+              <w:rPr>
+                <w:noProof/>
+                <w:webHidden/>
+              </w:rPr>
+              <w:t>76</w:t>
+            </w:r>
+            <w:r>
+              <w:rPr>
+                <w:noProof/>
+                <w:webHidden/>
+              </w:rPr>
+              <w:fldChar w:fldCharType="end"/>
+            </w:r>
+          </w:hyperlink>
+        </w:p>
+        <w:p>
+          <w:pPr>
+            <w:pStyle w:val="TOC3"/>
+            <w:tabs>
+              <w:tab w:val="right" w:leader="dot" w:pos="9016"/>
+            </w:tabs>
+            <w:rPr>
+              <w:rFonts w:eastAsiaTheme="minorEastAsia"/>
+              <w:noProof/>
+              <w:lang w:eastAsia="en-GB"/>
+            </w:rPr>
+          </w:pPr>
+          <w:hyperlink w:anchor="_Toc239628389" w:history="1">
+            <w:r>
+              <w:rPr>
+                <w:rStyle w:val="Hyperlink"/>
+                <w:noProof/>
+              </w:rPr>
+              <w:t>A.3 ASR Component Tests</w:t>
+            </w:r>
+            <w:r>
+              <w:rPr>
+                <w:noProof/>
+                <w:webHidden/>
+              </w:rPr>
+              <w:tab/>
+            </w:r>
+            <w:r>
+              <w:rPr>
+                <w:noProof/>
+                <w:webHidden/>
+              </w:rPr>
+              <w:fldChar w:fldCharType="begin"/>
+            </w:r>
+            <w:r>
+              <w:rPr>
+                <w:noProof/>
+                <w:webHidden/>
+              </w:rPr>
+              <w:instrText xml:space="preserve"> PAGEREF _Toc239628389 \h </w:instrText>
+            </w:r>
+            <w:r>
+              <w:rPr>
+                <w:noProof/>
+                <w:webHidden/>
+              </w:rPr>
+            </w:r>
+            <w:r>
+              <w:rPr>
+                <w:noProof/>
+                <w:webHidden/>
+              </w:rPr>
+              <w:fldChar w:fldCharType="separate"/>
+            </w:r>
+            <w:r>
+              <w:rPr>
+                <w:noProof/>
+                <w:webHidden/>
+              </w:rPr>
+              <w:t>77</w:t>
+            </w:r>
+            <w:r>
+              <w:rPr>
+                <w:noProof/>
+                <w:webHidden/>
+              </w:rPr>
+              <w:fldChar w:fldCharType="end"/>
+            </w:r>
+          </w:hyperlink>
+        </w:p>
+        <w:p>
+          <w:pPr>
+            <w:pStyle w:val="TOC3"/>
+            <w:tabs>
+              <w:tab w:val="right" w:leader="dot" w:pos="9016"/>
+            </w:tabs>
+            <w:rPr>
+              <w:rFonts w:eastAsiaTheme="minorEastAsia"/>
+              <w:noProof/>
+              <w:lang w:eastAsia="en-GB"/>
+            </w:rPr>
+          </w:pPr>
+          <w:hyperlink w:anchor="_Toc239628390" w:history="1">
+            <w:r>
+              <w:rPr>
+                <w:rStyle w:val="Hyperlink"/>
+                <w:noProof/>
+              </w:rPr>
+              <w:t>A.4 Transformer Component Tests</w:t>
+            </w:r>
+            <w:r>
+              <w:rPr>
+                <w:noProof/>
+                <w:webHidden/>
+              </w:rPr>
+              <w:tab/>
+            </w:r>
+            <w:r>
+              <w:rPr>
+                <w:noProof/>
+                <w:webHidden/>
+              </w:rPr>
+              <w:fldChar w:fldCharType="begin"/>
+            </w:r>
+            <w:r>
+              <w:rPr>
+                <w:noProof/>
+                <w:webHidden/>
+              </w:rPr>
+              <w:instrText xml:space="preserve"> PAGEREF _Toc239628390 \h </w:instrText>
+            </w:r>
+            <w:r>
+              <w:rPr>
+                <w:noProof/>
+                <w:webHidden/>
+              </w:rPr>
+            </w:r>
+            <w:r>
+              <w:rPr>
+                <w:noProof/>
+                <w:webHidden/>
+              </w:rPr>
+              <w:fldChar w:fldCharType="separate"/>
+            </w:r>
+            <w:r>
+              <w:rPr>
+                <w:noProof/>
+                <w:webHidden/>
+              </w:rPr>
+              <w:t>79</w:t>
+            </w:r>
+            <w:r>
+              <w:rPr>
+                <w:noProof/>
+                <w:webHidden/>
+              </w:rPr>
+              <w:fldChar w:fldCharType="end"/>
+            </w:r>
+          </w:hyperlink>
+        </w:p>
+        <w:p>
+          <w:pPr>
+            <w:pStyle w:val="TOC3"/>
+            <w:tabs>
+              <w:tab w:val="right" w:leader="dot" w:pos="9016"/>
+            </w:tabs>
+            <w:rPr>
+              <w:rFonts w:eastAsiaTheme="minorEastAsia"/>
+              <w:noProof/>
+              <w:lang w:eastAsia="en-GB"/>
+            </w:rPr>
+          </w:pPr>
+          <w:hyperlink w:anchor="_Toc239628391" w:history="1">
+            <w:r>
+              <w:rPr>
+                <w:rStyle w:val="Hyperlink"/>
+                <w:noProof/>
+              </w:rPr>
+              <w:t>A.5 Integration Tests</w:t>
+            </w:r>
+            <w:r>
+              <w:rPr>
+                <w:noProof/>
+                <w:webHidden/>
+              </w:rPr>
+              <w:tab/>
+            </w:r>
+            <w:r>
+              <w:rPr>
+                <w:noProof/>
+                <w:webHidden/>
+              </w:rPr>
+              <w:fldChar w:fldCharType="begin"/>
+            </w:r>
+            <w:r>
+              <w:rPr>
+                <w:noProof/>
+                <w:webHidden/>
+              </w:rPr>
+              <w:instrText xml:space="preserve"> PAGEREF _Toc239628391 \h </w:instrText>
+            </w:r>
+            <w:r>
+              <w:rPr>
+                <w:noProof/>
+                <w:webHidden/>
+              </w:rPr>
+            </w:r>
+            <w:r>
+              <w:rPr>
+                <w:noProof/>
+                <w:webHidden/>
+              </w:rPr>
+              <w:fldChar w:fldCharType="separate"/>
+            </w:r>
+            <w:r>
+              <w:rPr>
+                <w:noProof/>
+                <w:webHidden/>
+              </w:rPr>
+              <w:t>80</w:t>
+            </w:r>
+            <w:r>
+              <w:rPr>
+                <w:noProof/>
+                <w:webHidden/>
+              </w:rPr>
+              <w:fldChar w:fldCharType="end"/>
+            </w:r>
+          </w:hyperlink>
+        </w:p>
+        <w:p>
+          <w:pPr>
+            <w:pStyle w:val="TOC3"/>
+            <w:tabs>
+              <w:tab w:val="right" w:leader="dot" w:pos="9016"/>
+            </w:tabs>
+            <w:rPr>
+              <w:rFonts w:eastAsiaTheme="minorEastAsia"/>
+              <w:noProof/>
+              <w:lang w:eastAsia="en-GB"/>
+            </w:rPr>
+          </w:pPr>
+          <w:hyperlink w:anchor="_Toc239628392" w:history="1">
+            <w:r>
+              <w:rPr>
+                <w:rStyle w:val="Hyperlink"/>
+                <w:noProof/>
+              </w:rPr>
+              <w:t>A.6 Functional System Tests</w:t>
+            </w:r>
+            <w:r>
+              <w:rPr>
+                <w:noProof/>
+                <w:webHidden/>
+              </w:rPr>
+              <w:tab/>
+            </w:r>
+            <w:r>
+              <w:rPr>
+                <w:noProof/>
+                <w:webHidden/>
+              </w:rPr>
+              <w:fldChar w:fldCharType="begin"/>
+            </w:r>
+            <w:r>
+              <w:rPr>
+                <w:noProof/>
+                <w:webHidden/>
+              </w:rPr>
+              <w:instrText xml:space="preserve"> PAGEREF _Toc239628392 \h </w:instrText>
+            </w:r>
+            <w:r>
+              <w:rPr>
+                <w:noProof/>
+                <w:webHidden/>
+              </w:rPr>
+            </w:r>
+            <w:r>
+              <w:rPr>
+                <w:noProof/>
+                <w:webHidden/>
+              </w:rPr>
+              <w:fldChar w:fldCharType="separate"/>
+            </w:r>
+            <w:r>
+              <w:rPr>
+                <w:noProof/>
+                <w:webHidden/>
+              </w:rPr>
+              <w:t>81</w:t>
+            </w:r>
+            <w:r>
+              <w:rPr>
+                <w:noProof/>
+                <w:webHidden/>
+              </w:rPr>
+              <w:fldChar w:fldCharType="end"/>
+            </w:r>
+          </w:hyperlink>
+        </w:p>
+        <w:p>
+          <w:pPr>
+            <w:pStyle w:val="TOC3"/>
+            <w:tabs>
+              <w:tab w:val="right" w:leader="dot" w:pos="9016"/>
+            </w:tabs>
+            <w:rPr>
+              <w:rFonts w:eastAsiaTheme="minorEastAsia"/>
+              <w:noProof/>
+              <w:lang w:eastAsia="en-GB"/>
+            </w:rPr>
+          </w:pPr>
+          <w:hyperlink w:anchor="_Toc239628393" w:history="1">
+            <w:r>
+              <w:rPr>
+                <w:rStyle w:val="Hyperlink"/>
+                <w:noProof/>
+              </w:rPr>
+              <w:t>B.7 End-User Tests</w:t>
+            </w:r>
+            <w:r>
+              <w:rPr>
+                <w:noProof/>
+                <w:webHidden/>
+              </w:rPr>
+              <w:tab/>
+            </w:r>
+            <w:r>
+              <w:rPr>
+                <w:noProof/>
+                <w:webHidden/>
+              </w:rPr>
+              <w:fldChar w:fldCharType="begin"/>
+            </w:r>
+            <w:r>
+              <w:rPr>
+                <w:noProof/>
+                <w:webHidden/>
+              </w:rPr>
+              <w:instrText xml:space="preserve"> PAGEREF _Toc239628393 \h </w:instrText>
+            </w:r>
+            <w:r>
+              <w:rPr>
+                <w:noProof/>
+                <w:webHidden/>
+              </w:rPr>
+            </w:r>
+            <w:r>
+              <w:rPr>
+                <w:noProof/>
+                <w:webHidden/>
+              </w:rPr>
+              <w:fldChar w:fldCharType="separate"/>
+            </w:r>
+            <w:r>
+              <w:rPr>
+                <w:noProof/>
+                <w:webHidden/>
+              </w:rPr>
+              <w:t>83</w:t>
+            </w:r>
+            <w:r>
+              <w:rPr>
+                <w:noProof/>
+                <w:webHidden/>
+              </w:rPr>
+              <w:fldChar w:fldCharType="end"/>
+            </w:r>
+          </w:hyperlink>
+        </w:p>
+        <w:p>
+          <w:pPr>
+            <w:pStyle w:val="TOC3"/>
+            <w:tabs>
+              <w:tab w:val="right" w:leader="dot" w:pos="9016"/>
+            </w:tabs>
+            <w:rPr>
+              <w:rFonts w:eastAsiaTheme="minorEastAsia"/>
+              <w:noProof/>
+              <w:lang w:eastAsia="en-GB"/>
+            </w:rPr>
+          </w:pPr>
+          <w:hyperlink w:anchor="_Toc239628394" w:history="1">
+            <w:r>
+              <w:rPr>
+                <w:rStyle w:val="Hyperlink"/>
+                <w:noProof/>
+              </w:rPr>
+              <w:t>B.8 USABILITY TESTING</w:t>
+            </w:r>
+            <w:r>
+              <w:rPr>
+                <w:noProof/>
+                <w:webHidden/>
+              </w:rPr>
+              <w:tab/>
+            </w:r>
+            <w:r>
+              <w:rPr>
+                <w:noProof/>
+                <w:webHidden/>
+              </w:rPr>
+              <w:fldChar w:fldCharType="begin"/>
+            </w:r>
+            <w:r>
+              <w:rPr>
+                <w:noProof/>
+                <w:webHidden/>
+              </w:rPr>
+              <w:instrText xml:space="preserve"> PAGEREF _Toc239628394 \h </w:instrText>
+            </w:r>
+            <w:r>
+              <w:rPr>
+                <w:noProof/>
+                <w:webHidden/>
+              </w:rPr>
+            </w:r>
+            <w:r>
+              <w:rPr>
+                <w:noProof/>
+                <w:webHidden/>
+              </w:rPr>
+              <w:fldChar w:fldCharType="separate"/>
+            </w:r>
+            <w:r>
+              <w:rPr>
+                <w:noProof/>
+                <w:webHidden/>
+              </w:rPr>
+              <w:t>84</w:t>
             </w:r>
             <w:r>
               <w:rPr>
@@ -2487,13 +4097,13 @@
               <w:lang w:eastAsia="en-GB"/>
             </w:rPr>
           </w:pPr>
-          <w:hyperlink w:anchor="_Toc238719431" w:history="1">
+          <w:hyperlink w:anchor="_Toc239628395" w:history="1">
             <w:r>
               <w:rPr>
                 <w:rStyle w:val="Hyperlink"/>
                 <w:noProof/>
               </w:rPr>
-              <w:t>Evaluation</w:t>
+              <w:t>Appendix B – Testing Documentation</w:t>
             </w:r>
             <w:r>
               <w:rPr>
@@ -2514,7 +4124,7 @@
                 <w:noProof/>
                 <w:webHidden/>
               </w:rPr>
-              <w:instrText xml:space="preserve"> PAGEREF _Toc238719431 \h </w:instrText>
+              <w:instrText xml:space="preserve"> PAGEREF _Toc239628395 \h </w:instrText>
             </w:r>
             <w:r>
               <w:rPr>
@@ -2534,7 +4144,7 @@
                 <w:noProof/>
                 <w:webHidden/>
               </w:rPr>
-              <w:t>44</w:t>
+              <w:t>85</w:t>
             </w:r>
             <w:r>
               <w:rPr>
@@ -2557,13 +4167,13 @@
               <w:lang w:eastAsia="en-GB"/>
             </w:rPr>
           </w:pPr>
-          <w:hyperlink w:anchor="_Toc238719432" w:history="1">
+          <w:hyperlink w:anchor="_Toc239628396" w:history="1">
             <w:r>
               <w:rPr>
                 <w:rStyle w:val="Hyperlink"/>
                 <w:noProof/>
               </w:rPr>
-              <w:t>5.1 Evaluation Methodology</w:t>
+              <w:t>B.1 Unit Testing</w:t>
             </w:r>
             <w:r>
               <w:rPr>
@@ -2584,7 +4194,7 @@
                 <w:noProof/>
                 <w:webHidden/>
               </w:rPr>
-              <w:instrText xml:space="preserve"> PAGEREF _Toc238719432 \h </w:instrText>
+              <w:instrText xml:space="preserve"> PAGEREF _Toc239628396 \h </w:instrText>
             </w:r>
             <w:r>
               <w:rPr>
@@ -2604,7 +4214,7 @@
                 <w:noProof/>
                 <w:webHidden/>
               </w:rPr>
-              <w:t>45</w:t>
+              <w:t>86</w:t>
             </w:r>
             <w:r>
               <w:rPr>
@@ -2627,13 +4237,13 @@
               <w:lang w:eastAsia="en-GB"/>
             </w:rPr>
           </w:pPr>
-          <w:hyperlink w:anchor="_Toc238719433" w:history="1">
+          <w:hyperlink w:anchor="_Toc239628397" w:history="1">
             <w:r>
               <w:rPr>
                 <w:rStyle w:val="Hyperlink"/>
                 <w:noProof/>
               </w:rPr>
-              <w:t>5.2 Unit Testing</w:t>
+              <w:t>B.2 Component Testing</w:t>
             </w:r>
             <w:r>
               <w:rPr>
@@ -2654,7 +4264,7 @@
                 <w:noProof/>
                 <w:webHidden/>
               </w:rPr>
-              <w:instrText xml:space="preserve"> PAGEREF _Toc238719433 \h </w:instrText>
+              <w:instrText xml:space="preserve"> PAGEREF _Toc239628397 \h </w:instrText>
             </w:r>
             <w:r>
               <w:rPr>
@@ -2674,1548 +4284,7 @@
                 <w:noProof/>
                 <w:webHidden/>
               </w:rPr>
-              <w:t>46</w:t>
-            </w:r>
-            <w:r>
-              <w:rPr>
-                <w:noProof/>
-                <w:webHidden/>
-              </w:rPr>
-              <w:fldChar w:fldCharType="end"/>
-            </w:r>
-          </w:hyperlink>
-        </w:p>
-        <w:p>
-          <w:pPr>
-            <w:pStyle w:val="TOC3"/>
-            <w:tabs>
-              <w:tab w:val="right" w:leader="dot" w:pos="9016"/>
-            </w:tabs>
-            <w:rPr>
-              <w:rFonts w:eastAsiaTheme="minorEastAsia"/>
-              <w:noProof/>
-              <w:lang w:eastAsia="en-GB"/>
-            </w:rPr>
-          </w:pPr>
-          <w:hyperlink w:anchor="_Toc238719434" w:history="1">
-            <w:r>
-              <w:rPr>
-                <w:rStyle w:val="Hyperlink"/>
-                <w:noProof/>
-              </w:rPr>
-              <w:t>5.3 OCR Evaluation</w:t>
-            </w:r>
-            <w:r>
-              <w:rPr>
-                <w:noProof/>
-                <w:webHidden/>
-              </w:rPr>
-              <w:tab/>
-            </w:r>
-            <w:r>
-              <w:rPr>
-                <w:noProof/>
-                <w:webHidden/>
-              </w:rPr>
-              <w:fldChar w:fldCharType="begin"/>
-            </w:r>
-            <w:r>
-              <w:rPr>
-                <w:noProof/>
-                <w:webHidden/>
-              </w:rPr>
-              <w:instrText xml:space="preserve"> PAGEREF _Toc238719434 \h </w:instrText>
-            </w:r>
-            <w:r>
-              <w:rPr>
-                <w:noProof/>
-                <w:webHidden/>
-              </w:rPr>
-            </w:r>
-            <w:r>
-              <w:rPr>
-                <w:noProof/>
-                <w:webHidden/>
-              </w:rPr>
-              <w:fldChar w:fldCharType="separate"/>
-            </w:r>
-            <w:r>
-              <w:rPr>
-                <w:noProof/>
-                <w:webHidden/>
-              </w:rPr>
-              <w:t>47</w:t>
-            </w:r>
-            <w:r>
-              <w:rPr>
-                <w:noProof/>
-                <w:webHidden/>
-              </w:rPr>
-              <w:fldChar w:fldCharType="end"/>
-            </w:r>
-          </w:hyperlink>
-        </w:p>
-        <w:p>
-          <w:pPr>
-            <w:pStyle w:val="TOC3"/>
-            <w:tabs>
-              <w:tab w:val="right" w:leader="dot" w:pos="9016"/>
-            </w:tabs>
-            <w:rPr>
-              <w:rFonts w:eastAsiaTheme="minorEastAsia"/>
-              <w:noProof/>
-              <w:lang w:eastAsia="en-GB"/>
-            </w:rPr>
-          </w:pPr>
-          <w:hyperlink w:anchor="_Toc238719435" w:history="1">
-            <w:r>
-              <w:rPr>
-                <w:rStyle w:val="Hyperlink"/>
-                <w:noProof/>
-              </w:rPr>
-              <w:t>5.4 ASR Evaluation</w:t>
-            </w:r>
-            <w:r>
-              <w:rPr>
-                <w:noProof/>
-                <w:webHidden/>
-              </w:rPr>
-              <w:tab/>
-            </w:r>
-            <w:r>
-              <w:rPr>
-                <w:noProof/>
-                <w:webHidden/>
-              </w:rPr>
-              <w:fldChar w:fldCharType="begin"/>
-            </w:r>
-            <w:r>
-              <w:rPr>
-                <w:noProof/>
-                <w:webHidden/>
-              </w:rPr>
-              <w:instrText xml:space="preserve"> PAGEREF _Toc238719435 \h </w:instrText>
-            </w:r>
-            <w:r>
-              <w:rPr>
-                <w:noProof/>
-                <w:webHidden/>
-              </w:rPr>
-            </w:r>
-            <w:r>
-              <w:rPr>
-                <w:noProof/>
-                <w:webHidden/>
-              </w:rPr>
-              <w:fldChar w:fldCharType="separate"/>
-            </w:r>
-            <w:r>
-              <w:rPr>
-                <w:noProof/>
-                <w:webHidden/>
-              </w:rPr>
-              <w:t>48</w:t>
-            </w:r>
-            <w:r>
-              <w:rPr>
-                <w:noProof/>
-                <w:webHidden/>
-              </w:rPr>
-              <w:fldChar w:fldCharType="end"/>
-            </w:r>
-          </w:hyperlink>
-        </w:p>
-        <w:p>
-          <w:pPr>
-            <w:pStyle w:val="TOC3"/>
-            <w:tabs>
-              <w:tab w:val="right" w:leader="dot" w:pos="9016"/>
-            </w:tabs>
-            <w:rPr>
-              <w:rFonts w:eastAsiaTheme="minorEastAsia"/>
-              <w:noProof/>
-              <w:lang w:eastAsia="en-GB"/>
-            </w:rPr>
-          </w:pPr>
-          <w:hyperlink w:anchor="_Toc238719436" w:history="1">
-            <w:r>
-              <w:rPr>
-                <w:rStyle w:val="Hyperlink"/>
-                <w:noProof/>
-              </w:rPr>
-              <w:t>5.5 Transformer/AES Evaluation</w:t>
-            </w:r>
-            <w:r>
-              <w:rPr>
-                <w:noProof/>
-                <w:webHidden/>
-              </w:rPr>
-              <w:tab/>
-            </w:r>
-            <w:r>
-              <w:rPr>
-                <w:noProof/>
-                <w:webHidden/>
-              </w:rPr>
-              <w:fldChar w:fldCharType="begin"/>
-            </w:r>
-            <w:r>
-              <w:rPr>
-                <w:noProof/>
-                <w:webHidden/>
-              </w:rPr>
-              <w:instrText xml:space="preserve"> PAGEREF _Toc238719436 \h </w:instrText>
-            </w:r>
-            <w:r>
-              <w:rPr>
-                <w:noProof/>
-                <w:webHidden/>
-              </w:rPr>
-            </w:r>
-            <w:r>
-              <w:rPr>
-                <w:noProof/>
-                <w:webHidden/>
-              </w:rPr>
-              <w:fldChar w:fldCharType="separate"/>
-            </w:r>
-            <w:r>
-              <w:rPr>
-                <w:noProof/>
-                <w:webHidden/>
-              </w:rPr>
-              <w:t>49</w:t>
-            </w:r>
-            <w:r>
-              <w:rPr>
-                <w:noProof/>
-                <w:webHidden/>
-              </w:rPr>
-              <w:fldChar w:fldCharType="end"/>
-            </w:r>
-          </w:hyperlink>
-        </w:p>
-        <w:p>
-          <w:pPr>
-            <w:pStyle w:val="TOC3"/>
-            <w:tabs>
-              <w:tab w:val="right" w:leader="dot" w:pos="9016"/>
-            </w:tabs>
-            <w:rPr>
-              <w:rFonts w:eastAsiaTheme="minorEastAsia"/>
-              <w:noProof/>
-              <w:lang w:eastAsia="en-GB"/>
-            </w:rPr>
-          </w:pPr>
-          <w:hyperlink w:anchor="_Toc238719437" w:history="1">
-            <w:r>
-              <w:rPr>
-                <w:rStyle w:val="Hyperlink"/>
-                <w:noProof/>
-              </w:rPr>
-              <w:t>5.6 Integration/System Evaluation</w:t>
-            </w:r>
-            <w:r>
-              <w:rPr>
-                <w:noProof/>
-                <w:webHidden/>
-              </w:rPr>
-              <w:tab/>
-            </w:r>
-            <w:r>
-              <w:rPr>
-                <w:noProof/>
-                <w:webHidden/>
-              </w:rPr>
-              <w:fldChar w:fldCharType="begin"/>
-            </w:r>
-            <w:r>
-              <w:rPr>
-                <w:noProof/>
-                <w:webHidden/>
-              </w:rPr>
-              <w:instrText xml:space="preserve"> PAGEREF _Toc238719437 \h </w:instrText>
-            </w:r>
-            <w:r>
-              <w:rPr>
-                <w:noProof/>
-                <w:webHidden/>
-              </w:rPr>
-            </w:r>
-            <w:r>
-              <w:rPr>
-                <w:noProof/>
-                <w:webHidden/>
-              </w:rPr>
-              <w:fldChar w:fldCharType="separate"/>
-            </w:r>
-            <w:r>
-              <w:rPr>
-                <w:noProof/>
-                <w:webHidden/>
-              </w:rPr>
-              <w:t>50</w:t>
-            </w:r>
-            <w:r>
-              <w:rPr>
-                <w:noProof/>
-                <w:webHidden/>
-              </w:rPr>
-              <w:fldChar w:fldCharType="end"/>
-            </w:r>
-          </w:hyperlink>
-        </w:p>
-        <w:p>
-          <w:pPr>
-            <w:pStyle w:val="TOC3"/>
-            <w:tabs>
-              <w:tab w:val="right" w:leader="dot" w:pos="9016"/>
-            </w:tabs>
-            <w:rPr>
-              <w:rFonts w:eastAsiaTheme="minorEastAsia"/>
-              <w:noProof/>
-              <w:lang w:eastAsia="en-GB"/>
-            </w:rPr>
-          </w:pPr>
-          <w:hyperlink w:anchor="_Toc238719438" w:history="1">
-            <w:r>
-              <w:rPr>
-                <w:rStyle w:val="Hyperlink"/>
-                <w:noProof/>
-              </w:rPr>
-              <w:t>5.7 End-User/Usability Evaluation</w:t>
-            </w:r>
-            <w:r>
-              <w:rPr>
-                <w:noProof/>
-                <w:webHidden/>
-              </w:rPr>
-              <w:tab/>
-            </w:r>
-            <w:r>
-              <w:rPr>
-                <w:noProof/>
-                <w:webHidden/>
-              </w:rPr>
-              <w:fldChar w:fldCharType="begin"/>
-            </w:r>
-            <w:r>
-              <w:rPr>
-                <w:noProof/>
-                <w:webHidden/>
-              </w:rPr>
-              <w:instrText xml:space="preserve"> PAGEREF _Toc238719438 \h </w:instrText>
-            </w:r>
-            <w:r>
-              <w:rPr>
-                <w:noProof/>
-                <w:webHidden/>
-              </w:rPr>
-            </w:r>
-            <w:r>
-              <w:rPr>
-                <w:noProof/>
-                <w:webHidden/>
-              </w:rPr>
-              <w:fldChar w:fldCharType="separate"/>
-            </w:r>
-            <w:r>
-              <w:rPr>
-                <w:noProof/>
-                <w:webHidden/>
-              </w:rPr>
-              <w:t>51</w:t>
-            </w:r>
-            <w:r>
-              <w:rPr>
-                <w:noProof/>
-                <w:webHidden/>
-              </w:rPr>
-              <w:fldChar w:fldCharType="end"/>
-            </w:r>
-          </w:hyperlink>
-        </w:p>
-        <w:p>
-          <w:pPr>
-            <w:pStyle w:val="TOC3"/>
-            <w:tabs>
-              <w:tab w:val="right" w:leader="dot" w:pos="9016"/>
-            </w:tabs>
-            <w:rPr>
-              <w:rFonts w:eastAsiaTheme="minorEastAsia"/>
-              <w:noProof/>
-              <w:lang w:eastAsia="en-GB"/>
-            </w:rPr>
-          </w:pPr>
-          <w:hyperlink w:anchor="_Toc238719439" w:history="1">
-            <w:r>
-              <w:rPr>
-                <w:rStyle w:val="Hyperlink"/>
-                <w:noProof/>
-              </w:rPr>
-              <w:t>5.8 Overall Evaluation</w:t>
-            </w:r>
-            <w:r>
-              <w:rPr>
-                <w:noProof/>
-                <w:webHidden/>
-              </w:rPr>
-              <w:tab/>
-            </w:r>
-            <w:r>
-              <w:rPr>
-                <w:noProof/>
-                <w:webHidden/>
-              </w:rPr>
-              <w:fldChar w:fldCharType="begin"/>
-            </w:r>
-            <w:r>
-              <w:rPr>
-                <w:noProof/>
-                <w:webHidden/>
-              </w:rPr>
-              <w:instrText xml:space="preserve"> PAGEREF _Toc238719439 \h </w:instrText>
-            </w:r>
-            <w:r>
-              <w:rPr>
-                <w:noProof/>
-                <w:webHidden/>
-              </w:rPr>
-            </w:r>
-            <w:r>
-              <w:rPr>
-                <w:noProof/>
-                <w:webHidden/>
-              </w:rPr>
-              <w:fldChar w:fldCharType="separate"/>
-            </w:r>
-            <w:r>
-              <w:rPr>
-                <w:noProof/>
-                <w:webHidden/>
-              </w:rPr>
-              <w:t>52</w:t>
-            </w:r>
-            <w:r>
-              <w:rPr>
-                <w:noProof/>
-                <w:webHidden/>
-              </w:rPr>
-              <w:fldChar w:fldCharType="end"/>
-            </w:r>
-          </w:hyperlink>
-        </w:p>
-        <w:p>
-          <w:pPr>
-            <w:pStyle w:val="TOC2"/>
-            <w:tabs>
-              <w:tab w:val="right" w:leader="dot" w:pos="9016"/>
-            </w:tabs>
-            <w:rPr>
-              <w:rFonts w:eastAsiaTheme="minorEastAsia"/>
-              <w:noProof/>
-              <w:lang w:eastAsia="en-GB"/>
-            </w:rPr>
-          </w:pPr>
-          <w:hyperlink w:anchor="_Toc238719440" w:history="1">
-            <w:r>
-              <w:rPr>
-                <w:rStyle w:val="Hyperlink"/>
-                <w:noProof/>
-              </w:rPr>
-              <w:t>5.2 Unit Tests</w:t>
-            </w:r>
-            <w:r>
-              <w:rPr>
-                <w:noProof/>
-                <w:webHidden/>
-              </w:rPr>
-              <w:tab/>
-            </w:r>
-            <w:r>
-              <w:rPr>
-                <w:noProof/>
-                <w:webHidden/>
-              </w:rPr>
-              <w:fldChar w:fldCharType="begin"/>
-            </w:r>
-            <w:r>
-              <w:rPr>
-                <w:noProof/>
-                <w:webHidden/>
-              </w:rPr>
-              <w:instrText xml:space="preserve"> PAGEREF _Toc238719440 \h </w:instrText>
-            </w:r>
-            <w:r>
-              <w:rPr>
-                <w:noProof/>
-                <w:webHidden/>
-              </w:rPr>
-            </w:r>
-            <w:r>
-              <w:rPr>
-                <w:noProof/>
-                <w:webHidden/>
-              </w:rPr>
-              <w:fldChar w:fldCharType="separate"/>
-            </w:r>
-            <w:r>
-              <w:rPr>
-                <w:noProof/>
-                <w:webHidden/>
-              </w:rPr>
-              <w:t>54</w:t>
-            </w:r>
-            <w:r>
-              <w:rPr>
-                <w:noProof/>
-                <w:webHidden/>
-              </w:rPr>
-              <w:fldChar w:fldCharType="end"/>
-            </w:r>
-          </w:hyperlink>
-        </w:p>
-        <w:p>
-          <w:pPr>
-            <w:pStyle w:val="TOC2"/>
-            <w:tabs>
-              <w:tab w:val="right" w:leader="dot" w:pos="9016"/>
-            </w:tabs>
-            <w:rPr>
-              <w:rFonts w:eastAsiaTheme="minorEastAsia"/>
-              <w:noProof/>
-              <w:lang w:eastAsia="en-GB"/>
-            </w:rPr>
-          </w:pPr>
-          <w:hyperlink w:anchor="_Toc238719441" w:history="1">
-            <w:r>
-              <w:rPr>
-                <w:rStyle w:val="Hyperlink"/>
-                <w:noProof/>
-              </w:rPr>
-              <w:t>5.3 Component Testing</w:t>
-            </w:r>
-            <w:r>
-              <w:rPr>
-                <w:noProof/>
-                <w:webHidden/>
-              </w:rPr>
-              <w:tab/>
-            </w:r>
-            <w:r>
-              <w:rPr>
-                <w:noProof/>
-                <w:webHidden/>
-              </w:rPr>
-              <w:fldChar w:fldCharType="begin"/>
-            </w:r>
-            <w:r>
-              <w:rPr>
-                <w:noProof/>
-                <w:webHidden/>
-              </w:rPr>
-              <w:instrText xml:space="preserve"> PAGEREF _Toc238719441 \h </w:instrText>
-            </w:r>
-            <w:r>
-              <w:rPr>
-                <w:noProof/>
-                <w:webHidden/>
-              </w:rPr>
-            </w:r>
-            <w:r>
-              <w:rPr>
-                <w:noProof/>
-                <w:webHidden/>
-              </w:rPr>
-              <w:fldChar w:fldCharType="separate"/>
-            </w:r>
-            <w:r>
-              <w:rPr>
-                <w:noProof/>
-                <w:webHidden/>
-              </w:rPr>
-              <w:t>57</w:t>
-            </w:r>
-            <w:r>
-              <w:rPr>
-                <w:noProof/>
-                <w:webHidden/>
-              </w:rPr>
-              <w:fldChar w:fldCharType="end"/>
-            </w:r>
-          </w:hyperlink>
-        </w:p>
-        <w:p>
-          <w:pPr>
-            <w:pStyle w:val="TOC1"/>
-            <w:tabs>
-              <w:tab w:val="right" w:leader="dot" w:pos="9016"/>
-            </w:tabs>
-            <w:rPr>
-              <w:rFonts w:eastAsiaTheme="minorEastAsia"/>
-              <w:noProof/>
-              <w:lang w:eastAsia="en-GB"/>
-            </w:rPr>
-          </w:pPr>
-          <w:hyperlink w:anchor="_Toc238719442" w:history="1">
-            <w:r>
-              <w:rPr>
-                <w:rStyle w:val="Hyperlink"/>
-                <w:noProof/>
-              </w:rPr>
-              <w:t>Chapter 6</w:t>
-            </w:r>
-            <w:r>
-              <w:rPr>
-                <w:noProof/>
-                <w:webHidden/>
-              </w:rPr>
-              <w:tab/>
-            </w:r>
-            <w:r>
-              <w:rPr>
-                <w:noProof/>
-                <w:webHidden/>
-              </w:rPr>
-              <w:fldChar w:fldCharType="begin"/>
-            </w:r>
-            <w:r>
-              <w:rPr>
-                <w:noProof/>
-                <w:webHidden/>
-              </w:rPr>
-              <w:instrText xml:space="preserve"> PAGEREF _Toc238719442 \h </w:instrText>
-            </w:r>
-            <w:r>
-              <w:rPr>
-                <w:noProof/>
-                <w:webHidden/>
-              </w:rPr>
-            </w:r>
-            <w:r>
-              <w:rPr>
-                <w:noProof/>
-                <w:webHidden/>
-              </w:rPr>
-              <w:fldChar w:fldCharType="separate"/>
-            </w:r>
-            <w:r>
-              <w:rPr>
-                <w:noProof/>
-                <w:webHidden/>
-              </w:rPr>
-              <w:t>65</w:t>
-            </w:r>
-            <w:r>
-              <w:rPr>
-                <w:noProof/>
-                <w:webHidden/>
-              </w:rPr>
-              <w:fldChar w:fldCharType="end"/>
-            </w:r>
-          </w:hyperlink>
-        </w:p>
-        <w:p>
-          <w:pPr>
-            <w:pStyle w:val="TOC1"/>
-            <w:tabs>
-              <w:tab w:val="right" w:leader="dot" w:pos="9016"/>
-            </w:tabs>
-            <w:rPr>
-              <w:rFonts w:eastAsiaTheme="minorEastAsia"/>
-              <w:noProof/>
-              <w:lang w:eastAsia="en-GB"/>
-            </w:rPr>
-          </w:pPr>
-          <w:hyperlink w:anchor="_Toc238719443" w:history="1">
-            <w:r>
-              <w:rPr>
-                <w:rStyle w:val="Hyperlink"/>
-                <w:noProof/>
-              </w:rPr>
-              <w:t>Conclusion</w:t>
-            </w:r>
-            <w:r>
-              <w:rPr>
-                <w:noProof/>
-                <w:webHidden/>
-              </w:rPr>
-              <w:tab/>
-            </w:r>
-            <w:r>
-              <w:rPr>
-                <w:noProof/>
-                <w:webHidden/>
-              </w:rPr>
-              <w:fldChar w:fldCharType="begin"/>
-            </w:r>
-            <w:r>
-              <w:rPr>
-                <w:noProof/>
-                <w:webHidden/>
-              </w:rPr>
-              <w:instrText xml:space="preserve"> PAGEREF _Toc238719443 \h </w:instrText>
-            </w:r>
-            <w:r>
-              <w:rPr>
-                <w:noProof/>
-                <w:webHidden/>
-              </w:rPr>
-            </w:r>
-            <w:r>
-              <w:rPr>
-                <w:noProof/>
-                <w:webHidden/>
-              </w:rPr>
-              <w:fldChar w:fldCharType="separate"/>
-            </w:r>
-            <w:r>
-              <w:rPr>
-                <w:noProof/>
-                <w:webHidden/>
-              </w:rPr>
-              <w:t>65</w:t>
-            </w:r>
-            <w:r>
-              <w:rPr>
-                <w:noProof/>
-                <w:webHidden/>
-              </w:rPr>
-              <w:fldChar w:fldCharType="end"/>
-            </w:r>
-          </w:hyperlink>
-        </w:p>
-        <w:p>
-          <w:pPr>
-            <w:pStyle w:val="TOC3"/>
-            <w:tabs>
-              <w:tab w:val="right" w:leader="dot" w:pos="9016"/>
-            </w:tabs>
-            <w:rPr>
-              <w:rFonts w:eastAsiaTheme="minorEastAsia"/>
-              <w:noProof/>
-              <w:lang w:eastAsia="en-GB"/>
-            </w:rPr>
-          </w:pPr>
-          <w:hyperlink w:anchor="_Toc238719444" w:history="1">
-            <w:r>
-              <w:rPr>
-                <w:rStyle w:val="Hyperlink"/>
-                <w:noProof/>
-              </w:rPr>
-              <w:t>6.1 Conclusion</w:t>
-            </w:r>
-            <w:r>
-              <w:rPr>
-                <w:noProof/>
-                <w:webHidden/>
-              </w:rPr>
-              <w:tab/>
-            </w:r>
-            <w:r>
-              <w:rPr>
-                <w:noProof/>
-                <w:webHidden/>
-              </w:rPr>
-              <w:fldChar w:fldCharType="begin"/>
-            </w:r>
-            <w:r>
-              <w:rPr>
-                <w:noProof/>
-                <w:webHidden/>
-              </w:rPr>
-              <w:instrText xml:space="preserve"> PAGEREF _Toc238719444 \h </w:instrText>
-            </w:r>
-            <w:r>
-              <w:rPr>
-                <w:noProof/>
-                <w:webHidden/>
-              </w:rPr>
-            </w:r>
-            <w:r>
-              <w:rPr>
-                <w:noProof/>
-                <w:webHidden/>
-              </w:rPr>
-              <w:fldChar w:fldCharType="separate"/>
-            </w:r>
-            <w:r>
-              <w:rPr>
-                <w:noProof/>
-                <w:webHidden/>
-              </w:rPr>
-              <w:t>66</w:t>
-            </w:r>
-            <w:r>
-              <w:rPr>
-                <w:noProof/>
-                <w:webHidden/>
-              </w:rPr>
-              <w:fldChar w:fldCharType="end"/>
-            </w:r>
-          </w:hyperlink>
-        </w:p>
-        <w:p>
-          <w:pPr>
-            <w:pStyle w:val="TOC3"/>
-            <w:tabs>
-              <w:tab w:val="right" w:leader="dot" w:pos="9016"/>
-            </w:tabs>
-            <w:rPr>
-              <w:rFonts w:eastAsiaTheme="minorEastAsia"/>
-              <w:noProof/>
-              <w:lang w:eastAsia="en-GB"/>
-            </w:rPr>
-          </w:pPr>
-          <w:hyperlink w:anchor="_Toc238719445" w:history="1">
-            <w:r>
-              <w:rPr>
-                <w:rStyle w:val="Hyperlink"/>
-                <w:noProof/>
-              </w:rPr>
-              <w:t>6.2 Future improvements:</w:t>
-            </w:r>
-            <w:r>
-              <w:rPr>
-                <w:noProof/>
-                <w:webHidden/>
-              </w:rPr>
-              <w:tab/>
-            </w:r>
-            <w:r>
-              <w:rPr>
-                <w:noProof/>
-                <w:webHidden/>
-              </w:rPr>
-              <w:fldChar w:fldCharType="begin"/>
-            </w:r>
-            <w:r>
-              <w:rPr>
-                <w:noProof/>
-                <w:webHidden/>
-              </w:rPr>
-              <w:instrText xml:space="preserve"> PAGEREF _Toc238719445 \h </w:instrText>
-            </w:r>
-            <w:r>
-              <w:rPr>
-                <w:noProof/>
-                <w:webHidden/>
-              </w:rPr>
-            </w:r>
-            <w:r>
-              <w:rPr>
-                <w:noProof/>
-                <w:webHidden/>
-              </w:rPr>
-              <w:fldChar w:fldCharType="separate"/>
-            </w:r>
-            <w:r>
-              <w:rPr>
-                <w:noProof/>
-                <w:webHidden/>
-              </w:rPr>
-              <w:t>67</w:t>
-            </w:r>
-            <w:r>
-              <w:rPr>
-                <w:noProof/>
-                <w:webHidden/>
-              </w:rPr>
-              <w:fldChar w:fldCharType="end"/>
-            </w:r>
-          </w:hyperlink>
-        </w:p>
-        <w:p>
-          <w:pPr>
-            <w:pStyle w:val="TOC2"/>
-            <w:tabs>
-              <w:tab w:val="right" w:leader="dot" w:pos="9016"/>
-            </w:tabs>
-            <w:rPr>
-              <w:rFonts w:eastAsiaTheme="minorEastAsia"/>
-              <w:noProof/>
-              <w:lang w:eastAsia="en-GB"/>
-            </w:rPr>
-          </w:pPr>
-          <w:hyperlink w:anchor="_Toc238719446" w:history="1">
-            <w:r>
-              <w:rPr>
-                <w:rStyle w:val="Hyperlink"/>
-                <w:noProof/>
-              </w:rPr>
-              <w:t>Reference List</w:t>
-            </w:r>
-            <w:r>
-              <w:rPr>
-                <w:noProof/>
-                <w:webHidden/>
-              </w:rPr>
-              <w:tab/>
-            </w:r>
-            <w:r>
-              <w:rPr>
-                <w:noProof/>
-                <w:webHidden/>
-              </w:rPr>
-              <w:fldChar w:fldCharType="begin"/>
-            </w:r>
-            <w:r>
-              <w:rPr>
-                <w:noProof/>
-                <w:webHidden/>
-              </w:rPr>
-              <w:instrText xml:space="preserve"> PAGEREF _Toc238719446 \h </w:instrText>
-            </w:r>
-            <w:r>
-              <w:rPr>
-                <w:noProof/>
-                <w:webHidden/>
-              </w:rPr>
-            </w:r>
-            <w:r>
-              <w:rPr>
-                <w:noProof/>
-                <w:webHidden/>
-              </w:rPr>
-              <w:fldChar w:fldCharType="separate"/>
-            </w:r>
-            <w:r>
-              <w:rPr>
-                <w:noProof/>
-                <w:webHidden/>
-              </w:rPr>
-              <w:t>68</w:t>
-            </w:r>
-            <w:r>
-              <w:rPr>
-                <w:noProof/>
-                <w:webHidden/>
-              </w:rPr>
-              <w:fldChar w:fldCharType="end"/>
-            </w:r>
-          </w:hyperlink>
-        </w:p>
-        <w:p>
-          <w:pPr>
-            <w:pStyle w:val="TOC1"/>
-            <w:tabs>
-              <w:tab w:val="right" w:leader="dot" w:pos="9016"/>
-            </w:tabs>
-            <w:rPr>
-              <w:rFonts w:eastAsiaTheme="minorEastAsia"/>
-              <w:noProof/>
-              <w:lang w:eastAsia="en-GB"/>
-            </w:rPr>
-          </w:pPr>
-          <w:hyperlink w:anchor="_Toc238719447" w:history="1">
-            <w:r>
-              <w:rPr>
-                <w:rStyle w:val="Hyperlink"/>
-                <w:noProof/>
-              </w:rPr>
-              <w:t>Appendix A – Testing Documentation</w:t>
-            </w:r>
-            <w:r>
-              <w:rPr>
-                <w:noProof/>
-                <w:webHidden/>
-              </w:rPr>
-              <w:tab/>
-            </w:r>
-            <w:r>
-              <w:rPr>
-                <w:noProof/>
-                <w:webHidden/>
-              </w:rPr>
-              <w:fldChar w:fldCharType="begin"/>
-            </w:r>
-            <w:r>
-              <w:rPr>
-                <w:noProof/>
-                <w:webHidden/>
-              </w:rPr>
-              <w:instrText xml:space="preserve"> PAGEREF _Toc238719447 \h </w:instrText>
-            </w:r>
-            <w:r>
-              <w:rPr>
-                <w:noProof/>
-                <w:webHidden/>
-              </w:rPr>
-            </w:r>
-            <w:r>
-              <w:rPr>
-                <w:noProof/>
-                <w:webHidden/>
-              </w:rPr>
-              <w:fldChar w:fldCharType="separate"/>
-            </w:r>
-            <w:r>
-              <w:rPr>
-                <w:noProof/>
-                <w:webHidden/>
-              </w:rPr>
-              <w:t>72</w:t>
-            </w:r>
-            <w:r>
-              <w:rPr>
-                <w:noProof/>
-                <w:webHidden/>
-              </w:rPr>
-              <w:fldChar w:fldCharType="end"/>
-            </w:r>
-          </w:hyperlink>
-        </w:p>
-        <w:p>
-          <w:pPr>
-            <w:pStyle w:val="TOC3"/>
-            <w:tabs>
-              <w:tab w:val="right" w:leader="dot" w:pos="9016"/>
-            </w:tabs>
-            <w:rPr>
-              <w:rFonts w:eastAsiaTheme="minorEastAsia"/>
-              <w:noProof/>
-              <w:lang w:eastAsia="en-GB"/>
-            </w:rPr>
-          </w:pPr>
-          <w:hyperlink w:anchor="_Toc238719448" w:history="1">
-            <w:r>
-              <w:rPr>
-                <w:rStyle w:val="Hyperlink"/>
-                <w:rFonts w:asciiTheme="majorHAnsi" w:hAnsiTheme="majorHAnsi"/>
-                <w:noProof/>
-              </w:rPr>
-              <w:t>B.1 Unit Tests</w:t>
-            </w:r>
-            <w:r>
-              <w:rPr>
-                <w:noProof/>
-                <w:webHidden/>
-              </w:rPr>
-              <w:tab/>
-            </w:r>
-            <w:r>
-              <w:rPr>
-                <w:noProof/>
-                <w:webHidden/>
-              </w:rPr>
-              <w:fldChar w:fldCharType="begin"/>
-            </w:r>
-            <w:r>
-              <w:rPr>
-                <w:noProof/>
-                <w:webHidden/>
-              </w:rPr>
-              <w:instrText xml:space="preserve"> PAGEREF _Toc238719448 \h </w:instrText>
-            </w:r>
-            <w:r>
-              <w:rPr>
-                <w:noProof/>
-                <w:webHidden/>
-              </w:rPr>
-            </w:r>
-            <w:r>
-              <w:rPr>
-                <w:noProof/>
-                <w:webHidden/>
-              </w:rPr>
-              <w:fldChar w:fldCharType="separate"/>
-            </w:r>
-            <w:r>
-              <w:rPr>
-                <w:noProof/>
-                <w:webHidden/>
-              </w:rPr>
-              <w:t>73</w:t>
-            </w:r>
-            <w:r>
-              <w:rPr>
-                <w:noProof/>
-                <w:webHidden/>
-              </w:rPr>
-              <w:fldChar w:fldCharType="end"/>
-            </w:r>
-          </w:hyperlink>
-        </w:p>
-        <w:p>
-          <w:pPr>
-            <w:pStyle w:val="TOC3"/>
-            <w:tabs>
-              <w:tab w:val="right" w:leader="dot" w:pos="9016"/>
-            </w:tabs>
-            <w:rPr>
-              <w:rFonts w:eastAsiaTheme="minorEastAsia"/>
-              <w:noProof/>
-              <w:lang w:eastAsia="en-GB"/>
-            </w:rPr>
-          </w:pPr>
-          <w:hyperlink w:anchor="_Toc238719449" w:history="1">
-            <w:r>
-              <w:rPr>
-                <w:rStyle w:val="Hyperlink"/>
-                <w:noProof/>
-              </w:rPr>
-              <w:t>B.2 OCR Component Tests</w:t>
-            </w:r>
-            <w:r>
-              <w:rPr>
-                <w:noProof/>
-                <w:webHidden/>
-              </w:rPr>
-              <w:tab/>
-            </w:r>
-            <w:r>
-              <w:rPr>
-                <w:noProof/>
-                <w:webHidden/>
-              </w:rPr>
-              <w:fldChar w:fldCharType="begin"/>
-            </w:r>
-            <w:r>
-              <w:rPr>
-                <w:noProof/>
-                <w:webHidden/>
-              </w:rPr>
-              <w:instrText xml:space="preserve"> PAGEREF _Toc238719449 \h </w:instrText>
-            </w:r>
-            <w:r>
-              <w:rPr>
-                <w:noProof/>
-                <w:webHidden/>
-              </w:rPr>
-            </w:r>
-            <w:r>
-              <w:rPr>
-                <w:noProof/>
-                <w:webHidden/>
-              </w:rPr>
-              <w:fldChar w:fldCharType="separate"/>
-            </w:r>
-            <w:r>
-              <w:rPr>
-                <w:noProof/>
-                <w:webHidden/>
-              </w:rPr>
-              <w:t>75</w:t>
-            </w:r>
-            <w:r>
-              <w:rPr>
-                <w:noProof/>
-                <w:webHidden/>
-              </w:rPr>
-              <w:fldChar w:fldCharType="end"/>
-            </w:r>
-          </w:hyperlink>
-        </w:p>
-        <w:p>
-          <w:pPr>
-            <w:pStyle w:val="TOC3"/>
-            <w:tabs>
-              <w:tab w:val="right" w:leader="dot" w:pos="9016"/>
-            </w:tabs>
-            <w:rPr>
-              <w:rFonts w:eastAsiaTheme="minorEastAsia"/>
-              <w:noProof/>
-              <w:lang w:eastAsia="en-GB"/>
-            </w:rPr>
-          </w:pPr>
-          <w:hyperlink w:anchor="_Toc238719450" w:history="1">
-            <w:r>
-              <w:rPr>
-                <w:rStyle w:val="Hyperlink"/>
-                <w:noProof/>
-              </w:rPr>
-              <w:t>B.3 ASR Component Tests</w:t>
-            </w:r>
-            <w:r>
-              <w:rPr>
-                <w:noProof/>
-                <w:webHidden/>
-              </w:rPr>
-              <w:tab/>
-            </w:r>
-            <w:r>
-              <w:rPr>
-                <w:noProof/>
-                <w:webHidden/>
-              </w:rPr>
-              <w:fldChar w:fldCharType="begin"/>
-            </w:r>
-            <w:r>
-              <w:rPr>
-                <w:noProof/>
-                <w:webHidden/>
-              </w:rPr>
-              <w:instrText xml:space="preserve"> PAGEREF _Toc238719450 \h </w:instrText>
-            </w:r>
-            <w:r>
-              <w:rPr>
-                <w:noProof/>
-                <w:webHidden/>
-              </w:rPr>
-            </w:r>
-            <w:r>
-              <w:rPr>
-                <w:noProof/>
-                <w:webHidden/>
-              </w:rPr>
-              <w:fldChar w:fldCharType="separate"/>
-            </w:r>
-            <w:r>
-              <w:rPr>
-                <w:noProof/>
-                <w:webHidden/>
-              </w:rPr>
-              <w:t>76</w:t>
-            </w:r>
-            <w:r>
-              <w:rPr>
-                <w:noProof/>
-                <w:webHidden/>
-              </w:rPr>
-              <w:fldChar w:fldCharType="end"/>
-            </w:r>
-          </w:hyperlink>
-        </w:p>
-        <w:p>
-          <w:pPr>
-            <w:pStyle w:val="TOC3"/>
-            <w:tabs>
-              <w:tab w:val="right" w:leader="dot" w:pos="9016"/>
-            </w:tabs>
-            <w:rPr>
-              <w:rFonts w:eastAsiaTheme="minorEastAsia"/>
-              <w:noProof/>
-              <w:lang w:eastAsia="en-GB"/>
-            </w:rPr>
-          </w:pPr>
-          <w:hyperlink w:anchor="_Toc238719451" w:history="1">
-            <w:r>
-              <w:rPr>
-                <w:rStyle w:val="Hyperlink"/>
-                <w:noProof/>
-              </w:rPr>
-              <w:t>B.4 Transformer Component Tests</w:t>
-            </w:r>
-            <w:r>
-              <w:rPr>
-                <w:noProof/>
-                <w:webHidden/>
-              </w:rPr>
-              <w:tab/>
-            </w:r>
-            <w:r>
-              <w:rPr>
-                <w:noProof/>
-                <w:webHidden/>
-              </w:rPr>
-              <w:fldChar w:fldCharType="begin"/>
-            </w:r>
-            <w:r>
-              <w:rPr>
-                <w:noProof/>
-                <w:webHidden/>
-              </w:rPr>
-              <w:instrText xml:space="preserve"> PAGEREF _Toc238719451 \h </w:instrText>
-            </w:r>
-            <w:r>
-              <w:rPr>
-                <w:noProof/>
-                <w:webHidden/>
-              </w:rPr>
-            </w:r>
-            <w:r>
-              <w:rPr>
-                <w:noProof/>
-                <w:webHidden/>
-              </w:rPr>
-              <w:fldChar w:fldCharType="separate"/>
-            </w:r>
-            <w:r>
-              <w:rPr>
-                <w:noProof/>
-                <w:webHidden/>
-              </w:rPr>
-              <w:t>78</w:t>
-            </w:r>
-            <w:r>
-              <w:rPr>
-                <w:noProof/>
-                <w:webHidden/>
-              </w:rPr>
-              <w:fldChar w:fldCharType="end"/>
-            </w:r>
-          </w:hyperlink>
-        </w:p>
-        <w:p>
-          <w:pPr>
-            <w:pStyle w:val="TOC3"/>
-            <w:tabs>
-              <w:tab w:val="right" w:leader="dot" w:pos="9016"/>
-            </w:tabs>
-            <w:rPr>
-              <w:rFonts w:eastAsiaTheme="minorEastAsia"/>
-              <w:noProof/>
-              <w:lang w:eastAsia="en-GB"/>
-            </w:rPr>
-          </w:pPr>
-          <w:hyperlink w:anchor="_Toc238719452" w:history="1">
-            <w:r>
-              <w:rPr>
-                <w:rStyle w:val="Hyperlink"/>
-                <w:noProof/>
-              </w:rPr>
-              <w:t>B.5 Integration Tests</w:t>
-            </w:r>
-            <w:r>
-              <w:rPr>
-                <w:noProof/>
-                <w:webHidden/>
-              </w:rPr>
-              <w:tab/>
-            </w:r>
-            <w:r>
-              <w:rPr>
-                <w:noProof/>
-                <w:webHidden/>
-              </w:rPr>
-              <w:fldChar w:fldCharType="begin"/>
-            </w:r>
-            <w:r>
-              <w:rPr>
-                <w:noProof/>
-                <w:webHidden/>
-              </w:rPr>
-              <w:instrText xml:space="preserve"> PAGEREF _Toc238719452 \h </w:instrText>
-            </w:r>
-            <w:r>
-              <w:rPr>
-                <w:noProof/>
-                <w:webHidden/>
-              </w:rPr>
-            </w:r>
-            <w:r>
-              <w:rPr>
-                <w:noProof/>
-                <w:webHidden/>
-              </w:rPr>
-              <w:fldChar w:fldCharType="separate"/>
-            </w:r>
-            <w:r>
-              <w:rPr>
-                <w:noProof/>
-                <w:webHidden/>
-              </w:rPr>
-              <w:t>79</w:t>
-            </w:r>
-            <w:r>
-              <w:rPr>
-                <w:noProof/>
-                <w:webHidden/>
-              </w:rPr>
-              <w:fldChar w:fldCharType="end"/>
-            </w:r>
-          </w:hyperlink>
-        </w:p>
-        <w:p>
-          <w:pPr>
-            <w:pStyle w:val="TOC3"/>
-            <w:tabs>
-              <w:tab w:val="right" w:leader="dot" w:pos="9016"/>
-            </w:tabs>
-            <w:rPr>
-              <w:rFonts w:eastAsiaTheme="minorEastAsia"/>
-              <w:noProof/>
-              <w:lang w:eastAsia="en-GB"/>
-            </w:rPr>
-          </w:pPr>
-          <w:hyperlink w:anchor="_Toc238719453" w:history="1">
-            <w:r>
-              <w:rPr>
-                <w:rStyle w:val="Hyperlink"/>
-                <w:noProof/>
-              </w:rPr>
-              <w:t>B.6 Functional System Tests</w:t>
-            </w:r>
-            <w:r>
-              <w:rPr>
-                <w:noProof/>
-                <w:webHidden/>
-              </w:rPr>
-              <w:tab/>
-            </w:r>
-            <w:r>
-              <w:rPr>
-                <w:noProof/>
-                <w:webHidden/>
-              </w:rPr>
-              <w:fldChar w:fldCharType="begin"/>
-            </w:r>
-            <w:r>
-              <w:rPr>
-                <w:noProof/>
-                <w:webHidden/>
-              </w:rPr>
-              <w:instrText xml:space="preserve"> PAGEREF _Toc238719453 \h </w:instrText>
-            </w:r>
-            <w:r>
-              <w:rPr>
-                <w:noProof/>
-                <w:webHidden/>
-              </w:rPr>
-            </w:r>
-            <w:r>
-              <w:rPr>
-                <w:noProof/>
-                <w:webHidden/>
-              </w:rPr>
-              <w:fldChar w:fldCharType="separate"/>
-            </w:r>
-            <w:r>
-              <w:rPr>
-                <w:noProof/>
-                <w:webHidden/>
-              </w:rPr>
-              <w:t>80</w:t>
-            </w:r>
-            <w:r>
-              <w:rPr>
-                <w:noProof/>
-                <w:webHidden/>
-              </w:rPr>
-              <w:fldChar w:fldCharType="end"/>
-            </w:r>
-          </w:hyperlink>
-        </w:p>
-        <w:p>
-          <w:pPr>
-            <w:pStyle w:val="TOC3"/>
-            <w:tabs>
-              <w:tab w:val="right" w:leader="dot" w:pos="9016"/>
-            </w:tabs>
-            <w:rPr>
-              <w:rFonts w:eastAsiaTheme="minorEastAsia"/>
-              <w:noProof/>
-              <w:lang w:eastAsia="en-GB"/>
-            </w:rPr>
-          </w:pPr>
-          <w:hyperlink w:anchor="_Toc238719454" w:history="1">
-            <w:r>
-              <w:rPr>
-                <w:rStyle w:val="Hyperlink"/>
-                <w:noProof/>
-              </w:rPr>
-              <w:t>B.7 End-User Tests</w:t>
-            </w:r>
-            <w:r>
-              <w:rPr>
-                <w:noProof/>
-                <w:webHidden/>
-              </w:rPr>
-              <w:tab/>
-            </w:r>
-            <w:r>
-              <w:rPr>
-                <w:noProof/>
-                <w:webHidden/>
-              </w:rPr>
-              <w:fldChar w:fldCharType="begin"/>
-            </w:r>
-            <w:r>
-              <w:rPr>
-                <w:noProof/>
-                <w:webHidden/>
-              </w:rPr>
-              <w:instrText xml:space="preserve"> PAGEREF _Toc238719454 \h </w:instrText>
-            </w:r>
-            <w:r>
-              <w:rPr>
-                <w:noProof/>
-                <w:webHidden/>
-              </w:rPr>
-            </w:r>
-            <w:r>
-              <w:rPr>
-                <w:noProof/>
-                <w:webHidden/>
-              </w:rPr>
-              <w:fldChar w:fldCharType="separate"/>
-            </w:r>
-            <w:r>
-              <w:rPr>
-                <w:noProof/>
-                <w:webHidden/>
-              </w:rPr>
-              <w:t>82</w:t>
-            </w:r>
-            <w:r>
-              <w:rPr>
-                <w:noProof/>
-                <w:webHidden/>
-              </w:rPr>
-              <w:fldChar w:fldCharType="end"/>
-            </w:r>
-          </w:hyperlink>
-        </w:p>
-        <w:p>
-          <w:pPr>
-            <w:pStyle w:val="TOC3"/>
-            <w:tabs>
-              <w:tab w:val="right" w:leader="dot" w:pos="9016"/>
-            </w:tabs>
-            <w:rPr>
-              <w:rFonts w:eastAsiaTheme="minorEastAsia"/>
-              <w:noProof/>
-              <w:lang w:eastAsia="en-GB"/>
-            </w:rPr>
-          </w:pPr>
-          <w:hyperlink w:anchor="_Toc238719455" w:history="1">
-            <w:r>
-              <w:rPr>
-                <w:rStyle w:val="Hyperlink"/>
-                <w:noProof/>
-              </w:rPr>
-              <w:t>B.8 USABILITY TESTING</w:t>
-            </w:r>
-            <w:r>
-              <w:rPr>
-                <w:noProof/>
-                <w:webHidden/>
-              </w:rPr>
-              <w:tab/>
-            </w:r>
-            <w:r>
-              <w:rPr>
-                <w:noProof/>
-                <w:webHidden/>
-              </w:rPr>
-              <w:fldChar w:fldCharType="begin"/>
-            </w:r>
-            <w:r>
-              <w:rPr>
-                <w:noProof/>
-                <w:webHidden/>
-              </w:rPr>
-              <w:instrText xml:space="preserve"> PAGEREF _Toc238719455 \h </w:instrText>
-            </w:r>
-            <w:r>
-              <w:rPr>
-                <w:noProof/>
-                <w:webHidden/>
-              </w:rPr>
-            </w:r>
-            <w:r>
-              <w:rPr>
-                <w:noProof/>
-                <w:webHidden/>
-              </w:rPr>
-              <w:fldChar w:fldCharType="separate"/>
-            </w:r>
-            <w:r>
-              <w:rPr>
-                <w:noProof/>
-                <w:webHidden/>
-              </w:rPr>
-              <w:t>83</w:t>
+              <w:t>89</w:t>
             </w:r>
             <w:r>
               <w:rPr>
@@ -4251,7 +4320,6 @@
         <w:spacing w:line="360" w:lineRule="auto"/>
       </w:pPr>
       <w:r>
-        <w:lastRenderedPageBreak/>
         <w:br w:type="page"/>
       </w:r>
     </w:p>
@@ -4260,7 +4328,7 @@
         <w:pStyle w:val="Heading2"/>
         <w:spacing w:line="360" w:lineRule="auto"/>
       </w:pPr>
-      <w:bookmarkStart w:id="0" w:name="_Toc238719398"/>
+      <w:bookmarkStart w:id="0" w:name="_Toc239628339"/>
       <w:r>
         <w:lastRenderedPageBreak/>
         <w:t>Abstract</w:t>
@@ -4545,7 +4613,7 @@
         <w:spacing w:line="360" w:lineRule="auto"/>
         <w:jc w:val="center"/>
       </w:pPr>
-      <w:bookmarkStart w:id="1" w:name="_Toc238719399"/>
+      <w:bookmarkStart w:id="1" w:name="_Toc239628340"/>
       <w:r>
         <w:t>Chapter 1</w:t>
       </w:r>
@@ -4557,7 +4625,7 @@
         <w:spacing w:line="360" w:lineRule="auto"/>
         <w:jc w:val="center"/>
       </w:pPr>
-      <w:bookmarkStart w:id="2" w:name="_Toc238719400"/>
+      <w:bookmarkStart w:id="2" w:name="_Toc239628341"/>
       <w:r>
         <w:t>Introduction</w:t>
       </w:r>
@@ -4856,7 +4924,7 @@
         <w:spacing w:line="360" w:lineRule="auto"/>
         <w:jc w:val="center"/>
       </w:pPr>
-      <w:bookmarkStart w:id="3" w:name="_Toc238719401"/>
+      <w:bookmarkStart w:id="3" w:name="_Toc239628342"/>
       <w:r>
         <w:t>Chapter 2</w:t>
       </w:r>
@@ -4868,7 +4936,7 @@
         <w:spacing w:line="360" w:lineRule="auto"/>
         <w:jc w:val="center"/>
       </w:pPr>
-      <w:bookmarkStart w:id="4" w:name="_Toc238719402"/>
+      <w:bookmarkStart w:id="4" w:name="_Toc239628343"/>
       <w:r>
         <w:t>Literature Review</w:t>
       </w:r>
@@ -4893,7 +4961,7 @@
         <w:pStyle w:val="Heading3"/>
         <w:spacing w:line="360" w:lineRule="auto"/>
       </w:pPr>
-      <w:bookmarkStart w:id="5" w:name="_Toc238719403"/>
+      <w:bookmarkStart w:id="5" w:name="_Toc239628344"/>
       <w:r>
         <w:lastRenderedPageBreak/>
         <w:t>2.1 Automated Essay Scoring (AES) Systems</w:t>
@@ -5170,7 +5238,7 @@
       <w:pPr>
         <w:spacing w:line="360" w:lineRule="auto"/>
       </w:pPr>
-      <w:bookmarkStart w:id="6" w:name="_Toc238719404"/>
+      <w:bookmarkStart w:id="6" w:name="_Toc239628345"/>
       <w:r>
         <w:rPr>
           <w:rStyle w:val="Heading3Char"/>
@@ -5363,7 +5431,7 @@
         <w:pStyle w:val="Heading3"/>
         <w:spacing w:line="360" w:lineRule="auto"/>
       </w:pPr>
-      <w:bookmarkStart w:id="7" w:name="_Toc238719405"/>
+      <w:bookmarkStart w:id="7" w:name="_Toc239628346"/>
       <w:r>
         <w:t>2.1.2 Optical Character Recognition (OCR)</w:t>
       </w:r>
@@ -5685,7 +5753,7 @@
         <w:pStyle w:val="Heading3"/>
         <w:spacing w:line="360" w:lineRule="auto"/>
       </w:pPr>
-      <w:bookmarkStart w:id="8" w:name="_Toc238719406"/>
+      <w:bookmarkStart w:id="8" w:name="_Toc239628347"/>
       <w:r>
         <w:t>2.1.3 Automated Speech Recognition (ASR), Speech-To-Text (STT)</w:t>
       </w:r>
@@ -5825,7 +5893,7 @@
         <w:pStyle w:val="Heading3"/>
         <w:spacing w:line="360" w:lineRule="auto"/>
       </w:pPr>
-      <w:bookmarkStart w:id="9" w:name="_Toc238719407"/>
+      <w:bookmarkStart w:id="9" w:name="_Toc239628348"/>
       <w:r>
         <w:lastRenderedPageBreak/>
         <w:t>2.1.4 Multimodal Systems</w:t>
@@ -6254,7 +6322,7 @@
         <w:pStyle w:val="Heading3"/>
         <w:spacing w:line="360" w:lineRule="auto"/>
       </w:pPr>
-      <w:bookmarkStart w:id="10" w:name="_Toc238719408"/>
+      <w:bookmarkStart w:id="10" w:name="_Toc239628349"/>
       <w:r>
         <w:t>2.2 Challenges and consideration for component selection</w:t>
       </w:r>
@@ -6701,7 +6769,7 @@
       <w:pPr>
         <w:pStyle w:val="Heading3"/>
       </w:pPr>
-      <w:bookmarkStart w:id="12" w:name="_Toc238719409"/>
+      <w:bookmarkStart w:id="12" w:name="_Toc239628350"/>
       <w:r>
         <w:lastRenderedPageBreak/>
         <w:t>Evaluation Metrics</w:t>
@@ -7228,7 +7296,7 @@
         <w:spacing w:line="360" w:lineRule="auto"/>
         <w:jc w:val="center"/>
       </w:pPr>
-      <w:bookmarkStart w:id="13" w:name="_Toc238719410"/>
+      <w:bookmarkStart w:id="13" w:name="_Toc239628351"/>
       <w:r>
         <w:t>Chapter 3</w:t>
       </w:r>
@@ -7240,7 +7308,7 @@
         <w:spacing w:line="360" w:lineRule="auto"/>
         <w:jc w:val="center"/>
       </w:pPr>
-      <w:bookmarkStart w:id="14" w:name="_Toc238719411"/>
+      <w:bookmarkStart w:id="14" w:name="_Toc239628352"/>
       <w:r>
         <w:t>Design</w:t>
       </w:r>
@@ -7283,7 +7351,7 @@
       <w:pPr>
         <w:pStyle w:val="Heading3"/>
       </w:pPr>
-      <w:bookmarkStart w:id="15" w:name="_Toc238719412"/>
+      <w:bookmarkStart w:id="15" w:name="_Toc239628353"/>
       <w:r>
         <w:lastRenderedPageBreak/>
         <w:t>3.1 System Architecture</w:t>
@@ -7591,7 +7659,7 @@
       <w:pPr>
         <w:pStyle w:val="Heading3"/>
       </w:pPr>
-      <w:bookmarkStart w:id="16" w:name="_Toc238719413"/>
+      <w:bookmarkStart w:id="16" w:name="_Toc239628354"/>
       <w:r>
         <w:lastRenderedPageBreak/>
         <w:t>3.2 System Workflow</w:t>
@@ -8145,7 +8213,7 @@
       <w:pPr>
         <w:pStyle w:val="Heading3"/>
       </w:pPr>
-      <w:bookmarkStart w:id="17" w:name="_Toc238719414"/>
+      <w:bookmarkStart w:id="17" w:name="_Toc239628355"/>
       <w:r>
         <w:lastRenderedPageBreak/>
         <w:t>3.</w:t>
@@ -8635,7 +8703,7 @@
       <w:pPr>
         <w:pStyle w:val="Heading3"/>
       </w:pPr>
-      <w:bookmarkStart w:id="18" w:name="_Toc238719415"/>
+      <w:bookmarkStart w:id="18" w:name="_Toc239628356"/>
       <w:r>
         <w:lastRenderedPageBreak/>
         <w:t>3.</w:t>
@@ -8969,7 +9037,7 @@
       <w:pPr>
         <w:pStyle w:val="Heading3"/>
       </w:pPr>
-      <w:bookmarkStart w:id="19" w:name="_Toc238719416"/>
+      <w:bookmarkStart w:id="19" w:name="_Toc239628357"/>
       <w:r>
         <w:lastRenderedPageBreak/>
         <w:t>3.</w:t>
@@ -9330,7 +9398,7 @@
       <w:pPr>
         <w:pStyle w:val="Heading3"/>
       </w:pPr>
-      <w:bookmarkStart w:id="20" w:name="_Toc238719417"/>
+      <w:bookmarkStart w:id="20" w:name="_Toc239628358"/>
       <w:r>
         <w:lastRenderedPageBreak/>
         <w:t>3.6 Data/ System Design</w:t>
@@ -9714,7 +9782,6 @@
       <w:r>
         <w:t>.</w:t>
       </w:r>
-      <w:bookmarkStart w:id="21" w:name="_Toc238719418"/>
     </w:p>
     <w:p>
       <w:pPr>
@@ -9790,6 +9857,7 @@
         <w:pStyle w:val="Heading1"/>
         <w:jc w:val="center"/>
       </w:pPr>
+      <w:bookmarkStart w:id="21" w:name="_Toc239628359"/>
       <w:r>
         <w:t>Chapter 4</w:t>
       </w:r>
@@ -9801,7 +9869,7 @@
         <w:spacing w:line="360" w:lineRule="auto"/>
         <w:jc w:val="center"/>
       </w:pPr>
-      <w:bookmarkStart w:id="22" w:name="_Toc238719419"/>
+      <w:bookmarkStart w:id="22" w:name="_Toc239628360"/>
       <w:r>
         <w:t>Implementation</w:t>
       </w:r>
@@ -9830,7 +9898,7 @@
       <w:pPr>
         <w:pStyle w:val="Heading3"/>
       </w:pPr>
-      <w:bookmarkStart w:id="23" w:name="_Toc238719420"/>
+      <w:bookmarkStart w:id="23" w:name="_Toc239628361"/>
       <w:r>
         <w:lastRenderedPageBreak/>
         <w:t>4.1 Implementation Environment</w:t>
@@ -10155,7 +10223,7 @@
       <w:pPr>
         <w:pStyle w:val="Heading3"/>
       </w:pPr>
-      <w:bookmarkStart w:id="24" w:name="_Toc238719421"/>
+      <w:bookmarkStart w:id="24" w:name="_Toc239628362"/>
       <w:r>
         <w:lastRenderedPageBreak/>
         <w:t>4.2 Data Processing and Management</w:t>
@@ -10647,7 +10715,7 @@
       <w:pPr>
         <w:pStyle w:val="Heading3"/>
       </w:pPr>
-      <w:bookmarkStart w:id="25" w:name="_Toc238719422"/>
+      <w:bookmarkStart w:id="25" w:name="_Toc239628363"/>
       <w:r>
         <w:lastRenderedPageBreak/>
         <w:t>4.3 OCR Implementation</w:t>
@@ -11173,7 +11241,6 @@
           <w:bCs/>
         </w:rPr>
       </w:pPr>
-      <w:bookmarkStart w:id="26" w:name="_Toc238719423"/>
       <w:r>
         <w:rPr>
           <w:b/>
@@ -11253,6 +11320,7 @@
       <w:pPr>
         <w:pStyle w:val="Heading3"/>
       </w:pPr>
+      <w:bookmarkStart w:id="26" w:name="_Toc239628364"/>
       <w:r>
         <w:lastRenderedPageBreak/>
         <w:t>4.</w:t>
@@ -11901,7 +11969,7 @@
       <w:pPr>
         <w:pStyle w:val="Heading3"/>
       </w:pPr>
-      <w:bookmarkStart w:id="27" w:name="_Toc238719424"/>
+      <w:bookmarkStart w:id="27" w:name="_Toc239628365"/>
       <w:r>
         <w:lastRenderedPageBreak/>
         <w:t>4.</w:t>
@@ -12059,7 +12127,7 @@
       <w:pPr>
         <w:pStyle w:val="Heading3"/>
       </w:pPr>
-      <w:bookmarkStart w:id="28" w:name="_Toc238719425"/>
+      <w:bookmarkStart w:id="28" w:name="_Toc239628366"/>
       <w:r>
         <w:lastRenderedPageBreak/>
         <w:t>4.6 Evaluation/Routing Logic</w:t>
@@ -12471,7 +12539,7 @@
       <w:pPr>
         <w:pStyle w:val="Heading3"/>
       </w:pPr>
-      <w:bookmarkStart w:id="29" w:name="_Toc238719426"/>
+      <w:bookmarkStart w:id="29" w:name="_Toc239628367"/>
       <w:r>
         <w:lastRenderedPageBreak/>
         <w:t>4.7 System Integration</w:t>
@@ -12546,7 +12614,7 @@
       <w:pPr>
         <w:pStyle w:val="Heading3"/>
       </w:pPr>
-      <w:bookmarkStart w:id="30" w:name="_Toc238719429"/>
+      <w:bookmarkStart w:id="30" w:name="_Toc239628368"/>
       <w:r>
         <w:lastRenderedPageBreak/>
         <w:t xml:space="preserve">4.8 </w:t>
@@ -12678,7 +12746,7 @@
         <w:spacing w:line="360" w:lineRule="auto"/>
         <w:jc w:val="center"/>
       </w:pPr>
-      <w:bookmarkStart w:id="31" w:name="_Toc238719430"/>
+      <w:bookmarkStart w:id="31" w:name="_Toc239628369"/>
       <w:r>
         <w:t>CHAPTER  5</w:t>
       </w:r>
@@ -12690,7 +12758,7 @@
         <w:spacing w:line="360" w:lineRule="auto"/>
         <w:jc w:val="center"/>
       </w:pPr>
-      <w:bookmarkStart w:id="32" w:name="_Toc238719431"/>
+      <w:bookmarkStart w:id="32" w:name="_Toc239628370"/>
       <w:r>
         <w:t>Evaluation</w:t>
       </w:r>
@@ -12709,7 +12777,7 @@
       <w:pPr>
         <w:pStyle w:val="Heading3"/>
       </w:pPr>
-      <w:bookmarkStart w:id="33" w:name="_Toc238719432"/>
+      <w:bookmarkStart w:id="33" w:name="_Toc239628371"/>
       <w:r>
         <w:lastRenderedPageBreak/>
         <w:t>5.1 Evaluation Methodology</w:t>
@@ -12986,7 +13054,6 @@
           <w:szCs w:val="28"/>
         </w:rPr>
       </w:pPr>
-      <w:bookmarkStart w:id="34" w:name="_Toc238719428"/>
       <w:r>
         <w:br w:type="page"/>
       </w:r>
@@ -12996,6 +13063,7 @@
         <w:pStyle w:val="Heading3"/>
         <w:spacing w:line="360" w:lineRule="auto"/>
       </w:pPr>
+      <w:bookmarkStart w:id="34" w:name="_Toc239628372"/>
       <w:r>
         <w:lastRenderedPageBreak/>
         <w:t>Procedure</w:t>
@@ -13145,6 +13213,7 @@
       <w:pPr>
         <w:pStyle w:val="Heading3"/>
       </w:pPr>
+      <w:bookmarkStart w:id="35" w:name="_Toc239628373"/>
       <w:r>
         <w:lastRenderedPageBreak/>
         <w:t xml:space="preserve">5.2 </w:t>
@@ -13152,6 +13221,7 @@
       <w:r>
         <w:t>Testing Plan</w:t>
       </w:r>
+      <w:bookmarkEnd w:id="35"/>
     </w:p>
     <w:p>
       <w:pPr>
@@ -13558,7 +13628,7 @@
       <w:pPr>
         <w:pStyle w:val="Heading3"/>
       </w:pPr>
-      <w:bookmarkStart w:id="35" w:name="_Toc238719433"/>
+      <w:bookmarkStart w:id="36" w:name="_Toc239628374"/>
       <w:r>
         <w:lastRenderedPageBreak/>
         <w:t>5.</w:t>
@@ -13569,7 +13639,7 @@
       <w:r>
         <w:t xml:space="preserve"> Unit Testing</w:t>
       </w:r>
-      <w:bookmarkEnd w:id="35"/>
+      <w:bookmarkEnd w:id="36"/>
     </w:p>
     <w:p/>
     <w:p>
@@ -13666,7 +13736,7 @@
       <w:pPr>
         <w:pStyle w:val="Heading3"/>
       </w:pPr>
-      <w:bookmarkStart w:id="36" w:name="_Toc238719434"/>
+      <w:bookmarkStart w:id="37" w:name="_Toc239628375"/>
       <w:r>
         <w:lastRenderedPageBreak/>
         <w:t>5.</w:t>
@@ -13677,7 +13747,7 @@
       <w:r>
         <w:t xml:space="preserve"> OCR Evaluation</w:t>
       </w:r>
-      <w:bookmarkEnd w:id="36"/>
+      <w:bookmarkEnd w:id="37"/>
     </w:p>
     <w:p/>
     <w:p>
@@ -13899,6 +13969,9 @@
         <w:spacing w:line="360" w:lineRule="auto"/>
       </w:pPr>
       <w:r>
+        <w:rPr>
+          <w:noProof/>
+        </w:rPr>
         <w:drawing>
           <wp:inline distT="0" distB="0" distL="0" distR="0" wp14:anchorId="4D2FA287" wp14:editId="695E629D">
             <wp:extent cx="5731510" cy="2190115"/>
@@ -14313,6 +14386,9 @@
         <w:spacing w:line="360" w:lineRule="auto"/>
       </w:pPr>
       <w:r>
+        <w:rPr>
+          <w:noProof/>
+        </w:rPr>
         <w:drawing>
           <wp:inline distT="0" distB="0" distL="0" distR="0" wp14:anchorId="7EA5A95E" wp14:editId="715A3040">
             <wp:extent cx="4157932" cy="1424172"/>
@@ -14464,7 +14540,7 @@
       <w:pPr>
         <w:pStyle w:val="Heading3"/>
       </w:pPr>
-      <w:bookmarkStart w:id="37" w:name="_Toc238719435"/>
+      <w:bookmarkStart w:id="38" w:name="_Toc239628376"/>
       <w:r>
         <w:lastRenderedPageBreak/>
         <w:t>5.</w:t>
@@ -14478,7 +14554,7 @@
       <w:r>
         <w:t>ASR Evaluation</w:t>
       </w:r>
-      <w:bookmarkEnd w:id="37"/>
+      <w:bookmarkEnd w:id="38"/>
     </w:p>
     <w:p>
       <w:pPr>
@@ -14760,6 +14836,9 @@
         <w:spacing w:line="360" w:lineRule="auto"/>
       </w:pPr>
       <w:r>
+        <w:rPr>
+          <w:noProof/>
+        </w:rPr>
         <w:drawing>
           <wp:inline distT="0" distB="0" distL="0" distR="0" wp14:anchorId="1490D2F7" wp14:editId="12F9FD50">
             <wp:extent cx="4582164" cy="1952898"/>
@@ -14883,21 +14962,7 @@
           <w:b/>
           <w:bCs/>
         </w:rPr>
-        <w:t xml:space="preserve"> </w:t>
-      </w:r>
-      <w:r>
-        <w:rPr>
-          <w:b/>
-          <w:bCs/>
-        </w:rPr>
-        <w:t>float_</w:t>
-      </w:r>
-      <w:r>
-        <w:rPr>
-          <w:b/>
-          <w:bCs/>
-        </w:rPr>
-        <w:t>16</w:t>
+        <w:t xml:space="preserve"> float_16</w:t>
       </w:r>
       <w:r>
         <w:t xml:space="preserve"> and </w:t>
@@ -14946,13 +15011,7 @@
         <w:t>Therefore,</w:t>
       </w:r>
       <w:r>
-        <w:t xml:space="preserve"> the </w:t>
-      </w:r>
-      <w:r>
-        <w:t>configuration</w:t>
-      </w:r>
-      <w:r>
-        <w:t xml:space="preserve"> that </w:t>
+        <w:t xml:space="preserve"> the configuration that </w:t>
       </w:r>
       <w:r>
         <w:t>was</w:t>
@@ -15076,6 +15135,7 @@
         <w:rPr>
           <w:b/>
           <w:bCs/>
+          <w:noProof/>
         </w:rPr>
         <w:drawing>
           <wp:inline distT="0" distB="0" distL="0" distR="0" wp14:anchorId="27AACEE0" wp14:editId="5ECF2C4F">
@@ -15195,6 +15255,9 @@
         <w:spacing w:line="360" w:lineRule="auto"/>
       </w:pPr>
       <w:r>
+        <w:rPr>
+          <w:noProof/>
+        </w:rPr>
         <w:drawing>
           <wp:inline distT="0" distB="0" distL="0" distR="0" wp14:anchorId="3F494FCE" wp14:editId="2E1BA288">
             <wp:extent cx="1880558" cy="2708998"/>
@@ -15331,6 +15394,9 @@
         <w:spacing w:line="360" w:lineRule="auto"/>
       </w:pPr>
       <w:r>
+        <w:rPr>
+          <w:noProof/>
+        </w:rPr>
         <w:drawing>
           <wp:inline distT="0" distB="0" distL="0" distR="0" wp14:anchorId="3956B703" wp14:editId="4EB7C2C2">
             <wp:extent cx="4515480" cy="1733792"/>
@@ -15405,6 +15471,9 @@
         <w:spacing w:line="360" w:lineRule="auto"/>
       </w:pPr>
       <w:r>
+        <w:rPr>
+          <w:noProof/>
+        </w:rPr>
         <w:drawing>
           <wp:inline distT="0" distB="0" distL="0" distR="0" wp14:anchorId="7E47B227" wp14:editId="1F8A83B9">
             <wp:extent cx="5068007" cy="2048161"/>
@@ -15717,6 +15786,9 @@
         <w:spacing w:line="360" w:lineRule="auto"/>
       </w:pPr>
       <w:r>
+        <w:rPr>
+          <w:noProof/>
+        </w:rPr>
         <w:drawing>
           <wp:inline distT="0" distB="0" distL="0" distR="0" wp14:anchorId="6993889B" wp14:editId="5BEC9BB1">
             <wp:extent cx="5163271" cy="1467055"/>
@@ -15774,6 +15846,9 @@
         <w:spacing w:line="360" w:lineRule="auto"/>
       </w:pPr>
       <w:r>
+        <w:rPr>
+          <w:noProof/>
+        </w:rPr>
         <w:drawing>
           <wp:inline distT="0" distB="0" distL="0" distR="0" wp14:anchorId="50C4F1C5" wp14:editId="2E7BEB82">
             <wp:extent cx="4972744" cy="1952898"/>
@@ -15895,6 +15970,9 @@
         <w:spacing w:line="360" w:lineRule="auto"/>
       </w:pPr>
       <w:r>
+        <w:rPr>
+          <w:noProof/>
+        </w:rPr>
         <w:lastRenderedPageBreak/>
         <w:drawing>
           <wp:inline distT="0" distB="0" distL="0" distR="0" wp14:anchorId="0D58FD30" wp14:editId="29F5D076">
@@ -16143,7 +16221,7 @@
       <w:pPr>
         <w:pStyle w:val="Heading3"/>
       </w:pPr>
-      <w:bookmarkStart w:id="38" w:name="_Toc238719436"/>
+      <w:bookmarkStart w:id="39" w:name="_Toc239628377"/>
       <w:r>
         <w:lastRenderedPageBreak/>
         <w:t>5.</w:t>
@@ -16154,7 +16232,7 @@
       <w:r>
         <w:t xml:space="preserve"> Transformer/AES Evaluation</w:t>
       </w:r>
-      <w:bookmarkEnd w:id="38"/>
+      <w:bookmarkEnd w:id="39"/>
       <w:r>
         <w:t xml:space="preserve"> </w:t>
       </w:r>
@@ -16285,7 +16363,7 @@
       <w:pPr>
         <w:pStyle w:val="Heading3"/>
       </w:pPr>
-      <w:bookmarkStart w:id="39" w:name="_Toc238719437"/>
+      <w:bookmarkStart w:id="40" w:name="_Toc239628378"/>
       <w:r>
         <w:lastRenderedPageBreak/>
         <w:t>5.</w:t>
@@ -16296,7 +16374,7 @@
       <w:r>
         <w:t xml:space="preserve"> Integration/System Evaluation</w:t>
       </w:r>
-      <w:bookmarkEnd w:id="39"/>
+      <w:bookmarkEnd w:id="40"/>
     </w:p>
     <w:p/>
     <w:p>
@@ -16372,7 +16450,7 @@
       <w:pPr>
         <w:pStyle w:val="Heading3"/>
       </w:pPr>
-      <w:bookmarkStart w:id="40" w:name="_Toc238719438"/>
+      <w:bookmarkStart w:id="41" w:name="_Toc239628379"/>
       <w:r>
         <w:lastRenderedPageBreak/>
         <w:t>5.</w:t>
@@ -16383,7 +16461,7 @@
       <w:r>
         <w:t xml:space="preserve"> End-User/Usability Evaluation</w:t>
       </w:r>
-      <w:bookmarkEnd w:id="40"/>
+      <w:bookmarkEnd w:id="41"/>
     </w:p>
     <w:p/>
     <w:p>
@@ -16481,7 +16559,7 @@
       <w:pPr>
         <w:pStyle w:val="Heading3"/>
       </w:pPr>
-      <w:bookmarkStart w:id="41" w:name="_Toc238719439"/>
+      <w:bookmarkStart w:id="42" w:name="_Toc239628380"/>
       <w:r>
         <w:lastRenderedPageBreak/>
         <w:t>5.</w:t>
@@ -16492,7 +16570,7 @@
       <w:r>
         <w:t xml:space="preserve"> Overall Evaluation</w:t>
       </w:r>
-      <w:bookmarkEnd w:id="41"/>
+      <w:bookmarkEnd w:id="42"/>
     </w:p>
     <w:p/>
     <w:p>
@@ -16869,11 +16947,11 @@
         <w:spacing w:line="360" w:lineRule="auto"/>
         <w:jc w:val="center"/>
       </w:pPr>
-      <w:bookmarkStart w:id="42" w:name="_Toc238719442"/>
+      <w:bookmarkStart w:id="43" w:name="_Toc239628381"/>
       <w:r>
         <w:t>Chapter 6</w:t>
       </w:r>
-      <w:bookmarkEnd w:id="42"/>
+      <w:bookmarkEnd w:id="43"/>
     </w:p>
     <w:p>
       <w:pPr>
@@ -16881,11 +16959,11 @@
         <w:spacing w:line="360" w:lineRule="auto"/>
         <w:jc w:val="center"/>
       </w:pPr>
-      <w:bookmarkStart w:id="43" w:name="_Toc238719443"/>
+      <w:bookmarkStart w:id="44" w:name="_Toc239628382"/>
       <w:r>
         <w:t>Conclusion</w:t>
       </w:r>
-      <w:bookmarkEnd w:id="43"/>
+      <w:bookmarkEnd w:id="44"/>
       <w:r>
         <w:t xml:space="preserve"> </w:t>
       </w:r>
@@ -16902,12 +16980,12 @@
       <w:pPr>
         <w:pStyle w:val="Heading3"/>
       </w:pPr>
-      <w:bookmarkStart w:id="44" w:name="_Toc238719444"/>
+      <w:bookmarkStart w:id="45" w:name="_Toc239628383"/>
       <w:r>
         <w:lastRenderedPageBreak/>
         <w:t>6.1 Conclusion</w:t>
       </w:r>
-      <w:bookmarkEnd w:id="44"/>
+      <w:bookmarkEnd w:id="45"/>
     </w:p>
     <w:p>
       <w:pPr>
@@ -16926,7 +17004,7 @@
       <w:pPr>
         <w:pStyle w:val="Heading3"/>
       </w:pPr>
-      <w:bookmarkStart w:id="45" w:name="_Toc238719445"/>
+      <w:bookmarkStart w:id="46" w:name="_Toc239628384"/>
       <w:r>
         <w:lastRenderedPageBreak/>
         <w:t xml:space="preserve">6.2 </w:t>
@@ -16934,7 +17012,7 @@
       <w:r>
         <w:t>Future improvements:</w:t>
       </w:r>
-      <w:bookmarkEnd w:id="45"/>
+      <w:bookmarkEnd w:id="46"/>
     </w:p>
     <w:p>
       <w:pPr>
@@ -17233,12 +17311,12 @@
       <w:pPr>
         <w:pStyle w:val="Heading2"/>
       </w:pPr>
-      <w:bookmarkStart w:id="46" w:name="_Toc238719446"/>
+      <w:bookmarkStart w:id="47" w:name="_Toc239628385"/>
       <w:r>
         <w:lastRenderedPageBreak/>
         <w:t>Reference List</w:t>
       </w:r>
-      <w:bookmarkEnd w:id="46"/>
+      <w:bookmarkEnd w:id="47"/>
       <w:r>
         <w:t xml:space="preserve"> </w:t>
       </w:r>
@@ -18354,7 +18432,7 @@
           <w:szCs w:val="40"/>
         </w:rPr>
       </w:pPr>
-      <w:bookmarkStart w:id="47" w:name="_Toc238719447"/>
+      <w:bookmarkStart w:id="48" w:name="_Toc239628386"/>
       <w:r>
         <w:rPr>
           <w:rStyle w:val="Heading2Char"/>
@@ -18363,7 +18441,7 @@
         </w:rPr>
         <w:t>Appendix A – Testing Documentation</w:t>
       </w:r>
-      <w:bookmarkEnd w:id="47"/>
+      <w:bookmarkEnd w:id="48"/>
     </w:p>
     <w:p>
       <w:pPr>
@@ -18396,7 +18474,7 @@
           <w:szCs w:val="28"/>
         </w:rPr>
       </w:pPr>
-      <w:bookmarkStart w:id="48" w:name="_Toc238719448"/>
+      <w:bookmarkStart w:id="49" w:name="_Toc239628387"/>
       <w:r>
         <w:rPr>
           <w:rStyle w:val="Heading2Char"/>
@@ -18416,7 +18494,7 @@
         </w:rPr>
         <w:t>.1 Unit Tests</w:t>
       </w:r>
-      <w:bookmarkEnd w:id="48"/>
+      <w:bookmarkEnd w:id="49"/>
       <w:r>
         <w:rPr>
           <w:rStyle w:val="Heading2Char"/>
@@ -19150,7 +19228,7 @@
       <w:pPr>
         <w:pStyle w:val="Heading3"/>
       </w:pPr>
-      <w:bookmarkStart w:id="49" w:name="_Toc238719449"/>
+      <w:bookmarkStart w:id="50" w:name="_Toc239628388"/>
       <w:r>
         <w:lastRenderedPageBreak/>
         <w:t>A</w:t>
@@ -19158,7 +19236,7 @@
       <w:r>
         <w:t>.2 OCR Component Tests</w:t>
       </w:r>
-      <w:bookmarkEnd w:id="49"/>
+      <w:bookmarkEnd w:id="50"/>
     </w:p>
     <w:p>
       <w:r>
@@ -19692,7 +19770,7 @@
       <w:pPr>
         <w:pStyle w:val="Heading3"/>
       </w:pPr>
-      <w:bookmarkStart w:id="50" w:name="_Toc238719450"/>
+      <w:bookmarkStart w:id="51" w:name="_Toc239628389"/>
       <w:r>
         <w:lastRenderedPageBreak/>
         <w:t>A</w:t>
@@ -19700,7 +19778,7 @@
       <w:r>
         <w:t>.3 ASR Component Tests</w:t>
       </w:r>
-      <w:bookmarkEnd w:id="50"/>
+      <w:bookmarkEnd w:id="51"/>
     </w:p>
     <w:p>
       <w:r>
@@ -20348,7 +20426,7 @@
       <w:pPr>
         <w:pStyle w:val="Heading3"/>
       </w:pPr>
-      <w:bookmarkStart w:id="51" w:name="_Toc238719451"/>
+      <w:bookmarkStart w:id="52" w:name="_Toc239628390"/>
       <w:r>
         <w:lastRenderedPageBreak/>
         <w:t>A</w:t>
@@ -20356,7 +20434,7 @@
       <w:r>
         <w:t>.4 Transformer Component Tests</w:t>
       </w:r>
-      <w:bookmarkEnd w:id="51"/>
+      <w:bookmarkEnd w:id="52"/>
     </w:p>
     <w:p>
       <w:r>
@@ -20851,7 +20929,7 @@
       <w:pPr>
         <w:pStyle w:val="Heading3"/>
       </w:pPr>
-      <w:bookmarkStart w:id="52" w:name="_Toc238719452"/>
+      <w:bookmarkStart w:id="53" w:name="_Toc239628391"/>
       <w:r>
         <w:lastRenderedPageBreak/>
         <w:t>A</w:t>
@@ -20859,7 +20937,7 @@
       <w:r>
         <w:t>.5 Integration Tests</w:t>
       </w:r>
-      <w:bookmarkEnd w:id="52"/>
+      <w:bookmarkEnd w:id="53"/>
     </w:p>
     <w:p>
       <w:r>
@@ -21297,7 +21375,7 @@
       <w:pPr>
         <w:pStyle w:val="Heading3"/>
       </w:pPr>
-      <w:bookmarkStart w:id="53" w:name="_Toc238719453"/>
+      <w:bookmarkStart w:id="54" w:name="_Toc239628392"/>
       <w:r>
         <w:lastRenderedPageBreak/>
         <w:t>A</w:t>
@@ -21305,7 +21383,7 @@
       <w:r>
         <w:t>.6 Functional System Tests</w:t>
       </w:r>
-      <w:bookmarkEnd w:id="53"/>
+      <w:bookmarkEnd w:id="54"/>
     </w:p>
     <w:p>
       <w:r>
@@ -21762,12 +21840,12 @@
       <w:pPr>
         <w:pStyle w:val="Heading3"/>
       </w:pPr>
-      <w:bookmarkStart w:id="54" w:name="_Toc238719454"/>
+      <w:bookmarkStart w:id="55" w:name="_Toc239628393"/>
       <w:r>
         <w:lastRenderedPageBreak/>
         <w:t>B.7 End-User Tests</w:t>
       </w:r>
-      <w:bookmarkEnd w:id="54"/>
+      <w:bookmarkEnd w:id="55"/>
     </w:p>
     <w:p>
       <w:r>
@@ -22110,12 +22188,12 @@
       <w:pPr>
         <w:pStyle w:val="Heading3"/>
       </w:pPr>
-      <w:bookmarkStart w:id="55" w:name="_Toc238719455"/>
+      <w:bookmarkStart w:id="56" w:name="_Toc239628394"/>
       <w:r>
         <w:lastRenderedPageBreak/>
         <w:t>B.8 USABILITY TESTING</w:t>
       </w:r>
-      <w:bookmarkEnd w:id="55"/>
+      <w:bookmarkEnd w:id="56"/>
     </w:p>
     <w:tbl>
       <w:tblPr>
@@ -23055,6 +23133,7 @@
           <w:szCs w:val="40"/>
         </w:rPr>
       </w:pPr>
+      <w:bookmarkStart w:id="57" w:name="_Toc239628395"/>
       <w:r>
         <w:rPr>
           <w:rStyle w:val="Heading2Char"/>
@@ -23079,6 +23158,7 @@
         </w:rPr>
         <w:t xml:space="preserve"> – Testing Documentation</w:t>
       </w:r>
+      <w:bookmarkEnd w:id="57"/>
     </w:p>
     <w:p>
       <w:pPr>
@@ -23105,10 +23185,12 @@
       <w:pPr>
         <w:pStyle w:val="Heading3"/>
       </w:pPr>
+      <w:bookmarkStart w:id="58" w:name="_Toc239628396"/>
       <w:r>
         <w:lastRenderedPageBreak/>
         <w:t>B.1 Unit Testing</w:t>
       </w:r>
+      <w:bookmarkEnd w:id="58"/>
     </w:p>
     <w:p/>
     <w:p>
@@ -23632,7 +23714,7 @@
       <w:pPr>
         <w:pStyle w:val="Heading3"/>
       </w:pPr>
-      <w:bookmarkStart w:id="56" w:name="_Toc238719441"/>
+      <w:bookmarkStart w:id="59" w:name="_Toc239628397"/>
       <w:r>
         <w:lastRenderedPageBreak/>
         <w:t>B</w:t>
@@ -23649,7 +23731,7 @@
       <w:r>
         <w:t xml:space="preserve"> Testing</w:t>
       </w:r>
-      <w:bookmarkEnd w:id="56"/>
+      <w:bookmarkEnd w:id="59"/>
     </w:p>
     <w:p>
       <w:pPr>
@@ -30674,6 +30756,7 @@
   <w:style w:type="character" w:default="1" w:styleId="DefaultParagraphFont">
     <w:name w:val="Default Paragraph Font"/>
     <w:uiPriority w:val="1"/>
+    <w:semiHidden/>
     <w:unhideWhenUsed/>
   </w:style>
   <w:style w:type="table" w:default="1" w:styleId="TableNormal">

</xml_diff>

<commit_message>
Deberta fine-tuning, and implementation write-up completed
</commit_message>
<xml_diff>
--- a/final report/Final Report.docx
+++ b/final report/Final Report.docx
@@ -7431,14 +7431,27 @@
       <w:r>
         <w:t xml:space="preserve">Figure </w:t>
       </w:r>
-      <w:fldSimple w:instr=" SEQ Figure \* ARABIC ">
-        <w:r>
-          <w:rPr>
-            <w:noProof/>
-          </w:rPr>
-          <w:t>1</w:t>
-        </w:r>
-      </w:fldSimple>
+      <w:r>
+        <w:fldChar w:fldCharType="begin"/>
+      </w:r>
+      <w:r>
+        <w:instrText xml:space="preserve"> SEQ Figure \* ARABIC </w:instrText>
+      </w:r>
+      <w:r>
+        <w:fldChar w:fldCharType="separate"/>
+      </w:r>
+      <w:r>
+        <w:rPr>
+          <w:noProof/>
+        </w:rPr>
+        <w:t>1</w:t>
+      </w:r>
+      <w:r>
+        <w:rPr>
+          <w:noProof/>
+        </w:rPr>
+        <w:fldChar w:fldCharType="end"/>
+      </w:r>
       <w:r>
         <w:t xml:space="preserve"> Architecture of </w:t>
       </w:r>
@@ -8824,14 +8837,27 @@
       <w:r>
         <w:t xml:space="preserve">Figure </w:t>
       </w:r>
-      <w:fldSimple w:instr=" SEQ Figure \* ARABIC ">
-        <w:r>
-          <w:rPr>
-            <w:noProof/>
-          </w:rPr>
-          <w:t>2</w:t>
-        </w:r>
-      </w:fldSimple>
+      <w:r>
+        <w:fldChar w:fldCharType="begin"/>
+      </w:r>
+      <w:r>
+        <w:instrText xml:space="preserve"> SEQ Figure \* ARABIC </w:instrText>
+      </w:r>
+      <w:r>
+        <w:fldChar w:fldCharType="separate"/>
+      </w:r>
+      <w:r>
+        <w:rPr>
+          <w:noProof/>
+        </w:rPr>
+        <w:t>2</w:t>
+      </w:r>
+      <w:r>
+        <w:rPr>
+          <w:noProof/>
+        </w:rPr>
+        <w:fldChar w:fldCharType="end"/>
+      </w:r>
       <w:r>
         <w:t xml:space="preserve"> User interface for </w:t>
       </w:r>
@@ -10739,6 +10765,9 @@
       </w:r>
     </w:p>
     <w:p>
+      <w:pPr>
+        <w:spacing w:line="360" w:lineRule="auto"/>
+      </w:pPr>
       <w:r>
         <w:t>Implementation began by</w:t>
       </w:r>
@@ -10864,6 +10893,9 @@
       </w:r>
     </w:p>
     <w:p>
+      <w:pPr>
+        <w:spacing w:line="360" w:lineRule="auto"/>
+      </w:pPr>
       <w:r>
         <w:t>F</w:t>
       </w:r>
@@ -11028,6 +11060,9 @@
       </w:r>
     </w:p>
     <w:p>
+      <w:pPr>
+        <w:spacing w:line="360" w:lineRule="auto"/>
+      </w:pPr>
       <w:r>
         <w:t xml:space="preserve">The </w:t>
       </w:r>
@@ -11086,6 +11121,9 @@
       </w:r>
     </w:p>
     <w:p>
+      <w:pPr>
+        <w:spacing w:line="360" w:lineRule="auto"/>
+      </w:pPr>
       <w:r>
         <w:t xml:space="preserve">The output was passed to the </w:t>
       </w:r>
@@ -11177,10 +11215,14 @@
           <w:b/>
           <w:bCs/>
         </w:rPr>
+        <w:lastRenderedPageBreak/>
         <w:t xml:space="preserve">Error-rate calculation </w:t>
       </w:r>
     </w:p>
     <w:p>
+      <w:pPr>
+        <w:spacing w:line="360" w:lineRule="auto"/>
+      </w:pPr>
       <w:r>
         <w:t>The</w:t>
       </w:r>
@@ -11251,6 +11293,7 @@
     </w:p>
     <w:p>
       <w:pPr>
+        <w:spacing w:line="360" w:lineRule="auto"/>
         <w:rPr>
           <w:rFonts w:eastAsiaTheme="majorEastAsia" w:cstheme="majorBidi"/>
           <w:color w:val="0F4761" w:themeColor="accent1" w:themeShade="BF"/>
@@ -11259,7 +11302,6 @@
         </w:rPr>
       </w:pPr>
       <w:r>
-        <w:lastRenderedPageBreak/>
         <w:t xml:space="preserve">The logic correctly classified output that had either WER or CER percentage scores below their respective thresholds </w:t>
       </w:r>
       <w:r>
@@ -11753,7 +11795,7 @@
         <w:t xml:space="preserve"> the language. Setting the beam size to </w:t>
       </w:r>
       <w:r>
-        <w:t>5</w:t>
+        <w:t>2</w:t>
       </w:r>
       <w:r>
         <w:t xml:space="preserve"> </w:t>
@@ -11984,26 +12026,230 @@
     </w:p>
     <w:p/>
     <w:p>
-      <w:r>
-        <w:t xml:space="preserve">This is where your </w:t>
+      <w:pPr>
+        <w:spacing w:line="360" w:lineRule="auto"/>
+        <w:rPr>
+          <w:b/>
+          <w:bCs/>
+        </w:rPr>
+      </w:pPr>
+      <w:r>
+        <w:rPr>
+          <w:b/>
+          <w:bCs/>
+        </w:rPr>
+        <w:t>Dataset Preparation</w:t>
+      </w:r>
+    </w:p>
+    <w:p>
+      <w:pPr>
+        <w:spacing w:line="360" w:lineRule="auto"/>
+      </w:pPr>
+      <w:r>
+        <w:t xml:space="preserve">The ASAP Prompt 1 </w:t>
+      </w:r>
+      <w:proofErr w:type="gramStart"/>
+      <w:r>
+        <w:t>essays</w:t>
+      </w:r>
+      <w:proofErr w:type="gramEnd"/>
+      <w:r>
+        <w:t xml:space="preserve"> and their corresponding trait scores were combined to produce the dataset used for fine-tuning DeBERTa-v3-base. Each record contained the essay identifier, essay text, and scores for the five traits: Content, Organization, Word Choice, Sentence Fluency and Conventions. The dataset was cleaned and divided into training, validation and test subsets using scikit-</w:t>
       </w:r>
       <w:proofErr w:type="spellStart"/>
       <w:r>
-        <w:t>DeBERTa</w:t>
+        <w:t>learn's</w:t>
       </w:r>
       <w:proofErr w:type="spellEnd"/>
       <w:r>
         <w:t xml:space="preserve"> </w:t>
       </w:r>
-      <w:r>
-        <w:t>implementation</w:t>
-      </w:r>
-      <w:r>
-        <w:t xml:space="preserve"> belongs.</w:t>
-      </w:r>
-    </w:p>
-    <w:p>
-      <w:r>
+      <w:proofErr w:type="spellStart"/>
+      <w:r>
+        <w:t>train_test_</w:t>
+      </w:r>
+      <w:proofErr w:type="gramStart"/>
+      <w:r>
+        <w:t>split</w:t>
+      </w:r>
+      <w:proofErr w:type="spellEnd"/>
+      <w:r>
+        <w:t>(</w:t>
+      </w:r>
+      <w:proofErr w:type="gramEnd"/>
+      <w:r>
+        <w:t>) function, with a fixed random seed to ensure reproducibility. The resulting split allocated 80% of the data for training, with the remaining data divided between validation and testing.</w:t>
+      </w:r>
+    </w:p>
+    <w:p>
+      <w:pPr>
+        <w:spacing w:line="360" w:lineRule="auto"/>
+      </w:pPr>
+      <w:r>
+        <w:t>The essay text was separated from the trait scores so that the former could be provided as model input and the latter used as regression targets.</w:t>
+      </w:r>
+    </w:p>
+    <w:p>
+      <w:pPr>
+        <w:spacing w:line="360" w:lineRule="auto"/>
+        <w:rPr>
+          <w:b/>
+          <w:bCs/>
+        </w:rPr>
+      </w:pPr>
+      <w:r>
+        <w:rPr>
+          <w:b/>
+          <w:bCs/>
+        </w:rPr>
+        <w:t>Essay Tokenization</w:t>
+      </w:r>
+    </w:p>
+    <w:p>
+      <w:pPr>
+        <w:spacing w:line="360" w:lineRule="auto"/>
+      </w:pPr>
+      <w:r>
+        <w:t xml:space="preserve">Essays were tokenized using the Hugging Face Transformers </w:t>
+      </w:r>
+      <w:proofErr w:type="spellStart"/>
+      <w:r>
+        <w:t>AutoTokenizer</w:t>
+      </w:r>
+      <w:proofErr w:type="spellEnd"/>
+      <w:r>
+        <w:t>. The maximum sequence length was increased from 512 to 768 tokens following an analysis of the tokenized training data. At this length, only 38 essays (2.66%) exceeded the maximum sequence length. The increase therefore reduced the proportion of essays subject to truncation while remaining computationally feasible on the available hardware.</w:t>
+      </w:r>
+    </w:p>
+    <w:p>
+      <w:pPr>
+        <w:spacing w:line="360" w:lineRule="auto"/>
+        <w:rPr>
+          <w:b/>
+          <w:bCs/>
+        </w:rPr>
+      </w:pPr>
+      <w:r>
+        <w:rPr>
+          <w:b/>
+          <w:bCs/>
+        </w:rPr>
+        <w:t>Model Configuration and Training</w:t>
+      </w:r>
+    </w:p>
+    <w:p>
+      <w:pPr>
+        <w:spacing w:line="360" w:lineRule="auto"/>
+      </w:pPr>
+      <w:r>
+        <w:t xml:space="preserve">Microsoft DeBERTa-v3-base was configured for multi-output regression with five output labels corresponding to the five ASAP++ trait scores. A custom </w:t>
+      </w:r>
+      <w:proofErr w:type="spellStart"/>
+      <w:r>
+        <w:t>PyTorch</w:t>
+      </w:r>
+      <w:proofErr w:type="spellEnd"/>
+      <w:r>
+        <w:t xml:space="preserve"> dataset was used to associate the tokenized essays with their numerical trait labels, while data loaders provided batches of training and evaluation data.</w:t>
+      </w:r>
+    </w:p>
+    <w:p>
+      <w:pPr>
+        <w:spacing w:line="360" w:lineRule="auto"/>
+      </w:pPr>
+      <w:r>
+        <w:t xml:space="preserve">The model was fine-tuned using the Hugging Face Transformers Trainer framework. Training was configured for three epochs with a weight decay of 0.01. Checkpoints were saved during training, and </w:t>
+      </w:r>
+      <w:proofErr w:type="spellStart"/>
+      <w:r>
+        <w:t>load_best_model_at_end</w:t>
+      </w:r>
+      <w:proofErr w:type="spellEnd"/>
+      <w:r>
+        <w:t xml:space="preserve"> was enabled so that the model checkpoint selected for subsequent evaluation was the best-performing checkpoint </w:t>
+      </w:r>
+      <w:r>
+        <w:lastRenderedPageBreak/>
+        <w:t>rather than necessarily the final training state. The training data were shuffled between epochs, while validation and test data were kept in a fixed order.</w:t>
+      </w:r>
+    </w:p>
+    <w:p>
+      <w:pPr>
+        <w:spacing w:line="360" w:lineRule="auto"/>
+        <w:rPr>
+          <w:b/>
+          <w:bCs/>
+        </w:rPr>
+      </w:pPr>
+      <w:r>
+        <w:rPr>
+          <w:b/>
+          <w:bCs/>
+        </w:rPr>
+        <w:t>Quadratic Weighted Kappa</w:t>
+      </w:r>
+    </w:p>
+    <w:p>
+      <w:pPr>
+        <w:spacing w:line="360" w:lineRule="auto"/>
+      </w:pPr>
+      <w:r>
+        <w:t xml:space="preserve">Model performance was evaluated using Quadratic Weighted Kappa (QWK), the primary evaluation metric for the AES system. A custom </w:t>
+      </w:r>
+      <w:proofErr w:type="spellStart"/>
+      <w:r>
+        <w:t>calculate_</w:t>
+      </w:r>
+      <w:proofErr w:type="gramStart"/>
+      <w:r>
+        <w:t>qwk</w:t>
+      </w:r>
+      <w:proofErr w:type="spellEnd"/>
+      <w:r>
+        <w:t>(</w:t>
+      </w:r>
+      <w:proofErr w:type="gramEnd"/>
+      <w:r>
+        <w:t>) function calculated QWK independently for each of the five traits using scikit-</w:t>
+      </w:r>
+      <w:proofErr w:type="spellStart"/>
+      <w:r>
+        <w:t>learn's</w:t>
+      </w:r>
+      <w:proofErr w:type="spellEnd"/>
+      <w:r>
+        <w:t xml:space="preserve"> </w:t>
+      </w:r>
+      <w:proofErr w:type="spellStart"/>
+      <w:r>
+        <w:t>cohen_kappa_</w:t>
+      </w:r>
+      <w:proofErr w:type="gramStart"/>
+      <w:r>
+        <w:t>score</w:t>
+      </w:r>
+      <w:proofErr w:type="spellEnd"/>
+      <w:r>
+        <w:t>(</w:t>
+      </w:r>
+      <w:proofErr w:type="gramEnd"/>
+      <w:r>
+        <w:t>). The resulting trait-level QWK values were also averaged to provide a mean QWK for overall model evaluation.</w:t>
+      </w:r>
+    </w:p>
+    <w:p>
+      <w:pPr>
+        <w:spacing w:line="360" w:lineRule="auto"/>
+      </w:pPr>
+    </w:p>
+    <w:p>
+      <w:r>
+        <w:br w:type="page"/>
+      </w:r>
+    </w:p>
+    <w:p>
+      <w:r>
+        <w:lastRenderedPageBreak/>
         <w:t>Explain:</w:t>
       </w:r>
     </w:p>
@@ -12101,12 +12347,18 @@
       </w:r>
     </w:p>
     <w:p>
-      <w:r>
-        <w:rPr>
-          <w:b/>
-          <w:bCs/>
-        </w:rPr>
-        <w:t>Your final report should describe the final implementation, not the implementation you originally intended to build.</w:t>
+      <w:pPr>
+        <w:rPr>
+          <w:color w:val="EE0000"/>
+        </w:rPr>
+      </w:pPr>
+      <w:r>
+        <w:rPr>
+          <w:b/>
+          <w:bCs/>
+          <w:color w:val="EE0000"/>
+        </w:rPr>
+        <w:t>final report should describe the final implementation, not the implementation you originally intended to build.</w:t>
       </w:r>
     </w:p>
     <w:p/>
@@ -12980,7 +13232,13 @@
       </w:r>
       <w:proofErr w:type="spellEnd"/>
       <w:r>
-        <w:t xml:space="preserve">, why initially </w:t>
+        <w:t>, w</w:t>
+      </w:r>
+      <w:r>
+        <w:t>ere</w:t>
+      </w:r>
+      <w:r>
+        <w:t xml:space="preserve"> initially </w:t>
       </w:r>
       <w:r>
         <w:t>selected heuristically</w:t>
@@ -18520,8 +18778,8 @@
       <w:tblGrid>
         <w:gridCol w:w="890"/>
         <w:gridCol w:w="2798"/>
-        <w:gridCol w:w="2832"/>
-        <w:gridCol w:w="2496"/>
+        <w:gridCol w:w="2831"/>
+        <w:gridCol w:w="2497"/>
       </w:tblGrid>
       <w:tr>
         <w:trPr>
@@ -18626,19 +18884,17 @@
               <w:cnfStyle w:val="000000100000" w:firstRow="0" w:lastRow="0" w:firstColumn="0" w:lastColumn="0" w:oddVBand="0" w:evenVBand="0" w:oddHBand="1" w:evenHBand="0" w:firstRowFirstColumn="0" w:firstRowLastColumn="0" w:lastRowFirstColumn="0" w:lastRowLastColumn="0"/>
             </w:pPr>
             <w:r>
-              <w:t xml:space="preserve">Dataset </w:t>
-            </w:r>
-            <w:proofErr w:type="spellStart"/>
-            <w:r>
-              <w:t>load</w:t>
+              <w:t>Dataset load</w:t>
             </w:r>
             <w:r>
               <w:t>ed</w:t>
             </w:r>
             <w:r>
+              <w:t xml:space="preserve"> </w:t>
+            </w:r>
+            <w:r>
               <w:t>successfully</w:t>
             </w:r>
-            <w:proofErr w:type="spellEnd"/>
           </w:p>
         </w:tc>
         <w:tc>
@@ -23037,2037 +23293,12 @@
     <w:p>
       <w:pPr>
         <w:rPr>
-          <w:rFonts w:asciiTheme="majorHAnsi" w:eastAsiaTheme="majorEastAsia" w:hAnsiTheme="majorHAnsi" w:cstheme="majorBidi"/>
-          <w:color w:val="0F4761" w:themeColor="accent1" w:themeShade="BF"/>
-          <w:sz w:val="32"/>
-          <w:szCs w:val="32"/>
-        </w:rPr>
-      </w:pPr>
-      <w:r>
-        <w:rPr>
-          <w:rFonts w:asciiTheme="majorHAnsi" w:eastAsiaTheme="majorEastAsia" w:hAnsiTheme="majorHAnsi" w:cstheme="majorBidi"/>
-          <w:color w:val="0F4761" w:themeColor="accent1" w:themeShade="BF"/>
-          <w:sz w:val="32"/>
-          <w:szCs w:val="32"/>
-        </w:rPr>
-        <w:br w:type="page"/>
-      </w:r>
-    </w:p>
-    <w:p>
-      <w:pPr>
-        <w:rPr>
           <w:rStyle w:val="Heading2Char"/>
         </w:rPr>
       </w:pPr>
     </w:p>
-    <w:p>
-      <w:pPr>
-        <w:rPr>
-          <w:rStyle w:val="Heading2Char"/>
-        </w:rPr>
-      </w:pPr>
-    </w:p>
-    <w:p>
-      <w:pPr>
-        <w:rPr>
-          <w:rStyle w:val="Heading2Char"/>
-        </w:rPr>
-      </w:pPr>
-    </w:p>
-    <w:p>
-      <w:pPr>
-        <w:rPr>
-          <w:rStyle w:val="Heading2Char"/>
-        </w:rPr>
-      </w:pPr>
-    </w:p>
-    <w:p>
-      <w:pPr>
-        <w:rPr>
-          <w:rStyle w:val="Heading2Char"/>
-        </w:rPr>
-      </w:pPr>
-    </w:p>
-    <w:p>
-      <w:pPr>
-        <w:rPr>
-          <w:rStyle w:val="Heading2Char"/>
-        </w:rPr>
-      </w:pPr>
-    </w:p>
-    <w:p>
-      <w:pPr>
-        <w:rPr>
-          <w:rStyle w:val="Heading2Char"/>
-        </w:rPr>
-      </w:pPr>
-    </w:p>
-    <w:p>
-      <w:pPr>
-        <w:rPr>
-          <w:rStyle w:val="Heading2Char"/>
-        </w:rPr>
-      </w:pPr>
-    </w:p>
-    <w:p>
-      <w:pPr>
-        <w:rPr>
-          <w:rStyle w:val="Heading2Char"/>
-        </w:rPr>
-      </w:pPr>
-    </w:p>
-    <w:p>
-      <w:pPr>
-        <w:rPr>
-          <w:rStyle w:val="Heading2Char"/>
-        </w:rPr>
-      </w:pPr>
-    </w:p>
-    <w:p>
-      <w:pPr>
-        <w:pStyle w:val="Heading1"/>
-        <w:jc w:val="center"/>
-        <w:rPr>
-          <w:rStyle w:val="Heading2Char"/>
-          <w:sz w:val="40"/>
-          <w:szCs w:val="40"/>
-        </w:rPr>
-      </w:pPr>
-      <w:bookmarkStart w:id="57" w:name="_Toc239628395"/>
-      <w:r>
-        <w:rPr>
-          <w:rStyle w:val="Heading2Char"/>
-          <w:sz w:val="40"/>
-          <w:szCs w:val="40"/>
-        </w:rPr>
-        <w:t xml:space="preserve">Appendix </w:t>
-      </w:r>
-      <w:r>
-        <w:rPr>
-          <w:rStyle w:val="Heading2Char"/>
-          <w:sz w:val="40"/>
-          <w:szCs w:val="40"/>
-        </w:rPr>
-        <w:t>B</w:t>
-      </w:r>
-      <w:r>
-        <w:rPr>
-          <w:rStyle w:val="Heading2Char"/>
-          <w:sz w:val="40"/>
-          <w:szCs w:val="40"/>
-        </w:rPr>
-        <w:t xml:space="preserve"> – Testing Documentation</w:t>
-      </w:r>
-      <w:bookmarkEnd w:id="57"/>
-    </w:p>
-    <w:p>
-      <w:pPr>
-        <w:pStyle w:val="Heading3"/>
-        <w:rPr>
-          <w:rStyle w:val="Heading2Char"/>
-        </w:rPr>
-      </w:pPr>
-    </w:p>
-    <w:p>
-      <w:pPr>
-        <w:rPr>
-          <w:rStyle w:val="Heading2Char"/>
-        </w:rPr>
-      </w:pPr>
-      <w:r>
-        <w:rPr>
-          <w:rStyle w:val="Heading2Char"/>
-        </w:rPr>
-        <w:br w:type="page"/>
-      </w:r>
-    </w:p>
-    <w:p>
-      <w:pPr>
-        <w:pStyle w:val="Heading3"/>
-      </w:pPr>
-      <w:bookmarkStart w:id="58" w:name="_Toc239628396"/>
-      <w:r>
-        <w:lastRenderedPageBreak/>
-        <w:t>B.1 Unit Testing</w:t>
-      </w:r>
-      <w:bookmarkEnd w:id="58"/>
-    </w:p>
-    <w:p/>
-    <w:p>
-      <w:pPr>
-        <w:pStyle w:val="ListParagraph"/>
-        <w:numPr>
-          <w:ilvl w:val="0"/>
-          <w:numId w:val="8"/>
-        </w:numPr>
-        <w:spacing w:line="360" w:lineRule="auto"/>
-        <w:rPr>
-          <w:b/>
-          <w:bCs/>
-        </w:rPr>
-      </w:pPr>
-      <w:r>
-        <w:rPr>
-          <w:b/>
-          <w:bCs/>
-        </w:rPr>
-        <w:t>Extract and display the reference essay – Essay 1 of Prompt 1</w:t>
-      </w:r>
-    </w:p>
-    <w:p>
-      <w:pPr>
-        <w:spacing w:line="360" w:lineRule="auto"/>
-      </w:pPr>
-    </w:p>
-    <w:p>
-      <w:pPr>
-        <w:spacing w:line="360" w:lineRule="auto"/>
-      </w:pPr>
-      <w:r>
-        <w:rPr>
-          <w:noProof/>
-        </w:rPr>
-        <w:drawing>
-          <wp:inline distT="0" distB="0" distL="0" distR="0" wp14:anchorId="5B44AC91" wp14:editId="749D2844">
-            <wp:extent cx="4829849" cy="1143160"/>
-            <wp:effectExtent l="0" t="0" r="0" b="0"/>
-            <wp:docPr id="1021535383" name="Picture 1"/>
-            <wp:cNvGraphicFramePr>
-              <a:graphicFrameLocks xmlns:a="http://schemas.openxmlformats.org/drawingml/2006/main" noChangeAspect="1"/>
-            </wp:cNvGraphicFramePr>
-            <a:graphic xmlns:a="http://schemas.openxmlformats.org/drawingml/2006/main">
-              <a:graphicData uri="http://schemas.openxmlformats.org/drawingml/2006/picture">
-                <pic:pic xmlns:pic="http://schemas.openxmlformats.org/drawingml/2006/picture">
-                  <pic:nvPicPr>
-                    <pic:cNvPr id="1021535383" name=""/>
-                    <pic:cNvPicPr/>
-                  </pic:nvPicPr>
-                  <pic:blipFill>
-                    <a:blip r:embed="rId27"/>
-                    <a:stretch>
-                      <a:fillRect/>
-                    </a:stretch>
-                  </pic:blipFill>
-                  <pic:spPr>
-                    <a:xfrm>
-                      <a:off x="0" y="0"/>
-                      <a:ext cx="4829849" cy="1143160"/>
-                    </a:xfrm>
-                    <a:prstGeom prst="rect">
-                      <a:avLst/>
-                    </a:prstGeom>
-                  </pic:spPr>
-                </pic:pic>
-              </a:graphicData>
-            </a:graphic>
-          </wp:inline>
-        </w:drawing>
-      </w:r>
-    </w:p>
-    <w:p>
-      <w:pPr>
-        <w:pStyle w:val="ListParagraph"/>
-        <w:numPr>
-          <w:ilvl w:val="0"/>
-          <w:numId w:val="8"/>
-        </w:numPr>
-        <w:spacing w:line="360" w:lineRule="auto"/>
-        <w:rPr>
-          <w:b/>
-          <w:bCs/>
-        </w:rPr>
-      </w:pPr>
-      <w:r>
-        <w:rPr>
-          <w:b/>
-          <w:bCs/>
-        </w:rPr>
-        <w:t xml:space="preserve">Calculate and display word and sentence count from </w:t>
-      </w:r>
-      <w:r>
-        <w:rPr>
-          <w:b/>
-          <w:bCs/>
-        </w:rPr>
-        <w:t>the reference essay</w:t>
-      </w:r>
-    </w:p>
-    <w:p>
-      <w:pPr>
-        <w:spacing w:line="360" w:lineRule="auto"/>
-      </w:pPr>
-    </w:p>
-    <w:p>
-      <w:pPr>
-        <w:spacing w:line="360" w:lineRule="auto"/>
-      </w:pPr>
-      <w:r>
-        <w:rPr>
-          <w:noProof/>
-        </w:rPr>
-        <w:drawing>
-          <wp:inline distT="0" distB="0" distL="0" distR="0" wp14:anchorId="4C1EA0A1" wp14:editId="4E0517EE">
-            <wp:extent cx="3753374" cy="809738"/>
-            <wp:effectExtent l="0" t="0" r="0" b="9525"/>
-            <wp:docPr id="1708367262" name="Picture 1"/>
-            <wp:cNvGraphicFramePr>
-              <a:graphicFrameLocks xmlns:a="http://schemas.openxmlformats.org/drawingml/2006/main" noChangeAspect="1"/>
-            </wp:cNvGraphicFramePr>
-            <a:graphic xmlns:a="http://schemas.openxmlformats.org/drawingml/2006/main">
-              <a:graphicData uri="http://schemas.openxmlformats.org/drawingml/2006/picture">
-                <pic:pic xmlns:pic="http://schemas.openxmlformats.org/drawingml/2006/picture">
-                  <pic:nvPicPr>
-                    <pic:cNvPr id="1708367262" name=""/>
-                    <pic:cNvPicPr/>
-                  </pic:nvPicPr>
-                  <pic:blipFill>
-                    <a:blip r:embed="rId28"/>
-                    <a:stretch>
-                      <a:fillRect/>
-                    </a:stretch>
-                  </pic:blipFill>
-                  <pic:spPr>
-                    <a:xfrm>
-                      <a:off x="0" y="0"/>
-                      <a:ext cx="3753374" cy="809738"/>
-                    </a:xfrm>
-                    <a:prstGeom prst="rect">
-                      <a:avLst/>
-                    </a:prstGeom>
-                  </pic:spPr>
-                </pic:pic>
-              </a:graphicData>
-            </a:graphic>
-          </wp:inline>
-        </w:drawing>
-      </w:r>
-    </w:p>
-    <w:p>
-      <w:pPr>
-        <w:spacing w:line="360" w:lineRule="auto"/>
-      </w:pPr>
-      <w:r>
-        <w:t>The natural language tool kit was used to tokenise sentences and words to provide a count that will later be used as a point of reference in determining the accuracy of the OCR detection and ASR transcription processes.</w:t>
-      </w:r>
-    </w:p>
-    <w:p>
-      <w:pPr>
-        <w:spacing w:line="360" w:lineRule="auto"/>
-      </w:pPr>
-      <w:r>
-        <w:rPr>
-          <w:b/>
-          <w:bCs/>
-        </w:rPr>
-        <w:t>Purpose</w:t>
-      </w:r>
-      <w:r>
-        <w:t xml:space="preserve">: Although these features will not contribute to the scoring of the essay by the transformer, they serve to satisfy the requirements for the system to be interpretable and explainable to human scorers. </w:t>
-      </w:r>
-    </w:p>
-    <w:p>
-      <w:pPr>
-        <w:spacing w:line="360" w:lineRule="auto"/>
-        <w:rPr>
-          <w:b/>
-          <w:bCs/>
-        </w:rPr>
-      </w:pPr>
-    </w:p>
-    <w:p>
-      <w:pPr>
-        <w:pStyle w:val="ListParagraph"/>
-        <w:numPr>
-          <w:ilvl w:val="0"/>
-          <w:numId w:val="8"/>
-        </w:numPr>
-        <w:spacing w:line="360" w:lineRule="auto"/>
-        <w:rPr>
-          <w:b/>
-          <w:bCs/>
-        </w:rPr>
-      </w:pPr>
-      <w:r>
-        <w:rPr>
-          <w:b/>
-          <w:bCs/>
-        </w:rPr>
-        <w:t>Calculate and display</w:t>
-      </w:r>
-      <w:r>
-        <w:rPr>
-          <w:b/>
-          <w:bCs/>
-        </w:rPr>
-        <w:t xml:space="preserve"> the</w:t>
-      </w:r>
-      <w:r>
-        <w:rPr>
-          <w:b/>
-          <w:bCs/>
-        </w:rPr>
-        <w:t xml:space="preserve"> word and </w:t>
-      </w:r>
-      <w:r>
-        <w:rPr>
-          <w:b/>
-          <w:bCs/>
-        </w:rPr>
-        <w:t>sentence error rates</w:t>
-      </w:r>
-    </w:p>
-    <w:p>
-      <w:pPr>
-        <w:spacing w:line="360" w:lineRule="auto"/>
-      </w:pPr>
-    </w:p>
-    <w:p>
-      <w:pPr>
-        <w:spacing w:line="360" w:lineRule="auto"/>
-      </w:pPr>
-      <w:r>
-        <w:t>A copy of the reference essay was deliberately modified by appending the digit “5” to the first three and last three words of the first and last sentences. The ‘</w:t>
-      </w:r>
-      <w:proofErr w:type="spellStart"/>
-      <w:r>
-        <w:t>wer</w:t>
-      </w:r>
-      <w:proofErr w:type="spellEnd"/>
-      <w:r>
-        <w:t>’ and ‘</w:t>
-      </w:r>
-      <w:proofErr w:type="spellStart"/>
-      <w:r>
-        <w:t>cer</w:t>
-      </w:r>
-      <w:proofErr w:type="spellEnd"/>
-      <w:r>
-        <w:t xml:space="preserve">’ methods from the </w:t>
-      </w:r>
-      <w:proofErr w:type="spellStart"/>
-      <w:r>
-        <w:rPr>
-          <w:b/>
-          <w:bCs/>
-        </w:rPr>
-        <w:t>jiwer</w:t>
-      </w:r>
-      <w:proofErr w:type="spellEnd"/>
-      <w:r>
-        <w:t xml:space="preserve"> module were then used to calculate the word and character error rates.  </w:t>
-      </w:r>
-    </w:p>
-    <w:p>
-      <w:pPr>
-        <w:spacing w:line="360" w:lineRule="auto"/>
-      </w:pPr>
-      <w:r>
-        <w:rPr>
-          <w:b/>
-          <w:bCs/>
-        </w:rPr>
-        <w:lastRenderedPageBreak/>
-        <w:t>Purpose</w:t>
-      </w:r>
-      <w:r>
-        <w:t xml:space="preserve">: This was designed to test the accuracy of the </w:t>
-      </w:r>
-      <w:proofErr w:type="spellStart"/>
-      <w:r>
-        <w:t>calculate_error_</w:t>
-      </w:r>
-      <w:proofErr w:type="gramStart"/>
-      <w:r>
-        <w:t>rates</w:t>
-      </w:r>
-      <w:proofErr w:type="spellEnd"/>
-      <w:r>
-        <w:t>(</w:t>
-      </w:r>
-      <w:proofErr w:type="gramEnd"/>
-      <w:r>
-        <w:t xml:space="preserve">) function, prior to the implementation of the OCR and ASR components. These metrics are essential to the operation of the evaluator functions in determining what output is fed to the transformer for further processing or returned to the human scorer for manual scoring.  </w:t>
-      </w:r>
-    </w:p>
-    <w:p>
-      <w:pPr>
-        <w:pStyle w:val="ListParagraph"/>
-        <w:numPr>
-          <w:ilvl w:val="0"/>
-          <w:numId w:val="8"/>
-        </w:numPr>
-        <w:spacing w:line="360" w:lineRule="auto"/>
-        <w:rPr>
-          <w:b/>
-          <w:bCs/>
-        </w:rPr>
-      </w:pPr>
-      <w:r>
-        <w:rPr>
-          <w:b/>
-          <w:bCs/>
-        </w:rPr>
-        <w:t>Normalize the reference essay</w:t>
-      </w:r>
-    </w:p>
-    <w:p>
-      <w:pPr>
-        <w:spacing w:line="360" w:lineRule="auto"/>
-      </w:pPr>
-      <w:r>
-        <w:t xml:space="preserve">For efficiency, scalability and modularity, a </w:t>
-      </w:r>
-      <w:proofErr w:type="gramStart"/>
-      <w:r>
-        <w:t>class based</w:t>
-      </w:r>
-      <w:proofErr w:type="gramEnd"/>
-      <w:r>
-        <w:t xml:space="preserve"> approach – the </w:t>
-      </w:r>
-      <w:proofErr w:type="spellStart"/>
-      <w:r>
-        <w:t>EssayEditor</w:t>
-      </w:r>
-      <w:proofErr w:type="spellEnd"/>
-      <w:r>
-        <w:t xml:space="preserve"> class, was used to encapsulate the functions that will be applied to an essay to normalise it. </w:t>
-      </w:r>
-    </w:p>
-    <w:p>
-      <w:pPr>
-        <w:spacing w:line="360" w:lineRule="auto"/>
-      </w:pPr>
-      <w:r>
-        <w:rPr>
-          <w:noProof/>
-        </w:rPr>
-        <w:drawing>
-          <wp:inline distT="0" distB="0" distL="0" distR="0" wp14:anchorId="3473DE54" wp14:editId="5C250053">
-            <wp:extent cx="5020376" cy="2600688"/>
-            <wp:effectExtent l="0" t="0" r="8890" b="9525"/>
-            <wp:docPr id="638147064" name="Picture 1"/>
-            <wp:cNvGraphicFramePr>
-              <a:graphicFrameLocks xmlns:a="http://schemas.openxmlformats.org/drawingml/2006/main" noChangeAspect="1"/>
-            </wp:cNvGraphicFramePr>
-            <a:graphic xmlns:a="http://schemas.openxmlformats.org/drawingml/2006/main">
-              <a:graphicData uri="http://schemas.openxmlformats.org/drawingml/2006/picture">
-                <pic:pic xmlns:pic="http://schemas.openxmlformats.org/drawingml/2006/picture">
-                  <pic:nvPicPr>
-                    <pic:cNvPr id="638147064" name=""/>
-                    <pic:cNvPicPr/>
-                  </pic:nvPicPr>
-                  <pic:blipFill>
-                    <a:blip r:embed="rId29"/>
-                    <a:stretch>
-                      <a:fillRect/>
-                    </a:stretch>
-                  </pic:blipFill>
-                  <pic:spPr>
-                    <a:xfrm>
-                      <a:off x="0" y="0"/>
-                      <a:ext cx="5020376" cy="2600688"/>
-                    </a:xfrm>
-                    <a:prstGeom prst="rect">
-                      <a:avLst/>
-                    </a:prstGeom>
-                  </pic:spPr>
-                </pic:pic>
-              </a:graphicData>
-            </a:graphic>
-          </wp:inline>
-        </w:drawing>
-      </w:r>
-    </w:p>
-    <w:p>
-      <w:pPr>
-        <w:spacing w:line="360" w:lineRule="auto"/>
-      </w:pPr>
-      <w:r>
-        <w:t xml:space="preserve">The researcher chose to use class attributes instead of instance variables for the normalisation process to conserve memory – each object will have its own copy of instance variables as compared to one set per class, available to all objects. This means that the normalisation process scales well as the number of input essays grows.  </w:t>
-      </w:r>
-    </w:p>
-    <w:p>
-      <w:pPr>
-        <w:spacing w:line="360" w:lineRule="auto"/>
-      </w:pPr>
-      <w:r>
-        <w:t xml:space="preserve">Some members of the sample use the spoken form slash to represent ‘/’, while others use ‘or’. The </w:t>
-      </w:r>
-      <w:proofErr w:type="gramStart"/>
-      <w:r>
-        <w:t>normalise(</w:t>
-      </w:r>
-      <w:proofErr w:type="gramEnd"/>
-      <w:r>
-        <w:t xml:space="preserve">) method of the </w:t>
-      </w:r>
-      <w:proofErr w:type="spellStart"/>
-      <w:r>
-        <w:t>EssayEditor</w:t>
-      </w:r>
-      <w:proofErr w:type="spellEnd"/>
-      <w:r>
-        <w:t xml:space="preserve"> class, substitutes these symbols with their spoken forms. This is to ensure that when applied to spoken essays from different speakers, the output is consistent after normalisation, making calculation of the CER and WER more accurate.</w:t>
-      </w:r>
-    </w:p>
-    <w:p>
-      <w:pPr>
-        <w:spacing w:line="360" w:lineRule="auto"/>
-      </w:pPr>
-      <w:r>
-        <w:rPr>
-          <w:noProof/>
-        </w:rPr>
-        <w:lastRenderedPageBreak/>
-        <w:drawing>
-          <wp:inline distT="0" distB="0" distL="0" distR="0" wp14:anchorId="128A58C1" wp14:editId="607BAD77">
-            <wp:extent cx="4544059" cy="1571844"/>
-            <wp:effectExtent l="0" t="0" r="9525" b="9525"/>
-            <wp:docPr id="299450725" name="Picture 1"/>
-            <wp:cNvGraphicFramePr>
-              <a:graphicFrameLocks xmlns:a="http://schemas.openxmlformats.org/drawingml/2006/main" noChangeAspect="1"/>
-            </wp:cNvGraphicFramePr>
-            <a:graphic xmlns:a="http://schemas.openxmlformats.org/drawingml/2006/main">
-              <a:graphicData uri="http://schemas.openxmlformats.org/drawingml/2006/picture">
-                <pic:pic xmlns:pic="http://schemas.openxmlformats.org/drawingml/2006/picture">
-                  <pic:nvPicPr>
-                    <pic:cNvPr id="299450725" name=""/>
-                    <pic:cNvPicPr/>
-                  </pic:nvPicPr>
-                  <pic:blipFill>
-                    <a:blip r:embed="rId30"/>
-                    <a:stretch>
-                      <a:fillRect/>
-                    </a:stretch>
-                  </pic:blipFill>
-                  <pic:spPr>
-                    <a:xfrm>
-                      <a:off x="0" y="0"/>
-                      <a:ext cx="4544059" cy="1571844"/>
-                    </a:xfrm>
-                    <a:prstGeom prst="rect">
-                      <a:avLst/>
-                    </a:prstGeom>
-                  </pic:spPr>
-                </pic:pic>
-              </a:graphicData>
-            </a:graphic>
-          </wp:inline>
-        </w:drawing>
-      </w:r>
-    </w:p>
-    <w:p>
-      <w:pPr>
-        <w:spacing w:line="360" w:lineRule="auto"/>
-      </w:pPr>
-      <w:r>
-        <w:t xml:space="preserve">The screenshot above shows the output from the </w:t>
-      </w:r>
-      <w:proofErr w:type="spellStart"/>
-      <w:r>
-        <w:t>EssayEditor</w:t>
-      </w:r>
-      <w:proofErr w:type="spellEnd"/>
-      <w:r>
-        <w:t xml:space="preserve"> object after its text – the reference essay, has been normalised. The object also prints confirmation of all successfully executed operations – when its </w:t>
-      </w:r>
-      <w:proofErr w:type="spellStart"/>
-      <w:r>
-        <w:t>show_edit_</w:t>
-      </w:r>
-      <w:proofErr w:type="gramStart"/>
-      <w:r>
-        <w:t>log</w:t>
-      </w:r>
-      <w:proofErr w:type="spellEnd"/>
-      <w:r>
-        <w:t>(</w:t>
-      </w:r>
-      <w:proofErr w:type="gramEnd"/>
-      <w:r>
-        <w:t xml:space="preserve">) method is invoked. </w:t>
-      </w:r>
-    </w:p>
-    <w:p>
-      <w:pPr>
-        <w:spacing w:line="360" w:lineRule="auto"/>
-      </w:pPr>
-    </w:p>
-    <w:p>
-      <w:pPr>
-        <w:spacing w:line="360" w:lineRule="auto"/>
-        <w:rPr>
-          <w:b/>
-          <w:bCs/>
-        </w:rPr>
-      </w:pPr>
-      <w:r>
-        <w:rPr>
-          <w:b/>
-          <w:bCs/>
-        </w:rPr>
-        <w:br w:type="page"/>
-      </w:r>
-    </w:p>
-    <w:p>
-      <w:pPr>
-        <w:pStyle w:val="Heading3"/>
-      </w:pPr>
-      <w:bookmarkStart w:id="59" w:name="_Toc239628397"/>
-      <w:r>
-        <w:lastRenderedPageBreak/>
-        <w:t>B</w:t>
-      </w:r>
-      <w:r>
-        <w:t>.</w:t>
-      </w:r>
-      <w:r>
-        <w:t>2</w:t>
-      </w:r>
-      <w:r>
-        <w:t xml:space="preserve"> Component</w:t>
-      </w:r>
-      <w:r>
-        <w:t xml:space="preserve"> Testing</w:t>
-      </w:r>
-      <w:bookmarkEnd w:id="59"/>
-    </w:p>
-    <w:p>
-      <w:pPr>
-        <w:spacing w:line="360" w:lineRule="auto"/>
-      </w:pPr>
-    </w:p>
-    <w:p>
-      <w:pPr>
-        <w:pStyle w:val="ListParagraph"/>
-        <w:numPr>
-          <w:ilvl w:val="0"/>
-          <w:numId w:val="9"/>
-        </w:numPr>
-        <w:spacing w:line="360" w:lineRule="auto"/>
-      </w:pPr>
-      <w:r>
-        <w:rPr>
-          <w:b/>
-          <w:bCs/>
-        </w:rPr>
-        <w:t>OCR</w:t>
-      </w:r>
-      <w:r>
-        <w:t xml:space="preserve">:  </w:t>
-      </w:r>
-      <w:proofErr w:type="spellStart"/>
-      <w:r>
-        <w:t>paddleOCR</w:t>
-      </w:r>
-      <w:proofErr w:type="spellEnd"/>
-      <w:r>
-        <w:t xml:space="preserve"> </w:t>
-      </w:r>
-    </w:p>
-    <w:p>
-      <w:pPr>
-        <w:pStyle w:val="ListParagraph"/>
-        <w:numPr>
-          <w:ilvl w:val="0"/>
-          <w:numId w:val="6"/>
-        </w:numPr>
-        <w:spacing w:line="360" w:lineRule="auto"/>
-      </w:pPr>
-      <w:r>
-        <w:rPr>
-          <w:b/>
-          <w:bCs/>
-        </w:rPr>
-        <w:t>Recognition model</w:t>
-      </w:r>
-      <w:r>
-        <w:t xml:space="preserve">: </w:t>
-      </w:r>
-      <w:r>
-        <w:t>PP-OCRv6_medium_det</w:t>
-      </w:r>
-    </w:p>
-    <w:p>
-      <w:pPr>
-        <w:pStyle w:val="ListParagraph"/>
-        <w:numPr>
-          <w:ilvl w:val="0"/>
-          <w:numId w:val="6"/>
-        </w:numPr>
-        <w:spacing w:line="360" w:lineRule="auto"/>
-      </w:pPr>
-      <w:r>
-        <w:rPr>
-          <w:b/>
-          <w:bCs/>
-        </w:rPr>
-        <w:t>Detection model</w:t>
-      </w:r>
-      <w:r>
-        <w:t xml:space="preserve">: </w:t>
-      </w:r>
-      <w:r>
-        <w:t>PP-OCRv6_medium_</w:t>
-      </w:r>
-      <w:r>
-        <w:t>rec</w:t>
-      </w:r>
-    </w:p>
-    <w:p>
-      <w:pPr>
-        <w:pStyle w:val="ListParagraph"/>
-        <w:spacing w:line="360" w:lineRule="auto"/>
-        <w:ind w:left="1440"/>
-      </w:pPr>
-    </w:p>
-    <w:p>
-      <w:pPr>
-        <w:pStyle w:val="ListParagraph"/>
-        <w:numPr>
-          <w:ilvl w:val="0"/>
-          <w:numId w:val="9"/>
-        </w:numPr>
-        <w:tabs>
-          <w:tab w:val="left" w:pos="1965"/>
-        </w:tabs>
-        <w:spacing w:line="360" w:lineRule="auto"/>
-      </w:pPr>
-      <w:r>
-        <w:rPr>
-          <w:b/>
-          <w:bCs/>
-        </w:rPr>
-        <w:t>ASR</w:t>
-      </w:r>
-      <w:r>
-        <w:t xml:space="preserve">: </w:t>
-      </w:r>
-      <w:proofErr w:type="spellStart"/>
-      <w:r>
-        <w:t>OpenAi</w:t>
-      </w:r>
-      <w:proofErr w:type="spellEnd"/>
-      <w:r>
-        <w:t xml:space="preserve"> Whisper </w:t>
-      </w:r>
-    </w:p>
-    <w:p>
-      <w:pPr>
-        <w:pStyle w:val="ListParagraph"/>
-        <w:numPr>
-          <w:ilvl w:val="0"/>
-          <w:numId w:val="7"/>
-        </w:numPr>
-        <w:tabs>
-          <w:tab w:val="left" w:pos="1965"/>
-        </w:tabs>
-        <w:spacing w:line="360" w:lineRule="auto"/>
-      </w:pPr>
-      <w:r>
-        <w:rPr>
-          <w:b/>
-          <w:bCs/>
-        </w:rPr>
-        <w:t>Model</w:t>
-      </w:r>
-      <w:r>
-        <w:rPr>
-          <w:b/>
-          <w:bCs/>
-        </w:rPr>
-        <w:t>s</w:t>
-      </w:r>
-      <w:r>
-        <w:t>: faster-</w:t>
-      </w:r>
-      <w:r>
-        <w:t>whisper-</w:t>
-      </w:r>
-      <w:r>
-        <w:t>base, faster-whisper-small, faster-whisper-medium</w:t>
-      </w:r>
-    </w:p>
-    <w:p>
-      <w:pPr>
-        <w:spacing w:line="360" w:lineRule="auto"/>
-        <w:rPr>
-          <w:b/>
-          <w:bCs/>
-        </w:rPr>
-      </w:pPr>
-      <w:r>
-        <w:rPr>
-          <w:b/>
-          <w:bCs/>
-        </w:rPr>
-        <w:t xml:space="preserve">Test </w:t>
-      </w:r>
-      <w:r>
-        <w:rPr>
-          <w:b/>
-          <w:bCs/>
-        </w:rPr>
-        <w:t>Objectives:</w:t>
-      </w:r>
-    </w:p>
-    <w:p>
-      <w:pPr>
-        <w:pStyle w:val="ListParagraph"/>
-        <w:numPr>
-          <w:ilvl w:val="0"/>
-          <w:numId w:val="7"/>
-        </w:numPr>
-        <w:spacing w:line="360" w:lineRule="auto"/>
-      </w:pPr>
-      <w:r>
-        <w:t xml:space="preserve">Obtain the best performing model with respect to inference time, and storage footprint </w:t>
-      </w:r>
-      <w:proofErr w:type="gramStart"/>
-      <w:r>
-        <w:t>and  transcription</w:t>
-      </w:r>
-      <w:proofErr w:type="gramEnd"/>
-      <w:r>
-        <w:t xml:space="preserve"> accuracy</w:t>
-      </w:r>
-    </w:p>
-    <w:p>
-      <w:pPr>
-        <w:pStyle w:val="ListParagraph"/>
-        <w:numPr>
-          <w:ilvl w:val="0"/>
-          <w:numId w:val="7"/>
-        </w:numPr>
-        <w:spacing w:line="360" w:lineRule="auto"/>
-      </w:pPr>
-      <w:r>
-        <w:t xml:space="preserve">Determine if whisper’s transcriptions are acceptable to support its inclusion in the AES pipeline </w:t>
-      </w:r>
-    </w:p>
-    <w:p>
-      <w:pPr>
-        <w:tabs>
-          <w:tab w:val="left" w:pos="1965"/>
-        </w:tabs>
-        <w:spacing w:line="360" w:lineRule="auto"/>
-      </w:pPr>
-    </w:p>
-    <w:p>
-      <w:pPr>
-        <w:tabs>
-          <w:tab w:val="left" w:pos="1965"/>
-        </w:tabs>
-        <w:spacing w:line="360" w:lineRule="auto"/>
-      </w:pPr>
-      <w:r>
-        <w:t>Selecting the best model along with the optimum parameter configuration. A list of six, 2-tuples – (</w:t>
-      </w:r>
-      <w:r>
-        <w:rPr>
-          <w:b/>
-          <w:bCs/>
-        </w:rPr>
-        <w:t xml:space="preserve">model size, </w:t>
-      </w:r>
-      <w:proofErr w:type="spellStart"/>
-      <w:r>
-        <w:rPr>
-          <w:b/>
-          <w:bCs/>
-        </w:rPr>
-        <w:t>compute_type</w:t>
-      </w:r>
-      <w:proofErr w:type="spellEnd"/>
-      <w:r>
-        <w:t xml:space="preserve">) parameter configurations were used to select the best model for the system. </w:t>
-      </w:r>
-    </w:p>
-    <w:p>
-      <w:pPr>
-        <w:tabs>
-          <w:tab w:val="left" w:pos="1965"/>
-        </w:tabs>
-        <w:spacing w:line="360" w:lineRule="auto"/>
-      </w:pPr>
-      <w:r>
-        <w:rPr>
-          <w:noProof/>
-        </w:rPr>
-        <w:drawing>
-          <wp:inline distT="0" distB="0" distL="0" distR="0" wp14:anchorId="03BAA7C5" wp14:editId="2AC2D582">
-            <wp:extent cx="3734321" cy="1600423"/>
-            <wp:effectExtent l="0" t="0" r="0" b="0"/>
-            <wp:docPr id="62984566" name="Picture 1"/>
-            <wp:cNvGraphicFramePr>
-              <a:graphicFrameLocks xmlns:a="http://schemas.openxmlformats.org/drawingml/2006/main" noChangeAspect="1"/>
-            </wp:cNvGraphicFramePr>
-            <a:graphic xmlns:a="http://schemas.openxmlformats.org/drawingml/2006/main">
-              <a:graphicData uri="http://schemas.openxmlformats.org/drawingml/2006/picture">
-                <pic:pic xmlns:pic="http://schemas.openxmlformats.org/drawingml/2006/picture">
-                  <pic:nvPicPr>
-                    <pic:cNvPr id="62984566" name=""/>
-                    <pic:cNvPicPr/>
-                  </pic:nvPicPr>
-                  <pic:blipFill>
-                    <a:blip r:embed="rId18"/>
-                    <a:stretch>
-                      <a:fillRect/>
-                    </a:stretch>
-                  </pic:blipFill>
-                  <pic:spPr>
-                    <a:xfrm>
-                      <a:off x="0" y="0"/>
-                      <a:ext cx="3734321" cy="1600423"/>
-                    </a:xfrm>
-                    <a:prstGeom prst="rect">
-                      <a:avLst/>
-                    </a:prstGeom>
-                  </pic:spPr>
-                </pic:pic>
-              </a:graphicData>
-            </a:graphic>
-          </wp:inline>
-        </w:drawing>
-      </w:r>
-    </w:p>
-    <w:p>
-      <w:pPr>
-        <w:tabs>
-          <w:tab w:val="left" w:pos="1965"/>
-        </w:tabs>
-        <w:spacing w:line="360" w:lineRule="auto"/>
-      </w:pPr>
-      <w:r>
-        <w:t xml:space="preserve">Thus, a total of 30 experiments – 5 per each </w:t>
-      </w:r>
-      <w:r>
-        <w:rPr>
-          <w:b/>
-          <w:bCs/>
-        </w:rPr>
-        <w:t>model size</w:t>
-      </w:r>
-      <w:r>
-        <w:t xml:space="preserve">, </w:t>
-      </w:r>
-      <w:proofErr w:type="spellStart"/>
-      <w:r>
-        <w:rPr>
-          <w:b/>
-          <w:bCs/>
-        </w:rPr>
-        <w:t>compute_type</w:t>
-      </w:r>
-      <w:proofErr w:type="spellEnd"/>
-      <w:r>
-        <w:t xml:space="preserve"> pair, were carried out. For each pair, transcription was done using beam sizes from 1 to 5 respectively.  The results stored as a list of dictionaries are shown in the table below. </w:t>
-      </w:r>
-    </w:p>
-    <w:p>
-      <w:pPr>
-        <w:spacing w:line="360" w:lineRule="auto"/>
-        <w:rPr>
-          <w:b/>
-          <w:bCs/>
-        </w:rPr>
-      </w:pPr>
-      <w:r>
-        <w:rPr>
-          <w:b/>
-          <w:bCs/>
-          <w:noProof/>
-        </w:rPr>
-        <w:lastRenderedPageBreak/>
-        <w:drawing>
-          <wp:inline distT="0" distB="0" distL="0" distR="0" wp14:anchorId="0F85A4C3" wp14:editId="150E79BA">
-            <wp:extent cx="5681780" cy="1626781"/>
-            <wp:effectExtent l="0" t="0" r="0" b="0"/>
-            <wp:docPr id="898140625" name="Picture 1"/>
-            <wp:cNvGraphicFramePr>
-              <a:graphicFrameLocks xmlns:a="http://schemas.openxmlformats.org/drawingml/2006/main" noChangeAspect="1"/>
-            </wp:cNvGraphicFramePr>
-            <a:graphic xmlns:a="http://schemas.openxmlformats.org/drawingml/2006/main">
-              <a:graphicData uri="http://schemas.openxmlformats.org/drawingml/2006/picture">
-                <pic:pic xmlns:pic="http://schemas.openxmlformats.org/drawingml/2006/picture">
-                  <pic:nvPicPr>
-                    <pic:cNvPr id="898140625" name=""/>
-                    <pic:cNvPicPr/>
-                  </pic:nvPicPr>
-                  <pic:blipFill rotWithShape="1">
-                    <a:blip r:embed="rId31"/>
-                    <a:srcRect r="5389"/>
-                    <a:stretch>
-                      <a:fillRect/>
-                    </a:stretch>
-                  </pic:blipFill>
-                  <pic:spPr bwMode="auto">
-                    <a:xfrm>
-                      <a:off x="0" y="0"/>
-                      <a:ext cx="5687213" cy="1628337"/>
-                    </a:xfrm>
-                    <a:prstGeom prst="rect">
-                      <a:avLst/>
-                    </a:prstGeom>
-                    <a:ln>
-                      <a:noFill/>
-                    </a:ln>
-                    <a:extLst>
-                      <a:ext uri="{53640926-AAD7-44D8-BBD7-CCE9431645EC}">
-                        <a14:shadowObscured xmlns:a14="http://schemas.microsoft.com/office/drawing/2010/main"/>
-                      </a:ext>
-                    </a:extLst>
-                  </pic:spPr>
-                </pic:pic>
-              </a:graphicData>
-            </a:graphic>
-          </wp:inline>
-        </w:drawing>
-      </w:r>
-    </w:p>
-    <w:p>
-      <w:pPr>
-        <w:spacing w:line="360" w:lineRule="auto"/>
-      </w:pPr>
-      <w:r>
-        <w:t>Experiments 24 and 28 achieved the same transcription accuracy. However, they differed</w:t>
-      </w:r>
-      <w:r>
-        <w:t xml:space="preserve"> noticeably </w:t>
-      </w:r>
-      <w:r>
-        <w:t xml:space="preserve">in the time </w:t>
-      </w:r>
-      <w:r>
-        <w:t>the model took to load</w:t>
-      </w:r>
-      <w:r>
-        <w:t xml:space="preserve">. In experiment 24, mixed-precision quantization - int8_float16 was used, along with </w:t>
-      </w:r>
-      <w:r>
-        <w:t>the</w:t>
-      </w:r>
-      <w:r>
-        <w:t xml:space="preserve"> </w:t>
-      </w:r>
-      <w:proofErr w:type="spellStart"/>
-      <w:r>
-        <w:rPr>
-          <w:b/>
-          <w:bCs/>
-        </w:rPr>
-        <w:t>beamsize</w:t>
-      </w:r>
-      <w:proofErr w:type="spellEnd"/>
-      <w:r>
-        <w:rPr>
-          <w:b/>
-          <w:bCs/>
-        </w:rPr>
-        <w:t>=5</w:t>
-      </w:r>
-      <w:r>
-        <w:t xml:space="preserve">. This model took roughly </w:t>
-      </w:r>
-      <w:r>
-        <w:t>four (4)</w:t>
-      </w:r>
-      <w:r>
-        <w:t xml:space="preserve"> seconds to transcribe the audio. </w:t>
-      </w:r>
-    </w:p>
-    <w:p>
-      <w:pPr>
-        <w:spacing w:line="360" w:lineRule="auto"/>
-      </w:pPr>
-      <w:r>
-        <w:t xml:space="preserve">The model in experiment 28, with </w:t>
-      </w:r>
-      <w:r>
-        <w:rPr>
-          <w:b/>
-          <w:bCs/>
-        </w:rPr>
-        <w:t>beam size=4</w:t>
-      </w:r>
-      <w:r>
-        <w:t xml:space="preserve"> and </w:t>
-      </w:r>
-      <w:proofErr w:type="spellStart"/>
-      <w:r>
-        <w:rPr>
-          <w:b/>
-          <w:bCs/>
-        </w:rPr>
-        <w:t>compute_type</w:t>
-      </w:r>
-      <w:proofErr w:type="spellEnd"/>
-      <w:r>
-        <w:rPr>
-          <w:b/>
-          <w:bCs/>
-        </w:rPr>
-        <w:t>=</w:t>
-      </w:r>
-      <w:r>
-        <w:rPr>
-          <w:b/>
-          <w:bCs/>
-        </w:rPr>
-        <w:t>float16</w:t>
-      </w:r>
-      <w:r>
-        <w:t xml:space="preserve">, however, took about 50% less time to load but </w:t>
-      </w:r>
-      <w:r>
-        <w:t xml:space="preserve">was more than three times slower </w:t>
-      </w:r>
-      <w:r>
-        <w:t xml:space="preserve">than the model in experiment 24. </w:t>
-      </w:r>
-    </w:p>
-    <w:p>
-      <w:pPr>
-        <w:spacing w:line="360" w:lineRule="auto"/>
-      </w:pPr>
-      <w:r>
-        <w:t>(Questions requiring answers)</w:t>
-      </w:r>
-    </w:p>
-    <w:p>
-      <w:pPr>
-        <w:spacing w:line="360" w:lineRule="auto"/>
-        <w:rPr>
-          <w:color w:val="EE0000"/>
-        </w:rPr>
-      </w:pPr>
-      <w:r>
-        <w:rPr>
-          <w:color w:val="EE0000"/>
-        </w:rPr>
-        <w:t>Why was the VAD Filter set to True?</w:t>
-      </w:r>
-    </w:p>
-    <w:p>
-      <w:pPr>
-        <w:spacing w:line="360" w:lineRule="auto"/>
-        <w:rPr>
-          <w:color w:val="EE0000"/>
-        </w:rPr>
-      </w:pPr>
-      <w:r>
-        <w:rPr>
-          <w:color w:val="EE0000"/>
-        </w:rPr>
-        <w:t>Why was the beam size adjusted?</w:t>
-      </w:r>
-    </w:p>
-    <w:p>
-      <w:pPr>
-        <w:spacing w:line="360" w:lineRule="auto"/>
-        <w:rPr>
-          <w:color w:val="EE0000"/>
-        </w:rPr>
-      </w:pPr>
-      <w:r>
-        <w:rPr>
-          <w:color w:val="EE0000"/>
-        </w:rPr>
-        <w:t>Why were 16 threads alone used?</w:t>
-      </w:r>
-    </w:p>
-    <w:p>
-      <w:pPr>
-        <w:spacing w:line="360" w:lineRule="auto"/>
-        <w:rPr>
-          <w:color w:val="EE0000"/>
-        </w:rPr>
-      </w:pPr>
-      <w:r>
-        <w:rPr>
-          <w:color w:val="EE0000"/>
-        </w:rPr>
-        <w:t>Why was CUDA fixed?</w:t>
-      </w:r>
-    </w:p>
-    <w:p>
-      <w:pPr>
-        <w:spacing w:line="360" w:lineRule="auto"/>
-      </w:pPr>
-      <w:r>
-        <w:t xml:space="preserve">After </w:t>
-      </w:r>
-      <w:r>
-        <w:t>the optimum configuration was implemented</w:t>
-      </w:r>
-      <w:r>
-        <w:t xml:space="preserve">, </w:t>
-      </w:r>
-      <w:r>
-        <w:t xml:space="preserve">the </w:t>
-      </w:r>
-      <w:r>
-        <w:rPr>
-          <w:b/>
-          <w:bCs/>
-        </w:rPr>
-        <w:t>details</w:t>
-      </w:r>
-      <w:r>
-        <w:t xml:space="preserve"> dictionary was updated to include not only </w:t>
-      </w:r>
-      <w:r>
-        <w:t xml:space="preserve">each file’s properties e.g. length and size along with the WER and CER for the transcription </w:t>
-      </w:r>
-      <w:r>
-        <w:t xml:space="preserve">but also a “pass” or “fail” evaluation status. These values are assigned in relation to the WER and CER values exceeding the set threshold values of 0.099 and 0.059 respectively. These evaluation labels will be used later, to determine which transcriptions are forwarded to the transformer or human scorer for scoring. </w:t>
-      </w:r>
-    </w:p>
-    <w:p>
-      <w:pPr>
-        <w:spacing w:line="360" w:lineRule="auto"/>
-      </w:pPr>
-      <w:r>
-        <w:t xml:space="preserve">A </w:t>
-      </w:r>
-      <w:proofErr w:type="spellStart"/>
-      <w:r>
-        <w:rPr>
-          <w:b/>
-          <w:bCs/>
-        </w:rPr>
-        <w:t>batch</w:t>
-      </w:r>
-      <w:r>
-        <w:rPr>
-          <w:b/>
-          <w:bCs/>
-        </w:rPr>
-        <w:t>_transcription</w:t>
-      </w:r>
-      <w:proofErr w:type="spellEnd"/>
-      <w:r>
-        <w:t xml:space="preserve"> dict</w:t>
-      </w:r>
-      <w:r>
-        <w:t>ionary</w:t>
-      </w:r>
-      <w:r>
-        <w:t xml:space="preserve"> stores </w:t>
-      </w:r>
-      <w:r>
-        <w:t xml:space="preserve">all individual </w:t>
-      </w:r>
-      <w:r>
-        <w:t>transcription</w:t>
-      </w:r>
-      <w:r>
-        <w:t>-detail</w:t>
-      </w:r>
-      <w:r>
-        <w:t xml:space="preserve"> dictionaries </w:t>
-      </w:r>
-      <w:r>
-        <w:t xml:space="preserve">in a list </w:t>
-      </w:r>
-      <w:r>
-        <w:t>along with WER</w:t>
-      </w:r>
-      <w:r>
-        <w:t xml:space="preserve">, </w:t>
-      </w:r>
-      <w:r>
-        <w:t>CER</w:t>
-      </w:r>
-      <w:r>
-        <w:t xml:space="preserve"> and evaluation statistics for the batch.</w:t>
-      </w:r>
-    </w:p>
-    <w:p>
-      <w:pPr>
-        <w:spacing w:line="360" w:lineRule="auto"/>
-      </w:pPr>
-      <w:r>
-        <w:rPr>
-          <w:noProof/>
-        </w:rPr>
-        <w:lastRenderedPageBreak/>
-        <w:drawing>
-          <wp:inline distT="0" distB="0" distL="0" distR="0" wp14:anchorId="6760807A" wp14:editId="7C2DB317">
-            <wp:extent cx="2476846" cy="5372850"/>
-            <wp:effectExtent l="0" t="0" r="0" b="0"/>
-            <wp:docPr id="1083939629" name="Picture 1"/>
-            <wp:cNvGraphicFramePr>
-              <a:graphicFrameLocks xmlns:a="http://schemas.openxmlformats.org/drawingml/2006/main" noChangeAspect="1"/>
-            </wp:cNvGraphicFramePr>
-            <a:graphic xmlns:a="http://schemas.openxmlformats.org/drawingml/2006/main">
-              <a:graphicData uri="http://schemas.openxmlformats.org/drawingml/2006/picture">
-                <pic:pic xmlns:pic="http://schemas.openxmlformats.org/drawingml/2006/picture">
-                  <pic:nvPicPr>
-                    <pic:cNvPr id="1083939629" name=""/>
-                    <pic:cNvPicPr/>
-                  </pic:nvPicPr>
-                  <pic:blipFill>
-                    <a:blip r:embed="rId32"/>
-                    <a:stretch>
-                      <a:fillRect/>
-                    </a:stretch>
-                  </pic:blipFill>
-                  <pic:spPr>
-                    <a:xfrm>
-                      <a:off x="0" y="0"/>
-                      <a:ext cx="2476846" cy="5372850"/>
-                    </a:xfrm>
-                    <a:prstGeom prst="rect">
-                      <a:avLst/>
-                    </a:prstGeom>
-                  </pic:spPr>
-                </pic:pic>
-              </a:graphicData>
-            </a:graphic>
-          </wp:inline>
-        </w:drawing>
-      </w:r>
-    </w:p>
-    <w:p>
-      <w:pPr>
-        <w:spacing w:line="360" w:lineRule="auto"/>
-        <w:rPr>
-          <w:color w:val="EE0000"/>
-        </w:rPr>
-      </w:pPr>
-      <w:r>
-        <w:t>The rationale behind this design decision is to make possible the analysis of transcription statistics per individual transcription and per batch (e.g. a class of 25 students).</w:t>
-      </w:r>
-    </w:p>
-    <w:p>
-      <w:pPr>
-        <w:spacing w:line="360" w:lineRule="auto"/>
-      </w:pPr>
-      <w:r>
-        <w:t>Although the WER and CER per batch are stored in the</w:t>
-      </w:r>
-      <w:r>
-        <w:t xml:space="preserve"> </w:t>
-      </w:r>
-      <w:proofErr w:type="spellStart"/>
-      <w:r>
-        <w:rPr>
-          <w:b/>
-          <w:bCs/>
-        </w:rPr>
-        <w:t>batch</w:t>
-      </w:r>
-      <w:r>
-        <w:rPr>
-          <w:b/>
-          <w:bCs/>
-        </w:rPr>
-        <w:t>_transcription</w:t>
-      </w:r>
-      <w:proofErr w:type="spellEnd"/>
-      <w:r>
-        <w:t xml:space="preserve"> object, the</w:t>
-      </w:r>
-      <w:r>
-        <w:t>ir</w:t>
-      </w:r>
-      <w:r>
-        <w:t xml:space="preserve"> calculation is not performed locally.  </w:t>
-      </w:r>
-      <w:r>
-        <w:t xml:space="preserve">The </w:t>
-      </w:r>
-      <w:r>
-        <w:t xml:space="preserve">global </w:t>
-      </w:r>
-      <w:proofErr w:type="spellStart"/>
-      <w:r>
-        <w:rPr>
-          <w:b/>
-          <w:bCs/>
-        </w:rPr>
-        <w:t>calculate_stats</w:t>
-      </w:r>
-      <w:proofErr w:type="spellEnd"/>
-      <w:r>
-        <w:t xml:space="preserve"> function is invoked</w:t>
-      </w:r>
-      <w:r>
-        <w:t xml:space="preserve"> to perform these calculations</w:t>
-      </w:r>
-      <w:r>
-        <w:t xml:space="preserve">. </w:t>
-      </w:r>
-      <w:proofErr w:type="spellStart"/>
-      <w:r>
-        <w:rPr>
-          <w:b/>
-          <w:bCs/>
-        </w:rPr>
-        <w:t>calculate_stats</w:t>
-      </w:r>
-      <w:proofErr w:type="spellEnd"/>
-      <w:r>
-        <w:t xml:space="preserve"> </w:t>
-      </w:r>
-      <w:r>
-        <w:t xml:space="preserve">converts a list of individual transcription statistics to a </w:t>
-      </w:r>
-      <w:proofErr w:type="spellStart"/>
-      <w:r>
-        <w:rPr>
-          <w:b/>
-          <w:bCs/>
-        </w:rPr>
-        <w:t>numpy</w:t>
-      </w:r>
-      <w:proofErr w:type="spellEnd"/>
-      <w:r>
-        <w:t xml:space="preserve"> array and invokes </w:t>
-      </w:r>
-      <w:proofErr w:type="spellStart"/>
-      <w:r>
-        <w:t>numpy’s</w:t>
-      </w:r>
-      <w:proofErr w:type="spellEnd"/>
-      <w:r>
-        <w:t xml:space="preserve"> statistical function</w:t>
-      </w:r>
-      <w:r>
-        <w:t>s</w:t>
-      </w:r>
-      <w:r>
-        <w:t xml:space="preserve"> to obtain an aggregate of the mean, median and so on</w:t>
-      </w:r>
-      <w:r>
-        <w:t xml:space="preserve">. </w:t>
-      </w:r>
-      <w:r>
-        <w:t xml:space="preserve"> </w:t>
-      </w:r>
-      <w:r>
-        <w:t xml:space="preserve">The function </w:t>
-      </w:r>
-      <w:r>
-        <w:t xml:space="preserve">returns a dictionary with the </w:t>
-      </w:r>
-      <w:r>
-        <w:t>calculated</w:t>
-      </w:r>
-      <w:r>
-        <w:t xml:space="preserve"> statistics.  </w:t>
-      </w:r>
-      <w:r>
-        <w:t xml:space="preserve">The rationale behind this design, is to avoid code redundancy – the OCR component also utilises the </w:t>
-      </w:r>
-      <w:proofErr w:type="spellStart"/>
-      <w:r>
-        <w:rPr>
-          <w:b/>
-          <w:bCs/>
-        </w:rPr>
-        <w:t>calculate_stats</w:t>
-      </w:r>
-      <w:proofErr w:type="spellEnd"/>
-      <w:r>
-        <w:t xml:space="preserve"> function. </w:t>
-      </w:r>
-    </w:p>
-    <w:p>
-      <w:pPr>
-        <w:spacing w:line="360" w:lineRule="auto"/>
-      </w:pPr>
-      <w:r>
-        <w:rPr>
-          <w:noProof/>
-        </w:rPr>
-        <w:lastRenderedPageBreak/>
-        <w:drawing>
-          <wp:inline distT="0" distB="0" distL="0" distR="0" wp14:anchorId="003C7358" wp14:editId="2A219F5B">
-            <wp:extent cx="1913860" cy="1913860"/>
-            <wp:effectExtent l="0" t="0" r="0" b="0"/>
-            <wp:docPr id="497411748" name="Picture 1"/>
-            <wp:cNvGraphicFramePr>
-              <a:graphicFrameLocks xmlns:a="http://schemas.openxmlformats.org/drawingml/2006/main" noChangeAspect="1"/>
-            </wp:cNvGraphicFramePr>
-            <a:graphic xmlns:a="http://schemas.openxmlformats.org/drawingml/2006/main">
-              <a:graphicData uri="http://schemas.openxmlformats.org/drawingml/2006/picture">
-                <pic:pic xmlns:pic="http://schemas.openxmlformats.org/drawingml/2006/picture">
-                  <pic:nvPicPr>
-                    <pic:cNvPr id="497411748" name=""/>
-                    <pic:cNvPicPr/>
-                  </pic:nvPicPr>
-                  <pic:blipFill>
-                    <a:blip r:embed="rId33"/>
-                    <a:stretch>
-                      <a:fillRect/>
-                    </a:stretch>
-                  </pic:blipFill>
-                  <pic:spPr>
-                    <a:xfrm>
-                      <a:off x="0" y="0"/>
-                      <a:ext cx="1917733" cy="1917733"/>
-                    </a:xfrm>
-                    <a:prstGeom prst="rect">
-                      <a:avLst/>
-                    </a:prstGeom>
-                  </pic:spPr>
-                </pic:pic>
-              </a:graphicData>
-            </a:graphic>
-          </wp:inline>
-        </w:drawing>
-      </w:r>
-    </w:p>
-    <w:p>
-      <w:pPr>
-        <w:spacing w:line="360" w:lineRule="auto"/>
-        <w:rPr>
-          <w:b/>
-          <w:bCs/>
-        </w:rPr>
-      </w:pPr>
-      <w:r>
-        <w:rPr>
-          <w:b/>
-          <w:bCs/>
-        </w:rPr>
-        <w:t>Evaluation of Whisper:</w:t>
-      </w:r>
-    </w:p>
-    <w:p>
-      <w:pPr>
-        <w:spacing w:line="360" w:lineRule="auto"/>
-      </w:pPr>
-      <w:r>
-        <w:t xml:space="preserve">The mean WER, 11.55%, is slightly higher than the acceptable threshold of 9.0%. The max WER however, differs from the min by roughly 15 percentage points – indicating variation in transcription accuracy across the samples. The median WER, 10.56% is slightly above the threshold while the CER, 4.70%, is slightly below the threshold. Whisper transcribed 27 essays. 29.6% were within the acceptable bound and were classified as “pass”, which means that they will be scored by the transformer. The majority, however, more than double the percentage pass, were classified as “fail”, and will be assigned to the human scorer for scoring. </w:t>
-      </w:r>
-    </w:p>
-    <w:p>
-      <w:pPr>
-        <w:spacing w:line="360" w:lineRule="auto"/>
-      </w:pPr>
-      <w:r>
-        <w:t>The number of essays classified as “fail”, due to a high WER is more than double that of those classified as “pass”. With respect CER the number of transcriptions that are classified as “pass” is roughly 10% more than those classified as “fail”. The model seems to more consistently get words wrong rather than individual letters or characters. There were 8/27 WER passes, 29.63% and 15/25 CER passes, 55.56%.</w:t>
-      </w:r>
-    </w:p>
-    <w:p>
-      <w:pPr>
-        <w:spacing w:line="360" w:lineRule="auto"/>
-      </w:pPr>
-      <w:r>
-        <w:t>The most accurately transcribed essay has a WER of 6.67%, and a CER of less than 2%.  Perusal of this essay after normalisation revealed that it is near perfect and that the errors in transcription did not detract from the semantic of the essay. An excerpt is shown below.</w:t>
-      </w:r>
-    </w:p>
-    <w:p>
-      <w:pPr>
-        <w:spacing w:line="360" w:lineRule="auto"/>
-      </w:pPr>
-      <w:r>
-        <w:rPr>
-          <w:noProof/>
-        </w:rPr>
-        <w:lastRenderedPageBreak/>
-        <w:drawing>
-          <wp:inline distT="0" distB="0" distL="0" distR="0" wp14:anchorId="66EB3C3A" wp14:editId="697260F3">
-            <wp:extent cx="3848637" cy="1781424"/>
-            <wp:effectExtent l="0" t="0" r="0" b="9525"/>
-            <wp:docPr id="1364885674" name="Picture 1"/>
-            <wp:cNvGraphicFramePr>
-              <a:graphicFrameLocks xmlns:a="http://schemas.openxmlformats.org/drawingml/2006/main" noChangeAspect="1"/>
-            </wp:cNvGraphicFramePr>
-            <a:graphic xmlns:a="http://schemas.openxmlformats.org/drawingml/2006/main">
-              <a:graphicData uri="http://schemas.openxmlformats.org/drawingml/2006/picture">
-                <pic:pic xmlns:pic="http://schemas.openxmlformats.org/drawingml/2006/picture">
-                  <pic:nvPicPr>
-                    <pic:cNvPr id="1364885674" name=""/>
-                    <pic:cNvPicPr/>
-                  </pic:nvPicPr>
-                  <pic:blipFill>
-                    <a:blip r:embed="rId34"/>
-                    <a:stretch>
-                      <a:fillRect/>
-                    </a:stretch>
-                  </pic:blipFill>
-                  <pic:spPr>
-                    <a:xfrm>
-                      <a:off x="0" y="0"/>
-                      <a:ext cx="3848637" cy="1781424"/>
-                    </a:xfrm>
-                    <a:prstGeom prst="rect">
-                      <a:avLst/>
-                    </a:prstGeom>
-                  </pic:spPr>
-                </pic:pic>
-              </a:graphicData>
-            </a:graphic>
-          </wp:inline>
-        </w:drawing>
-      </w:r>
-    </w:p>
-    <w:p>
-      <w:pPr>
-        <w:spacing w:line="360" w:lineRule="auto"/>
-      </w:pPr>
-      <w:r>
-        <w:t>The essay with the median WER percentage has a WER slightly above the acceptable WER threshold, and a CER slightly below the acceptable threshold.</w:t>
-      </w:r>
-      <w:r>
-        <w:t xml:space="preserve"> </w:t>
-      </w:r>
-      <w:r>
-        <w:rPr>
-          <w:noProof/>
-        </w:rPr>
-        <w:drawing>
-          <wp:inline distT="0" distB="0" distL="0" distR="0" wp14:anchorId="63FE28FC" wp14:editId="28773C2A">
-            <wp:extent cx="4667901" cy="1781424"/>
-            <wp:effectExtent l="0" t="0" r="0" b="9525"/>
-            <wp:docPr id="1460716706" name="Picture 1"/>
-            <wp:cNvGraphicFramePr>
-              <a:graphicFrameLocks xmlns:a="http://schemas.openxmlformats.org/drawingml/2006/main" noChangeAspect="1"/>
-            </wp:cNvGraphicFramePr>
-            <a:graphic xmlns:a="http://schemas.openxmlformats.org/drawingml/2006/main">
-              <a:graphicData uri="http://schemas.openxmlformats.org/drawingml/2006/picture">
-                <pic:pic xmlns:pic="http://schemas.openxmlformats.org/drawingml/2006/picture">
-                  <pic:nvPicPr>
-                    <pic:cNvPr id="1460716706" name=""/>
-                    <pic:cNvPicPr/>
-                  </pic:nvPicPr>
-                  <pic:blipFill>
-                    <a:blip r:embed="rId35"/>
-                    <a:stretch>
-                      <a:fillRect/>
-                    </a:stretch>
-                  </pic:blipFill>
-                  <pic:spPr>
-                    <a:xfrm>
-                      <a:off x="0" y="0"/>
-                      <a:ext cx="4667901" cy="1781424"/>
-                    </a:xfrm>
-                    <a:prstGeom prst="rect">
-                      <a:avLst/>
-                    </a:prstGeom>
-                  </pic:spPr>
-                </pic:pic>
-              </a:graphicData>
-            </a:graphic>
-          </wp:inline>
-        </w:drawing>
-      </w:r>
-    </w:p>
-    <w:p>
-      <w:pPr>
-        <w:spacing w:line="360" w:lineRule="auto"/>
-      </w:pPr>
-      <w:r>
-        <w:t xml:space="preserve"> From a visual inspection of the normalised essay, it is apparent that most of the wrongly transcribed words are still decipherable by a human scorer. For example, Whisper transcribed “sea floor spreading” as</w:t>
-      </w:r>
-    </w:p>
-    <w:p>
-      <w:pPr>
-        <w:spacing w:line="360" w:lineRule="auto"/>
-      </w:pPr>
-      <w:r>
-        <w:rPr>
-          <w:noProof/>
-        </w:rPr>
-        <w:drawing>
-          <wp:inline distT="0" distB="0" distL="0" distR="0" wp14:anchorId="014BF153" wp14:editId="5975BD5D">
-            <wp:extent cx="2584173" cy="276447"/>
-            <wp:effectExtent l="0" t="0" r="6985" b="9525"/>
-            <wp:docPr id="2132120072" name="Picture 1"/>
-            <wp:cNvGraphicFramePr>
-              <a:graphicFrameLocks xmlns:a="http://schemas.openxmlformats.org/drawingml/2006/main" noChangeAspect="1"/>
-            </wp:cNvGraphicFramePr>
-            <a:graphic xmlns:a="http://schemas.openxmlformats.org/drawingml/2006/main">
-              <a:graphicData uri="http://schemas.openxmlformats.org/drawingml/2006/picture">
-                <pic:pic xmlns:pic="http://schemas.openxmlformats.org/drawingml/2006/picture">
-                  <pic:nvPicPr>
-                    <pic:cNvPr id="2132120072" name=""/>
-                    <pic:cNvPicPr/>
-                  </pic:nvPicPr>
-                  <pic:blipFill>
-                    <a:blip r:embed="rId36"/>
-                    <a:stretch>
-                      <a:fillRect/>
-                    </a:stretch>
-                  </pic:blipFill>
-                  <pic:spPr>
-                    <a:xfrm>
-                      <a:off x="0" y="0"/>
-                      <a:ext cx="2609479" cy="279154"/>
-                    </a:xfrm>
-                    <a:prstGeom prst="rect">
-                      <a:avLst/>
-                    </a:prstGeom>
-                  </pic:spPr>
-                </pic:pic>
-              </a:graphicData>
-            </a:graphic>
-          </wp:inline>
-        </w:drawing>
-      </w:r>
-      <w:r>
-        <w:t xml:space="preserve">. This observation, however, does not motivate an adjustment to the current thresholds as this substitution, though recognisable to a human scorer, is likely to affect the transformer’s interpretation, resulting in an inaccurate score. </w:t>
-      </w:r>
-    </w:p>
-    <w:p>
-      <w:pPr>
-        <w:spacing w:line="360" w:lineRule="auto"/>
-      </w:pPr>
-      <w:r>
-        <w:t>The screenshots below are from transcriptions with WER and CER percentages between the min and median and the median and max, respectively.</w:t>
-      </w:r>
-    </w:p>
-    <w:p>
-      <w:pPr>
-        <w:spacing w:line="360" w:lineRule="auto"/>
-      </w:pPr>
-      <w:r>
-        <w:rPr>
-          <w:noProof/>
-        </w:rPr>
-        <w:lastRenderedPageBreak/>
-        <w:drawing>
-          <wp:inline distT="0" distB="0" distL="0" distR="0" wp14:anchorId="14EE8C2E" wp14:editId="1E84752A">
-            <wp:extent cx="4896533" cy="1648055"/>
-            <wp:effectExtent l="0" t="0" r="0" b="9525"/>
-            <wp:docPr id="1081167865" name="Picture 1"/>
-            <wp:cNvGraphicFramePr>
-              <a:graphicFrameLocks xmlns:a="http://schemas.openxmlformats.org/drawingml/2006/main" noChangeAspect="1"/>
-            </wp:cNvGraphicFramePr>
-            <a:graphic xmlns:a="http://schemas.openxmlformats.org/drawingml/2006/main">
-              <a:graphicData uri="http://schemas.openxmlformats.org/drawingml/2006/picture">
-                <pic:pic xmlns:pic="http://schemas.openxmlformats.org/drawingml/2006/picture">
-                  <pic:nvPicPr>
-                    <pic:cNvPr id="1081167865" name=""/>
-                    <pic:cNvPicPr/>
-                  </pic:nvPicPr>
-                  <pic:blipFill>
-                    <a:blip r:embed="rId37"/>
-                    <a:stretch>
-                      <a:fillRect/>
-                    </a:stretch>
-                  </pic:blipFill>
-                  <pic:spPr>
-                    <a:xfrm>
-                      <a:off x="0" y="0"/>
-                      <a:ext cx="4896533" cy="1648055"/>
-                    </a:xfrm>
-                    <a:prstGeom prst="rect">
-                      <a:avLst/>
-                    </a:prstGeom>
-                  </pic:spPr>
-                </pic:pic>
-              </a:graphicData>
-            </a:graphic>
-          </wp:inline>
-        </w:drawing>
-      </w:r>
-    </w:p>
-    <w:p>
-      <w:pPr>
-        <w:spacing w:line="360" w:lineRule="auto"/>
-      </w:pPr>
-      <w:r>
-        <w:rPr>
-          <w:noProof/>
-        </w:rPr>
-        <w:drawing>
-          <wp:inline distT="0" distB="0" distL="0" distR="0" wp14:anchorId="5A8F856D" wp14:editId="4EFE9724">
-            <wp:extent cx="5172797" cy="1810003"/>
-            <wp:effectExtent l="0" t="0" r="0" b="0"/>
-            <wp:docPr id="1322649141" name="Picture 1"/>
-            <wp:cNvGraphicFramePr>
-              <a:graphicFrameLocks xmlns:a="http://schemas.openxmlformats.org/drawingml/2006/main" noChangeAspect="1"/>
-            </wp:cNvGraphicFramePr>
-            <a:graphic xmlns:a="http://schemas.openxmlformats.org/drawingml/2006/main">
-              <a:graphicData uri="http://schemas.openxmlformats.org/drawingml/2006/picture">
-                <pic:pic xmlns:pic="http://schemas.openxmlformats.org/drawingml/2006/picture">
-                  <pic:nvPicPr>
-                    <pic:cNvPr id="1322649141" name=""/>
-                    <pic:cNvPicPr/>
-                  </pic:nvPicPr>
-                  <pic:blipFill>
-                    <a:blip r:embed="rId38"/>
-                    <a:stretch>
-                      <a:fillRect/>
-                    </a:stretch>
-                  </pic:blipFill>
-                  <pic:spPr>
-                    <a:xfrm>
-                      <a:off x="0" y="0"/>
-                      <a:ext cx="5172797" cy="1810003"/>
-                    </a:xfrm>
-                    <a:prstGeom prst="rect">
-                      <a:avLst/>
-                    </a:prstGeom>
-                  </pic:spPr>
-                </pic:pic>
-              </a:graphicData>
-            </a:graphic>
-          </wp:inline>
-        </w:drawing>
-      </w:r>
-    </w:p>
-    <w:p>
-      <w:pPr>
-        <w:spacing w:line="360" w:lineRule="auto"/>
-      </w:pPr>
-      <w:r>
-        <w:t xml:space="preserve">The transcription of Daniella voice is highly accurate with a WER of 8.89% and a CER of 3.79%. The transcription of Hannah although classified as “fail” is still readable and interpretable by a human scorer. </w:t>
-      </w:r>
-    </w:p>
-    <w:p>
-      <w:pPr>
-        <w:spacing w:line="360" w:lineRule="auto"/>
-      </w:pPr>
-      <w:r>
-        <w:t xml:space="preserve">The most inaccurate transcription is still decipherable by a human scorer, as seen in the screenshot below. </w:t>
-      </w:r>
-    </w:p>
-    <w:p>
-      <w:pPr>
-        <w:spacing w:line="360" w:lineRule="auto"/>
-      </w:pPr>
-      <w:r>
-        <w:rPr>
-          <w:noProof/>
-        </w:rPr>
-        <w:drawing>
-          <wp:inline distT="0" distB="0" distL="0" distR="0" wp14:anchorId="17F9132D" wp14:editId="496169AF">
-            <wp:extent cx="4248743" cy="1619476"/>
-            <wp:effectExtent l="0" t="0" r="0" b="0"/>
-            <wp:docPr id="1179730839" name="Picture 1"/>
-            <wp:cNvGraphicFramePr>
-              <a:graphicFrameLocks xmlns:a="http://schemas.openxmlformats.org/drawingml/2006/main" noChangeAspect="1"/>
-            </wp:cNvGraphicFramePr>
-            <a:graphic xmlns:a="http://schemas.openxmlformats.org/drawingml/2006/main">
-              <a:graphicData uri="http://schemas.openxmlformats.org/drawingml/2006/picture">
-                <pic:pic xmlns:pic="http://schemas.openxmlformats.org/drawingml/2006/picture">
-                  <pic:nvPicPr>
-                    <pic:cNvPr id="1179730839" name=""/>
-                    <pic:cNvPicPr/>
-                  </pic:nvPicPr>
-                  <pic:blipFill>
-                    <a:blip r:embed="rId39"/>
-                    <a:stretch>
-                      <a:fillRect/>
-                    </a:stretch>
-                  </pic:blipFill>
-                  <pic:spPr>
-                    <a:xfrm>
-                      <a:off x="0" y="0"/>
-                      <a:ext cx="4248743" cy="1619476"/>
-                    </a:xfrm>
-                    <a:prstGeom prst="rect">
-                      <a:avLst/>
-                    </a:prstGeom>
-                  </pic:spPr>
-                </pic:pic>
-              </a:graphicData>
-            </a:graphic>
-          </wp:inline>
-        </w:drawing>
-      </w:r>
-    </w:p>
-    <w:p>
-      <w:pPr>
-        <w:spacing w:line="360" w:lineRule="auto"/>
-      </w:pPr>
-      <w:r>
-        <w:t xml:space="preserve"> This indicates that the evaluation logic worked as intended, demonstrating sensitivity to transcriptions with high WER percentages, preventing them from moving through the pipeline. </w:t>
-      </w:r>
-    </w:p>
-    <w:p>
-      <w:pPr>
-        <w:spacing w:line="360" w:lineRule="auto"/>
-      </w:pPr>
-      <w:r>
-        <w:t xml:space="preserve">This analysis supports the inclusion of Whisper in the AES pipeline as an assistive technology. However, the high proportion of failed transcriptions justifies the use of </w:t>
-      </w:r>
-      <w:r>
-        <w:lastRenderedPageBreak/>
-        <w:t>evaluation logic to route transcriptions to the appropriate scorer based on their WER and CER</w:t>
-      </w:r>
-    </w:p>
-    <w:p>
-      <w:r>
-        <w:br w:type="page"/>
-      </w:r>
-    </w:p>
-    <w:p>
-      <w:r>
-        <w:lastRenderedPageBreak/>
-        <w:t xml:space="preserve">Selection of Essay samples based on variation in writing styles and image composition </w:t>
-      </w:r>
-    </w:p>
-    <w:p>
-      <w:r>
-        <w:t xml:space="preserve">Aaliah – warpage, curvature, vignetting, blurry top right edge, </w:t>
-      </w:r>
-    </w:p>
-    <w:p>
-      <w:r>
-        <w:t>Gordon- use paper without lines, some text overlaps, some characters were cropped, mixed cursive and block style writing</w:t>
-      </w:r>
-    </w:p>
-    <w:p>
-      <w:r>
-        <w:t xml:space="preserve">Kaelum – no signs of warpage, however, text is light didn’t seem to press much on pen, last sentence is a bit faint. </w:t>
-      </w:r>
-    </w:p>
-    <w:p>
-      <w:r>
-        <w:t xml:space="preserve">Nubia- </w:t>
-      </w:r>
-      <w:proofErr w:type="spellStart"/>
-      <w:proofErr w:type="gramStart"/>
-      <w:r>
-        <w:t>clear,clean</w:t>
-      </w:r>
-      <w:proofErr w:type="spellEnd"/>
-      <w:proofErr w:type="gramEnd"/>
-      <w:r>
-        <w:t>, consistent, text size decreased slightly after the first paragraph so mixed text size</w:t>
-      </w:r>
-    </w:p>
-    <w:p>
-      <w:r>
-        <w:t xml:space="preserve">Shemar, very small text, several crossings, writing uniform however some text is illegible. Overall image is underexposed. </w:t>
-      </w:r>
-    </w:p>
-    <w:p/>
-    <w:p>
-      <w:r>
-        <w:t>Selection of Audio samples-based quality</w:t>
-      </w:r>
-    </w:p>
-    <w:p>
-      <w:r>
-        <w:t>researcher-assessed recording quality</w:t>
-      </w:r>
-    </w:p>
-    <w:p>
-      <w:r>
-        <w:t>Daniella- clear, not background noise, words can be easily deciphered, speaker speaks at a reasonable pace</w:t>
-      </w:r>
-    </w:p>
-    <w:p>
-      <w:r>
-        <w:t>Gordon speaks fast, some words are not easily deciphered the first time they are heard, the audio has some background noise that muffles the speaker’s voice</w:t>
-      </w:r>
-    </w:p>
-    <w:p>
-      <w:r>
-        <w:t>Katelyn – very difficult to hear as the audio volume is quite low, no evidence of background noise</w:t>
-      </w:r>
-    </w:p>
     <w:sectPr>
-      <w:footerReference w:type="default" r:id="rId40"/>
+      <w:footerReference w:type="default" r:id="rId27"/>
       <w:pgSz w:w="11906" w:h="16838"/>
       <w:pgMar w:top="1440" w:right="1440" w:bottom="1440" w:left="1440" w:header="708" w:footer="708" w:gutter="0"/>
       <w:cols w:space="708"/>
@@ -30756,7 +28987,6 @@
   <w:style w:type="character" w:default="1" w:styleId="DefaultParagraphFont">
     <w:name w:val="Default Paragraph Font"/>
     <w:uiPriority w:val="1"/>
-    <w:semiHidden/>
     <w:unhideWhenUsed/>
   </w:style>
   <w:style w:type="table" w:default="1" w:styleId="TableNormal">

</xml_diff>